<commit_message>
Relatorio: contribuicoes dos participantes e como o conteudo foi revisado
</commit_message>
<xml_diff>
--- a/relatorio/Relatorio_Final_PIBIC_BioquimicaEDU.docx
+++ b/relatorio/Relatorio_Final_PIBIC_BioquimicaEDU.docx
@@ -329,7 +329,7 @@
     <w:sdt>
       <w:sdtPr>
         <w:alias w:val="LISTA DE FIGURAS"/>
-        <w:id w:val="553352158"/>
+        <w:id w:val="209007937"/>
       </w:sdtPr>
       <w:sdtEndPr/>
       <w:sdtContent>
@@ -355,7 +355,7 @@
           <w:r>
             <w:fldChar w:fldCharType="separate"/>
           </w:r>
-          <w:hyperlink w:anchor="_Toc243156961" w:history="1">
+          <w:hyperlink w:anchor="_Toc243165359" w:history="1">
             <w:r>
               <w:rPr>
                 <w:rStyle w:val="Hyperlink"/>
@@ -379,7 +379,7 @@
               <w:rPr>
                 <w:noProof/>
               </w:rPr>
-              <w:instrText xml:space="preserve"> PAGEREF _Toc243156961 \h </w:instrText>
+              <w:instrText xml:space="preserve"> PAGEREF _Toc243165359 \h </w:instrText>
             </w:r>
             <w:r>
               <w:rPr>
@@ -419,7 +419,7 @@
               <w14:ligatures w14:val="standardContextual"/>
             </w:rPr>
           </w:pPr>
-          <w:hyperlink w:anchor="_Toc243156962" w:history="1">
+          <w:hyperlink w:anchor="_Toc243165360" w:history="1">
             <w:r>
               <w:rPr>
                 <w:rStyle w:val="Hyperlink"/>
@@ -443,7 +443,7 @@
               <w:rPr>
                 <w:noProof/>
               </w:rPr>
-              <w:instrText xml:space="preserve"> PAGEREF _Toc243156962 \h </w:instrText>
+              <w:instrText xml:space="preserve"> PAGEREF _Toc243165360 \h </w:instrText>
             </w:r>
             <w:r>
               <w:rPr>
@@ -483,7 +483,7 @@
               <w14:ligatures w14:val="standardContextual"/>
             </w:rPr>
           </w:pPr>
-          <w:hyperlink w:anchor="_Toc243156963" w:history="1">
+          <w:hyperlink w:anchor="_Toc243165361" w:history="1">
             <w:r>
               <w:rPr>
                 <w:rStyle w:val="Hyperlink"/>
@@ -507,7 +507,7 @@
               <w:rPr>
                 <w:noProof/>
               </w:rPr>
-              <w:instrText xml:space="preserve"> PAGEREF _Toc243156963 \h </w:instrText>
+              <w:instrText xml:space="preserve"> PAGEREF _Toc243165361 \h </w:instrText>
             </w:r>
             <w:r>
               <w:rPr>
@@ -547,7 +547,7 @@
               <w14:ligatures w14:val="standardContextual"/>
             </w:rPr>
           </w:pPr>
-          <w:hyperlink w:anchor="_Toc243156964" w:history="1">
+          <w:hyperlink w:anchor="_Toc243165362" w:history="1">
             <w:r>
               <w:rPr>
                 <w:rStyle w:val="Hyperlink"/>
@@ -587,7 +587,7 @@
               <w:rPr>
                 <w:noProof/>
               </w:rPr>
-              <w:instrText xml:space="preserve"> PAGEREF _Toc243156964 \h </w:instrText>
+              <w:instrText xml:space="preserve"> PAGEREF _Toc243165362 \h </w:instrText>
             </w:r>
             <w:r>
               <w:rPr>
@@ -627,7 +627,7 @@
               <w14:ligatures w14:val="standardContextual"/>
             </w:rPr>
           </w:pPr>
-          <w:hyperlink w:anchor="_Toc243156965" w:history="1">
+          <w:hyperlink w:anchor="_Toc243165363" w:history="1">
             <w:r>
               <w:rPr>
                 <w:rStyle w:val="Hyperlink"/>
@@ -651,7 +651,7 @@
               <w:rPr>
                 <w:noProof/>
               </w:rPr>
-              <w:instrText xml:space="preserve"> PAGEREF _Toc243156965 \h </w:instrText>
+              <w:instrText xml:space="preserve"> PAGEREF _Toc243165363 \h </w:instrText>
             </w:r>
             <w:r>
               <w:rPr>
@@ -691,7 +691,7 @@
               <w14:ligatures w14:val="standardContextual"/>
             </w:rPr>
           </w:pPr>
-          <w:hyperlink w:anchor="_Toc243156966" w:history="1">
+          <w:hyperlink w:anchor="_Toc243165364" w:history="1">
             <w:r>
               <w:rPr>
                 <w:rStyle w:val="Hyperlink"/>
@@ -715,7 +715,7 @@
               <w:rPr>
                 <w:noProof/>
               </w:rPr>
-              <w:instrText xml:space="preserve"> PAGEREF _Toc243156966 \h </w:instrText>
+              <w:instrText xml:space="preserve"> PAGEREF _Toc243165364 \h </w:instrText>
             </w:r>
             <w:r>
               <w:rPr>
@@ -755,7 +755,7 @@
               <w14:ligatures w14:val="standardContextual"/>
             </w:rPr>
           </w:pPr>
-          <w:hyperlink w:anchor="_Toc243156967" w:history="1">
+          <w:hyperlink w:anchor="_Toc243165365" w:history="1">
             <w:r>
               <w:rPr>
                 <w:rStyle w:val="Hyperlink"/>
@@ -779,7 +779,7 @@
               <w:rPr>
                 <w:noProof/>
               </w:rPr>
-              <w:instrText xml:space="preserve"> PAGEREF _Toc243156967 \h </w:instrText>
+              <w:instrText xml:space="preserve"> PAGEREF _Toc243165365 \h </w:instrText>
             </w:r>
             <w:r>
               <w:rPr>
@@ -819,7 +819,7 @@
               <w14:ligatures w14:val="standardContextual"/>
             </w:rPr>
           </w:pPr>
-          <w:hyperlink w:anchor="_Toc243156968" w:history="1">
+          <w:hyperlink w:anchor="_Toc243165366" w:history="1">
             <w:r>
               <w:rPr>
                 <w:rStyle w:val="Hyperlink"/>
@@ -843,7 +843,7 @@
               <w:rPr>
                 <w:noProof/>
               </w:rPr>
-              <w:instrText xml:space="preserve"> PAGEREF _Toc243156968 \h </w:instrText>
+              <w:instrText xml:space="preserve"> PAGEREF _Toc243165366 \h </w:instrText>
             </w:r>
             <w:r>
               <w:rPr>
@@ -883,7 +883,7 @@
               <w14:ligatures w14:val="standardContextual"/>
             </w:rPr>
           </w:pPr>
-          <w:hyperlink w:anchor="_Toc243156969" w:history="1">
+          <w:hyperlink w:anchor="_Toc243165367" w:history="1">
             <w:r>
               <w:rPr>
                 <w:rStyle w:val="Hyperlink"/>
@@ -907,7 +907,7 @@
               <w:rPr>
                 <w:noProof/>
               </w:rPr>
-              <w:instrText xml:space="preserve"> PAGEREF _Toc243156969 \h </w:instrText>
+              <w:instrText xml:space="preserve"> PAGEREF _Toc243165367 \h </w:instrText>
             </w:r>
             <w:r>
               <w:rPr>
@@ -947,7 +947,7 @@
               <w14:ligatures w14:val="standardContextual"/>
             </w:rPr>
           </w:pPr>
-          <w:hyperlink w:anchor="_Toc243156970" w:history="1">
+          <w:hyperlink w:anchor="_Toc243165368" w:history="1">
             <w:r>
               <w:rPr>
                 <w:rStyle w:val="Hyperlink"/>
@@ -971,7 +971,7 @@
               <w:rPr>
                 <w:noProof/>
               </w:rPr>
-              <w:instrText xml:space="preserve"> PAGEREF _Toc243156970 \h </w:instrText>
+              <w:instrText xml:space="preserve"> PAGEREF _Toc243165368 \h </w:instrText>
             </w:r>
             <w:r>
               <w:rPr>
@@ -1011,7 +1011,7 @@
               <w14:ligatures w14:val="standardContextual"/>
             </w:rPr>
           </w:pPr>
-          <w:hyperlink w:anchor="_Toc243156971" w:history="1">
+          <w:hyperlink w:anchor="_Toc243165369" w:history="1">
             <w:r>
               <w:rPr>
                 <w:rStyle w:val="Hyperlink"/>
@@ -1035,7 +1035,7 @@
               <w:rPr>
                 <w:noProof/>
               </w:rPr>
-              <w:instrText xml:space="preserve"> PAGEREF _Toc243156971 \h </w:instrText>
+              <w:instrText xml:space="preserve"> PAGEREF _Toc243165369 \h </w:instrText>
             </w:r>
             <w:r>
               <w:rPr>
@@ -1075,7 +1075,7 @@
               <w14:ligatures w14:val="standardContextual"/>
             </w:rPr>
           </w:pPr>
-          <w:hyperlink w:anchor="_Toc243156972" w:history="1">
+          <w:hyperlink w:anchor="_Toc243165370" w:history="1">
             <w:r>
               <w:rPr>
                 <w:rStyle w:val="Hyperlink"/>
@@ -1099,7 +1099,7 @@
               <w:rPr>
                 <w:noProof/>
               </w:rPr>
-              <w:instrText xml:space="preserve"> PAGEREF _Toc243156972 \h </w:instrText>
+              <w:instrText xml:space="preserve"> PAGEREF _Toc243165370 \h </w:instrText>
             </w:r>
             <w:r>
               <w:rPr>
@@ -1144,7 +1144,7 @@
     <w:sdt>
       <w:sdtPr>
         <w:alias w:val="LISTA DE QUADROS"/>
-        <w:id w:val="1463842904"/>
+        <w:id w:val="1180855859"/>
       </w:sdtPr>
       <w:sdtEndPr/>
       <w:sdtContent>
@@ -1170,7 +1170,7 @@
           <w:r>
             <w:fldChar w:fldCharType="separate"/>
           </w:r>
-          <w:hyperlink w:anchor="_Toc243156973" w:history="1">
+          <w:hyperlink w:anchor="_Toc243165371" w:history="1">
             <w:r>
               <w:rPr>
                 <w:rStyle w:val="Hyperlink"/>
@@ -1194,7 +1194,7 @@
               <w:rPr>
                 <w:noProof/>
               </w:rPr>
-              <w:instrText xml:space="preserve"> PAGEREF _Toc243156973 \h </w:instrText>
+              <w:instrText xml:space="preserve"> PAGEREF _Toc243165371 \h </w:instrText>
             </w:r>
             <w:r>
               <w:rPr>
@@ -1234,7 +1234,7 @@
               <w14:ligatures w14:val="standardContextual"/>
             </w:rPr>
           </w:pPr>
-          <w:hyperlink w:anchor="_Toc243156974" w:history="1">
+          <w:hyperlink w:anchor="_Toc243165372" w:history="1">
             <w:r>
               <w:rPr>
                 <w:rStyle w:val="Hyperlink"/>
@@ -1258,7 +1258,7 @@
               <w:rPr>
                 <w:noProof/>
               </w:rPr>
-              <w:instrText xml:space="preserve"> PAGEREF _Toc243156974 \h </w:instrText>
+              <w:instrText xml:space="preserve"> PAGEREF _Toc243165372 \h </w:instrText>
             </w:r>
             <w:r>
               <w:rPr>
@@ -1298,7 +1298,7 @@
               <w14:ligatures w14:val="standardContextual"/>
             </w:rPr>
           </w:pPr>
-          <w:hyperlink w:anchor="_Toc243156975" w:history="1">
+          <w:hyperlink w:anchor="_Toc243165373" w:history="1">
             <w:r>
               <w:rPr>
                 <w:rStyle w:val="Hyperlink"/>
@@ -1322,7 +1322,7 @@
               <w:rPr>
                 <w:noProof/>
               </w:rPr>
-              <w:instrText xml:space="preserve"> PAGEREF _Toc243156975 \h </w:instrText>
+              <w:instrText xml:space="preserve"> PAGEREF _Toc243165373 \h </w:instrText>
             </w:r>
             <w:r>
               <w:rPr>
@@ -1362,7 +1362,7 @@
               <w14:ligatures w14:val="standardContextual"/>
             </w:rPr>
           </w:pPr>
-          <w:hyperlink w:anchor="_Toc243156976" w:history="1">
+          <w:hyperlink w:anchor="_Toc243165374" w:history="1">
             <w:r>
               <w:rPr>
                 <w:rStyle w:val="Hyperlink"/>
@@ -1386,7 +1386,7 @@
               <w:rPr>
                 <w:noProof/>
               </w:rPr>
-              <w:instrText xml:space="preserve"> PAGEREF _Toc243156976 \h </w:instrText>
+              <w:instrText xml:space="preserve"> PAGEREF _Toc243165374 \h </w:instrText>
             </w:r>
             <w:r>
               <w:rPr>
@@ -1426,7 +1426,7 @@
               <w14:ligatures w14:val="standardContextual"/>
             </w:rPr>
           </w:pPr>
-          <w:hyperlink w:anchor="_Toc243156977" w:history="1">
+          <w:hyperlink w:anchor="_Toc243165375" w:history="1">
             <w:r>
               <w:rPr>
                 <w:rStyle w:val="Hyperlink"/>
@@ -1450,7 +1450,7 @@
               <w:rPr>
                 <w:noProof/>
               </w:rPr>
-              <w:instrText xml:space="preserve"> PAGEREF _Toc243156977 \h </w:instrText>
+              <w:instrText xml:space="preserve"> PAGEREF _Toc243165375 \h </w:instrText>
             </w:r>
             <w:r>
               <w:rPr>
@@ -1490,7 +1490,7 @@
               <w14:ligatures w14:val="standardContextual"/>
             </w:rPr>
           </w:pPr>
-          <w:hyperlink w:anchor="_Toc243156978" w:history="1">
+          <w:hyperlink w:anchor="_Toc243165376" w:history="1">
             <w:r>
               <w:rPr>
                 <w:rStyle w:val="Hyperlink"/>
@@ -1514,7 +1514,7 @@
               <w:rPr>
                 <w:noProof/>
               </w:rPr>
-              <w:instrText xml:space="preserve"> PAGEREF _Toc243156978 \h </w:instrText>
+              <w:instrText xml:space="preserve"> PAGEREF _Toc243165376 \h </w:instrText>
             </w:r>
             <w:r>
               <w:rPr>
@@ -1554,7 +1554,7 @@
               <w14:ligatures w14:val="standardContextual"/>
             </w:rPr>
           </w:pPr>
-          <w:hyperlink w:anchor="_Toc243156979" w:history="1">
+          <w:hyperlink w:anchor="_Toc243165377" w:history="1">
             <w:r>
               <w:rPr>
                 <w:rStyle w:val="Hyperlink"/>
@@ -1578,7 +1578,7 @@
               <w:rPr>
                 <w:noProof/>
               </w:rPr>
-              <w:instrText xml:space="preserve"> PAGEREF _Toc243156979 \h </w:instrText>
+              <w:instrText xml:space="preserve"> PAGEREF _Toc243165377 \h </w:instrText>
             </w:r>
             <w:r>
               <w:rPr>
@@ -1623,7 +1623,7 @@
     <w:sdt>
       <w:sdtPr>
         <w:alias w:val="LISTA DE TABELAS"/>
-        <w:id w:val="362019097"/>
+        <w:id w:val="-404230386"/>
       </w:sdtPr>
       <w:sdtEndPr/>
       <w:sdtContent>
@@ -1649,7 +1649,7 @@
           <w:r>
             <w:fldChar w:fldCharType="separate"/>
           </w:r>
-          <w:hyperlink w:anchor="_Toc243156980" w:history="1">
+          <w:hyperlink w:anchor="_Toc243165378" w:history="1">
             <w:r>
               <w:rPr>
                 <w:rStyle w:val="Hyperlink"/>
@@ -1673,7 +1673,7 @@
               <w:rPr>
                 <w:noProof/>
               </w:rPr>
-              <w:instrText xml:space="preserve"> PAGEREF _Toc243156980 \h </w:instrText>
+              <w:instrText xml:space="preserve"> PAGEREF _Toc243165378 \h </w:instrText>
             </w:r>
             <w:r>
               <w:rPr>
@@ -1713,7 +1713,7 @@
               <w14:ligatures w14:val="standardContextual"/>
             </w:rPr>
           </w:pPr>
-          <w:hyperlink w:anchor="_Toc243156981" w:history="1">
+          <w:hyperlink w:anchor="_Toc243165379" w:history="1">
             <w:r>
               <w:rPr>
                 <w:rStyle w:val="Hyperlink"/>
@@ -1737,7 +1737,7 @@
               <w:rPr>
                 <w:noProof/>
               </w:rPr>
-              <w:instrText xml:space="preserve"> PAGEREF _Toc243156981 \h </w:instrText>
+              <w:instrText xml:space="preserve"> PAGEREF _Toc243165379 \h </w:instrText>
             </w:r>
             <w:r>
               <w:rPr>
@@ -1777,7 +1777,7 @@
               <w14:ligatures w14:val="standardContextual"/>
             </w:rPr>
           </w:pPr>
-          <w:hyperlink w:anchor="_Toc243156982" w:history="1">
+          <w:hyperlink w:anchor="_Toc243165380" w:history="1">
             <w:r>
               <w:rPr>
                 <w:rStyle w:val="Hyperlink"/>
@@ -1801,7 +1801,7 @@
               <w:rPr>
                 <w:noProof/>
               </w:rPr>
-              <w:instrText xml:space="preserve"> PAGEREF _Toc243156982 \h </w:instrText>
+              <w:instrText xml:space="preserve"> PAGEREF _Toc243165380 \h </w:instrText>
             </w:r>
             <w:r>
               <w:rPr>
@@ -1841,7 +1841,7 @@
               <w14:ligatures w14:val="standardContextual"/>
             </w:rPr>
           </w:pPr>
-          <w:hyperlink w:anchor="_Toc243156983" w:history="1">
+          <w:hyperlink w:anchor="_Toc243165381" w:history="1">
             <w:r>
               <w:rPr>
                 <w:rStyle w:val="Hyperlink"/>
@@ -1865,7 +1865,7 @@
               <w:rPr>
                 <w:noProof/>
               </w:rPr>
-              <w:instrText xml:space="preserve"> PAGEREF _Toc243156983 \h </w:instrText>
+              <w:instrText xml:space="preserve"> PAGEREF _Toc243165381 \h </w:instrText>
             </w:r>
             <w:r>
               <w:rPr>
@@ -1905,7 +1905,7 @@
               <w14:ligatures w14:val="standardContextual"/>
             </w:rPr>
           </w:pPr>
-          <w:hyperlink w:anchor="_Toc243156984" w:history="1">
+          <w:hyperlink w:anchor="_Toc243165382" w:history="1">
             <w:r>
               <w:rPr>
                 <w:rStyle w:val="Hyperlink"/>
@@ -1929,7 +1929,7 @@
               <w:rPr>
                 <w:noProof/>
               </w:rPr>
-              <w:instrText xml:space="preserve"> PAGEREF _Toc243156984 \h </w:instrText>
+              <w:instrText xml:space="preserve"> PAGEREF _Toc243165382 \h </w:instrText>
             </w:r>
             <w:r>
               <w:rPr>
@@ -2532,7 +2532,7 @@
           <w:bCs w:val="0"/>
         </w:rPr>
         <w:alias w:val="Sumário"/>
-        <w:id w:val="-1409608111"/>
+        <w:id w:val="1432389566"/>
       </w:sdtPr>
       <w:sdtEndPr/>
       <w:sdtContent>
@@ -2560,7 +2560,7 @@
           <w:r>
             <w:fldChar w:fldCharType="separate"/>
           </w:r>
-          <w:hyperlink w:anchor="_Toc243156915" w:history="1">
+          <w:hyperlink w:anchor="_Toc243165313" w:history="1">
             <w:r>
               <w:rPr>
                 <w:rStyle w:val="Hyperlink"/>
@@ -2584,7 +2584,7 @@
               <w:rPr>
                 <w:noProof/>
               </w:rPr>
-              <w:instrText xml:space="preserve"> PAGEREF _Toc243156915 \h </w:instrText>
+              <w:instrText xml:space="preserve"> PAGEREF _Toc243165313 \h </w:instrText>
             </w:r>
             <w:r>
               <w:rPr>
@@ -2624,7 +2624,7 @@
               <w14:ligatures w14:val="standardContextual"/>
             </w:rPr>
           </w:pPr>
-          <w:hyperlink w:anchor="_Toc243156916" w:history="1">
+          <w:hyperlink w:anchor="_Toc243165314" w:history="1">
             <w:r>
               <w:rPr>
                 <w:rStyle w:val="Hyperlink"/>
@@ -2648,7 +2648,7 @@
               <w:rPr>
                 <w:noProof/>
               </w:rPr>
-              <w:instrText xml:space="preserve"> PAGEREF _Toc243156916 \h </w:instrText>
+              <w:instrText xml:space="preserve"> PAGEREF _Toc243165314 \h </w:instrText>
             </w:r>
             <w:r>
               <w:rPr>
@@ -2688,7 +2688,7 @@
               <w14:ligatures w14:val="standardContextual"/>
             </w:rPr>
           </w:pPr>
-          <w:hyperlink w:anchor="_Toc243156917" w:history="1">
+          <w:hyperlink w:anchor="_Toc243165315" w:history="1">
             <w:r>
               <w:rPr>
                 <w:rStyle w:val="Hyperlink"/>
@@ -2712,7 +2712,7 @@
               <w:rPr>
                 <w:noProof/>
               </w:rPr>
-              <w:instrText xml:space="preserve"> PAGEREF _Toc243156917 \h </w:instrText>
+              <w:instrText xml:space="preserve"> PAGEREF _Toc243165315 \h </w:instrText>
             </w:r>
             <w:r>
               <w:rPr>
@@ -2752,7 +2752,7 @@
               <w14:ligatures w14:val="standardContextual"/>
             </w:rPr>
           </w:pPr>
-          <w:hyperlink w:anchor="_Toc243156918" w:history="1">
+          <w:hyperlink w:anchor="_Toc243165316" w:history="1">
             <w:r>
               <w:rPr>
                 <w:rStyle w:val="Hyperlink"/>
@@ -2776,7 +2776,7 @@
               <w:rPr>
                 <w:noProof/>
               </w:rPr>
-              <w:instrText xml:space="preserve"> PAGEREF _Toc243156918 \h </w:instrText>
+              <w:instrText xml:space="preserve"> PAGEREF _Toc243165316 \h </w:instrText>
             </w:r>
             <w:r>
               <w:rPr>
@@ -2816,7 +2816,7 @@
               <w14:ligatures w14:val="standardContextual"/>
             </w:rPr>
           </w:pPr>
-          <w:hyperlink w:anchor="_Toc243156919" w:history="1">
+          <w:hyperlink w:anchor="_Toc243165317" w:history="1">
             <w:r>
               <w:rPr>
                 <w:rStyle w:val="Hyperlink"/>
@@ -2840,7 +2840,7 @@
               <w:rPr>
                 <w:noProof/>
               </w:rPr>
-              <w:instrText xml:space="preserve"> PAGEREF _Toc243156919 \h </w:instrText>
+              <w:instrText xml:space="preserve"> PAGEREF _Toc243165317 \h </w:instrText>
             </w:r>
             <w:r>
               <w:rPr>
@@ -2882,7 +2882,7 @@
               <w14:ligatures w14:val="standardContextual"/>
             </w:rPr>
           </w:pPr>
-          <w:hyperlink w:anchor="_Toc243156920" w:history="1">
+          <w:hyperlink w:anchor="_Toc243165318" w:history="1">
             <w:r>
               <w:rPr>
                 <w:rStyle w:val="Hyperlink"/>
@@ -2906,7 +2906,7 @@
               <w:rPr>
                 <w:noProof/>
               </w:rPr>
-              <w:instrText xml:space="preserve"> PAGEREF _Toc243156920 \h </w:instrText>
+              <w:instrText xml:space="preserve"> PAGEREF _Toc243165318 \h </w:instrText>
             </w:r>
             <w:r>
               <w:rPr>
@@ -2946,7 +2946,7 @@
               <w14:ligatures w14:val="standardContextual"/>
             </w:rPr>
           </w:pPr>
-          <w:hyperlink w:anchor="_Toc243156921" w:history="1">
+          <w:hyperlink w:anchor="_Toc243165319" w:history="1">
             <w:r>
               <w:rPr>
                 <w:rStyle w:val="Hyperlink"/>
@@ -2970,7 +2970,7 @@
               <w:rPr>
                 <w:noProof/>
               </w:rPr>
-              <w:instrText xml:space="preserve"> PAGEREF _Toc243156921 \h </w:instrText>
+              <w:instrText xml:space="preserve"> PAGEREF _Toc243165319 \h </w:instrText>
             </w:r>
             <w:r>
               <w:rPr>
@@ -3010,7 +3010,7 @@
               <w14:ligatures w14:val="standardContextual"/>
             </w:rPr>
           </w:pPr>
-          <w:hyperlink w:anchor="_Toc243156922" w:history="1">
+          <w:hyperlink w:anchor="_Toc243165320" w:history="1">
             <w:r>
               <w:rPr>
                 <w:rStyle w:val="Hyperlink"/>
@@ -3034,7 +3034,7 @@
               <w:rPr>
                 <w:noProof/>
               </w:rPr>
-              <w:instrText xml:space="preserve"> PAGEREF _Toc243156922 \h </w:instrText>
+              <w:instrText xml:space="preserve"> PAGEREF _Toc243165320 \h </w:instrText>
             </w:r>
             <w:r>
               <w:rPr>
@@ -3074,7 +3074,7 @@
               <w14:ligatures w14:val="standardContextual"/>
             </w:rPr>
           </w:pPr>
-          <w:hyperlink w:anchor="_Toc243156923" w:history="1">
+          <w:hyperlink w:anchor="_Toc243165321" w:history="1">
             <w:r>
               <w:rPr>
                 <w:rStyle w:val="Hyperlink"/>
@@ -3098,7 +3098,7 @@
               <w:rPr>
                 <w:noProof/>
               </w:rPr>
-              <w:instrText xml:space="preserve"> PAGEREF _Toc243156923 \h </w:instrText>
+              <w:instrText xml:space="preserve"> PAGEREF _Toc243165321 \h </w:instrText>
             </w:r>
             <w:r>
               <w:rPr>
@@ -3138,7 +3138,7 @@
               <w14:ligatures w14:val="standardContextual"/>
             </w:rPr>
           </w:pPr>
-          <w:hyperlink w:anchor="_Toc243156924" w:history="1">
+          <w:hyperlink w:anchor="_Toc243165322" w:history="1">
             <w:r>
               <w:rPr>
                 <w:rStyle w:val="Hyperlink"/>
@@ -3162,7 +3162,7 @@
               <w:rPr>
                 <w:noProof/>
               </w:rPr>
-              <w:instrText xml:space="preserve"> PAGEREF _Toc243156924 \h </w:instrText>
+              <w:instrText xml:space="preserve"> PAGEREF _Toc243165322 \h </w:instrText>
             </w:r>
             <w:r>
               <w:rPr>
@@ -3202,7 +3202,7 @@
               <w14:ligatures w14:val="standardContextual"/>
             </w:rPr>
           </w:pPr>
-          <w:hyperlink w:anchor="_Toc243156925" w:history="1">
+          <w:hyperlink w:anchor="_Toc243165323" w:history="1">
             <w:r>
               <w:rPr>
                 <w:rStyle w:val="Hyperlink"/>
@@ -3226,7 +3226,7 @@
               <w:rPr>
                 <w:noProof/>
               </w:rPr>
-              <w:instrText xml:space="preserve"> PAGEREF _Toc243156925 \h </w:instrText>
+              <w:instrText xml:space="preserve"> PAGEREF _Toc243165323 \h </w:instrText>
             </w:r>
             <w:r>
               <w:rPr>
@@ -3268,7 +3268,7 @@
               <w14:ligatures w14:val="standardContextual"/>
             </w:rPr>
           </w:pPr>
-          <w:hyperlink w:anchor="_Toc243156926" w:history="1">
+          <w:hyperlink w:anchor="_Toc243165324" w:history="1">
             <w:r>
               <w:rPr>
                 <w:rStyle w:val="Hyperlink"/>
@@ -3292,7 +3292,7 @@
               <w:rPr>
                 <w:noProof/>
               </w:rPr>
-              <w:instrText xml:space="preserve"> PAGEREF _Toc243156926 \h </w:instrText>
+              <w:instrText xml:space="preserve"> PAGEREF _Toc243165324 \h </w:instrText>
             </w:r>
             <w:r>
               <w:rPr>
@@ -3332,7 +3332,7 @@
               <w14:ligatures w14:val="standardContextual"/>
             </w:rPr>
           </w:pPr>
-          <w:hyperlink w:anchor="_Toc243156927" w:history="1">
+          <w:hyperlink w:anchor="_Toc243165325" w:history="1">
             <w:r>
               <w:rPr>
                 <w:rStyle w:val="Hyperlink"/>
@@ -3356,7 +3356,7 @@
               <w:rPr>
                 <w:noProof/>
               </w:rPr>
-              <w:instrText xml:space="preserve"> PAGEREF _Toc243156927 \h </w:instrText>
+              <w:instrText xml:space="preserve"> PAGEREF _Toc243165325 \h </w:instrText>
             </w:r>
             <w:r>
               <w:rPr>
@@ -3396,7 +3396,7 @@
               <w14:ligatures w14:val="standardContextual"/>
             </w:rPr>
           </w:pPr>
-          <w:hyperlink w:anchor="_Toc243156928" w:history="1">
+          <w:hyperlink w:anchor="_Toc243165326" w:history="1">
             <w:r>
               <w:rPr>
                 <w:rStyle w:val="Hyperlink"/>
@@ -3420,7 +3420,7 @@
               <w:rPr>
                 <w:noProof/>
               </w:rPr>
-              <w:instrText xml:space="preserve"> PAGEREF _Toc243156928 \h </w:instrText>
+              <w:instrText xml:space="preserve"> PAGEREF _Toc243165326 \h </w:instrText>
             </w:r>
             <w:r>
               <w:rPr>
@@ -3460,7 +3460,7 @@
               <w14:ligatures w14:val="standardContextual"/>
             </w:rPr>
           </w:pPr>
-          <w:hyperlink w:anchor="_Toc243156929" w:history="1">
+          <w:hyperlink w:anchor="_Toc243165327" w:history="1">
             <w:r>
               <w:rPr>
                 <w:rStyle w:val="Hyperlink"/>
@@ -3484,7 +3484,7 @@
               <w:rPr>
                 <w:noProof/>
               </w:rPr>
-              <w:instrText xml:space="preserve"> PAGEREF _Toc243156929 \h </w:instrText>
+              <w:instrText xml:space="preserve"> PAGEREF _Toc243165327 \h </w:instrText>
             </w:r>
             <w:r>
               <w:rPr>
@@ -3524,7 +3524,7 @@
               <w14:ligatures w14:val="standardContextual"/>
             </w:rPr>
           </w:pPr>
-          <w:hyperlink w:anchor="_Toc243156930" w:history="1">
+          <w:hyperlink w:anchor="_Toc243165328" w:history="1">
             <w:r>
               <w:rPr>
                 <w:rStyle w:val="Hyperlink"/>
@@ -3548,7 +3548,7 @@
               <w:rPr>
                 <w:noProof/>
               </w:rPr>
-              <w:instrText xml:space="preserve"> PAGEREF _Toc243156930 \h </w:instrText>
+              <w:instrText xml:space="preserve"> PAGEREF _Toc243165328 \h </w:instrText>
             </w:r>
             <w:r>
               <w:rPr>
@@ -3588,7 +3588,7 @@
               <w14:ligatures w14:val="standardContextual"/>
             </w:rPr>
           </w:pPr>
-          <w:hyperlink w:anchor="_Toc243156931" w:history="1">
+          <w:hyperlink w:anchor="_Toc243165329" w:history="1">
             <w:r>
               <w:rPr>
                 <w:rStyle w:val="Hyperlink"/>
@@ -3612,7 +3612,7 @@
               <w:rPr>
                 <w:noProof/>
               </w:rPr>
-              <w:instrText xml:space="preserve"> PAGEREF _Toc243156931 \h </w:instrText>
+              <w:instrText xml:space="preserve"> PAGEREF _Toc243165329 \h </w:instrText>
             </w:r>
             <w:r>
               <w:rPr>
@@ -3652,7 +3652,7 @@
               <w14:ligatures w14:val="standardContextual"/>
             </w:rPr>
           </w:pPr>
-          <w:hyperlink w:anchor="_Toc243156932" w:history="1">
+          <w:hyperlink w:anchor="_Toc243165330" w:history="1">
             <w:r>
               <w:rPr>
                 <w:rStyle w:val="Hyperlink"/>
@@ -3676,7 +3676,7 @@
               <w:rPr>
                 <w:noProof/>
               </w:rPr>
-              <w:instrText xml:space="preserve"> PAGEREF _Toc243156932 \h </w:instrText>
+              <w:instrText xml:space="preserve"> PAGEREF _Toc243165330 \h </w:instrText>
             </w:r>
             <w:r>
               <w:rPr>
@@ -3716,7 +3716,7 @@
               <w14:ligatures w14:val="standardContextual"/>
             </w:rPr>
           </w:pPr>
-          <w:hyperlink w:anchor="_Toc243156933" w:history="1">
+          <w:hyperlink w:anchor="_Toc243165331" w:history="1">
             <w:r>
               <w:rPr>
                 <w:rStyle w:val="Hyperlink"/>
@@ -3740,7 +3740,7 @@
               <w:rPr>
                 <w:noProof/>
               </w:rPr>
-              <w:instrText xml:space="preserve"> PAGEREF _Toc243156933 \h </w:instrText>
+              <w:instrText xml:space="preserve"> PAGEREF _Toc243165331 \h </w:instrText>
             </w:r>
             <w:r>
               <w:rPr>
@@ -3780,7 +3780,7 @@
               <w14:ligatures w14:val="standardContextual"/>
             </w:rPr>
           </w:pPr>
-          <w:hyperlink w:anchor="_Toc243156934" w:history="1">
+          <w:hyperlink w:anchor="_Toc243165332" w:history="1">
             <w:r>
               <w:rPr>
                 <w:rStyle w:val="Hyperlink"/>
@@ -3804,7 +3804,7 @@
               <w:rPr>
                 <w:noProof/>
               </w:rPr>
-              <w:instrText xml:space="preserve"> PAGEREF _Toc243156934 \h </w:instrText>
+              <w:instrText xml:space="preserve"> PAGEREF _Toc243165332 \h </w:instrText>
             </w:r>
             <w:r>
               <w:rPr>
@@ -3844,7 +3844,7 @@
               <w14:ligatures w14:val="standardContextual"/>
             </w:rPr>
           </w:pPr>
-          <w:hyperlink w:anchor="_Toc243156935" w:history="1">
+          <w:hyperlink w:anchor="_Toc243165333" w:history="1">
             <w:r>
               <w:rPr>
                 <w:rStyle w:val="Hyperlink"/>
@@ -3868,7 +3868,7 @@
               <w:rPr>
                 <w:noProof/>
               </w:rPr>
-              <w:instrText xml:space="preserve"> PAGEREF _Toc243156935 \h </w:instrText>
+              <w:instrText xml:space="preserve"> PAGEREF _Toc243165333 \h </w:instrText>
             </w:r>
             <w:r>
               <w:rPr>
@@ -3908,7 +3908,7 @@
               <w14:ligatures w14:val="standardContextual"/>
             </w:rPr>
           </w:pPr>
-          <w:hyperlink w:anchor="_Toc243156936" w:history="1">
+          <w:hyperlink w:anchor="_Toc243165334" w:history="1">
             <w:r>
               <w:rPr>
                 <w:rStyle w:val="Hyperlink"/>
@@ -3932,7 +3932,7 @@
               <w:rPr>
                 <w:noProof/>
               </w:rPr>
-              <w:instrText xml:space="preserve"> PAGEREF _Toc243156936 \h </w:instrText>
+              <w:instrText xml:space="preserve"> PAGEREF _Toc243165334 \h </w:instrText>
             </w:r>
             <w:r>
               <w:rPr>
@@ -3972,7 +3972,7 @@
               <w14:ligatures w14:val="standardContextual"/>
             </w:rPr>
           </w:pPr>
-          <w:hyperlink w:anchor="_Toc243156937" w:history="1">
+          <w:hyperlink w:anchor="_Toc243165335" w:history="1">
             <w:r>
               <w:rPr>
                 <w:rStyle w:val="Hyperlink"/>
@@ -3996,7 +3996,7 @@
               <w:rPr>
                 <w:noProof/>
               </w:rPr>
-              <w:instrText xml:space="preserve"> PAGEREF _Toc243156937 \h </w:instrText>
+              <w:instrText xml:space="preserve"> PAGEREF _Toc243165335 \h </w:instrText>
             </w:r>
             <w:r>
               <w:rPr>
@@ -4038,7 +4038,7 @@
               <w14:ligatures w14:val="standardContextual"/>
             </w:rPr>
           </w:pPr>
-          <w:hyperlink w:anchor="_Toc243156938" w:history="1">
+          <w:hyperlink w:anchor="_Toc243165336" w:history="1">
             <w:r>
               <w:rPr>
                 <w:rStyle w:val="Hyperlink"/>
@@ -4062,7 +4062,7 @@
               <w:rPr>
                 <w:noProof/>
               </w:rPr>
-              <w:instrText xml:space="preserve"> PAGEREF _Toc243156938 \h </w:instrText>
+              <w:instrText xml:space="preserve"> PAGEREF _Toc243165336 \h </w:instrText>
             </w:r>
             <w:r>
               <w:rPr>
@@ -4102,7 +4102,7 @@
               <w14:ligatures w14:val="standardContextual"/>
             </w:rPr>
           </w:pPr>
-          <w:hyperlink w:anchor="_Toc243156939" w:history="1">
+          <w:hyperlink w:anchor="_Toc243165337" w:history="1">
             <w:r>
               <w:rPr>
                 <w:rStyle w:val="Hyperlink"/>
@@ -4126,7 +4126,7 @@
               <w:rPr>
                 <w:noProof/>
               </w:rPr>
-              <w:instrText xml:space="preserve"> PAGEREF _Toc243156939 \h </w:instrText>
+              <w:instrText xml:space="preserve"> PAGEREF _Toc243165337 \h </w:instrText>
             </w:r>
             <w:r>
               <w:rPr>
@@ -4166,7 +4166,7 @@
               <w14:ligatures w14:val="standardContextual"/>
             </w:rPr>
           </w:pPr>
-          <w:hyperlink w:anchor="_Toc243156940" w:history="1">
+          <w:hyperlink w:anchor="_Toc243165338" w:history="1">
             <w:r>
               <w:rPr>
                 <w:rStyle w:val="Hyperlink"/>
@@ -4190,7 +4190,7 @@
               <w:rPr>
                 <w:noProof/>
               </w:rPr>
-              <w:instrText xml:space="preserve"> PAGEREF _Toc243156940 \h </w:instrText>
+              <w:instrText xml:space="preserve"> PAGEREF _Toc243165338 \h </w:instrText>
             </w:r>
             <w:r>
               <w:rPr>
@@ -4230,7 +4230,7 @@
               <w14:ligatures w14:val="standardContextual"/>
             </w:rPr>
           </w:pPr>
-          <w:hyperlink w:anchor="_Toc243156941" w:history="1">
+          <w:hyperlink w:anchor="_Toc243165339" w:history="1">
             <w:r>
               <w:rPr>
                 <w:rStyle w:val="Hyperlink"/>
@@ -4254,7 +4254,7 @@
               <w:rPr>
                 <w:noProof/>
               </w:rPr>
-              <w:instrText xml:space="preserve"> PAGEREF _Toc243156941 \h </w:instrText>
+              <w:instrText xml:space="preserve"> PAGEREF _Toc243165339 \h </w:instrText>
             </w:r>
             <w:r>
               <w:rPr>
@@ -4294,7 +4294,7 @@
               <w14:ligatures w14:val="standardContextual"/>
             </w:rPr>
           </w:pPr>
-          <w:hyperlink w:anchor="_Toc243156942" w:history="1">
+          <w:hyperlink w:anchor="_Toc243165340" w:history="1">
             <w:r>
               <w:rPr>
                 <w:rStyle w:val="Hyperlink"/>
@@ -4318,7 +4318,7 @@
               <w:rPr>
                 <w:noProof/>
               </w:rPr>
-              <w:instrText xml:space="preserve"> PAGEREF _Toc243156942 \h </w:instrText>
+              <w:instrText xml:space="preserve"> PAGEREF _Toc243165340 \h </w:instrText>
             </w:r>
             <w:r>
               <w:rPr>
@@ -4358,7 +4358,7 @@
               <w14:ligatures w14:val="standardContextual"/>
             </w:rPr>
           </w:pPr>
-          <w:hyperlink w:anchor="_Toc243156943" w:history="1">
+          <w:hyperlink w:anchor="_Toc243165341" w:history="1">
             <w:r>
               <w:rPr>
                 <w:rStyle w:val="Hyperlink"/>
@@ -4382,7 +4382,7 @@
               <w:rPr>
                 <w:noProof/>
               </w:rPr>
-              <w:instrText xml:space="preserve"> PAGEREF _Toc243156943 \h </w:instrText>
+              <w:instrText xml:space="preserve"> PAGEREF _Toc243165341 \h </w:instrText>
             </w:r>
             <w:r>
               <w:rPr>
@@ -4422,7 +4422,7 @@
               <w14:ligatures w14:val="standardContextual"/>
             </w:rPr>
           </w:pPr>
-          <w:hyperlink w:anchor="_Toc243156944" w:history="1">
+          <w:hyperlink w:anchor="_Toc243165342" w:history="1">
             <w:r>
               <w:rPr>
                 <w:rStyle w:val="Hyperlink"/>
@@ -4446,7 +4446,7 @@
               <w:rPr>
                 <w:noProof/>
               </w:rPr>
-              <w:instrText xml:space="preserve"> PAGEREF _Toc243156944 \h </w:instrText>
+              <w:instrText xml:space="preserve"> PAGEREF _Toc243165342 \h </w:instrText>
             </w:r>
             <w:r>
               <w:rPr>
@@ -4486,7 +4486,7 @@
               <w14:ligatures w14:val="standardContextual"/>
             </w:rPr>
           </w:pPr>
-          <w:hyperlink w:anchor="_Toc243156945" w:history="1">
+          <w:hyperlink w:anchor="_Toc243165343" w:history="1">
             <w:r>
               <w:rPr>
                 <w:rStyle w:val="Hyperlink"/>
@@ -4510,7 +4510,7 @@
               <w:rPr>
                 <w:noProof/>
               </w:rPr>
-              <w:instrText xml:space="preserve"> PAGEREF _Toc243156945 \h </w:instrText>
+              <w:instrText xml:space="preserve"> PAGEREF _Toc243165343 \h </w:instrText>
             </w:r>
             <w:r>
               <w:rPr>
@@ -4550,7 +4550,7 @@
               <w14:ligatures w14:val="standardContextual"/>
             </w:rPr>
           </w:pPr>
-          <w:hyperlink w:anchor="_Toc243156946" w:history="1">
+          <w:hyperlink w:anchor="_Toc243165344" w:history="1">
             <w:r>
               <w:rPr>
                 <w:rStyle w:val="Hyperlink"/>
@@ -4574,7 +4574,7 @@
               <w:rPr>
                 <w:noProof/>
               </w:rPr>
-              <w:instrText xml:space="preserve"> PAGEREF _Toc243156946 \h </w:instrText>
+              <w:instrText xml:space="preserve"> PAGEREF _Toc243165344 \h </w:instrText>
             </w:r>
             <w:r>
               <w:rPr>
@@ -4614,7 +4614,7 @@
               <w14:ligatures w14:val="standardContextual"/>
             </w:rPr>
           </w:pPr>
-          <w:hyperlink w:anchor="_Toc243156947" w:history="1">
+          <w:hyperlink w:anchor="_Toc243165345" w:history="1">
             <w:r>
               <w:rPr>
                 <w:rStyle w:val="Hyperlink"/>
@@ -4638,7 +4638,7 @@
               <w:rPr>
                 <w:noProof/>
               </w:rPr>
-              <w:instrText xml:space="preserve"> PAGEREF _Toc243156947 \h </w:instrText>
+              <w:instrText xml:space="preserve"> PAGEREF _Toc243165345 \h </w:instrText>
             </w:r>
             <w:r>
               <w:rPr>
@@ -4678,7 +4678,7 @@
               <w14:ligatures w14:val="standardContextual"/>
             </w:rPr>
           </w:pPr>
-          <w:hyperlink w:anchor="_Toc243156948" w:history="1">
+          <w:hyperlink w:anchor="_Toc243165346" w:history="1">
             <w:r>
               <w:rPr>
                 <w:rStyle w:val="Hyperlink"/>
@@ -4702,7 +4702,7 @@
               <w:rPr>
                 <w:noProof/>
               </w:rPr>
-              <w:instrText xml:space="preserve"> PAGEREF _Toc243156948 \h </w:instrText>
+              <w:instrText xml:space="preserve"> PAGEREF _Toc243165346 \h </w:instrText>
             </w:r>
             <w:r>
               <w:rPr>
@@ -4742,7 +4742,7 @@
               <w14:ligatures w14:val="standardContextual"/>
             </w:rPr>
           </w:pPr>
-          <w:hyperlink w:anchor="_Toc243156949" w:history="1">
+          <w:hyperlink w:anchor="_Toc243165347" w:history="1">
             <w:r>
               <w:rPr>
                 <w:rStyle w:val="Hyperlink"/>
@@ -4766,7 +4766,7 @@
               <w:rPr>
                 <w:noProof/>
               </w:rPr>
-              <w:instrText xml:space="preserve"> PAGEREF _Toc243156949 \h </w:instrText>
+              <w:instrText xml:space="preserve"> PAGEREF _Toc243165347 \h </w:instrText>
             </w:r>
             <w:r>
               <w:rPr>
@@ -4806,7 +4806,7 @@
               <w14:ligatures w14:val="standardContextual"/>
             </w:rPr>
           </w:pPr>
-          <w:hyperlink w:anchor="_Toc243156950" w:history="1">
+          <w:hyperlink w:anchor="_Toc243165348" w:history="1">
             <w:r>
               <w:rPr>
                 <w:rStyle w:val="Hyperlink"/>
@@ -4830,7 +4830,7 @@
               <w:rPr>
                 <w:noProof/>
               </w:rPr>
-              <w:instrText xml:space="preserve"> PAGEREF _Toc243156950 \h </w:instrText>
+              <w:instrText xml:space="preserve"> PAGEREF _Toc243165348 \h </w:instrText>
             </w:r>
             <w:r>
               <w:rPr>
@@ -4870,7 +4870,7 @@
               <w14:ligatures w14:val="standardContextual"/>
             </w:rPr>
           </w:pPr>
-          <w:hyperlink w:anchor="_Toc243156951" w:history="1">
+          <w:hyperlink w:anchor="_Toc243165349" w:history="1">
             <w:r>
               <w:rPr>
                 <w:rStyle w:val="Hyperlink"/>
@@ -4894,7 +4894,7 @@
               <w:rPr>
                 <w:noProof/>
               </w:rPr>
-              <w:instrText xml:space="preserve"> PAGEREF _Toc243156951 \h </w:instrText>
+              <w:instrText xml:space="preserve"> PAGEREF _Toc243165349 \h </w:instrText>
             </w:r>
             <w:r>
               <w:rPr>
@@ -4934,7 +4934,7 @@
               <w14:ligatures w14:val="standardContextual"/>
             </w:rPr>
           </w:pPr>
-          <w:hyperlink w:anchor="_Toc243156952" w:history="1">
+          <w:hyperlink w:anchor="_Toc243165350" w:history="1">
             <w:r>
               <w:rPr>
                 <w:rStyle w:val="Hyperlink"/>
@@ -4958,7 +4958,7 @@
               <w:rPr>
                 <w:noProof/>
               </w:rPr>
-              <w:instrText xml:space="preserve"> PAGEREF _Toc243156952 \h </w:instrText>
+              <w:instrText xml:space="preserve"> PAGEREF _Toc243165350 \h </w:instrText>
             </w:r>
             <w:r>
               <w:rPr>
@@ -4998,7 +4998,7 @@
               <w14:ligatures w14:val="standardContextual"/>
             </w:rPr>
           </w:pPr>
-          <w:hyperlink w:anchor="_Toc243156953" w:history="1">
+          <w:hyperlink w:anchor="_Toc243165351" w:history="1">
             <w:r>
               <w:rPr>
                 <w:rStyle w:val="Hyperlink"/>
@@ -5022,7 +5022,7 @@
               <w:rPr>
                 <w:noProof/>
               </w:rPr>
-              <w:instrText xml:space="preserve"> PAGEREF _Toc243156953 \h </w:instrText>
+              <w:instrText xml:space="preserve"> PAGEREF _Toc243165351 \h </w:instrText>
             </w:r>
             <w:r>
               <w:rPr>
@@ -5064,7 +5064,7 @@
               <w14:ligatures w14:val="standardContextual"/>
             </w:rPr>
           </w:pPr>
-          <w:hyperlink w:anchor="_Toc243156954" w:history="1">
+          <w:hyperlink w:anchor="_Toc243165352" w:history="1">
             <w:r>
               <w:rPr>
                 <w:rStyle w:val="Hyperlink"/>
@@ -5088,7 +5088,7 @@
               <w:rPr>
                 <w:noProof/>
               </w:rPr>
-              <w:instrText xml:space="preserve"> PAGEREF _Toc243156954 \h </w:instrText>
+              <w:instrText xml:space="preserve"> PAGEREF _Toc243165352 \h </w:instrText>
             </w:r>
             <w:r>
               <w:rPr>
@@ -5130,7 +5130,7 @@
               <w14:ligatures w14:val="standardContextual"/>
             </w:rPr>
           </w:pPr>
-          <w:hyperlink w:anchor="_Toc243156955" w:history="1">
+          <w:hyperlink w:anchor="_Toc243165353" w:history="1">
             <w:r>
               <w:rPr>
                 <w:rStyle w:val="Hyperlink"/>
@@ -5154,7 +5154,7 @@
               <w:rPr>
                 <w:noProof/>
               </w:rPr>
-              <w:instrText xml:space="preserve"> PAGEREF _Toc243156955 \h </w:instrText>
+              <w:instrText xml:space="preserve"> PAGEREF _Toc243165353 \h </w:instrText>
             </w:r>
             <w:r>
               <w:rPr>
@@ -5196,7 +5196,7 @@
               <w14:ligatures w14:val="standardContextual"/>
             </w:rPr>
           </w:pPr>
-          <w:hyperlink w:anchor="_Toc243156956" w:history="1">
+          <w:hyperlink w:anchor="_Toc243165354" w:history="1">
             <w:r>
               <w:rPr>
                 <w:rStyle w:val="Hyperlink"/>
@@ -5220,7 +5220,7 @@
               <w:rPr>
                 <w:noProof/>
               </w:rPr>
-              <w:instrText xml:space="preserve"> PAGEREF _Toc243156956 \h </w:instrText>
+              <w:instrText xml:space="preserve"> PAGEREF _Toc243165354 \h </w:instrText>
             </w:r>
             <w:r>
               <w:rPr>
@@ -5262,7 +5262,7 @@
               <w14:ligatures w14:val="standardContextual"/>
             </w:rPr>
           </w:pPr>
-          <w:hyperlink w:anchor="_Toc243156957" w:history="1">
+          <w:hyperlink w:anchor="_Toc243165355" w:history="1">
             <w:r>
               <w:rPr>
                 <w:rStyle w:val="Hyperlink"/>
@@ -5286,7 +5286,7 @@
               <w:rPr>
                 <w:noProof/>
               </w:rPr>
-              <w:instrText xml:space="preserve"> PAGEREF _Toc243156957 \h </w:instrText>
+              <w:instrText xml:space="preserve"> PAGEREF _Toc243165355 \h </w:instrText>
             </w:r>
             <w:r>
               <w:rPr>
@@ -5328,7 +5328,7 @@
               <w14:ligatures w14:val="standardContextual"/>
             </w:rPr>
           </w:pPr>
-          <w:hyperlink w:anchor="_Toc243156958" w:history="1">
+          <w:hyperlink w:anchor="_Toc243165356" w:history="1">
             <w:r>
               <w:rPr>
                 <w:rStyle w:val="Hyperlink"/>
@@ -5352,7 +5352,7 @@
               <w:rPr>
                 <w:noProof/>
               </w:rPr>
-              <w:instrText xml:space="preserve"> PAGEREF _Toc243156958 \h </w:instrText>
+              <w:instrText xml:space="preserve"> PAGEREF _Toc243165356 \h </w:instrText>
             </w:r>
             <w:r>
               <w:rPr>
@@ -5394,7 +5394,7 @@
               <w14:ligatures w14:val="standardContextual"/>
             </w:rPr>
           </w:pPr>
-          <w:hyperlink w:anchor="_Toc243156959" w:history="1">
+          <w:hyperlink w:anchor="_Toc243165357" w:history="1">
             <w:r>
               <w:rPr>
                 <w:rStyle w:val="Hyperlink"/>
@@ -5418,7 +5418,7 @@
               <w:rPr>
                 <w:noProof/>
               </w:rPr>
-              <w:instrText xml:space="preserve"> PAGEREF _Toc243156959 \h </w:instrText>
+              <w:instrText xml:space="preserve"> PAGEREF _Toc243165357 \h </w:instrText>
             </w:r>
             <w:r>
               <w:rPr>
@@ -5460,7 +5460,7 @@
               <w14:ligatures w14:val="standardContextual"/>
             </w:rPr>
           </w:pPr>
-          <w:hyperlink w:anchor="_Toc243156960" w:history="1">
+          <w:hyperlink w:anchor="_Toc243165358" w:history="1">
             <w:r>
               <w:rPr>
                 <w:rStyle w:val="Hyperlink"/>
@@ -5484,7 +5484,7 @@
               <w:rPr>
                 <w:noProof/>
               </w:rPr>
-              <w:instrText xml:space="preserve"> PAGEREF _Toc243156960 \h </w:instrText>
+              <w:instrText xml:space="preserve"> PAGEREF _Toc243165358 \h </w:instrText>
             </w:r>
             <w:r>
               <w:rPr>
@@ -5533,7 +5533,7 @@
       <w:pPr>
         <w:pStyle w:val="Ttulo1"/>
       </w:pPr>
-      <w:bookmarkStart w:id="0" w:name="_Toc243156915"/>
+      <w:bookmarkStart w:id="0" w:name="_Toc243165313"/>
       <w:r>
         <w:t>1 INTRODUÇÃO</w:t>
       </w:r>
@@ -5605,7 +5605,7 @@
       <w:pPr>
         <w:pStyle w:val="Ttulo2"/>
       </w:pPr>
-      <w:bookmarkStart w:id="1" w:name="_Toc243156916"/>
+      <w:bookmarkStart w:id="1" w:name="_Toc243165314"/>
       <w:r>
         <w:t>1.1 OBJETIVOS</w:t>
       </w:r>
@@ -5615,7 +5615,7 @@
       <w:pPr>
         <w:pStyle w:val="Ttulo3"/>
       </w:pPr>
-      <w:bookmarkStart w:id="2" w:name="_Toc243156917"/>
+      <w:bookmarkStart w:id="2" w:name="_Toc243165315"/>
       <w:r>
         <w:t>1.1.1 Objetivo geral</w:t>
       </w:r>
@@ -5634,7 +5634,7 @@
       <w:pPr>
         <w:pStyle w:val="Ttulo3"/>
       </w:pPr>
-      <w:bookmarkStart w:id="3" w:name="_Toc243156918"/>
+      <w:bookmarkStart w:id="3" w:name="_Toc243165316"/>
       <w:r>
         <w:t>1.1.2 Objetivos específicos</w:t>
       </w:r>
@@ -5742,7 +5742,7 @@
       <w:pPr>
         <w:pStyle w:val="Ttulo2"/>
       </w:pPr>
-      <w:bookmarkStart w:id="4" w:name="_Toc243156919"/>
+      <w:bookmarkStart w:id="4" w:name="_Toc243165317"/>
       <w:r>
         <w:t>1.2 ORGANIZAÇÃO DO RELATÓRIO</w:t>
       </w:r>
@@ -5761,7 +5761,7 @@
       <w:pPr>
         <w:pStyle w:val="Ttulo1"/>
       </w:pPr>
-      <w:bookmarkStart w:id="5" w:name="_Toc243156920"/>
+      <w:bookmarkStart w:id="5" w:name="_Toc243165318"/>
       <w:r>
         <w:t>2 FUNDAMENTAÇÃO TEÓRICA</w:t>
       </w:r>
@@ -5780,7 +5780,7 @@
       <w:pPr>
         <w:pStyle w:val="Ttulo2"/>
       </w:pPr>
-      <w:bookmarkStart w:id="6" w:name="_Toc243156921"/>
+      <w:bookmarkStart w:id="6" w:name="_Toc243165319"/>
       <w:r>
         <w:t>2.1 MARCADORES BIOQUÍMICOS NO DIAGNÓSTICO CLÍNICO</w:t>
       </w:r>
@@ -5812,7 +5812,7 @@
       <w:pPr>
         <w:pStyle w:val="LegendaABNT"/>
       </w:pPr>
-      <w:bookmarkStart w:id="7" w:name="_Toc243156973"/>
+      <w:bookmarkStart w:id="7" w:name="_Toc243165371"/>
       <w:r>
         <w:t xml:space="preserve">Quadro </w:t>
       </w:r>
@@ -6350,7 +6350,7 @@
       <w:pPr>
         <w:pStyle w:val="Ttulo2"/>
       </w:pPr>
-      <w:bookmarkStart w:id="8" w:name="_Toc243156922"/>
+      <w:bookmarkStart w:id="8" w:name="_Toc243165320"/>
       <w:r>
         <w:t>2.2 PRÁTICA DE RECUPERAÇÃO E REPETIÇÃO ESPAÇADA</w:t>
       </w:r>
@@ -6430,7 +6430,7 @@
       <w:pPr>
         <w:pStyle w:val="Ttulo2"/>
       </w:pPr>
-      <w:bookmarkStart w:id="9" w:name="_Toc243156923"/>
+      <w:bookmarkStart w:id="9" w:name="_Toc243165321"/>
       <w:r>
         <w:t>2.3 O ALGORITMO SM-2</w:t>
       </w:r>
@@ -6506,7 +6506,7 @@
       <w:pPr>
         <w:pStyle w:val="Ttulo2"/>
       </w:pPr>
-      <w:bookmarkStart w:id="10" w:name="_Toc243156924"/>
+      <w:bookmarkStart w:id="10" w:name="_Toc243165322"/>
       <w:r>
         <w:t>2.4 GAMIFICAÇÃO E MOTIVAÇÃO</w:t>
       </w:r>
@@ -6584,7 +6584,7 @@
       <w:pPr>
         <w:pStyle w:val="Ttulo2"/>
       </w:pPr>
-      <w:bookmarkStart w:id="11" w:name="_Toc243156925"/>
+      <w:bookmarkStart w:id="11" w:name="_Toc243165323"/>
       <w:r>
         <w:t>2.5 METACOGNIÇÃO E CALIBRAÇÃO</w:t>
       </w:r>
@@ -6632,7 +6632,7 @@
       <w:pPr>
         <w:pStyle w:val="Ttulo1"/>
       </w:pPr>
-      <w:bookmarkStart w:id="12" w:name="_Toc243156926"/>
+      <w:bookmarkStart w:id="12" w:name="_Toc243165324"/>
       <w:r>
         <w:t>3 MATERIAIS E MÉTODOS</w:t>
       </w:r>
@@ -6642,7 +6642,7 @@
       <w:pPr>
         <w:pStyle w:val="Ttulo2"/>
       </w:pPr>
-      <w:bookmarkStart w:id="13" w:name="_Toc243156927"/>
+      <w:bookmarkStart w:id="13" w:name="_Toc243165325"/>
       <w:r>
         <w:t>3.1 NATUREZA DA PESQUISA E ETAPAS</w:t>
       </w:r>
@@ -6779,7 +6779,7 @@
       <w:pPr>
         <w:pStyle w:val="Ttulo2"/>
       </w:pPr>
-      <w:bookmarkStart w:id="14" w:name="_Toc243156928"/>
+      <w:bookmarkStart w:id="14" w:name="_Toc243165326"/>
       <w:r>
         <w:t>3.2 CURADORIA DO CONTEÚDO</w:t>
       </w:r>
@@ -6833,20 +6833,14 @@
         <w:t>flashcards</w:t>
       </w:r>
       <w:r>
-        <w:t xml:space="preserve"> contra as fichas e as fontes corrigiu 17 cartões com valores divergentes ou erros de conteúdo. </w:t>
-      </w:r>
-      <w:r>
-        <w:rPr>
-          <w:highlight w:val="yellow"/>
-        </w:rPr>
-        <w:t>[CONFIRMAR: se o conteúdo foi revisado pelo orientador ou por docente da área da saúde, e como.]</w:t>
+        <w:t xml:space="preserve"> contra as fichas e as fontes corrigiu 17 cartões com valores divergentes ou erros de conteúdo. O conteúdo não passou por revisão formal de um docente da área da saúde: foi conferido pelo autor nas fontes citadas e ajustado a partir das observações de profissionais da área e de estudantes que já haviam cursado a disciplina, na avaliação formativa (seção 3.6.1).</w:t>
       </w:r>
     </w:p>
     <w:p>
       <w:pPr>
         <w:pStyle w:val="Ttulo2"/>
       </w:pPr>
-      <w:bookmarkStart w:id="15" w:name="_Toc243156929"/>
+      <w:bookmarkStart w:id="15" w:name="_Toc243165327"/>
       <w:r>
         <w:t>3.3 TECNOLOGIAS UTILIZADAS</w:t>
       </w:r>
@@ -6866,7 +6860,7 @@
       <w:pPr>
         <w:pStyle w:val="LegendaABNT"/>
       </w:pPr>
-      <w:bookmarkStart w:id="16" w:name="_Toc243156974"/>
+      <w:bookmarkStart w:id="16" w:name="_Toc243165372"/>
       <w:r>
         <w:t xml:space="preserve">Quadro </w:t>
       </w:r>
@@ -8416,7 +8410,7 @@
       <w:pPr>
         <w:pStyle w:val="Ttulo2"/>
       </w:pPr>
-      <w:bookmarkStart w:id="17" w:name="_Toc243156930"/>
+      <w:bookmarkStart w:id="17" w:name="_Toc243165328"/>
       <w:r>
         <w:t>3.4 ARQUITETURA DO SOFTWARE</w:t>
       </w:r>
@@ -8436,7 +8430,7 @@
       <w:pPr>
         <w:pStyle w:val="LegendaABNT"/>
       </w:pPr>
-      <w:bookmarkStart w:id="18" w:name="_Toc243156961"/>
+      <w:bookmarkStart w:id="18" w:name="_Toc243165359"/>
       <w:r>
         <w:t xml:space="preserve">Figura </w:t>
       </w:r>
@@ -8474,7 +8468,7 @@
           <w:noProof/>
         </w:rPr>
         <w:drawing>
-          <wp:inline distT="0" distB="0" distL="0" distR="0" wp14:anchorId="264043D2" wp14:editId="0A7697E7">
+          <wp:inline distT="0" distB="0" distL="0" distR="0" wp14:anchorId="39DFEC5A" wp14:editId="5E7AFAEE">
             <wp:extent cx="5762625" cy="3714750"/>
             <wp:effectExtent l="0" t="0" r="0" b="0"/>
             <wp:docPr id="1" name="arquitetura.png" descr="Arquitetura do BioquímicaEDU" title="Arquitetura do BioquímicaEDU"/>
@@ -8537,7 +8531,7 @@
       <w:pPr>
         <w:pStyle w:val="Ttulo2"/>
       </w:pPr>
-      <w:bookmarkStart w:id="19" w:name="_Toc243156931"/>
+      <w:bookmarkStart w:id="19" w:name="_Toc243165329"/>
       <w:r>
         <w:t>3.5 VERIFICAÇÃO DO SOFTWARE</w:t>
       </w:r>
@@ -8578,7 +8572,7 @@
       <w:pPr>
         <w:pStyle w:val="Ttulo2"/>
       </w:pPr>
-      <w:bookmarkStart w:id="20" w:name="_Toc243156932"/>
+      <w:bookmarkStart w:id="20" w:name="_Toc243165330"/>
       <w:r>
         <w:t>3.6 AVALIAÇÃO COM USUÁRIOS</w:t>
       </w:r>
@@ -8597,7 +8591,7 @@
       <w:pPr>
         <w:pStyle w:val="Ttulo3"/>
       </w:pPr>
-      <w:bookmarkStart w:id="21" w:name="_Toc243156933"/>
+      <w:bookmarkStart w:id="21" w:name="_Toc243165331"/>
       <w:r>
         <w:t>3.6.1 Avaliação formativa</w:t>
       </w:r>
@@ -8619,7 +8613,7 @@
       <w:pPr>
         <w:pStyle w:val="Ttulo3"/>
       </w:pPr>
-      <w:bookmarkStart w:id="22" w:name="_Toc243156934"/>
+      <w:bookmarkStart w:id="22" w:name="_Toc243165332"/>
       <w:r>
         <w:t>3.6.2 Pré-teste e pós-teste</w:t>
       </w:r>
@@ -8665,7 +8659,7 @@
       <w:pPr>
         <w:pStyle w:val="Ttulo3"/>
       </w:pPr>
-      <w:bookmarkStart w:id="23" w:name="_Toc243156935"/>
+      <w:bookmarkStart w:id="23" w:name="_Toc243165333"/>
       <w:r>
         <w:t>3.6.3 Questionário de opinião</w:t>
       </w:r>
@@ -8687,7 +8681,7 @@
       <w:pPr>
         <w:pStyle w:val="Ttulo3"/>
       </w:pPr>
-      <w:bookmarkStart w:id="24" w:name="_Toc243156936"/>
+      <w:bookmarkStart w:id="24" w:name="_Toc243165334"/>
       <w:r>
         <w:t>3.6.4 Aspectos éticos e proteção de dados</w:t>
       </w:r>
@@ -8715,7 +8709,7 @@
       <w:pPr>
         <w:pStyle w:val="Ttulo2"/>
       </w:pPr>
-      <w:bookmarkStart w:id="25" w:name="_Toc243156937"/>
+      <w:bookmarkStart w:id="25" w:name="_Toc243165335"/>
       <w:r>
         <w:t>3.7 USO DE FERRAMENTAS DE INTELIGÊNCIA ARTIFICIAL</w:t>
       </w:r>
@@ -8740,7 +8734,7 @@
       <w:pPr>
         <w:pStyle w:val="Ttulo1"/>
       </w:pPr>
-      <w:bookmarkStart w:id="26" w:name="_Toc243156938"/>
+      <w:bookmarkStart w:id="26" w:name="_Toc243165336"/>
       <w:r>
         <w:t>4 RESULTADOS</w:t>
       </w:r>
@@ -8750,7 +8744,7 @@
       <w:pPr>
         <w:pStyle w:val="Ttulo2"/>
       </w:pPr>
-      <w:bookmarkStart w:id="27" w:name="_Toc243156939"/>
+      <w:bookmarkStart w:id="27" w:name="_Toc243165337"/>
       <w:r>
         <w:t>4.1 VISÃO GERAL DO SOFTWARE</w:t>
       </w:r>
@@ -8770,7 +8764,7 @@
       <w:pPr>
         <w:pStyle w:val="LegendaABNT"/>
       </w:pPr>
-      <w:bookmarkStart w:id="28" w:name="_Toc243156975"/>
+      <w:bookmarkStart w:id="28" w:name="_Toc243165373"/>
       <w:r>
         <w:t xml:space="preserve">Quadro </w:t>
       </w:r>
@@ -9257,7 +9251,7 @@
       <w:pPr>
         <w:pStyle w:val="LegendaABNT"/>
       </w:pPr>
-      <w:bookmarkStart w:id="29" w:name="_Toc243156980"/>
+      <w:bookmarkStart w:id="29" w:name="_Toc243165378"/>
       <w:r>
         <w:t xml:space="preserve">Tabela </w:t>
       </w:r>
@@ -10637,7 +10631,7 @@
       <w:pPr>
         <w:pStyle w:val="LegendaABNT"/>
       </w:pPr>
-      <w:bookmarkStart w:id="30" w:name="_Toc243156981"/>
+      <w:bookmarkStart w:id="30" w:name="_Toc243165379"/>
       <w:r>
         <w:t xml:space="preserve">Tabela </w:t>
       </w:r>
@@ -11324,7 +11318,7 @@
       <w:pPr>
         <w:pStyle w:val="Ttulo2"/>
       </w:pPr>
-      <w:bookmarkStart w:id="31" w:name="_Toc243156940"/>
+      <w:bookmarkStart w:id="31" w:name="_Toc243165338"/>
       <w:r>
         <w:t>4.2 MOTOR DE APRENDIZAGEM</w:t>
       </w:r>
@@ -11356,7 +11350,7 @@
       <w:pPr>
         <w:pStyle w:val="LegendaABNT"/>
       </w:pPr>
-      <w:bookmarkStart w:id="32" w:name="_Toc243156976"/>
+      <w:bookmarkStart w:id="32" w:name="_Toc243165374"/>
       <w:r>
         <w:t xml:space="preserve">Quadro </w:t>
       </w:r>
@@ -11954,7 +11948,7 @@
       <w:pPr>
         <w:pStyle w:val="LegendaABNT"/>
       </w:pPr>
-      <w:bookmarkStart w:id="33" w:name="_Toc243156962"/>
+      <w:bookmarkStart w:id="33" w:name="_Toc243165360"/>
       <w:r>
         <w:t xml:space="preserve">Figura </w:t>
       </w:r>
@@ -11992,7 +11986,7 @@
           <w:noProof/>
         </w:rPr>
         <w:drawing>
-          <wp:inline distT="0" distB="0" distL="0" distR="0" wp14:anchorId="02AE1D6A" wp14:editId="6CAB0A3A">
+          <wp:inline distT="0" distB="0" distL="0" distR="0" wp14:anchorId="2EF96C2E" wp14:editId="31B7F3E2">
             <wp:extent cx="5400675" cy="2971800"/>
             <wp:effectExtent l="0" t="0" r="0" b="0"/>
             <wp:docPr id="2" name="sm2_intervalos.png" descr="Intervalos calculados pelo motor em três sequências de respostas" title="Intervalos calculados pelo motor em três sequências de respostas"/>
@@ -12053,7 +12047,7 @@
       <w:pPr>
         <w:pStyle w:val="LegendaABNT"/>
       </w:pPr>
-      <w:bookmarkStart w:id="34" w:name="_Toc243156982"/>
+      <w:bookmarkStart w:id="34" w:name="_Toc243165380"/>
       <w:r>
         <w:t xml:space="preserve">Tabela </w:t>
       </w:r>
@@ -12880,7 +12874,7 @@
       <w:pPr>
         <w:pStyle w:val="Ttulo2"/>
       </w:pPr>
-      <w:bookmarkStart w:id="35" w:name="_Toc243156941"/>
+      <w:bookmarkStart w:id="35" w:name="_Toc243165339"/>
       <w:r>
         <w:t>4.3 VERSÃO PARA DISPOSITIVOS MÓVEIS</w:t>
       </w:r>
@@ -12900,7 +12894,7 @@
       <w:pPr>
         <w:pStyle w:val="LegendaABNT"/>
       </w:pPr>
-      <w:bookmarkStart w:id="36" w:name="_Toc243156963"/>
+      <w:bookmarkStart w:id="36" w:name="_Toc243165361"/>
       <w:r>
         <w:t xml:space="preserve">Figura </w:t>
       </w:r>
@@ -12938,7 +12932,7 @@
           <w:noProof/>
         </w:rPr>
         <w:drawing>
-          <wp:inline distT="0" distB="0" distL="0" distR="0" wp14:anchorId="78B43F0B" wp14:editId="35E37006">
+          <wp:inline distT="0" distB="0" distL="0" distR="0" wp14:anchorId="7913F067" wp14:editId="0CFA8E51">
             <wp:extent cx="5762625" cy="4086225"/>
             <wp:effectExtent l="0" t="0" r="0" b="0"/>
             <wp:docPr id="3" name="telas_inicio_estudo.png" descr="Início e estudo na versão móvel" title="Início e estudo na versão móvel"/>
@@ -13008,7 +13002,7 @@
       <w:pPr>
         <w:pStyle w:val="LegendaABNT"/>
       </w:pPr>
-      <w:bookmarkStart w:id="37" w:name="_Toc243156964"/>
+      <w:bookmarkStart w:id="37" w:name="_Toc243165362"/>
       <w:r>
         <w:t xml:space="preserve">Figura </w:t>
       </w:r>
@@ -13056,7 +13050,7 @@
           <w:noProof/>
         </w:rPr>
         <w:drawing>
-          <wp:inline distT="0" distB="0" distL="0" distR="0" wp14:anchorId="714D66BA" wp14:editId="416AD186">
+          <wp:inline distT="0" distB="0" distL="0" distR="0" wp14:anchorId="03326650" wp14:editId="3F8BB6F9">
             <wp:extent cx="5762625" cy="4086225"/>
             <wp:effectExtent l="0" t="0" r="0" b="0"/>
             <wp:docPr id="4" name="telas_revisao.png" descr="Revisão espaçada e flashcards na versão móvel" title="Revisão espaçada e flashcards na versão móvel"/>
@@ -13146,7 +13140,7 @@
       <w:pPr>
         <w:pStyle w:val="LegendaABNT"/>
       </w:pPr>
-      <w:bookmarkStart w:id="38" w:name="_Toc243156965"/>
+      <w:bookmarkStart w:id="38" w:name="_Toc243165363"/>
       <w:r>
         <w:t xml:space="preserve">Figura </w:t>
       </w:r>
@@ -13184,7 +13178,7 @@
           <w:noProof/>
         </w:rPr>
         <w:drawing>
-          <wp:inline distT="0" distB="0" distL="0" distR="0" wp14:anchorId="39F4E782" wp14:editId="03623A4D">
+          <wp:inline distT="0" distB="0" distL="0" distR="0" wp14:anchorId="6DF732DE" wp14:editId="3F675946">
             <wp:extent cx="5762625" cy="4086225"/>
             <wp:effectExtent l="0" t="0" r="0" b="0"/>
             <wp:docPr id="5" name="telas_pratica_tutor.png" descr="Prática e tutor na versão móvel" title="Prática e tutor na versão móvel"/>
@@ -13286,7 +13280,7 @@
       <w:pPr>
         <w:pStyle w:val="Ttulo2"/>
       </w:pPr>
-      <w:bookmarkStart w:id="39" w:name="_Toc243156942"/>
+      <w:bookmarkStart w:id="39" w:name="_Toc243165340"/>
       <w:r>
         <w:t>4.4 VERSÕES PARA COMPUTADOR</w:t>
       </w:r>
@@ -13306,7 +13300,7 @@
       <w:pPr>
         <w:pStyle w:val="LegendaABNT"/>
       </w:pPr>
-      <w:bookmarkStart w:id="40" w:name="_Toc243156966"/>
+      <w:bookmarkStart w:id="40" w:name="_Toc243165364"/>
       <w:r>
         <w:t xml:space="preserve">Figura </w:t>
       </w:r>
@@ -13344,7 +13338,7 @@
           <w:noProof/>
         </w:rPr>
         <w:drawing>
-          <wp:inline distT="0" distB="0" distL="0" distR="0" wp14:anchorId="6A6347CE" wp14:editId="7DC68DA3">
+          <wp:inline distT="0" distB="0" distL="0" distR="0" wp14:anchorId="7AD8982F" wp14:editId="62534765">
             <wp:extent cx="5762625" cy="3981450"/>
             <wp:effectExtent l="0" t="0" r="0" b="0"/>
             <wp:docPr id="6" name="desktop_painel.png" descr="Painel inicial da versão para computador" title="Painel inicial da versão para computador"/>
@@ -13404,7 +13398,7 @@
       <w:pPr>
         <w:pStyle w:val="Ttulo2"/>
       </w:pPr>
-      <w:bookmarkStart w:id="41" w:name="_Toc243156943"/>
+      <w:bookmarkStart w:id="41" w:name="_Toc243165341"/>
       <w:r>
         <w:t>4.5 IDENTIDADE VISUAL</w:t>
       </w:r>
@@ -13424,7 +13418,7 @@
       <w:pPr>
         <w:pStyle w:val="LegendaABNT"/>
       </w:pPr>
-      <w:bookmarkStart w:id="42" w:name="_Toc243156967"/>
+      <w:bookmarkStart w:id="42" w:name="_Toc243165365"/>
       <w:r>
         <w:t xml:space="preserve">Figura </w:t>
       </w:r>
@@ -13462,7 +13456,7 @@
           <w:noProof/>
         </w:rPr>
         <w:drawing>
-          <wp:inline distT="0" distB="0" distL="0" distR="0" wp14:anchorId="4534A452" wp14:editId="0F90AC3E">
+          <wp:inline distT="0" distB="0" distL="0" distR="0" wp14:anchorId="2FE6E581" wp14:editId="47FF4A59">
             <wp:extent cx="3600450" cy="866775"/>
             <wp:effectExtent l="0" t="0" r="0" b="0"/>
             <wp:docPr id="7" name="horizontal.png" descr="Logo do BioquímicaEDU" title="Logo do BioquímicaEDU"/>
@@ -13513,7 +13507,7 @@
       <w:pPr>
         <w:pStyle w:val="Ttulo2"/>
       </w:pPr>
-      <w:bookmarkStart w:id="43" w:name="_Toc243156944"/>
+      <w:bookmarkStart w:id="43" w:name="_Toc243165342"/>
       <w:r>
         <w:t>4.6 AVALIAÇÃO FORMATIVA</w:t>
       </w:r>
@@ -13525,13 +13519,10 @@
         <w:jc w:val="both"/>
       </w:pPr>
       <w:r>
-        <w:t xml:space="preserve">Nas conversas descritas na seção 3.6.1, os participantes viram o aplicativo funcionando, testaram o que lhes interessava e fizeram sugestões e pedidos de mudança. A recepção foi positiva, e os estudantes que ainda não haviam cursado a disciplina disseram que pensavam em usar o aplicativo para estudar. Os pedidos mais diretos foram vídeos em português, no lugar dos dois vídeos em inglês da primeira versão, e imagens e esquemas de melhor qualidade. </w:t>
-      </w:r>
-      <w:r>
-        <w:rPr>
-          <w:highlight w:val="yellow"/>
-        </w:rPr>
-        <w:t>[PREENCHER: outras sugestões que você anotou nas conversas, se houver.]</w:t>
+        <w:t>Nas conversas descritas na seção 3.6.1, os participantes viram o aplicativo funcionando, testaram o que lhes interessava e fizeram sugestões e pedidos de mudança. A recepção foi positiva, e os estudantes que ainda não haviam cursado a disciplina disseram que pensavam em usar o aplicativo para estudar. Alguns participantes contribuíram também com ideias para os casos clínicos e para os jogos. Os pedidos mais diretos foram vídeos em português, no lugar dos dois vídeos em inglês da primeira versão, e imagens e</w:t>
+      </w:r>
+      <w:r>
+        <w:t xml:space="preserve"> esquemas de melhor qualidade.</w:t>
       </w:r>
     </w:p>
     <w:p>
@@ -13547,7 +13538,7 @@
       <w:pPr>
         <w:pStyle w:val="Ttulo2"/>
       </w:pPr>
-      <w:bookmarkStart w:id="44" w:name="_Toc243156945"/>
+      <w:bookmarkStart w:id="44" w:name="_Toc243165343"/>
       <w:r>
         <w:t>4.7 EVOLUÇÃO DO SOFTWARE</w:t>
       </w:r>
@@ -13569,7 +13560,7 @@
       <w:pPr>
         <w:pStyle w:val="Ttulo3"/>
       </w:pPr>
-      <w:bookmarkStart w:id="45" w:name="_Toc243156946"/>
+      <w:bookmarkStart w:id="45" w:name="_Toc243165344"/>
       <w:r>
         <w:t>4.7.1 Itens da proposta: novos marcadores, jogos e régua das faixas</w:t>
       </w:r>
@@ -13617,7 +13608,7 @@
       <w:pPr>
         <w:pStyle w:val="LegendaABNT"/>
       </w:pPr>
-      <w:bookmarkStart w:id="46" w:name="_Toc243156968"/>
+      <w:bookmarkStart w:id="46" w:name="_Toc243165366"/>
       <w:r>
         <w:t xml:space="preserve">Figura </w:t>
       </w:r>
@@ -13655,7 +13646,7 @@
           <w:noProof/>
         </w:rPr>
         <w:drawing>
-          <wp:inline distT="0" distB="0" distL="0" distR="0" wp14:anchorId="3C2C80D1" wp14:editId="1256B7E8">
+          <wp:inline distT="0" distB="0" distL="0" distR="0" wp14:anchorId="27D412EC" wp14:editId="0DE6B25E">
             <wp:extent cx="5762625" cy="4086225"/>
             <wp:effectExtent l="0" t="0" r="0" b="0"/>
             <wp:docPr id="8" name="evolucao_jogos.png" descr="Jogos didáticos e calculadora da TFG estimada na versão para celular" title="Jogos didáticos e calculadora da TFG estimada na versão para celular"/>
@@ -13728,7 +13719,7 @@
       <w:pPr>
         <w:pStyle w:val="Ttulo3"/>
       </w:pPr>
-      <w:bookmarkStart w:id="47" w:name="_Toc243156947"/>
+      <w:bookmarkStart w:id="47" w:name="_Toc243165345"/>
       <w:r>
         <w:t>4.7.2 Intervalos da revisão</w:t>
       </w:r>
@@ -13751,7 +13742,7 @@
       <w:pPr>
         <w:pStyle w:val="LegendaABNT"/>
       </w:pPr>
-      <w:bookmarkStart w:id="48" w:name="_Toc243156983"/>
+      <w:bookmarkStart w:id="48" w:name="_Toc243165381"/>
       <w:r>
         <w:t xml:space="preserve">Tabela </w:t>
       </w:r>
@@ -14330,7 +14321,7 @@
       <w:pPr>
         <w:pStyle w:val="Ttulo3"/>
       </w:pPr>
-      <w:bookmarkStart w:id="49" w:name="_Toc243156948"/>
+      <w:bookmarkStart w:id="49" w:name="_Toc243165346"/>
       <w:r>
         <w:t>4.7.3 Um aplicativo para celular, tablet e computador</w:t>
       </w:r>
@@ -14353,7 +14344,7 @@
       <w:pPr>
         <w:pStyle w:val="LegendaABNT"/>
       </w:pPr>
-      <w:bookmarkStart w:id="50" w:name="_Toc243156977"/>
+      <w:bookmarkStart w:id="50" w:name="_Toc243165375"/>
       <w:r>
         <w:t xml:space="preserve">Quadro </w:t>
       </w:r>
@@ -15103,7 +15094,7 @@
       <w:pPr>
         <w:pStyle w:val="LegendaABNT"/>
       </w:pPr>
-      <w:bookmarkStart w:id="51" w:name="_Toc243156969"/>
+      <w:bookmarkStart w:id="51" w:name="_Toc243165367"/>
       <w:r>
         <w:t xml:space="preserve">Figura </w:t>
       </w:r>
@@ -15141,7 +15132,7 @@
           <w:noProof/>
         </w:rPr>
         <w:drawing>
-          <wp:inline distT="0" distB="0" distL="0" distR="0" wp14:anchorId="23D9FAED" wp14:editId="7C7C200C">
+          <wp:inline distT="0" distB="0" distL="0" distR="0" wp14:anchorId="66557053" wp14:editId="76C3187C">
             <wp:extent cx="5762625" cy="7219950"/>
             <wp:effectExtent l="0" t="0" r="0" b="0"/>
             <wp:docPr id="9" name="evolucao_formatos.png" descr="O mesmo aplicativo no computador, no tablet e no celular" title="O mesmo aplicativo no computador, no tablet e no celular"/>
@@ -15202,7 +15193,7 @@
       <w:pPr>
         <w:pStyle w:val="Ttulo3"/>
       </w:pPr>
-      <w:bookmarkStart w:id="52" w:name="_Toc243156949"/>
+      <w:bookmarkStart w:id="52" w:name="_Toc243165347"/>
       <w:r>
         <w:t>4.7.4 Acessibilidade</w:t>
       </w:r>
@@ -15303,7 +15294,7 @@
       <w:pPr>
         <w:pStyle w:val="LegendaABNT"/>
       </w:pPr>
-      <w:bookmarkStart w:id="53" w:name="_Toc243156970"/>
+      <w:bookmarkStart w:id="53" w:name="_Toc243165368"/>
       <w:r>
         <w:t xml:space="preserve">Figura </w:t>
       </w:r>
@@ -15341,7 +15332,7 @@
           <w:noProof/>
         </w:rPr>
         <w:drawing>
-          <wp:inline distT="0" distB="0" distL="0" distR="0" wp14:anchorId="40E67747" wp14:editId="647AAFA4">
+          <wp:inline distT="0" distB="0" distL="0" distR="0" wp14:anchorId="358F4250" wp14:editId="53EFB4E1">
             <wp:extent cx="5762625" cy="4086225"/>
             <wp:effectExtent l="0" t="0" r="0" b="0"/>
             <wp:docPr id="10" name="evolucao_acessibilidade.png" descr="Recursos de acessibilidade na versão para celular" title="Recursos de acessibilidade na versão para celular"/>
@@ -15414,7 +15405,7 @@
       <w:pPr>
         <w:pStyle w:val="Ttulo3"/>
       </w:pPr>
-      <w:bookmarkStart w:id="54" w:name="_Toc243156950"/>
+      <w:bookmarkStart w:id="54" w:name="_Toc243165348"/>
       <w:r>
         <w:t>4.7.5 Tutor com inteligência artificial generativa</w:t>
       </w:r>
@@ -15437,7 +15428,7 @@
       <w:pPr>
         <w:pStyle w:val="LegendaABNT"/>
       </w:pPr>
-      <w:bookmarkStart w:id="55" w:name="_Toc243156971"/>
+      <w:bookmarkStart w:id="55" w:name="_Toc243165369"/>
       <w:r>
         <w:t xml:space="preserve">Figura </w:t>
       </w:r>
@@ -15475,7 +15466,7 @@
           <w:noProof/>
         </w:rPr>
         <w:drawing>
-          <wp:inline distT="0" distB="0" distL="0" distR="0" wp14:anchorId="51B1000B" wp14:editId="0E5B7B31">
+          <wp:inline distT="0" distB="0" distL="0" distR="0" wp14:anchorId="2DFAEFF6" wp14:editId="0ED46A24">
             <wp:extent cx="5762625" cy="2933700"/>
             <wp:effectExtent l="0" t="0" r="0" b="0"/>
             <wp:docPr id="11" name="tutor_arquitetura.png" descr="Provedores de resposta do tutor e local da chave de acesso" title="Provedores de resposta do tutor e local da chave de acesso"/>
@@ -15581,7 +15572,7 @@
       <w:pPr>
         <w:pStyle w:val="LegendaABNT"/>
       </w:pPr>
-      <w:bookmarkStart w:id="56" w:name="_Toc243156972"/>
+      <w:bookmarkStart w:id="56" w:name="_Toc243165370"/>
       <w:r>
         <w:t xml:space="preserve">Figura </w:t>
       </w:r>
@@ -15619,7 +15610,7 @@
           <w:noProof/>
         </w:rPr>
         <w:drawing>
-          <wp:inline distT="0" distB="0" distL="0" distR="0" wp14:anchorId="6691CE6E" wp14:editId="02A944AE">
+          <wp:inline distT="0" distB="0" distL="0" distR="0" wp14:anchorId="05F89C48" wp14:editId="2D902849">
             <wp:extent cx="5762625" cy="4086225"/>
             <wp:effectExtent l="0" t="0" r="0" b="0"/>
             <wp:docPr id="12" name="evolucao_tutor.png" descr="Conversa com o tutor usando o Gemini na versão para celular" title="Conversa com o tutor usando o Gemini na versão para celular"/>
@@ -15680,7 +15671,7 @@
       <w:pPr>
         <w:pStyle w:val="Ttulo3"/>
       </w:pPr>
-      <w:bookmarkStart w:id="57" w:name="_Toc243156951"/>
+      <w:bookmarkStart w:id="57" w:name="_Toc243165349"/>
       <w:r>
         <w:t>4.7.6 Abertura, conta Google opcional e apresentação</w:t>
       </w:r>
@@ -15705,7 +15696,7 @@
       <w:pPr>
         <w:pStyle w:val="Ttulo3"/>
       </w:pPr>
-      <w:bookmarkStart w:id="58" w:name="_Toc243156952"/>
+      <w:bookmarkStart w:id="58" w:name="_Toc243165350"/>
       <w:r>
         <w:t>4.7.7 Site e instaladores</w:t>
       </w:r>
@@ -15752,7 +15743,7 @@
       <w:pPr>
         <w:pStyle w:val="Ttulo2"/>
       </w:pPr>
-      <w:bookmarkStart w:id="59" w:name="_Toc243156953"/>
+      <w:bookmarkStart w:id="59" w:name="_Toc243165351"/>
       <w:r>
         <w:t>4.8 AVALIAÇÃO DA APRENDIZAGEM</w:t>
       </w:r>
@@ -15775,7 +15766,7 @@
       <w:pPr>
         <w:pStyle w:val="LegendaABNT"/>
       </w:pPr>
-      <w:bookmarkStart w:id="60" w:name="_Toc243156984"/>
+      <w:bookmarkStart w:id="60" w:name="_Toc243165382"/>
       <w:r>
         <w:t xml:space="preserve">Tabela </w:t>
       </w:r>
@@ -16389,7 +16380,7 @@
       <w:pPr>
         <w:pStyle w:val="Ttulo1"/>
       </w:pPr>
-      <w:bookmarkStart w:id="61" w:name="_Toc243156954"/>
+      <w:bookmarkStart w:id="61" w:name="_Toc243165352"/>
       <w:r>
         <w:t>5 DISCUSSÃO</w:t>
       </w:r>
@@ -16409,7 +16400,7 @@
       <w:pPr>
         <w:pStyle w:val="LegendaABNT"/>
       </w:pPr>
-      <w:bookmarkStart w:id="62" w:name="_Toc243156978"/>
+      <w:bookmarkStart w:id="62" w:name="_Toc243165376"/>
       <w:r>
         <w:t xml:space="preserve">Quadro </w:t>
       </w:r>
@@ -17517,10 +17508,10 @@
         <w:jc w:val="both"/>
       </w:pPr>
       <w:r>
-        <w:t>O trabalho tem limitações. O conteúdo cobre 22 marcadores, e o banco de 14 questões é pequeno, o que favorece a repetição das mesmas perguntas. As questões geradas pelo modelo de linguagem na versão clássica com tutor não passam por curadoria e podem conter erros. Os diagramas do conteúdo ainda são os da primeira versão, e a melhoria pedida na avaliação formativa não foi feita. A versão para iOS, possível com o Kivy, não foi testada, e os recursos de acessibilidade não foram avaliados com estudantes com def</w:t>
-      </w:r>
-      <w:r>
-        <w:t xml:space="preserve">iciência. Na avaliação, a parte formativa não usou instrumento padronizado nem produziu medidas; o pré-teste e o pós-teste não têm grupo de comparação, repetem as mesmas questões — parte da melhora pode vir de já tê-las visto — e reúnem uma amostra pequena e de conveniência </w:t>
+        <w:t xml:space="preserve">O trabalho tem limitações. O conteúdo cobre 22 marcadores e não passou por revisão formal de docente da área da saúde, e o banco de 14 questões é pequeno, o que favorece a repetição das mesmas perguntas. As questões geradas pelo modelo de linguagem na versão clássica com tutor não passam por curadoria e podem conter erros. Os diagramas do conteúdo ainda são os da primeira versão, e a melhoria pedida na avaliação formativa não foi feita. A versão para iOS, possível com o Kivy, não foi testada, e os recursos </w:t>
+      </w:r>
+      <w:r>
+        <w:t xml:space="preserve">de acessibilidade não foram avaliados com estudantes com deficiência. Na avaliação, a parte formativa não usou instrumento padronizado nem produziu medidas; o pré-teste e o pós-teste não têm grupo de comparação, repetem as mesmas questões — parte da melhora pode vir de já tê-las visto — e reúnem uma amostra pequena e de conveniência </w:t>
       </w:r>
       <w:r>
         <w:rPr>
@@ -17536,7 +17527,7 @@
       <w:pPr>
         <w:pStyle w:val="Ttulo1"/>
       </w:pPr>
-      <w:bookmarkStart w:id="63" w:name="_Toc243156955"/>
+      <w:bookmarkStart w:id="63" w:name="_Toc243165353"/>
       <w:r>
         <w:t>6 CONSIDERAÇÕES FINAIS</w:t>
       </w:r>
@@ -17606,7 +17597,7 @@
         <w:pStyle w:val="Ttulo1"/>
         <w:jc w:val="center"/>
       </w:pPr>
-      <w:bookmarkStart w:id="64" w:name="_Toc243156956"/>
+      <w:bookmarkStart w:id="64" w:name="_Toc243165354"/>
       <w:r>
         <w:t>REFERÊNCIAS</w:t>
       </w:r>
@@ -18483,7 +18474,7 @@
         <w:pStyle w:val="Ttulo1"/>
         <w:jc w:val="center"/>
       </w:pPr>
-      <w:bookmarkStart w:id="65" w:name="_Toc243156957"/>
+      <w:bookmarkStart w:id="65" w:name="_Toc243165355"/>
       <w:r>
         <w:t>APÊNDICE A – FONTES DO CONTEÚDO POR MARCADOR</w:t>
       </w:r>
@@ -18503,7 +18494,7 @@
       <w:pPr>
         <w:pStyle w:val="LegendaABNT"/>
       </w:pPr>
-      <w:bookmarkStart w:id="66" w:name="_Toc243156979"/>
+      <w:bookmarkStart w:id="66" w:name="_Toc243165377"/>
       <w:r>
         <w:t xml:space="preserve">Quadro </w:t>
       </w:r>
@@ -20878,7 +20869,7 @@
         <w:pStyle w:val="Ttulo1"/>
         <w:jc w:val="center"/>
       </w:pPr>
-      <w:bookmarkStart w:id="67" w:name="_Toc243156958"/>
+      <w:bookmarkStart w:id="67" w:name="_Toc243165356"/>
       <w:r>
         <w:t>APÊNDICE B – CÓDIGO-FONTE E EXECUÇÃO</w:t>
       </w:r>
@@ -20973,7 +20964,7 @@
         <w:pStyle w:val="Ttulo1"/>
         <w:jc w:val="center"/>
       </w:pPr>
-      <w:bookmarkStart w:id="68" w:name="_Toc243156959"/>
+      <w:bookmarkStart w:id="68" w:name="_Toc243165357"/>
       <w:r>
         <w:t>APÊNDICE C – QUESTÕES DO PRÉ-TESTE E DO PÓS-TESTE</w:t>
       </w:r>
@@ -21814,7 +21805,7 @@
         <w:pStyle w:val="Ttulo1"/>
         <w:jc w:val="center"/>
       </w:pPr>
-      <w:bookmarkStart w:id="69" w:name="_Toc243156960"/>
+      <w:bookmarkStart w:id="69" w:name="_Toc243165358"/>
       <w:r>
         <w:t>APÊNDICE D – QUESTIONÁRIO DE OPINIÃO</w:t>
       </w:r>
@@ -22160,10 +22151,10 @@
 <file path=word/numbering.xml><?xml version="1.0" encoding="utf-8"?>
 <w:numbering xmlns:wpc="http://schemas.microsoft.com/office/word/2010/wordprocessingCanvas" xmlns:cx="http://schemas.microsoft.com/office/drawing/2014/chartex" xmlns:cx1="http://schemas.microsoft.com/office/drawing/2015/9/8/chartex" xmlns:cx2="http://schemas.microsoft.com/office/drawing/2015/10/21/chartex" xmlns:cx3="http://schemas.microsoft.com/office/drawing/2016/5/9/chartex" xmlns:cx4="http://schemas.microsoft.com/office/drawing/2016/5/10/chartex" xmlns:cx5="http://schemas.microsoft.com/office/drawing/2016/5/11/chartex" xmlns:cx6="http://schemas.microsoft.com/office/drawing/2016/5/12/chartex" xmlns:cx7="http://schemas.microsoft.com/office/drawing/2016/5/13/chartex" xmlns:cx8="http://schemas.microsoft.com/office/drawing/2016/5/14/chartex" xmlns:mc="http://schemas.openxmlformats.org/markup-compatibility/2006" xmlns:aink="http://schemas.microsoft.com/office/drawing/2016/ink" xmlns:am3d="http://schemas.microsoft.com/office/drawing/2017/model3d" xmlns:o="urn:schemas-microsoft-com:office:office" xmlns:oel="http://schemas.microsoft.com/office/2019/extlst" xmlns:r="http://schemas.openxmlformats.org/officeDocument/2006/relationships" xmlns:m="http://schemas.openxmlformats.org/officeDocument/2006/math" xmlns:v="urn:schemas-microsoft-com:vml" xmlns:wp14="http://schemas.microsoft.com/office/word/2010/wordprocessingDrawing" xmlns:wp="http://schemas.openxmlformats.org/drawingml/2006/wordprocessingDrawing" xmlns:w10="urn:schemas-microsoft-com:office:word" xmlns:w="http://schemas.openxmlformats.org/wordprocessingml/2006/main" xmlns:w14="http://schemas.microsoft.com/office/word/2010/wordml" xmlns:w15="http://schemas.microsoft.com/office/word/2012/wordml" xmlns:w16cex="http://schemas.microsoft.com/office/word/2018/wordml/cex" xmlns:w16cid="http://schemas.microsoft.com/office/word/2016/wordml/cid" xmlns:w16="http://schemas.microsoft.com/office/word/2018/wordml" xmlns:w16du="http://schemas.microsoft.com/office/word/2023/wordml/word16du" xmlns:w16sdtdh="http://schemas.microsoft.com/office/word/2020/wordml/sdtdatahash" xmlns:w16sdtfl="http://schemas.microsoft.com/office/word/2024/wordml/sdtformatlock" xmlns:w16se="http://schemas.microsoft.com/office/word/2015/wordml/symex" xmlns:wpg="http://schemas.microsoft.com/office/word/2010/wordprocessingGroup" xmlns:wpi="http://schemas.microsoft.com/office/word/2010/wordprocessingInk" xmlns:wne="http://schemas.microsoft.com/office/word/2006/wordml" xmlns:wps="http://schemas.microsoft.com/office/word/2010/wordprocessingShape" mc:Ignorable="w14 w15 w16se w16cid w16 w16cex w16sdtdh w16sdtfl w16du wp14">
   <w:abstractNum w:abstractNumId="0" w15:restartNumberingAfterBreak="0">
-    <w:nsid w:val="396E680A"/>
+    <w:nsid w:val="276D37C3"/>
     <w:multiLevelType w:val="hybridMultilevel"/>
-    <w:tmpl w:val="2496DDDC"/>
-    <w:lvl w:ilvl="0" w:tplc="F2CC2BC6">
+    <w:tmpl w:val="CB6CA87E"/>
+    <w:lvl w:ilvl="0" w:tplc="9C8E62F0">
       <w:start w:val="1"/>
       <w:numFmt w:val="lowerLetter"/>
       <w:lvlText w:val="%1)"/>
@@ -22172,52 +22163,52 @@
         <w:ind w:left="1106" w:hanging="397"/>
       </w:pPr>
     </w:lvl>
-    <w:lvl w:ilvl="1" w:tplc="B58E9A50">
+    <w:lvl w:ilvl="1" w:tplc="20B8731A">
       <w:numFmt w:val="decimal"/>
       <w:lvlText w:val=""/>
       <w:lvlJc w:val="left"/>
     </w:lvl>
-    <w:lvl w:ilvl="2" w:tplc="9342D0B6">
+    <w:lvl w:ilvl="2" w:tplc="15A26E18">
       <w:numFmt w:val="decimal"/>
       <w:lvlText w:val=""/>
       <w:lvlJc w:val="left"/>
     </w:lvl>
-    <w:lvl w:ilvl="3" w:tplc="869C8AEA">
+    <w:lvl w:ilvl="3" w:tplc="1394810A">
       <w:numFmt w:val="decimal"/>
       <w:lvlText w:val=""/>
       <w:lvlJc w:val="left"/>
     </w:lvl>
-    <w:lvl w:ilvl="4" w:tplc="A9BACB16">
+    <w:lvl w:ilvl="4" w:tplc="D6A866D0">
       <w:numFmt w:val="decimal"/>
       <w:lvlText w:val=""/>
       <w:lvlJc w:val="left"/>
     </w:lvl>
-    <w:lvl w:ilvl="5" w:tplc="9538EF44">
+    <w:lvl w:ilvl="5" w:tplc="CEF29856">
       <w:numFmt w:val="decimal"/>
       <w:lvlText w:val=""/>
       <w:lvlJc w:val="left"/>
     </w:lvl>
-    <w:lvl w:ilvl="6" w:tplc="BAA4D38E">
+    <w:lvl w:ilvl="6" w:tplc="B102202A">
       <w:numFmt w:val="decimal"/>
       <w:lvlText w:val=""/>
       <w:lvlJc w:val="left"/>
     </w:lvl>
-    <w:lvl w:ilvl="7" w:tplc="73866B52">
+    <w:lvl w:ilvl="7" w:tplc="34004CA0">
       <w:numFmt w:val="decimal"/>
       <w:lvlText w:val=""/>
       <w:lvlJc w:val="left"/>
     </w:lvl>
-    <w:lvl w:ilvl="8" w:tplc="BB50A0D8">
+    <w:lvl w:ilvl="8" w:tplc="2C3A34FE">
       <w:numFmt w:val="decimal"/>
       <w:lvlText w:val=""/>
       <w:lvlJc w:val="left"/>
     </w:lvl>
   </w:abstractNum>
   <w:abstractNum w:abstractNumId="1" w15:restartNumberingAfterBreak="0">
-    <w:nsid w:val="5EDB47B6"/>
+    <w:nsid w:val="29BB2FF2"/>
     <w:multiLevelType w:val="hybridMultilevel"/>
-    <w:tmpl w:val="FAFEA0CE"/>
-    <w:lvl w:ilvl="0" w:tplc="B150E0BE" w:tentative="1">
+    <w:tmpl w:val="FC5A9132"/>
+    <w:lvl w:ilvl="0" w:tplc="8E48D1EE" w:tentative="1">
       <w:start w:val="1"/>
       <w:numFmt w:val="bullet"/>
       <w:lvlText w:val="●"/>
@@ -22226,7 +22217,7 @@
         <w:ind w:left="720" w:hanging="360"/>
       </w:pPr>
     </w:lvl>
-    <w:lvl w:ilvl="1" w:tplc="89782ED0" w:tentative="1">
+    <w:lvl w:ilvl="1" w:tplc="0DA83A58" w:tentative="1">
       <w:start w:val="1"/>
       <w:numFmt w:val="bullet"/>
       <w:lvlText w:val="○"/>
@@ -22235,7 +22226,7 @@
         <w:ind w:left="1440" w:hanging="360"/>
       </w:pPr>
     </w:lvl>
-    <w:lvl w:ilvl="2" w:tplc="6574AC16" w:tentative="1">
+    <w:lvl w:ilvl="2" w:tplc="9446ABA8" w:tentative="1">
       <w:start w:val="1"/>
       <w:numFmt w:val="bullet"/>
       <w:lvlText w:val="■"/>
@@ -22244,7 +22235,7 @@
         <w:ind w:left="2160" w:hanging="360"/>
       </w:pPr>
     </w:lvl>
-    <w:lvl w:ilvl="3" w:tplc="7362E0FC" w:tentative="1">
+    <w:lvl w:ilvl="3" w:tplc="C31EE6EA" w:tentative="1">
       <w:start w:val="1"/>
       <w:numFmt w:val="bullet"/>
       <w:lvlText w:val="●"/>
@@ -22253,7 +22244,7 @@
         <w:ind w:left="2880" w:hanging="360"/>
       </w:pPr>
     </w:lvl>
-    <w:lvl w:ilvl="4" w:tplc="DB9A2BCE" w:tentative="1">
+    <w:lvl w:ilvl="4" w:tplc="5A7CBCD2" w:tentative="1">
       <w:start w:val="1"/>
       <w:numFmt w:val="bullet"/>
       <w:lvlText w:val="○"/>
@@ -22262,7 +22253,7 @@
         <w:ind w:left="3600" w:hanging="360"/>
       </w:pPr>
     </w:lvl>
-    <w:lvl w:ilvl="5" w:tplc="FA842126" w:tentative="1">
+    <w:lvl w:ilvl="5" w:tplc="33105A9E" w:tentative="1">
       <w:start w:val="1"/>
       <w:numFmt w:val="bullet"/>
       <w:lvlText w:val="■"/>
@@ -22271,7 +22262,7 @@
         <w:ind w:left="4320" w:hanging="360"/>
       </w:pPr>
     </w:lvl>
-    <w:lvl w:ilvl="6" w:tplc="F02C5694" w:tentative="1">
+    <w:lvl w:ilvl="6" w:tplc="D7D49E36" w:tentative="1">
       <w:start w:val="1"/>
       <w:numFmt w:val="bullet"/>
       <w:lvlText w:val="●"/>
@@ -22280,7 +22271,7 @@
         <w:ind w:left="5040" w:hanging="360"/>
       </w:pPr>
     </w:lvl>
-    <w:lvl w:ilvl="7" w:tplc="00C25C20" w:tentative="1">
+    <w:lvl w:ilvl="7" w:tplc="24F425BA" w:tentative="1">
       <w:start w:val="1"/>
       <w:numFmt w:val="bullet"/>
       <w:lvlText w:val="●"/>
@@ -22289,7 +22280,7 @@
         <w:ind w:left="5760" w:hanging="360"/>
       </w:pPr>
     </w:lvl>
-    <w:lvl w:ilvl="8" w:tplc="CC6281AC" w:tentative="1">
+    <w:lvl w:ilvl="8" w:tplc="B4B06192" w:tentative="1">
       <w:start w:val="1"/>
       <w:numFmt w:val="bullet"/>
       <w:lvlText w:val="●"/>
@@ -22299,97 +22290,97 @@
       </w:pPr>
     </w:lvl>
   </w:abstractNum>
-  <w:num w:numId="1" w16cid:durableId="442188952">
+  <w:num w:numId="1" w16cid:durableId="1206022273">
     <w:abstractNumId w:val="1"/>
     <w:lvlOverride w:ilvl="0">
       <w:startOverride w:val="1"/>
     </w:lvlOverride>
   </w:num>
-  <w:num w:numId="2" w16cid:durableId="298582196">
+  <w:num w:numId="2" w16cid:durableId="2084984406">
     <w:abstractNumId w:val="0"/>
     <w:lvlOverride w:ilvl="0">
       <w:startOverride w:val="1"/>
     </w:lvlOverride>
   </w:num>
-  <w:num w:numId="3" w16cid:durableId="1232543760">
+  <w:num w:numId="3" w16cid:durableId="1583100092">
     <w:abstractNumId w:val="0"/>
     <w:lvlOverride w:ilvl="0">
       <w:startOverride w:val="1"/>
     </w:lvlOverride>
   </w:num>
-  <w:num w:numId="4" w16cid:durableId="1539128712">
+  <w:num w:numId="4" w16cid:durableId="868567107">
     <w:abstractNumId w:val="0"/>
     <w:lvlOverride w:ilvl="0">
       <w:startOverride w:val="1"/>
     </w:lvlOverride>
   </w:num>
-  <w:num w:numId="5" w16cid:durableId="1253126545">
+  <w:num w:numId="5" w16cid:durableId="339549438">
     <w:abstractNumId w:val="0"/>
     <w:lvlOverride w:ilvl="0">
       <w:startOverride w:val="1"/>
     </w:lvlOverride>
   </w:num>
-  <w:num w:numId="6" w16cid:durableId="707148680">
+  <w:num w:numId="6" w16cid:durableId="499852985">
     <w:abstractNumId w:val="0"/>
     <w:lvlOverride w:ilvl="0">
       <w:startOverride w:val="1"/>
     </w:lvlOverride>
   </w:num>
-  <w:num w:numId="7" w16cid:durableId="1423063697">
+  <w:num w:numId="7" w16cid:durableId="161237655">
     <w:abstractNumId w:val="0"/>
     <w:lvlOverride w:ilvl="0">
       <w:startOverride w:val="1"/>
     </w:lvlOverride>
   </w:num>
-  <w:num w:numId="8" w16cid:durableId="233853036">
+  <w:num w:numId="8" w16cid:durableId="662927472">
     <w:abstractNumId w:val="0"/>
     <w:lvlOverride w:ilvl="0">
       <w:startOverride w:val="1"/>
     </w:lvlOverride>
   </w:num>
-  <w:num w:numId="9" w16cid:durableId="1704672347">
+  <w:num w:numId="9" w16cid:durableId="1935090200">
     <w:abstractNumId w:val="0"/>
     <w:lvlOverride w:ilvl="0">
       <w:startOverride w:val="1"/>
     </w:lvlOverride>
   </w:num>
-  <w:num w:numId="10" w16cid:durableId="305671893">
+  <w:num w:numId="10" w16cid:durableId="32771086">
     <w:abstractNumId w:val="0"/>
     <w:lvlOverride w:ilvl="0">
       <w:startOverride w:val="1"/>
     </w:lvlOverride>
   </w:num>
-  <w:num w:numId="11" w16cid:durableId="322469047">
+  <w:num w:numId="11" w16cid:durableId="1707217448">
     <w:abstractNumId w:val="0"/>
     <w:lvlOverride w:ilvl="0">
       <w:startOverride w:val="1"/>
     </w:lvlOverride>
   </w:num>
-  <w:num w:numId="12" w16cid:durableId="770055726">
+  <w:num w:numId="12" w16cid:durableId="1084033885">
     <w:abstractNumId w:val="0"/>
     <w:lvlOverride w:ilvl="0">
       <w:startOverride w:val="1"/>
     </w:lvlOverride>
   </w:num>
-  <w:num w:numId="13" w16cid:durableId="321394785">
+  <w:num w:numId="13" w16cid:durableId="1424495496">
     <w:abstractNumId w:val="0"/>
     <w:lvlOverride w:ilvl="0">
       <w:startOverride w:val="1"/>
     </w:lvlOverride>
   </w:num>
-  <w:num w:numId="14" w16cid:durableId="942569883">
+  <w:num w:numId="14" w16cid:durableId="921914525">
     <w:abstractNumId w:val="0"/>
     <w:lvlOverride w:ilvl="0">
       <w:startOverride w:val="1"/>
     </w:lvlOverride>
   </w:num>
-  <w:num w:numId="15" w16cid:durableId="479886887">
+  <w:num w:numId="15" w16cid:durableId="1380587263">
     <w:abstractNumId w:val="0"/>
     <w:lvlOverride w:ilvl="0">
       <w:startOverride w:val="1"/>
     </w:lvlOverride>
   </w:num>
-  <w:num w:numId="16" w16cid:durableId="1853452023">
+  <w:num w:numId="16" w16cid:durableId="733624782">
     <w:abstractNumId w:val="0"/>
     <w:lvlOverride w:ilvl="0">
       <w:startOverride w:val="1"/>

</xml_diff>

<commit_message>
Relatorio: etica das conversas e aparelhos em que o APK foi testado
</commit_message>
<xml_diff>
--- a/relatorio/Relatorio_Final_PIBIC_BioquimicaEDU.docx
+++ b/relatorio/Relatorio_Final_PIBIC_BioquimicaEDU.docx
@@ -329,7 +329,7 @@
     <w:sdt>
       <w:sdtPr>
         <w:alias w:val="LISTA DE FIGURAS"/>
-        <w:id w:val="209007937"/>
+        <w:id w:val="1398245558"/>
       </w:sdtPr>
       <w:sdtEndPr/>
       <w:sdtContent>
@@ -355,7 +355,7 @@
           <w:r>
             <w:fldChar w:fldCharType="separate"/>
           </w:r>
-          <w:hyperlink w:anchor="_Toc243165359" w:history="1">
+          <w:hyperlink w:anchor="_Toc243168980" w:history="1">
             <w:r>
               <w:rPr>
                 <w:rStyle w:val="Hyperlink"/>
@@ -379,7 +379,7 @@
               <w:rPr>
                 <w:noProof/>
               </w:rPr>
-              <w:instrText xml:space="preserve"> PAGEREF _Toc243165359 \h </w:instrText>
+              <w:instrText xml:space="preserve"> PAGEREF _Toc243168980 \h </w:instrText>
             </w:r>
             <w:r>
               <w:rPr>
@@ -419,7 +419,7 @@
               <w14:ligatures w14:val="standardContextual"/>
             </w:rPr>
           </w:pPr>
-          <w:hyperlink w:anchor="_Toc243165360" w:history="1">
+          <w:hyperlink w:anchor="_Toc243168981" w:history="1">
             <w:r>
               <w:rPr>
                 <w:rStyle w:val="Hyperlink"/>
@@ -443,7 +443,7 @@
               <w:rPr>
                 <w:noProof/>
               </w:rPr>
-              <w:instrText xml:space="preserve"> PAGEREF _Toc243165360 \h </w:instrText>
+              <w:instrText xml:space="preserve"> PAGEREF _Toc243168981 \h </w:instrText>
             </w:r>
             <w:r>
               <w:rPr>
@@ -483,7 +483,7 @@
               <w14:ligatures w14:val="standardContextual"/>
             </w:rPr>
           </w:pPr>
-          <w:hyperlink w:anchor="_Toc243165361" w:history="1">
+          <w:hyperlink w:anchor="_Toc243168982" w:history="1">
             <w:r>
               <w:rPr>
                 <w:rStyle w:val="Hyperlink"/>
@@ -507,7 +507,7 @@
               <w:rPr>
                 <w:noProof/>
               </w:rPr>
-              <w:instrText xml:space="preserve"> PAGEREF _Toc243165361 \h </w:instrText>
+              <w:instrText xml:space="preserve"> PAGEREF _Toc243168982 \h </w:instrText>
             </w:r>
             <w:r>
               <w:rPr>
@@ -547,7 +547,7 @@
               <w14:ligatures w14:val="standardContextual"/>
             </w:rPr>
           </w:pPr>
-          <w:hyperlink w:anchor="_Toc243165362" w:history="1">
+          <w:hyperlink w:anchor="_Toc243168983" w:history="1">
             <w:r>
               <w:rPr>
                 <w:rStyle w:val="Hyperlink"/>
@@ -587,7 +587,7 @@
               <w:rPr>
                 <w:noProof/>
               </w:rPr>
-              <w:instrText xml:space="preserve"> PAGEREF _Toc243165362 \h </w:instrText>
+              <w:instrText xml:space="preserve"> PAGEREF _Toc243168983 \h </w:instrText>
             </w:r>
             <w:r>
               <w:rPr>
@@ -627,7 +627,7 @@
               <w14:ligatures w14:val="standardContextual"/>
             </w:rPr>
           </w:pPr>
-          <w:hyperlink w:anchor="_Toc243165363" w:history="1">
+          <w:hyperlink w:anchor="_Toc243168984" w:history="1">
             <w:r>
               <w:rPr>
                 <w:rStyle w:val="Hyperlink"/>
@@ -651,7 +651,7 @@
               <w:rPr>
                 <w:noProof/>
               </w:rPr>
-              <w:instrText xml:space="preserve"> PAGEREF _Toc243165363 \h </w:instrText>
+              <w:instrText xml:space="preserve"> PAGEREF _Toc243168984 \h </w:instrText>
             </w:r>
             <w:r>
               <w:rPr>
@@ -691,7 +691,7 @@
               <w14:ligatures w14:val="standardContextual"/>
             </w:rPr>
           </w:pPr>
-          <w:hyperlink w:anchor="_Toc243165364" w:history="1">
+          <w:hyperlink w:anchor="_Toc243168985" w:history="1">
             <w:r>
               <w:rPr>
                 <w:rStyle w:val="Hyperlink"/>
@@ -715,7 +715,7 @@
               <w:rPr>
                 <w:noProof/>
               </w:rPr>
-              <w:instrText xml:space="preserve"> PAGEREF _Toc243165364 \h </w:instrText>
+              <w:instrText xml:space="preserve"> PAGEREF _Toc243168985 \h </w:instrText>
             </w:r>
             <w:r>
               <w:rPr>
@@ -755,7 +755,7 @@
               <w14:ligatures w14:val="standardContextual"/>
             </w:rPr>
           </w:pPr>
-          <w:hyperlink w:anchor="_Toc243165365" w:history="1">
+          <w:hyperlink w:anchor="_Toc243168986" w:history="1">
             <w:r>
               <w:rPr>
                 <w:rStyle w:val="Hyperlink"/>
@@ -779,7 +779,7 @@
               <w:rPr>
                 <w:noProof/>
               </w:rPr>
-              <w:instrText xml:space="preserve"> PAGEREF _Toc243165365 \h </w:instrText>
+              <w:instrText xml:space="preserve"> PAGEREF _Toc243168986 \h </w:instrText>
             </w:r>
             <w:r>
               <w:rPr>
@@ -819,7 +819,7 @@
               <w14:ligatures w14:val="standardContextual"/>
             </w:rPr>
           </w:pPr>
-          <w:hyperlink w:anchor="_Toc243165366" w:history="1">
+          <w:hyperlink w:anchor="_Toc243168987" w:history="1">
             <w:r>
               <w:rPr>
                 <w:rStyle w:val="Hyperlink"/>
@@ -843,7 +843,7 @@
               <w:rPr>
                 <w:noProof/>
               </w:rPr>
-              <w:instrText xml:space="preserve"> PAGEREF _Toc243165366 \h </w:instrText>
+              <w:instrText xml:space="preserve"> PAGEREF _Toc243168987 \h </w:instrText>
             </w:r>
             <w:r>
               <w:rPr>
@@ -883,7 +883,7 @@
               <w14:ligatures w14:val="standardContextual"/>
             </w:rPr>
           </w:pPr>
-          <w:hyperlink w:anchor="_Toc243165367" w:history="1">
+          <w:hyperlink w:anchor="_Toc243168988" w:history="1">
             <w:r>
               <w:rPr>
                 <w:rStyle w:val="Hyperlink"/>
@@ -907,7 +907,7 @@
               <w:rPr>
                 <w:noProof/>
               </w:rPr>
-              <w:instrText xml:space="preserve"> PAGEREF _Toc243165367 \h </w:instrText>
+              <w:instrText xml:space="preserve"> PAGEREF _Toc243168988 \h </w:instrText>
             </w:r>
             <w:r>
               <w:rPr>
@@ -947,7 +947,7 @@
               <w14:ligatures w14:val="standardContextual"/>
             </w:rPr>
           </w:pPr>
-          <w:hyperlink w:anchor="_Toc243165368" w:history="1">
+          <w:hyperlink w:anchor="_Toc243168989" w:history="1">
             <w:r>
               <w:rPr>
                 <w:rStyle w:val="Hyperlink"/>
@@ -971,7 +971,7 @@
               <w:rPr>
                 <w:noProof/>
               </w:rPr>
-              <w:instrText xml:space="preserve"> PAGEREF _Toc243165368 \h </w:instrText>
+              <w:instrText xml:space="preserve"> PAGEREF _Toc243168989 \h </w:instrText>
             </w:r>
             <w:r>
               <w:rPr>
@@ -1011,7 +1011,7 @@
               <w14:ligatures w14:val="standardContextual"/>
             </w:rPr>
           </w:pPr>
-          <w:hyperlink w:anchor="_Toc243165369" w:history="1">
+          <w:hyperlink w:anchor="_Toc243168990" w:history="1">
             <w:r>
               <w:rPr>
                 <w:rStyle w:val="Hyperlink"/>
@@ -1035,7 +1035,7 @@
               <w:rPr>
                 <w:noProof/>
               </w:rPr>
-              <w:instrText xml:space="preserve"> PAGEREF _Toc243165369 \h </w:instrText>
+              <w:instrText xml:space="preserve"> PAGEREF _Toc243168990 \h </w:instrText>
             </w:r>
             <w:r>
               <w:rPr>
@@ -1075,7 +1075,7 @@
               <w14:ligatures w14:val="standardContextual"/>
             </w:rPr>
           </w:pPr>
-          <w:hyperlink w:anchor="_Toc243165370" w:history="1">
+          <w:hyperlink w:anchor="_Toc243168991" w:history="1">
             <w:r>
               <w:rPr>
                 <w:rStyle w:val="Hyperlink"/>
@@ -1099,7 +1099,7 @@
               <w:rPr>
                 <w:noProof/>
               </w:rPr>
-              <w:instrText xml:space="preserve"> PAGEREF _Toc243165370 \h </w:instrText>
+              <w:instrText xml:space="preserve"> PAGEREF _Toc243168991 \h </w:instrText>
             </w:r>
             <w:r>
               <w:rPr>
@@ -1144,7 +1144,7 @@
     <w:sdt>
       <w:sdtPr>
         <w:alias w:val="LISTA DE QUADROS"/>
-        <w:id w:val="1180855859"/>
+        <w:id w:val="278616795"/>
       </w:sdtPr>
       <w:sdtEndPr/>
       <w:sdtContent>
@@ -1170,7 +1170,7 @@
           <w:r>
             <w:fldChar w:fldCharType="separate"/>
           </w:r>
-          <w:hyperlink w:anchor="_Toc243165371" w:history="1">
+          <w:hyperlink w:anchor="_Toc243168992" w:history="1">
             <w:r>
               <w:rPr>
                 <w:rStyle w:val="Hyperlink"/>
@@ -1194,7 +1194,7 @@
               <w:rPr>
                 <w:noProof/>
               </w:rPr>
-              <w:instrText xml:space="preserve"> PAGEREF _Toc243165371 \h </w:instrText>
+              <w:instrText xml:space="preserve"> PAGEREF _Toc243168992 \h </w:instrText>
             </w:r>
             <w:r>
               <w:rPr>
@@ -1234,7 +1234,7 @@
               <w14:ligatures w14:val="standardContextual"/>
             </w:rPr>
           </w:pPr>
-          <w:hyperlink w:anchor="_Toc243165372" w:history="1">
+          <w:hyperlink w:anchor="_Toc243168993" w:history="1">
             <w:r>
               <w:rPr>
                 <w:rStyle w:val="Hyperlink"/>
@@ -1258,7 +1258,7 @@
               <w:rPr>
                 <w:noProof/>
               </w:rPr>
-              <w:instrText xml:space="preserve"> PAGEREF _Toc243165372 \h </w:instrText>
+              <w:instrText xml:space="preserve"> PAGEREF _Toc243168993 \h </w:instrText>
             </w:r>
             <w:r>
               <w:rPr>
@@ -1298,7 +1298,7 @@
               <w14:ligatures w14:val="standardContextual"/>
             </w:rPr>
           </w:pPr>
-          <w:hyperlink w:anchor="_Toc243165373" w:history="1">
+          <w:hyperlink w:anchor="_Toc243168994" w:history="1">
             <w:r>
               <w:rPr>
                 <w:rStyle w:val="Hyperlink"/>
@@ -1322,7 +1322,7 @@
               <w:rPr>
                 <w:noProof/>
               </w:rPr>
-              <w:instrText xml:space="preserve"> PAGEREF _Toc243165373 \h </w:instrText>
+              <w:instrText xml:space="preserve"> PAGEREF _Toc243168994 \h </w:instrText>
             </w:r>
             <w:r>
               <w:rPr>
@@ -1362,7 +1362,7 @@
               <w14:ligatures w14:val="standardContextual"/>
             </w:rPr>
           </w:pPr>
-          <w:hyperlink w:anchor="_Toc243165374" w:history="1">
+          <w:hyperlink w:anchor="_Toc243168995" w:history="1">
             <w:r>
               <w:rPr>
                 <w:rStyle w:val="Hyperlink"/>
@@ -1386,7 +1386,7 @@
               <w:rPr>
                 <w:noProof/>
               </w:rPr>
-              <w:instrText xml:space="preserve"> PAGEREF _Toc243165374 \h </w:instrText>
+              <w:instrText xml:space="preserve"> PAGEREF _Toc243168995 \h </w:instrText>
             </w:r>
             <w:r>
               <w:rPr>
@@ -1426,7 +1426,7 @@
               <w14:ligatures w14:val="standardContextual"/>
             </w:rPr>
           </w:pPr>
-          <w:hyperlink w:anchor="_Toc243165375" w:history="1">
+          <w:hyperlink w:anchor="_Toc243168996" w:history="1">
             <w:r>
               <w:rPr>
                 <w:rStyle w:val="Hyperlink"/>
@@ -1450,7 +1450,7 @@
               <w:rPr>
                 <w:noProof/>
               </w:rPr>
-              <w:instrText xml:space="preserve"> PAGEREF _Toc243165375 \h </w:instrText>
+              <w:instrText xml:space="preserve"> PAGEREF _Toc243168996 \h </w:instrText>
             </w:r>
             <w:r>
               <w:rPr>
@@ -1490,7 +1490,7 @@
               <w14:ligatures w14:val="standardContextual"/>
             </w:rPr>
           </w:pPr>
-          <w:hyperlink w:anchor="_Toc243165376" w:history="1">
+          <w:hyperlink w:anchor="_Toc243168997" w:history="1">
             <w:r>
               <w:rPr>
                 <w:rStyle w:val="Hyperlink"/>
@@ -1514,7 +1514,7 @@
               <w:rPr>
                 <w:noProof/>
               </w:rPr>
-              <w:instrText xml:space="preserve"> PAGEREF _Toc243165376 \h </w:instrText>
+              <w:instrText xml:space="preserve"> PAGEREF _Toc243168997 \h </w:instrText>
             </w:r>
             <w:r>
               <w:rPr>
@@ -1554,7 +1554,7 @@
               <w14:ligatures w14:val="standardContextual"/>
             </w:rPr>
           </w:pPr>
-          <w:hyperlink w:anchor="_Toc243165377" w:history="1">
+          <w:hyperlink w:anchor="_Toc243168998" w:history="1">
             <w:r>
               <w:rPr>
                 <w:rStyle w:val="Hyperlink"/>
@@ -1578,7 +1578,7 @@
               <w:rPr>
                 <w:noProof/>
               </w:rPr>
-              <w:instrText xml:space="preserve"> PAGEREF _Toc243165377 \h </w:instrText>
+              <w:instrText xml:space="preserve"> PAGEREF _Toc243168998 \h </w:instrText>
             </w:r>
             <w:r>
               <w:rPr>
@@ -1623,7 +1623,7 @@
     <w:sdt>
       <w:sdtPr>
         <w:alias w:val="LISTA DE TABELAS"/>
-        <w:id w:val="-404230386"/>
+        <w:id w:val="-503671057"/>
       </w:sdtPr>
       <w:sdtEndPr/>
       <w:sdtContent>
@@ -1649,7 +1649,7 @@
           <w:r>
             <w:fldChar w:fldCharType="separate"/>
           </w:r>
-          <w:hyperlink w:anchor="_Toc243165378" w:history="1">
+          <w:hyperlink w:anchor="_Toc243168999" w:history="1">
             <w:r>
               <w:rPr>
                 <w:rStyle w:val="Hyperlink"/>
@@ -1673,7 +1673,7 @@
               <w:rPr>
                 <w:noProof/>
               </w:rPr>
-              <w:instrText xml:space="preserve"> PAGEREF _Toc243165378 \h </w:instrText>
+              <w:instrText xml:space="preserve"> PAGEREF _Toc243168999 \h </w:instrText>
             </w:r>
             <w:r>
               <w:rPr>
@@ -1713,7 +1713,7 @@
               <w14:ligatures w14:val="standardContextual"/>
             </w:rPr>
           </w:pPr>
-          <w:hyperlink w:anchor="_Toc243165379" w:history="1">
+          <w:hyperlink w:anchor="_Toc243169000" w:history="1">
             <w:r>
               <w:rPr>
                 <w:rStyle w:val="Hyperlink"/>
@@ -1737,7 +1737,7 @@
               <w:rPr>
                 <w:noProof/>
               </w:rPr>
-              <w:instrText xml:space="preserve"> PAGEREF _Toc243165379 \h </w:instrText>
+              <w:instrText xml:space="preserve"> PAGEREF _Toc243169000 \h </w:instrText>
             </w:r>
             <w:r>
               <w:rPr>
@@ -1777,7 +1777,7 @@
               <w14:ligatures w14:val="standardContextual"/>
             </w:rPr>
           </w:pPr>
-          <w:hyperlink w:anchor="_Toc243165380" w:history="1">
+          <w:hyperlink w:anchor="_Toc243169001" w:history="1">
             <w:r>
               <w:rPr>
                 <w:rStyle w:val="Hyperlink"/>
@@ -1801,7 +1801,7 @@
               <w:rPr>
                 <w:noProof/>
               </w:rPr>
-              <w:instrText xml:space="preserve"> PAGEREF _Toc243165380 \h </w:instrText>
+              <w:instrText xml:space="preserve"> PAGEREF _Toc243169001 \h </w:instrText>
             </w:r>
             <w:r>
               <w:rPr>
@@ -1841,7 +1841,7 @@
               <w14:ligatures w14:val="standardContextual"/>
             </w:rPr>
           </w:pPr>
-          <w:hyperlink w:anchor="_Toc243165381" w:history="1">
+          <w:hyperlink w:anchor="_Toc243169002" w:history="1">
             <w:r>
               <w:rPr>
                 <w:rStyle w:val="Hyperlink"/>
@@ -1865,7 +1865,7 @@
               <w:rPr>
                 <w:noProof/>
               </w:rPr>
-              <w:instrText xml:space="preserve"> PAGEREF _Toc243165381 \h </w:instrText>
+              <w:instrText xml:space="preserve"> PAGEREF _Toc243169002 \h </w:instrText>
             </w:r>
             <w:r>
               <w:rPr>
@@ -1905,7 +1905,7 @@
               <w14:ligatures w14:val="standardContextual"/>
             </w:rPr>
           </w:pPr>
-          <w:hyperlink w:anchor="_Toc243165382" w:history="1">
+          <w:hyperlink w:anchor="_Toc243169003" w:history="1">
             <w:r>
               <w:rPr>
                 <w:rStyle w:val="Hyperlink"/>
@@ -1929,7 +1929,7 @@
               <w:rPr>
                 <w:noProof/>
               </w:rPr>
-              <w:instrText xml:space="preserve"> PAGEREF _Toc243165382 \h </w:instrText>
+              <w:instrText xml:space="preserve"> PAGEREF _Toc243169003 \h </w:instrText>
             </w:r>
             <w:r>
               <w:rPr>
@@ -2532,7 +2532,7 @@
           <w:bCs w:val="0"/>
         </w:rPr>
         <w:alias w:val="Sumário"/>
-        <w:id w:val="1432389566"/>
+        <w:id w:val="-1290672561"/>
       </w:sdtPr>
       <w:sdtEndPr/>
       <w:sdtContent>
@@ -2560,7 +2560,7 @@
           <w:r>
             <w:fldChar w:fldCharType="separate"/>
           </w:r>
-          <w:hyperlink w:anchor="_Toc243165313" w:history="1">
+          <w:hyperlink w:anchor="_Toc243168934" w:history="1">
             <w:r>
               <w:rPr>
                 <w:rStyle w:val="Hyperlink"/>
@@ -2584,7 +2584,7 @@
               <w:rPr>
                 <w:noProof/>
               </w:rPr>
-              <w:instrText xml:space="preserve"> PAGEREF _Toc243165313 \h </w:instrText>
+              <w:instrText xml:space="preserve"> PAGEREF _Toc243168934 \h </w:instrText>
             </w:r>
             <w:r>
               <w:rPr>
@@ -2624,7 +2624,7 @@
               <w14:ligatures w14:val="standardContextual"/>
             </w:rPr>
           </w:pPr>
-          <w:hyperlink w:anchor="_Toc243165314" w:history="1">
+          <w:hyperlink w:anchor="_Toc243168935" w:history="1">
             <w:r>
               <w:rPr>
                 <w:rStyle w:val="Hyperlink"/>
@@ -2648,7 +2648,7 @@
               <w:rPr>
                 <w:noProof/>
               </w:rPr>
-              <w:instrText xml:space="preserve"> PAGEREF _Toc243165314 \h </w:instrText>
+              <w:instrText xml:space="preserve"> PAGEREF _Toc243168935 \h </w:instrText>
             </w:r>
             <w:r>
               <w:rPr>
@@ -2688,7 +2688,7 @@
               <w14:ligatures w14:val="standardContextual"/>
             </w:rPr>
           </w:pPr>
-          <w:hyperlink w:anchor="_Toc243165315" w:history="1">
+          <w:hyperlink w:anchor="_Toc243168936" w:history="1">
             <w:r>
               <w:rPr>
                 <w:rStyle w:val="Hyperlink"/>
@@ -2712,7 +2712,7 @@
               <w:rPr>
                 <w:noProof/>
               </w:rPr>
-              <w:instrText xml:space="preserve"> PAGEREF _Toc243165315 \h </w:instrText>
+              <w:instrText xml:space="preserve"> PAGEREF _Toc243168936 \h </w:instrText>
             </w:r>
             <w:r>
               <w:rPr>
@@ -2752,7 +2752,7 @@
               <w14:ligatures w14:val="standardContextual"/>
             </w:rPr>
           </w:pPr>
-          <w:hyperlink w:anchor="_Toc243165316" w:history="1">
+          <w:hyperlink w:anchor="_Toc243168937" w:history="1">
             <w:r>
               <w:rPr>
                 <w:rStyle w:val="Hyperlink"/>
@@ -2776,7 +2776,7 @@
               <w:rPr>
                 <w:noProof/>
               </w:rPr>
-              <w:instrText xml:space="preserve"> PAGEREF _Toc243165316 \h </w:instrText>
+              <w:instrText xml:space="preserve"> PAGEREF _Toc243168937 \h </w:instrText>
             </w:r>
             <w:r>
               <w:rPr>
@@ -2816,7 +2816,7 @@
               <w14:ligatures w14:val="standardContextual"/>
             </w:rPr>
           </w:pPr>
-          <w:hyperlink w:anchor="_Toc243165317" w:history="1">
+          <w:hyperlink w:anchor="_Toc243168938" w:history="1">
             <w:r>
               <w:rPr>
                 <w:rStyle w:val="Hyperlink"/>
@@ -2840,7 +2840,7 @@
               <w:rPr>
                 <w:noProof/>
               </w:rPr>
-              <w:instrText xml:space="preserve"> PAGEREF _Toc243165317 \h </w:instrText>
+              <w:instrText xml:space="preserve"> PAGEREF _Toc243168938 \h </w:instrText>
             </w:r>
             <w:r>
               <w:rPr>
@@ -2882,7 +2882,7 @@
               <w14:ligatures w14:val="standardContextual"/>
             </w:rPr>
           </w:pPr>
-          <w:hyperlink w:anchor="_Toc243165318" w:history="1">
+          <w:hyperlink w:anchor="_Toc243168939" w:history="1">
             <w:r>
               <w:rPr>
                 <w:rStyle w:val="Hyperlink"/>
@@ -2906,7 +2906,7 @@
               <w:rPr>
                 <w:noProof/>
               </w:rPr>
-              <w:instrText xml:space="preserve"> PAGEREF _Toc243165318 \h </w:instrText>
+              <w:instrText xml:space="preserve"> PAGEREF _Toc243168939 \h </w:instrText>
             </w:r>
             <w:r>
               <w:rPr>
@@ -2946,7 +2946,7 @@
               <w14:ligatures w14:val="standardContextual"/>
             </w:rPr>
           </w:pPr>
-          <w:hyperlink w:anchor="_Toc243165319" w:history="1">
+          <w:hyperlink w:anchor="_Toc243168940" w:history="1">
             <w:r>
               <w:rPr>
                 <w:rStyle w:val="Hyperlink"/>
@@ -2970,7 +2970,7 @@
               <w:rPr>
                 <w:noProof/>
               </w:rPr>
-              <w:instrText xml:space="preserve"> PAGEREF _Toc243165319 \h </w:instrText>
+              <w:instrText xml:space="preserve"> PAGEREF _Toc243168940 \h </w:instrText>
             </w:r>
             <w:r>
               <w:rPr>
@@ -3010,7 +3010,7 @@
               <w14:ligatures w14:val="standardContextual"/>
             </w:rPr>
           </w:pPr>
-          <w:hyperlink w:anchor="_Toc243165320" w:history="1">
+          <w:hyperlink w:anchor="_Toc243168941" w:history="1">
             <w:r>
               <w:rPr>
                 <w:rStyle w:val="Hyperlink"/>
@@ -3034,7 +3034,7 @@
               <w:rPr>
                 <w:noProof/>
               </w:rPr>
-              <w:instrText xml:space="preserve"> PAGEREF _Toc243165320 \h </w:instrText>
+              <w:instrText xml:space="preserve"> PAGEREF _Toc243168941 \h </w:instrText>
             </w:r>
             <w:r>
               <w:rPr>
@@ -3074,7 +3074,7 @@
               <w14:ligatures w14:val="standardContextual"/>
             </w:rPr>
           </w:pPr>
-          <w:hyperlink w:anchor="_Toc243165321" w:history="1">
+          <w:hyperlink w:anchor="_Toc243168942" w:history="1">
             <w:r>
               <w:rPr>
                 <w:rStyle w:val="Hyperlink"/>
@@ -3098,7 +3098,7 @@
               <w:rPr>
                 <w:noProof/>
               </w:rPr>
-              <w:instrText xml:space="preserve"> PAGEREF _Toc243165321 \h </w:instrText>
+              <w:instrText xml:space="preserve"> PAGEREF _Toc243168942 \h </w:instrText>
             </w:r>
             <w:r>
               <w:rPr>
@@ -3138,7 +3138,7 @@
               <w14:ligatures w14:val="standardContextual"/>
             </w:rPr>
           </w:pPr>
-          <w:hyperlink w:anchor="_Toc243165322" w:history="1">
+          <w:hyperlink w:anchor="_Toc243168943" w:history="1">
             <w:r>
               <w:rPr>
                 <w:rStyle w:val="Hyperlink"/>
@@ -3162,7 +3162,7 @@
               <w:rPr>
                 <w:noProof/>
               </w:rPr>
-              <w:instrText xml:space="preserve"> PAGEREF _Toc243165322 \h </w:instrText>
+              <w:instrText xml:space="preserve"> PAGEREF _Toc243168943 \h </w:instrText>
             </w:r>
             <w:r>
               <w:rPr>
@@ -3202,7 +3202,7 @@
               <w14:ligatures w14:val="standardContextual"/>
             </w:rPr>
           </w:pPr>
-          <w:hyperlink w:anchor="_Toc243165323" w:history="1">
+          <w:hyperlink w:anchor="_Toc243168944" w:history="1">
             <w:r>
               <w:rPr>
                 <w:rStyle w:val="Hyperlink"/>
@@ -3226,7 +3226,7 @@
               <w:rPr>
                 <w:noProof/>
               </w:rPr>
-              <w:instrText xml:space="preserve"> PAGEREF _Toc243165323 \h </w:instrText>
+              <w:instrText xml:space="preserve"> PAGEREF _Toc243168944 \h </w:instrText>
             </w:r>
             <w:r>
               <w:rPr>
@@ -3268,7 +3268,7 @@
               <w14:ligatures w14:val="standardContextual"/>
             </w:rPr>
           </w:pPr>
-          <w:hyperlink w:anchor="_Toc243165324" w:history="1">
+          <w:hyperlink w:anchor="_Toc243168945" w:history="1">
             <w:r>
               <w:rPr>
                 <w:rStyle w:val="Hyperlink"/>
@@ -3292,7 +3292,7 @@
               <w:rPr>
                 <w:noProof/>
               </w:rPr>
-              <w:instrText xml:space="preserve"> PAGEREF _Toc243165324 \h </w:instrText>
+              <w:instrText xml:space="preserve"> PAGEREF _Toc243168945 \h </w:instrText>
             </w:r>
             <w:r>
               <w:rPr>
@@ -3332,7 +3332,7 @@
               <w14:ligatures w14:val="standardContextual"/>
             </w:rPr>
           </w:pPr>
-          <w:hyperlink w:anchor="_Toc243165325" w:history="1">
+          <w:hyperlink w:anchor="_Toc243168946" w:history="1">
             <w:r>
               <w:rPr>
                 <w:rStyle w:val="Hyperlink"/>
@@ -3356,7 +3356,7 @@
               <w:rPr>
                 <w:noProof/>
               </w:rPr>
-              <w:instrText xml:space="preserve"> PAGEREF _Toc243165325 \h </w:instrText>
+              <w:instrText xml:space="preserve"> PAGEREF _Toc243168946 \h </w:instrText>
             </w:r>
             <w:r>
               <w:rPr>
@@ -3396,7 +3396,7 @@
               <w14:ligatures w14:val="standardContextual"/>
             </w:rPr>
           </w:pPr>
-          <w:hyperlink w:anchor="_Toc243165326" w:history="1">
+          <w:hyperlink w:anchor="_Toc243168947" w:history="1">
             <w:r>
               <w:rPr>
                 <w:rStyle w:val="Hyperlink"/>
@@ -3420,7 +3420,7 @@
               <w:rPr>
                 <w:noProof/>
               </w:rPr>
-              <w:instrText xml:space="preserve"> PAGEREF _Toc243165326 \h </w:instrText>
+              <w:instrText xml:space="preserve"> PAGEREF _Toc243168947 \h </w:instrText>
             </w:r>
             <w:r>
               <w:rPr>
@@ -3460,7 +3460,7 @@
               <w14:ligatures w14:val="standardContextual"/>
             </w:rPr>
           </w:pPr>
-          <w:hyperlink w:anchor="_Toc243165327" w:history="1">
+          <w:hyperlink w:anchor="_Toc243168948" w:history="1">
             <w:r>
               <w:rPr>
                 <w:rStyle w:val="Hyperlink"/>
@@ -3484,7 +3484,7 @@
               <w:rPr>
                 <w:noProof/>
               </w:rPr>
-              <w:instrText xml:space="preserve"> PAGEREF _Toc243165327 \h </w:instrText>
+              <w:instrText xml:space="preserve"> PAGEREF _Toc243168948 \h </w:instrText>
             </w:r>
             <w:r>
               <w:rPr>
@@ -3524,7 +3524,7 @@
               <w14:ligatures w14:val="standardContextual"/>
             </w:rPr>
           </w:pPr>
-          <w:hyperlink w:anchor="_Toc243165328" w:history="1">
+          <w:hyperlink w:anchor="_Toc243168949" w:history="1">
             <w:r>
               <w:rPr>
                 <w:rStyle w:val="Hyperlink"/>
@@ -3548,7 +3548,7 @@
               <w:rPr>
                 <w:noProof/>
               </w:rPr>
-              <w:instrText xml:space="preserve"> PAGEREF _Toc243165328 \h </w:instrText>
+              <w:instrText xml:space="preserve"> PAGEREF _Toc243168949 \h </w:instrText>
             </w:r>
             <w:r>
               <w:rPr>
@@ -3588,7 +3588,7 @@
               <w14:ligatures w14:val="standardContextual"/>
             </w:rPr>
           </w:pPr>
-          <w:hyperlink w:anchor="_Toc243165329" w:history="1">
+          <w:hyperlink w:anchor="_Toc243168950" w:history="1">
             <w:r>
               <w:rPr>
                 <w:rStyle w:val="Hyperlink"/>
@@ -3612,7 +3612,7 @@
               <w:rPr>
                 <w:noProof/>
               </w:rPr>
-              <w:instrText xml:space="preserve"> PAGEREF _Toc243165329 \h </w:instrText>
+              <w:instrText xml:space="preserve"> PAGEREF _Toc243168950 \h </w:instrText>
             </w:r>
             <w:r>
               <w:rPr>
@@ -3652,7 +3652,7 @@
               <w14:ligatures w14:val="standardContextual"/>
             </w:rPr>
           </w:pPr>
-          <w:hyperlink w:anchor="_Toc243165330" w:history="1">
+          <w:hyperlink w:anchor="_Toc243168951" w:history="1">
             <w:r>
               <w:rPr>
                 <w:rStyle w:val="Hyperlink"/>
@@ -3676,7 +3676,7 @@
               <w:rPr>
                 <w:noProof/>
               </w:rPr>
-              <w:instrText xml:space="preserve"> PAGEREF _Toc243165330 \h </w:instrText>
+              <w:instrText xml:space="preserve"> PAGEREF _Toc243168951 \h </w:instrText>
             </w:r>
             <w:r>
               <w:rPr>
@@ -3716,7 +3716,7 @@
               <w14:ligatures w14:val="standardContextual"/>
             </w:rPr>
           </w:pPr>
-          <w:hyperlink w:anchor="_Toc243165331" w:history="1">
+          <w:hyperlink w:anchor="_Toc243168952" w:history="1">
             <w:r>
               <w:rPr>
                 <w:rStyle w:val="Hyperlink"/>
@@ -3740,7 +3740,7 @@
               <w:rPr>
                 <w:noProof/>
               </w:rPr>
-              <w:instrText xml:space="preserve"> PAGEREF _Toc243165331 \h </w:instrText>
+              <w:instrText xml:space="preserve"> PAGEREF _Toc243168952 \h </w:instrText>
             </w:r>
             <w:r>
               <w:rPr>
@@ -3780,7 +3780,7 @@
               <w14:ligatures w14:val="standardContextual"/>
             </w:rPr>
           </w:pPr>
-          <w:hyperlink w:anchor="_Toc243165332" w:history="1">
+          <w:hyperlink w:anchor="_Toc243168953" w:history="1">
             <w:r>
               <w:rPr>
                 <w:rStyle w:val="Hyperlink"/>
@@ -3804,7 +3804,7 @@
               <w:rPr>
                 <w:noProof/>
               </w:rPr>
-              <w:instrText xml:space="preserve"> PAGEREF _Toc243165332 \h </w:instrText>
+              <w:instrText xml:space="preserve"> PAGEREF _Toc243168953 \h </w:instrText>
             </w:r>
             <w:r>
               <w:rPr>
@@ -3844,7 +3844,7 @@
               <w14:ligatures w14:val="standardContextual"/>
             </w:rPr>
           </w:pPr>
-          <w:hyperlink w:anchor="_Toc243165333" w:history="1">
+          <w:hyperlink w:anchor="_Toc243168954" w:history="1">
             <w:r>
               <w:rPr>
                 <w:rStyle w:val="Hyperlink"/>
@@ -3868,7 +3868,7 @@
               <w:rPr>
                 <w:noProof/>
               </w:rPr>
-              <w:instrText xml:space="preserve"> PAGEREF _Toc243165333 \h </w:instrText>
+              <w:instrText xml:space="preserve"> PAGEREF _Toc243168954 \h </w:instrText>
             </w:r>
             <w:r>
               <w:rPr>
@@ -3908,7 +3908,7 @@
               <w14:ligatures w14:val="standardContextual"/>
             </w:rPr>
           </w:pPr>
-          <w:hyperlink w:anchor="_Toc243165334" w:history="1">
+          <w:hyperlink w:anchor="_Toc243168955" w:history="1">
             <w:r>
               <w:rPr>
                 <w:rStyle w:val="Hyperlink"/>
@@ -3932,7 +3932,7 @@
               <w:rPr>
                 <w:noProof/>
               </w:rPr>
-              <w:instrText xml:space="preserve"> PAGEREF _Toc243165334 \h </w:instrText>
+              <w:instrText xml:space="preserve"> PAGEREF _Toc243168955 \h </w:instrText>
             </w:r>
             <w:r>
               <w:rPr>
@@ -3972,7 +3972,7 @@
               <w14:ligatures w14:val="standardContextual"/>
             </w:rPr>
           </w:pPr>
-          <w:hyperlink w:anchor="_Toc243165335" w:history="1">
+          <w:hyperlink w:anchor="_Toc243168956" w:history="1">
             <w:r>
               <w:rPr>
                 <w:rStyle w:val="Hyperlink"/>
@@ -3996,7 +3996,7 @@
               <w:rPr>
                 <w:noProof/>
               </w:rPr>
-              <w:instrText xml:space="preserve"> PAGEREF _Toc243165335 \h </w:instrText>
+              <w:instrText xml:space="preserve"> PAGEREF _Toc243168956 \h </w:instrText>
             </w:r>
             <w:r>
               <w:rPr>
@@ -4038,7 +4038,7 @@
               <w14:ligatures w14:val="standardContextual"/>
             </w:rPr>
           </w:pPr>
-          <w:hyperlink w:anchor="_Toc243165336" w:history="1">
+          <w:hyperlink w:anchor="_Toc243168957" w:history="1">
             <w:r>
               <w:rPr>
                 <w:rStyle w:val="Hyperlink"/>
@@ -4062,7 +4062,7 @@
               <w:rPr>
                 <w:noProof/>
               </w:rPr>
-              <w:instrText xml:space="preserve"> PAGEREF _Toc243165336 \h </w:instrText>
+              <w:instrText xml:space="preserve"> PAGEREF _Toc243168957 \h </w:instrText>
             </w:r>
             <w:r>
               <w:rPr>
@@ -4102,7 +4102,7 @@
               <w14:ligatures w14:val="standardContextual"/>
             </w:rPr>
           </w:pPr>
-          <w:hyperlink w:anchor="_Toc243165337" w:history="1">
+          <w:hyperlink w:anchor="_Toc243168958" w:history="1">
             <w:r>
               <w:rPr>
                 <w:rStyle w:val="Hyperlink"/>
@@ -4126,7 +4126,7 @@
               <w:rPr>
                 <w:noProof/>
               </w:rPr>
-              <w:instrText xml:space="preserve"> PAGEREF _Toc243165337 \h </w:instrText>
+              <w:instrText xml:space="preserve"> PAGEREF _Toc243168958 \h </w:instrText>
             </w:r>
             <w:r>
               <w:rPr>
@@ -4166,7 +4166,7 @@
               <w14:ligatures w14:val="standardContextual"/>
             </w:rPr>
           </w:pPr>
-          <w:hyperlink w:anchor="_Toc243165338" w:history="1">
+          <w:hyperlink w:anchor="_Toc243168959" w:history="1">
             <w:r>
               <w:rPr>
                 <w:rStyle w:val="Hyperlink"/>
@@ -4190,7 +4190,7 @@
               <w:rPr>
                 <w:noProof/>
               </w:rPr>
-              <w:instrText xml:space="preserve"> PAGEREF _Toc243165338 \h </w:instrText>
+              <w:instrText xml:space="preserve"> PAGEREF _Toc243168959 \h </w:instrText>
             </w:r>
             <w:r>
               <w:rPr>
@@ -4230,7 +4230,7 @@
               <w14:ligatures w14:val="standardContextual"/>
             </w:rPr>
           </w:pPr>
-          <w:hyperlink w:anchor="_Toc243165339" w:history="1">
+          <w:hyperlink w:anchor="_Toc243168960" w:history="1">
             <w:r>
               <w:rPr>
                 <w:rStyle w:val="Hyperlink"/>
@@ -4254,7 +4254,7 @@
               <w:rPr>
                 <w:noProof/>
               </w:rPr>
-              <w:instrText xml:space="preserve"> PAGEREF _Toc243165339 \h </w:instrText>
+              <w:instrText xml:space="preserve"> PAGEREF _Toc243168960 \h </w:instrText>
             </w:r>
             <w:r>
               <w:rPr>
@@ -4294,7 +4294,7 @@
               <w14:ligatures w14:val="standardContextual"/>
             </w:rPr>
           </w:pPr>
-          <w:hyperlink w:anchor="_Toc243165340" w:history="1">
+          <w:hyperlink w:anchor="_Toc243168961" w:history="1">
             <w:r>
               <w:rPr>
                 <w:rStyle w:val="Hyperlink"/>
@@ -4318,7 +4318,7 @@
               <w:rPr>
                 <w:noProof/>
               </w:rPr>
-              <w:instrText xml:space="preserve"> PAGEREF _Toc243165340 \h </w:instrText>
+              <w:instrText xml:space="preserve"> PAGEREF _Toc243168961 \h </w:instrText>
             </w:r>
             <w:r>
               <w:rPr>
@@ -4358,7 +4358,7 @@
               <w14:ligatures w14:val="standardContextual"/>
             </w:rPr>
           </w:pPr>
-          <w:hyperlink w:anchor="_Toc243165341" w:history="1">
+          <w:hyperlink w:anchor="_Toc243168962" w:history="1">
             <w:r>
               <w:rPr>
                 <w:rStyle w:val="Hyperlink"/>
@@ -4382,7 +4382,7 @@
               <w:rPr>
                 <w:noProof/>
               </w:rPr>
-              <w:instrText xml:space="preserve"> PAGEREF _Toc243165341 \h </w:instrText>
+              <w:instrText xml:space="preserve"> PAGEREF _Toc243168962 \h </w:instrText>
             </w:r>
             <w:r>
               <w:rPr>
@@ -4422,7 +4422,7 @@
               <w14:ligatures w14:val="standardContextual"/>
             </w:rPr>
           </w:pPr>
-          <w:hyperlink w:anchor="_Toc243165342" w:history="1">
+          <w:hyperlink w:anchor="_Toc243168963" w:history="1">
             <w:r>
               <w:rPr>
                 <w:rStyle w:val="Hyperlink"/>
@@ -4446,7 +4446,7 @@
               <w:rPr>
                 <w:noProof/>
               </w:rPr>
-              <w:instrText xml:space="preserve"> PAGEREF _Toc243165342 \h </w:instrText>
+              <w:instrText xml:space="preserve"> PAGEREF _Toc243168963 \h </w:instrText>
             </w:r>
             <w:r>
               <w:rPr>
@@ -4486,7 +4486,7 @@
               <w14:ligatures w14:val="standardContextual"/>
             </w:rPr>
           </w:pPr>
-          <w:hyperlink w:anchor="_Toc243165343" w:history="1">
+          <w:hyperlink w:anchor="_Toc243168964" w:history="1">
             <w:r>
               <w:rPr>
                 <w:rStyle w:val="Hyperlink"/>
@@ -4510,7 +4510,7 @@
               <w:rPr>
                 <w:noProof/>
               </w:rPr>
-              <w:instrText xml:space="preserve"> PAGEREF _Toc243165343 \h </w:instrText>
+              <w:instrText xml:space="preserve"> PAGEREF _Toc243168964 \h </w:instrText>
             </w:r>
             <w:r>
               <w:rPr>
@@ -4550,7 +4550,7 @@
               <w14:ligatures w14:val="standardContextual"/>
             </w:rPr>
           </w:pPr>
-          <w:hyperlink w:anchor="_Toc243165344" w:history="1">
+          <w:hyperlink w:anchor="_Toc243168965" w:history="1">
             <w:r>
               <w:rPr>
                 <w:rStyle w:val="Hyperlink"/>
@@ -4574,7 +4574,7 @@
               <w:rPr>
                 <w:noProof/>
               </w:rPr>
-              <w:instrText xml:space="preserve"> PAGEREF _Toc243165344 \h </w:instrText>
+              <w:instrText xml:space="preserve"> PAGEREF _Toc243168965 \h </w:instrText>
             </w:r>
             <w:r>
               <w:rPr>
@@ -4614,7 +4614,7 @@
               <w14:ligatures w14:val="standardContextual"/>
             </w:rPr>
           </w:pPr>
-          <w:hyperlink w:anchor="_Toc243165345" w:history="1">
+          <w:hyperlink w:anchor="_Toc243168966" w:history="1">
             <w:r>
               <w:rPr>
                 <w:rStyle w:val="Hyperlink"/>
@@ -4638,7 +4638,7 @@
               <w:rPr>
                 <w:noProof/>
               </w:rPr>
-              <w:instrText xml:space="preserve"> PAGEREF _Toc243165345 \h </w:instrText>
+              <w:instrText xml:space="preserve"> PAGEREF _Toc243168966 \h </w:instrText>
             </w:r>
             <w:r>
               <w:rPr>
@@ -4678,7 +4678,7 @@
               <w14:ligatures w14:val="standardContextual"/>
             </w:rPr>
           </w:pPr>
-          <w:hyperlink w:anchor="_Toc243165346" w:history="1">
+          <w:hyperlink w:anchor="_Toc243168967" w:history="1">
             <w:r>
               <w:rPr>
                 <w:rStyle w:val="Hyperlink"/>
@@ -4702,7 +4702,7 @@
               <w:rPr>
                 <w:noProof/>
               </w:rPr>
-              <w:instrText xml:space="preserve"> PAGEREF _Toc243165346 \h </w:instrText>
+              <w:instrText xml:space="preserve"> PAGEREF _Toc243168967 \h </w:instrText>
             </w:r>
             <w:r>
               <w:rPr>
@@ -4742,7 +4742,7 @@
               <w14:ligatures w14:val="standardContextual"/>
             </w:rPr>
           </w:pPr>
-          <w:hyperlink w:anchor="_Toc243165347" w:history="1">
+          <w:hyperlink w:anchor="_Toc243168968" w:history="1">
             <w:r>
               <w:rPr>
                 <w:rStyle w:val="Hyperlink"/>
@@ -4766,7 +4766,7 @@
               <w:rPr>
                 <w:noProof/>
               </w:rPr>
-              <w:instrText xml:space="preserve"> PAGEREF _Toc243165347 \h </w:instrText>
+              <w:instrText xml:space="preserve"> PAGEREF _Toc243168968 \h </w:instrText>
             </w:r>
             <w:r>
               <w:rPr>
@@ -4806,7 +4806,7 @@
               <w14:ligatures w14:val="standardContextual"/>
             </w:rPr>
           </w:pPr>
-          <w:hyperlink w:anchor="_Toc243165348" w:history="1">
+          <w:hyperlink w:anchor="_Toc243168969" w:history="1">
             <w:r>
               <w:rPr>
                 <w:rStyle w:val="Hyperlink"/>
@@ -4830,7 +4830,7 @@
               <w:rPr>
                 <w:noProof/>
               </w:rPr>
-              <w:instrText xml:space="preserve"> PAGEREF _Toc243165348 \h </w:instrText>
+              <w:instrText xml:space="preserve"> PAGEREF _Toc243168969 \h </w:instrText>
             </w:r>
             <w:r>
               <w:rPr>
@@ -4870,7 +4870,7 @@
               <w14:ligatures w14:val="standardContextual"/>
             </w:rPr>
           </w:pPr>
-          <w:hyperlink w:anchor="_Toc243165349" w:history="1">
+          <w:hyperlink w:anchor="_Toc243168970" w:history="1">
             <w:r>
               <w:rPr>
                 <w:rStyle w:val="Hyperlink"/>
@@ -4894,7 +4894,7 @@
               <w:rPr>
                 <w:noProof/>
               </w:rPr>
-              <w:instrText xml:space="preserve"> PAGEREF _Toc243165349 \h </w:instrText>
+              <w:instrText xml:space="preserve"> PAGEREF _Toc243168970 \h </w:instrText>
             </w:r>
             <w:r>
               <w:rPr>
@@ -4934,7 +4934,7 @@
               <w14:ligatures w14:val="standardContextual"/>
             </w:rPr>
           </w:pPr>
-          <w:hyperlink w:anchor="_Toc243165350" w:history="1">
+          <w:hyperlink w:anchor="_Toc243168971" w:history="1">
             <w:r>
               <w:rPr>
                 <w:rStyle w:val="Hyperlink"/>
@@ -4958,7 +4958,7 @@
               <w:rPr>
                 <w:noProof/>
               </w:rPr>
-              <w:instrText xml:space="preserve"> PAGEREF _Toc243165350 \h </w:instrText>
+              <w:instrText xml:space="preserve"> PAGEREF _Toc243168971 \h </w:instrText>
             </w:r>
             <w:r>
               <w:rPr>
@@ -4998,7 +4998,7 @@
               <w14:ligatures w14:val="standardContextual"/>
             </w:rPr>
           </w:pPr>
-          <w:hyperlink w:anchor="_Toc243165351" w:history="1">
+          <w:hyperlink w:anchor="_Toc243168972" w:history="1">
             <w:r>
               <w:rPr>
                 <w:rStyle w:val="Hyperlink"/>
@@ -5022,7 +5022,7 @@
               <w:rPr>
                 <w:noProof/>
               </w:rPr>
-              <w:instrText xml:space="preserve"> PAGEREF _Toc243165351 \h </w:instrText>
+              <w:instrText xml:space="preserve"> PAGEREF _Toc243168972 \h </w:instrText>
             </w:r>
             <w:r>
               <w:rPr>
@@ -5064,7 +5064,7 @@
               <w14:ligatures w14:val="standardContextual"/>
             </w:rPr>
           </w:pPr>
-          <w:hyperlink w:anchor="_Toc243165352" w:history="1">
+          <w:hyperlink w:anchor="_Toc243168973" w:history="1">
             <w:r>
               <w:rPr>
                 <w:rStyle w:val="Hyperlink"/>
@@ -5088,7 +5088,7 @@
               <w:rPr>
                 <w:noProof/>
               </w:rPr>
-              <w:instrText xml:space="preserve"> PAGEREF _Toc243165352 \h </w:instrText>
+              <w:instrText xml:space="preserve"> PAGEREF _Toc243168973 \h </w:instrText>
             </w:r>
             <w:r>
               <w:rPr>
@@ -5130,7 +5130,7 @@
               <w14:ligatures w14:val="standardContextual"/>
             </w:rPr>
           </w:pPr>
-          <w:hyperlink w:anchor="_Toc243165353" w:history="1">
+          <w:hyperlink w:anchor="_Toc243168974" w:history="1">
             <w:r>
               <w:rPr>
                 <w:rStyle w:val="Hyperlink"/>
@@ -5154,7 +5154,7 @@
               <w:rPr>
                 <w:noProof/>
               </w:rPr>
-              <w:instrText xml:space="preserve"> PAGEREF _Toc243165353 \h </w:instrText>
+              <w:instrText xml:space="preserve"> PAGEREF _Toc243168974 \h </w:instrText>
             </w:r>
             <w:r>
               <w:rPr>
@@ -5196,7 +5196,7 @@
               <w14:ligatures w14:val="standardContextual"/>
             </w:rPr>
           </w:pPr>
-          <w:hyperlink w:anchor="_Toc243165354" w:history="1">
+          <w:hyperlink w:anchor="_Toc243168975" w:history="1">
             <w:r>
               <w:rPr>
                 <w:rStyle w:val="Hyperlink"/>
@@ -5220,7 +5220,7 @@
               <w:rPr>
                 <w:noProof/>
               </w:rPr>
-              <w:instrText xml:space="preserve"> PAGEREF _Toc243165354 \h </w:instrText>
+              <w:instrText xml:space="preserve"> PAGEREF _Toc243168975 \h </w:instrText>
             </w:r>
             <w:r>
               <w:rPr>
@@ -5262,7 +5262,7 @@
               <w14:ligatures w14:val="standardContextual"/>
             </w:rPr>
           </w:pPr>
-          <w:hyperlink w:anchor="_Toc243165355" w:history="1">
+          <w:hyperlink w:anchor="_Toc243168976" w:history="1">
             <w:r>
               <w:rPr>
                 <w:rStyle w:val="Hyperlink"/>
@@ -5286,7 +5286,7 @@
               <w:rPr>
                 <w:noProof/>
               </w:rPr>
-              <w:instrText xml:space="preserve"> PAGEREF _Toc243165355 \h </w:instrText>
+              <w:instrText xml:space="preserve"> PAGEREF _Toc243168976 \h </w:instrText>
             </w:r>
             <w:r>
               <w:rPr>
@@ -5328,7 +5328,7 @@
               <w14:ligatures w14:val="standardContextual"/>
             </w:rPr>
           </w:pPr>
-          <w:hyperlink w:anchor="_Toc243165356" w:history="1">
+          <w:hyperlink w:anchor="_Toc243168977" w:history="1">
             <w:r>
               <w:rPr>
                 <w:rStyle w:val="Hyperlink"/>
@@ -5352,7 +5352,7 @@
               <w:rPr>
                 <w:noProof/>
               </w:rPr>
-              <w:instrText xml:space="preserve"> PAGEREF _Toc243165356 \h </w:instrText>
+              <w:instrText xml:space="preserve"> PAGEREF _Toc243168977 \h </w:instrText>
             </w:r>
             <w:r>
               <w:rPr>
@@ -5394,7 +5394,7 @@
               <w14:ligatures w14:val="standardContextual"/>
             </w:rPr>
           </w:pPr>
-          <w:hyperlink w:anchor="_Toc243165357" w:history="1">
+          <w:hyperlink w:anchor="_Toc243168978" w:history="1">
             <w:r>
               <w:rPr>
                 <w:rStyle w:val="Hyperlink"/>
@@ -5418,7 +5418,7 @@
               <w:rPr>
                 <w:noProof/>
               </w:rPr>
-              <w:instrText xml:space="preserve"> PAGEREF _Toc243165357 \h </w:instrText>
+              <w:instrText xml:space="preserve"> PAGEREF _Toc243168978 \h </w:instrText>
             </w:r>
             <w:r>
               <w:rPr>
@@ -5460,7 +5460,7 @@
               <w14:ligatures w14:val="standardContextual"/>
             </w:rPr>
           </w:pPr>
-          <w:hyperlink w:anchor="_Toc243165358" w:history="1">
+          <w:hyperlink w:anchor="_Toc243168979" w:history="1">
             <w:r>
               <w:rPr>
                 <w:rStyle w:val="Hyperlink"/>
@@ -5484,7 +5484,7 @@
               <w:rPr>
                 <w:noProof/>
               </w:rPr>
-              <w:instrText xml:space="preserve"> PAGEREF _Toc243165358 \h </w:instrText>
+              <w:instrText xml:space="preserve"> PAGEREF _Toc243168979 \h </w:instrText>
             </w:r>
             <w:r>
               <w:rPr>
@@ -5533,7 +5533,7 @@
       <w:pPr>
         <w:pStyle w:val="Ttulo1"/>
       </w:pPr>
-      <w:bookmarkStart w:id="0" w:name="_Toc243165313"/>
+      <w:bookmarkStart w:id="0" w:name="_Toc243168934"/>
       <w:r>
         <w:t>1 INTRODUÇÃO</w:t>
       </w:r>
@@ -5605,7 +5605,7 @@
       <w:pPr>
         <w:pStyle w:val="Ttulo2"/>
       </w:pPr>
-      <w:bookmarkStart w:id="1" w:name="_Toc243165314"/>
+      <w:bookmarkStart w:id="1" w:name="_Toc243168935"/>
       <w:r>
         <w:t>1.1 OBJETIVOS</w:t>
       </w:r>
@@ -5615,7 +5615,7 @@
       <w:pPr>
         <w:pStyle w:val="Ttulo3"/>
       </w:pPr>
-      <w:bookmarkStart w:id="2" w:name="_Toc243165315"/>
+      <w:bookmarkStart w:id="2" w:name="_Toc243168936"/>
       <w:r>
         <w:t>1.1.1 Objetivo geral</w:t>
       </w:r>
@@ -5634,7 +5634,7 @@
       <w:pPr>
         <w:pStyle w:val="Ttulo3"/>
       </w:pPr>
-      <w:bookmarkStart w:id="3" w:name="_Toc243165316"/>
+      <w:bookmarkStart w:id="3" w:name="_Toc243168937"/>
       <w:r>
         <w:t>1.1.2 Objetivos específicos</w:t>
       </w:r>
@@ -5742,7 +5742,7 @@
       <w:pPr>
         <w:pStyle w:val="Ttulo2"/>
       </w:pPr>
-      <w:bookmarkStart w:id="4" w:name="_Toc243165317"/>
+      <w:bookmarkStart w:id="4" w:name="_Toc243168938"/>
       <w:r>
         <w:t>1.2 ORGANIZAÇÃO DO RELATÓRIO</w:t>
       </w:r>
@@ -5761,7 +5761,7 @@
       <w:pPr>
         <w:pStyle w:val="Ttulo1"/>
       </w:pPr>
-      <w:bookmarkStart w:id="5" w:name="_Toc243165318"/>
+      <w:bookmarkStart w:id="5" w:name="_Toc243168939"/>
       <w:r>
         <w:t>2 FUNDAMENTAÇÃO TEÓRICA</w:t>
       </w:r>
@@ -5780,7 +5780,7 @@
       <w:pPr>
         <w:pStyle w:val="Ttulo2"/>
       </w:pPr>
-      <w:bookmarkStart w:id="6" w:name="_Toc243165319"/>
+      <w:bookmarkStart w:id="6" w:name="_Toc243168940"/>
       <w:r>
         <w:t>2.1 MARCADORES BIOQUÍMICOS NO DIAGNÓSTICO CLÍNICO</w:t>
       </w:r>
@@ -5812,7 +5812,7 @@
       <w:pPr>
         <w:pStyle w:val="LegendaABNT"/>
       </w:pPr>
-      <w:bookmarkStart w:id="7" w:name="_Toc243165371"/>
+      <w:bookmarkStart w:id="7" w:name="_Toc243168992"/>
       <w:r>
         <w:t xml:space="preserve">Quadro </w:t>
       </w:r>
@@ -6350,7 +6350,7 @@
       <w:pPr>
         <w:pStyle w:val="Ttulo2"/>
       </w:pPr>
-      <w:bookmarkStart w:id="8" w:name="_Toc243165320"/>
+      <w:bookmarkStart w:id="8" w:name="_Toc243168941"/>
       <w:r>
         <w:t>2.2 PRÁTICA DE RECUPERAÇÃO E REPETIÇÃO ESPAÇADA</w:t>
       </w:r>
@@ -6430,7 +6430,7 @@
       <w:pPr>
         <w:pStyle w:val="Ttulo2"/>
       </w:pPr>
-      <w:bookmarkStart w:id="9" w:name="_Toc243165321"/>
+      <w:bookmarkStart w:id="9" w:name="_Toc243168942"/>
       <w:r>
         <w:t>2.3 O ALGORITMO SM-2</w:t>
       </w:r>
@@ -6506,7 +6506,7 @@
       <w:pPr>
         <w:pStyle w:val="Ttulo2"/>
       </w:pPr>
-      <w:bookmarkStart w:id="10" w:name="_Toc243165322"/>
+      <w:bookmarkStart w:id="10" w:name="_Toc243168943"/>
       <w:r>
         <w:t>2.4 GAMIFICAÇÃO E MOTIVAÇÃO</w:t>
       </w:r>
@@ -6584,7 +6584,7 @@
       <w:pPr>
         <w:pStyle w:val="Ttulo2"/>
       </w:pPr>
-      <w:bookmarkStart w:id="11" w:name="_Toc243165323"/>
+      <w:bookmarkStart w:id="11" w:name="_Toc243168944"/>
       <w:r>
         <w:t>2.5 METACOGNIÇÃO E CALIBRAÇÃO</w:t>
       </w:r>
@@ -6632,7 +6632,7 @@
       <w:pPr>
         <w:pStyle w:val="Ttulo1"/>
       </w:pPr>
-      <w:bookmarkStart w:id="12" w:name="_Toc243165324"/>
+      <w:bookmarkStart w:id="12" w:name="_Toc243168945"/>
       <w:r>
         <w:t>3 MATERIAIS E MÉTODOS</w:t>
       </w:r>
@@ -6642,7 +6642,7 @@
       <w:pPr>
         <w:pStyle w:val="Ttulo2"/>
       </w:pPr>
-      <w:bookmarkStart w:id="13" w:name="_Toc243165325"/>
+      <w:bookmarkStart w:id="13" w:name="_Toc243168946"/>
       <w:r>
         <w:t>3.1 NATUREZA DA PESQUISA E ETAPAS</w:t>
       </w:r>
@@ -6779,7 +6779,7 @@
       <w:pPr>
         <w:pStyle w:val="Ttulo2"/>
       </w:pPr>
-      <w:bookmarkStart w:id="14" w:name="_Toc243165326"/>
+      <w:bookmarkStart w:id="14" w:name="_Toc243168947"/>
       <w:r>
         <w:t>3.2 CURADORIA DO CONTEÚDO</w:t>
       </w:r>
@@ -6840,7 +6840,7 @@
       <w:pPr>
         <w:pStyle w:val="Ttulo2"/>
       </w:pPr>
-      <w:bookmarkStart w:id="15" w:name="_Toc243165327"/>
+      <w:bookmarkStart w:id="15" w:name="_Toc243168948"/>
       <w:r>
         <w:t>3.3 TECNOLOGIAS UTILIZADAS</w:t>
       </w:r>
@@ -6860,7 +6860,7 @@
       <w:pPr>
         <w:pStyle w:val="LegendaABNT"/>
       </w:pPr>
-      <w:bookmarkStart w:id="16" w:name="_Toc243165372"/>
+      <w:bookmarkStart w:id="16" w:name="_Toc243168993"/>
       <w:r>
         <w:t xml:space="preserve">Quadro </w:t>
       </w:r>
@@ -8410,7 +8410,7 @@
       <w:pPr>
         <w:pStyle w:val="Ttulo2"/>
       </w:pPr>
-      <w:bookmarkStart w:id="17" w:name="_Toc243165328"/>
+      <w:bookmarkStart w:id="17" w:name="_Toc243168949"/>
       <w:r>
         <w:t>3.4 ARQUITETURA DO SOFTWARE</w:t>
       </w:r>
@@ -8430,7 +8430,7 @@
       <w:pPr>
         <w:pStyle w:val="LegendaABNT"/>
       </w:pPr>
-      <w:bookmarkStart w:id="18" w:name="_Toc243165359"/>
+      <w:bookmarkStart w:id="18" w:name="_Toc243168980"/>
       <w:r>
         <w:t xml:space="preserve">Figura </w:t>
       </w:r>
@@ -8468,7 +8468,7 @@
           <w:noProof/>
         </w:rPr>
         <w:drawing>
-          <wp:inline distT="0" distB="0" distL="0" distR="0" wp14:anchorId="39DFEC5A" wp14:editId="5E7AFAEE">
+          <wp:inline distT="0" distB="0" distL="0" distR="0" wp14:anchorId="47D8BCCE" wp14:editId="60CFFBC2">
             <wp:extent cx="5762625" cy="3714750"/>
             <wp:effectExtent l="0" t="0" r="0" b="0"/>
             <wp:docPr id="1" name="arquitetura.png" descr="Arquitetura do BioquímicaEDU" title="Arquitetura do BioquímicaEDU"/>
@@ -8531,7 +8531,7 @@
       <w:pPr>
         <w:pStyle w:val="Ttulo2"/>
       </w:pPr>
-      <w:bookmarkStart w:id="19" w:name="_Toc243165329"/>
+      <w:bookmarkStart w:id="19" w:name="_Toc243168950"/>
       <w:r>
         <w:t>3.5 VERIFICAÇÃO DO SOFTWARE</w:t>
       </w:r>
@@ -8572,7 +8572,7 @@
       <w:pPr>
         <w:pStyle w:val="Ttulo2"/>
       </w:pPr>
-      <w:bookmarkStart w:id="20" w:name="_Toc243165330"/>
+      <w:bookmarkStart w:id="20" w:name="_Toc243168951"/>
       <w:r>
         <w:t>3.6 AVALIAÇÃO COM USUÁRIOS</w:t>
       </w:r>
@@ -8591,7 +8591,7 @@
       <w:pPr>
         <w:pStyle w:val="Ttulo3"/>
       </w:pPr>
-      <w:bookmarkStart w:id="21" w:name="_Toc243165331"/>
+      <w:bookmarkStart w:id="21" w:name="_Toc243168952"/>
       <w:r>
         <w:t>3.6.1 Avaliação formativa</w:t>
       </w:r>
@@ -8613,7 +8613,7 @@
       <w:pPr>
         <w:pStyle w:val="Ttulo3"/>
       </w:pPr>
-      <w:bookmarkStart w:id="22" w:name="_Toc243165332"/>
+      <w:bookmarkStart w:id="22" w:name="_Toc243168953"/>
       <w:r>
         <w:t>3.6.2 Pré-teste e pós-teste</w:t>
       </w:r>
@@ -8659,7 +8659,7 @@
       <w:pPr>
         <w:pStyle w:val="Ttulo3"/>
       </w:pPr>
-      <w:bookmarkStart w:id="23" w:name="_Toc243165333"/>
+      <w:bookmarkStart w:id="23" w:name="_Toc243168954"/>
       <w:r>
         <w:t>3.6.3 Questionário de opinião</w:t>
       </w:r>
@@ -8681,11 +8681,20 @@
       <w:pPr>
         <w:pStyle w:val="Ttulo3"/>
       </w:pPr>
-      <w:bookmarkStart w:id="24" w:name="_Toc243165334"/>
+      <w:bookmarkStart w:id="24" w:name="_Toc243168955"/>
       <w:r>
         <w:t>3.6.4 Aspectos éticos e proteção de dados</w:t>
       </w:r>
       <w:bookmarkEnd w:id="24"/>
+    </w:p>
+    <w:p>
+      <w:pPr>
+        <w:ind w:firstLine="709"/>
+        <w:jc w:val="both"/>
+      </w:pPr>
+      <w:r>
+        <w:t>As conversas da avaliação formativa não envolveram coleta de dados pessoais nem registro de respostas individuais: os participantes opinaram sobre o software, como consultores, e este relatório apresenta apenas o perfil do grupo e as sugestões recebidas.</w:t>
+      </w:r>
     </w:p>
     <w:p>
       <w:pPr>
@@ -8702,14 +8711,14 @@
         <w:rPr>
           <w:highlight w:val="yellow"/>
         </w:rPr>
-        <w:t>[CONFIRMAR com o orientador: submissão ao Comitê de Ética em Pesquisa (CAAE e número do parecer) ou enquadramento na dispensa da Resolução CNS nº 510/2016.]</w:t>
+        <w:t>[CONFIRMAR com o orientador: submissão ao Comitê de Ética em Pesquisa (CAAE e número do parecer) ou enquadramento na dispensa da Resolução CNS nº 510/2016, art. 1º, parágrafo único — sobretudo para o pré-teste e o pós-teste, que medem o conhecimento dos participantes.]</w:t>
       </w:r>
     </w:p>
     <w:p>
       <w:pPr>
         <w:pStyle w:val="Ttulo2"/>
       </w:pPr>
-      <w:bookmarkStart w:id="25" w:name="_Toc243165335"/>
+      <w:bookmarkStart w:id="25" w:name="_Toc243168956"/>
       <w:r>
         <w:t>3.7 USO DE FERRAMENTAS DE INTELIGÊNCIA ARTIFICIAL</w:t>
       </w:r>
@@ -8734,7 +8743,7 @@
       <w:pPr>
         <w:pStyle w:val="Ttulo1"/>
       </w:pPr>
-      <w:bookmarkStart w:id="26" w:name="_Toc243165336"/>
+      <w:bookmarkStart w:id="26" w:name="_Toc243168957"/>
       <w:r>
         <w:t>4 RESULTADOS</w:t>
       </w:r>
@@ -8744,7 +8753,7 @@
       <w:pPr>
         <w:pStyle w:val="Ttulo2"/>
       </w:pPr>
-      <w:bookmarkStart w:id="27" w:name="_Toc243165337"/>
+      <w:bookmarkStart w:id="27" w:name="_Toc243168958"/>
       <w:r>
         <w:t>4.1 VISÃO GERAL DO SOFTWARE</w:t>
       </w:r>
@@ -8764,7 +8773,7 @@
       <w:pPr>
         <w:pStyle w:val="LegendaABNT"/>
       </w:pPr>
-      <w:bookmarkStart w:id="28" w:name="_Toc243165373"/>
+      <w:bookmarkStart w:id="28" w:name="_Toc243168994"/>
       <w:r>
         <w:t xml:space="preserve">Quadro </w:t>
       </w:r>
@@ -9251,7 +9260,7 @@
       <w:pPr>
         <w:pStyle w:val="LegendaABNT"/>
       </w:pPr>
-      <w:bookmarkStart w:id="29" w:name="_Toc243165378"/>
+      <w:bookmarkStart w:id="29" w:name="_Toc243168999"/>
       <w:r>
         <w:t xml:space="preserve">Tabela </w:t>
       </w:r>
@@ -10631,7 +10640,7 @@
       <w:pPr>
         <w:pStyle w:val="LegendaABNT"/>
       </w:pPr>
-      <w:bookmarkStart w:id="30" w:name="_Toc243165379"/>
+      <w:bookmarkStart w:id="30" w:name="_Toc243169000"/>
       <w:r>
         <w:t xml:space="preserve">Tabela </w:t>
       </w:r>
@@ -11318,7 +11327,7 @@
       <w:pPr>
         <w:pStyle w:val="Ttulo2"/>
       </w:pPr>
-      <w:bookmarkStart w:id="31" w:name="_Toc243165338"/>
+      <w:bookmarkStart w:id="31" w:name="_Toc243168959"/>
       <w:r>
         <w:t>4.2 MOTOR DE APRENDIZAGEM</w:t>
       </w:r>
@@ -11350,7 +11359,7 @@
       <w:pPr>
         <w:pStyle w:val="LegendaABNT"/>
       </w:pPr>
-      <w:bookmarkStart w:id="32" w:name="_Toc243165374"/>
+      <w:bookmarkStart w:id="32" w:name="_Toc243168995"/>
       <w:r>
         <w:t xml:space="preserve">Quadro </w:t>
       </w:r>
@@ -11948,7 +11957,7 @@
       <w:pPr>
         <w:pStyle w:val="LegendaABNT"/>
       </w:pPr>
-      <w:bookmarkStart w:id="33" w:name="_Toc243165360"/>
+      <w:bookmarkStart w:id="33" w:name="_Toc243168981"/>
       <w:r>
         <w:t xml:space="preserve">Figura </w:t>
       </w:r>
@@ -11986,7 +11995,7 @@
           <w:noProof/>
         </w:rPr>
         <w:drawing>
-          <wp:inline distT="0" distB="0" distL="0" distR="0" wp14:anchorId="2EF96C2E" wp14:editId="31B7F3E2">
+          <wp:inline distT="0" distB="0" distL="0" distR="0" wp14:anchorId="25FA21E9" wp14:editId="07F3B8B8">
             <wp:extent cx="5400675" cy="2971800"/>
             <wp:effectExtent l="0" t="0" r="0" b="0"/>
             <wp:docPr id="2" name="sm2_intervalos.png" descr="Intervalos calculados pelo motor em três sequências de respostas" title="Intervalos calculados pelo motor em três sequências de respostas"/>
@@ -12047,7 +12056,7 @@
       <w:pPr>
         <w:pStyle w:val="LegendaABNT"/>
       </w:pPr>
-      <w:bookmarkStart w:id="34" w:name="_Toc243165380"/>
+      <w:bookmarkStart w:id="34" w:name="_Toc243169001"/>
       <w:r>
         <w:t xml:space="preserve">Tabela </w:t>
       </w:r>
@@ -12874,7 +12883,7 @@
       <w:pPr>
         <w:pStyle w:val="Ttulo2"/>
       </w:pPr>
-      <w:bookmarkStart w:id="35" w:name="_Toc243165339"/>
+      <w:bookmarkStart w:id="35" w:name="_Toc243168960"/>
       <w:r>
         <w:t>4.3 VERSÃO PARA DISPOSITIVOS MÓVEIS</w:t>
       </w:r>
@@ -12894,7 +12903,7 @@
       <w:pPr>
         <w:pStyle w:val="LegendaABNT"/>
       </w:pPr>
-      <w:bookmarkStart w:id="36" w:name="_Toc243165361"/>
+      <w:bookmarkStart w:id="36" w:name="_Toc243168982"/>
       <w:r>
         <w:t xml:space="preserve">Figura </w:t>
       </w:r>
@@ -12932,7 +12941,7 @@
           <w:noProof/>
         </w:rPr>
         <w:drawing>
-          <wp:inline distT="0" distB="0" distL="0" distR="0" wp14:anchorId="7913F067" wp14:editId="0CFA8E51">
+          <wp:inline distT="0" distB="0" distL="0" distR="0" wp14:anchorId="2C0232DA" wp14:editId="6B659E06">
             <wp:extent cx="5762625" cy="4086225"/>
             <wp:effectExtent l="0" t="0" r="0" b="0"/>
             <wp:docPr id="3" name="telas_inicio_estudo.png" descr="Início e estudo na versão móvel" title="Início e estudo na versão móvel"/>
@@ -13002,7 +13011,7 @@
       <w:pPr>
         <w:pStyle w:val="LegendaABNT"/>
       </w:pPr>
-      <w:bookmarkStart w:id="37" w:name="_Toc243165362"/>
+      <w:bookmarkStart w:id="37" w:name="_Toc243168983"/>
       <w:r>
         <w:t xml:space="preserve">Figura </w:t>
       </w:r>
@@ -13050,7 +13059,7 @@
           <w:noProof/>
         </w:rPr>
         <w:drawing>
-          <wp:inline distT="0" distB="0" distL="0" distR="0" wp14:anchorId="03326650" wp14:editId="3F8BB6F9">
+          <wp:inline distT="0" distB="0" distL="0" distR="0" wp14:anchorId="346C3B4D" wp14:editId="372BBAD6">
             <wp:extent cx="5762625" cy="4086225"/>
             <wp:effectExtent l="0" t="0" r="0" b="0"/>
             <wp:docPr id="4" name="telas_revisao.png" descr="Revisão espaçada e flashcards na versão móvel" title="Revisão espaçada e flashcards na versão móvel"/>
@@ -13140,7 +13149,7 @@
       <w:pPr>
         <w:pStyle w:val="LegendaABNT"/>
       </w:pPr>
-      <w:bookmarkStart w:id="38" w:name="_Toc243165363"/>
+      <w:bookmarkStart w:id="38" w:name="_Toc243168984"/>
       <w:r>
         <w:t xml:space="preserve">Figura </w:t>
       </w:r>
@@ -13178,7 +13187,7 @@
           <w:noProof/>
         </w:rPr>
         <w:drawing>
-          <wp:inline distT="0" distB="0" distL="0" distR="0" wp14:anchorId="6DF732DE" wp14:editId="3F675946">
+          <wp:inline distT="0" distB="0" distL="0" distR="0" wp14:anchorId="23AB709F" wp14:editId="030C452E">
             <wp:extent cx="5762625" cy="4086225"/>
             <wp:effectExtent l="0" t="0" r="0" b="0"/>
             <wp:docPr id="5" name="telas_pratica_tutor.png" descr="Prática e tutor na versão móvel" title="Prática e tutor na versão móvel"/>
@@ -13280,7 +13289,7 @@
       <w:pPr>
         <w:pStyle w:val="Ttulo2"/>
       </w:pPr>
-      <w:bookmarkStart w:id="39" w:name="_Toc243165340"/>
+      <w:bookmarkStart w:id="39" w:name="_Toc243168961"/>
       <w:r>
         <w:t>4.4 VERSÕES PARA COMPUTADOR</w:t>
       </w:r>
@@ -13300,7 +13309,7 @@
       <w:pPr>
         <w:pStyle w:val="LegendaABNT"/>
       </w:pPr>
-      <w:bookmarkStart w:id="40" w:name="_Toc243165364"/>
+      <w:bookmarkStart w:id="40" w:name="_Toc243168985"/>
       <w:r>
         <w:t xml:space="preserve">Figura </w:t>
       </w:r>
@@ -13338,7 +13347,7 @@
           <w:noProof/>
         </w:rPr>
         <w:drawing>
-          <wp:inline distT="0" distB="0" distL="0" distR="0" wp14:anchorId="7AD8982F" wp14:editId="62534765">
+          <wp:inline distT="0" distB="0" distL="0" distR="0" wp14:anchorId="08C698C8" wp14:editId="45DFE46F">
             <wp:extent cx="5762625" cy="3981450"/>
             <wp:effectExtent l="0" t="0" r="0" b="0"/>
             <wp:docPr id="6" name="desktop_painel.png" descr="Painel inicial da versão para computador" title="Painel inicial da versão para computador"/>
@@ -13398,7 +13407,7 @@
       <w:pPr>
         <w:pStyle w:val="Ttulo2"/>
       </w:pPr>
-      <w:bookmarkStart w:id="41" w:name="_Toc243165341"/>
+      <w:bookmarkStart w:id="41" w:name="_Toc243168962"/>
       <w:r>
         <w:t>4.5 IDENTIDADE VISUAL</w:t>
       </w:r>
@@ -13418,7 +13427,7 @@
       <w:pPr>
         <w:pStyle w:val="LegendaABNT"/>
       </w:pPr>
-      <w:bookmarkStart w:id="42" w:name="_Toc243165365"/>
+      <w:bookmarkStart w:id="42" w:name="_Toc243168986"/>
       <w:r>
         <w:t xml:space="preserve">Figura </w:t>
       </w:r>
@@ -13456,7 +13465,7 @@
           <w:noProof/>
         </w:rPr>
         <w:drawing>
-          <wp:inline distT="0" distB="0" distL="0" distR="0" wp14:anchorId="2FE6E581" wp14:editId="47FF4A59">
+          <wp:inline distT="0" distB="0" distL="0" distR="0" wp14:anchorId="394B5480" wp14:editId="19F5896B">
             <wp:extent cx="3600450" cy="866775"/>
             <wp:effectExtent l="0" t="0" r="0" b="0"/>
             <wp:docPr id="7" name="horizontal.png" descr="Logo do BioquímicaEDU" title="Logo do BioquímicaEDU"/>
@@ -13507,7 +13516,7 @@
       <w:pPr>
         <w:pStyle w:val="Ttulo2"/>
       </w:pPr>
-      <w:bookmarkStart w:id="43" w:name="_Toc243165342"/>
+      <w:bookmarkStart w:id="43" w:name="_Toc243168963"/>
       <w:r>
         <w:t>4.6 AVALIAÇÃO FORMATIVA</w:t>
       </w:r>
@@ -13538,7 +13547,7 @@
       <w:pPr>
         <w:pStyle w:val="Ttulo2"/>
       </w:pPr>
-      <w:bookmarkStart w:id="44" w:name="_Toc243165343"/>
+      <w:bookmarkStart w:id="44" w:name="_Toc243168964"/>
       <w:r>
         <w:t>4.7 EVOLUÇÃO DO SOFTWARE</w:t>
       </w:r>
@@ -13560,7 +13569,7 @@
       <w:pPr>
         <w:pStyle w:val="Ttulo3"/>
       </w:pPr>
-      <w:bookmarkStart w:id="45" w:name="_Toc243165344"/>
+      <w:bookmarkStart w:id="45" w:name="_Toc243168965"/>
       <w:r>
         <w:t>4.7.1 Itens da proposta: novos marcadores, jogos e régua das faixas</w:t>
       </w:r>
@@ -13608,7 +13617,7 @@
       <w:pPr>
         <w:pStyle w:val="LegendaABNT"/>
       </w:pPr>
-      <w:bookmarkStart w:id="46" w:name="_Toc243165366"/>
+      <w:bookmarkStart w:id="46" w:name="_Toc243168987"/>
       <w:r>
         <w:t xml:space="preserve">Figura </w:t>
       </w:r>
@@ -13646,7 +13655,7 @@
           <w:noProof/>
         </w:rPr>
         <w:drawing>
-          <wp:inline distT="0" distB="0" distL="0" distR="0" wp14:anchorId="27D412EC" wp14:editId="0DE6B25E">
+          <wp:inline distT="0" distB="0" distL="0" distR="0" wp14:anchorId="7BA59C51" wp14:editId="1B6AD673">
             <wp:extent cx="5762625" cy="4086225"/>
             <wp:effectExtent l="0" t="0" r="0" b="0"/>
             <wp:docPr id="8" name="evolucao_jogos.png" descr="Jogos didáticos e calculadora da TFG estimada na versão para celular" title="Jogos didáticos e calculadora da TFG estimada na versão para celular"/>
@@ -13719,7 +13728,7 @@
       <w:pPr>
         <w:pStyle w:val="Ttulo3"/>
       </w:pPr>
-      <w:bookmarkStart w:id="47" w:name="_Toc243165345"/>
+      <w:bookmarkStart w:id="47" w:name="_Toc243168966"/>
       <w:r>
         <w:t>4.7.2 Intervalos da revisão</w:t>
       </w:r>
@@ -13742,7 +13751,7 @@
       <w:pPr>
         <w:pStyle w:val="LegendaABNT"/>
       </w:pPr>
-      <w:bookmarkStart w:id="48" w:name="_Toc243165381"/>
+      <w:bookmarkStart w:id="48" w:name="_Toc243169002"/>
       <w:r>
         <w:t xml:space="preserve">Tabela </w:t>
       </w:r>
@@ -14321,7 +14330,7 @@
       <w:pPr>
         <w:pStyle w:val="Ttulo3"/>
       </w:pPr>
-      <w:bookmarkStart w:id="49" w:name="_Toc243165346"/>
+      <w:bookmarkStart w:id="49" w:name="_Toc243168967"/>
       <w:r>
         <w:t>4.7.3 Um aplicativo para celular, tablet e computador</w:t>
       </w:r>
@@ -14344,7 +14353,7 @@
       <w:pPr>
         <w:pStyle w:val="LegendaABNT"/>
       </w:pPr>
-      <w:bookmarkStart w:id="50" w:name="_Toc243165375"/>
+      <w:bookmarkStart w:id="50" w:name="_Toc243168996"/>
       <w:r>
         <w:t xml:space="preserve">Quadro </w:t>
       </w:r>
@@ -15094,7 +15103,7 @@
       <w:pPr>
         <w:pStyle w:val="LegendaABNT"/>
       </w:pPr>
-      <w:bookmarkStart w:id="51" w:name="_Toc243165367"/>
+      <w:bookmarkStart w:id="51" w:name="_Toc243168988"/>
       <w:r>
         <w:t xml:space="preserve">Figura </w:t>
       </w:r>
@@ -15132,7 +15141,7 @@
           <w:noProof/>
         </w:rPr>
         <w:drawing>
-          <wp:inline distT="0" distB="0" distL="0" distR="0" wp14:anchorId="66557053" wp14:editId="76C3187C">
+          <wp:inline distT="0" distB="0" distL="0" distR="0" wp14:anchorId="6CB1B98A" wp14:editId="7927D313">
             <wp:extent cx="5762625" cy="7219950"/>
             <wp:effectExtent l="0" t="0" r="0" b="0"/>
             <wp:docPr id="9" name="evolucao_formatos.png" descr="O mesmo aplicativo no computador, no tablet e no celular" title="O mesmo aplicativo no computador, no tablet e no celular"/>
@@ -15193,7 +15202,7 @@
       <w:pPr>
         <w:pStyle w:val="Ttulo3"/>
       </w:pPr>
-      <w:bookmarkStart w:id="52" w:name="_Toc243165347"/>
+      <w:bookmarkStart w:id="52" w:name="_Toc243168968"/>
       <w:r>
         <w:t>4.7.4 Acessibilidade</w:t>
       </w:r>
@@ -15294,7 +15303,7 @@
       <w:pPr>
         <w:pStyle w:val="LegendaABNT"/>
       </w:pPr>
-      <w:bookmarkStart w:id="53" w:name="_Toc243165368"/>
+      <w:bookmarkStart w:id="53" w:name="_Toc243168989"/>
       <w:r>
         <w:t xml:space="preserve">Figura </w:t>
       </w:r>
@@ -15332,7 +15341,7 @@
           <w:noProof/>
         </w:rPr>
         <w:drawing>
-          <wp:inline distT="0" distB="0" distL="0" distR="0" wp14:anchorId="358F4250" wp14:editId="53EFB4E1">
+          <wp:inline distT="0" distB="0" distL="0" distR="0" wp14:anchorId="07D96822" wp14:editId="3A7C86F1">
             <wp:extent cx="5762625" cy="4086225"/>
             <wp:effectExtent l="0" t="0" r="0" b="0"/>
             <wp:docPr id="10" name="evolucao_acessibilidade.png" descr="Recursos de acessibilidade na versão para celular" title="Recursos de acessibilidade na versão para celular"/>
@@ -15405,7 +15414,7 @@
       <w:pPr>
         <w:pStyle w:val="Ttulo3"/>
       </w:pPr>
-      <w:bookmarkStart w:id="54" w:name="_Toc243165348"/>
+      <w:bookmarkStart w:id="54" w:name="_Toc243168969"/>
       <w:r>
         <w:t>4.7.5 Tutor com inteligência artificial generativa</w:t>
       </w:r>
@@ -15428,7 +15437,7 @@
       <w:pPr>
         <w:pStyle w:val="LegendaABNT"/>
       </w:pPr>
-      <w:bookmarkStart w:id="55" w:name="_Toc243165369"/>
+      <w:bookmarkStart w:id="55" w:name="_Toc243168990"/>
       <w:r>
         <w:t xml:space="preserve">Figura </w:t>
       </w:r>
@@ -15466,7 +15475,7 @@
           <w:noProof/>
         </w:rPr>
         <w:drawing>
-          <wp:inline distT="0" distB="0" distL="0" distR="0" wp14:anchorId="2DFAEFF6" wp14:editId="0ED46A24">
+          <wp:inline distT="0" distB="0" distL="0" distR="0" wp14:anchorId="565193EE" wp14:editId="12A4FD23">
             <wp:extent cx="5762625" cy="2933700"/>
             <wp:effectExtent l="0" t="0" r="0" b="0"/>
             <wp:docPr id="11" name="tutor_arquitetura.png" descr="Provedores de resposta do tutor e local da chave de acesso" title="Provedores de resposta do tutor e local da chave de acesso"/>
@@ -15572,7 +15581,7 @@
       <w:pPr>
         <w:pStyle w:val="LegendaABNT"/>
       </w:pPr>
-      <w:bookmarkStart w:id="56" w:name="_Toc243165370"/>
+      <w:bookmarkStart w:id="56" w:name="_Toc243168991"/>
       <w:r>
         <w:t xml:space="preserve">Figura </w:t>
       </w:r>
@@ -15610,7 +15619,7 @@
           <w:noProof/>
         </w:rPr>
         <w:drawing>
-          <wp:inline distT="0" distB="0" distL="0" distR="0" wp14:anchorId="05F89C48" wp14:editId="2D902849">
+          <wp:inline distT="0" distB="0" distL="0" distR="0" wp14:anchorId="5E8FDBDD" wp14:editId="4FF2974F">
             <wp:extent cx="5762625" cy="4086225"/>
             <wp:effectExtent l="0" t="0" r="0" b="0"/>
             <wp:docPr id="12" name="evolucao_tutor.png" descr="Conversa com o tutor usando o Gemini na versão para celular" title="Conversa com o tutor usando o Gemini na versão para celular"/>
@@ -15671,7 +15680,7 @@
       <w:pPr>
         <w:pStyle w:val="Ttulo3"/>
       </w:pPr>
-      <w:bookmarkStart w:id="57" w:name="_Toc243165349"/>
+      <w:bookmarkStart w:id="57" w:name="_Toc243168970"/>
       <w:r>
         <w:t>4.7.6 Abertura, conta Google opcional e apresentação</w:t>
       </w:r>
@@ -15696,7 +15705,7 @@
       <w:pPr>
         <w:pStyle w:val="Ttulo3"/>
       </w:pPr>
-      <w:bookmarkStart w:id="58" w:name="_Toc243165350"/>
+      <w:bookmarkStart w:id="58" w:name="_Toc243168971"/>
       <w:r>
         <w:t>4.7.7 Site e instaladores</w:t>
       </w:r>
@@ -15730,20 +15739,38 @@
         <w:t>O pacote para Android (APK) é gerado no GitHub Actions, num computador Linux do próprio GitHub, porque o Buildozer não roda no Windows. Ele é gerado para processadores de 64 bits (arm64-v8a), os dos celulares e tablets atuais e os exigidos pela Google Play, e é assinado sempre com a mesma chave, guardada fora do repositório: o Android só atualiza um aplicativo assinado pela mesma chave, e o login com Google confere a impressão digital (SHA-1) dela. Nenhum dos dois pacotes contém a chave do Gemini nem o prog</w:t>
       </w:r>
       <w:r>
-        <w:t xml:space="preserve">resso e as preferências de quem os gerou: o empacotamento os exclui, e os arquivos internos de cada pacote foram conferidos. Ambos usam o servidor intermediário da seção 4.7.5. </w:t>
+        <w:t xml:space="preserve">resso e as preferências de quem os gerou: o empacotamento os exclui, e os arquivos internos de cada pacote foram conferidos. Ambos usam o servidor intermediário da seção 4.7.5. O APK foi testado num celular Samsung Galaxy S20 FE 5G, com Android </w:t>
       </w:r>
       <w:r>
         <w:rPr>
           <w:highlight w:val="yellow"/>
         </w:rPr>
-        <w:t>[CONFIRMAR: aparelho Android em que o APK foi testado — modelo e versão do Android — e se ele já está publicado no site.]</w:t>
+        <w:t>[CONFIRMAR: versão]</w:t>
+      </w:r>
+      <w:r>
+        <w:t xml:space="preserve">, e num tablet </w:t>
+      </w:r>
+      <w:r>
+        <w:rPr>
+          <w:highlight w:val="yellow"/>
+        </w:rPr>
+        <w:t>[CONFIRMAR: modelo]</w:t>
+      </w:r>
+      <w:r>
+        <w:t xml:space="preserve"> com Android 10, em pé e deitado: a disposição das telas, o quiz, os jogos, o tutor com Gemini, os vídeos e as referências, o atalho para Libras e o alto contraste funcionaram. </w:t>
+      </w:r>
+      <w:r>
+        <w:rPr>
+          <w:highlight w:val="yellow"/>
+        </w:rPr>
+        <w:t>[CONFIRMAR: resultado do login com Google no Android e se o APK já está publicado no site.]</w:t>
       </w:r>
     </w:p>
     <w:p>
       <w:pPr>
         <w:pStyle w:val="Ttulo2"/>
       </w:pPr>
-      <w:bookmarkStart w:id="59" w:name="_Toc243165351"/>
+      <w:bookmarkStart w:id="59" w:name="_Toc243168972"/>
       <w:r>
         <w:t>4.8 AVALIAÇÃO DA APRENDIZAGEM</w:t>
       </w:r>
@@ -15766,7 +15793,7 @@
       <w:pPr>
         <w:pStyle w:val="LegendaABNT"/>
       </w:pPr>
-      <w:bookmarkStart w:id="60" w:name="_Toc243165382"/>
+      <w:bookmarkStart w:id="60" w:name="_Toc243169003"/>
       <w:r>
         <w:t xml:space="preserve">Tabela </w:t>
       </w:r>
@@ -16380,7 +16407,7 @@
       <w:pPr>
         <w:pStyle w:val="Ttulo1"/>
       </w:pPr>
-      <w:bookmarkStart w:id="61" w:name="_Toc243165352"/>
+      <w:bookmarkStart w:id="61" w:name="_Toc243168973"/>
       <w:r>
         <w:t>5 DISCUSSÃO</w:t>
       </w:r>
@@ -16400,7 +16427,7 @@
       <w:pPr>
         <w:pStyle w:val="LegendaABNT"/>
       </w:pPr>
-      <w:bookmarkStart w:id="62" w:name="_Toc243165376"/>
+      <w:bookmarkStart w:id="62" w:name="_Toc243168997"/>
       <w:r>
         <w:t xml:space="preserve">Quadro </w:t>
       </w:r>
@@ -17527,7 +17554,7 @@
       <w:pPr>
         <w:pStyle w:val="Ttulo1"/>
       </w:pPr>
-      <w:bookmarkStart w:id="63" w:name="_Toc243165353"/>
+      <w:bookmarkStart w:id="63" w:name="_Toc243168974"/>
       <w:r>
         <w:t>6 CONSIDERAÇÕES FINAIS</w:t>
       </w:r>
@@ -17597,7 +17624,7 @@
         <w:pStyle w:val="Ttulo1"/>
         <w:jc w:val="center"/>
       </w:pPr>
-      <w:bookmarkStart w:id="64" w:name="_Toc243165354"/>
+      <w:bookmarkStart w:id="64" w:name="_Toc243168975"/>
       <w:r>
         <w:t>REFERÊNCIAS</w:t>
       </w:r>
@@ -18474,7 +18501,7 @@
         <w:pStyle w:val="Ttulo1"/>
         <w:jc w:val="center"/>
       </w:pPr>
-      <w:bookmarkStart w:id="65" w:name="_Toc243165355"/>
+      <w:bookmarkStart w:id="65" w:name="_Toc243168976"/>
       <w:r>
         <w:t>APÊNDICE A – FONTES DO CONTEÚDO POR MARCADOR</w:t>
       </w:r>
@@ -18494,7 +18521,7 @@
       <w:pPr>
         <w:pStyle w:val="LegendaABNT"/>
       </w:pPr>
-      <w:bookmarkStart w:id="66" w:name="_Toc243165377"/>
+      <w:bookmarkStart w:id="66" w:name="_Toc243168998"/>
       <w:r>
         <w:t xml:space="preserve">Quadro </w:t>
       </w:r>
@@ -20869,7 +20896,7 @@
         <w:pStyle w:val="Ttulo1"/>
         <w:jc w:val="center"/>
       </w:pPr>
-      <w:bookmarkStart w:id="67" w:name="_Toc243165356"/>
+      <w:bookmarkStart w:id="67" w:name="_Toc243168977"/>
       <w:r>
         <w:t>APÊNDICE B – CÓDIGO-FONTE E EXECUÇÃO</w:t>
       </w:r>
@@ -20964,7 +20991,7 @@
         <w:pStyle w:val="Ttulo1"/>
         <w:jc w:val="center"/>
       </w:pPr>
-      <w:bookmarkStart w:id="68" w:name="_Toc243165357"/>
+      <w:bookmarkStart w:id="68" w:name="_Toc243168978"/>
       <w:r>
         <w:t>APÊNDICE C – QUESTÕES DO PRÉ-TESTE E DO PÓS-TESTE</w:t>
       </w:r>
@@ -21805,7 +21832,7 @@
         <w:pStyle w:val="Ttulo1"/>
         <w:jc w:val="center"/>
       </w:pPr>
-      <w:bookmarkStart w:id="69" w:name="_Toc243165358"/>
+      <w:bookmarkStart w:id="69" w:name="_Toc243168979"/>
       <w:r>
         <w:t>APÊNDICE D – QUESTIONÁRIO DE OPINIÃO</w:t>
       </w:r>
@@ -22151,10 +22178,96 @@
 <file path=word/numbering.xml><?xml version="1.0" encoding="utf-8"?>
 <w:numbering xmlns:wpc="http://schemas.microsoft.com/office/word/2010/wordprocessingCanvas" xmlns:cx="http://schemas.microsoft.com/office/drawing/2014/chartex" xmlns:cx1="http://schemas.microsoft.com/office/drawing/2015/9/8/chartex" xmlns:cx2="http://schemas.microsoft.com/office/drawing/2015/10/21/chartex" xmlns:cx3="http://schemas.microsoft.com/office/drawing/2016/5/9/chartex" xmlns:cx4="http://schemas.microsoft.com/office/drawing/2016/5/10/chartex" xmlns:cx5="http://schemas.microsoft.com/office/drawing/2016/5/11/chartex" xmlns:cx6="http://schemas.microsoft.com/office/drawing/2016/5/12/chartex" xmlns:cx7="http://schemas.microsoft.com/office/drawing/2016/5/13/chartex" xmlns:cx8="http://schemas.microsoft.com/office/drawing/2016/5/14/chartex" xmlns:mc="http://schemas.openxmlformats.org/markup-compatibility/2006" xmlns:aink="http://schemas.microsoft.com/office/drawing/2016/ink" xmlns:am3d="http://schemas.microsoft.com/office/drawing/2017/model3d" xmlns:o="urn:schemas-microsoft-com:office:office" xmlns:oel="http://schemas.microsoft.com/office/2019/extlst" xmlns:r="http://schemas.openxmlformats.org/officeDocument/2006/relationships" xmlns:m="http://schemas.openxmlformats.org/officeDocument/2006/math" xmlns:v="urn:schemas-microsoft-com:vml" xmlns:wp14="http://schemas.microsoft.com/office/word/2010/wordprocessingDrawing" xmlns:wp="http://schemas.openxmlformats.org/drawingml/2006/wordprocessingDrawing" xmlns:w10="urn:schemas-microsoft-com:office:word" xmlns:w="http://schemas.openxmlformats.org/wordprocessingml/2006/main" xmlns:w14="http://schemas.microsoft.com/office/word/2010/wordml" xmlns:w15="http://schemas.microsoft.com/office/word/2012/wordml" xmlns:w16cex="http://schemas.microsoft.com/office/word/2018/wordml/cex" xmlns:w16cid="http://schemas.microsoft.com/office/word/2016/wordml/cid" xmlns:w16="http://schemas.microsoft.com/office/word/2018/wordml" xmlns:w16du="http://schemas.microsoft.com/office/word/2023/wordml/word16du" xmlns:w16sdtdh="http://schemas.microsoft.com/office/word/2020/wordml/sdtdatahash" xmlns:w16sdtfl="http://schemas.microsoft.com/office/word/2024/wordml/sdtformatlock" xmlns:w16se="http://schemas.microsoft.com/office/word/2015/wordml/symex" xmlns:wpg="http://schemas.microsoft.com/office/word/2010/wordprocessingGroup" xmlns:wpi="http://schemas.microsoft.com/office/word/2010/wordprocessingInk" xmlns:wne="http://schemas.microsoft.com/office/word/2006/wordml" xmlns:wps="http://schemas.microsoft.com/office/word/2010/wordprocessingShape" mc:Ignorable="w14 w15 w16se w16cid w16 w16cex w16sdtdh w16sdtfl w16du wp14">
   <w:abstractNum w:abstractNumId="0" w15:restartNumberingAfterBreak="0">
-    <w:nsid w:val="276D37C3"/>
+    <w:nsid w:val="4811023E"/>
     <w:multiLevelType w:val="hybridMultilevel"/>
-    <w:tmpl w:val="CB6CA87E"/>
-    <w:lvl w:ilvl="0" w:tplc="9C8E62F0">
+    <w:tmpl w:val="91029178"/>
+    <w:lvl w:ilvl="0" w:tplc="388EF0AE" w:tentative="1">
+      <w:start w:val="1"/>
+      <w:numFmt w:val="bullet"/>
+      <w:lvlText w:val="●"/>
+      <w:lvlJc w:val="left"/>
+      <w:pPr>
+        <w:ind w:left="720" w:hanging="360"/>
+      </w:pPr>
+    </w:lvl>
+    <w:lvl w:ilvl="1" w:tplc="EB084D8E" w:tentative="1">
+      <w:start w:val="1"/>
+      <w:numFmt w:val="bullet"/>
+      <w:lvlText w:val="○"/>
+      <w:lvlJc w:val="left"/>
+      <w:pPr>
+        <w:ind w:left="1440" w:hanging="360"/>
+      </w:pPr>
+    </w:lvl>
+    <w:lvl w:ilvl="2" w:tplc="A846FB7C" w:tentative="1">
+      <w:start w:val="1"/>
+      <w:numFmt w:val="bullet"/>
+      <w:lvlText w:val="■"/>
+      <w:lvlJc w:val="left"/>
+      <w:pPr>
+        <w:ind w:left="2160" w:hanging="360"/>
+      </w:pPr>
+    </w:lvl>
+    <w:lvl w:ilvl="3" w:tplc="5C7C8602" w:tentative="1">
+      <w:start w:val="1"/>
+      <w:numFmt w:val="bullet"/>
+      <w:lvlText w:val="●"/>
+      <w:lvlJc w:val="left"/>
+      <w:pPr>
+        <w:ind w:left="2880" w:hanging="360"/>
+      </w:pPr>
+    </w:lvl>
+    <w:lvl w:ilvl="4" w:tplc="A2D429A0" w:tentative="1">
+      <w:start w:val="1"/>
+      <w:numFmt w:val="bullet"/>
+      <w:lvlText w:val="○"/>
+      <w:lvlJc w:val="left"/>
+      <w:pPr>
+        <w:ind w:left="3600" w:hanging="360"/>
+      </w:pPr>
+    </w:lvl>
+    <w:lvl w:ilvl="5" w:tplc="5770E8F4" w:tentative="1">
+      <w:start w:val="1"/>
+      <w:numFmt w:val="bullet"/>
+      <w:lvlText w:val="■"/>
+      <w:lvlJc w:val="left"/>
+      <w:pPr>
+        <w:ind w:left="4320" w:hanging="360"/>
+      </w:pPr>
+    </w:lvl>
+    <w:lvl w:ilvl="6" w:tplc="8D102272" w:tentative="1">
+      <w:start w:val="1"/>
+      <w:numFmt w:val="bullet"/>
+      <w:lvlText w:val="●"/>
+      <w:lvlJc w:val="left"/>
+      <w:pPr>
+        <w:ind w:left="5040" w:hanging="360"/>
+      </w:pPr>
+    </w:lvl>
+    <w:lvl w:ilvl="7" w:tplc="D57ED93A" w:tentative="1">
+      <w:start w:val="1"/>
+      <w:numFmt w:val="bullet"/>
+      <w:lvlText w:val="●"/>
+      <w:lvlJc w:val="left"/>
+      <w:pPr>
+        <w:ind w:left="5760" w:hanging="360"/>
+      </w:pPr>
+    </w:lvl>
+    <w:lvl w:ilvl="8" w:tplc="1AC456AE" w:tentative="1">
+      <w:start w:val="1"/>
+      <w:numFmt w:val="bullet"/>
+      <w:lvlText w:val="●"/>
+      <w:lvlJc w:val="left"/>
+      <w:pPr>
+        <w:ind w:left="6480" w:hanging="360"/>
+      </w:pPr>
+    </w:lvl>
+  </w:abstractNum>
+  <w:abstractNum w:abstractNumId="1" w15:restartNumberingAfterBreak="0">
+    <w:nsid w:val="7A2B0C5B"/>
+    <w:multiLevelType w:val="hybridMultilevel"/>
+    <w:tmpl w:val="607259C6"/>
+    <w:lvl w:ilvl="0" w:tplc="6DB4331A">
       <w:start w:val="1"/>
       <w:numFmt w:val="lowerLetter"/>
       <w:lvlText w:val="%1)"/>
@@ -22163,225 +22276,139 @@
         <w:ind w:left="1106" w:hanging="397"/>
       </w:pPr>
     </w:lvl>
-    <w:lvl w:ilvl="1" w:tplc="20B8731A">
+    <w:lvl w:ilvl="1" w:tplc="C504C2C6">
       <w:numFmt w:val="decimal"/>
       <w:lvlText w:val=""/>
       <w:lvlJc w:val="left"/>
     </w:lvl>
-    <w:lvl w:ilvl="2" w:tplc="15A26E18">
+    <w:lvl w:ilvl="2" w:tplc="9A52C812">
       <w:numFmt w:val="decimal"/>
       <w:lvlText w:val=""/>
       <w:lvlJc w:val="left"/>
     </w:lvl>
-    <w:lvl w:ilvl="3" w:tplc="1394810A">
+    <w:lvl w:ilvl="3" w:tplc="0896B250">
       <w:numFmt w:val="decimal"/>
       <w:lvlText w:val=""/>
       <w:lvlJc w:val="left"/>
     </w:lvl>
-    <w:lvl w:ilvl="4" w:tplc="D6A866D0">
+    <w:lvl w:ilvl="4" w:tplc="1CB24E98">
       <w:numFmt w:val="decimal"/>
       <w:lvlText w:val=""/>
       <w:lvlJc w:val="left"/>
     </w:lvl>
-    <w:lvl w:ilvl="5" w:tplc="CEF29856">
+    <w:lvl w:ilvl="5" w:tplc="AA3C748C">
       <w:numFmt w:val="decimal"/>
       <w:lvlText w:val=""/>
       <w:lvlJc w:val="left"/>
     </w:lvl>
-    <w:lvl w:ilvl="6" w:tplc="B102202A">
+    <w:lvl w:ilvl="6" w:tplc="80604AEE">
       <w:numFmt w:val="decimal"/>
       <w:lvlText w:val=""/>
       <w:lvlJc w:val="left"/>
     </w:lvl>
-    <w:lvl w:ilvl="7" w:tplc="34004CA0">
+    <w:lvl w:ilvl="7" w:tplc="DFF20814">
       <w:numFmt w:val="decimal"/>
       <w:lvlText w:val=""/>
       <w:lvlJc w:val="left"/>
     </w:lvl>
-    <w:lvl w:ilvl="8" w:tplc="2C3A34FE">
+    <w:lvl w:ilvl="8" w:tplc="6B5299D2">
       <w:numFmt w:val="decimal"/>
       <w:lvlText w:val=""/>
       <w:lvlJc w:val="left"/>
     </w:lvl>
   </w:abstractNum>
-  <w:abstractNum w:abstractNumId="1" w15:restartNumberingAfterBreak="0">
-    <w:nsid w:val="29BB2FF2"/>
-    <w:multiLevelType w:val="hybridMultilevel"/>
-    <w:tmpl w:val="FC5A9132"/>
-    <w:lvl w:ilvl="0" w:tplc="8E48D1EE" w:tentative="1">
-      <w:start w:val="1"/>
-      <w:numFmt w:val="bullet"/>
-      <w:lvlText w:val="●"/>
-      <w:lvlJc w:val="left"/>
-      <w:pPr>
-        <w:ind w:left="720" w:hanging="360"/>
-      </w:pPr>
-    </w:lvl>
-    <w:lvl w:ilvl="1" w:tplc="0DA83A58" w:tentative="1">
-      <w:start w:val="1"/>
-      <w:numFmt w:val="bullet"/>
-      <w:lvlText w:val="○"/>
-      <w:lvlJc w:val="left"/>
-      <w:pPr>
-        <w:ind w:left="1440" w:hanging="360"/>
-      </w:pPr>
-    </w:lvl>
-    <w:lvl w:ilvl="2" w:tplc="9446ABA8" w:tentative="1">
-      <w:start w:val="1"/>
-      <w:numFmt w:val="bullet"/>
-      <w:lvlText w:val="■"/>
-      <w:lvlJc w:val="left"/>
-      <w:pPr>
-        <w:ind w:left="2160" w:hanging="360"/>
-      </w:pPr>
-    </w:lvl>
-    <w:lvl w:ilvl="3" w:tplc="C31EE6EA" w:tentative="1">
-      <w:start w:val="1"/>
-      <w:numFmt w:val="bullet"/>
-      <w:lvlText w:val="●"/>
-      <w:lvlJc w:val="left"/>
-      <w:pPr>
-        <w:ind w:left="2880" w:hanging="360"/>
-      </w:pPr>
-    </w:lvl>
-    <w:lvl w:ilvl="4" w:tplc="5A7CBCD2" w:tentative="1">
-      <w:start w:val="1"/>
-      <w:numFmt w:val="bullet"/>
-      <w:lvlText w:val="○"/>
-      <w:lvlJc w:val="left"/>
-      <w:pPr>
-        <w:ind w:left="3600" w:hanging="360"/>
-      </w:pPr>
-    </w:lvl>
-    <w:lvl w:ilvl="5" w:tplc="33105A9E" w:tentative="1">
-      <w:start w:val="1"/>
-      <w:numFmt w:val="bullet"/>
-      <w:lvlText w:val="■"/>
-      <w:lvlJc w:val="left"/>
-      <w:pPr>
-        <w:ind w:left="4320" w:hanging="360"/>
-      </w:pPr>
-    </w:lvl>
-    <w:lvl w:ilvl="6" w:tplc="D7D49E36" w:tentative="1">
-      <w:start w:val="1"/>
-      <w:numFmt w:val="bullet"/>
-      <w:lvlText w:val="●"/>
-      <w:lvlJc w:val="left"/>
-      <w:pPr>
-        <w:ind w:left="5040" w:hanging="360"/>
-      </w:pPr>
-    </w:lvl>
-    <w:lvl w:ilvl="7" w:tplc="24F425BA" w:tentative="1">
-      <w:start w:val="1"/>
-      <w:numFmt w:val="bullet"/>
-      <w:lvlText w:val="●"/>
-      <w:lvlJc w:val="left"/>
-      <w:pPr>
-        <w:ind w:left="5760" w:hanging="360"/>
-      </w:pPr>
-    </w:lvl>
-    <w:lvl w:ilvl="8" w:tplc="B4B06192" w:tentative="1">
-      <w:start w:val="1"/>
-      <w:numFmt w:val="bullet"/>
-      <w:lvlText w:val="●"/>
-      <w:lvlJc w:val="left"/>
-      <w:pPr>
-        <w:ind w:left="6480" w:hanging="360"/>
-      </w:pPr>
-    </w:lvl>
-  </w:abstractNum>
-  <w:num w:numId="1" w16cid:durableId="1206022273">
+  <w:num w:numId="1" w16cid:durableId="597252154">
+    <w:abstractNumId w:val="0"/>
+    <w:lvlOverride w:ilvl="0">
+      <w:startOverride w:val="1"/>
+    </w:lvlOverride>
+  </w:num>
+  <w:num w:numId="2" w16cid:durableId="1008140732">
     <w:abstractNumId w:val="1"/>
     <w:lvlOverride w:ilvl="0">
       <w:startOverride w:val="1"/>
     </w:lvlOverride>
   </w:num>
-  <w:num w:numId="2" w16cid:durableId="2084984406">
-    <w:abstractNumId w:val="0"/>
+  <w:num w:numId="3" w16cid:durableId="49812237">
+    <w:abstractNumId w:val="1"/>
     <w:lvlOverride w:ilvl="0">
       <w:startOverride w:val="1"/>
     </w:lvlOverride>
   </w:num>
-  <w:num w:numId="3" w16cid:durableId="1583100092">
-    <w:abstractNumId w:val="0"/>
+  <w:num w:numId="4" w16cid:durableId="2110464754">
+    <w:abstractNumId w:val="1"/>
     <w:lvlOverride w:ilvl="0">
       <w:startOverride w:val="1"/>
     </w:lvlOverride>
   </w:num>
-  <w:num w:numId="4" w16cid:durableId="868567107">
-    <w:abstractNumId w:val="0"/>
+  <w:num w:numId="5" w16cid:durableId="1851750760">
+    <w:abstractNumId w:val="1"/>
     <w:lvlOverride w:ilvl="0">
       <w:startOverride w:val="1"/>
     </w:lvlOverride>
   </w:num>
-  <w:num w:numId="5" w16cid:durableId="339549438">
-    <w:abstractNumId w:val="0"/>
+  <w:num w:numId="6" w16cid:durableId="1025524586">
+    <w:abstractNumId w:val="1"/>
     <w:lvlOverride w:ilvl="0">
       <w:startOverride w:val="1"/>
     </w:lvlOverride>
   </w:num>
-  <w:num w:numId="6" w16cid:durableId="499852985">
-    <w:abstractNumId w:val="0"/>
+  <w:num w:numId="7" w16cid:durableId="168298856">
+    <w:abstractNumId w:val="1"/>
     <w:lvlOverride w:ilvl="0">
       <w:startOverride w:val="1"/>
     </w:lvlOverride>
   </w:num>
-  <w:num w:numId="7" w16cid:durableId="161237655">
-    <w:abstractNumId w:val="0"/>
+  <w:num w:numId="8" w16cid:durableId="1950231915">
+    <w:abstractNumId w:val="1"/>
     <w:lvlOverride w:ilvl="0">
       <w:startOverride w:val="1"/>
     </w:lvlOverride>
   </w:num>
-  <w:num w:numId="8" w16cid:durableId="662927472">
-    <w:abstractNumId w:val="0"/>
+  <w:num w:numId="9" w16cid:durableId="1648587903">
+    <w:abstractNumId w:val="1"/>
     <w:lvlOverride w:ilvl="0">
       <w:startOverride w:val="1"/>
     </w:lvlOverride>
   </w:num>
-  <w:num w:numId="9" w16cid:durableId="1935090200">
-    <w:abstractNumId w:val="0"/>
+  <w:num w:numId="10" w16cid:durableId="1196578415">
+    <w:abstractNumId w:val="1"/>
     <w:lvlOverride w:ilvl="0">
       <w:startOverride w:val="1"/>
     </w:lvlOverride>
   </w:num>
-  <w:num w:numId="10" w16cid:durableId="32771086">
-    <w:abstractNumId w:val="0"/>
+  <w:num w:numId="11" w16cid:durableId="744032493">
+    <w:abstractNumId w:val="1"/>
     <w:lvlOverride w:ilvl="0">
       <w:startOverride w:val="1"/>
     </w:lvlOverride>
   </w:num>
-  <w:num w:numId="11" w16cid:durableId="1707217448">
-    <w:abstractNumId w:val="0"/>
+  <w:num w:numId="12" w16cid:durableId="1317565210">
+    <w:abstractNumId w:val="1"/>
     <w:lvlOverride w:ilvl="0">
       <w:startOverride w:val="1"/>
     </w:lvlOverride>
   </w:num>
-  <w:num w:numId="12" w16cid:durableId="1084033885">
-    <w:abstractNumId w:val="0"/>
+  <w:num w:numId="13" w16cid:durableId="967860090">
+    <w:abstractNumId w:val="1"/>
     <w:lvlOverride w:ilvl="0">
       <w:startOverride w:val="1"/>
     </w:lvlOverride>
   </w:num>
-  <w:num w:numId="13" w16cid:durableId="1424495496">
-    <w:abstractNumId w:val="0"/>
+  <w:num w:numId="14" w16cid:durableId="1910528987">
+    <w:abstractNumId w:val="1"/>
     <w:lvlOverride w:ilvl="0">
       <w:startOverride w:val="1"/>
     </w:lvlOverride>
   </w:num>
-  <w:num w:numId="14" w16cid:durableId="921914525">
-    <w:abstractNumId w:val="0"/>
+  <w:num w:numId="15" w16cid:durableId="493495928">
+    <w:abstractNumId w:val="1"/>
     <w:lvlOverride w:ilvl="0">
       <w:startOverride w:val="1"/>
     </w:lvlOverride>
   </w:num>
-  <w:num w:numId="15" w16cid:durableId="1380587263">
-    <w:abstractNumId w:val="0"/>
-    <w:lvlOverride w:ilvl="0">
-      <w:startOverride w:val="1"/>
-    </w:lvlOverride>
-  </w:num>
-  <w:num w:numId="16" w16cid:durableId="733624782">
-    <w:abstractNumId w:val="0"/>
+  <w:num w:numId="16" w16cid:durableId="1879656290">
+    <w:abstractNumId w:val="1"/>
     <w:lvlOverride w:ilvl="0">
       <w:startOverride w:val="1"/>
     </w:lvlOverride>

</xml_diff>

<commit_message>
Relatorio: aparelhos do teste do APK (S20 FE com Android 13, Galaxy Tab S4 com Android 10)
</commit_message>
<xml_diff>
--- a/relatorio/Relatorio_Final_PIBIC_BioquimicaEDU.docx
+++ b/relatorio/Relatorio_Final_PIBIC_BioquimicaEDU.docx
@@ -87,6 +87,7 @@
           <w:b/>
           <w:bCs/>
         </w:rPr>
+        <w:lastRenderedPageBreak/>
         <w:t>ALEXANDRO DE ARAUJO JUNIOR</w:t>
       </w:r>
     </w:p>
@@ -158,6 +159,7 @@
         <w:pStyle w:val="Ttulopr-textual"/>
       </w:pPr>
       <w:r>
+        <w:lastRenderedPageBreak/>
         <w:t>AGRADECIMENTOS</w:t>
       </w:r>
     </w:p>
@@ -211,6 +213,7 @@
         <w:pStyle w:val="Ttulopr-textual"/>
       </w:pPr>
       <w:r>
+        <w:lastRenderedPageBreak/>
         <w:t>RESUMO</w:t>
       </w:r>
     </w:p>
@@ -267,6 +270,7 @@
         <w:pStyle w:val="Ttulopr-textual"/>
       </w:pPr>
       <w:r>
+        <w:lastRenderedPageBreak/>
         <w:t>ABSTRACT</w:t>
       </w:r>
     </w:p>
@@ -323,13 +327,14 @@
         <w:pStyle w:val="Ttulopr-textual"/>
       </w:pPr>
       <w:r>
+        <w:lastRenderedPageBreak/>
         <w:t>LISTA DE FIGURAS</w:t>
       </w:r>
     </w:p>
     <w:sdt>
       <w:sdtPr>
         <w:alias w:val="LISTA DE FIGURAS"/>
-        <w:id w:val="1398245558"/>
+        <w:id w:val="-1050228581"/>
       </w:sdtPr>
       <w:sdtEndPr/>
       <w:sdtContent>
@@ -355,7 +360,7 @@
           <w:r>
             <w:fldChar w:fldCharType="separate"/>
           </w:r>
-          <w:hyperlink w:anchor="_Toc243168980" w:history="1">
+          <w:hyperlink w:anchor="_Toc243296827" w:history="1">
             <w:r>
               <w:rPr>
                 <w:rStyle w:val="Hyperlink"/>
@@ -379,7 +384,7 @@
               <w:rPr>
                 <w:noProof/>
               </w:rPr>
-              <w:instrText xml:space="preserve"> PAGEREF _Toc243168980 \h </w:instrText>
+              <w:instrText xml:space="preserve"> PAGEREF _Toc243296827 \h </w:instrText>
             </w:r>
             <w:r>
               <w:rPr>
@@ -419,7 +424,7 @@
               <w14:ligatures w14:val="standardContextual"/>
             </w:rPr>
           </w:pPr>
-          <w:hyperlink w:anchor="_Toc243168981" w:history="1">
+          <w:hyperlink w:anchor="_Toc243296828" w:history="1">
             <w:r>
               <w:rPr>
                 <w:rStyle w:val="Hyperlink"/>
@@ -443,7 +448,7 @@
               <w:rPr>
                 <w:noProof/>
               </w:rPr>
-              <w:instrText xml:space="preserve"> PAGEREF _Toc243168981 \h </w:instrText>
+              <w:instrText xml:space="preserve"> PAGEREF _Toc243296828 \h </w:instrText>
             </w:r>
             <w:r>
               <w:rPr>
@@ -483,7 +488,7 @@
               <w14:ligatures w14:val="standardContextual"/>
             </w:rPr>
           </w:pPr>
-          <w:hyperlink w:anchor="_Toc243168982" w:history="1">
+          <w:hyperlink w:anchor="_Toc243296829" w:history="1">
             <w:r>
               <w:rPr>
                 <w:rStyle w:val="Hyperlink"/>
@@ -507,7 +512,7 @@
               <w:rPr>
                 <w:noProof/>
               </w:rPr>
-              <w:instrText xml:space="preserve"> PAGEREF _Toc243168982 \h </w:instrText>
+              <w:instrText xml:space="preserve"> PAGEREF _Toc243296829 \h </w:instrText>
             </w:r>
             <w:r>
               <w:rPr>
@@ -547,7 +552,7 @@
               <w14:ligatures w14:val="standardContextual"/>
             </w:rPr>
           </w:pPr>
-          <w:hyperlink w:anchor="_Toc243168983" w:history="1">
+          <w:hyperlink w:anchor="_Toc243296830" w:history="1">
             <w:r>
               <w:rPr>
                 <w:rStyle w:val="Hyperlink"/>
@@ -587,7 +592,7 @@
               <w:rPr>
                 <w:noProof/>
               </w:rPr>
-              <w:instrText xml:space="preserve"> PAGEREF _Toc243168983 \h </w:instrText>
+              <w:instrText xml:space="preserve"> PAGEREF _Toc243296830 \h </w:instrText>
             </w:r>
             <w:r>
               <w:rPr>
@@ -627,7 +632,7 @@
               <w14:ligatures w14:val="standardContextual"/>
             </w:rPr>
           </w:pPr>
-          <w:hyperlink w:anchor="_Toc243168984" w:history="1">
+          <w:hyperlink w:anchor="_Toc243296831" w:history="1">
             <w:r>
               <w:rPr>
                 <w:rStyle w:val="Hyperlink"/>
@@ -651,7 +656,7 @@
               <w:rPr>
                 <w:noProof/>
               </w:rPr>
-              <w:instrText xml:space="preserve"> PAGEREF _Toc243168984 \h </w:instrText>
+              <w:instrText xml:space="preserve"> PAGEREF _Toc243296831 \h </w:instrText>
             </w:r>
             <w:r>
               <w:rPr>
@@ -691,7 +696,7 @@
               <w14:ligatures w14:val="standardContextual"/>
             </w:rPr>
           </w:pPr>
-          <w:hyperlink w:anchor="_Toc243168985" w:history="1">
+          <w:hyperlink w:anchor="_Toc243296832" w:history="1">
             <w:r>
               <w:rPr>
                 <w:rStyle w:val="Hyperlink"/>
@@ -715,7 +720,7 @@
               <w:rPr>
                 <w:noProof/>
               </w:rPr>
-              <w:instrText xml:space="preserve"> PAGEREF _Toc243168985 \h </w:instrText>
+              <w:instrText xml:space="preserve"> PAGEREF _Toc243296832 \h </w:instrText>
             </w:r>
             <w:r>
               <w:rPr>
@@ -755,7 +760,7 @@
               <w14:ligatures w14:val="standardContextual"/>
             </w:rPr>
           </w:pPr>
-          <w:hyperlink w:anchor="_Toc243168986" w:history="1">
+          <w:hyperlink w:anchor="_Toc243296833" w:history="1">
             <w:r>
               <w:rPr>
                 <w:rStyle w:val="Hyperlink"/>
@@ -779,7 +784,7 @@
               <w:rPr>
                 <w:noProof/>
               </w:rPr>
-              <w:instrText xml:space="preserve"> PAGEREF _Toc243168986 \h </w:instrText>
+              <w:instrText xml:space="preserve"> PAGEREF _Toc243296833 \h </w:instrText>
             </w:r>
             <w:r>
               <w:rPr>
@@ -819,7 +824,7 @@
               <w14:ligatures w14:val="standardContextual"/>
             </w:rPr>
           </w:pPr>
-          <w:hyperlink w:anchor="_Toc243168987" w:history="1">
+          <w:hyperlink w:anchor="_Toc243296834" w:history="1">
             <w:r>
               <w:rPr>
                 <w:rStyle w:val="Hyperlink"/>
@@ -843,7 +848,7 @@
               <w:rPr>
                 <w:noProof/>
               </w:rPr>
-              <w:instrText xml:space="preserve"> PAGEREF _Toc243168987 \h </w:instrText>
+              <w:instrText xml:space="preserve"> PAGEREF _Toc243296834 \h </w:instrText>
             </w:r>
             <w:r>
               <w:rPr>
@@ -883,7 +888,7 @@
               <w14:ligatures w14:val="standardContextual"/>
             </w:rPr>
           </w:pPr>
-          <w:hyperlink w:anchor="_Toc243168988" w:history="1">
+          <w:hyperlink w:anchor="_Toc243296835" w:history="1">
             <w:r>
               <w:rPr>
                 <w:rStyle w:val="Hyperlink"/>
@@ -907,7 +912,7 @@
               <w:rPr>
                 <w:noProof/>
               </w:rPr>
-              <w:instrText xml:space="preserve"> PAGEREF _Toc243168988 \h </w:instrText>
+              <w:instrText xml:space="preserve"> PAGEREF _Toc243296835 \h </w:instrText>
             </w:r>
             <w:r>
               <w:rPr>
@@ -947,7 +952,7 @@
               <w14:ligatures w14:val="standardContextual"/>
             </w:rPr>
           </w:pPr>
-          <w:hyperlink w:anchor="_Toc243168989" w:history="1">
+          <w:hyperlink w:anchor="_Toc243296836" w:history="1">
             <w:r>
               <w:rPr>
                 <w:rStyle w:val="Hyperlink"/>
@@ -971,7 +976,7 @@
               <w:rPr>
                 <w:noProof/>
               </w:rPr>
-              <w:instrText xml:space="preserve"> PAGEREF _Toc243168989 \h </w:instrText>
+              <w:instrText xml:space="preserve"> PAGEREF _Toc243296836 \h </w:instrText>
             </w:r>
             <w:r>
               <w:rPr>
@@ -1011,7 +1016,7 @@
               <w14:ligatures w14:val="standardContextual"/>
             </w:rPr>
           </w:pPr>
-          <w:hyperlink w:anchor="_Toc243168990" w:history="1">
+          <w:hyperlink w:anchor="_Toc243296837" w:history="1">
             <w:r>
               <w:rPr>
                 <w:rStyle w:val="Hyperlink"/>
@@ -1035,7 +1040,7 @@
               <w:rPr>
                 <w:noProof/>
               </w:rPr>
-              <w:instrText xml:space="preserve"> PAGEREF _Toc243168990 \h </w:instrText>
+              <w:instrText xml:space="preserve"> PAGEREF _Toc243296837 \h </w:instrText>
             </w:r>
             <w:r>
               <w:rPr>
@@ -1075,7 +1080,7 @@
               <w14:ligatures w14:val="standardContextual"/>
             </w:rPr>
           </w:pPr>
-          <w:hyperlink w:anchor="_Toc243168991" w:history="1">
+          <w:hyperlink w:anchor="_Toc243296838" w:history="1">
             <w:r>
               <w:rPr>
                 <w:rStyle w:val="Hyperlink"/>
@@ -1099,7 +1104,7 @@
               <w:rPr>
                 <w:noProof/>
               </w:rPr>
-              <w:instrText xml:space="preserve"> PAGEREF _Toc243168991 \h </w:instrText>
+              <w:instrText xml:space="preserve"> PAGEREF _Toc243296838 \h </w:instrText>
             </w:r>
             <w:r>
               <w:rPr>
@@ -1138,13 +1143,14 @@
         <w:pStyle w:val="Ttulopr-textual"/>
       </w:pPr>
       <w:r>
+        <w:lastRenderedPageBreak/>
         <w:t>LISTA DE QUADROS</w:t>
       </w:r>
     </w:p>
     <w:sdt>
       <w:sdtPr>
         <w:alias w:val="LISTA DE QUADROS"/>
-        <w:id w:val="278616795"/>
+        <w:id w:val="1180390136"/>
       </w:sdtPr>
       <w:sdtEndPr/>
       <w:sdtContent>
@@ -1170,7 +1176,7 @@
           <w:r>
             <w:fldChar w:fldCharType="separate"/>
           </w:r>
-          <w:hyperlink w:anchor="_Toc243168992" w:history="1">
+          <w:hyperlink w:anchor="_Toc243296839" w:history="1">
             <w:r>
               <w:rPr>
                 <w:rStyle w:val="Hyperlink"/>
@@ -1194,7 +1200,7 @@
               <w:rPr>
                 <w:noProof/>
               </w:rPr>
-              <w:instrText xml:space="preserve"> PAGEREF _Toc243168992 \h </w:instrText>
+              <w:instrText xml:space="preserve"> PAGEREF _Toc243296839 \h </w:instrText>
             </w:r>
             <w:r>
               <w:rPr>
@@ -1234,7 +1240,7 @@
               <w14:ligatures w14:val="standardContextual"/>
             </w:rPr>
           </w:pPr>
-          <w:hyperlink w:anchor="_Toc243168993" w:history="1">
+          <w:hyperlink w:anchor="_Toc243296840" w:history="1">
             <w:r>
               <w:rPr>
                 <w:rStyle w:val="Hyperlink"/>
@@ -1258,7 +1264,7 @@
               <w:rPr>
                 <w:noProof/>
               </w:rPr>
-              <w:instrText xml:space="preserve"> PAGEREF _Toc243168993 \h </w:instrText>
+              <w:instrText xml:space="preserve"> PAGEREF _Toc243296840 \h </w:instrText>
             </w:r>
             <w:r>
               <w:rPr>
@@ -1298,7 +1304,7 @@
               <w14:ligatures w14:val="standardContextual"/>
             </w:rPr>
           </w:pPr>
-          <w:hyperlink w:anchor="_Toc243168994" w:history="1">
+          <w:hyperlink w:anchor="_Toc243296841" w:history="1">
             <w:r>
               <w:rPr>
                 <w:rStyle w:val="Hyperlink"/>
@@ -1322,7 +1328,7 @@
               <w:rPr>
                 <w:noProof/>
               </w:rPr>
-              <w:instrText xml:space="preserve"> PAGEREF _Toc243168994 \h </w:instrText>
+              <w:instrText xml:space="preserve"> PAGEREF _Toc243296841 \h </w:instrText>
             </w:r>
             <w:r>
               <w:rPr>
@@ -1362,7 +1368,7 @@
               <w14:ligatures w14:val="standardContextual"/>
             </w:rPr>
           </w:pPr>
-          <w:hyperlink w:anchor="_Toc243168995" w:history="1">
+          <w:hyperlink w:anchor="_Toc243296842" w:history="1">
             <w:r>
               <w:rPr>
                 <w:rStyle w:val="Hyperlink"/>
@@ -1386,7 +1392,7 @@
               <w:rPr>
                 <w:noProof/>
               </w:rPr>
-              <w:instrText xml:space="preserve"> PAGEREF _Toc243168995 \h </w:instrText>
+              <w:instrText xml:space="preserve"> PAGEREF _Toc243296842 \h </w:instrText>
             </w:r>
             <w:r>
               <w:rPr>
@@ -1426,7 +1432,7 @@
               <w14:ligatures w14:val="standardContextual"/>
             </w:rPr>
           </w:pPr>
-          <w:hyperlink w:anchor="_Toc243168996" w:history="1">
+          <w:hyperlink w:anchor="_Toc243296843" w:history="1">
             <w:r>
               <w:rPr>
                 <w:rStyle w:val="Hyperlink"/>
@@ -1450,7 +1456,7 @@
               <w:rPr>
                 <w:noProof/>
               </w:rPr>
-              <w:instrText xml:space="preserve"> PAGEREF _Toc243168996 \h </w:instrText>
+              <w:instrText xml:space="preserve"> PAGEREF _Toc243296843 \h </w:instrText>
             </w:r>
             <w:r>
               <w:rPr>
@@ -1490,7 +1496,7 @@
               <w14:ligatures w14:val="standardContextual"/>
             </w:rPr>
           </w:pPr>
-          <w:hyperlink w:anchor="_Toc243168997" w:history="1">
+          <w:hyperlink w:anchor="_Toc243296844" w:history="1">
             <w:r>
               <w:rPr>
                 <w:rStyle w:val="Hyperlink"/>
@@ -1514,7 +1520,7 @@
               <w:rPr>
                 <w:noProof/>
               </w:rPr>
-              <w:instrText xml:space="preserve"> PAGEREF _Toc243168997 \h </w:instrText>
+              <w:instrText xml:space="preserve"> PAGEREF _Toc243296844 \h </w:instrText>
             </w:r>
             <w:r>
               <w:rPr>
@@ -1554,7 +1560,7 @@
               <w14:ligatures w14:val="standardContextual"/>
             </w:rPr>
           </w:pPr>
-          <w:hyperlink w:anchor="_Toc243168998" w:history="1">
+          <w:hyperlink w:anchor="_Toc243296845" w:history="1">
             <w:r>
               <w:rPr>
                 <w:rStyle w:val="Hyperlink"/>
@@ -1578,7 +1584,7 @@
               <w:rPr>
                 <w:noProof/>
               </w:rPr>
-              <w:instrText xml:space="preserve"> PAGEREF _Toc243168998 \h </w:instrText>
+              <w:instrText xml:space="preserve"> PAGEREF _Toc243296845 \h </w:instrText>
             </w:r>
             <w:r>
               <w:rPr>
@@ -1617,13 +1623,14 @@
         <w:pStyle w:val="Ttulopr-textual"/>
       </w:pPr>
       <w:r>
+        <w:lastRenderedPageBreak/>
         <w:t>LISTA DE TABELAS</w:t>
       </w:r>
     </w:p>
     <w:sdt>
       <w:sdtPr>
         <w:alias w:val="LISTA DE TABELAS"/>
-        <w:id w:val="-503671057"/>
+        <w:id w:val="1375651483"/>
       </w:sdtPr>
       <w:sdtEndPr/>
       <w:sdtContent>
@@ -1649,7 +1656,7 @@
           <w:r>
             <w:fldChar w:fldCharType="separate"/>
           </w:r>
-          <w:hyperlink w:anchor="_Toc243168999" w:history="1">
+          <w:hyperlink w:anchor="_Toc243296846" w:history="1">
             <w:r>
               <w:rPr>
                 <w:rStyle w:val="Hyperlink"/>
@@ -1673,7 +1680,7 @@
               <w:rPr>
                 <w:noProof/>
               </w:rPr>
-              <w:instrText xml:space="preserve"> PAGEREF _Toc243168999 \h </w:instrText>
+              <w:instrText xml:space="preserve"> PAGEREF _Toc243296846 \h </w:instrText>
             </w:r>
             <w:r>
               <w:rPr>
@@ -1713,7 +1720,7 @@
               <w14:ligatures w14:val="standardContextual"/>
             </w:rPr>
           </w:pPr>
-          <w:hyperlink w:anchor="_Toc243169000" w:history="1">
+          <w:hyperlink w:anchor="_Toc243296847" w:history="1">
             <w:r>
               <w:rPr>
                 <w:rStyle w:val="Hyperlink"/>
@@ -1737,7 +1744,7 @@
               <w:rPr>
                 <w:noProof/>
               </w:rPr>
-              <w:instrText xml:space="preserve"> PAGEREF _Toc243169000 \h </w:instrText>
+              <w:instrText xml:space="preserve"> PAGEREF _Toc243296847 \h </w:instrText>
             </w:r>
             <w:r>
               <w:rPr>
@@ -1777,7 +1784,7 @@
               <w14:ligatures w14:val="standardContextual"/>
             </w:rPr>
           </w:pPr>
-          <w:hyperlink w:anchor="_Toc243169001" w:history="1">
+          <w:hyperlink w:anchor="_Toc243296848" w:history="1">
             <w:r>
               <w:rPr>
                 <w:rStyle w:val="Hyperlink"/>
@@ -1801,7 +1808,7 @@
               <w:rPr>
                 <w:noProof/>
               </w:rPr>
-              <w:instrText xml:space="preserve"> PAGEREF _Toc243169001 \h </w:instrText>
+              <w:instrText xml:space="preserve"> PAGEREF _Toc243296848 \h </w:instrText>
             </w:r>
             <w:r>
               <w:rPr>
@@ -1841,7 +1848,7 @@
               <w14:ligatures w14:val="standardContextual"/>
             </w:rPr>
           </w:pPr>
-          <w:hyperlink w:anchor="_Toc243169002" w:history="1">
+          <w:hyperlink w:anchor="_Toc243296849" w:history="1">
             <w:r>
               <w:rPr>
                 <w:rStyle w:val="Hyperlink"/>
@@ -1865,7 +1872,7 @@
               <w:rPr>
                 <w:noProof/>
               </w:rPr>
-              <w:instrText xml:space="preserve"> PAGEREF _Toc243169002 \h </w:instrText>
+              <w:instrText xml:space="preserve"> PAGEREF _Toc243296849 \h </w:instrText>
             </w:r>
             <w:r>
               <w:rPr>
@@ -1905,7 +1912,7 @@
               <w14:ligatures w14:val="standardContextual"/>
             </w:rPr>
           </w:pPr>
-          <w:hyperlink w:anchor="_Toc243169003" w:history="1">
+          <w:hyperlink w:anchor="_Toc243296850" w:history="1">
             <w:r>
               <w:rPr>
                 <w:rStyle w:val="Hyperlink"/>
@@ -1929,7 +1936,7 @@
               <w:rPr>
                 <w:noProof/>
               </w:rPr>
-              <w:instrText xml:space="preserve"> PAGEREF _Toc243169003 \h </w:instrText>
+              <w:instrText xml:space="preserve"> PAGEREF _Toc243296850 \h </w:instrText>
             </w:r>
             <w:r>
               <w:rPr>
@@ -1968,6 +1975,7 @@
         <w:pStyle w:val="Ttulopr-textual"/>
       </w:pPr>
       <w:r>
+        <w:lastRenderedPageBreak/>
         <w:t>LISTA DE ABREVIATURAS E SIGLAS</w:t>
       </w:r>
     </w:p>
@@ -2522,6 +2530,7 @@
         <w:pStyle w:val="Ttulopr-textual"/>
       </w:pPr>
       <w:r>
+        <w:lastRenderedPageBreak/>
         <w:t>SUMÁRIO</w:t>
       </w:r>
     </w:p>
@@ -2532,7 +2541,7 @@
           <w:bCs w:val="0"/>
         </w:rPr>
         <w:alias w:val="Sumário"/>
-        <w:id w:val="-1290672561"/>
+        <w:id w:val="-2118823417"/>
       </w:sdtPr>
       <w:sdtEndPr/>
       <w:sdtContent>
@@ -2560,7 +2569,7 @@
           <w:r>
             <w:fldChar w:fldCharType="separate"/>
           </w:r>
-          <w:hyperlink w:anchor="_Toc243168934" w:history="1">
+          <w:hyperlink w:anchor="_Toc243296781" w:history="1">
             <w:r>
               <w:rPr>
                 <w:rStyle w:val="Hyperlink"/>
@@ -2584,7 +2593,7 @@
               <w:rPr>
                 <w:noProof/>
               </w:rPr>
-              <w:instrText xml:space="preserve"> PAGEREF _Toc243168934 \h </w:instrText>
+              <w:instrText xml:space="preserve"> PAGEREF _Toc243296781 \h </w:instrText>
             </w:r>
             <w:r>
               <w:rPr>
@@ -2624,7 +2633,7 @@
               <w14:ligatures w14:val="standardContextual"/>
             </w:rPr>
           </w:pPr>
-          <w:hyperlink w:anchor="_Toc243168935" w:history="1">
+          <w:hyperlink w:anchor="_Toc243296782" w:history="1">
             <w:r>
               <w:rPr>
                 <w:rStyle w:val="Hyperlink"/>
@@ -2648,7 +2657,7 @@
               <w:rPr>
                 <w:noProof/>
               </w:rPr>
-              <w:instrText xml:space="preserve"> PAGEREF _Toc243168935 \h </w:instrText>
+              <w:instrText xml:space="preserve"> PAGEREF _Toc243296782 \h </w:instrText>
             </w:r>
             <w:r>
               <w:rPr>
@@ -2688,7 +2697,7 @@
               <w14:ligatures w14:val="standardContextual"/>
             </w:rPr>
           </w:pPr>
-          <w:hyperlink w:anchor="_Toc243168936" w:history="1">
+          <w:hyperlink w:anchor="_Toc243296783" w:history="1">
             <w:r>
               <w:rPr>
                 <w:rStyle w:val="Hyperlink"/>
@@ -2712,7 +2721,7 @@
               <w:rPr>
                 <w:noProof/>
               </w:rPr>
-              <w:instrText xml:space="preserve"> PAGEREF _Toc243168936 \h </w:instrText>
+              <w:instrText xml:space="preserve"> PAGEREF _Toc243296783 \h </w:instrText>
             </w:r>
             <w:r>
               <w:rPr>
@@ -2752,7 +2761,7 @@
               <w14:ligatures w14:val="standardContextual"/>
             </w:rPr>
           </w:pPr>
-          <w:hyperlink w:anchor="_Toc243168937" w:history="1">
+          <w:hyperlink w:anchor="_Toc243296784" w:history="1">
             <w:r>
               <w:rPr>
                 <w:rStyle w:val="Hyperlink"/>
@@ -2776,7 +2785,7 @@
               <w:rPr>
                 <w:noProof/>
               </w:rPr>
-              <w:instrText xml:space="preserve"> PAGEREF _Toc243168937 \h </w:instrText>
+              <w:instrText xml:space="preserve"> PAGEREF _Toc243296784 \h </w:instrText>
             </w:r>
             <w:r>
               <w:rPr>
@@ -2816,7 +2825,7 @@
               <w14:ligatures w14:val="standardContextual"/>
             </w:rPr>
           </w:pPr>
-          <w:hyperlink w:anchor="_Toc243168938" w:history="1">
+          <w:hyperlink w:anchor="_Toc243296785" w:history="1">
             <w:r>
               <w:rPr>
                 <w:rStyle w:val="Hyperlink"/>
@@ -2840,7 +2849,7 @@
               <w:rPr>
                 <w:noProof/>
               </w:rPr>
-              <w:instrText xml:space="preserve"> PAGEREF _Toc243168938 \h </w:instrText>
+              <w:instrText xml:space="preserve"> PAGEREF _Toc243296785 \h </w:instrText>
             </w:r>
             <w:r>
               <w:rPr>
@@ -2882,7 +2891,7 @@
               <w14:ligatures w14:val="standardContextual"/>
             </w:rPr>
           </w:pPr>
-          <w:hyperlink w:anchor="_Toc243168939" w:history="1">
+          <w:hyperlink w:anchor="_Toc243296786" w:history="1">
             <w:r>
               <w:rPr>
                 <w:rStyle w:val="Hyperlink"/>
@@ -2906,7 +2915,7 @@
               <w:rPr>
                 <w:noProof/>
               </w:rPr>
-              <w:instrText xml:space="preserve"> PAGEREF _Toc243168939 \h </w:instrText>
+              <w:instrText xml:space="preserve"> PAGEREF _Toc243296786 \h </w:instrText>
             </w:r>
             <w:r>
               <w:rPr>
@@ -2946,7 +2955,7 @@
               <w14:ligatures w14:val="standardContextual"/>
             </w:rPr>
           </w:pPr>
-          <w:hyperlink w:anchor="_Toc243168940" w:history="1">
+          <w:hyperlink w:anchor="_Toc243296787" w:history="1">
             <w:r>
               <w:rPr>
                 <w:rStyle w:val="Hyperlink"/>
@@ -2970,7 +2979,7 @@
               <w:rPr>
                 <w:noProof/>
               </w:rPr>
-              <w:instrText xml:space="preserve"> PAGEREF _Toc243168940 \h </w:instrText>
+              <w:instrText xml:space="preserve"> PAGEREF _Toc243296787 \h </w:instrText>
             </w:r>
             <w:r>
               <w:rPr>
@@ -3010,7 +3019,7 @@
               <w14:ligatures w14:val="standardContextual"/>
             </w:rPr>
           </w:pPr>
-          <w:hyperlink w:anchor="_Toc243168941" w:history="1">
+          <w:hyperlink w:anchor="_Toc243296788" w:history="1">
             <w:r>
               <w:rPr>
                 <w:rStyle w:val="Hyperlink"/>
@@ -3034,7 +3043,7 @@
               <w:rPr>
                 <w:noProof/>
               </w:rPr>
-              <w:instrText xml:space="preserve"> PAGEREF _Toc243168941 \h </w:instrText>
+              <w:instrText xml:space="preserve"> PAGEREF _Toc243296788 \h </w:instrText>
             </w:r>
             <w:r>
               <w:rPr>
@@ -3074,7 +3083,7 @@
               <w14:ligatures w14:val="standardContextual"/>
             </w:rPr>
           </w:pPr>
-          <w:hyperlink w:anchor="_Toc243168942" w:history="1">
+          <w:hyperlink w:anchor="_Toc243296789" w:history="1">
             <w:r>
               <w:rPr>
                 <w:rStyle w:val="Hyperlink"/>
@@ -3098,7 +3107,7 @@
               <w:rPr>
                 <w:noProof/>
               </w:rPr>
-              <w:instrText xml:space="preserve"> PAGEREF _Toc243168942 \h </w:instrText>
+              <w:instrText xml:space="preserve"> PAGEREF _Toc243296789 \h </w:instrText>
             </w:r>
             <w:r>
               <w:rPr>
@@ -3138,7 +3147,7 @@
               <w14:ligatures w14:val="standardContextual"/>
             </w:rPr>
           </w:pPr>
-          <w:hyperlink w:anchor="_Toc243168943" w:history="1">
+          <w:hyperlink w:anchor="_Toc243296790" w:history="1">
             <w:r>
               <w:rPr>
                 <w:rStyle w:val="Hyperlink"/>
@@ -3162,7 +3171,7 @@
               <w:rPr>
                 <w:noProof/>
               </w:rPr>
-              <w:instrText xml:space="preserve"> PAGEREF _Toc243168943 \h </w:instrText>
+              <w:instrText xml:space="preserve"> PAGEREF _Toc243296790 \h </w:instrText>
             </w:r>
             <w:r>
               <w:rPr>
@@ -3202,7 +3211,7 @@
               <w14:ligatures w14:val="standardContextual"/>
             </w:rPr>
           </w:pPr>
-          <w:hyperlink w:anchor="_Toc243168944" w:history="1">
+          <w:hyperlink w:anchor="_Toc243296791" w:history="1">
             <w:r>
               <w:rPr>
                 <w:rStyle w:val="Hyperlink"/>
@@ -3226,7 +3235,7 @@
               <w:rPr>
                 <w:noProof/>
               </w:rPr>
-              <w:instrText xml:space="preserve"> PAGEREF _Toc243168944 \h </w:instrText>
+              <w:instrText xml:space="preserve"> PAGEREF _Toc243296791 \h </w:instrText>
             </w:r>
             <w:r>
               <w:rPr>
@@ -3268,7 +3277,7 @@
               <w14:ligatures w14:val="standardContextual"/>
             </w:rPr>
           </w:pPr>
-          <w:hyperlink w:anchor="_Toc243168945" w:history="1">
+          <w:hyperlink w:anchor="_Toc243296792" w:history="1">
             <w:r>
               <w:rPr>
                 <w:rStyle w:val="Hyperlink"/>
@@ -3292,7 +3301,7 @@
               <w:rPr>
                 <w:noProof/>
               </w:rPr>
-              <w:instrText xml:space="preserve"> PAGEREF _Toc243168945 \h </w:instrText>
+              <w:instrText xml:space="preserve"> PAGEREF _Toc243296792 \h </w:instrText>
             </w:r>
             <w:r>
               <w:rPr>
@@ -3332,7 +3341,7 @@
               <w14:ligatures w14:val="standardContextual"/>
             </w:rPr>
           </w:pPr>
-          <w:hyperlink w:anchor="_Toc243168946" w:history="1">
+          <w:hyperlink w:anchor="_Toc243296793" w:history="1">
             <w:r>
               <w:rPr>
                 <w:rStyle w:val="Hyperlink"/>
@@ -3356,7 +3365,7 @@
               <w:rPr>
                 <w:noProof/>
               </w:rPr>
-              <w:instrText xml:space="preserve"> PAGEREF _Toc243168946 \h </w:instrText>
+              <w:instrText xml:space="preserve"> PAGEREF _Toc243296793 \h </w:instrText>
             </w:r>
             <w:r>
               <w:rPr>
@@ -3396,7 +3405,7 @@
               <w14:ligatures w14:val="standardContextual"/>
             </w:rPr>
           </w:pPr>
-          <w:hyperlink w:anchor="_Toc243168947" w:history="1">
+          <w:hyperlink w:anchor="_Toc243296794" w:history="1">
             <w:r>
               <w:rPr>
                 <w:rStyle w:val="Hyperlink"/>
@@ -3420,7 +3429,7 @@
               <w:rPr>
                 <w:noProof/>
               </w:rPr>
-              <w:instrText xml:space="preserve"> PAGEREF _Toc243168947 \h </w:instrText>
+              <w:instrText xml:space="preserve"> PAGEREF _Toc243296794 \h </w:instrText>
             </w:r>
             <w:r>
               <w:rPr>
@@ -3460,7 +3469,7 @@
               <w14:ligatures w14:val="standardContextual"/>
             </w:rPr>
           </w:pPr>
-          <w:hyperlink w:anchor="_Toc243168948" w:history="1">
+          <w:hyperlink w:anchor="_Toc243296795" w:history="1">
             <w:r>
               <w:rPr>
                 <w:rStyle w:val="Hyperlink"/>
@@ -3484,7 +3493,7 @@
               <w:rPr>
                 <w:noProof/>
               </w:rPr>
-              <w:instrText xml:space="preserve"> PAGEREF _Toc243168948 \h </w:instrText>
+              <w:instrText xml:space="preserve"> PAGEREF _Toc243296795 \h </w:instrText>
             </w:r>
             <w:r>
               <w:rPr>
@@ -3524,7 +3533,7 @@
               <w14:ligatures w14:val="standardContextual"/>
             </w:rPr>
           </w:pPr>
-          <w:hyperlink w:anchor="_Toc243168949" w:history="1">
+          <w:hyperlink w:anchor="_Toc243296796" w:history="1">
             <w:r>
               <w:rPr>
                 <w:rStyle w:val="Hyperlink"/>
@@ -3548,7 +3557,7 @@
               <w:rPr>
                 <w:noProof/>
               </w:rPr>
-              <w:instrText xml:space="preserve"> PAGEREF _Toc243168949 \h </w:instrText>
+              <w:instrText xml:space="preserve"> PAGEREF _Toc243296796 \h </w:instrText>
             </w:r>
             <w:r>
               <w:rPr>
@@ -3588,7 +3597,7 @@
               <w14:ligatures w14:val="standardContextual"/>
             </w:rPr>
           </w:pPr>
-          <w:hyperlink w:anchor="_Toc243168950" w:history="1">
+          <w:hyperlink w:anchor="_Toc243296797" w:history="1">
             <w:r>
               <w:rPr>
                 <w:rStyle w:val="Hyperlink"/>
@@ -3612,7 +3621,7 @@
               <w:rPr>
                 <w:noProof/>
               </w:rPr>
-              <w:instrText xml:space="preserve"> PAGEREF _Toc243168950 \h </w:instrText>
+              <w:instrText xml:space="preserve"> PAGEREF _Toc243296797 \h </w:instrText>
             </w:r>
             <w:r>
               <w:rPr>
@@ -3652,7 +3661,7 @@
               <w14:ligatures w14:val="standardContextual"/>
             </w:rPr>
           </w:pPr>
-          <w:hyperlink w:anchor="_Toc243168951" w:history="1">
+          <w:hyperlink w:anchor="_Toc243296798" w:history="1">
             <w:r>
               <w:rPr>
                 <w:rStyle w:val="Hyperlink"/>
@@ -3676,7 +3685,7 @@
               <w:rPr>
                 <w:noProof/>
               </w:rPr>
-              <w:instrText xml:space="preserve"> PAGEREF _Toc243168951 \h </w:instrText>
+              <w:instrText xml:space="preserve"> PAGEREF _Toc243296798 \h </w:instrText>
             </w:r>
             <w:r>
               <w:rPr>
@@ -3716,7 +3725,7 @@
               <w14:ligatures w14:val="standardContextual"/>
             </w:rPr>
           </w:pPr>
-          <w:hyperlink w:anchor="_Toc243168952" w:history="1">
+          <w:hyperlink w:anchor="_Toc243296799" w:history="1">
             <w:r>
               <w:rPr>
                 <w:rStyle w:val="Hyperlink"/>
@@ -3740,7 +3749,7 @@
               <w:rPr>
                 <w:noProof/>
               </w:rPr>
-              <w:instrText xml:space="preserve"> PAGEREF _Toc243168952 \h </w:instrText>
+              <w:instrText xml:space="preserve"> PAGEREF _Toc243296799 \h </w:instrText>
             </w:r>
             <w:r>
               <w:rPr>
@@ -3780,7 +3789,7 @@
               <w14:ligatures w14:val="standardContextual"/>
             </w:rPr>
           </w:pPr>
-          <w:hyperlink w:anchor="_Toc243168953" w:history="1">
+          <w:hyperlink w:anchor="_Toc243296800" w:history="1">
             <w:r>
               <w:rPr>
                 <w:rStyle w:val="Hyperlink"/>
@@ -3804,7 +3813,7 @@
               <w:rPr>
                 <w:noProof/>
               </w:rPr>
-              <w:instrText xml:space="preserve"> PAGEREF _Toc243168953 \h </w:instrText>
+              <w:instrText xml:space="preserve"> PAGEREF _Toc243296800 \h </w:instrText>
             </w:r>
             <w:r>
               <w:rPr>
@@ -3844,7 +3853,7 @@
               <w14:ligatures w14:val="standardContextual"/>
             </w:rPr>
           </w:pPr>
-          <w:hyperlink w:anchor="_Toc243168954" w:history="1">
+          <w:hyperlink w:anchor="_Toc243296801" w:history="1">
             <w:r>
               <w:rPr>
                 <w:rStyle w:val="Hyperlink"/>
@@ -3868,7 +3877,7 @@
               <w:rPr>
                 <w:noProof/>
               </w:rPr>
-              <w:instrText xml:space="preserve"> PAGEREF _Toc243168954 \h </w:instrText>
+              <w:instrText xml:space="preserve"> PAGEREF _Toc243296801 \h </w:instrText>
             </w:r>
             <w:r>
               <w:rPr>
@@ -3908,7 +3917,7 @@
               <w14:ligatures w14:val="standardContextual"/>
             </w:rPr>
           </w:pPr>
-          <w:hyperlink w:anchor="_Toc243168955" w:history="1">
+          <w:hyperlink w:anchor="_Toc243296802" w:history="1">
             <w:r>
               <w:rPr>
                 <w:rStyle w:val="Hyperlink"/>
@@ -3932,7 +3941,7 @@
               <w:rPr>
                 <w:noProof/>
               </w:rPr>
-              <w:instrText xml:space="preserve"> PAGEREF _Toc243168955 \h </w:instrText>
+              <w:instrText xml:space="preserve"> PAGEREF _Toc243296802 \h </w:instrText>
             </w:r>
             <w:r>
               <w:rPr>
@@ -3972,7 +3981,7 @@
               <w14:ligatures w14:val="standardContextual"/>
             </w:rPr>
           </w:pPr>
-          <w:hyperlink w:anchor="_Toc243168956" w:history="1">
+          <w:hyperlink w:anchor="_Toc243296803" w:history="1">
             <w:r>
               <w:rPr>
                 <w:rStyle w:val="Hyperlink"/>
@@ -3996,7 +4005,7 @@
               <w:rPr>
                 <w:noProof/>
               </w:rPr>
-              <w:instrText xml:space="preserve"> PAGEREF _Toc243168956 \h </w:instrText>
+              <w:instrText xml:space="preserve"> PAGEREF _Toc243296803 \h </w:instrText>
             </w:r>
             <w:r>
               <w:rPr>
@@ -4038,7 +4047,7 @@
               <w14:ligatures w14:val="standardContextual"/>
             </w:rPr>
           </w:pPr>
-          <w:hyperlink w:anchor="_Toc243168957" w:history="1">
+          <w:hyperlink w:anchor="_Toc243296804" w:history="1">
             <w:r>
               <w:rPr>
                 <w:rStyle w:val="Hyperlink"/>
@@ -4062,7 +4071,7 @@
               <w:rPr>
                 <w:noProof/>
               </w:rPr>
-              <w:instrText xml:space="preserve"> PAGEREF _Toc243168957 \h </w:instrText>
+              <w:instrText xml:space="preserve"> PAGEREF _Toc243296804 \h </w:instrText>
             </w:r>
             <w:r>
               <w:rPr>
@@ -4102,7 +4111,7 @@
               <w14:ligatures w14:val="standardContextual"/>
             </w:rPr>
           </w:pPr>
-          <w:hyperlink w:anchor="_Toc243168958" w:history="1">
+          <w:hyperlink w:anchor="_Toc243296805" w:history="1">
             <w:r>
               <w:rPr>
                 <w:rStyle w:val="Hyperlink"/>
@@ -4126,7 +4135,7 @@
               <w:rPr>
                 <w:noProof/>
               </w:rPr>
-              <w:instrText xml:space="preserve"> PAGEREF _Toc243168958 \h </w:instrText>
+              <w:instrText xml:space="preserve"> PAGEREF _Toc243296805 \h </w:instrText>
             </w:r>
             <w:r>
               <w:rPr>
@@ -4166,7 +4175,7 @@
               <w14:ligatures w14:val="standardContextual"/>
             </w:rPr>
           </w:pPr>
-          <w:hyperlink w:anchor="_Toc243168959" w:history="1">
+          <w:hyperlink w:anchor="_Toc243296806" w:history="1">
             <w:r>
               <w:rPr>
                 <w:rStyle w:val="Hyperlink"/>
@@ -4190,7 +4199,7 @@
               <w:rPr>
                 <w:noProof/>
               </w:rPr>
-              <w:instrText xml:space="preserve"> PAGEREF _Toc243168959 \h </w:instrText>
+              <w:instrText xml:space="preserve"> PAGEREF _Toc243296806 \h </w:instrText>
             </w:r>
             <w:r>
               <w:rPr>
@@ -4230,7 +4239,7 @@
               <w14:ligatures w14:val="standardContextual"/>
             </w:rPr>
           </w:pPr>
-          <w:hyperlink w:anchor="_Toc243168960" w:history="1">
+          <w:hyperlink w:anchor="_Toc243296807" w:history="1">
             <w:r>
               <w:rPr>
                 <w:rStyle w:val="Hyperlink"/>
@@ -4254,7 +4263,7 @@
               <w:rPr>
                 <w:noProof/>
               </w:rPr>
-              <w:instrText xml:space="preserve"> PAGEREF _Toc243168960 \h </w:instrText>
+              <w:instrText xml:space="preserve"> PAGEREF _Toc243296807 \h </w:instrText>
             </w:r>
             <w:r>
               <w:rPr>
@@ -4294,7 +4303,7 @@
               <w14:ligatures w14:val="standardContextual"/>
             </w:rPr>
           </w:pPr>
-          <w:hyperlink w:anchor="_Toc243168961" w:history="1">
+          <w:hyperlink w:anchor="_Toc243296808" w:history="1">
             <w:r>
               <w:rPr>
                 <w:rStyle w:val="Hyperlink"/>
@@ -4318,7 +4327,7 @@
               <w:rPr>
                 <w:noProof/>
               </w:rPr>
-              <w:instrText xml:space="preserve"> PAGEREF _Toc243168961 \h </w:instrText>
+              <w:instrText xml:space="preserve"> PAGEREF _Toc243296808 \h </w:instrText>
             </w:r>
             <w:r>
               <w:rPr>
@@ -4358,7 +4367,7 @@
               <w14:ligatures w14:val="standardContextual"/>
             </w:rPr>
           </w:pPr>
-          <w:hyperlink w:anchor="_Toc243168962" w:history="1">
+          <w:hyperlink w:anchor="_Toc243296809" w:history="1">
             <w:r>
               <w:rPr>
                 <w:rStyle w:val="Hyperlink"/>
@@ -4382,7 +4391,7 @@
               <w:rPr>
                 <w:noProof/>
               </w:rPr>
-              <w:instrText xml:space="preserve"> PAGEREF _Toc243168962 \h </w:instrText>
+              <w:instrText xml:space="preserve"> PAGEREF _Toc243296809 \h </w:instrText>
             </w:r>
             <w:r>
               <w:rPr>
@@ -4422,7 +4431,7 @@
               <w14:ligatures w14:val="standardContextual"/>
             </w:rPr>
           </w:pPr>
-          <w:hyperlink w:anchor="_Toc243168963" w:history="1">
+          <w:hyperlink w:anchor="_Toc243296810" w:history="1">
             <w:r>
               <w:rPr>
                 <w:rStyle w:val="Hyperlink"/>
@@ -4446,7 +4455,7 @@
               <w:rPr>
                 <w:noProof/>
               </w:rPr>
-              <w:instrText xml:space="preserve"> PAGEREF _Toc243168963 \h </w:instrText>
+              <w:instrText xml:space="preserve"> PAGEREF _Toc243296810 \h </w:instrText>
             </w:r>
             <w:r>
               <w:rPr>
@@ -4486,7 +4495,7 @@
               <w14:ligatures w14:val="standardContextual"/>
             </w:rPr>
           </w:pPr>
-          <w:hyperlink w:anchor="_Toc243168964" w:history="1">
+          <w:hyperlink w:anchor="_Toc243296811" w:history="1">
             <w:r>
               <w:rPr>
                 <w:rStyle w:val="Hyperlink"/>
@@ -4510,7 +4519,7 @@
               <w:rPr>
                 <w:noProof/>
               </w:rPr>
-              <w:instrText xml:space="preserve"> PAGEREF _Toc243168964 \h </w:instrText>
+              <w:instrText xml:space="preserve"> PAGEREF _Toc243296811 \h </w:instrText>
             </w:r>
             <w:r>
               <w:rPr>
@@ -4550,7 +4559,7 @@
               <w14:ligatures w14:val="standardContextual"/>
             </w:rPr>
           </w:pPr>
-          <w:hyperlink w:anchor="_Toc243168965" w:history="1">
+          <w:hyperlink w:anchor="_Toc243296812" w:history="1">
             <w:r>
               <w:rPr>
                 <w:rStyle w:val="Hyperlink"/>
@@ -4574,7 +4583,7 @@
               <w:rPr>
                 <w:noProof/>
               </w:rPr>
-              <w:instrText xml:space="preserve"> PAGEREF _Toc243168965 \h </w:instrText>
+              <w:instrText xml:space="preserve"> PAGEREF _Toc243296812 \h </w:instrText>
             </w:r>
             <w:r>
               <w:rPr>
@@ -4614,7 +4623,7 @@
               <w14:ligatures w14:val="standardContextual"/>
             </w:rPr>
           </w:pPr>
-          <w:hyperlink w:anchor="_Toc243168966" w:history="1">
+          <w:hyperlink w:anchor="_Toc243296813" w:history="1">
             <w:r>
               <w:rPr>
                 <w:rStyle w:val="Hyperlink"/>
@@ -4638,7 +4647,7 @@
               <w:rPr>
                 <w:noProof/>
               </w:rPr>
-              <w:instrText xml:space="preserve"> PAGEREF _Toc243168966 \h </w:instrText>
+              <w:instrText xml:space="preserve"> PAGEREF _Toc243296813 \h </w:instrText>
             </w:r>
             <w:r>
               <w:rPr>
@@ -4678,7 +4687,7 @@
               <w14:ligatures w14:val="standardContextual"/>
             </w:rPr>
           </w:pPr>
-          <w:hyperlink w:anchor="_Toc243168967" w:history="1">
+          <w:hyperlink w:anchor="_Toc243296814" w:history="1">
             <w:r>
               <w:rPr>
                 <w:rStyle w:val="Hyperlink"/>
@@ -4702,7 +4711,7 @@
               <w:rPr>
                 <w:noProof/>
               </w:rPr>
-              <w:instrText xml:space="preserve"> PAGEREF _Toc243168967 \h </w:instrText>
+              <w:instrText xml:space="preserve"> PAGEREF _Toc243296814 \h </w:instrText>
             </w:r>
             <w:r>
               <w:rPr>
@@ -4742,7 +4751,7 @@
               <w14:ligatures w14:val="standardContextual"/>
             </w:rPr>
           </w:pPr>
-          <w:hyperlink w:anchor="_Toc243168968" w:history="1">
+          <w:hyperlink w:anchor="_Toc243296815" w:history="1">
             <w:r>
               <w:rPr>
                 <w:rStyle w:val="Hyperlink"/>
@@ -4766,7 +4775,7 @@
               <w:rPr>
                 <w:noProof/>
               </w:rPr>
-              <w:instrText xml:space="preserve"> PAGEREF _Toc243168968 \h </w:instrText>
+              <w:instrText xml:space="preserve"> PAGEREF _Toc243296815 \h </w:instrText>
             </w:r>
             <w:r>
               <w:rPr>
@@ -4806,7 +4815,7 @@
               <w14:ligatures w14:val="standardContextual"/>
             </w:rPr>
           </w:pPr>
-          <w:hyperlink w:anchor="_Toc243168969" w:history="1">
+          <w:hyperlink w:anchor="_Toc243296816" w:history="1">
             <w:r>
               <w:rPr>
                 <w:rStyle w:val="Hyperlink"/>
@@ -4830,7 +4839,7 @@
               <w:rPr>
                 <w:noProof/>
               </w:rPr>
-              <w:instrText xml:space="preserve"> PAGEREF _Toc243168969 \h </w:instrText>
+              <w:instrText xml:space="preserve"> PAGEREF _Toc243296816 \h </w:instrText>
             </w:r>
             <w:r>
               <w:rPr>
@@ -4870,7 +4879,7 @@
               <w14:ligatures w14:val="standardContextual"/>
             </w:rPr>
           </w:pPr>
-          <w:hyperlink w:anchor="_Toc243168970" w:history="1">
+          <w:hyperlink w:anchor="_Toc243296817" w:history="1">
             <w:r>
               <w:rPr>
                 <w:rStyle w:val="Hyperlink"/>
@@ -4894,7 +4903,7 @@
               <w:rPr>
                 <w:noProof/>
               </w:rPr>
-              <w:instrText xml:space="preserve"> PAGEREF _Toc243168970 \h </w:instrText>
+              <w:instrText xml:space="preserve"> PAGEREF _Toc243296817 \h </w:instrText>
             </w:r>
             <w:r>
               <w:rPr>
@@ -4934,7 +4943,7 @@
               <w14:ligatures w14:val="standardContextual"/>
             </w:rPr>
           </w:pPr>
-          <w:hyperlink w:anchor="_Toc243168971" w:history="1">
+          <w:hyperlink w:anchor="_Toc243296818" w:history="1">
             <w:r>
               <w:rPr>
                 <w:rStyle w:val="Hyperlink"/>
@@ -4958,7 +4967,7 @@
               <w:rPr>
                 <w:noProof/>
               </w:rPr>
-              <w:instrText xml:space="preserve"> PAGEREF _Toc243168971 \h </w:instrText>
+              <w:instrText xml:space="preserve"> PAGEREF _Toc243296818 \h </w:instrText>
             </w:r>
             <w:r>
               <w:rPr>
@@ -4998,7 +5007,7 @@
               <w14:ligatures w14:val="standardContextual"/>
             </w:rPr>
           </w:pPr>
-          <w:hyperlink w:anchor="_Toc243168972" w:history="1">
+          <w:hyperlink w:anchor="_Toc243296819" w:history="1">
             <w:r>
               <w:rPr>
                 <w:rStyle w:val="Hyperlink"/>
@@ -5022,7 +5031,7 @@
               <w:rPr>
                 <w:noProof/>
               </w:rPr>
-              <w:instrText xml:space="preserve"> PAGEREF _Toc243168972 \h </w:instrText>
+              <w:instrText xml:space="preserve"> PAGEREF _Toc243296819 \h </w:instrText>
             </w:r>
             <w:r>
               <w:rPr>
@@ -5064,7 +5073,7 @@
               <w14:ligatures w14:val="standardContextual"/>
             </w:rPr>
           </w:pPr>
-          <w:hyperlink w:anchor="_Toc243168973" w:history="1">
+          <w:hyperlink w:anchor="_Toc243296820" w:history="1">
             <w:r>
               <w:rPr>
                 <w:rStyle w:val="Hyperlink"/>
@@ -5088,7 +5097,7 @@
               <w:rPr>
                 <w:noProof/>
               </w:rPr>
-              <w:instrText xml:space="preserve"> PAGEREF _Toc243168973 \h </w:instrText>
+              <w:instrText xml:space="preserve"> PAGEREF _Toc243296820 \h </w:instrText>
             </w:r>
             <w:r>
               <w:rPr>
@@ -5130,7 +5139,7 @@
               <w14:ligatures w14:val="standardContextual"/>
             </w:rPr>
           </w:pPr>
-          <w:hyperlink w:anchor="_Toc243168974" w:history="1">
+          <w:hyperlink w:anchor="_Toc243296821" w:history="1">
             <w:r>
               <w:rPr>
                 <w:rStyle w:val="Hyperlink"/>
@@ -5154,7 +5163,7 @@
               <w:rPr>
                 <w:noProof/>
               </w:rPr>
-              <w:instrText xml:space="preserve"> PAGEREF _Toc243168974 \h </w:instrText>
+              <w:instrText xml:space="preserve"> PAGEREF _Toc243296821 \h </w:instrText>
             </w:r>
             <w:r>
               <w:rPr>
@@ -5196,7 +5205,7 @@
               <w14:ligatures w14:val="standardContextual"/>
             </w:rPr>
           </w:pPr>
-          <w:hyperlink w:anchor="_Toc243168975" w:history="1">
+          <w:hyperlink w:anchor="_Toc243296822" w:history="1">
             <w:r>
               <w:rPr>
                 <w:rStyle w:val="Hyperlink"/>
@@ -5220,7 +5229,7 @@
               <w:rPr>
                 <w:noProof/>
               </w:rPr>
-              <w:instrText xml:space="preserve"> PAGEREF _Toc243168975 \h </w:instrText>
+              <w:instrText xml:space="preserve"> PAGEREF _Toc243296822 \h </w:instrText>
             </w:r>
             <w:r>
               <w:rPr>
@@ -5262,7 +5271,7 @@
               <w14:ligatures w14:val="standardContextual"/>
             </w:rPr>
           </w:pPr>
-          <w:hyperlink w:anchor="_Toc243168976" w:history="1">
+          <w:hyperlink w:anchor="_Toc243296823" w:history="1">
             <w:r>
               <w:rPr>
                 <w:rStyle w:val="Hyperlink"/>
@@ -5286,7 +5295,7 @@
               <w:rPr>
                 <w:noProof/>
               </w:rPr>
-              <w:instrText xml:space="preserve"> PAGEREF _Toc243168976 \h </w:instrText>
+              <w:instrText xml:space="preserve"> PAGEREF _Toc243296823 \h </w:instrText>
             </w:r>
             <w:r>
               <w:rPr>
@@ -5328,7 +5337,7 @@
               <w14:ligatures w14:val="standardContextual"/>
             </w:rPr>
           </w:pPr>
-          <w:hyperlink w:anchor="_Toc243168977" w:history="1">
+          <w:hyperlink w:anchor="_Toc243296824" w:history="1">
             <w:r>
               <w:rPr>
                 <w:rStyle w:val="Hyperlink"/>
@@ -5352,7 +5361,7 @@
               <w:rPr>
                 <w:noProof/>
               </w:rPr>
-              <w:instrText xml:space="preserve"> PAGEREF _Toc243168977 \h </w:instrText>
+              <w:instrText xml:space="preserve"> PAGEREF _Toc243296824 \h </w:instrText>
             </w:r>
             <w:r>
               <w:rPr>
@@ -5394,7 +5403,7 @@
               <w14:ligatures w14:val="standardContextual"/>
             </w:rPr>
           </w:pPr>
-          <w:hyperlink w:anchor="_Toc243168978" w:history="1">
+          <w:hyperlink w:anchor="_Toc243296825" w:history="1">
             <w:r>
               <w:rPr>
                 <w:rStyle w:val="Hyperlink"/>
@@ -5418,7 +5427,7 @@
               <w:rPr>
                 <w:noProof/>
               </w:rPr>
-              <w:instrText xml:space="preserve"> PAGEREF _Toc243168978 \h </w:instrText>
+              <w:instrText xml:space="preserve"> PAGEREF _Toc243296825 \h </w:instrText>
             </w:r>
             <w:r>
               <w:rPr>
@@ -5460,7 +5469,7 @@
               <w14:ligatures w14:val="standardContextual"/>
             </w:rPr>
           </w:pPr>
-          <w:hyperlink w:anchor="_Toc243168979" w:history="1">
+          <w:hyperlink w:anchor="_Toc243296826" w:history="1">
             <w:r>
               <w:rPr>
                 <w:rStyle w:val="Hyperlink"/>
@@ -5484,7 +5493,7 @@
               <w:rPr>
                 <w:noProof/>
               </w:rPr>
-              <w:instrText xml:space="preserve"> PAGEREF _Toc243168979 \h </w:instrText>
+              <w:instrText xml:space="preserve"> PAGEREF _Toc243296826 \h </w:instrText>
             </w:r>
             <w:r>
               <w:rPr>
@@ -5533,8 +5542,9 @@
       <w:pPr>
         <w:pStyle w:val="Ttulo1"/>
       </w:pPr>
-      <w:bookmarkStart w:id="0" w:name="_Toc243168934"/>
-      <w:r>
+      <w:bookmarkStart w:id="0" w:name="_Toc243296781"/>
+      <w:r>
+        <w:lastRenderedPageBreak/>
         <w:t>1 INTRODUÇÃO</w:t>
       </w:r>
       <w:bookmarkEnd w:id="0"/>
@@ -5605,8 +5615,9 @@
       <w:pPr>
         <w:pStyle w:val="Ttulo2"/>
       </w:pPr>
-      <w:bookmarkStart w:id="1" w:name="_Toc243168935"/>
-      <w:r>
+      <w:bookmarkStart w:id="1" w:name="_Toc243296782"/>
+      <w:r>
+        <w:lastRenderedPageBreak/>
         <w:t>1.1 OBJETIVOS</w:t>
       </w:r>
       <w:bookmarkEnd w:id="1"/>
@@ -5615,7 +5626,7 @@
       <w:pPr>
         <w:pStyle w:val="Ttulo3"/>
       </w:pPr>
-      <w:bookmarkStart w:id="2" w:name="_Toc243168936"/>
+      <w:bookmarkStart w:id="2" w:name="_Toc243296783"/>
       <w:r>
         <w:t>1.1.1 Objetivo geral</w:t>
       </w:r>
@@ -5634,7 +5645,7 @@
       <w:pPr>
         <w:pStyle w:val="Ttulo3"/>
       </w:pPr>
-      <w:bookmarkStart w:id="3" w:name="_Toc243168937"/>
+      <w:bookmarkStart w:id="3" w:name="_Toc243296784"/>
       <w:r>
         <w:t>1.1.2 Objetivos específicos</w:t>
       </w:r>
@@ -5742,7 +5753,7 @@
       <w:pPr>
         <w:pStyle w:val="Ttulo2"/>
       </w:pPr>
-      <w:bookmarkStart w:id="4" w:name="_Toc243168938"/>
+      <w:bookmarkStart w:id="4" w:name="_Toc243296785"/>
       <w:r>
         <w:t>1.2 ORGANIZAÇÃO DO RELATÓRIO</w:t>
       </w:r>
@@ -5754,15 +5765,20 @@
         <w:jc w:val="both"/>
       </w:pPr>
       <w:r>
-        <w:t>A seção 2 apresenta a fundamentação teórica; a seção 3 descreve materiais e métodos; a seção 4 reúne os resultados — a primeira versão do software, a avaliação formativa, a evolução posterior e a avaliação da aprendizagem; a seção 5 compara o que foi feito com a proposta e discute as decisões de projeto e as limitações; e a seção 6 traz as considerações finais.</w:t>
+        <w:t xml:space="preserve">A seção 2 apresenta a fundamentação teórica; a seção 3 descreve materiais e métodos; a seção 4 reúne os resultados — a primeira versão do software, a avaliação formativa, a evolução posterior e a avaliação da aprendizagem; a seção 5 compara o </w:t>
+      </w:r>
+      <w:r>
+        <w:lastRenderedPageBreak/>
+        <w:t>que foi feito com a proposta e discute as decisões de projeto e as limitações; e a seção 6 traz as considerações finais.</w:t>
       </w:r>
     </w:p>
     <w:p>
       <w:pPr>
         <w:pStyle w:val="Ttulo1"/>
       </w:pPr>
-      <w:bookmarkStart w:id="5" w:name="_Toc243168939"/>
-      <w:r>
+      <w:bookmarkStart w:id="5" w:name="_Toc243296786"/>
+      <w:r>
+        <w:lastRenderedPageBreak/>
         <w:t>2 FUNDAMENTAÇÃO TEÓRICA</w:t>
       </w:r>
       <w:bookmarkEnd w:id="5"/>
@@ -5780,7 +5796,7 @@
       <w:pPr>
         <w:pStyle w:val="Ttulo2"/>
       </w:pPr>
-      <w:bookmarkStart w:id="6" w:name="_Toc243168940"/>
+      <w:bookmarkStart w:id="6" w:name="_Toc243296787"/>
       <w:r>
         <w:t>2.1 MARCADORES BIOQUÍMICOS NO DIAGNÓSTICO CLÍNICO</w:t>
       </w:r>
@@ -5812,7 +5828,7 @@
       <w:pPr>
         <w:pStyle w:val="LegendaABNT"/>
       </w:pPr>
-      <w:bookmarkStart w:id="7" w:name="_Toc243168992"/>
+      <w:bookmarkStart w:id="7" w:name="_Toc243296839"/>
       <w:r>
         <w:t xml:space="preserve">Quadro </w:t>
       </w:r>
@@ -6350,7 +6366,7 @@
       <w:pPr>
         <w:pStyle w:val="Ttulo2"/>
       </w:pPr>
-      <w:bookmarkStart w:id="8" w:name="_Toc243168941"/>
+      <w:bookmarkStart w:id="8" w:name="_Toc243296788"/>
       <w:r>
         <w:t>2.2 PRÁTICA DE RECUPERAÇÃO E REPETIÇÃO ESPAÇADA</w:t>
       </w:r>
@@ -6362,10 +6378,11 @@
         <w:jc w:val="both"/>
       </w:pPr>
       <w:r>
-        <w:t>Roediger e Karpicke (2006) compararam estudantes que, depois de ler textos, fizeram testes de recordação livre com estudantes que releram o material o mesmo número de vezes. No teste final aplicado cinco minutos depois, a releitura levou vantagem; após dois dias e após uma semana, quem havia sido testado lembrou substancialmente mais — embora a releitura tivesse aumentado a confiança dos estudantes em sua memória. O teste, portanto, não apenas mede a aprendizagem: também a produz. Nas profissões da saúde, a</w:t>
-      </w:r>
-      <w:r>
-        <w:t xml:space="preserve"> prática de recuperação foi amplamente adotada, sobretudo na preparação para provas, mas ainda encontra barreiras à adoção pelos próprios estudantes (Serra </w:t>
+        <w:t xml:space="preserve">Roediger e Karpicke (2006) compararam estudantes que, depois de ler textos, fizeram testes de recordação livre com estudantes que releram o material o mesmo </w:t>
+      </w:r>
+      <w:r>
+        <w:lastRenderedPageBreak/>
+        <w:t xml:space="preserve">número de vezes. No teste final aplicado cinco minutos depois, a releitura levou vantagem; após dois dias e após uma semana, quem havia sido testado lembrou substancialmente mais — embora a releitura tivesse aumentado a confiança dos estudantes em sua memória. O teste, portanto, não apenas mede a aprendizagem: também a produz. Nas profissões da saúde, a prática de recuperação foi amplamente adotada, sobretudo na preparação para provas, mas ainda encontra barreiras à adoção pelos próprios estudantes (Serra </w:t>
       </w:r>
       <w:r>
         <w:rPr>
@@ -6430,7 +6447,7 @@
       <w:pPr>
         <w:pStyle w:val="Ttulo2"/>
       </w:pPr>
-      <w:bookmarkStart w:id="9" w:name="_Toc243168942"/>
+      <w:bookmarkStart w:id="9" w:name="_Toc243296789"/>
       <w:r>
         <w:t>2.3 O ALGORITMO SM-2</w:t>
       </w:r>
@@ -6499,6 +6516,7 @@
         <w:jc w:val="both"/>
       </w:pPr>
       <w:r>
+        <w:lastRenderedPageBreak/>
         <w:t>Com nota 4 o fator não muda; com nota 5 aumenta 0,1; com nota 3 diminui 0,14; e com nota 0 diminui 0,8. Notas abaixo de 3 indicam falha: as repetições do item recomeçam do início, sem alterar o EF. Ao final de cada sessão diária, o algoritmo original ainda manda repetir todos os itens que receberam nota inferior a 4, até que cada um alcance essa nota (Wozniak, 1990). O BioquímicaEDU parte dessas regras com três adaptações, descritas na seção 4.2.</w:t>
       </w:r>
     </w:p>
@@ -6506,7 +6524,7 @@
       <w:pPr>
         <w:pStyle w:val="Ttulo2"/>
       </w:pPr>
-      <w:bookmarkStart w:id="10" w:name="_Toc243168943"/>
+      <w:bookmarkStart w:id="10" w:name="_Toc243296790"/>
       <w:r>
         <w:t>2.4 GAMIFICAÇÃO E MOTIVAÇÃO</w:t>
       </w:r>
@@ -6584,7 +6602,7 @@
       <w:pPr>
         <w:pStyle w:val="Ttulo2"/>
       </w:pPr>
-      <w:bookmarkStart w:id="11" w:name="_Toc243168944"/>
+      <w:bookmarkStart w:id="11" w:name="_Toc243296791"/>
       <w:r>
         <w:t>2.5 METACOGNIÇÃO E CALIBRAÇÃO</w:t>
       </w:r>
@@ -6596,7 +6614,11 @@
         <w:jc w:val="both"/>
       </w:pPr>
       <w:r>
-        <w:t xml:space="preserve">Calibração é a correspondência entre o desempenho que a pessoa julga ter e o desempenho real. Kruger e Dunning (1999) mostraram que participantes no quartil inferior de testes de gramática, lógica e humor se situavam, em média, no 12º percentil, mas se estimavam no 62º. A má calibração também é estável: estudantes de baixo desempenho mantiveram previsões de nota otimistas, e a confiança nelas, ao longo de quatro provas de um semestre (Karaca </w:t>
+        <w:t xml:space="preserve">Calibração é a correspondência entre o desempenho que a pessoa julga ter e o desempenho real. Kruger e Dunning (1999) mostraram que participantes no quartil </w:t>
+      </w:r>
+      <w:r>
+        <w:lastRenderedPageBreak/>
+        <w:t xml:space="preserve">inferior de testes de gramática, lógica e humor se situavam, em média, no 12º percentil, mas se estimavam no 62º. A má calibração também é estável: estudantes de baixo desempenho mantiveram previsões de nota otimistas, e a confiança nelas, ao longo de quatro provas de um semestre (Karaca </w:t>
       </w:r>
       <w:r>
         <w:rPr>
@@ -6632,8 +6654,9 @@
       <w:pPr>
         <w:pStyle w:val="Ttulo1"/>
       </w:pPr>
-      <w:bookmarkStart w:id="12" w:name="_Toc243168945"/>
-      <w:r>
+      <w:bookmarkStart w:id="12" w:name="_Toc243296792"/>
+      <w:r>
+        <w:lastRenderedPageBreak/>
         <w:t>3 MATERIAIS E MÉTODOS</w:t>
       </w:r>
       <w:bookmarkEnd w:id="12"/>
@@ -6642,7 +6665,7 @@
       <w:pPr>
         <w:pStyle w:val="Ttulo2"/>
       </w:pPr>
-      <w:bookmarkStart w:id="13" w:name="_Toc243168946"/>
+      <w:bookmarkStart w:id="13" w:name="_Toc243296793"/>
       <w:r>
         <w:t>3.1 NATUREZA DA PESQUISA E ETAPAS</w:t>
       </w:r>
@@ -6779,7 +6802,7 @@
       <w:pPr>
         <w:pStyle w:val="Ttulo2"/>
       </w:pPr>
-      <w:bookmarkStart w:id="14" w:name="_Toc243168947"/>
+      <w:bookmarkStart w:id="14" w:name="_Toc243296794"/>
       <w:r>
         <w:t>3.2 CURADORIA DO CONTEÚDO</w:t>
       </w:r>
@@ -6810,6 +6833,7 @@
         <w:jc w:val="both"/>
       </w:pPr>
       <w:r>
+        <w:lastRenderedPageBreak/>
         <w:t xml:space="preserve">Cada marcador foi associado a capítulos do StatPearls e do </w:t>
       </w:r>
       <w:r>
@@ -6840,7 +6864,7 @@
       <w:pPr>
         <w:pStyle w:val="Ttulo2"/>
       </w:pPr>
-      <w:bookmarkStart w:id="15" w:name="_Toc243168948"/>
+      <w:bookmarkStart w:id="15" w:name="_Toc243296795"/>
       <w:r>
         <w:t>3.3 TECNOLOGIAS UTILIZADAS</w:t>
       </w:r>
@@ -6853,14 +6877,18 @@
         <w:jc w:val="both"/>
       </w:pPr>
       <w:r>
-        <w:t>O software foi escrito em Python (Python Software Foundation, 2023), escolhido por permitir compartilhar o mesmo motor de aprendizagem e os mesmos dados entre as interfaces para computador e para celular. O Quadro 2 lista as tecnologias empregadas.</w:t>
+        <w:t xml:space="preserve">O software foi escrito em Python (Python Software Foundation, 2023), escolhido por permitir compartilhar o mesmo motor de aprendizagem e os mesmos </w:t>
+      </w:r>
+      <w:r>
+        <w:lastRenderedPageBreak/>
+        <w:t>dados entre as interfaces para computador e para celular. O Quadro 2 lista as tecnologias empregadas.</w:t>
       </w:r>
     </w:p>
     <w:p>
       <w:pPr>
         <w:pStyle w:val="LegendaABNT"/>
       </w:pPr>
-      <w:bookmarkStart w:id="16" w:name="_Toc243168993"/>
+      <w:bookmarkStart w:id="16" w:name="_Toc243296840"/>
       <w:r>
         <w:t xml:space="preserve">Quadro </w:t>
       </w:r>
@@ -8410,7 +8438,7 @@
       <w:pPr>
         <w:pStyle w:val="Ttulo2"/>
       </w:pPr>
-      <w:bookmarkStart w:id="17" w:name="_Toc243168949"/>
+      <w:bookmarkStart w:id="17" w:name="_Toc243296796"/>
       <w:r>
         <w:t>3.4 ARQUITETURA DO SOFTWARE</w:t>
       </w:r>
@@ -8423,14 +8451,18 @@
         <w:jc w:val="both"/>
       </w:pPr>
       <w:r>
-        <w:t>O software foi organizado em três camadas (Figura 1). Na camada de interfaces estão as três versões; no núcleo, o motor de aprendizagem e o tutor; e na camada de dados, o conteúdo, apenas lido, e o progresso do estudante, lido e gravado pelo motor. Como o motor não depende de nenhuma interface, as mesmas regras de agendamento valem no computador e no celular.</w:t>
+        <w:t xml:space="preserve">O software foi organizado em três camadas (Figura 1). Na camada de interfaces estão as três versões; no núcleo, o motor de aprendizagem e o tutor; e na camada de dados, o conteúdo, apenas lido, e o progresso do estudante, lido e gravado pelo motor. </w:t>
+      </w:r>
+      <w:r>
+        <w:lastRenderedPageBreak/>
+        <w:t>Como o motor não depende de nenhuma interface, as mesmas regras de agendamento valem no computador e no celular.</w:t>
       </w:r>
     </w:p>
     <w:p>
       <w:pPr>
         <w:pStyle w:val="LegendaABNT"/>
       </w:pPr>
-      <w:bookmarkStart w:id="18" w:name="_Toc243168980"/>
+      <w:bookmarkStart w:id="18" w:name="_Toc243296827"/>
       <w:r>
         <w:t xml:space="preserve">Figura </w:t>
       </w:r>
@@ -8468,7 +8500,7 @@
           <w:noProof/>
         </w:rPr>
         <w:drawing>
-          <wp:inline distT="0" distB="0" distL="0" distR="0" wp14:anchorId="47D8BCCE" wp14:editId="60CFFBC2">
+          <wp:inline distT="0" distB="0" distL="0" distR="0" wp14:anchorId="004DCBFF" wp14:editId="4397B4BA">
             <wp:extent cx="5762625" cy="3714750"/>
             <wp:effectExtent l="0" t="0" r="0" b="0"/>
             <wp:docPr id="1" name="arquitetura.png" descr="Arquitetura do BioquímicaEDU" title="Arquitetura do BioquímicaEDU"/>
@@ -8531,7 +8563,7 @@
       <w:pPr>
         <w:pStyle w:val="Ttulo2"/>
       </w:pPr>
-      <w:bookmarkStart w:id="19" w:name="_Toc243168950"/>
+      <w:bookmarkStart w:id="19" w:name="_Toc243296797"/>
       <w:r>
         <w:t>3.5 VERIFICAÇÃO DO SOFTWARE</w:t>
       </w:r>
@@ -8553,7 +8585,11 @@
         <w:t>flashcards</w:t>
       </w:r>
       <w:r>
-        <w:t>, um quiz inteiro, um caso clínico, os dois jogos, a calculadora da TFGe e o tutor, conferindo ao final se o painel inicial reflete a sessão; ele roda nos formatos de celular e de computador e confere também os recursos de acessibilidade e a troca de formato ao redimensionar a janela. Outros testes cobrem as versões clássicas para computador, as regras dos jogos, o tutor em nuvem (seção 4.7.5), o login com Google, com o serviço simulado, e o próprio conteúdo: a presença de todos os marcadores da proposta, c</w:t>
+        <w:t xml:space="preserve">, um quiz inteiro, um caso clínico, os dois jogos, a calculadora da TFGe e o tutor, conferindo </w:t>
+      </w:r>
+      <w:r>
+        <w:lastRenderedPageBreak/>
+        <w:t>ao final se o painel inicial reflete a sessão; ele roda nos formatos de celular e de computador e confere também os recursos de acessibilidade e a troca de formato ao redimensionar a janela. Outros testes cobrem as versões clássicas para computador, as regras dos jogos, o tutor em nuvem (seção 4.7.5), o login com Google, com o serviço simulado, e o próprio conteúdo: a presença de todos os marcadores da proposta, c</w:t>
       </w:r>
       <w:r>
         <w:t>ada um com fontes, exemplos e vídeos; a ausência de caracteres que as fontes do aplicativo não conseguem desenhar; e a calculadora, que deve reproduzir valores da equação CKD-EPI 2021 e os limites das categorias da KDIGO. Os testes gravam numa pasta temporária, de modo que o progresso real do usuário não é lido nem alterado.</w:t>
@@ -8572,7 +8608,7 @@
       <w:pPr>
         <w:pStyle w:val="Ttulo2"/>
       </w:pPr>
-      <w:bookmarkStart w:id="20" w:name="_Toc243168951"/>
+      <w:bookmarkStart w:id="20" w:name="_Toc243296798"/>
       <w:r>
         <w:t>3.6 AVALIAÇÃO COM USUÁRIOS</w:t>
       </w:r>
@@ -8591,7 +8627,7 @@
       <w:pPr>
         <w:pStyle w:val="Ttulo3"/>
       </w:pPr>
-      <w:bookmarkStart w:id="21" w:name="_Toc243168952"/>
+      <w:bookmarkStart w:id="21" w:name="_Toc243296799"/>
       <w:r>
         <w:t>3.6.1 Avaliação formativa</w:t>
       </w:r>
@@ -8606,14 +8642,18 @@
         <w:t>Durante o desenvolvimento, o software foi apresentado a 12 pessoas em conversas online, a maioria pelo Microsoft Teams e algumas pelo Zoom: dois profissionais que atuam na área e se formaram há bastante tempo; cinco recém-formados, em mestrado ou já trabalhando; e cinco estudantes, dos quais alguns já haviam cursado a disciplina, outros a cursavam e outros ainda iriam cursá-la. Em cada conversa, o autor mostrava o aplicativo funcionando, perguntava o que a pessoa queria ver ou testar e conversava sobre as d</w:t>
       </w:r>
       <w:r>
-        <w:t>úvidas, as dificuldades e as sugestões que surgiam. Não houve questionário nem roteiro fixo: o objetivo era encontrar problemas e prioridades enquanto o software ainda podia mudar, e não medir a satisfação com um produto acabado.</w:t>
+        <w:t xml:space="preserve">úvidas, as dificuldades e as sugestões que surgiam. Não houve questionário nem roteiro fixo: o objetivo era encontrar </w:t>
+      </w:r>
+      <w:r>
+        <w:lastRenderedPageBreak/>
+        <w:t>problemas e prioridades enquanto o software ainda podia mudar, e não medir a satisfação com um produto acabado.</w:t>
       </w:r>
     </w:p>
     <w:p>
       <w:pPr>
         <w:pStyle w:val="Ttulo3"/>
       </w:pPr>
-      <w:bookmarkStart w:id="22" w:name="_Toc243168953"/>
+      <w:bookmarkStart w:id="22" w:name="_Toc243296800"/>
       <w:r>
         <w:t>3.6.2 Pré-teste e pós-teste</w:t>
       </w:r>
@@ -8659,7 +8699,7 @@
       <w:pPr>
         <w:pStyle w:val="Ttulo3"/>
       </w:pPr>
-      <w:bookmarkStart w:id="23" w:name="_Toc243168954"/>
+      <w:bookmarkStart w:id="23" w:name="_Toc243296801"/>
       <w:r>
         <w:t>3.6.3 Questionário de opinião</w:t>
       </w:r>
@@ -8671,17 +8711,18 @@
         <w:jc w:val="both"/>
       </w:pPr>
       <w:r>
-        <w:t>Quem já cursou a disciplina ou é formado avalia o aplicativo por um questionário com perfil em poucas categorias, afirmações numa escala de 1 (discordo totalmente) a 5 (concordo totalmente) — facilidade de uso, clareza e confiabilidade do conteúdo, qualidade das imagens e utilidade da revisão espaçada, dos casos clínicos, dos jogos, do tutor e da acessibilidade — e três perguntas abertas (Apêndice D). As afirmações são resumidas pela mediana e pelo número de respostas 4 ou 5, e os comentários, agrupados por</w:t>
-      </w:r>
-      <w:r>
-        <w:t xml:space="preserve"> tema.</w:t>
+        <w:t xml:space="preserve">Quem já cursou a disciplina ou é formado avalia o aplicativo por um questionário com perfil em poucas categorias, afirmações numa escala de 1 (discordo totalmente) a 5 (concordo totalmente) — facilidade de uso, clareza e confiabilidade do conteúdo, qualidade das imagens e utilidade da revisão espaçada, dos casos clínicos, dos jogos, </w:t>
+      </w:r>
+      <w:r>
+        <w:lastRenderedPageBreak/>
+        <w:t>do tutor e da acessibilidade — e três perguntas abertas (Apêndice D). As afirmações são resumidas pela mediana e pelo número de respostas 4 ou 5, e os comentários, agrupados por tema.</w:t>
       </w:r>
     </w:p>
     <w:p>
       <w:pPr>
         <w:pStyle w:val="Ttulo3"/>
       </w:pPr>
-      <w:bookmarkStart w:id="24" w:name="_Toc243168955"/>
+      <w:bookmarkStart w:id="24" w:name="_Toc243296802"/>
       <w:r>
         <w:t>3.6.4 Aspectos éticos e proteção de dados</w:t>
       </w:r>
@@ -8718,7 +8759,7 @@
       <w:pPr>
         <w:pStyle w:val="Ttulo2"/>
       </w:pPr>
-      <w:bookmarkStart w:id="25" w:name="_Toc243168956"/>
+      <w:bookmarkStart w:id="25" w:name="_Toc243296803"/>
       <w:r>
         <w:t>3.7 USO DE FERRAMENTAS DE INTELIGÊNCIA ARTIFICIAL</w:t>
       </w:r>
@@ -8743,8 +8784,9 @@
       <w:pPr>
         <w:pStyle w:val="Ttulo1"/>
       </w:pPr>
-      <w:bookmarkStart w:id="26" w:name="_Toc243168957"/>
-      <w:r>
+      <w:bookmarkStart w:id="26" w:name="_Toc243296804"/>
+      <w:r>
+        <w:lastRenderedPageBreak/>
         <w:t>4 RESULTADOS</w:t>
       </w:r>
       <w:bookmarkEnd w:id="26"/>
@@ -8753,7 +8795,7 @@
       <w:pPr>
         <w:pStyle w:val="Ttulo2"/>
       </w:pPr>
-      <w:bookmarkStart w:id="27" w:name="_Toc243168958"/>
+      <w:bookmarkStart w:id="27" w:name="_Toc243296805"/>
       <w:r>
         <w:t>4.1 VISÃO GERAL DO SOFTWARE</w:t>
       </w:r>
@@ -8773,7 +8815,7 @@
       <w:pPr>
         <w:pStyle w:val="LegendaABNT"/>
       </w:pPr>
-      <w:bookmarkStart w:id="28" w:name="_Toc243168994"/>
+      <w:bookmarkStart w:id="28" w:name="_Toc243296841"/>
       <w:r>
         <w:t xml:space="preserve">Quadro </w:t>
       </w:r>
@@ -9260,7 +9302,7 @@
       <w:pPr>
         <w:pStyle w:val="LegendaABNT"/>
       </w:pPr>
-      <w:bookmarkStart w:id="29" w:name="_Toc243168999"/>
+      <w:bookmarkStart w:id="29" w:name="_Toc243296846"/>
       <w:r>
         <w:t xml:space="preserve">Tabela </w:t>
       </w:r>
@@ -10640,8 +10682,9 @@
       <w:pPr>
         <w:pStyle w:val="LegendaABNT"/>
       </w:pPr>
-      <w:bookmarkStart w:id="30" w:name="_Toc243169000"/>
-      <w:r>
+      <w:bookmarkStart w:id="30" w:name="_Toc243296847"/>
+      <w:r>
+        <w:lastRenderedPageBreak/>
         <w:t xml:space="preserve">Tabela </w:t>
       </w:r>
       <w:r>
@@ -11327,7 +11370,7 @@
       <w:pPr>
         <w:pStyle w:val="Ttulo2"/>
       </w:pPr>
-      <w:bookmarkStart w:id="31" w:name="_Toc243168959"/>
+      <w:bookmarkStart w:id="31" w:name="_Toc243296806"/>
       <w:r>
         <w:t>4.2 MOTOR DE APRENDIZAGEM</w:t>
       </w:r>
@@ -11352,6 +11395,7 @@
         <w:jc w:val="both"/>
       </w:pPr>
       <w:r>
+        <w:lastRenderedPageBreak/>
         <w:t>O Quadro 4 descreve as três adaptações feitas ao SM-2 original.</w:t>
       </w:r>
     </w:p>
@@ -11359,7 +11403,7 @@
       <w:pPr>
         <w:pStyle w:val="LegendaABNT"/>
       </w:pPr>
-      <w:bookmarkStart w:id="32" w:name="_Toc243168995"/>
+      <w:bookmarkStart w:id="32" w:name="_Toc243296842"/>
       <w:r>
         <w:t xml:space="preserve">Quadro </w:t>
       </w:r>
@@ -11957,7 +12001,7 @@
       <w:pPr>
         <w:pStyle w:val="LegendaABNT"/>
       </w:pPr>
-      <w:bookmarkStart w:id="33" w:name="_Toc243168981"/>
+      <w:bookmarkStart w:id="33" w:name="_Toc243296828"/>
       <w:r>
         <w:t xml:space="preserve">Figura </w:t>
       </w:r>
@@ -11995,7 +12039,7 @@
           <w:noProof/>
         </w:rPr>
         <w:drawing>
-          <wp:inline distT="0" distB="0" distL="0" distR="0" wp14:anchorId="25FA21E9" wp14:editId="07F3B8B8">
+          <wp:inline distT="0" distB="0" distL="0" distR="0" wp14:anchorId="2DFD1B2A" wp14:editId="6207E915">
             <wp:extent cx="5400675" cy="2971800"/>
             <wp:effectExtent l="0" t="0" r="0" b="0"/>
             <wp:docPr id="2" name="sm2_intervalos.png" descr="Intervalos calculados pelo motor em três sequências de respostas" title="Intervalos calculados pelo motor em três sequências de respostas"/>
@@ -12049,14 +12093,18 @@
         <w:jc w:val="both"/>
       </w:pPr>
       <w:r>
-        <w:t>As demais atividades também alimentam o agendamento, com as notas da Tabela 3. Para isso, o motor identifica a quais marcadores cada questão ou caso se refere, procurando no texto as siglas, os nomes e apelidos comuns (“troponina” para troponina I, por exemplo). Siglas que também são palavras do português, como “Na”, só contam na forma iônica (Na+); assim, uma frase iniciada por “Na hepatite…” não altera o agendamento do sódio. Quando nada é identificado, nada é registrado.</w:t>
+        <w:t xml:space="preserve">As demais atividades também alimentam o agendamento, com as notas da Tabela 3. Para isso, o motor identifica a quais marcadores cada questão ou caso se </w:t>
+      </w:r>
+      <w:r>
+        <w:lastRenderedPageBreak/>
+        <w:t>refere, procurando no texto as siglas, os nomes e apelidos comuns (“troponina” para troponina I, por exemplo). Siglas que também são palavras do português, como “Na”, só contam na forma iônica (Na+); assim, uma frase iniciada por “Na hepatite…” não altera o agendamento do sódio. Quando nada é identificado, nada é registrado.</w:t>
       </w:r>
     </w:p>
     <w:p>
       <w:pPr>
         <w:pStyle w:val="LegendaABNT"/>
       </w:pPr>
-      <w:bookmarkStart w:id="34" w:name="_Toc243169001"/>
+      <w:bookmarkStart w:id="34" w:name="_Toc243296848"/>
       <w:r>
         <w:t xml:space="preserve">Tabela </w:t>
       </w:r>
@@ -12876,6 +12924,7 @@
         <w:jc w:val="both"/>
       </w:pPr>
       <w:r>
+        <w:lastRenderedPageBreak/>
         <w:t>Por fim, o painel mostra a sequência de dias de estudo e sete marcos, todos ligados à aprendizagem e não ao tempo de uso: primeiro estudo, todos os marcadores estudados, primeira retenção, 10 marcadores consolidados, metade consolidada, sete dias seguidos de estudo e confiança alinhada ao desempenho. A sequência é contada a partir do dia anterior quando o estudante ainda não estudou no dia corrente, para informar sem punir.</w:t>
       </w:r>
     </w:p>
@@ -12883,7 +12932,7 @@
       <w:pPr>
         <w:pStyle w:val="Ttulo2"/>
       </w:pPr>
-      <w:bookmarkStart w:id="35" w:name="_Toc243168960"/>
+      <w:bookmarkStart w:id="35" w:name="_Toc243296807"/>
       <w:r>
         <w:t>4.3 VERSÃO PARA DISPOSITIVOS MÓVEIS</w:t>
       </w:r>
@@ -12903,7 +12952,7 @@
       <w:pPr>
         <w:pStyle w:val="LegendaABNT"/>
       </w:pPr>
-      <w:bookmarkStart w:id="36" w:name="_Toc243168982"/>
+      <w:bookmarkStart w:id="36" w:name="_Toc243296829"/>
       <w:r>
         <w:t xml:space="preserve">Figura </w:t>
       </w:r>
@@ -12941,7 +12990,7 @@
           <w:noProof/>
         </w:rPr>
         <w:drawing>
-          <wp:inline distT="0" distB="0" distL="0" distR="0" wp14:anchorId="2C0232DA" wp14:editId="6B659E06">
+          <wp:inline distT="0" distB="0" distL="0" distR="0" wp14:anchorId="6485A7C3" wp14:editId="7681DB92">
             <wp:extent cx="5762625" cy="4086225"/>
             <wp:effectExtent l="0" t="0" r="0" b="0"/>
             <wp:docPr id="3" name="telas_inicio_estudo.png" descr="Início e estudo na versão móvel" title="Início e estudo na versão móvel"/>
@@ -13004,6 +13053,7 @@
         <w:jc w:val="both"/>
       </w:pPr>
       <w:r>
+        <w:lastRenderedPageBreak/>
         <w:t>A tela inicial responde primeiro à pergunta “o que estudar agora?”: o cartão em destaque mostra a revisão do dia e o tempo estimado. Abaixo vêm os atalhos para as atividades, o estado da memória, os marcadores mais frágeis, o domínio por sistema, a autoavaliação, a constância das últimas quatro semanas e os marcos. No detalhe de cada marcador (Figura 3c), as abas reúnem visão geral, exemplos clínicos, diagramas, fontes e vídeos.</w:t>
       </w:r>
     </w:p>
@@ -13011,7 +13061,7 @@
       <w:pPr>
         <w:pStyle w:val="LegendaABNT"/>
       </w:pPr>
-      <w:bookmarkStart w:id="37" w:name="_Toc243168983"/>
+      <w:bookmarkStart w:id="37" w:name="_Toc243296830"/>
       <w:r>
         <w:t xml:space="preserve">Figura </w:t>
       </w:r>
@@ -13059,7 +13109,7 @@
           <w:noProof/>
         </w:rPr>
         <w:drawing>
-          <wp:inline distT="0" distB="0" distL="0" distR="0" wp14:anchorId="346C3B4D" wp14:editId="372BBAD6">
+          <wp:inline distT="0" distB="0" distL="0" distR="0" wp14:anchorId="6ED17A47" wp14:editId="754CFAF0">
             <wp:extent cx="5762625" cy="4086225"/>
             <wp:effectExtent l="0" t="0" r="0" b="0"/>
             <wp:docPr id="4" name="telas_revisao.png" descr="Revisão espaçada e flashcards na versão móvel" title="Revisão espaçada e flashcards na versão móvel"/>
@@ -13149,8 +13199,9 @@
       <w:pPr>
         <w:pStyle w:val="LegendaABNT"/>
       </w:pPr>
-      <w:bookmarkStart w:id="38" w:name="_Toc243168984"/>
-      <w:r>
+      <w:bookmarkStart w:id="38" w:name="_Toc243296831"/>
+      <w:r>
+        <w:lastRenderedPageBreak/>
         <w:t xml:space="preserve">Figura </w:t>
       </w:r>
       <w:r>
@@ -13187,7 +13238,7 @@
           <w:noProof/>
         </w:rPr>
         <w:drawing>
-          <wp:inline distT="0" distB="0" distL="0" distR="0" wp14:anchorId="23AB709F" wp14:editId="030C452E">
+          <wp:inline distT="0" distB="0" distL="0" distR="0" wp14:anchorId="2543C0DA" wp14:editId="334A21D2">
             <wp:extent cx="5762625" cy="4086225"/>
             <wp:effectExtent l="0" t="0" r="0" b="0"/>
             <wp:docPr id="5" name="telas_pratica_tutor.png" descr="Prática e tutor na versão móvel" title="Prática e tutor na versão móvel"/>
@@ -13289,8 +13340,9 @@
       <w:pPr>
         <w:pStyle w:val="Ttulo2"/>
       </w:pPr>
-      <w:bookmarkStart w:id="39" w:name="_Toc243168961"/>
-      <w:r>
+      <w:bookmarkStart w:id="39" w:name="_Toc243296808"/>
+      <w:r>
+        <w:lastRenderedPageBreak/>
         <w:t>4.4 VERSÕES PARA COMPUTADOR</w:t>
       </w:r>
       <w:bookmarkEnd w:id="39"/>
@@ -13309,7 +13361,7 @@
       <w:pPr>
         <w:pStyle w:val="LegendaABNT"/>
       </w:pPr>
-      <w:bookmarkStart w:id="40" w:name="_Toc243168985"/>
+      <w:bookmarkStart w:id="40" w:name="_Toc243296832"/>
       <w:r>
         <w:t xml:space="preserve">Figura </w:t>
       </w:r>
@@ -13347,7 +13399,7 @@
           <w:noProof/>
         </w:rPr>
         <w:drawing>
-          <wp:inline distT="0" distB="0" distL="0" distR="0" wp14:anchorId="08C698C8" wp14:editId="45DFE46F">
+          <wp:inline distT="0" distB="0" distL="0" distR="0" wp14:anchorId="3E0038BA" wp14:editId="298CFD55">
             <wp:extent cx="5762625" cy="3981450"/>
             <wp:effectExtent l="0" t="0" r="0" b="0"/>
             <wp:docPr id="6" name="desktop_painel.png" descr="Painel inicial da versão para computador" title="Painel inicial da versão para computador"/>
@@ -13407,7 +13459,7 @@
       <w:pPr>
         <w:pStyle w:val="Ttulo2"/>
       </w:pPr>
-      <w:bookmarkStart w:id="41" w:name="_Toc243168962"/>
+      <w:bookmarkStart w:id="41" w:name="_Toc243296809"/>
       <w:r>
         <w:t>4.5 IDENTIDADE VISUAL</w:t>
       </w:r>
@@ -13420,14 +13472,18 @@
         <w:jc w:val="both"/>
       </w:pPr>
       <w:r>
-        <w:t>A logo combina um hexágono, que remete ao anel benzênico e à química, com uma gota, que remete à amostra de sangue de onde vêm os marcadores (Figura 7). Ela é gerada por um programa a partir de uma única geometria, que produz arquivos vetoriais (SVG), com o texto convertido em contornos, e imagens PNG, nas variações horizontal, vertical, símbolo e negativa. O ícone e a tela de abertura do aplicativo usam o mesmo símbolo.</w:t>
+        <w:t xml:space="preserve">A logo combina um hexágono, que remete ao anel benzênico e à química, com uma gota, que remete à amostra de sangue de onde vêm os marcadores (Figura 7). </w:t>
+      </w:r>
+      <w:r>
+        <w:lastRenderedPageBreak/>
+        <w:t>Ela é gerada por um programa a partir de uma única geometria, que produz arquivos vetoriais (SVG), com o texto convertido em contornos, e imagens PNG, nas variações horizontal, vertical, símbolo e negativa. O ícone e a tela de abertura do aplicativo usam o mesmo símbolo.</w:t>
       </w:r>
     </w:p>
     <w:p>
       <w:pPr>
         <w:pStyle w:val="LegendaABNT"/>
       </w:pPr>
-      <w:bookmarkStart w:id="42" w:name="_Toc243168986"/>
+      <w:bookmarkStart w:id="42" w:name="_Toc243296833"/>
       <w:r>
         <w:t xml:space="preserve">Figura </w:t>
       </w:r>
@@ -13465,7 +13521,7 @@
           <w:noProof/>
         </w:rPr>
         <w:drawing>
-          <wp:inline distT="0" distB="0" distL="0" distR="0" wp14:anchorId="394B5480" wp14:editId="19F5896B">
+          <wp:inline distT="0" distB="0" distL="0" distR="0" wp14:anchorId="20DF5D7A" wp14:editId="3411E29E">
             <wp:extent cx="3600450" cy="866775"/>
             <wp:effectExtent l="0" t="0" r="0" b="0"/>
             <wp:docPr id="7" name="horizontal.png" descr="Logo do BioquímicaEDU" title="Logo do BioquímicaEDU"/>
@@ -13516,7 +13572,7 @@
       <w:pPr>
         <w:pStyle w:val="Ttulo2"/>
       </w:pPr>
-      <w:bookmarkStart w:id="43" w:name="_Toc243168963"/>
+      <w:bookmarkStart w:id="43" w:name="_Toc243296810"/>
       <w:r>
         <w:t>4.6 AVALIAÇÃO FORMATIVA</w:t>
       </w:r>
@@ -13547,7 +13603,7 @@
       <w:pPr>
         <w:pStyle w:val="Ttulo2"/>
       </w:pPr>
-      <w:bookmarkStart w:id="44" w:name="_Toc243168964"/>
+      <w:bookmarkStart w:id="44" w:name="_Toc243296811"/>
       <w:r>
         <w:t>4.7 EVOLUÇÃO DO SOFTWARE</w:t>
       </w:r>
@@ -13559,17 +13615,21 @@
         <w:jc w:val="both"/>
       </w:pPr>
       <w:r>
-        <w:t xml:space="preserve">Depois da primeira versão, o software continuou a ser desenvolvido, orientado pelas sugestões da avaliação formativa e por uma conferência, item por item, da proposta do projeto, que mostrou o que ainda faltava: dois marcadores, as frações da bilirrubina, os jogos didáticos e uma visualização gráfica interativa. As mudanças são descritas aqui, separadas das seções 4.1 a 4.5, para que se distinga o que existia na primeira versão do que veio depois. Além dos itens da proposta, foram tratados os intervalos da </w:t>
-      </w:r>
-      <w:r>
-        <w:t>revisão, que não diferenciavam de imediato as avaliações “Difícil”, “Bom” e “Fácil”; a existência de uma interface diferente para cada aparelho; a acessibilidade, que ainda não havia sido tratada de forma sistemática; o tutor, que passou a contar, como opção, com um modelo de linguagem em nuvem; a entrada no aplicativo, com conta Google opcional; e a distribuição, com site e instaladores. Com essas mudanças, o código-fonte passou de 7.905 para 13.571 linhas não vazias, excluídos os comentários.</w:t>
+        <w:t xml:space="preserve">Depois da primeira versão, o software continuou a ser desenvolvido, orientado pelas sugestões da avaliação formativa e por uma conferência, item por item, da proposta do projeto, que mostrou o que ainda faltava: dois marcadores, as frações da bilirrubina, os jogos didáticos e uma visualização gráfica interativa. As mudanças são descritas aqui, separadas das seções 4.1 a 4.5, para que se distinga o que existia na </w:t>
+      </w:r>
+      <w:r>
+        <w:lastRenderedPageBreak/>
+        <w:t>primeira versão do que veio depois. Além dos itens da proposta, foram tratados os intervalos da revisão, que não diferenciavam de imediato as avaliações “Difícil”, “Bom” e “Fácil”; a existência de uma interface diferente para cada aparelho; a acessibilidade, que ainda não havia sido tratada de forma sistemática; o tutor, que passou a contar, como opção, com um modelo de linguagem em nuvem; a entrada no aplicativo, com conta Google opcional; e a distribuição, com site e instaladores. Com essas mudanças, o có</w:t>
+      </w:r>
+      <w:r>
+        <w:t>digo-fonte passou de 7.905 para 13.571 linhas não vazias, excluídos os comentários.</w:t>
       </w:r>
     </w:p>
     <w:p>
       <w:pPr>
         <w:pStyle w:val="Ttulo3"/>
       </w:pPr>
-      <w:bookmarkStart w:id="45" w:name="_Toc243168965"/>
+      <w:bookmarkStart w:id="45" w:name="_Toc243296812"/>
       <w:r>
         <w:t>4.7.1 Itens da proposta: novos marcadores, jogos e régua das faixas</w:t>
       </w:r>
@@ -13607,7 +13667,11 @@
         <w:t>Os jogos didáticos ganharam uma seção própria na aba Prática e um atalho na tela inicial (Figura 8). No primeiro, “Alto, normal ou baixo?”, o estudante vê o valor de um marcador e o classifica em relação à faixa de referência, em dez rodadas. Os valores são sorteados dentro de faixas plausíveis para cada classe, e alterações sem sentido clínico — como uma troponina abaixo do normal — não são sorteadas. Cada acerto vale 10 pontos, com bônus por acertos seguidos; a faixa pode ser consultada como dica, mas ent</w:t>
       </w:r>
       <w:r>
-        <w:t>ão o acerto vale metade; e um relógio opcional dá 15 segundos por rodada. O retorno mostra a régua da faixa com o valor marcado e a interpretação da alteração. As respostas dadas sem dica também alimentam o agendamento das revisões, com as notas do quiz (Tabela 3), porque nelas o estudante recuperou a faixa da memória. No segundo jogo, de memória, o estudante forma seis pares entre um marcador e o órgão ou sistema que ele avalia, e cada par formado traz uma explicação curta. Os dois jogos dão até três estre</w:t>
+        <w:t xml:space="preserve">ão o acerto vale metade; e um relógio opcional dá 15 segundos por rodada. O retorno mostra a régua da faixa com o valor marcado e a interpretação da alteração. As respostas dadas sem dica também alimentam o agendamento das revisões, com as notas do quiz (Tabela 3), porque nelas o estudante recuperou a faixa da memória. No segundo jogo, de memória, o estudante forma seis pares entre um </w:t>
+      </w:r>
+      <w:r>
+        <w:lastRenderedPageBreak/>
+        <w:t>marcador e o órgão ou sistema que ele avalia, e cada par formado traz uma explicação curta. Os dois jogos dão até três estre</w:t>
       </w:r>
       <w:r>
         <w:t>las conforme o desempenho e guardam o recorde do próprio estudante, sem classificação entre estudantes (seção 2.4).</w:t>
@@ -13617,7 +13681,7 @@
       <w:pPr>
         <w:pStyle w:val="LegendaABNT"/>
       </w:pPr>
-      <w:bookmarkStart w:id="46" w:name="_Toc243168987"/>
+      <w:bookmarkStart w:id="46" w:name="_Toc243296834"/>
       <w:r>
         <w:t xml:space="preserve">Figura </w:t>
       </w:r>
@@ -13655,7 +13719,7 @@
           <w:noProof/>
         </w:rPr>
         <w:drawing>
-          <wp:inline distT="0" distB="0" distL="0" distR="0" wp14:anchorId="7BA59C51" wp14:editId="1B6AD673">
+          <wp:inline distT="0" distB="0" distL="0" distR="0" wp14:anchorId="2D2FA450" wp14:editId="17BF4D88">
             <wp:extent cx="5762625" cy="4086225"/>
             <wp:effectExtent l="0" t="0" r="0" b="0"/>
             <wp:docPr id="8" name="evolucao_jogos.png" descr="Jogos didáticos e calculadora da TFG estimada na versão para celular" title="Jogos didáticos e calculadora da TFG estimada na versão para celular"/>
@@ -13728,8 +13792,9 @@
       <w:pPr>
         <w:pStyle w:val="Ttulo3"/>
       </w:pPr>
-      <w:bookmarkStart w:id="47" w:name="_Toc243168966"/>
-      <w:r>
+      <w:bookmarkStart w:id="47" w:name="_Toc243296813"/>
+      <w:r>
+        <w:lastRenderedPageBreak/>
         <w:t>4.7.2 Intervalos da revisão</w:t>
       </w:r>
       <w:bookmarkEnd w:id="47"/>
@@ -13751,7 +13816,7 @@
       <w:pPr>
         <w:pStyle w:val="LegendaABNT"/>
       </w:pPr>
-      <w:bookmarkStart w:id="48" w:name="_Toc243169002"/>
+      <w:bookmarkStart w:id="48" w:name="_Toc243296849"/>
       <w:r>
         <w:t xml:space="preserve">Tabela </w:t>
       </w:r>
@@ -14330,7 +14395,7 @@
       <w:pPr>
         <w:pStyle w:val="Ttulo3"/>
       </w:pPr>
-      <w:bookmarkStart w:id="49" w:name="_Toc243168967"/>
+      <w:bookmarkStart w:id="49" w:name="_Toc243296814"/>
       <w:r>
         <w:t>4.7.3 Um aplicativo para celular, tablet e computador</w:t>
       </w:r>
@@ -14343,17 +14408,18 @@
         <w:jc w:val="both"/>
       </w:pPr>
       <w:r>
-        <w:t>Na primeira versão, o computador tinha duas interfaces em Tkinter, e o celular, uma em Kivy (Quadro 3), o que obrigava a manter interfaces separadas para o mesmo conteúdo, com aparência e recursos diferentes entre os aparelhos. Como a interface em Kivy também roda no computador, ela passou a ser a única: o comando python main.py abre o mesmo aplicativo no computador, e as versões em Tkinter continuam disponíveis pela opção --classico. Para isso, a interface passou a se adaptar à largura da janela, medida em</w:t>
-      </w:r>
-      <w:r>
-        <w:t xml:space="preserve"> pixels independentes de densidade (dp), unidade que mantém o tamanho físico aproximado dos elementos em telas de densidades diferentes. As faixas seguem as classes de tamanho de janela recomendadas para o Android (Android Developers, [2026b]), como resume o Quadro 5.</w:t>
+        <w:t xml:space="preserve">Na primeira versão, o computador tinha duas interfaces em Tkinter, e o celular, uma em Kivy (Quadro 3), o que obrigava a manter interfaces separadas para o mesmo conteúdo, com aparência e recursos diferentes entre os aparelhos. Como a interface em Kivy também roda no computador, ela passou a ser a única: o comando python main.py abre o mesmo aplicativo no computador, e as versões em Tkinter continuam </w:t>
+      </w:r>
+      <w:r>
+        <w:lastRenderedPageBreak/>
+        <w:t>disponíveis pela opção --classico. Para isso, a interface passou a se adaptar à largura da janela, medida em pixels independentes de densidade (dp), unidade que mantém o tamanho físico aproximado dos elementos em telas de densidades diferentes. As faixas seguem as classes de tamanho de janela recomendadas para o Android (Android Developers, [2026b]), como resume o Quadro 5.</w:t>
       </w:r>
     </w:p>
     <w:p>
       <w:pPr>
         <w:pStyle w:val="LegendaABNT"/>
       </w:pPr>
-      <w:bookmarkStart w:id="50" w:name="_Toc243168996"/>
+      <w:bookmarkStart w:id="50" w:name="_Toc243296843"/>
       <w:r>
         <w:t xml:space="preserve">Quadro </w:t>
       </w:r>
@@ -15096,14 +15162,18 @@
         <w:t>Os formatos se complementam no uso. O agendamento espaçado pede sessões curtas e frequentes, que cabem no celular, em qualquer intervalo do dia; o computador e o tablet favorecem o estudo mais longo — a leitura do detalhe de cada marcador, os casos clínicos e as conversas com o tutor —, com mais informação visível ao mesmo tempo. Como o conteúdo, o motor de aprendizagem e a interface são os mesmos, o estudante encontra as mesmas telas e as mesmas regras em qualquer aparelho. Cada aparelho, porém, guarda o p</w:t>
       </w:r>
       <w:r>
-        <w:t>róprio progresso; a sincronização pela conta Google fica como trabalho futuro (seção 4.7.6). A Figura 9 mostra o aplicativo nos três formatos.</w:t>
+        <w:t xml:space="preserve">róprio progresso; a </w:t>
+      </w:r>
+      <w:r>
+        <w:lastRenderedPageBreak/>
+        <w:t>sincronização pela conta Google fica como trabalho futuro (seção 4.7.6). A Figura 9 mostra o aplicativo nos três formatos.</w:t>
       </w:r>
     </w:p>
     <w:p>
       <w:pPr>
         <w:pStyle w:val="LegendaABNT"/>
       </w:pPr>
-      <w:bookmarkStart w:id="51" w:name="_Toc243168988"/>
+      <w:bookmarkStart w:id="51" w:name="_Toc243296835"/>
       <w:r>
         <w:t xml:space="preserve">Figura </w:t>
       </w:r>
@@ -15141,7 +15211,7 @@
           <w:noProof/>
         </w:rPr>
         <w:drawing>
-          <wp:inline distT="0" distB="0" distL="0" distR="0" wp14:anchorId="6CB1B98A" wp14:editId="7927D313">
+          <wp:inline distT="0" distB="0" distL="0" distR="0" wp14:anchorId="210E244A" wp14:editId="3692E21B">
             <wp:extent cx="5762625" cy="7219950"/>
             <wp:effectExtent l="0" t="0" r="0" b="0"/>
             <wp:docPr id="9" name="evolucao_formatos.png" descr="O mesmo aplicativo no computador, no tablet e no celular" title="O mesmo aplicativo no computador, no tablet e no celular"/>
@@ -15202,8 +15272,9 @@
       <w:pPr>
         <w:pStyle w:val="Ttulo3"/>
       </w:pPr>
-      <w:bookmarkStart w:id="52" w:name="_Toc243168968"/>
-      <w:r>
+      <w:bookmarkStart w:id="52" w:name="_Toc243296815"/>
+      <w:r>
+        <w:lastRenderedPageBreak/>
         <w:t>4.7.4 Acessibilidade</w:t>
       </w:r>
       <w:bookmarkEnd w:id="52"/>
@@ -15303,8 +15374,9 @@
       <w:pPr>
         <w:pStyle w:val="LegendaABNT"/>
       </w:pPr>
-      <w:bookmarkStart w:id="53" w:name="_Toc243168989"/>
-      <w:r>
+      <w:bookmarkStart w:id="53" w:name="_Toc243296836"/>
+      <w:r>
+        <w:lastRenderedPageBreak/>
         <w:t xml:space="preserve">Figura </w:t>
       </w:r>
       <w:r>
@@ -15341,7 +15413,7 @@
           <w:noProof/>
         </w:rPr>
         <w:drawing>
-          <wp:inline distT="0" distB="0" distL="0" distR="0" wp14:anchorId="07D96822" wp14:editId="3A7C86F1">
+          <wp:inline distT="0" distB="0" distL="0" distR="0" wp14:anchorId="3BF8FAA1" wp14:editId="59B3BDA4">
             <wp:extent cx="5762625" cy="4086225"/>
             <wp:effectExtent l="0" t="0" r="0" b="0"/>
             <wp:docPr id="10" name="evolucao_acessibilidade.png" descr="Recursos de acessibilidade na versão para celular" title="Recursos de acessibilidade na versão para celular"/>
@@ -15414,7 +15486,7 @@
       <w:pPr>
         <w:pStyle w:val="Ttulo3"/>
       </w:pPr>
-      <w:bookmarkStart w:id="54" w:name="_Toc243168969"/>
+      <w:bookmarkStart w:id="54" w:name="_Toc243296816"/>
       <w:r>
         <w:t>4.7.5 Tutor com inteligência artificial generativa</w:t>
       </w:r>
@@ -15427,17 +15499,18 @@
         <w:jc w:val="both"/>
       </w:pPr>
       <w:r>
-        <w:t>Na primeira versão, o tutor do celular respondia apenas pela base do aplicativo, e o do computador podia usar um modelo de linguagem local, executado com o Ollama (seção 4.4). Modelos locais, porém, não rodam no celular e, nos tamanhos que cabem num computador comum, tendem a responder mais devagar e com qualidade inferior à de modelos maiores. O tutor passou a aceitar, como opção, o Gemini, modelo de linguagem do Google acessado pela internet (Google, [2026b]). Os provedores de resposta são tentados em ord</w:t>
-      </w:r>
-      <w:r>
-        <w:t>em — Gemini, modelo local e base do aplicativo —, e a base, que sempre responde, é a reserva de todos (Figura 11).</w:t>
+        <w:t xml:space="preserve">Na primeira versão, o tutor do celular respondia apenas pela base do aplicativo, e o do computador podia usar um modelo de linguagem local, executado com o Ollama </w:t>
+      </w:r>
+      <w:r>
+        <w:lastRenderedPageBreak/>
+        <w:t>(seção 4.4). Modelos locais, porém, não rodam no celular e, nos tamanhos que cabem num computador comum, tendem a responder mais devagar e com qualidade inferior à de modelos maiores. O tutor passou a aceitar, como opção, o Gemini, modelo de linguagem do Google acessado pela internet (Google, [2026b]). Os provedores de resposta são tentados em ordem — Gemini, modelo local e base do aplicativo —, e a base, que sempre responde, é a reserva de todos (Figura 11).</w:t>
       </w:r>
     </w:p>
     <w:p>
       <w:pPr>
         <w:pStyle w:val="LegendaABNT"/>
       </w:pPr>
-      <w:bookmarkStart w:id="55" w:name="_Toc243168990"/>
+      <w:bookmarkStart w:id="55" w:name="_Toc243296837"/>
       <w:r>
         <w:t xml:space="preserve">Figura </w:t>
       </w:r>
@@ -15475,7 +15548,7 @@
           <w:noProof/>
         </w:rPr>
         <w:drawing>
-          <wp:inline distT="0" distB="0" distL="0" distR="0" wp14:anchorId="565193EE" wp14:editId="12A4FD23">
+          <wp:inline distT="0" distB="0" distL="0" distR="0" wp14:anchorId="5F7F1D89" wp14:editId="2A9CEC42">
             <wp:extent cx="5762625" cy="2933700"/>
             <wp:effectExtent l="0" t="0" r="0" b="0"/>
             <wp:docPr id="11" name="tutor_arquitetura.png" descr="Provedores de resposta do tutor e local da chave de acesso" title="Provedores de resposta do tutor e local da chave de acesso"/>
@@ -15540,10 +15613,11 @@
         <w:jc w:val="both"/>
       </w:pPr>
       <w:r>
-        <w:t>A chave de acesso à API do Gemini dá acesso à conta de quem a criou e, por isso, não fica no código-fonte nem nos pacotes do aplicativo, de onde poderia ser extraída. Quem roda o aplicativo a partir do código pode usar a própria chave, lida de um arquivo local excluído do controle de versões; o instalador para Windows e o celular não têm chave e enviam a pergunta a um servidor intermediário, executado no Cloudflare Workers, que guarda a chave como segredo e aplica a mesma instrução fixa (Cloudflare, [2026])</w:t>
-      </w:r>
-      <w:r>
-        <w:t>. Só são aceitas conexões criptografadas (HTTPS).</w:t>
+        <w:t xml:space="preserve">A chave de acesso à API do Gemini dá acesso à conta de quem a criou e, por isso, não fica no código-fonte nem nos pacotes do aplicativo, de onde poderia ser extraída. Quem roda o aplicativo a partir do código pode usar a própria chave, lida de um arquivo local excluído do controle de versões; o instalador para Windows e o </w:t>
+      </w:r>
+      <w:r>
+        <w:lastRenderedPageBreak/>
+        <w:t>celular não têm chave e enviam a pergunta a um servidor intermediário, executado no Cloudflare Workers, que guarda a chave como segredo e aplica a mesma instrução fixa (Cloudflare, [2026]). Só são aceitas conexões criptografadas (HTTPS).</w:t>
       </w:r>
     </w:p>
     <w:p>
@@ -15574,14 +15648,18 @@
         <w:jc w:val="both"/>
       </w:pPr>
       <w:r>
-        <w:t>Esse comportamento é verificado por um programa de testes que substitui a conexão com o Google por uma simulada: ele confere o conteúdo enviado, a leitura das respostas, cada tipo de falha, as novas tentativas, a troca para o modelo de reserva, o tempo limite, o caminho pelo servidor, a igualdade entre as instruções do aplicativo e do servidor e a ausência de chaves de API nos arquivos do projeto. A Figura 12 mostra uma conversa real com o tutor.</w:t>
+        <w:t xml:space="preserve">Esse comportamento é verificado por um programa de testes que substitui a conexão com o Google por uma simulada: ele confere o conteúdo enviado, a leitura das respostas, cada tipo de falha, as novas tentativas, a troca para o modelo de reserva, o tempo limite, o caminho pelo servidor, a igualdade entre as instruções do </w:t>
+      </w:r>
+      <w:r>
+        <w:lastRenderedPageBreak/>
+        <w:t>aplicativo e do servidor e a ausência de chaves de API nos arquivos do projeto. A Figura 12 mostra uma conversa real com o tutor.</w:t>
       </w:r>
     </w:p>
     <w:p>
       <w:pPr>
         <w:pStyle w:val="LegendaABNT"/>
       </w:pPr>
-      <w:bookmarkStart w:id="56" w:name="_Toc243168991"/>
+      <w:bookmarkStart w:id="56" w:name="_Toc243296838"/>
       <w:r>
         <w:t xml:space="preserve">Figura </w:t>
       </w:r>
@@ -15619,7 +15697,7 @@
           <w:noProof/>
         </w:rPr>
         <w:drawing>
-          <wp:inline distT="0" distB="0" distL="0" distR="0" wp14:anchorId="5E8FDBDD" wp14:editId="4FF2974F">
+          <wp:inline distT="0" distB="0" distL="0" distR="0" wp14:anchorId="6120717F" wp14:editId="34AF06F4">
             <wp:extent cx="5762625" cy="4086225"/>
             <wp:effectExtent l="0" t="0" r="0" b="0"/>
             <wp:docPr id="12" name="evolucao_tutor.png" descr="Conversa com o tutor usando o Gemini na versão para celular" title="Conversa com o tutor usando o Gemini na versão para celular"/>
@@ -15680,7 +15758,7 @@
       <w:pPr>
         <w:pStyle w:val="Ttulo3"/>
       </w:pPr>
-      <w:bookmarkStart w:id="57" w:name="_Toc243168970"/>
+      <w:bookmarkStart w:id="57" w:name="_Toc243296817"/>
       <w:r>
         <w:t>4.7.6 Abertura, conta Google opcional e apresentação</w:t>
       </w:r>
@@ -15695,7 +15773,11 @@
         <w:t>O aplicativo ganhou uma tela de abertura com a logo, exibida enquanto o conteúdo e o progresso são carregados, que, se a leitura dos dados falhar, explica o problema e oferece nova tentativa. No primeiro acesso, o estudante escolhe entrar com a conta Google ou continuar sem conta; em seguida, vê uma apresentação de três passos, que termina nos ajustes de acessibilidade. O login usa o Firebase Authentication, do Google: no computador, pela página de login do Google no navegador, e no Android, pelo seletor de</w:t>
       </w:r>
       <w:r>
-        <w:t xml:space="preserve"> contas do próprio sistema. A conta guarda apenas se o estudante já viu a apresentação, para que ela não se repita ao trocar de aparelho; o progresso de estudo continua no aparelho, e as regras do banco de dados só permitem a cada estudante ler e gravar o próprio registro. No Windows, a sessão fica gravada de forma cifrada pelo próprio sistema. A identidade visual também foi completada com as variações de que um aplicativo precisa, como o ícone adaptativo do Android, que se ajusta ao formato de ícone de cad</w:t>
+        <w:t xml:space="preserve"> contas do próprio sistema. A conta guarda apenas se o estudante já viu a apresentação, para que ela não se repita ao trocar de aparelho; o progresso de estudo continua no aparelho, e as regras do banco de dados </w:t>
+      </w:r>
+      <w:r>
+        <w:lastRenderedPageBreak/>
+        <w:t>só permitem a cada estudante ler e gravar o próprio registro. No Windows, a sessão fica gravada de forma cifrada pelo próprio sistema. A identidade visual também foi completada com as variações de que um aplicativo precisa, como o ícone adaptativo do Android, que se ajusta ao formato de ícone de cad</w:t>
       </w:r>
       <w:r>
         <w:t>a aparelho.</w:t>
@@ -15705,7 +15787,7 @@
       <w:pPr>
         <w:pStyle w:val="Ttulo3"/>
       </w:pPr>
-      <w:bookmarkStart w:id="58" w:name="_Toc243168971"/>
+      <w:bookmarkStart w:id="58" w:name="_Toc243296818"/>
       <w:r>
         <w:t>4.7.7 Site e instaladores</w:t>
       </w:r>
@@ -15739,25 +15821,7 @@
         <w:t>O pacote para Android (APK) é gerado no GitHub Actions, num computador Linux do próprio GitHub, porque o Buildozer não roda no Windows. Ele é gerado para processadores de 64 bits (arm64-v8a), os dos celulares e tablets atuais e os exigidos pela Google Play, e é assinado sempre com a mesma chave, guardada fora do repositório: o Android só atualiza um aplicativo assinado pela mesma chave, e o login com Google confere a impressão digital (SHA-1) dela. Nenhum dos dois pacotes contém a chave do Gemini nem o prog</w:t>
       </w:r>
       <w:r>
-        <w:t xml:space="preserve">resso e as preferências de quem os gerou: o empacotamento os exclui, e os arquivos internos de cada pacote foram conferidos. Ambos usam o servidor intermediário da seção 4.7.5. O APK foi testado num celular Samsung Galaxy S20 FE 5G, com Android </w:t>
-      </w:r>
-      <w:r>
-        <w:rPr>
-          <w:highlight w:val="yellow"/>
-        </w:rPr>
-        <w:t>[CONFIRMAR: versão]</w:t>
-      </w:r>
-      <w:r>
-        <w:t xml:space="preserve">, e num tablet </w:t>
-      </w:r>
-      <w:r>
-        <w:rPr>
-          <w:highlight w:val="yellow"/>
-        </w:rPr>
-        <w:t>[CONFIRMAR: modelo]</w:t>
-      </w:r>
-      <w:r>
-        <w:t xml:space="preserve"> com Android 10, em pé e deitado: a disposição das telas, o quiz, os jogos, o tutor com Gemini, os vídeos e as referências, o atalho para Libras e o alto contraste funcionaram. </w:t>
+        <w:t xml:space="preserve">resso e as preferências de quem os gerou: o empacotamento os exclui, e os arquivos internos de cada pacote foram conferidos. Ambos usam o servidor intermediário da seção 4.7.5. O APK foi testado num celular Samsung Galaxy S20 FE 5G, com Android 13, e num tablet Samsung Galaxy Tab S4, com Android 10, em pé e deitado: a disposição das telas, o quiz, os jogos, o tutor com Gemini, os vídeos e as referências, o atalho para Libras e o alto contraste funcionaram. </w:t>
       </w:r>
       <w:r>
         <w:rPr>
@@ -15770,8 +15834,9 @@
       <w:pPr>
         <w:pStyle w:val="Ttulo2"/>
       </w:pPr>
-      <w:bookmarkStart w:id="59" w:name="_Toc243168972"/>
-      <w:r>
+      <w:bookmarkStart w:id="59" w:name="_Toc243296819"/>
+      <w:r>
+        <w:lastRenderedPageBreak/>
         <w:t>4.8 AVALIAÇÃO DA APRENDIZAGEM</w:t>
       </w:r>
       <w:bookmarkEnd w:id="59"/>
@@ -15793,7 +15858,7 @@
       <w:pPr>
         <w:pStyle w:val="LegendaABNT"/>
       </w:pPr>
-      <w:bookmarkStart w:id="60" w:name="_Toc243169003"/>
+      <w:bookmarkStart w:id="60" w:name="_Toc243296850"/>
       <w:r>
         <w:t xml:space="preserve">Tabela </w:t>
       </w:r>
@@ -16407,8 +16472,9 @@
       <w:pPr>
         <w:pStyle w:val="Ttulo1"/>
       </w:pPr>
-      <w:bookmarkStart w:id="61" w:name="_Toc243168973"/>
-      <w:r>
+      <w:bookmarkStart w:id="61" w:name="_Toc243296820"/>
+      <w:r>
+        <w:lastRenderedPageBreak/>
         <w:t>5 DISCUSSÃO</w:t>
       </w:r>
       <w:bookmarkEnd w:id="61"/>
@@ -16427,7 +16493,7 @@
       <w:pPr>
         <w:pStyle w:val="LegendaABNT"/>
       </w:pPr>
-      <w:bookmarkStart w:id="62" w:name="_Toc243168997"/>
+      <w:bookmarkStart w:id="62" w:name="_Toc243296844"/>
       <w:r>
         <w:t xml:space="preserve">Quadro </w:t>
       </w:r>
@@ -17401,10 +17467,11 @@
         <w:jc w:val="both"/>
       </w:pPr>
       <w:r>
-        <w:t>As mudanças de tecnologia tiveram motivo prático. O Tkinter não roda no Android, e o PyQt5 exigiria uma cadeia de empacotamento própria para o celular; o Kivy, também em Python, roda no Android, no Windows e em outros sistemas com o mesmo código, o que permitiu chegar a um único aplicativo. O Pandas foi dispensado porque a base, com algumas dezenas de linhas, é lida em poucos comandos pela biblioteca padrão, e uma dependência a menos reduz o tamanho dos instaladores; o SQLite também não foi necessário, porq</w:t>
-      </w:r>
-      <w:r>
-        <w:t>ue o conteúdo é apenas lido e o progresso do estudante cabe num arquivo JSON. Por fim, a fundamentação teórica foi construída com fontes cujo acesso pôde ser conferido nas bases de origem, pelo DOI ou pelo endereço do capítulo.</w:t>
+        <w:t xml:space="preserve">As mudanças de tecnologia tiveram motivo prático. O Tkinter não roda no Android, e o PyQt5 exigiria uma cadeia de empacotamento própria para o celular; o Kivy, também em Python, roda no Android, no Windows e em outros sistemas com o mesmo código, o que permitiu chegar a um único aplicativo. O Pandas foi dispensado </w:t>
+      </w:r>
+      <w:r>
+        <w:lastRenderedPageBreak/>
+        <w:t>porque a base, com algumas dezenas de linhas, é lida em poucos comandos pela biblioteca padrão, e uma dependência a menos reduz o tamanho dos instaladores; o SQLite também não foi necessário, porque o conteúdo é apenas lido e o progresso do estudante cabe num arquivo JSON. Por fim, a fundamentação teórica foi construída com fontes cujo acesso pôde ser conferido nas bases de origem, pelo DOI ou pelo endereço do capítulo.</w:t>
       </w:r>
     </w:p>
     <w:p>
@@ -17480,7 +17547,11 @@
         <w:t>et al.</w:t>
       </w:r>
       <w:r>
-        <w:t xml:space="preserve">, 2019). Como a má calibração de estudantes de baixo desempenho se mostrou estável mesmo diante de notas anteriores (Karaca </w:t>
+        <w:t xml:space="preserve">, 2019). Como a má calibração de estudantes de baixo desempenho se mostrou estável </w:t>
+      </w:r>
+      <w:r>
+        <w:lastRenderedPageBreak/>
+        <w:t xml:space="preserve">mesmo diante de notas anteriores (Karaca </w:t>
       </w:r>
       <w:r>
         <w:rPr>
@@ -17535,10 +17606,14 @@
         <w:jc w:val="both"/>
       </w:pPr>
       <w:r>
-        <w:t xml:space="preserve">O trabalho tem limitações. O conteúdo cobre 22 marcadores e não passou por revisão formal de docente da área da saúde, e o banco de 14 questões é pequeno, o que favorece a repetição das mesmas perguntas. As questões geradas pelo modelo de linguagem na versão clássica com tutor não passam por curadoria e podem conter erros. Os diagramas do conteúdo ainda são os da primeira versão, e a melhoria pedida na avaliação formativa não foi feita. A versão para iOS, possível com o Kivy, não foi testada, e os recursos </w:t>
-      </w:r>
-      <w:r>
-        <w:t xml:space="preserve">de acessibilidade não foram avaliados com estudantes com deficiência. Na avaliação, a parte formativa não usou instrumento padronizado nem produziu medidas; o pré-teste e o pós-teste não têm grupo de comparação, repetem as mesmas questões — parte da melhora pode vir de já tê-las visto — e reúnem uma amostra pequena e de conveniência </w:t>
+        <w:t xml:space="preserve">O trabalho tem limitações. O conteúdo cobre 22 marcadores e não passou por revisão formal de docente da área da saúde, e o banco de 14 questões é pequeno, o que favorece a repetição das mesmas perguntas. As questões geradas pelo modelo de linguagem na versão clássica com tutor não passam por curadoria e podem conter </w:t>
+      </w:r>
+      <w:r>
+        <w:lastRenderedPageBreak/>
+        <w:t>erros. Os diagramas do conteúdo ainda são os da primeira versão, e a melhoria pedida na avaliação formativa não foi feita. A versão para iOS, possível com o Kivy, não foi testada, e os recursos de acessibilidade não foram avaliados com estudantes com deficiência. Na avaliação, a parte formativa não usou instrumento padronizado nem produziu medidas; o pré-teste e o pós-teste não têm grupo de comparação, repetem as mesmas questões — parte da melhora pode vir de já tê-las visto — e reúnem uma amostra pequena e</w:t>
+      </w:r>
+      <w:r>
+        <w:t xml:space="preserve"> de conveniência </w:t>
       </w:r>
       <w:r>
         <w:rPr>
@@ -17554,8 +17629,9 @@
       <w:pPr>
         <w:pStyle w:val="Ttulo1"/>
       </w:pPr>
-      <w:bookmarkStart w:id="63" w:name="_Toc243168974"/>
-      <w:r>
+      <w:bookmarkStart w:id="63" w:name="_Toc243296821"/>
+      <w:r>
+        <w:lastRenderedPageBreak/>
         <w:t>6 CONSIDERAÇÕES FINAIS</w:t>
       </w:r>
       <w:bookmarkEnd w:id="63"/>
@@ -17624,8 +17700,9 @@
         <w:pStyle w:val="Ttulo1"/>
         <w:jc w:val="center"/>
       </w:pPr>
-      <w:bookmarkStart w:id="64" w:name="_Toc243168975"/>
-      <w:r>
+      <w:bookmarkStart w:id="64" w:name="_Toc243296822"/>
+      <w:r>
+        <w:lastRenderedPageBreak/>
         <w:t>REFERÊNCIAS</w:t>
       </w:r>
       <w:bookmarkEnd w:id="64"/>
@@ -17783,6 +17860,7 @@
         <w:pStyle w:val="RefernciaABNT"/>
       </w:pPr>
       <w:r>
+        <w:lastRenderedPageBreak/>
         <w:t xml:space="preserve">CEPEDA, N. J. et al. Distributed practice in verbal recall tasks: a review and quantitative synthesis. </w:t>
       </w:r>
       <w:r>
@@ -17959,6 +18037,7 @@
         <w:pStyle w:val="RefernciaABNT"/>
       </w:pPr>
       <w:r>
+        <w:lastRenderedPageBreak/>
         <w:t xml:space="preserve">HELAL, I. et al. Glomerular hyperfiltration: definitions, mechanisms and clinical implications. </w:t>
       </w:r>
       <w:r>
@@ -18122,7 +18201,15 @@
           <w:b/>
           <w:bCs/>
         </w:rPr>
-        <w:t>Journal of Personality and Social Psychology</w:t>
+        <w:t xml:space="preserve">Journal of </w:t>
+      </w:r>
+      <w:r>
+        <w:rPr>
+          <w:b/>
+          <w:bCs/>
+        </w:rPr>
+        <w:lastRenderedPageBreak/>
+        <w:t>Personality and Social Psychology</w:t>
       </w:r>
       <w:r>
         <w:t>, [s. l.], v. 77, n. 6, p. 1121-1134, dez. 1999. DOI: https://doi.org/10.1037//0022-3514.77.6.1121.</w:t>
@@ -18273,6 +18360,7 @@
         <w:pStyle w:val="RefernciaABNT"/>
       </w:pPr>
       <w:r>
+        <w:lastRenderedPageBreak/>
         <w:t>PAPPAN, N.; AWOSIKA, A. O.; REHMAN, A. Dyslipidemia. In: STATPEARLS. Treasure Island, FL: StatPearls Publishing, 2024. Disponível em: https://www.ncbi.nlm.nih.gov/books/NBK560891/. Acesso em: 6 out. 2026.</w:t>
       </w:r>
     </w:p>
@@ -18431,7 +18519,11 @@
         <w:t>Clinical methods</w:t>
       </w:r>
       <w:r>
-        <w:t>: the history, physical, and laboratory examinations. 3. ed. Boston: Butterworths, 1990a. Disponível em: https://www.ncbi.nlm.nih.gov/books/NBK203/. Acesso em: 6 out. 2026.</w:t>
+        <w:t xml:space="preserve">: the history, physical, and laboratory examinations. 3. ed. Boston: Butterworths, 1990a. </w:t>
+      </w:r>
+      <w:r>
+        <w:lastRenderedPageBreak/>
+        <w:t>Disponível em: https://www.ncbi.nlm.nih.gov/books/NBK203/. Acesso em: 6 out. 2026.</w:t>
       </w:r>
     </w:p>
     <w:p>
@@ -18501,8 +18593,9 @@
         <w:pStyle w:val="Ttulo1"/>
         <w:jc w:val="center"/>
       </w:pPr>
-      <w:bookmarkStart w:id="65" w:name="_Toc243168976"/>
-      <w:r>
+      <w:bookmarkStart w:id="65" w:name="_Toc243296823"/>
+      <w:r>
+        <w:lastRenderedPageBreak/>
         <w:t>APÊNDICE A – FONTES DO CONTEÚDO POR MARCADOR</w:t>
       </w:r>
       <w:bookmarkEnd w:id="65"/>
@@ -18521,7 +18614,7 @@
       <w:pPr>
         <w:pStyle w:val="LegendaABNT"/>
       </w:pPr>
-      <w:bookmarkStart w:id="66" w:name="_Toc243168998"/>
+      <w:bookmarkStart w:id="66" w:name="_Toc243296845"/>
       <w:r>
         <w:t xml:space="preserve">Quadro </w:t>
       </w:r>
@@ -20896,8 +20989,9 @@
         <w:pStyle w:val="Ttulo1"/>
         <w:jc w:val="center"/>
       </w:pPr>
-      <w:bookmarkStart w:id="67" w:name="_Toc243168977"/>
-      <w:r>
+      <w:bookmarkStart w:id="67" w:name="_Toc243296824"/>
+      <w:r>
+        <w:lastRenderedPageBreak/>
         <w:t>APÊNDICE B – CÓDIGO-FONTE E EXECUÇÃO</w:t>
       </w:r>
       <w:bookmarkEnd w:id="67"/>
@@ -20991,8 +21085,9 @@
         <w:pStyle w:val="Ttulo1"/>
         <w:jc w:val="center"/>
       </w:pPr>
-      <w:bookmarkStart w:id="68" w:name="_Toc243168978"/>
-      <w:r>
+      <w:bookmarkStart w:id="68" w:name="_Toc243296825"/>
+      <w:r>
+        <w:lastRenderedPageBreak/>
         <w:t>APÊNDICE C – QUESTÕES DO PRÉ-TESTE E DO PÓS-TESTE</w:t>
       </w:r>
       <w:bookmarkEnd w:id="68"/>
@@ -21346,6 +21441,7 @@
           <w:b/>
           <w:bCs/>
         </w:rPr>
+        <w:lastRenderedPageBreak/>
         <w:t>Q5.</w:t>
       </w:r>
       <w:r>
@@ -21756,6 +21852,7 @@
           <w:b/>
           <w:bCs/>
         </w:rPr>
+        <w:lastRenderedPageBreak/>
         <w:t>Q10.</w:t>
       </w:r>
       <w:r>
@@ -21832,8 +21929,9 @@
         <w:pStyle w:val="Ttulo1"/>
         <w:jc w:val="center"/>
       </w:pPr>
-      <w:bookmarkStart w:id="69" w:name="_Toc243168979"/>
-      <w:r>
+      <w:bookmarkStart w:id="69" w:name="_Toc243296826"/>
+      <w:r>
+        <w:lastRenderedPageBreak/>
         <w:t>APÊNDICE D – QUESTIONÁRIO DE OPINIÃO</w:t>
       </w:r>
       <w:bookmarkEnd w:id="69"/>
@@ -22178,96 +22276,10 @@
 <file path=word/numbering.xml><?xml version="1.0" encoding="utf-8"?>
 <w:numbering xmlns:wpc="http://schemas.microsoft.com/office/word/2010/wordprocessingCanvas" xmlns:cx="http://schemas.microsoft.com/office/drawing/2014/chartex" xmlns:cx1="http://schemas.microsoft.com/office/drawing/2015/9/8/chartex" xmlns:cx2="http://schemas.microsoft.com/office/drawing/2015/10/21/chartex" xmlns:cx3="http://schemas.microsoft.com/office/drawing/2016/5/9/chartex" xmlns:cx4="http://schemas.microsoft.com/office/drawing/2016/5/10/chartex" xmlns:cx5="http://schemas.microsoft.com/office/drawing/2016/5/11/chartex" xmlns:cx6="http://schemas.microsoft.com/office/drawing/2016/5/12/chartex" xmlns:cx7="http://schemas.microsoft.com/office/drawing/2016/5/13/chartex" xmlns:cx8="http://schemas.microsoft.com/office/drawing/2016/5/14/chartex" xmlns:mc="http://schemas.openxmlformats.org/markup-compatibility/2006" xmlns:aink="http://schemas.microsoft.com/office/drawing/2016/ink" xmlns:am3d="http://schemas.microsoft.com/office/drawing/2017/model3d" xmlns:o="urn:schemas-microsoft-com:office:office" xmlns:oel="http://schemas.microsoft.com/office/2019/extlst" xmlns:r="http://schemas.openxmlformats.org/officeDocument/2006/relationships" xmlns:m="http://schemas.openxmlformats.org/officeDocument/2006/math" xmlns:v="urn:schemas-microsoft-com:vml" xmlns:wp14="http://schemas.microsoft.com/office/word/2010/wordprocessingDrawing" xmlns:wp="http://schemas.openxmlformats.org/drawingml/2006/wordprocessingDrawing" xmlns:w10="urn:schemas-microsoft-com:office:word" xmlns:w="http://schemas.openxmlformats.org/wordprocessingml/2006/main" xmlns:w14="http://schemas.microsoft.com/office/word/2010/wordml" xmlns:w15="http://schemas.microsoft.com/office/word/2012/wordml" xmlns:w16cex="http://schemas.microsoft.com/office/word/2018/wordml/cex" xmlns:w16cid="http://schemas.microsoft.com/office/word/2016/wordml/cid" xmlns:w16="http://schemas.microsoft.com/office/word/2018/wordml" xmlns:w16du="http://schemas.microsoft.com/office/word/2023/wordml/word16du" xmlns:w16sdtdh="http://schemas.microsoft.com/office/word/2020/wordml/sdtdatahash" xmlns:w16sdtfl="http://schemas.microsoft.com/office/word/2024/wordml/sdtformatlock" xmlns:w16se="http://schemas.microsoft.com/office/word/2015/wordml/symex" xmlns:wpg="http://schemas.microsoft.com/office/word/2010/wordprocessingGroup" xmlns:wpi="http://schemas.microsoft.com/office/word/2010/wordprocessingInk" xmlns:wne="http://schemas.microsoft.com/office/word/2006/wordml" xmlns:wps="http://schemas.microsoft.com/office/word/2010/wordprocessingShape" mc:Ignorable="w14 w15 w16se w16cid w16 w16cex w16sdtdh w16sdtfl w16du wp14">
   <w:abstractNum w:abstractNumId="0" w15:restartNumberingAfterBreak="0">
-    <w:nsid w:val="4811023E"/>
+    <w:nsid w:val="19D9408F"/>
     <w:multiLevelType w:val="hybridMultilevel"/>
-    <w:tmpl w:val="91029178"/>
-    <w:lvl w:ilvl="0" w:tplc="388EF0AE" w:tentative="1">
-      <w:start w:val="1"/>
-      <w:numFmt w:val="bullet"/>
-      <w:lvlText w:val="●"/>
-      <w:lvlJc w:val="left"/>
-      <w:pPr>
-        <w:ind w:left="720" w:hanging="360"/>
-      </w:pPr>
-    </w:lvl>
-    <w:lvl w:ilvl="1" w:tplc="EB084D8E" w:tentative="1">
-      <w:start w:val="1"/>
-      <w:numFmt w:val="bullet"/>
-      <w:lvlText w:val="○"/>
-      <w:lvlJc w:val="left"/>
-      <w:pPr>
-        <w:ind w:left="1440" w:hanging="360"/>
-      </w:pPr>
-    </w:lvl>
-    <w:lvl w:ilvl="2" w:tplc="A846FB7C" w:tentative="1">
-      <w:start w:val="1"/>
-      <w:numFmt w:val="bullet"/>
-      <w:lvlText w:val="■"/>
-      <w:lvlJc w:val="left"/>
-      <w:pPr>
-        <w:ind w:left="2160" w:hanging="360"/>
-      </w:pPr>
-    </w:lvl>
-    <w:lvl w:ilvl="3" w:tplc="5C7C8602" w:tentative="1">
-      <w:start w:val="1"/>
-      <w:numFmt w:val="bullet"/>
-      <w:lvlText w:val="●"/>
-      <w:lvlJc w:val="left"/>
-      <w:pPr>
-        <w:ind w:left="2880" w:hanging="360"/>
-      </w:pPr>
-    </w:lvl>
-    <w:lvl w:ilvl="4" w:tplc="A2D429A0" w:tentative="1">
-      <w:start w:val="1"/>
-      <w:numFmt w:val="bullet"/>
-      <w:lvlText w:val="○"/>
-      <w:lvlJc w:val="left"/>
-      <w:pPr>
-        <w:ind w:left="3600" w:hanging="360"/>
-      </w:pPr>
-    </w:lvl>
-    <w:lvl w:ilvl="5" w:tplc="5770E8F4" w:tentative="1">
-      <w:start w:val="1"/>
-      <w:numFmt w:val="bullet"/>
-      <w:lvlText w:val="■"/>
-      <w:lvlJc w:val="left"/>
-      <w:pPr>
-        <w:ind w:left="4320" w:hanging="360"/>
-      </w:pPr>
-    </w:lvl>
-    <w:lvl w:ilvl="6" w:tplc="8D102272" w:tentative="1">
-      <w:start w:val="1"/>
-      <w:numFmt w:val="bullet"/>
-      <w:lvlText w:val="●"/>
-      <w:lvlJc w:val="left"/>
-      <w:pPr>
-        <w:ind w:left="5040" w:hanging="360"/>
-      </w:pPr>
-    </w:lvl>
-    <w:lvl w:ilvl="7" w:tplc="D57ED93A" w:tentative="1">
-      <w:start w:val="1"/>
-      <w:numFmt w:val="bullet"/>
-      <w:lvlText w:val="●"/>
-      <w:lvlJc w:val="left"/>
-      <w:pPr>
-        <w:ind w:left="5760" w:hanging="360"/>
-      </w:pPr>
-    </w:lvl>
-    <w:lvl w:ilvl="8" w:tplc="1AC456AE" w:tentative="1">
-      <w:start w:val="1"/>
-      <w:numFmt w:val="bullet"/>
-      <w:lvlText w:val="●"/>
-      <w:lvlJc w:val="left"/>
-      <w:pPr>
-        <w:ind w:left="6480" w:hanging="360"/>
-      </w:pPr>
-    </w:lvl>
-  </w:abstractNum>
-  <w:abstractNum w:abstractNumId="1" w15:restartNumberingAfterBreak="0">
-    <w:nsid w:val="7A2B0C5B"/>
-    <w:multiLevelType w:val="hybridMultilevel"/>
-    <w:tmpl w:val="607259C6"/>
-    <w:lvl w:ilvl="0" w:tplc="6DB4331A">
+    <w:tmpl w:val="D9F89E34"/>
+    <w:lvl w:ilvl="0" w:tplc="AAA29464">
       <w:start w:val="1"/>
       <w:numFmt w:val="lowerLetter"/>
       <w:lvlText w:val="%1)"/>
@@ -22276,139 +22288,225 @@
         <w:ind w:left="1106" w:hanging="397"/>
       </w:pPr>
     </w:lvl>
-    <w:lvl w:ilvl="1" w:tplc="C504C2C6">
+    <w:lvl w:ilvl="1" w:tplc="44F02D00">
       <w:numFmt w:val="decimal"/>
       <w:lvlText w:val=""/>
       <w:lvlJc w:val="left"/>
     </w:lvl>
-    <w:lvl w:ilvl="2" w:tplc="9A52C812">
+    <w:lvl w:ilvl="2" w:tplc="E5FEE3BC">
       <w:numFmt w:val="decimal"/>
       <w:lvlText w:val=""/>
       <w:lvlJc w:val="left"/>
     </w:lvl>
-    <w:lvl w:ilvl="3" w:tplc="0896B250">
+    <w:lvl w:ilvl="3" w:tplc="3206A18C">
       <w:numFmt w:val="decimal"/>
       <w:lvlText w:val=""/>
       <w:lvlJc w:val="left"/>
     </w:lvl>
-    <w:lvl w:ilvl="4" w:tplc="1CB24E98">
+    <w:lvl w:ilvl="4" w:tplc="F0A222C4">
       <w:numFmt w:val="decimal"/>
       <w:lvlText w:val=""/>
       <w:lvlJc w:val="left"/>
     </w:lvl>
-    <w:lvl w:ilvl="5" w:tplc="AA3C748C">
+    <w:lvl w:ilvl="5" w:tplc="11564D1C">
       <w:numFmt w:val="decimal"/>
       <w:lvlText w:val=""/>
       <w:lvlJc w:val="left"/>
     </w:lvl>
-    <w:lvl w:ilvl="6" w:tplc="80604AEE">
+    <w:lvl w:ilvl="6" w:tplc="9CBA09AA">
       <w:numFmt w:val="decimal"/>
       <w:lvlText w:val=""/>
       <w:lvlJc w:val="left"/>
     </w:lvl>
-    <w:lvl w:ilvl="7" w:tplc="DFF20814">
+    <w:lvl w:ilvl="7" w:tplc="282ECBF8">
       <w:numFmt w:val="decimal"/>
       <w:lvlText w:val=""/>
       <w:lvlJc w:val="left"/>
     </w:lvl>
-    <w:lvl w:ilvl="8" w:tplc="6B5299D2">
+    <w:lvl w:ilvl="8" w:tplc="623AA2AA">
       <w:numFmt w:val="decimal"/>
       <w:lvlText w:val=""/>
       <w:lvlJc w:val="left"/>
     </w:lvl>
   </w:abstractNum>
-  <w:num w:numId="1" w16cid:durableId="597252154">
+  <w:abstractNum w:abstractNumId="1" w15:restartNumberingAfterBreak="0">
+    <w:nsid w:val="321D4202"/>
+    <w:multiLevelType w:val="hybridMultilevel"/>
+    <w:tmpl w:val="CF98786E"/>
+    <w:lvl w:ilvl="0" w:tplc="709A41B4" w:tentative="1">
+      <w:start w:val="1"/>
+      <w:numFmt w:val="bullet"/>
+      <w:lvlText w:val="●"/>
+      <w:lvlJc w:val="left"/>
+      <w:pPr>
+        <w:ind w:left="720" w:hanging="360"/>
+      </w:pPr>
+    </w:lvl>
+    <w:lvl w:ilvl="1" w:tplc="12C4254A" w:tentative="1">
+      <w:start w:val="1"/>
+      <w:numFmt w:val="bullet"/>
+      <w:lvlText w:val="○"/>
+      <w:lvlJc w:val="left"/>
+      <w:pPr>
+        <w:ind w:left="1440" w:hanging="360"/>
+      </w:pPr>
+    </w:lvl>
+    <w:lvl w:ilvl="2" w:tplc="C984457E" w:tentative="1">
+      <w:start w:val="1"/>
+      <w:numFmt w:val="bullet"/>
+      <w:lvlText w:val="■"/>
+      <w:lvlJc w:val="left"/>
+      <w:pPr>
+        <w:ind w:left="2160" w:hanging="360"/>
+      </w:pPr>
+    </w:lvl>
+    <w:lvl w:ilvl="3" w:tplc="3FD40CB6" w:tentative="1">
+      <w:start w:val="1"/>
+      <w:numFmt w:val="bullet"/>
+      <w:lvlText w:val="●"/>
+      <w:lvlJc w:val="left"/>
+      <w:pPr>
+        <w:ind w:left="2880" w:hanging="360"/>
+      </w:pPr>
+    </w:lvl>
+    <w:lvl w:ilvl="4" w:tplc="DF2670D6" w:tentative="1">
+      <w:start w:val="1"/>
+      <w:numFmt w:val="bullet"/>
+      <w:lvlText w:val="○"/>
+      <w:lvlJc w:val="left"/>
+      <w:pPr>
+        <w:ind w:left="3600" w:hanging="360"/>
+      </w:pPr>
+    </w:lvl>
+    <w:lvl w:ilvl="5" w:tplc="3C482920" w:tentative="1">
+      <w:start w:val="1"/>
+      <w:numFmt w:val="bullet"/>
+      <w:lvlText w:val="■"/>
+      <w:lvlJc w:val="left"/>
+      <w:pPr>
+        <w:ind w:left="4320" w:hanging="360"/>
+      </w:pPr>
+    </w:lvl>
+    <w:lvl w:ilvl="6" w:tplc="2476414A" w:tentative="1">
+      <w:start w:val="1"/>
+      <w:numFmt w:val="bullet"/>
+      <w:lvlText w:val="●"/>
+      <w:lvlJc w:val="left"/>
+      <w:pPr>
+        <w:ind w:left="5040" w:hanging="360"/>
+      </w:pPr>
+    </w:lvl>
+    <w:lvl w:ilvl="7" w:tplc="30A22EEC" w:tentative="1">
+      <w:start w:val="1"/>
+      <w:numFmt w:val="bullet"/>
+      <w:lvlText w:val="●"/>
+      <w:lvlJc w:val="left"/>
+      <w:pPr>
+        <w:ind w:left="5760" w:hanging="360"/>
+      </w:pPr>
+    </w:lvl>
+    <w:lvl w:ilvl="8" w:tplc="6C9AB802" w:tentative="1">
+      <w:start w:val="1"/>
+      <w:numFmt w:val="bullet"/>
+      <w:lvlText w:val="●"/>
+      <w:lvlJc w:val="left"/>
+      <w:pPr>
+        <w:ind w:left="6480" w:hanging="360"/>
+      </w:pPr>
+    </w:lvl>
+  </w:abstractNum>
+  <w:num w:numId="1" w16cid:durableId="836312147">
+    <w:abstractNumId w:val="1"/>
+    <w:lvlOverride w:ilvl="0">
+      <w:startOverride w:val="1"/>
+    </w:lvlOverride>
+  </w:num>
+  <w:num w:numId="2" w16cid:durableId="783114667">
     <w:abstractNumId w:val="0"/>
     <w:lvlOverride w:ilvl="0">
       <w:startOverride w:val="1"/>
     </w:lvlOverride>
   </w:num>
-  <w:num w:numId="2" w16cid:durableId="1008140732">
-    <w:abstractNumId w:val="1"/>
+  <w:num w:numId="3" w16cid:durableId="1021930371">
+    <w:abstractNumId w:val="0"/>
     <w:lvlOverride w:ilvl="0">
       <w:startOverride w:val="1"/>
     </w:lvlOverride>
   </w:num>
-  <w:num w:numId="3" w16cid:durableId="49812237">
-    <w:abstractNumId w:val="1"/>
+  <w:num w:numId="4" w16cid:durableId="934939582">
+    <w:abstractNumId w:val="0"/>
     <w:lvlOverride w:ilvl="0">
       <w:startOverride w:val="1"/>
     </w:lvlOverride>
   </w:num>
-  <w:num w:numId="4" w16cid:durableId="2110464754">
-    <w:abstractNumId w:val="1"/>
+  <w:num w:numId="5" w16cid:durableId="846555437">
+    <w:abstractNumId w:val="0"/>
     <w:lvlOverride w:ilvl="0">
       <w:startOverride w:val="1"/>
     </w:lvlOverride>
   </w:num>
-  <w:num w:numId="5" w16cid:durableId="1851750760">
-    <w:abstractNumId w:val="1"/>
+  <w:num w:numId="6" w16cid:durableId="1291009621">
+    <w:abstractNumId w:val="0"/>
     <w:lvlOverride w:ilvl="0">
       <w:startOverride w:val="1"/>
     </w:lvlOverride>
   </w:num>
-  <w:num w:numId="6" w16cid:durableId="1025524586">
-    <w:abstractNumId w:val="1"/>
+  <w:num w:numId="7" w16cid:durableId="1694526906">
+    <w:abstractNumId w:val="0"/>
     <w:lvlOverride w:ilvl="0">
       <w:startOverride w:val="1"/>
     </w:lvlOverride>
   </w:num>
-  <w:num w:numId="7" w16cid:durableId="168298856">
-    <w:abstractNumId w:val="1"/>
+  <w:num w:numId="8" w16cid:durableId="1299917757">
+    <w:abstractNumId w:val="0"/>
     <w:lvlOverride w:ilvl="0">
       <w:startOverride w:val="1"/>
     </w:lvlOverride>
   </w:num>
-  <w:num w:numId="8" w16cid:durableId="1950231915">
-    <w:abstractNumId w:val="1"/>
+  <w:num w:numId="9" w16cid:durableId="1669138331">
+    <w:abstractNumId w:val="0"/>
     <w:lvlOverride w:ilvl="0">
       <w:startOverride w:val="1"/>
     </w:lvlOverride>
   </w:num>
-  <w:num w:numId="9" w16cid:durableId="1648587903">
-    <w:abstractNumId w:val="1"/>
+  <w:num w:numId="10" w16cid:durableId="877666265">
+    <w:abstractNumId w:val="0"/>
     <w:lvlOverride w:ilvl="0">
       <w:startOverride w:val="1"/>
     </w:lvlOverride>
   </w:num>
-  <w:num w:numId="10" w16cid:durableId="1196578415">
-    <w:abstractNumId w:val="1"/>
+  <w:num w:numId="11" w16cid:durableId="1350906361">
+    <w:abstractNumId w:val="0"/>
     <w:lvlOverride w:ilvl="0">
       <w:startOverride w:val="1"/>
     </w:lvlOverride>
   </w:num>
-  <w:num w:numId="11" w16cid:durableId="744032493">
-    <w:abstractNumId w:val="1"/>
+  <w:num w:numId="12" w16cid:durableId="1088379660">
+    <w:abstractNumId w:val="0"/>
     <w:lvlOverride w:ilvl="0">
       <w:startOverride w:val="1"/>
     </w:lvlOverride>
   </w:num>
-  <w:num w:numId="12" w16cid:durableId="1317565210">
-    <w:abstractNumId w:val="1"/>
+  <w:num w:numId="13" w16cid:durableId="2067218384">
+    <w:abstractNumId w:val="0"/>
     <w:lvlOverride w:ilvl="0">
       <w:startOverride w:val="1"/>
     </w:lvlOverride>
   </w:num>
-  <w:num w:numId="13" w16cid:durableId="967860090">
-    <w:abstractNumId w:val="1"/>
+  <w:num w:numId="14" w16cid:durableId="1938370523">
+    <w:abstractNumId w:val="0"/>
     <w:lvlOverride w:ilvl="0">
       <w:startOverride w:val="1"/>
     </w:lvlOverride>
   </w:num>
-  <w:num w:numId="14" w16cid:durableId="1910528987">
-    <w:abstractNumId w:val="1"/>
+  <w:num w:numId="15" w16cid:durableId="1737782472">
+    <w:abstractNumId w:val="0"/>
     <w:lvlOverride w:ilvl="0">
       <w:startOverride w:val="1"/>
     </w:lvlOverride>
   </w:num>
-  <w:num w:numId="15" w16cid:durableId="493495928">
-    <w:abstractNumId w:val="1"/>
-    <w:lvlOverride w:ilvl="0">
-      <w:startOverride w:val="1"/>
-    </w:lvlOverride>
-  </w:num>
-  <w:num w:numId="16" w16cid:durableId="1879656290">
-    <w:abstractNumId w:val="1"/>
+  <w:num w:numId="16" w16cid:durableId="350835443">
+    <w:abstractNumId w:val="0"/>
     <w:lvlOverride w:ilvl="0">
       <w:startOverride w:val="1"/>
     </w:lvlOverride>

</xml_diff>

<commit_message>
Relatorio: PDF atualizado com os aparelhos do teste
</commit_message>
<xml_diff>
--- a/relatorio/Relatorio_Final_PIBIC_BioquimicaEDU.docx
+++ b/relatorio/Relatorio_Final_PIBIC_BioquimicaEDU.docx
@@ -87,7 +87,6 @@
           <w:b/>
           <w:bCs/>
         </w:rPr>
-        <w:lastRenderedPageBreak/>
         <w:t>ALEXANDRO DE ARAUJO JUNIOR</w:t>
       </w:r>
     </w:p>
@@ -159,7 +158,6 @@
         <w:pStyle w:val="Ttulopr-textual"/>
       </w:pPr>
       <w:r>
-        <w:lastRenderedPageBreak/>
         <w:t>AGRADECIMENTOS</w:t>
       </w:r>
     </w:p>
@@ -213,7 +211,6 @@
         <w:pStyle w:val="Ttulopr-textual"/>
       </w:pPr>
       <w:r>
-        <w:lastRenderedPageBreak/>
         <w:t>RESUMO</w:t>
       </w:r>
     </w:p>
@@ -270,7 +267,6 @@
         <w:pStyle w:val="Ttulopr-textual"/>
       </w:pPr>
       <w:r>
-        <w:lastRenderedPageBreak/>
         <w:t>ABSTRACT</w:t>
       </w:r>
     </w:p>
@@ -327,14 +323,13 @@
         <w:pStyle w:val="Ttulopr-textual"/>
       </w:pPr>
       <w:r>
-        <w:lastRenderedPageBreak/>
         <w:t>LISTA DE FIGURAS</w:t>
       </w:r>
     </w:p>
     <w:sdt>
       <w:sdtPr>
         <w:alias w:val="LISTA DE FIGURAS"/>
-        <w:id w:val="-1050228581"/>
+        <w:id w:val="-1137172668"/>
       </w:sdtPr>
       <w:sdtEndPr/>
       <w:sdtContent>
@@ -360,7 +355,7 @@
           <w:r>
             <w:fldChar w:fldCharType="separate"/>
           </w:r>
-          <w:hyperlink w:anchor="_Toc243296827" w:history="1">
+          <w:hyperlink w:anchor="_Toc243299595" w:history="1">
             <w:r>
               <w:rPr>
                 <w:rStyle w:val="Hyperlink"/>
@@ -384,7 +379,7 @@
               <w:rPr>
                 <w:noProof/>
               </w:rPr>
-              <w:instrText xml:space="preserve"> PAGEREF _Toc243296827 \h </w:instrText>
+              <w:instrText xml:space="preserve"> PAGEREF _Toc243299595 \h </w:instrText>
             </w:r>
             <w:r>
               <w:rPr>
@@ -424,7 +419,7 @@
               <w14:ligatures w14:val="standardContextual"/>
             </w:rPr>
           </w:pPr>
-          <w:hyperlink w:anchor="_Toc243296828" w:history="1">
+          <w:hyperlink w:anchor="_Toc243299596" w:history="1">
             <w:r>
               <w:rPr>
                 <w:rStyle w:val="Hyperlink"/>
@@ -448,7 +443,7 @@
               <w:rPr>
                 <w:noProof/>
               </w:rPr>
-              <w:instrText xml:space="preserve"> PAGEREF _Toc243296828 \h </w:instrText>
+              <w:instrText xml:space="preserve"> PAGEREF _Toc243299596 \h </w:instrText>
             </w:r>
             <w:r>
               <w:rPr>
@@ -488,7 +483,7 @@
               <w14:ligatures w14:val="standardContextual"/>
             </w:rPr>
           </w:pPr>
-          <w:hyperlink w:anchor="_Toc243296829" w:history="1">
+          <w:hyperlink w:anchor="_Toc243299597" w:history="1">
             <w:r>
               <w:rPr>
                 <w:rStyle w:val="Hyperlink"/>
@@ -512,7 +507,7 @@
               <w:rPr>
                 <w:noProof/>
               </w:rPr>
-              <w:instrText xml:space="preserve"> PAGEREF _Toc243296829 \h </w:instrText>
+              <w:instrText xml:space="preserve"> PAGEREF _Toc243299597 \h </w:instrText>
             </w:r>
             <w:r>
               <w:rPr>
@@ -552,7 +547,7 @@
               <w14:ligatures w14:val="standardContextual"/>
             </w:rPr>
           </w:pPr>
-          <w:hyperlink w:anchor="_Toc243296830" w:history="1">
+          <w:hyperlink w:anchor="_Toc243299598" w:history="1">
             <w:r>
               <w:rPr>
                 <w:rStyle w:val="Hyperlink"/>
@@ -592,7 +587,7 @@
               <w:rPr>
                 <w:noProof/>
               </w:rPr>
-              <w:instrText xml:space="preserve"> PAGEREF _Toc243296830 \h </w:instrText>
+              <w:instrText xml:space="preserve"> PAGEREF _Toc243299598 \h </w:instrText>
             </w:r>
             <w:r>
               <w:rPr>
@@ -632,7 +627,7 @@
               <w14:ligatures w14:val="standardContextual"/>
             </w:rPr>
           </w:pPr>
-          <w:hyperlink w:anchor="_Toc243296831" w:history="1">
+          <w:hyperlink w:anchor="_Toc243299599" w:history="1">
             <w:r>
               <w:rPr>
                 <w:rStyle w:val="Hyperlink"/>
@@ -656,7 +651,7 @@
               <w:rPr>
                 <w:noProof/>
               </w:rPr>
-              <w:instrText xml:space="preserve"> PAGEREF _Toc243296831 \h </w:instrText>
+              <w:instrText xml:space="preserve"> PAGEREF _Toc243299599 \h </w:instrText>
             </w:r>
             <w:r>
               <w:rPr>
@@ -696,7 +691,7 @@
               <w14:ligatures w14:val="standardContextual"/>
             </w:rPr>
           </w:pPr>
-          <w:hyperlink w:anchor="_Toc243296832" w:history="1">
+          <w:hyperlink w:anchor="_Toc243299600" w:history="1">
             <w:r>
               <w:rPr>
                 <w:rStyle w:val="Hyperlink"/>
@@ -720,7 +715,7 @@
               <w:rPr>
                 <w:noProof/>
               </w:rPr>
-              <w:instrText xml:space="preserve"> PAGEREF _Toc243296832 \h </w:instrText>
+              <w:instrText xml:space="preserve"> PAGEREF _Toc243299600 \h </w:instrText>
             </w:r>
             <w:r>
               <w:rPr>
@@ -760,7 +755,7 @@
               <w14:ligatures w14:val="standardContextual"/>
             </w:rPr>
           </w:pPr>
-          <w:hyperlink w:anchor="_Toc243296833" w:history="1">
+          <w:hyperlink w:anchor="_Toc243299601" w:history="1">
             <w:r>
               <w:rPr>
                 <w:rStyle w:val="Hyperlink"/>
@@ -784,7 +779,7 @@
               <w:rPr>
                 <w:noProof/>
               </w:rPr>
-              <w:instrText xml:space="preserve"> PAGEREF _Toc243296833 \h </w:instrText>
+              <w:instrText xml:space="preserve"> PAGEREF _Toc243299601 \h </w:instrText>
             </w:r>
             <w:r>
               <w:rPr>
@@ -824,7 +819,7 @@
               <w14:ligatures w14:val="standardContextual"/>
             </w:rPr>
           </w:pPr>
-          <w:hyperlink w:anchor="_Toc243296834" w:history="1">
+          <w:hyperlink w:anchor="_Toc243299602" w:history="1">
             <w:r>
               <w:rPr>
                 <w:rStyle w:val="Hyperlink"/>
@@ -848,7 +843,7 @@
               <w:rPr>
                 <w:noProof/>
               </w:rPr>
-              <w:instrText xml:space="preserve"> PAGEREF _Toc243296834 \h </w:instrText>
+              <w:instrText xml:space="preserve"> PAGEREF _Toc243299602 \h </w:instrText>
             </w:r>
             <w:r>
               <w:rPr>
@@ -888,7 +883,7 @@
               <w14:ligatures w14:val="standardContextual"/>
             </w:rPr>
           </w:pPr>
-          <w:hyperlink w:anchor="_Toc243296835" w:history="1">
+          <w:hyperlink w:anchor="_Toc243299603" w:history="1">
             <w:r>
               <w:rPr>
                 <w:rStyle w:val="Hyperlink"/>
@@ -912,7 +907,7 @@
               <w:rPr>
                 <w:noProof/>
               </w:rPr>
-              <w:instrText xml:space="preserve"> PAGEREF _Toc243296835 \h </w:instrText>
+              <w:instrText xml:space="preserve"> PAGEREF _Toc243299603 \h </w:instrText>
             </w:r>
             <w:r>
               <w:rPr>
@@ -952,7 +947,7 @@
               <w14:ligatures w14:val="standardContextual"/>
             </w:rPr>
           </w:pPr>
-          <w:hyperlink w:anchor="_Toc243296836" w:history="1">
+          <w:hyperlink w:anchor="_Toc243299604" w:history="1">
             <w:r>
               <w:rPr>
                 <w:rStyle w:val="Hyperlink"/>
@@ -976,7 +971,7 @@
               <w:rPr>
                 <w:noProof/>
               </w:rPr>
-              <w:instrText xml:space="preserve"> PAGEREF _Toc243296836 \h </w:instrText>
+              <w:instrText xml:space="preserve"> PAGEREF _Toc243299604 \h </w:instrText>
             </w:r>
             <w:r>
               <w:rPr>
@@ -1016,7 +1011,7 @@
               <w14:ligatures w14:val="standardContextual"/>
             </w:rPr>
           </w:pPr>
-          <w:hyperlink w:anchor="_Toc243296837" w:history="1">
+          <w:hyperlink w:anchor="_Toc243299605" w:history="1">
             <w:r>
               <w:rPr>
                 <w:rStyle w:val="Hyperlink"/>
@@ -1040,7 +1035,7 @@
               <w:rPr>
                 <w:noProof/>
               </w:rPr>
-              <w:instrText xml:space="preserve"> PAGEREF _Toc243296837 \h </w:instrText>
+              <w:instrText xml:space="preserve"> PAGEREF _Toc243299605 \h </w:instrText>
             </w:r>
             <w:r>
               <w:rPr>
@@ -1080,7 +1075,7 @@
               <w14:ligatures w14:val="standardContextual"/>
             </w:rPr>
           </w:pPr>
-          <w:hyperlink w:anchor="_Toc243296838" w:history="1">
+          <w:hyperlink w:anchor="_Toc243299606" w:history="1">
             <w:r>
               <w:rPr>
                 <w:rStyle w:val="Hyperlink"/>
@@ -1104,7 +1099,7 @@
               <w:rPr>
                 <w:noProof/>
               </w:rPr>
-              <w:instrText xml:space="preserve"> PAGEREF _Toc243296838 \h </w:instrText>
+              <w:instrText xml:space="preserve"> PAGEREF _Toc243299606 \h </w:instrText>
             </w:r>
             <w:r>
               <w:rPr>
@@ -1143,14 +1138,13 @@
         <w:pStyle w:val="Ttulopr-textual"/>
       </w:pPr>
       <w:r>
-        <w:lastRenderedPageBreak/>
         <w:t>LISTA DE QUADROS</w:t>
       </w:r>
     </w:p>
     <w:sdt>
       <w:sdtPr>
         <w:alias w:val="LISTA DE QUADROS"/>
-        <w:id w:val="1180390136"/>
+        <w:id w:val="-1113359238"/>
       </w:sdtPr>
       <w:sdtEndPr/>
       <w:sdtContent>
@@ -1176,7 +1170,7 @@
           <w:r>
             <w:fldChar w:fldCharType="separate"/>
           </w:r>
-          <w:hyperlink w:anchor="_Toc243296839" w:history="1">
+          <w:hyperlink w:anchor="_Toc243299607" w:history="1">
             <w:r>
               <w:rPr>
                 <w:rStyle w:val="Hyperlink"/>
@@ -1200,7 +1194,7 @@
               <w:rPr>
                 <w:noProof/>
               </w:rPr>
-              <w:instrText xml:space="preserve"> PAGEREF _Toc243296839 \h </w:instrText>
+              <w:instrText xml:space="preserve"> PAGEREF _Toc243299607 \h </w:instrText>
             </w:r>
             <w:r>
               <w:rPr>
@@ -1240,7 +1234,7 @@
               <w14:ligatures w14:val="standardContextual"/>
             </w:rPr>
           </w:pPr>
-          <w:hyperlink w:anchor="_Toc243296840" w:history="1">
+          <w:hyperlink w:anchor="_Toc243299608" w:history="1">
             <w:r>
               <w:rPr>
                 <w:rStyle w:val="Hyperlink"/>
@@ -1264,7 +1258,7 @@
               <w:rPr>
                 <w:noProof/>
               </w:rPr>
-              <w:instrText xml:space="preserve"> PAGEREF _Toc243296840 \h </w:instrText>
+              <w:instrText xml:space="preserve"> PAGEREF _Toc243299608 \h </w:instrText>
             </w:r>
             <w:r>
               <w:rPr>
@@ -1304,7 +1298,7 @@
               <w14:ligatures w14:val="standardContextual"/>
             </w:rPr>
           </w:pPr>
-          <w:hyperlink w:anchor="_Toc243296841" w:history="1">
+          <w:hyperlink w:anchor="_Toc243299609" w:history="1">
             <w:r>
               <w:rPr>
                 <w:rStyle w:val="Hyperlink"/>
@@ -1328,7 +1322,7 @@
               <w:rPr>
                 <w:noProof/>
               </w:rPr>
-              <w:instrText xml:space="preserve"> PAGEREF _Toc243296841 \h </w:instrText>
+              <w:instrText xml:space="preserve"> PAGEREF _Toc243299609 \h </w:instrText>
             </w:r>
             <w:r>
               <w:rPr>
@@ -1368,7 +1362,7 @@
               <w14:ligatures w14:val="standardContextual"/>
             </w:rPr>
           </w:pPr>
-          <w:hyperlink w:anchor="_Toc243296842" w:history="1">
+          <w:hyperlink w:anchor="_Toc243299610" w:history="1">
             <w:r>
               <w:rPr>
                 <w:rStyle w:val="Hyperlink"/>
@@ -1392,7 +1386,7 @@
               <w:rPr>
                 <w:noProof/>
               </w:rPr>
-              <w:instrText xml:space="preserve"> PAGEREF _Toc243296842 \h </w:instrText>
+              <w:instrText xml:space="preserve"> PAGEREF _Toc243299610 \h </w:instrText>
             </w:r>
             <w:r>
               <w:rPr>
@@ -1432,7 +1426,7 @@
               <w14:ligatures w14:val="standardContextual"/>
             </w:rPr>
           </w:pPr>
-          <w:hyperlink w:anchor="_Toc243296843" w:history="1">
+          <w:hyperlink w:anchor="_Toc243299611" w:history="1">
             <w:r>
               <w:rPr>
                 <w:rStyle w:val="Hyperlink"/>
@@ -1456,7 +1450,7 @@
               <w:rPr>
                 <w:noProof/>
               </w:rPr>
-              <w:instrText xml:space="preserve"> PAGEREF _Toc243296843 \h </w:instrText>
+              <w:instrText xml:space="preserve"> PAGEREF _Toc243299611 \h </w:instrText>
             </w:r>
             <w:r>
               <w:rPr>
@@ -1496,7 +1490,7 @@
               <w14:ligatures w14:val="standardContextual"/>
             </w:rPr>
           </w:pPr>
-          <w:hyperlink w:anchor="_Toc243296844" w:history="1">
+          <w:hyperlink w:anchor="_Toc243299612" w:history="1">
             <w:r>
               <w:rPr>
                 <w:rStyle w:val="Hyperlink"/>
@@ -1520,7 +1514,7 @@
               <w:rPr>
                 <w:noProof/>
               </w:rPr>
-              <w:instrText xml:space="preserve"> PAGEREF _Toc243296844 \h </w:instrText>
+              <w:instrText xml:space="preserve"> PAGEREF _Toc243299612 \h </w:instrText>
             </w:r>
             <w:r>
               <w:rPr>
@@ -1560,7 +1554,7 @@
               <w14:ligatures w14:val="standardContextual"/>
             </w:rPr>
           </w:pPr>
-          <w:hyperlink w:anchor="_Toc243296845" w:history="1">
+          <w:hyperlink w:anchor="_Toc243299613" w:history="1">
             <w:r>
               <w:rPr>
                 <w:rStyle w:val="Hyperlink"/>
@@ -1584,7 +1578,7 @@
               <w:rPr>
                 <w:noProof/>
               </w:rPr>
-              <w:instrText xml:space="preserve"> PAGEREF _Toc243296845 \h </w:instrText>
+              <w:instrText xml:space="preserve"> PAGEREF _Toc243299613 \h </w:instrText>
             </w:r>
             <w:r>
               <w:rPr>
@@ -1623,14 +1617,13 @@
         <w:pStyle w:val="Ttulopr-textual"/>
       </w:pPr>
       <w:r>
-        <w:lastRenderedPageBreak/>
         <w:t>LISTA DE TABELAS</w:t>
       </w:r>
     </w:p>
     <w:sdt>
       <w:sdtPr>
         <w:alias w:val="LISTA DE TABELAS"/>
-        <w:id w:val="1375651483"/>
+        <w:id w:val="-1534569972"/>
       </w:sdtPr>
       <w:sdtEndPr/>
       <w:sdtContent>
@@ -1656,7 +1649,7 @@
           <w:r>
             <w:fldChar w:fldCharType="separate"/>
           </w:r>
-          <w:hyperlink w:anchor="_Toc243296846" w:history="1">
+          <w:hyperlink w:anchor="_Toc243299614" w:history="1">
             <w:r>
               <w:rPr>
                 <w:rStyle w:val="Hyperlink"/>
@@ -1680,7 +1673,7 @@
               <w:rPr>
                 <w:noProof/>
               </w:rPr>
-              <w:instrText xml:space="preserve"> PAGEREF _Toc243296846 \h </w:instrText>
+              <w:instrText xml:space="preserve"> PAGEREF _Toc243299614 \h </w:instrText>
             </w:r>
             <w:r>
               <w:rPr>
@@ -1720,7 +1713,7 @@
               <w14:ligatures w14:val="standardContextual"/>
             </w:rPr>
           </w:pPr>
-          <w:hyperlink w:anchor="_Toc243296847" w:history="1">
+          <w:hyperlink w:anchor="_Toc243299615" w:history="1">
             <w:r>
               <w:rPr>
                 <w:rStyle w:val="Hyperlink"/>
@@ -1744,7 +1737,7 @@
               <w:rPr>
                 <w:noProof/>
               </w:rPr>
-              <w:instrText xml:space="preserve"> PAGEREF _Toc243296847 \h </w:instrText>
+              <w:instrText xml:space="preserve"> PAGEREF _Toc243299615 \h </w:instrText>
             </w:r>
             <w:r>
               <w:rPr>
@@ -1784,7 +1777,7 @@
               <w14:ligatures w14:val="standardContextual"/>
             </w:rPr>
           </w:pPr>
-          <w:hyperlink w:anchor="_Toc243296848" w:history="1">
+          <w:hyperlink w:anchor="_Toc243299616" w:history="1">
             <w:r>
               <w:rPr>
                 <w:rStyle w:val="Hyperlink"/>
@@ -1808,7 +1801,7 @@
               <w:rPr>
                 <w:noProof/>
               </w:rPr>
-              <w:instrText xml:space="preserve"> PAGEREF _Toc243296848 \h </w:instrText>
+              <w:instrText xml:space="preserve"> PAGEREF _Toc243299616 \h </w:instrText>
             </w:r>
             <w:r>
               <w:rPr>
@@ -1848,7 +1841,7 @@
               <w14:ligatures w14:val="standardContextual"/>
             </w:rPr>
           </w:pPr>
-          <w:hyperlink w:anchor="_Toc243296849" w:history="1">
+          <w:hyperlink w:anchor="_Toc243299617" w:history="1">
             <w:r>
               <w:rPr>
                 <w:rStyle w:val="Hyperlink"/>
@@ -1872,7 +1865,7 @@
               <w:rPr>
                 <w:noProof/>
               </w:rPr>
-              <w:instrText xml:space="preserve"> PAGEREF _Toc243296849 \h </w:instrText>
+              <w:instrText xml:space="preserve"> PAGEREF _Toc243299617 \h </w:instrText>
             </w:r>
             <w:r>
               <w:rPr>
@@ -1912,7 +1905,7 @@
               <w14:ligatures w14:val="standardContextual"/>
             </w:rPr>
           </w:pPr>
-          <w:hyperlink w:anchor="_Toc243296850" w:history="1">
+          <w:hyperlink w:anchor="_Toc243299618" w:history="1">
             <w:r>
               <w:rPr>
                 <w:rStyle w:val="Hyperlink"/>
@@ -1936,7 +1929,7 @@
               <w:rPr>
                 <w:noProof/>
               </w:rPr>
-              <w:instrText xml:space="preserve"> PAGEREF _Toc243296850 \h </w:instrText>
+              <w:instrText xml:space="preserve"> PAGEREF _Toc243299618 \h </w:instrText>
             </w:r>
             <w:r>
               <w:rPr>
@@ -1975,7 +1968,6 @@
         <w:pStyle w:val="Ttulopr-textual"/>
       </w:pPr>
       <w:r>
-        <w:lastRenderedPageBreak/>
         <w:t>LISTA DE ABREVIATURAS E SIGLAS</w:t>
       </w:r>
     </w:p>
@@ -2530,7 +2522,6 @@
         <w:pStyle w:val="Ttulopr-textual"/>
       </w:pPr>
       <w:r>
-        <w:lastRenderedPageBreak/>
         <w:t>SUMÁRIO</w:t>
       </w:r>
     </w:p>
@@ -2541,7 +2532,7 @@
           <w:bCs w:val="0"/>
         </w:rPr>
         <w:alias w:val="Sumário"/>
-        <w:id w:val="-2118823417"/>
+        <w:id w:val="-260373951"/>
       </w:sdtPr>
       <w:sdtEndPr/>
       <w:sdtContent>
@@ -2569,7 +2560,7 @@
           <w:r>
             <w:fldChar w:fldCharType="separate"/>
           </w:r>
-          <w:hyperlink w:anchor="_Toc243296781" w:history="1">
+          <w:hyperlink w:anchor="_Toc243299549" w:history="1">
             <w:r>
               <w:rPr>
                 <w:rStyle w:val="Hyperlink"/>
@@ -2593,7 +2584,7 @@
               <w:rPr>
                 <w:noProof/>
               </w:rPr>
-              <w:instrText xml:space="preserve"> PAGEREF _Toc243296781 \h </w:instrText>
+              <w:instrText xml:space="preserve"> PAGEREF _Toc243299549 \h </w:instrText>
             </w:r>
             <w:r>
               <w:rPr>
@@ -2633,7 +2624,7 @@
               <w14:ligatures w14:val="standardContextual"/>
             </w:rPr>
           </w:pPr>
-          <w:hyperlink w:anchor="_Toc243296782" w:history="1">
+          <w:hyperlink w:anchor="_Toc243299550" w:history="1">
             <w:r>
               <w:rPr>
                 <w:rStyle w:val="Hyperlink"/>
@@ -2657,7 +2648,7 @@
               <w:rPr>
                 <w:noProof/>
               </w:rPr>
-              <w:instrText xml:space="preserve"> PAGEREF _Toc243296782 \h </w:instrText>
+              <w:instrText xml:space="preserve"> PAGEREF _Toc243299550 \h </w:instrText>
             </w:r>
             <w:r>
               <w:rPr>
@@ -2697,7 +2688,7 @@
               <w14:ligatures w14:val="standardContextual"/>
             </w:rPr>
           </w:pPr>
-          <w:hyperlink w:anchor="_Toc243296783" w:history="1">
+          <w:hyperlink w:anchor="_Toc243299551" w:history="1">
             <w:r>
               <w:rPr>
                 <w:rStyle w:val="Hyperlink"/>
@@ -2721,7 +2712,7 @@
               <w:rPr>
                 <w:noProof/>
               </w:rPr>
-              <w:instrText xml:space="preserve"> PAGEREF _Toc243296783 \h </w:instrText>
+              <w:instrText xml:space="preserve"> PAGEREF _Toc243299551 \h </w:instrText>
             </w:r>
             <w:r>
               <w:rPr>
@@ -2761,7 +2752,7 @@
               <w14:ligatures w14:val="standardContextual"/>
             </w:rPr>
           </w:pPr>
-          <w:hyperlink w:anchor="_Toc243296784" w:history="1">
+          <w:hyperlink w:anchor="_Toc243299552" w:history="1">
             <w:r>
               <w:rPr>
                 <w:rStyle w:val="Hyperlink"/>
@@ -2785,7 +2776,7 @@
               <w:rPr>
                 <w:noProof/>
               </w:rPr>
-              <w:instrText xml:space="preserve"> PAGEREF _Toc243296784 \h </w:instrText>
+              <w:instrText xml:space="preserve"> PAGEREF _Toc243299552 \h </w:instrText>
             </w:r>
             <w:r>
               <w:rPr>
@@ -2825,7 +2816,7 @@
               <w14:ligatures w14:val="standardContextual"/>
             </w:rPr>
           </w:pPr>
-          <w:hyperlink w:anchor="_Toc243296785" w:history="1">
+          <w:hyperlink w:anchor="_Toc243299553" w:history="1">
             <w:r>
               <w:rPr>
                 <w:rStyle w:val="Hyperlink"/>
@@ -2849,7 +2840,7 @@
               <w:rPr>
                 <w:noProof/>
               </w:rPr>
-              <w:instrText xml:space="preserve"> PAGEREF _Toc243296785 \h </w:instrText>
+              <w:instrText xml:space="preserve"> PAGEREF _Toc243299553 \h </w:instrText>
             </w:r>
             <w:r>
               <w:rPr>
@@ -2891,7 +2882,7 @@
               <w14:ligatures w14:val="standardContextual"/>
             </w:rPr>
           </w:pPr>
-          <w:hyperlink w:anchor="_Toc243296786" w:history="1">
+          <w:hyperlink w:anchor="_Toc243299554" w:history="1">
             <w:r>
               <w:rPr>
                 <w:rStyle w:val="Hyperlink"/>
@@ -2915,7 +2906,7 @@
               <w:rPr>
                 <w:noProof/>
               </w:rPr>
-              <w:instrText xml:space="preserve"> PAGEREF _Toc243296786 \h </w:instrText>
+              <w:instrText xml:space="preserve"> PAGEREF _Toc243299554 \h </w:instrText>
             </w:r>
             <w:r>
               <w:rPr>
@@ -2955,7 +2946,7 @@
               <w14:ligatures w14:val="standardContextual"/>
             </w:rPr>
           </w:pPr>
-          <w:hyperlink w:anchor="_Toc243296787" w:history="1">
+          <w:hyperlink w:anchor="_Toc243299555" w:history="1">
             <w:r>
               <w:rPr>
                 <w:rStyle w:val="Hyperlink"/>
@@ -2979,7 +2970,7 @@
               <w:rPr>
                 <w:noProof/>
               </w:rPr>
-              <w:instrText xml:space="preserve"> PAGEREF _Toc243296787 \h </w:instrText>
+              <w:instrText xml:space="preserve"> PAGEREF _Toc243299555 \h </w:instrText>
             </w:r>
             <w:r>
               <w:rPr>
@@ -3019,7 +3010,7 @@
               <w14:ligatures w14:val="standardContextual"/>
             </w:rPr>
           </w:pPr>
-          <w:hyperlink w:anchor="_Toc243296788" w:history="1">
+          <w:hyperlink w:anchor="_Toc243299556" w:history="1">
             <w:r>
               <w:rPr>
                 <w:rStyle w:val="Hyperlink"/>
@@ -3043,7 +3034,7 @@
               <w:rPr>
                 <w:noProof/>
               </w:rPr>
-              <w:instrText xml:space="preserve"> PAGEREF _Toc243296788 \h </w:instrText>
+              <w:instrText xml:space="preserve"> PAGEREF _Toc243299556 \h </w:instrText>
             </w:r>
             <w:r>
               <w:rPr>
@@ -3083,7 +3074,7 @@
               <w14:ligatures w14:val="standardContextual"/>
             </w:rPr>
           </w:pPr>
-          <w:hyperlink w:anchor="_Toc243296789" w:history="1">
+          <w:hyperlink w:anchor="_Toc243299557" w:history="1">
             <w:r>
               <w:rPr>
                 <w:rStyle w:val="Hyperlink"/>
@@ -3107,7 +3098,7 @@
               <w:rPr>
                 <w:noProof/>
               </w:rPr>
-              <w:instrText xml:space="preserve"> PAGEREF _Toc243296789 \h </w:instrText>
+              <w:instrText xml:space="preserve"> PAGEREF _Toc243299557 \h </w:instrText>
             </w:r>
             <w:r>
               <w:rPr>
@@ -3147,7 +3138,7 @@
               <w14:ligatures w14:val="standardContextual"/>
             </w:rPr>
           </w:pPr>
-          <w:hyperlink w:anchor="_Toc243296790" w:history="1">
+          <w:hyperlink w:anchor="_Toc243299558" w:history="1">
             <w:r>
               <w:rPr>
                 <w:rStyle w:val="Hyperlink"/>
@@ -3171,7 +3162,7 @@
               <w:rPr>
                 <w:noProof/>
               </w:rPr>
-              <w:instrText xml:space="preserve"> PAGEREF _Toc243296790 \h </w:instrText>
+              <w:instrText xml:space="preserve"> PAGEREF _Toc243299558 \h </w:instrText>
             </w:r>
             <w:r>
               <w:rPr>
@@ -3211,7 +3202,7 @@
               <w14:ligatures w14:val="standardContextual"/>
             </w:rPr>
           </w:pPr>
-          <w:hyperlink w:anchor="_Toc243296791" w:history="1">
+          <w:hyperlink w:anchor="_Toc243299559" w:history="1">
             <w:r>
               <w:rPr>
                 <w:rStyle w:val="Hyperlink"/>
@@ -3235,7 +3226,7 @@
               <w:rPr>
                 <w:noProof/>
               </w:rPr>
-              <w:instrText xml:space="preserve"> PAGEREF _Toc243296791 \h </w:instrText>
+              <w:instrText xml:space="preserve"> PAGEREF _Toc243299559 \h </w:instrText>
             </w:r>
             <w:r>
               <w:rPr>
@@ -3277,7 +3268,7 @@
               <w14:ligatures w14:val="standardContextual"/>
             </w:rPr>
           </w:pPr>
-          <w:hyperlink w:anchor="_Toc243296792" w:history="1">
+          <w:hyperlink w:anchor="_Toc243299560" w:history="1">
             <w:r>
               <w:rPr>
                 <w:rStyle w:val="Hyperlink"/>
@@ -3301,7 +3292,7 @@
               <w:rPr>
                 <w:noProof/>
               </w:rPr>
-              <w:instrText xml:space="preserve"> PAGEREF _Toc243296792 \h </w:instrText>
+              <w:instrText xml:space="preserve"> PAGEREF _Toc243299560 \h </w:instrText>
             </w:r>
             <w:r>
               <w:rPr>
@@ -3341,7 +3332,7 @@
               <w14:ligatures w14:val="standardContextual"/>
             </w:rPr>
           </w:pPr>
-          <w:hyperlink w:anchor="_Toc243296793" w:history="1">
+          <w:hyperlink w:anchor="_Toc243299561" w:history="1">
             <w:r>
               <w:rPr>
                 <w:rStyle w:val="Hyperlink"/>
@@ -3365,7 +3356,7 @@
               <w:rPr>
                 <w:noProof/>
               </w:rPr>
-              <w:instrText xml:space="preserve"> PAGEREF _Toc243296793 \h </w:instrText>
+              <w:instrText xml:space="preserve"> PAGEREF _Toc243299561 \h </w:instrText>
             </w:r>
             <w:r>
               <w:rPr>
@@ -3405,7 +3396,7 @@
               <w14:ligatures w14:val="standardContextual"/>
             </w:rPr>
           </w:pPr>
-          <w:hyperlink w:anchor="_Toc243296794" w:history="1">
+          <w:hyperlink w:anchor="_Toc243299562" w:history="1">
             <w:r>
               <w:rPr>
                 <w:rStyle w:val="Hyperlink"/>
@@ -3429,7 +3420,7 @@
               <w:rPr>
                 <w:noProof/>
               </w:rPr>
-              <w:instrText xml:space="preserve"> PAGEREF _Toc243296794 \h </w:instrText>
+              <w:instrText xml:space="preserve"> PAGEREF _Toc243299562 \h </w:instrText>
             </w:r>
             <w:r>
               <w:rPr>
@@ -3469,7 +3460,7 @@
               <w14:ligatures w14:val="standardContextual"/>
             </w:rPr>
           </w:pPr>
-          <w:hyperlink w:anchor="_Toc243296795" w:history="1">
+          <w:hyperlink w:anchor="_Toc243299563" w:history="1">
             <w:r>
               <w:rPr>
                 <w:rStyle w:val="Hyperlink"/>
@@ -3493,7 +3484,7 @@
               <w:rPr>
                 <w:noProof/>
               </w:rPr>
-              <w:instrText xml:space="preserve"> PAGEREF _Toc243296795 \h </w:instrText>
+              <w:instrText xml:space="preserve"> PAGEREF _Toc243299563 \h </w:instrText>
             </w:r>
             <w:r>
               <w:rPr>
@@ -3533,7 +3524,7 @@
               <w14:ligatures w14:val="standardContextual"/>
             </w:rPr>
           </w:pPr>
-          <w:hyperlink w:anchor="_Toc243296796" w:history="1">
+          <w:hyperlink w:anchor="_Toc243299564" w:history="1">
             <w:r>
               <w:rPr>
                 <w:rStyle w:val="Hyperlink"/>
@@ -3557,7 +3548,7 @@
               <w:rPr>
                 <w:noProof/>
               </w:rPr>
-              <w:instrText xml:space="preserve"> PAGEREF _Toc243296796 \h </w:instrText>
+              <w:instrText xml:space="preserve"> PAGEREF _Toc243299564 \h </w:instrText>
             </w:r>
             <w:r>
               <w:rPr>
@@ -3597,7 +3588,7 @@
               <w14:ligatures w14:val="standardContextual"/>
             </w:rPr>
           </w:pPr>
-          <w:hyperlink w:anchor="_Toc243296797" w:history="1">
+          <w:hyperlink w:anchor="_Toc243299565" w:history="1">
             <w:r>
               <w:rPr>
                 <w:rStyle w:val="Hyperlink"/>
@@ -3621,7 +3612,7 @@
               <w:rPr>
                 <w:noProof/>
               </w:rPr>
-              <w:instrText xml:space="preserve"> PAGEREF _Toc243296797 \h </w:instrText>
+              <w:instrText xml:space="preserve"> PAGEREF _Toc243299565 \h </w:instrText>
             </w:r>
             <w:r>
               <w:rPr>
@@ -3661,7 +3652,7 @@
               <w14:ligatures w14:val="standardContextual"/>
             </w:rPr>
           </w:pPr>
-          <w:hyperlink w:anchor="_Toc243296798" w:history="1">
+          <w:hyperlink w:anchor="_Toc243299566" w:history="1">
             <w:r>
               <w:rPr>
                 <w:rStyle w:val="Hyperlink"/>
@@ -3685,7 +3676,7 @@
               <w:rPr>
                 <w:noProof/>
               </w:rPr>
-              <w:instrText xml:space="preserve"> PAGEREF _Toc243296798 \h </w:instrText>
+              <w:instrText xml:space="preserve"> PAGEREF _Toc243299566 \h </w:instrText>
             </w:r>
             <w:r>
               <w:rPr>
@@ -3725,7 +3716,7 @@
               <w14:ligatures w14:val="standardContextual"/>
             </w:rPr>
           </w:pPr>
-          <w:hyperlink w:anchor="_Toc243296799" w:history="1">
+          <w:hyperlink w:anchor="_Toc243299567" w:history="1">
             <w:r>
               <w:rPr>
                 <w:rStyle w:val="Hyperlink"/>
@@ -3749,7 +3740,7 @@
               <w:rPr>
                 <w:noProof/>
               </w:rPr>
-              <w:instrText xml:space="preserve"> PAGEREF _Toc243296799 \h </w:instrText>
+              <w:instrText xml:space="preserve"> PAGEREF _Toc243299567 \h </w:instrText>
             </w:r>
             <w:r>
               <w:rPr>
@@ -3789,7 +3780,7 @@
               <w14:ligatures w14:val="standardContextual"/>
             </w:rPr>
           </w:pPr>
-          <w:hyperlink w:anchor="_Toc243296800" w:history="1">
+          <w:hyperlink w:anchor="_Toc243299568" w:history="1">
             <w:r>
               <w:rPr>
                 <w:rStyle w:val="Hyperlink"/>
@@ -3813,7 +3804,7 @@
               <w:rPr>
                 <w:noProof/>
               </w:rPr>
-              <w:instrText xml:space="preserve"> PAGEREF _Toc243296800 \h </w:instrText>
+              <w:instrText xml:space="preserve"> PAGEREF _Toc243299568 \h </w:instrText>
             </w:r>
             <w:r>
               <w:rPr>
@@ -3853,7 +3844,7 @@
               <w14:ligatures w14:val="standardContextual"/>
             </w:rPr>
           </w:pPr>
-          <w:hyperlink w:anchor="_Toc243296801" w:history="1">
+          <w:hyperlink w:anchor="_Toc243299569" w:history="1">
             <w:r>
               <w:rPr>
                 <w:rStyle w:val="Hyperlink"/>
@@ -3877,7 +3868,7 @@
               <w:rPr>
                 <w:noProof/>
               </w:rPr>
-              <w:instrText xml:space="preserve"> PAGEREF _Toc243296801 \h </w:instrText>
+              <w:instrText xml:space="preserve"> PAGEREF _Toc243299569 \h </w:instrText>
             </w:r>
             <w:r>
               <w:rPr>
@@ -3917,7 +3908,7 @@
               <w14:ligatures w14:val="standardContextual"/>
             </w:rPr>
           </w:pPr>
-          <w:hyperlink w:anchor="_Toc243296802" w:history="1">
+          <w:hyperlink w:anchor="_Toc243299570" w:history="1">
             <w:r>
               <w:rPr>
                 <w:rStyle w:val="Hyperlink"/>
@@ -3941,7 +3932,7 @@
               <w:rPr>
                 <w:noProof/>
               </w:rPr>
-              <w:instrText xml:space="preserve"> PAGEREF _Toc243296802 \h </w:instrText>
+              <w:instrText xml:space="preserve"> PAGEREF _Toc243299570 \h </w:instrText>
             </w:r>
             <w:r>
               <w:rPr>
@@ -3981,7 +3972,7 @@
               <w14:ligatures w14:val="standardContextual"/>
             </w:rPr>
           </w:pPr>
-          <w:hyperlink w:anchor="_Toc243296803" w:history="1">
+          <w:hyperlink w:anchor="_Toc243299571" w:history="1">
             <w:r>
               <w:rPr>
                 <w:rStyle w:val="Hyperlink"/>
@@ -4005,7 +3996,7 @@
               <w:rPr>
                 <w:noProof/>
               </w:rPr>
-              <w:instrText xml:space="preserve"> PAGEREF _Toc243296803 \h </w:instrText>
+              <w:instrText xml:space="preserve"> PAGEREF _Toc243299571 \h </w:instrText>
             </w:r>
             <w:r>
               <w:rPr>
@@ -4047,7 +4038,7 @@
               <w14:ligatures w14:val="standardContextual"/>
             </w:rPr>
           </w:pPr>
-          <w:hyperlink w:anchor="_Toc243296804" w:history="1">
+          <w:hyperlink w:anchor="_Toc243299572" w:history="1">
             <w:r>
               <w:rPr>
                 <w:rStyle w:val="Hyperlink"/>
@@ -4071,7 +4062,7 @@
               <w:rPr>
                 <w:noProof/>
               </w:rPr>
-              <w:instrText xml:space="preserve"> PAGEREF _Toc243296804 \h </w:instrText>
+              <w:instrText xml:space="preserve"> PAGEREF _Toc243299572 \h </w:instrText>
             </w:r>
             <w:r>
               <w:rPr>
@@ -4111,7 +4102,7 @@
               <w14:ligatures w14:val="standardContextual"/>
             </w:rPr>
           </w:pPr>
-          <w:hyperlink w:anchor="_Toc243296805" w:history="1">
+          <w:hyperlink w:anchor="_Toc243299573" w:history="1">
             <w:r>
               <w:rPr>
                 <w:rStyle w:val="Hyperlink"/>
@@ -4135,7 +4126,7 @@
               <w:rPr>
                 <w:noProof/>
               </w:rPr>
-              <w:instrText xml:space="preserve"> PAGEREF _Toc243296805 \h </w:instrText>
+              <w:instrText xml:space="preserve"> PAGEREF _Toc243299573 \h </w:instrText>
             </w:r>
             <w:r>
               <w:rPr>
@@ -4175,7 +4166,7 @@
               <w14:ligatures w14:val="standardContextual"/>
             </w:rPr>
           </w:pPr>
-          <w:hyperlink w:anchor="_Toc243296806" w:history="1">
+          <w:hyperlink w:anchor="_Toc243299574" w:history="1">
             <w:r>
               <w:rPr>
                 <w:rStyle w:val="Hyperlink"/>
@@ -4199,7 +4190,7 @@
               <w:rPr>
                 <w:noProof/>
               </w:rPr>
-              <w:instrText xml:space="preserve"> PAGEREF _Toc243296806 \h </w:instrText>
+              <w:instrText xml:space="preserve"> PAGEREF _Toc243299574 \h </w:instrText>
             </w:r>
             <w:r>
               <w:rPr>
@@ -4239,7 +4230,7 @@
               <w14:ligatures w14:val="standardContextual"/>
             </w:rPr>
           </w:pPr>
-          <w:hyperlink w:anchor="_Toc243296807" w:history="1">
+          <w:hyperlink w:anchor="_Toc243299575" w:history="1">
             <w:r>
               <w:rPr>
                 <w:rStyle w:val="Hyperlink"/>
@@ -4263,7 +4254,7 @@
               <w:rPr>
                 <w:noProof/>
               </w:rPr>
-              <w:instrText xml:space="preserve"> PAGEREF _Toc243296807 \h </w:instrText>
+              <w:instrText xml:space="preserve"> PAGEREF _Toc243299575 \h </w:instrText>
             </w:r>
             <w:r>
               <w:rPr>
@@ -4303,7 +4294,7 @@
               <w14:ligatures w14:val="standardContextual"/>
             </w:rPr>
           </w:pPr>
-          <w:hyperlink w:anchor="_Toc243296808" w:history="1">
+          <w:hyperlink w:anchor="_Toc243299576" w:history="1">
             <w:r>
               <w:rPr>
                 <w:rStyle w:val="Hyperlink"/>
@@ -4327,7 +4318,7 @@
               <w:rPr>
                 <w:noProof/>
               </w:rPr>
-              <w:instrText xml:space="preserve"> PAGEREF _Toc243296808 \h </w:instrText>
+              <w:instrText xml:space="preserve"> PAGEREF _Toc243299576 \h </w:instrText>
             </w:r>
             <w:r>
               <w:rPr>
@@ -4367,7 +4358,7 @@
               <w14:ligatures w14:val="standardContextual"/>
             </w:rPr>
           </w:pPr>
-          <w:hyperlink w:anchor="_Toc243296809" w:history="1">
+          <w:hyperlink w:anchor="_Toc243299577" w:history="1">
             <w:r>
               <w:rPr>
                 <w:rStyle w:val="Hyperlink"/>
@@ -4391,7 +4382,7 @@
               <w:rPr>
                 <w:noProof/>
               </w:rPr>
-              <w:instrText xml:space="preserve"> PAGEREF _Toc243296809 \h </w:instrText>
+              <w:instrText xml:space="preserve"> PAGEREF _Toc243299577 \h </w:instrText>
             </w:r>
             <w:r>
               <w:rPr>
@@ -4431,7 +4422,7 @@
               <w14:ligatures w14:val="standardContextual"/>
             </w:rPr>
           </w:pPr>
-          <w:hyperlink w:anchor="_Toc243296810" w:history="1">
+          <w:hyperlink w:anchor="_Toc243299578" w:history="1">
             <w:r>
               <w:rPr>
                 <w:rStyle w:val="Hyperlink"/>
@@ -4455,7 +4446,7 @@
               <w:rPr>
                 <w:noProof/>
               </w:rPr>
-              <w:instrText xml:space="preserve"> PAGEREF _Toc243296810 \h </w:instrText>
+              <w:instrText xml:space="preserve"> PAGEREF _Toc243299578 \h </w:instrText>
             </w:r>
             <w:r>
               <w:rPr>
@@ -4495,7 +4486,7 @@
               <w14:ligatures w14:val="standardContextual"/>
             </w:rPr>
           </w:pPr>
-          <w:hyperlink w:anchor="_Toc243296811" w:history="1">
+          <w:hyperlink w:anchor="_Toc243299579" w:history="1">
             <w:r>
               <w:rPr>
                 <w:rStyle w:val="Hyperlink"/>
@@ -4519,7 +4510,7 @@
               <w:rPr>
                 <w:noProof/>
               </w:rPr>
-              <w:instrText xml:space="preserve"> PAGEREF _Toc243296811 \h </w:instrText>
+              <w:instrText xml:space="preserve"> PAGEREF _Toc243299579 \h </w:instrText>
             </w:r>
             <w:r>
               <w:rPr>
@@ -4559,7 +4550,7 @@
               <w14:ligatures w14:val="standardContextual"/>
             </w:rPr>
           </w:pPr>
-          <w:hyperlink w:anchor="_Toc243296812" w:history="1">
+          <w:hyperlink w:anchor="_Toc243299580" w:history="1">
             <w:r>
               <w:rPr>
                 <w:rStyle w:val="Hyperlink"/>
@@ -4583,7 +4574,7 @@
               <w:rPr>
                 <w:noProof/>
               </w:rPr>
-              <w:instrText xml:space="preserve"> PAGEREF _Toc243296812 \h </w:instrText>
+              <w:instrText xml:space="preserve"> PAGEREF _Toc243299580 \h </w:instrText>
             </w:r>
             <w:r>
               <w:rPr>
@@ -4623,7 +4614,7 @@
               <w14:ligatures w14:val="standardContextual"/>
             </w:rPr>
           </w:pPr>
-          <w:hyperlink w:anchor="_Toc243296813" w:history="1">
+          <w:hyperlink w:anchor="_Toc243299581" w:history="1">
             <w:r>
               <w:rPr>
                 <w:rStyle w:val="Hyperlink"/>
@@ -4647,7 +4638,7 @@
               <w:rPr>
                 <w:noProof/>
               </w:rPr>
-              <w:instrText xml:space="preserve"> PAGEREF _Toc243296813 \h </w:instrText>
+              <w:instrText xml:space="preserve"> PAGEREF _Toc243299581 \h </w:instrText>
             </w:r>
             <w:r>
               <w:rPr>
@@ -4687,7 +4678,7 @@
               <w14:ligatures w14:val="standardContextual"/>
             </w:rPr>
           </w:pPr>
-          <w:hyperlink w:anchor="_Toc243296814" w:history="1">
+          <w:hyperlink w:anchor="_Toc243299582" w:history="1">
             <w:r>
               <w:rPr>
                 <w:rStyle w:val="Hyperlink"/>
@@ -4711,7 +4702,7 @@
               <w:rPr>
                 <w:noProof/>
               </w:rPr>
-              <w:instrText xml:space="preserve"> PAGEREF _Toc243296814 \h </w:instrText>
+              <w:instrText xml:space="preserve"> PAGEREF _Toc243299582 \h </w:instrText>
             </w:r>
             <w:r>
               <w:rPr>
@@ -4751,7 +4742,7 @@
               <w14:ligatures w14:val="standardContextual"/>
             </w:rPr>
           </w:pPr>
-          <w:hyperlink w:anchor="_Toc243296815" w:history="1">
+          <w:hyperlink w:anchor="_Toc243299583" w:history="1">
             <w:r>
               <w:rPr>
                 <w:rStyle w:val="Hyperlink"/>
@@ -4775,7 +4766,7 @@
               <w:rPr>
                 <w:noProof/>
               </w:rPr>
-              <w:instrText xml:space="preserve"> PAGEREF _Toc243296815 \h </w:instrText>
+              <w:instrText xml:space="preserve"> PAGEREF _Toc243299583 \h </w:instrText>
             </w:r>
             <w:r>
               <w:rPr>
@@ -4815,7 +4806,7 @@
               <w14:ligatures w14:val="standardContextual"/>
             </w:rPr>
           </w:pPr>
-          <w:hyperlink w:anchor="_Toc243296816" w:history="1">
+          <w:hyperlink w:anchor="_Toc243299584" w:history="1">
             <w:r>
               <w:rPr>
                 <w:rStyle w:val="Hyperlink"/>
@@ -4839,7 +4830,7 @@
               <w:rPr>
                 <w:noProof/>
               </w:rPr>
-              <w:instrText xml:space="preserve"> PAGEREF _Toc243296816 \h </w:instrText>
+              <w:instrText xml:space="preserve"> PAGEREF _Toc243299584 \h </w:instrText>
             </w:r>
             <w:r>
               <w:rPr>
@@ -4879,7 +4870,7 @@
               <w14:ligatures w14:val="standardContextual"/>
             </w:rPr>
           </w:pPr>
-          <w:hyperlink w:anchor="_Toc243296817" w:history="1">
+          <w:hyperlink w:anchor="_Toc243299585" w:history="1">
             <w:r>
               <w:rPr>
                 <w:rStyle w:val="Hyperlink"/>
@@ -4903,7 +4894,7 @@
               <w:rPr>
                 <w:noProof/>
               </w:rPr>
-              <w:instrText xml:space="preserve"> PAGEREF _Toc243296817 \h </w:instrText>
+              <w:instrText xml:space="preserve"> PAGEREF _Toc243299585 \h </w:instrText>
             </w:r>
             <w:r>
               <w:rPr>
@@ -4943,7 +4934,7 @@
               <w14:ligatures w14:val="standardContextual"/>
             </w:rPr>
           </w:pPr>
-          <w:hyperlink w:anchor="_Toc243296818" w:history="1">
+          <w:hyperlink w:anchor="_Toc243299586" w:history="1">
             <w:r>
               <w:rPr>
                 <w:rStyle w:val="Hyperlink"/>
@@ -4967,7 +4958,7 @@
               <w:rPr>
                 <w:noProof/>
               </w:rPr>
-              <w:instrText xml:space="preserve"> PAGEREF _Toc243296818 \h </w:instrText>
+              <w:instrText xml:space="preserve"> PAGEREF _Toc243299586 \h </w:instrText>
             </w:r>
             <w:r>
               <w:rPr>
@@ -5007,7 +4998,7 @@
               <w14:ligatures w14:val="standardContextual"/>
             </w:rPr>
           </w:pPr>
-          <w:hyperlink w:anchor="_Toc243296819" w:history="1">
+          <w:hyperlink w:anchor="_Toc243299587" w:history="1">
             <w:r>
               <w:rPr>
                 <w:rStyle w:val="Hyperlink"/>
@@ -5031,7 +5022,7 @@
               <w:rPr>
                 <w:noProof/>
               </w:rPr>
-              <w:instrText xml:space="preserve"> PAGEREF _Toc243296819 \h </w:instrText>
+              <w:instrText xml:space="preserve"> PAGEREF _Toc243299587 \h </w:instrText>
             </w:r>
             <w:r>
               <w:rPr>
@@ -5073,7 +5064,7 @@
               <w14:ligatures w14:val="standardContextual"/>
             </w:rPr>
           </w:pPr>
-          <w:hyperlink w:anchor="_Toc243296820" w:history="1">
+          <w:hyperlink w:anchor="_Toc243299588" w:history="1">
             <w:r>
               <w:rPr>
                 <w:rStyle w:val="Hyperlink"/>
@@ -5097,7 +5088,7 @@
               <w:rPr>
                 <w:noProof/>
               </w:rPr>
-              <w:instrText xml:space="preserve"> PAGEREF _Toc243296820 \h </w:instrText>
+              <w:instrText xml:space="preserve"> PAGEREF _Toc243299588 \h </w:instrText>
             </w:r>
             <w:r>
               <w:rPr>
@@ -5139,7 +5130,7 @@
               <w14:ligatures w14:val="standardContextual"/>
             </w:rPr>
           </w:pPr>
-          <w:hyperlink w:anchor="_Toc243296821" w:history="1">
+          <w:hyperlink w:anchor="_Toc243299589" w:history="1">
             <w:r>
               <w:rPr>
                 <w:rStyle w:val="Hyperlink"/>
@@ -5163,7 +5154,7 @@
               <w:rPr>
                 <w:noProof/>
               </w:rPr>
-              <w:instrText xml:space="preserve"> PAGEREF _Toc243296821 \h </w:instrText>
+              <w:instrText xml:space="preserve"> PAGEREF _Toc243299589 \h </w:instrText>
             </w:r>
             <w:r>
               <w:rPr>
@@ -5205,7 +5196,7 @@
               <w14:ligatures w14:val="standardContextual"/>
             </w:rPr>
           </w:pPr>
-          <w:hyperlink w:anchor="_Toc243296822" w:history="1">
+          <w:hyperlink w:anchor="_Toc243299590" w:history="1">
             <w:r>
               <w:rPr>
                 <w:rStyle w:val="Hyperlink"/>
@@ -5229,7 +5220,7 @@
               <w:rPr>
                 <w:noProof/>
               </w:rPr>
-              <w:instrText xml:space="preserve"> PAGEREF _Toc243296822 \h </w:instrText>
+              <w:instrText xml:space="preserve"> PAGEREF _Toc243299590 \h </w:instrText>
             </w:r>
             <w:r>
               <w:rPr>
@@ -5271,7 +5262,7 @@
               <w14:ligatures w14:val="standardContextual"/>
             </w:rPr>
           </w:pPr>
-          <w:hyperlink w:anchor="_Toc243296823" w:history="1">
+          <w:hyperlink w:anchor="_Toc243299591" w:history="1">
             <w:r>
               <w:rPr>
                 <w:rStyle w:val="Hyperlink"/>
@@ -5295,7 +5286,7 @@
               <w:rPr>
                 <w:noProof/>
               </w:rPr>
-              <w:instrText xml:space="preserve"> PAGEREF _Toc243296823 \h </w:instrText>
+              <w:instrText xml:space="preserve"> PAGEREF _Toc243299591 \h </w:instrText>
             </w:r>
             <w:r>
               <w:rPr>
@@ -5337,7 +5328,7 @@
               <w14:ligatures w14:val="standardContextual"/>
             </w:rPr>
           </w:pPr>
-          <w:hyperlink w:anchor="_Toc243296824" w:history="1">
+          <w:hyperlink w:anchor="_Toc243299592" w:history="1">
             <w:r>
               <w:rPr>
                 <w:rStyle w:val="Hyperlink"/>
@@ -5361,7 +5352,7 @@
               <w:rPr>
                 <w:noProof/>
               </w:rPr>
-              <w:instrText xml:space="preserve"> PAGEREF _Toc243296824 \h </w:instrText>
+              <w:instrText xml:space="preserve"> PAGEREF _Toc243299592 \h </w:instrText>
             </w:r>
             <w:r>
               <w:rPr>
@@ -5403,7 +5394,7 @@
               <w14:ligatures w14:val="standardContextual"/>
             </w:rPr>
           </w:pPr>
-          <w:hyperlink w:anchor="_Toc243296825" w:history="1">
+          <w:hyperlink w:anchor="_Toc243299593" w:history="1">
             <w:r>
               <w:rPr>
                 <w:rStyle w:val="Hyperlink"/>
@@ -5427,7 +5418,7 @@
               <w:rPr>
                 <w:noProof/>
               </w:rPr>
-              <w:instrText xml:space="preserve"> PAGEREF _Toc243296825 \h </w:instrText>
+              <w:instrText xml:space="preserve"> PAGEREF _Toc243299593 \h </w:instrText>
             </w:r>
             <w:r>
               <w:rPr>
@@ -5469,7 +5460,7 @@
               <w14:ligatures w14:val="standardContextual"/>
             </w:rPr>
           </w:pPr>
-          <w:hyperlink w:anchor="_Toc243296826" w:history="1">
+          <w:hyperlink w:anchor="_Toc243299594" w:history="1">
             <w:r>
               <w:rPr>
                 <w:rStyle w:val="Hyperlink"/>
@@ -5493,7 +5484,7 @@
               <w:rPr>
                 <w:noProof/>
               </w:rPr>
-              <w:instrText xml:space="preserve"> PAGEREF _Toc243296826 \h </w:instrText>
+              <w:instrText xml:space="preserve"> PAGEREF _Toc243299594 \h </w:instrText>
             </w:r>
             <w:r>
               <w:rPr>
@@ -5542,9 +5533,8 @@
       <w:pPr>
         <w:pStyle w:val="Ttulo1"/>
       </w:pPr>
-      <w:bookmarkStart w:id="0" w:name="_Toc243296781"/>
-      <w:r>
-        <w:lastRenderedPageBreak/>
+      <w:bookmarkStart w:id="0" w:name="_Toc243299549"/>
+      <w:r>
         <w:t>1 INTRODUÇÃO</w:t>
       </w:r>
       <w:bookmarkEnd w:id="0"/>
@@ -5615,9 +5605,8 @@
       <w:pPr>
         <w:pStyle w:val="Ttulo2"/>
       </w:pPr>
-      <w:bookmarkStart w:id="1" w:name="_Toc243296782"/>
-      <w:r>
-        <w:lastRenderedPageBreak/>
+      <w:bookmarkStart w:id="1" w:name="_Toc243299550"/>
+      <w:r>
         <w:t>1.1 OBJETIVOS</w:t>
       </w:r>
       <w:bookmarkEnd w:id="1"/>
@@ -5626,7 +5615,7 @@
       <w:pPr>
         <w:pStyle w:val="Ttulo3"/>
       </w:pPr>
-      <w:bookmarkStart w:id="2" w:name="_Toc243296783"/>
+      <w:bookmarkStart w:id="2" w:name="_Toc243299551"/>
       <w:r>
         <w:t>1.1.1 Objetivo geral</w:t>
       </w:r>
@@ -5645,7 +5634,7 @@
       <w:pPr>
         <w:pStyle w:val="Ttulo3"/>
       </w:pPr>
-      <w:bookmarkStart w:id="3" w:name="_Toc243296784"/>
+      <w:bookmarkStart w:id="3" w:name="_Toc243299552"/>
       <w:r>
         <w:t>1.1.2 Objetivos específicos</w:t>
       </w:r>
@@ -5753,7 +5742,7 @@
       <w:pPr>
         <w:pStyle w:val="Ttulo2"/>
       </w:pPr>
-      <w:bookmarkStart w:id="4" w:name="_Toc243296785"/>
+      <w:bookmarkStart w:id="4" w:name="_Toc243299553"/>
       <w:r>
         <w:t>1.2 ORGANIZAÇÃO DO RELATÓRIO</w:t>
       </w:r>
@@ -5765,20 +5754,15 @@
         <w:jc w:val="both"/>
       </w:pPr>
       <w:r>
-        <w:t xml:space="preserve">A seção 2 apresenta a fundamentação teórica; a seção 3 descreve materiais e métodos; a seção 4 reúne os resultados — a primeira versão do software, a avaliação formativa, a evolução posterior e a avaliação da aprendizagem; a seção 5 compara o </w:t>
-      </w:r>
-      <w:r>
-        <w:lastRenderedPageBreak/>
-        <w:t>que foi feito com a proposta e discute as decisões de projeto e as limitações; e a seção 6 traz as considerações finais.</w:t>
+        <w:t>A seção 2 apresenta a fundamentação teórica; a seção 3 descreve materiais e métodos; a seção 4 reúne os resultados — a primeira versão do software, a avaliação formativa, a evolução posterior e a avaliação da aprendizagem; a seção 5 compara o que foi feito com a proposta e discute as decisões de projeto e as limitações; e a seção 6 traz as considerações finais.</w:t>
       </w:r>
     </w:p>
     <w:p>
       <w:pPr>
         <w:pStyle w:val="Ttulo1"/>
       </w:pPr>
-      <w:bookmarkStart w:id="5" w:name="_Toc243296786"/>
-      <w:r>
-        <w:lastRenderedPageBreak/>
+      <w:bookmarkStart w:id="5" w:name="_Toc243299554"/>
+      <w:r>
         <w:t>2 FUNDAMENTAÇÃO TEÓRICA</w:t>
       </w:r>
       <w:bookmarkEnd w:id="5"/>
@@ -5796,7 +5780,7 @@
       <w:pPr>
         <w:pStyle w:val="Ttulo2"/>
       </w:pPr>
-      <w:bookmarkStart w:id="6" w:name="_Toc243296787"/>
+      <w:bookmarkStart w:id="6" w:name="_Toc243299555"/>
       <w:r>
         <w:t>2.1 MARCADORES BIOQUÍMICOS NO DIAGNÓSTICO CLÍNICO</w:t>
       </w:r>
@@ -5828,7 +5812,7 @@
       <w:pPr>
         <w:pStyle w:val="LegendaABNT"/>
       </w:pPr>
-      <w:bookmarkStart w:id="7" w:name="_Toc243296839"/>
+      <w:bookmarkStart w:id="7" w:name="_Toc243299607"/>
       <w:r>
         <w:t xml:space="preserve">Quadro </w:t>
       </w:r>
@@ -6366,7 +6350,7 @@
       <w:pPr>
         <w:pStyle w:val="Ttulo2"/>
       </w:pPr>
-      <w:bookmarkStart w:id="8" w:name="_Toc243296788"/>
+      <w:bookmarkStart w:id="8" w:name="_Toc243299556"/>
       <w:r>
         <w:t>2.2 PRÁTICA DE RECUPERAÇÃO E REPETIÇÃO ESPAÇADA</w:t>
       </w:r>
@@ -6378,11 +6362,10 @@
         <w:jc w:val="both"/>
       </w:pPr>
       <w:r>
-        <w:t xml:space="preserve">Roediger e Karpicke (2006) compararam estudantes que, depois de ler textos, fizeram testes de recordação livre com estudantes que releram o material o mesmo </w:t>
-      </w:r>
-      <w:r>
-        <w:lastRenderedPageBreak/>
-        <w:t xml:space="preserve">número de vezes. No teste final aplicado cinco minutos depois, a releitura levou vantagem; após dois dias e após uma semana, quem havia sido testado lembrou substancialmente mais — embora a releitura tivesse aumentado a confiança dos estudantes em sua memória. O teste, portanto, não apenas mede a aprendizagem: também a produz. Nas profissões da saúde, a prática de recuperação foi amplamente adotada, sobretudo na preparação para provas, mas ainda encontra barreiras à adoção pelos próprios estudantes (Serra </w:t>
+        <w:t>Roediger e Karpicke (2006) compararam estudantes que, depois de ler textos, fizeram testes de recordação livre com estudantes que releram o material o mesmo número de vezes. No teste final aplicado cinco minutos depois, a releitura levou vantagem; após dois dias e após uma semana, quem havia sido testado lembrou substancialmente mais — embora a releitura tivesse aumentado a confiança dos estudantes em sua memória. O teste, portanto, não apenas mede a aprendizagem: também a produz. Nas profissões da saúde, a</w:t>
+      </w:r>
+      <w:r>
+        <w:t xml:space="preserve"> prática de recuperação foi amplamente adotada, sobretudo na preparação para provas, mas ainda encontra barreiras à adoção pelos próprios estudantes (Serra </w:t>
       </w:r>
       <w:r>
         <w:rPr>
@@ -6447,7 +6430,7 @@
       <w:pPr>
         <w:pStyle w:val="Ttulo2"/>
       </w:pPr>
-      <w:bookmarkStart w:id="9" w:name="_Toc243296789"/>
+      <w:bookmarkStart w:id="9" w:name="_Toc243299557"/>
       <w:r>
         <w:t>2.3 O ALGORITMO SM-2</w:t>
       </w:r>
@@ -6516,7 +6499,6 @@
         <w:jc w:val="both"/>
       </w:pPr>
       <w:r>
-        <w:lastRenderedPageBreak/>
         <w:t>Com nota 4 o fator não muda; com nota 5 aumenta 0,1; com nota 3 diminui 0,14; e com nota 0 diminui 0,8. Notas abaixo de 3 indicam falha: as repetições do item recomeçam do início, sem alterar o EF. Ao final de cada sessão diária, o algoritmo original ainda manda repetir todos os itens que receberam nota inferior a 4, até que cada um alcance essa nota (Wozniak, 1990). O BioquímicaEDU parte dessas regras com três adaptações, descritas na seção 4.2.</w:t>
       </w:r>
     </w:p>
@@ -6524,7 +6506,7 @@
       <w:pPr>
         <w:pStyle w:val="Ttulo2"/>
       </w:pPr>
-      <w:bookmarkStart w:id="10" w:name="_Toc243296790"/>
+      <w:bookmarkStart w:id="10" w:name="_Toc243299558"/>
       <w:r>
         <w:t>2.4 GAMIFICAÇÃO E MOTIVAÇÃO</w:t>
       </w:r>
@@ -6602,7 +6584,7 @@
       <w:pPr>
         <w:pStyle w:val="Ttulo2"/>
       </w:pPr>
-      <w:bookmarkStart w:id="11" w:name="_Toc243296791"/>
+      <w:bookmarkStart w:id="11" w:name="_Toc243299559"/>
       <w:r>
         <w:t>2.5 METACOGNIÇÃO E CALIBRAÇÃO</w:t>
       </w:r>
@@ -6614,11 +6596,7 @@
         <w:jc w:val="both"/>
       </w:pPr>
       <w:r>
-        <w:t xml:space="preserve">Calibração é a correspondência entre o desempenho que a pessoa julga ter e o desempenho real. Kruger e Dunning (1999) mostraram que participantes no quartil </w:t>
-      </w:r>
-      <w:r>
-        <w:lastRenderedPageBreak/>
-        <w:t xml:space="preserve">inferior de testes de gramática, lógica e humor se situavam, em média, no 12º percentil, mas se estimavam no 62º. A má calibração também é estável: estudantes de baixo desempenho mantiveram previsões de nota otimistas, e a confiança nelas, ao longo de quatro provas de um semestre (Karaca </w:t>
+        <w:t xml:space="preserve">Calibração é a correspondência entre o desempenho que a pessoa julga ter e o desempenho real. Kruger e Dunning (1999) mostraram que participantes no quartil inferior de testes de gramática, lógica e humor se situavam, em média, no 12º percentil, mas se estimavam no 62º. A má calibração também é estável: estudantes de baixo desempenho mantiveram previsões de nota otimistas, e a confiança nelas, ao longo de quatro provas de um semestre (Karaca </w:t>
       </w:r>
       <w:r>
         <w:rPr>
@@ -6654,9 +6632,8 @@
       <w:pPr>
         <w:pStyle w:val="Ttulo1"/>
       </w:pPr>
-      <w:bookmarkStart w:id="12" w:name="_Toc243296792"/>
-      <w:r>
-        <w:lastRenderedPageBreak/>
+      <w:bookmarkStart w:id="12" w:name="_Toc243299560"/>
+      <w:r>
         <w:t>3 MATERIAIS E MÉTODOS</w:t>
       </w:r>
       <w:bookmarkEnd w:id="12"/>
@@ -6665,7 +6642,7 @@
       <w:pPr>
         <w:pStyle w:val="Ttulo2"/>
       </w:pPr>
-      <w:bookmarkStart w:id="13" w:name="_Toc243296793"/>
+      <w:bookmarkStart w:id="13" w:name="_Toc243299561"/>
       <w:r>
         <w:t>3.1 NATUREZA DA PESQUISA E ETAPAS</w:t>
       </w:r>
@@ -6802,7 +6779,7 @@
       <w:pPr>
         <w:pStyle w:val="Ttulo2"/>
       </w:pPr>
-      <w:bookmarkStart w:id="14" w:name="_Toc243296794"/>
+      <w:bookmarkStart w:id="14" w:name="_Toc243299562"/>
       <w:r>
         <w:t>3.2 CURADORIA DO CONTEÚDO</w:t>
       </w:r>
@@ -6833,7 +6810,6 @@
         <w:jc w:val="both"/>
       </w:pPr>
       <w:r>
-        <w:lastRenderedPageBreak/>
         <w:t xml:space="preserve">Cada marcador foi associado a capítulos do StatPearls e do </w:t>
       </w:r>
       <w:r>
@@ -6864,7 +6840,7 @@
       <w:pPr>
         <w:pStyle w:val="Ttulo2"/>
       </w:pPr>
-      <w:bookmarkStart w:id="15" w:name="_Toc243296795"/>
+      <w:bookmarkStart w:id="15" w:name="_Toc243299563"/>
       <w:r>
         <w:t>3.3 TECNOLOGIAS UTILIZADAS</w:t>
       </w:r>
@@ -6877,18 +6853,14 @@
         <w:jc w:val="both"/>
       </w:pPr>
       <w:r>
-        <w:t xml:space="preserve">O software foi escrito em Python (Python Software Foundation, 2023), escolhido por permitir compartilhar o mesmo motor de aprendizagem e os mesmos </w:t>
-      </w:r>
-      <w:r>
-        <w:lastRenderedPageBreak/>
-        <w:t>dados entre as interfaces para computador e para celular. O Quadro 2 lista as tecnologias empregadas.</w:t>
+        <w:t>O software foi escrito em Python (Python Software Foundation, 2023), escolhido por permitir compartilhar o mesmo motor de aprendizagem e os mesmos dados entre as interfaces para computador e para celular. O Quadro 2 lista as tecnologias empregadas.</w:t>
       </w:r>
     </w:p>
     <w:p>
       <w:pPr>
         <w:pStyle w:val="LegendaABNT"/>
       </w:pPr>
-      <w:bookmarkStart w:id="16" w:name="_Toc243296840"/>
+      <w:bookmarkStart w:id="16" w:name="_Toc243299608"/>
       <w:r>
         <w:t xml:space="preserve">Quadro </w:t>
       </w:r>
@@ -8438,7 +8410,7 @@
       <w:pPr>
         <w:pStyle w:val="Ttulo2"/>
       </w:pPr>
-      <w:bookmarkStart w:id="17" w:name="_Toc243296796"/>
+      <w:bookmarkStart w:id="17" w:name="_Toc243299564"/>
       <w:r>
         <w:t>3.4 ARQUITETURA DO SOFTWARE</w:t>
       </w:r>
@@ -8451,18 +8423,14 @@
         <w:jc w:val="both"/>
       </w:pPr>
       <w:r>
-        <w:t xml:space="preserve">O software foi organizado em três camadas (Figura 1). Na camada de interfaces estão as três versões; no núcleo, o motor de aprendizagem e o tutor; e na camada de dados, o conteúdo, apenas lido, e o progresso do estudante, lido e gravado pelo motor. </w:t>
-      </w:r>
-      <w:r>
-        <w:lastRenderedPageBreak/>
-        <w:t>Como o motor não depende de nenhuma interface, as mesmas regras de agendamento valem no computador e no celular.</w:t>
+        <w:t>O software foi organizado em três camadas (Figura 1). Na camada de interfaces estão as três versões; no núcleo, o motor de aprendizagem e o tutor; e na camada de dados, o conteúdo, apenas lido, e o progresso do estudante, lido e gravado pelo motor. Como o motor não depende de nenhuma interface, as mesmas regras de agendamento valem no computador e no celular.</w:t>
       </w:r>
     </w:p>
     <w:p>
       <w:pPr>
         <w:pStyle w:val="LegendaABNT"/>
       </w:pPr>
-      <w:bookmarkStart w:id="18" w:name="_Toc243296827"/>
+      <w:bookmarkStart w:id="18" w:name="_Toc243299595"/>
       <w:r>
         <w:t xml:space="preserve">Figura </w:t>
       </w:r>
@@ -8500,7 +8468,7 @@
           <w:noProof/>
         </w:rPr>
         <w:drawing>
-          <wp:inline distT="0" distB="0" distL="0" distR="0" wp14:anchorId="004DCBFF" wp14:editId="4397B4BA">
+          <wp:inline distT="0" distB="0" distL="0" distR="0" wp14:anchorId="2DC13974" wp14:editId="68C5EC42">
             <wp:extent cx="5762625" cy="3714750"/>
             <wp:effectExtent l="0" t="0" r="0" b="0"/>
             <wp:docPr id="1" name="arquitetura.png" descr="Arquitetura do BioquímicaEDU" title="Arquitetura do BioquímicaEDU"/>
@@ -8563,7 +8531,7 @@
       <w:pPr>
         <w:pStyle w:val="Ttulo2"/>
       </w:pPr>
-      <w:bookmarkStart w:id="19" w:name="_Toc243296797"/>
+      <w:bookmarkStart w:id="19" w:name="_Toc243299565"/>
       <w:r>
         <w:t>3.5 VERIFICAÇÃO DO SOFTWARE</w:t>
       </w:r>
@@ -8585,11 +8553,7 @@
         <w:t>flashcards</w:t>
       </w:r>
       <w:r>
-        <w:t xml:space="preserve">, um quiz inteiro, um caso clínico, os dois jogos, a calculadora da TFGe e o tutor, conferindo </w:t>
-      </w:r>
-      <w:r>
-        <w:lastRenderedPageBreak/>
-        <w:t>ao final se o painel inicial reflete a sessão; ele roda nos formatos de celular e de computador e confere também os recursos de acessibilidade e a troca de formato ao redimensionar a janela. Outros testes cobrem as versões clássicas para computador, as regras dos jogos, o tutor em nuvem (seção 4.7.5), o login com Google, com o serviço simulado, e o próprio conteúdo: a presença de todos os marcadores da proposta, c</w:t>
+        <w:t>, um quiz inteiro, um caso clínico, os dois jogos, a calculadora da TFGe e o tutor, conferindo ao final se o painel inicial reflete a sessão; ele roda nos formatos de celular e de computador e confere também os recursos de acessibilidade e a troca de formato ao redimensionar a janela. Outros testes cobrem as versões clássicas para computador, as regras dos jogos, o tutor em nuvem (seção 4.7.5), o login com Google, com o serviço simulado, e o próprio conteúdo: a presença de todos os marcadores da proposta, c</w:t>
       </w:r>
       <w:r>
         <w:t>ada um com fontes, exemplos e vídeos; a ausência de caracteres que as fontes do aplicativo não conseguem desenhar; e a calculadora, que deve reproduzir valores da equação CKD-EPI 2021 e os limites das categorias da KDIGO. Os testes gravam numa pasta temporária, de modo que o progresso real do usuário não é lido nem alterado.</w:t>
@@ -8608,7 +8572,7 @@
       <w:pPr>
         <w:pStyle w:val="Ttulo2"/>
       </w:pPr>
-      <w:bookmarkStart w:id="20" w:name="_Toc243296798"/>
+      <w:bookmarkStart w:id="20" w:name="_Toc243299566"/>
       <w:r>
         <w:t>3.6 AVALIAÇÃO COM USUÁRIOS</w:t>
       </w:r>
@@ -8627,7 +8591,7 @@
       <w:pPr>
         <w:pStyle w:val="Ttulo3"/>
       </w:pPr>
-      <w:bookmarkStart w:id="21" w:name="_Toc243296799"/>
+      <w:bookmarkStart w:id="21" w:name="_Toc243299567"/>
       <w:r>
         <w:t>3.6.1 Avaliação formativa</w:t>
       </w:r>
@@ -8642,18 +8606,14 @@
         <w:t>Durante o desenvolvimento, o software foi apresentado a 12 pessoas em conversas online, a maioria pelo Microsoft Teams e algumas pelo Zoom: dois profissionais que atuam na área e se formaram há bastante tempo; cinco recém-formados, em mestrado ou já trabalhando; e cinco estudantes, dos quais alguns já haviam cursado a disciplina, outros a cursavam e outros ainda iriam cursá-la. Em cada conversa, o autor mostrava o aplicativo funcionando, perguntava o que a pessoa queria ver ou testar e conversava sobre as d</w:t>
       </w:r>
       <w:r>
-        <w:t xml:space="preserve">úvidas, as dificuldades e as sugestões que surgiam. Não houve questionário nem roteiro fixo: o objetivo era encontrar </w:t>
-      </w:r>
-      <w:r>
-        <w:lastRenderedPageBreak/>
-        <w:t>problemas e prioridades enquanto o software ainda podia mudar, e não medir a satisfação com um produto acabado.</w:t>
+        <w:t>úvidas, as dificuldades e as sugestões que surgiam. Não houve questionário nem roteiro fixo: o objetivo era encontrar problemas e prioridades enquanto o software ainda podia mudar, e não medir a satisfação com um produto acabado.</w:t>
       </w:r>
     </w:p>
     <w:p>
       <w:pPr>
         <w:pStyle w:val="Ttulo3"/>
       </w:pPr>
-      <w:bookmarkStart w:id="22" w:name="_Toc243296800"/>
+      <w:bookmarkStart w:id="22" w:name="_Toc243299568"/>
       <w:r>
         <w:t>3.6.2 Pré-teste e pós-teste</w:t>
       </w:r>
@@ -8699,7 +8659,7 @@
       <w:pPr>
         <w:pStyle w:val="Ttulo3"/>
       </w:pPr>
-      <w:bookmarkStart w:id="23" w:name="_Toc243296801"/>
+      <w:bookmarkStart w:id="23" w:name="_Toc243299569"/>
       <w:r>
         <w:t>3.6.3 Questionário de opinião</w:t>
       </w:r>
@@ -8711,18 +8671,17 @@
         <w:jc w:val="both"/>
       </w:pPr>
       <w:r>
-        <w:t xml:space="preserve">Quem já cursou a disciplina ou é formado avalia o aplicativo por um questionário com perfil em poucas categorias, afirmações numa escala de 1 (discordo totalmente) a 5 (concordo totalmente) — facilidade de uso, clareza e confiabilidade do conteúdo, qualidade das imagens e utilidade da revisão espaçada, dos casos clínicos, dos jogos, </w:t>
-      </w:r>
-      <w:r>
-        <w:lastRenderedPageBreak/>
-        <w:t>do tutor e da acessibilidade — e três perguntas abertas (Apêndice D). As afirmações são resumidas pela mediana e pelo número de respostas 4 ou 5, e os comentários, agrupados por tema.</w:t>
+        <w:t>Quem já cursou a disciplina ou é formado avalia o aplicativo por um questionário com perfil em poucas categorias, afirmações numa escala de 1 (discordo totalmente) a 5 (concordo totalmente) — facilidade de uso, clareza e confiabilidade do conteúdo, qualidade das imagens e utilidade da revisão espaçada, dos casos clínicos, dos jogos, do tutor e da acessibilidade — e três perguntas abertas (Apêndice D). As afirmações são resumidas pela mediana e pelo número de respostas 4 ou 5, e os comentários, agrupados por</w:t>
+      </w:r>
+      <w:r>
+        <w:t xml:space="preserve"> tema.</w:t>
       </w:r>
     </w:p>
     <w:p>
       <w:pPr>
         <w:pStyle w:val="Ttulo3"/>
       </w:pPr>
-      <w:bookmarkStart w:id="24" w:name="_Toc243296802"/>
+      <w:bookmarkStart w:id="24" w:name="_Toc243299570"/>
       <w:r>
         <w:t>3.6.4 Aspectos éticos e proteção de dados</w:t>
       </w:r>
@@ -8759,7 +8718,7 @@
       <w:pPr>
         <w:pStyle w:val="Ttulo2"/>
       </w:pPr>
-      <w:bookmarkStart w:id="25" w:name="_Toc243296803"/>
+      <w:bookmarkStart w:id="25" w:name="_Toc243299571"/>
       <w:r>
         <w:t>3.7 USO DE FERRAMENTAS DE INTELIGÊNCIA ARTIFICIAL</w:t>
       </w:r>
@@ -8784,9 +8743,8 @@
       <w:pPr>
         <w:pStyle w:val="Ttulo1"/>
       </w:pPr>
-      <w:bookmarkStart w:id="26" w:name="_Toc243296804"/>
-      <w:r>
-        <w:lastRenderedPageBreak/>
+      <w:bookmarkStart w:id="26" w:name="_Toc243299572"/>
+      <w:r>
         <w:t>4 RESULTADOS</w:t>
       </w:r>
       <w:bookmarkEnd w:id="26"/>
@@ -8795,7 +8753,7 @@
       <w:pPr>
         <w:pStyle w:val="Ttulo2"/>
       </w:pPr>
-      <w:bookmarkStart w:id="27" w:name="_Toc243296805"/>
+      <w:bookmarkStart w:id="27" w:name="_Toc243299573"/>
       <w:r>
         <w:t>4.1 VISÃO GERAL DO SOFTWARE</w:t>
       </w:r>
@@ -8815,7 +8773,7 @@
       <w:pPr>
         <w:pStyle w:val="LegendaABNT"/>
       </w:pPr>
-      <w:bookmarkStart w:id="28" w:name="_Toc243296841"/>
+      <w:bookmarkStart w:id="28" w:name="_Toc243299609"/>
       <w:r>
         <w:t xml:space="preserve">Quadro </w:t>
       </w:r>
@@ -9302,7 +9260,7 @@
       <w:pPr>
         <w:pStyle w:val="LegendaABNT"/>
       </w:pPr>
-      <w:bookmarkStart w:id="29" w:name="_Toc243296846"/>
+      <w:bookmarkStart w:id="29" w:name="_Toc243299614"/>
       <w:r>
         <w:t xml:space="preserve">Tabela </w:t>
       </w:r>
@@ -10682,9 +10640,8 @@
       <w:pPr>
         <w:pStyle w:val="LegendaABNT"/>
       </w:pPr>
-      <w:bookmarkStart w:id="30" w:name="_Toc243296847"/>
-      <w:r>
-        <w:lastRenderedPageBreak/>
+      <w:bookmarkStart w:id="30" w:name="_Toc243299615"/>
+      <w:r>
         <w:t xml:space="preserve">Tabela </w:t>
       </w:r>
       <w:r>
@@ -11370,7 +11327,7 @@
       <w:pPr>
         <w:pStyle w:val="Ttulo2"/>
       </w:pPr>
-      <w:bookmarkStart w:id="31" w:name="_Toc243296806"/>
+      <w:bookmarkStart w:id="31" w:name="_Toc243299574"/>
       <w:r>
         <w:t>4.2 MOTOR DE APRENDIZAGEM</w:t>
       </w:r>
@@ -11395,7 +11352,6 @@
         <w:jc w:val="both"/>
       </w:pPr>
       <w:r>
-        <w:lastRenderedPageBreak/>
         <w:t>O Quadro 4 descreve as três adaptações feitas ao SM-2 original.</w:t>
       </w:r>
     </w:p>
@@ -11403,7 +11359,7 @@
       <w:pPr>
         <w:pStyle w:val="LegendaABNT"/>
       </w:pPr>
-      <w:bookmarkStart w:id="32" w:name="_Toc243296842"/>
+      <w:bookmarkStart w:id="32" w:name="_Toc243299610"/>
       <w:r>
         <w:t xml:space="preserve">Quadro </w:t>
       </w:r>
@@ -12001,7 +11957,7 @@
       <w:pPr>
         <w:pStyle w:val="LegendaABNT"/>
       </w:pPr>
-      <w:bookmarkStart w:id="33" w:name="_Toc243296828"/>
+      <w:bookmarkStart w:id="33" w:name="_Toc243299596"/>
       <w:r>
         <w:t xml:space="preserve">Figura </w:t>
       </w:r>
@@ -12039,7 +11995,7 @@
           <w:noProof/>
         </w:rPr>
         <w:drawing>
-          <wp:inline distT="0" distB="0" distL="0" distR="0" wp14:anchorId="2DFD1B2A" wp14:editId="6207E915">
+          <wp:inline distT="0" distB="0" distL="0" distR="0" wp14:anchorId="0C058702" wp14:editId="4B1901D6">
             <wp:extent cx="5400675" cy="2971800"/>
             <wp:effectExtent l="0" t="0" r="0" b="0"/>
             <wp:docPr id="2" name="sm2_intervalos.png" descr="Intervalos calculados pelo motor em três sequências de respostas" title="Intervalos calculados pelo motor em três sequências de respostas"/>
@@ -12093,18 +12049,14 @@
         <w:jc w:val="both"/>
       </w:pPr>
       <w:r>
-        <w:t xml:space="preserve">As demais atividades também alimentam o agendamento, com as notas da Tabela 3. Para isso, o motor identifica a quais marcadores cada questão ou caso se </w:t>
-      </w:r>
-      <w:r>
-        <w:lastRenderedPageBreak/>
-        <w:t>refere, procurando no texto as siglas, os nomes e apelidos comuns (“troponina” para troponina I, por exemplo). Siglas que também são palavras do português, como “Na”, só contam na forma iônica (Na+); assim, uma frase iniciada por “Na hepatite…” não altera o agendamento do sódio. Quando nada é identificado, nada é registrado.</w:t>
+        <w:t>As demais atividades também alimentam o agendamento, com as notas da Tabela 3. Para isso, o motor identifica a quais marcadores cada questão ou caso se refere, procurando no texto as siglas, os nomes e apelidos comuns (“troponina” para troponina I, por exemplo). Siglas que também são palavras do português, como “Na”, só contam na forma iônica (Na+); assim, uma frase iniciada por “Na hepatite…” não altera o agendamento do sódio. Quando nada é identificado, nada é registrado.</w:t>
       </w:r>
     </w:p>
     <w:p>
       <w:pPr>
         <w:pStyle w:val="LegendaABNT"/>
       </w:pPr>
-      <w:bookmarkStart w:id="34" w:name="_Toc243296848"/>
+      <w:bookmarkStart w:id="34" w:name="_Toc243299616"/>
       <w:r>
         <w:t xml:space="preserve">Tabela </w:t>
       </w:r>
@@ -12924,7 +12876,6 @@
         <w:jc w:val="both"/>
       </w:pPr>
       <w:r>
-        <w:lastRenderedPageBreak/>
         <w:t>Por fim, o painel mostra a sequência de dias de estudo e sete marcos, todos ligados à aprendizagem e não ao tempo de uso: primeiro estudo, todos os marcadores estudados, primeira retenção, 10 marcadores consolidados, metade consolidada, sete dias seguidos de estudo e confiança alinhada ao desempenho. A sequência é contada a partir do dia anterior quando o estudante ainda não estudou no dia corrente, para informar sem punir.</w:t>
       </w:r>
     </w:p>
@@ -12932,7 +12883,7 @@
       <w:pPr>
         <w:pStyle w:val="Ttulo2"/>
       </w:pPr>
-      <w:bookmarkStart w:id="35" w:name="_Toc243296807"/>
+      <w:bookmarkStart w:id="35" w:name="_Toc243299575"/>
       <w:r>
         <w:t>4.3 VERSÃO PARA DISPOSITIVOS MÓVEIS</w:t>
       </w:r>
@@ -12952,7 +12903,7 @@
       <w:pPr>
         <w:pStyle w:val="LegendaABNT"/>
       </w:pPr>
-      <w:bookmarkStart w:id="36" w:name="_Toc243296829"/>
+      <w:bookmarkStart w:id="36" w:name="_Toc243299597"/>
       <w:r>
         <w:t xml:space="preserve">Figura </w:t>
       </w:r>
@@ -12990,7 +12941,7 @@
           <w:noProof/>
         </w:rPr>
         <w:drawing>
-          <wp:inline distT="0" distB="0" distL="0" distR="0" wp14:anchorId="6485A7C3" wp14:editId="7681DB92">
+          <wp:inline distT="0" distB="0" distL="0" distR="0" wp14:anchorId="19684BBB" wp14:editId="512E085E">
             <wp:extent cx="5762625" cy="4086225"/>
             <wp:effectExtent l="0" t="0" r="0" b="0"/>
             <wp:docPr id="3" name="telas_inicio_estudo.png" descr="Início e estudo na versão móvel" title="Início e estudo na versão móvel"/>
@@ -13053,7 +13004,6 @@
         <w:jc w:val="both"/>
       </w:pPr>
       <w:r>
-        <w:lastRenderedPageBreak/>
         <w:t>A tela inicial responde primeiro à pergunta “o que estudar agora?”: o cartão em destaque mostra a revisão do dia e o tempo estimado. Abaixo vêm os atalhos para as atividades, o estado da memória, os marcadores mais frágeis, o domínio por sistema, a autoavaliação, a constância das últimas quatro semanas e os marcos. No detalhe de cada marcador (Figura 3c), as abas reúnem visão geral, exemplos clínicos, diagramas, fontes e vídeos.</w:t>
       </w:r>
     </w:p>
@@ -13061,7 +13011,7 @@
       <w:pPr>
         <w:pStyle w:val="LegendaABNT"/>
       </w:pPr>
-      <w:bookmarkStart w:id="37" w:name="_Toc243296830"/>
+      <w:bookmarkStart w:id="37" w:name="_Toc243299598"/>
       <w:r>
         <w:t xml:space="preserve">Figura </w:t>
       </w:r>
@@ -13109,7 +13059,7 @@
           <w:noProof/>
         </w:rPr>
         <w:drawing>
-          <wp:inline distT="0" distB="0" distL="0" distR="0" wp14:anchorId="6ED17A47" wp14:editId="754CFAF0">
+          <wp:inline distT="0" distB="0" distL="0" distR="0" wp14:anchorId="6E03EA44" wp14:editId="273F3707">
             <wp:extent cx="5762625" cy="4086225"/>
             <wp:effectExtent l="0" t="0" r="0" b="0"/>
             <wp:docPr id="4" name="telas_revisao.png" descr="Revisão espaçada e flashcards na versão móvel" title="Revisão espaçada e flashcards na versão móvel"/>
@@ -13199,9 +13149,8 @@
       <w:pPr>
         <w:pStyle w:val="LegendaABNT"/>
       </w:pPr>
-      <w:bookmarkStart w:id="38" w:name="_Toc243296831"/>
-      <w:r>
-        <w:lastRenderedPageBreak/>
+      <w:bookmarkStart w:id="38" w:name="_Toc243299599"/>
+      <w:r>
         <w:t xml:space="preserve">Figura </w:t>
       </w:r>
       <w:r>
@@ -13238,7 +13187,7 @@
           <w:noProof/>
         </w:rPr>
         <w:drawing>
-          <wp:inline distT="0" distB="0" distL="0" distR="0" wp14:anchorId="2543C0DA" wp14:editId="334A21D2">
+          <wp:inline distT="0" distB="0" distL="0" distR="0" wp14:anchorId="3F2ED8FE" wp14:editId="03474CC3">
             <wp:extent cx="5762625" cy="4086225"/>
             <wp:effectExtent l="0" t="0" r="0" b="0"/>
             <wp:docPr id="5" name="telas_pratica_tutor.png" descr="Prática e tutor na versão móvel" title="Prática e tutor na versão móvel"/>
@@ -13340,9 +13289,8 @@
       <w:pPr>
         <w:pStyle w:val="Ttulo2"/>
       </w:pPr>
-      <w:bookmarkStart w:id="39" w:name="_Toc243296808"/>
-      <w:r>
-        <w:lastRenderedPageBreak/>
+      <w:bookmarkStart w:id="39" w:name="_Toc243299576"/>
+      <w:r>
         <w:t>4.4 VERSÕES PARA COMPUTADOR</w:t>
       </w:r>
       <w:bookmarkEnd w:id="39"/>
@@ -13361,7 +13309,7 @@
       <w:pPr>
         <w:pStyle w:val="LegendaABNT"/>
       </w:pPr>
-      <w:bookmarkStart w:id="40" w:name="_Toc243296832"/>
+      <w:bookmarkStart w:id="40" w:name="_Toc243299600"/>
       <w:r>
         <w:t xml:space="preserve">Figura </w:t>
       </w:r>
@@ -13399,7 +13347,7 @@
           <w:noProof/>
         </w:rPr>
         <w:drawing>
-          <wp:inline distT="0" distB="0" distL="0" distR="0" wp14:anchorId="3E0038BA" wp14:editId="298CFD55">
+          <wp:inline distT="0" distB="0" distL="0" distR="0" wp14:anchorId="61588910" wp14:editId="1C8F1BCF">
             <wp:extent cx="5762625" cy="3981450"/>
             <wp:effectExtent l="0" t="0" r="0" b="0"/>
             <wp:docPr id="6" name="desktop_painel.png" descr="Painel inicial da versão para computador" title="Painel inicial da versão para computador"/>
@@ -13459,7 +13407,7 @@
       <w:pPr>
         <w:pStyle w:val="Ttulo2"/>
       </w:pPr>
-      <w:bookmarkStart w:id="41" w:name="_Toc243296809"/>
+      <w:bookmarkStart w:id="41" w:name="_Toc243299577"/>
       <w:r>
         <w:t>4.5 IDENTIDADE VISUAL</w:t>
       </w:r>
@@ -13472,18 +13420,14 @@
         <w:jc w:val="both"/>
       </w:pPr>
       <w:r>
-        <w:t xml:space="preserve">A logo combina um hexágono, que remete ao anel benzênico e à química, com uma gota, que remete à amostra de sangue de onde vêm os marcadores (Figura 7). </w:t>
-      </w:r>
-      <w:r>
-        <w:lastRenderedPageBreak/>
-        <w:t>Ela é gerada por um programa a partir de uma única geometria, que produz arquivos vetoriais (SVG), com o texto convertido em contornos, e imagens PNG, nas variações horizontal, vertical, símbolo e negativa. O ícone e a tela de abertura do aplicativo usam o mesmo símbolo.</w:t>
+        <w:t>A logo combina um hexágono, que remete ao anel benzênico e à química, com uma gota, que remete à amostra de sangue de onde vêm os marcadores (Figura 7). Ela é gerada por um programa a partir de uma única geometria, que produz arquivos vetoriais (SVG), com o texto convertido em contornos, e imagens PNG, nas variações horizontal, vertical, símbolo e negativa. O ícone e a tela de abertura do aplicativo usam o mesmo símbolo.</w:t>
       </w:r>
     </w:p>
     <w:p>
       <w:pPr>
         <w:pStyle w:val="LegendaABNT"/>
       </w:pPr>
-      <w:bookmarkStart w:id="42" w:name="_Toc243296833"/>
+      <w:bookmarkStart w:id="42" w:name="_Toc243299601"/>
       <w:r>
         <w:t xml:space="preserve">Figura </w:t>
       </w:r>
@@ -13521,7 +13465,7 @@
           <w:noProof/>
         </w:rPr>
         <w:drawing>
-          <wp:inline distT="0" distB="0" distL="0" distR="0" wp14:anchorId="20DF5D7A" wp14:editId="3411E29E">
+          <wp:inline distT="0" distB="0" distL="0" distR="0" wp14:anchorId="392A9B62" wp14:editId="3297C782">
             <wp:extent cx="3600450" cy="866775"/>
             <wp:effectExtent l="0" t="0" r="0" b="0"/>
             <wp:docPr id="7" name="horizontal.png" descr="Logo do BioquímicaEDU" title="Logo do BioquímicaEDU"/>
@@ -13572,7 +13516,7 @@
       <w:pPr>
         <w:pStyle w:val="Ttulo2"/>
       </w:pPr>
-      <w:bookmarkStart w:id="43" w:name="_Toc243296810"/>
+      <w:bookmarkStart w:id="43" w:name="_Toc243299578"/>
       <w:r>
         <w:t>4.6 AVALIAÇÃO FORMATIVA</w:t>
       </w:r>
@@ -13603,7 +13547,7 @@
       <w:pPr>
         <w:pStyle w:val="Ttulo2"/>
       </w:pPr>
-      <w:bookmarkStart w:id="44" w:name="_Toc243296811"/>
+      <w:bookmarkStart w:id="44" w:name="_Toc243299579"/>
       <w:r>
         <w:t>4.7 EVOLUÇÃO DO SOFTWARE</w:t>
       </w:r>
@@ -13615,21 +13559,17 @@
         <w:jc w:val="both"/>
       </w:pPr>
       <w:r>
-        <w:t xml:space="preserve">Depois da primeira versão, o software continuou a ser desenvolvido, orientado pelas sugestões da avaliação formativa e por uma conferência, item por item, da proposta do projeto, que mostrou o que ainda faltava: dois marcadores, as frações da bilirrubina, os jogos didáticos e uma visualização gráfica interativa. As mudanças são descritas aqui, separadas das seções 4.1 a 4.5, para que se distinga o que existia na </w:t>
-      </w:r>
-      <w:r>
-        <w:lastRenderedPageBreak/>
-        <w:t>primeira versão do que veio depois. Além dos itens da proposta, foram tratados os intervalos da revisão, que não diferenciavam de imediato as avaliações “Difícil”, “Bom” e “Fácil”; a existência de uma interface diferente para cada aparelho; a acessibilidade, que ainda não havia sido tratada de forma sistemática; o tutor, que passou a contar, como opção, com um modelo de linguagem em nuvem; a entrada no aplicativo, com conta Google opcional; e a distribuição, com site e instaladores. Com essas mudanças, o có</w:t>
-      </w:r>
-      <w:r>
-        <w:t>digo-fonte passou de 7.905 para 13.571 linhas não vazias, excluídos os comentários.</w:t>
+        <w:t xml:space="preserve">Depois da primeira versão, o software continuou a ser desenvolvido, orientado pelas sugestões da avaliação formativa e por uma conferência, item por item, da proposta do projeto, que mostrou o que ainda faltava: dois marcadores, as frações da bilirrubina, os jogos didáticos e uma visualização gráfica interativa. As mudanças são descritas aqui, separadas das seções 4.1 a 4.5, para que se distinga o que existia na primeira versão do que veio depois. Além dos itens da proposta, foram tratados os intervalos da </w:t>
+      </w:r>
+      <w:r>
+        <w:t>revisão, que não diferenciavam de imediato as avaliações “Difícil”, “Bom” e “Fácil”; a existência de uma interface diferente para cada aparelho; a acessibilidade, que ainda não havia sido tratada de forma sistemática; o tutor, que passou a contar, como opção, com um modelo de linguagem em nuvem; a entrada no aplicativo, com conta Google opcional; e a distribuição, com site e instaladores. Com essas mudanças, o código-fonte passou de 7.905 para 13.571 linhas não vazias, excluídos os comentários.</w:t>
       </w:r>
     </w:p>
     <w:p>
       <w:pPr>
         <w:pStyle w:val="Ttulo3"/>
       </w:pPr>
-      <w:bookmarkStart w:id="45" w:name="_Toc243296812"/>
+      <w:bookmarkStart w:id="45" w:name="_Toc243299580"/>
       <w:r>
         <w:t>4.7.1 Itens da proposta: novos marcadores, jogos e régua das faixas</w:t>
       </w:r>
@@ -13667,11 +13607,7 @@
         <w:t>Os jogos didáticos ganharam uma seção própria na aba Prática e um atalho na tela inicial (Figura 8). No primeiro, “Alto, normal ou baixo?”, o estudante vê o valor de um marcador e o classifica em relação à faixa de referência, em dez rodadas. Os valores são sorteados dentro de faixas plausíveis para cada classe, e alterações sem sentido clínico — como uma troponina abaixo do normal — não são sorteadas. Cada acerto vale 10 pontos, com bônus por acertos seguidos; a faixa pode ser consultada como dica, mas ent</w:t>
       </w:r>
       <w:r>
-        <w:t xml:space="preserve">ão o acerto vale metade; e um relógio opcional dá 15 segundos por rodada. O retorno mostra a régua da faixa com o valor marcado e a interpretação da alteração. As respostas dadas sem dica também alimentam o agendamento das revisões, com as notas do quiz (Tabela 3), porque nelas o estudante recuperou a faixa da memória. No segundo jogo, de memória, o estudante forma seis pares entre um </w:t>
-      </w:r>
-      <w:r>
-        <w:lastRenderedPageBreak/>
-        <w:t>marcador e o órgão ou sistema que ele avalia, e cada par formado traz uma explicação curta. Os dois jogos dão até três estre</w:t>
+        <w:t>ão o acerto vale metade; e um relógio opcional dá 15 segundos por rodada. O retorno mostra a régua da faixa com o valor marcado e a interpretação da alteração. As respostas dadas sem dica também alimentam o agendamento das revisões, com as notas do quiz (Tabela 3), porque nelas o estudante recuperou a faixa da memória. No segundo jogo, de memória, o estudante forma seis pares entre um marcador e o órgão ou sistema que ele avalia, e cada par formado traz uma explicação curta. Os dois jogos dão até três estre</w:t>
       </w:r>
       <w:r>
         <w:t>las conforme o desempenho e guardam o recorde do próprio estudante, sem classificação entre estudantes (seção 2.4).</w:t>
@@ -13681,7 +13617,7 @@
       <w:pPr>
         <w:pStyle w:val="LegendaABNT"/>
       </w:pPr>
-      <w:bookmarkStart w:id="46" w:name="_Toc243296834"/>
+      <w:bookmarkStart w:id="46" w:name="_Toc243299602"/>
       <w:r>
         <w:t xml:space="preserve">Figura </w:t>
       </w:r>
@@ -13719,7 +13655,7 @@
           <w:noProof/>
         </w:rPr>
         <w:drawing>
-          <wp:inline distT="0" distB="0" distL="0" distR="0" wp14:anchorId="2D2FA450" wp14:editId="17BF4D88">
+          <wp:inline distT="0" distB="0" distL="0" distR="0" wp14:anchorId="03CD95F4" wp14:editId="00FE6F50">
             <wp:extent cx="5762625" cy="4086225"/>
             <wp:effectExtent l="0" t="0" r="0" b="0"/>
             <wp:docPr id="8" name="evolucao_jogos.png" descr="Jogos didáticos e calculadora da TFG estimada na versão para celular" title="Jogos didáticos e calculadora da TFG estimada na versão para celular"/>
@@ -13792,9 +13728,8 @@
       <w:pPr>
         <w:pStyle w:val="Ttulo3"/>
       </w:pPr>
-      <w:bookmarkStart w:id="47" w:name="_Toc243296813"/>
-      <w:r>
-        <w:lastRenderedPageBreak/>
+      <w:bookmarkStart w:id="47" w:name="_Toc243299581"/>
+      <w:r>
         <w:t>4.7.2 Intervalos da revisão</w:t>
       </w:r>
       <w:bookmarkEnd w:id="47"/>
@@ -13816,7 +13751,7 @@
       <w:pPr>
         <w:pStyle w:val="LegendaABNT"/>
       </w:pPr>
-      <w:bookmarkStart w:id="48" w:name="_Toc243296849"/>
+      <w:bookmarkStart w:id="48" w:name="_Toc243299617"/>
       <w:r>
         <w:t xml:space="preserve">Tabela </w:t>
       </w:r>
@@ -14395,7 +14330,7 @@
       <w:pPr>
         <w:pStyle w:val="Ttulo3"/>
       </w:pPr>
-      <w:bookmarkStart w:id="49" w:name="_Toc243296814"/>
+      <w:bookmarkStart w:id="49" w:name="_Toc243299582"/>
       <w:r>
         <w:t>4.7.3 Um aplicativo para celular, tablet e computador</w:t>
       </w:r>
@@ -14408,18 +14343,17 @@
         <w:jc w:val="both"/>
       </w:pPr>
       <w:r>
-        <w:t xml:space="preserve">Na primeira versão, o computador tinha duas interfaces em Tkinter, e o celular, uma em Kivy (Quadro 3), o que obrigava a manter interfaces separadas para o mesmo conteúdo, com aparência e recursos diferentes entre os aparelhos. Como a interface em Kivy também roda no computador, ela passou a ser a única: o comando python main.py abre o mesmo aplicativo no computador, e as versões em Tkinter continuam </w:t>
-      </w:r>
-      <w:r>
-        <w:lastRenderedPageBreak/>
-        <w:t>disponíveis pela opção --classico. Para isso, a interface passou a se adaptar à largura da janela, medida em pixels independentes de densidade (dp), unidade que mantém o tamanho físico aproximado dos elementos em telas de densidades diferentes. As faixas seguem as classes de tamanho de janela recomendadas para o Android (Android Developers, [2026b]), como resume o Quadro 5.</w:t>
+        <w:t>Na primeira versão, o computador tinha duas interfaces em Tkinter, e o celular, uma em Kivy (Quadro 3), o que obrigava a manter interfaces separadas para o mesmo conteúdo, com aparência e recursos diferentes entre os aparelhos. Como a interface em Kivy também roda no computador, ela passou a ser a única: o comando python main.py abre o mesmo aplicativo no computador, e as versões em Tkinter continuam disponíveis pela opção --classico. Para isso, a interface passou a se adaptar à largura da janela, medida em</w:t>
+      </w:r>
+      <w:r>
+        <w:t xml:space="preserve"> pixels independentes de densidade (dp), unidade que mantém o tamanho físico aproximado dos elementos em telas de densidades diferentes. As faixas seguem as classes de tamanho de janela recomendadas para o Android (Android Developers, [2026b]), como resume o Quadro 5.</w:t>
       </w:r>
     </w:p>
     <w:p>
       <w:pPr>
         <w:pStyle w:val="LegendaABNT"/>
       </w:pPr>
-      <w:bookmarkStart w:id="50" w:name="_Toc243296843"/>
+      <w:bookmarkStart w:id="50" w:name="_Toc243299611"/>
       <w:r>
         <w:t xml:space="preserve">Quadro </w:t>
       </w:r>
@@ -15162,18 +15096,14 @@
         <w:t>Os formatos se complementam no uso. O agendamento espaçado pede sessões curtas e frequentes, que cabem no celular, em qualquer intervalo do dia; o computador e o tablet favorecem o estudo mais longo — a leitura do detalhe de cada marcador, os casos clínicos e as conversas com o tutor —, com mais informação visível ao mesmo tempo. Como o conteúdo, o motor de aprendizagem e a interface são os mesmos, o estudante encontra as mesmas telas e as mesmas regras em qualquer aparelho. Cada aparelho, porém, guarda o p</w:t>
       </w:r>
       <w:r>
-        <w:t xml:space="preserve">róprio progresso; a </w:t>
-      </w:r>
-      <w:r>
-        <w:lastRenderedPageBreak/>
-        <w:t>sincronização pela conta Google fica como trabalho futuro (seção 4.7.6). A Figura 9 mostra o aplicativo nos três formatos.</w:t>
+        <w:t>róprio progresso; a sincronização pela conta Google fica como trabalho futuro (seção 4.7.6). A Figura 9 mostra o aplicativo nos três formatos.</w:t>
       </w:r>
     </w:p>
     <w:p>
       <w:pPr>
         <w:pStyle w:val="LegendaABNT"/>
       </w:pPr>
-      <w:bookmarkStart w:id="51" w:name="_Toc243296835"/>
+      <w:bookmarkStart w:id="51" w:name="_Toc243299603"/>
       <w:r>
         <w:t xml:space="preserve">Figura </w:t>
       </w:r>
@@ -15211,7 +15141,7 @@
           <w:noProof/>
         </w:rPr>
         <w:drawing>
-          <wp:inline distT="0" distB="0" distL="0" distR="0" wp14:anchorId="210E244A" wp14:editId="3692E21B">
+          <wp:inline distT="0" distB="0" distL="0" distR="0" wp14:anchorId="3C00EFFC" wp14:editId="0B035890">
             <wp:extent cx="5762625" cy="7219950"/>
             <wp:effectExtent l="0" t="0" r="0" b="0"/>
             <wp:docPr id="9" name="evolucao_formatos.png" descr="O mesmo aplicativo no computador, no tablet e no celular" title="O mesmo aplicativo no computador, no tablet e no celular"/>
@@ -15272,9 +15202,8 @@
       <w:pPr>
         <w:pStyle w:val="Ttulo3"/>
       </w:pPr>
-      <w:bookmarkStart w:id="52" w:name="_Toc243296815"/>
-      <w:r>
-        <w:lastRenderedPageBreak/>
+      <w:bookmarkStart w:id="52" w:name="_Toc243299583"/>
+      <w:r>
         <w:t>4.7.4 Acessibilidade</w:t>
       </w:r>
       <w:bookmarkEnd w:id="52"/>
@@ -15374,9 +15303,8 @@
       <w:pPr>
         <w:pStyle w:val="LegendaABNT"/>
       </w:pPr>
-      <w:bookmarkStart w:id="53" w:name="_Toc243296836"/>
-      <w:r>
-        <w:lastRenderedPageBreak/>
+      <w:bookmarkStart w:id="53" w:name="_Toc243299604"/>
+      <w:r>
         <w:t xml:space="preserve">Figura </w:t>
       </w:r>
       <w:r>
@@ -15413,7 +15341,7 @@
           <w:noProof/>
         </w:rPr>
         <w:drawing>
-          <wp:inline distT="0" distB="0" distL="0" distR="0" wp14:anchorId="3BF8FAA1" wp14:editId="59B3BDA4">
+          <wp:inline distT="0" distB="0" distL="0" distR="0" wp14:anchorId="1A694C3B" wp14:editId="549E2496">
             <wp:extent cx="5762625" cy="4086225"/>
             <wp:effectExtent l="0" t="0" r="0" b="0"/>
             <wp:docPr id="10" name="evolucao_acessibilidade.png" descr="Recursos de acessibilidade na versão para celular" title="Recursos de acessibilidade na versão para celular"/>
@@ -15486,7 +15414,7 @@
       <w:pPr>
         <w:pStyle w:val="Ttulo3"/>
       </w:pPr>
-      <w:bookmarkStart w:id="54" w:name="_Toc243296816"/>
+      <w:bookmarkStart w:id="54" w:name="_Toc243299584"/>
       <w:r>
         <w:t>4.7.5 Tutor com inteligência artificial generativa</w:t>
       </w:r>
@@ -15499,18 +15427,17 @@
         <w:jc w:val="both"/>
       </w:pPr>
       <w:r>
-        <w:t xml:space="preserve">Na primeira versão, o tutor do celular respondia apenas pela base do aplicativo, e o do computador podia usar um modelo de linguagem local, executado com o Ollama </w:t>
-      </w:r>
-      <w:r>
-        <w:lastRenderedPageBreak/>
-        <w:t>(seção 4.4). Modelos locais, porém, não rodam no celular e, nos tamanhos que cabem num computador comum, tendem a responder mais devagar e com qualidade inferior à de modelos maiores. O tutor passou a aceitar, como opção, o Gemini, modelo de linguagem do Google acessado pela internet (Google, [2026b]). Os provedores de resposta são tentados em ordem — Gemini, modelo local e base do aplicativo —, e a base, que sempre responde, é a reserva de todos (Figura 11).</w:t>
+        <w:t>Na primeira versão, o tutor do celular respondia apenas pela base do aplicativo, e o do computador podia usar um modelo de linguagem local, executado com o Ollama (seção 4.4). Modelos locais, porém, não rodam no celular e, nos tamanhos que cabem num computador comum, tendem a responder mais devagar e com qualidade inferior à de modelos maiores. O tutor passou a aceitar, como opção, o Gemini, modelo de linguagem do Google acessado pela internet (Google, [2026b]). Os provedores de resposta são tentados em ord</w:t>
+      </w:r>
+      <w:r>
+        <w:t>em — Gemini, modelo local e base do aplicativo —, e a base, que sempre responde, é a reserva de todos (Figura 11).</w:t>
       </w:r>
     </w:p>
     <w:p>
       <w:pPr>
         <w:pStyle w:val="LegendaABNT"/>
       </w:pPr>
-      <w:bookmarkStart w:id="55" w:name="_Toc243296837"/>
+      <w:bookmarkStart w:id="55" w:name="_Toc243299605"/>
       <w:r>
         <w:t xml:space="preserve">Figura </w:t>
       </w:r>
@@ -15548,7 +15475,7 @@
           <w:noProof/>
         </w:rPr>
         <w:drawing>
-          <wp:inline distT="0" distB="0" distL="0" distR="0" wp14:anchorId="5F7F1D89" wp14:editId="2A9CEC42">
+          <wp:inline distT="0" distB="0" distL="0" distR="0" wp14:anchorId="51EE6E53" wp14:editId="430B4C34">
             <wp:extent cx="5762625" cy="2933700"/>
             <wp:effectExtent l="0" t="0" r="0" b="0"/>
             <wp:docPr id="11" name="tutor_arquitetura.png" descr="Provedores de resposta do tutor e local da chave de acesso" title="Provedores de resposta do tutor e local da chave de acesso"/>
@@ -15613,11 +15540,10 @@
         <w:jc w:val="both"/>
       </w:pPr>
       <w:r>
-        <w:t xml:space="preserve">A chave de acesso à API do Gemini dá acesso à conta de quem a criou e, por isso, não fica no código-fonte nem nos pacotes do aplicativo, de onde poderia ser extraída. Quem roda o aplicativo a partir do código pode usar a própria chave, lida de um arquivo local excluído do controle de versões; o instalador para Windows e o </w:t>
-      </w:r>
-      <w:r>
-        <w:lastRenderedPageBreak/>
-        <w:t>celular não têm chave e enviam a pergunta a um servidor intermediário, executado no Cloudflare Workers, que guarda a chave como segredo e aplica a mesma instrução fixa (Cloudflare, [2026]). Só são aceitas conexões criptografadas (HTTPS).</w:t>
+        <w:t>A chave de acesso à API do Gemini dá acesso à conta de quem a criou e, por isso, não fica no código-fonte nem nos pacotes do aplicativo, de onde poderia ser extraída. Quem roda o aplicativo a partir do código pode usar a própria chave, lida de um arquivo local excluído do controle de versões; o instalador para Windows e o celular não têm chave e enviam a pergunta a um servidor intermediário, executado no Cloudflare Workers, que guarda a chave como segredo e aplica a mesma instrução fixa (Cloudflare, [2026])</w:t>
+      </w:r>
+      <w:r>
+        <w:t>. Só são aceitas conexões criptografadas (HTTPS).</w:t>
       </w:r>
     </w:p>
     <w:p>
@@ -15648,18 +15574,14 @@
         <w:jc w:val="both"/>
       </w:pPr>
       <w:r>
-        <w:t xml:space="preserve">Esse comportamento é verificado por um programa de testes que substitui a conexão com o Google por uma simulada: ele confere o conteúdo enviado, a leitura das respostas, cada tipo de falha, as novas tentativas, a troca para o modelo de reserva, o tempo limite, o caminho pelo servidor, a igualdade entre as instruções do </w:t>
-      </w:r>
-      <w:r>
-        <w:lastRenderedPageBreak/>
-        <w:t>aplicativo e do servidor e a ausência de chaves de API nos arquivos do projeto. A Figura 12 mostra uma conversa real com o tutor.</w:t>
+        <w:t>Esse comportamento é verificado por um programa de testes que substitui a conexão com o Google por uma simulada: ele confere o conteúdo enviado, a leitura das respostas, cada tipo de falha, as novas tentativas, a troca para o modelo de reserva, o tempo limite, o caminho pelo servidor, a igualdade entre as instruções do aplicativo e do servidor e a ausência de chaves de API nos arquivos do projeto. A Figura 12 mostra uma conversa real com o tutor.</w:t>
       </w:r>
     </w:p>
     <w:p>
       <w:pPr>
         <w:pStyle w:val="LegendaABNT"/>
       </w:pPr>
-      <w:bookmarkStart w:id="56" w:name="_Toc243296838"/>
+      <w:bookmarkStart w:id="56" w:name="_Toc243299606"/>
       <w:r>
         <w:t xml:space="preserve">Figura </w:t>
       </w:r>
@@ -15697,7 +15619,7 @@
           <w:noProof/>
         </w:rPr>
         <w:drawing>
-          <wp:inline distT="0" distB="0" distL="0" distR="0" wp14:anchorId="6120717F" wp14:editId="34AF06F4">
+          <wp:inline distT="0" distB="0" distL="0" distR="0" wp14:anchorId="23774FDE" wp14:editId="333FBD7C">
             <wp:extent cx="5762625" cy="4086225"/>
             <wp:effectExtent l="0" t="0" r="0" b="0"/>
             <wp:docPr id="12" name="evolucao_tutor.png" descr="Conversa com o tutor usando o Gemini na versão para celular" title="Conversa com o tutor usando o Gemini na versão para celular"/>
@@ -15758,7 +15680,7 @@
       <w:pPr>
         <w:pStyle w:val="Ttulo3"/>
       </w:pPr>
-      <w:bookmarkStart w:id="57" w:name="_Toc243296817"/>
+      <w:bookmarkStart w:id="57" w:name="_Toc243299585"/>
       <w:r>
         <w:t>4.7.6 Abertura, conta Google opcional e apresentação</w:t>
       </w:r>
@@ -15773,11 +15695,7 @@
         <w:t>O aplicativo ganhou uma tela de abertura com a logo, exibida enquanto o conteúdo e o progresso são carregados, que, se a leitura dos dados falhar, explica o problema e oferece nova tentativa. No primeiro acesso, o estudante escolhe entrar com a conta Google ou continuar sem conta; em seguida, vê uma apresentação de três passos, que termina nos ajustes de acessibilidade. O login usa o Firebase Authentication, do Google: no computador, pela página de login do Google no navegador, e no Android, pelo seletor de</w:t>
       </w:r>
       <w:r>
-        <w:t xml:space="preserve"> contas do próprio sistema. A conta guarda apenas se o estudante já viu a apresentação, para que ela não se repita ao trocar de aparelho; o progresso de estudo continua no aparelho, e as regras do banco de dados </w:t>
-      </w:r>
-      <w:r>
-        <w:lastRenderedPageBreak/>
-        <w:t>só permitem a cada estudante ler e gravar o próprio registro. No Windows, a sessão fica gravada de forma cifrada pelo próprio sistema. A identidade visual também foi completada com as variações de que um aplicativo precisa, como o ícone adaptativo do Android, que se ajusta ao formato de ícone de cad</w:t>
+        <w:t xml:space="preserve"> contas do próprio sistema. A conta guarda apenas se o estudante já viu a apresentação, para que ela não se repita ao trocar de aparelho; o progresso de estudo continua no aparelho, e as regras do banco de dados só permitem a cada estudante ler e gravar o próprio registro. No Windows, a sessão fica gravada de forma cifrada pelo próprio sistema. A identidade visual também foi completada com as variações de que um aplicativo precisa, como o ícone adaptativo do Android, que se ajusta ao formato de ícone de cad</w:t>
       </w:r>
       <w:r>
         <w:t>a aparelho.</w:t>
@@ -15787,7 +15705,7 @@
       <w:pPr>
         <w:pStyle w:val="Ttulo3"/>
       </w:pPr>
-      <w:bookmarkStart w:id="58" w:name="_Toc243296818"/>
+      <w:bookmarkStart w:id="58" w:name="_Toc243299586"/>
       <w:r>
         <w:t>4.7.7 Site e instaladores</w:t>
       </w:r>
@@ -15834,9 +15752,8 @@
       <w:pPr>
         <w:pStyle w:val="Ttulo2"/>
       </w:pPr>
-      <w:bookmarkStart w:id="59" w:name="_Toc243296819"/>
-      <w:r>
-        <w:lastRenderedPageBreak/>
+      <w:bookmarkStart w:id="59" w:name="_Toc243299587"/>
+      <w:r>
         <w:t>4.8 AVALIAÇÃO DA APRENDIZAGEM</w:t>
       </w:r>
       <w:bookmarkEnd w:id="59"/>
@@ -15858,7 +15775,7 @@
       <w:pPr>
         <w:pStyle w:val="LegendaABNT"/>
       </w:pPr>
-      <w:bookmarkStart w:id="60" w:name="_Toc243296850"/>
+      <w:bookmarkStart w:id="60" w:name="_Toc243299618"/>
       <w:r>
         <w:t xml:space="preserve">Tabela </w:t>
       </w:r>
@@ -16472,9 +16389,8 @@
       <w:pPr>
         <w:pStyle w:val="Ttulo1"/>
       </w:pPr>
-      <w:bookmarkStart w:id="61" w:name="_Toc243296820"/>
-      <w:r>
-        <w:lastRenderedPageBreak/>
+      <w:bookmarkStart w:id="61" w:name="_Toc243299588"/>
+      <w:r>
         <w:t>5 DISCUSSÃO</w:t>
       </w:r>
       <w:bookmarkEnd w:id="61"/>
@@ -16493,7 +16409,7 @@
       <w:pPr>
         <w:pStyle w:val="LegendaABNT"/>
       </w:pPr>
-      <w:bookmarkStart w:id="62" w:name="_Toc243296844"/>
+      <w:bookmarkStart w:id="62" w:name="_Toc243299612"/>
       <w:r>
         <w:t xml:space="preserve">Quadro </w:t>
       </w:r>
@@ -17467,11 +17383,10 @@
         <w:jc w:val="both"/>
       </w:pPr>
       <w:r>
-        <w:t xml:space="preserve">As mudanças de tecnologia tiveram motivo prático. O Tkinter não roda no Android, e o PyQt5 exigiria uma cadeia de empacotamento própria para o celular; o Kivy, também em Python, roda no Android, no Windows e em outros sistemas com o mesmo código, o que permitiu chegar a um único aplicativo. O Pandas foi dispensado </w:t>
-      </w:r>
-      <w:r>
-        <w:lastRenderedPageBreak/>
-        <w:t>porque a base, com algumas dezenas de linhas, é lida em poucos comandos pela biblioteca padrão, e uma dependência a menos reduz o tamanho dos instaladores; o SQLite também não foi necessário, porque o conteúdo é apenas lido e o progresso do estudante cabe num arquivo JSON. Por fim, a fundamentação teórica foi construída com fontes cujo acesso pôde ser conferido nas bases de origem, pelo DOI ou pelo endereço do capítulo.</w:t>
+        <w:t>As mudanças de tecnologia tiveram motivo prático. O Tkinter não roda no Android, e o PyQt5 exigiria uma cadeia de empacotamento própria para o celular; o Kivy, também em Python, roda no Android, no Windows e em outros sistemas com o mesmo código, o que permitiu chegar a um único aplicativo. O Pandas foi dispensado porque a base, com algumas dezenas de linhas, é lida em poucos comandos pela biblioteca padrão, e uma dependência a menos reduz o tamanho dos instaladores; o SQLite também não foi necessário, porq</w:t>
+      </w:r>
+      <w:r>
+        <w:t>ue o conteúdo é apenas lido e o progresso do estudante cabe num arquivo JSON. Por fim, a fundamentação teórica foi construída com fontes cujo acesso pôde ser conferido nas bases de origem, pelo DOI ou pelo endereço do capítulo.</w:t>
       </w:r>
     </w:p>
     <w:p>
@@ -17547,11 +17462,7 @@
         <w:t>et al.</w:t>
       </w:r>
       <w:r>
-        <w:t xml:space="preserve">, 2019). Como a má calibração de estudantes de baixo desempenho se mostrou estável </w:t>
-      </w:r>
-      <w:r>
-        <w:lastRenderedPageBreak/>
-        <w:t xml:space="preserve">mesmo diante de notas anteriores (Karaca </w:t>
+        <w:t xml:space="preserve">, 2019). Como a má calibração de estudantes de baixo desempenho se mostrou estável mesmo diante de notas anteriores (Karaca </w:t>
       </w:r>
       <w:r>
         <w:rPr>
@@ -17606,14 +17517,10 @@
         <w:jc w:val="both"/>
       </w:pPr>
       <w:r>
-        <w:t xml:space="preserve">O trabalho tem limitações. O conteúdo cobre 22 marcadores e não passou por revisão formal de docente da área da saúde, e o banco de 14 questões é pequeno, o que favorece a repetição das mesmas perguntas. As questões geradas pelo modelo de linguagem na versão clássica com tutor não passam por curadoria e podem conter </w:t>
-      </w:r>
-      <w:r>
-        <w:lastRenderedPageBreak/>
-        <w:t>erros. Os diagramas do conteúdo ainda são os da primeira versão, e a melhoria pedida na avaliação formativa não foi feita. A versão para iOS, possível com o Kivy, não foi testada, e os recursos de acessibilidade não foram avaliados com estudantes com deficiência. Na avaliação, a parte formativa não usou instrumento padronizado nem produziu medidas; o pré-teste e o pós-teste não têm grupo de comparação, repetem as mesmas questões — parte da melhora pode vir de já tê-las visto — e reúnem uma amostra pequena e</w:t>
-      </w:r>
-      <w:r>
-        <w:t xml:space="preserve"> de conveniência </w:t>
+        <w:t xml:space="preserve">O trabalho tem limitações. O conteúdo cobre 22 marcadores e não passou por revisão formal de docente da área da saúde, e o banco de 14 questões é pequeno, o que favorece a repetição das mesmas perguntas. As questões geradas pelo modelo de linguagem na versão clássica com tutor não passam por curadoria e podem conter erros. Os diagramas do conteúdo ainda são os da primeira versão, e a melhoria pedida na avaliação formativa não foi feita. A versão para iOS, possível com o Kivy, não foi testada, e os recursos </w:t>
+      </w:r>
+      <w:r>
+        <w:t xml:space="preserve">de acessibilidade não foram avaliados com estudantes com deficiência. Na avaliação, a parte formativa não usou instrumento padronizado nem produziu medidas; o pré-teste e o pós-teste não têm grupo de comparação, repetem as mesmas questões — parte da melhora pode vir de já tê-las visto — e reúnem uma amostra pequena e de conveniência </w:t>
       </w:r>
       <w:r>
         <w:rPr>
@@ -17629,9 +17536,8 @@
       <w:pPr>
         <w:pStyle w:val="Ttulo1"/>
       </w:pPr>
-      <w:bookmarkStart w:id="63" w:name="_Toc243296821"/>
-      <w:r>
-        <w:lastRenderedPageBreak/>
+      <w:bookmarkStart w:id="63" w:name="_Toc243299589"/>
+      <w:r>
         <w:t>6 CONSIDERAÇÕES FINAIS</w:t>
       </w:r>
       <w:bookmarkEnd w:id="63"/>
@@ -17700,9 +17606,8 @@
         <w:pStyle w:val="Ttulo1"/>
         <w:jc w:val="center"/>
       </w:pPr>
-      <w:bookmarkStart w:id="64" w:name="_Toc243296822"/>
-      <w:r>
-        <w:lastRenderedPageBreak/>
+      <w:bookmarkStart w:id="64" w:name="_Toc243299590"/>
+      <w:r>
         <w:t>REFERÊNCIAS</w:t>
       </w:r>
       <w:bookmarkEnd w:id="64"/>
@@ -17860,7 +17765,6 @@
         <w:pStyle w:val="RefernciaABNT"/>
       </w:pPr>
       <w:r>
-        <w:lastRenderedPageBreak/>
         <w:t xml:space="preserve">CEPEDA, N. J. et al. Distributed practice in verbal recall tasks: a review and quantitative synthesis. </w:t>
       </w:r>
       <w:r>
@@ -18037,7 +17941,6 @@
         <w:pStyle w:val="RefernciaABNT"/>
       </w:pPr>
       <w:r>
-        <w:lastRenderedPageBreak/>
         <w:t xml:space="preserve">HELAL, I. et al. Glomerular hyperfiltration: definitions, mechanisms and clinical implications. </w:t>
       </w:r>
       <w:r>
@@ -18201,15 +18104,7 @@
           <w:b/>
           <w:bCs/>
         </w:rPr>
-        <w:t xml:space="preserve">Journal of </w:t>
-      </w:r>
-      <w:r>
-        <w:rPr>
-          <w:b/>
-          <w:bCs/>
-        </w:rPr>
-        <w:lastRenderedPageBreak/>
-        <w:t>Personality and Social Psychology</w:t>
+        <w:t>Journal of Personality and Social Psychology</w:t>
       </w:r>
       <w:r>
         <w:t>, [s. l.], v. 77, n. 6, p. 1121-1134, dez. 1999. DOI: https://doi.org/10.1037//0022-3514.77.6.1121.</w:t>
@@ -18360,7 +18255,6 @@
         <w:pStyle w:val="RefernciaABNT"/>
       </w:pPr>
       <w:r>
-        <w:lastRenderedPageBreak/>
         <w:t>PAPPAN, N.; AWOSIKA, A. O.; REHMAN, A. Dyslipidemia. In: STATPEARLS. Treasure Island, FL: StatPearls Publishing, 2024. Disponível em: https://www.ncbi.nlm.nih.gov/books/NBK560891/. Acesso em: 6 out. 2026.</w:t>
       </w:r>
     </w:p>
@@ -18519,11 +18413,7 @@
         <w:t>Clinical methods</w:t>
       </w:r>
       <w:r>
-        <w:t xml:space="preserve">: the history, physical, and laboratory examinations. 3. ed. Boston: Butterworths, 1990a. </w:t>
-      </w:r>
-      <w:r>
-        <w:lastRenderedPageBreak/>
-        <w:t>Disponível em: https://www.ncbi.nlm.nih.gov/books/NBK203/. Acesso em: 6 out. 2026.</w:t>
+        <w:t>: the history, physical, and laboratory examinations. 3. ed. Boston: Butterworths, 1990a. Disponível em: https://www.ncbi.nlm.nih.gov/books/NBK203/. Acesso em: 6 out. 2026.</w:t>
       </w:r>
     </w:p>
     <w:p>
@@ -18593,9 +18483,8 @@
         <w:pStyle w:val="Ttulo1"/>
         <w:jc w:val="center"/>
       </w:pPr>
-      <w:bookmarkStart w:id="65" w:name="_Toc243296823"/>
-      <w:r>
-        <w:lastRenderedPageBreak/>
+      <w:bookmarkStart w:id="65" w:name="_Toc243299591"/>
+      <w:r>
         <w:t>APÊNDICE A – FONTES DO CONTEÚDO POR MARCADOR</w:t>
       </w:r>
       <w:bookmarkEnd w:id="65"/>
@@ -18614,7 +18503,7 @@
       <w:pPr>
         <w:pStyle w:val="LegendaABNT"/>
       </w:pPr>
-      <w:bookmarkStart w:id="66" w:name="_Toc243296845"/>
+      <w:bookmarkStart w:id="66" w:name="_Toc243299613"/>
       <w:r>
         <w:t xml:space="preserve">Quadro </w:t>
       </w:r>
@@ -20989,9 +20878,8 @@
         <w:pStyle w:val="Ttulo1"/>
         <w:jc w:val="center"/>
       </w:pPr>
-      <w:bookmarkStart w:id="67" w:name="_Toc243296824"/>
-      <w:r>
-        <w:lastRenderedPageBreak/>
+      <w:bookmarkStart w:id="67" w:name="_Toc243299592"/>
+      <w:r>
         <w:t>APÊNDICE B – CÓDIGO-FONTE E EXECUÇÃO</w:t>
       </w:r>
       <w:bookmarkEnd w:id="67"/>
@@ -21085,9 +20973,8 @@
         <w:pStyle w:val="Ttulo1"/>
         <w:jc w:val="center"/>
       </w:pPr>
-      <w:bookmarkStart w:id="68" w:name="_Toc243296825"/>
-      <w:r>
-        <w:lastRenderedPageBreak/>
+      <w:bookmarkStart w:id="68" w:name="_Toc243299593"/>
+      <w:r>
         <w:t>APÊNDICE C – QUESTÕES DO PRÉ-TESTE E DO PÓS-TESTE</w:t>
       </w:r>
       <w:bookmarkEnd w:id="68"/>
@@ -21441,7 +21328,6 @@
           <w:b/>
           <w:bCs/>
         </w:rPr>
-        <w:lastRenderedPageBreak/>
         <w:t>Q5.</w:t>
       </w:r>
       <w:r>
@@ -21852,7 +21738,6 @@
           <w:b/>
           <w:bCs/>
         </w:rPr>
-        <w:lastRenderedPageBreak/>
         <w:t>Q10.</w:t>
       </w:r>
       <w:r>
@@ -21929,9 +21814,8 @@
         <w:pStyle w:val="Ttulo1"/>
         <w:jc w:val="center"/>
       </w:pPr>
-      <w:bookmarkStart w:id="69" w:name="_Toc243296826"/>
-      <w:r>
-        <w:lastRenderedPageBreak/>
+      <w:bookmarkStart w:id="69" w:name="_Toc243299594"/>
+      <w:r>
         <w:t>APÊNDICE D – QUESTIONÁRIO DE OPINIÃO</w:t>
       </w:r>
       <w:bookmarkEnd w:id="69"/>
@@ -22276,10 +22160,10 @@
 <file path=word/numbering.xml><?xml version="1.0" encoding="utf-8"?>
 <w:numbering xmlns:wpc="http://schemas.microsoft.com/office/word/2010/wordprocessingCanvas" xmlns:cx="http://schemas.microsoft.com/office/drawing/2014/chartex" xmlns:cx1="http://schemas.microsoft.com/office/drawing/2015/9/8/chartex" xmlns:cx2="http://schemas.microsoft.com/office/drawing/2015/10/21/chartex" xmlns:cx3="http://schemas.microsoft.com/office/drawing/2016/5/9/chartex" xmlns:cx4="http://schemas.microsoft.com/office/drawing/2016/5/10/chartex" xmlns:cx5="http://schemas.microsoft.com/office/drawing/2016/5/11/chartex" xmlns:cx6="http://schemas.microsoft.com/office/drawing/2016/5/12/chartex" xmlns:cx7="http://schemas.microsoft.com/office/drawing/2016/5/13/chartex" xmlns:cx8="http://schemas.microsoft.com/office/drawing/2016/5/14/chartex" xmlns:mc="http://schemas.openxmlformats.org/markup-compatibility/2006" xmlns:aink="http://schemas.microsoft.com/office/drawing/2016/ink" xmlns:am3d="http://schemas.microsoft.com/office/drawing/2017/model3d" xmlns:o="urn:schemas-microsoft-com:office:office" xmlns:oel="http://schemas.microsoft.com/office/2019/extlst" xmlns:r="http://schemas.openxmlformats.org/officeDocument/2006/relationships" xmlns:m="http://schemas.openxmlformats.org/officeDocument/2006/math" xmlns:v="urn:schemas-microsoft-com:vml" xmlns:wp14="http://schemas.microsoft.com/office/word/2010/wordprocessingDrawing" xmlns:wp="http://schemas.openxmlformats.org/drawingml/2006/wordprocessingDrawing" xmlns:w10="urn:schemas-microsoft-com:office:word" xmlns:w="http://schemas.openxmlformats.org/wordprocessingml/2006/main" xmlns:w14="http://schemas.microsoft.com/office/word/2010/wordml" xmlns:w15="http://schemas.microsoft.com/office/word/2012/wordml" xmlns:w16cex="http://schemas.microsoft.com/office/word/2018/wordml/cex" xmlns:w16cid="http://schemas.microsoft.com/office/word/2016/wordml/cid" xmlns:w16="http://schemas.microsoft.com/office/word/2018/wordml" xmlns:w16du="http://schemas.microsoft.com/office/word/2023/wordml/word16du" xmlns:w16sdtdh="http://schemas.microsoft.com/office/word/2020/wordml/sdtdatahash" xmlns:w16sdtfl="http://schemas.microsoft.com/office/word/2024/wordml/sdtformatlock" xmlns:w16se="http://schemas.microsoft.com/office/word/2015/wordml/symex" xmlns:wpg="http://schemas.microsoft.com/office/word/2010/wordprocessingGroup" xmlns:wpi="http://schemas.microsoft.com/office/word/2010/wordprocessingInk" xmlns:wne="http://schemas.microsoft.com/office/word/2006/wordml" xmlns:wps="http://schemas.microsoft.com/office/word/2010/wordprocessingShape" mc:Ignorable="w14 w15 w16se w16cid w16 w16cex w16sdtdh w16sdtfl w16du wp14">
   <w:abstractNum w:abstractNumId="0" w15:restartNumberingAfterBreak="0">
-    <w:nsid w:val="19D9408F"/>
+    <w:nsid w:val="237876CF"/>
     <w:multiLevelType w:val="hybridMultilevel"/>
-    <w:tmpl w:val="D9F89E34"/>
-    <w:lvl w:ilvl="0" w:tplc="AAA29464">
+    <w:tmpl w:val="5A48D5E4"/>
+    <w:lvl w:ilvl="0" w:tplc="157A4362">
       <w:start w:val="1"/>
       <w:numFmt w:val="lowerLetter"/>
       <w:lvlText w:val="%1)"/>
@@ -22288,52 +22172,52 @@
         <w:ind w:left="1106" w:hanging="397"/>
       </w:pPr>
     </w:lvl>
-    <w:lvl w:ilvl="1" w:tplc="44F02D00">
+    <w:lvl w:ilvl="1" w:tplc="6D7491E0">
       <w:numFmt w:val="decimal"/>
       <w:lvlText w:val=""/>
       <w:lvlJc w:val="left"/>
     </w:lvl>
-    <w:lvl w:ilvl="2" w:tplc="E5FEE3BC">
+    <w:lvl w:ilvl="2" w:tplc="DC486E06">
       <w:numFmt w:val="decimal"/>
       <w:lvlText w:val=""/>
       <w:lvlJc w:val="left"/>
     </w:lvl>
-    <w:lvl w:ilvl="3" w:tplc="3206A18C">
+    <w:lvl w:ilvl="3" w:tplc="73A02868">
       <w:numFmt w:val="decimal"/>
       <w:lvlText w:val=""/>
       <w:lvlJc w:val="left"/>
     </w:lvl>
-    <w:lvl w:ilvl="4" w:tplc="F0A222C4">
+    <w:lvl w:ilvl="4" w:tplc="A8A406AA">
       <w:numFmt w:val="decimal"/>
       <w:lvlText w:val=""/>
       <w:lvlJc w:val="left"/>
     </w:lvl>
-    <w:lvl w:ilvl="5" w:tplc="11564D1C">
+    <w:lvl w:ilvl="5" w:tplc="F8880A9C">
       <w:numFmt w:val="decimal"/>
       <w:lvlText w:val=""/>
       <w:lvlJc w:val="left"/>
     </w:lvl>
-    <w:lvl w:ilvl="6" w:tplc="9CBA09AA">
+    <w:lvl w:ilvl="6" w:tplc="86ACE3AC">
       <w:numFmt w:val="decimal"/>
       <w:lvlText w:val=""/>
       <w:lvlJc w:val="left"/>
     </w:lvl>
-    <w:lvl w:ilvl="7" w:tplc="282ECBF8">
+    <w:lvl w:ilvl="7" w:tplc="F468F586">
       <w:numFmt w:val="decimal"/>
       <w:lvlText w:val=""/>
       <w:lvlJc w:val="left"/>
     </w:lvl>
-    <w:lvl w:ilvl="8" w:tplc="623AA2AA">
+    <w:lvl w:ilvl="8" w:tplc="CBE487E6">
       <w:numFmt w:val="decimal"/>
       <w:lvlText w:val=""/>
       <w:lvlJc w:val="left"/>
     </w:lvl>
   </w:abstractNum>
   <w:abstractNum w:abstractNumId="1" w15:restartNumberingAfterBreak="0">
-    <w:nsid w:val="321D4202"/>
+    <w:nsid w:val="3F91565B"/>
     <w:multiLevelType w:val="hybridMultilevel"/>
-    <w:tmpl w:val="CF98786E"/>
-    <w:lvl w:ilvl="0" w:tplc="709A41B4" w:tentative="1">
+    <w:tmpl w:val="F6B05156"/>
+    <w:lvl w:ilvl="0" w:tplc="D0783D2C" w:tentative="1">
       <w:start w:val="1"/>
       <w:numFmt w:val="bullet"/>
       <w:lvlText w:val="●"/>
@@ -22342,7 +22226,7 @@
         <w:ind w:left="720" w:hanging="360"/>
       </w:pPr>
     </w:lvl>
-    <w:lvl w:ilvl="1" w:tplc="12C4254A" w:tentative="1">
+    <w:lvl w:ilvl="1" w:tplc="247887BE" w:tentative="1">
       <w:start w:val="1"/>
       <w:numFmt w:val="bullet"/>
       <w:lvlText w:val="○"/>
@@ -22351,7 +22235,7 @@
         <w:ind w:left="1440" w:hanging="360"/>
       </w:pPr>
     </w:lvl>
-    <w:lvl w:ilvl="2" w:tplc="C984457E" w:tentative="1">
+    <w:lvl w:ilvl="2" w:tplc="E5DE1A2C" w:tentative="1">
       <w:start w:val="1"/>
       <w:numFmt w:val="bullet"/>
       <w:lvlText w:val="■"/>
@@ -22360,7 +22244,7 @@
         <w:ind w:left="2160" w:hanging="360"/>
       </w:pPr>
     </w:lvl>
-    <w:lvl w:ilvl="3" w:tplc="3FD40CB6" w:tentative="1">
+    <w:lvl w:ilvl="3" w:tplc="7C009C12" w:tentative="1">
       <w:start w:val="1"/>
       <w:numFmt w:val="bullet"/>
       <w:lvlText w:val="●"/>
@@ -22369,7 +22253,7 @@
         <w:ind w:left="2880" w:hanging="360"/>
       </w:pPr>
     </w:lvl>
-    <w:lvl w:ilvl="4" w:tplc="DF2670D6" w:tentative="1">
+    <w:lvl w:ilvl="4" w:tplc="DC0C4080" w:tentative="1">
       <w:start w:val="1"/>
       <w:numFmt w:val="bullet"/>
       <w:lvlText w:val="○"/>
@@ -22378,7 +22262,7 @@
         <w:ind w:left="3600" w:hanging="360"/>
       </w:pPr>
     </w:lvl>
-    <w:lvl w:ilvl="5" w:tplc="3C482920" w:tentative="1">
+    <w:lvl w:ilvl="5" w:tplc="EB2EFE02" w:tentative="1">
       <w:start w:val="1"/>
       <w:numFmt w:val="bullet"/>
       <w:lvlText w:val="■"/>
@@ -22387,7 +22271,7 @@
         <w:ind w:left="4320" w:hanging="360"/>
       </w:pPr>
     </w:lvl>
-    <w:lvl w:ilvl="6" w:tplc="2476414A" w:tentative="1">
+    <w:lvl w:ilvl="6" w:tplc="3BB27ED8" w:tentative="1">
       <w:start w:val="1"/>
       <w:numFmt w:val="bullet"/>
       <w:lvlText w:val="●"/>
@@ -22396,7 +22280,7 @@
         <w:ind w:left="5040" w:hanging="360"/>
       </w:pPr>
     </w:lvl>
-    <w:lvl w:ilvl="7" w:tplc="30A22EEC" w:tentative="1">
+    <w:lvl w:ilvl="7" w:tplc="BD86385A" w:tentative="1">
       <w:start w:val="1"/>
       <w:numFmt w:val="bullet"/>
       <w:lvlText w:val="●"/>
@@ -22405,7 +22289,7 @@
         <w:ind w:left="5760" w:hanging="360"/>
       </w:pPr>
     </w:lvl>
-    <w:lvl w:ilvl="8" w:tplc="6C9AB802" w:tentative="1">
+    <w:lvl w:ilvl="8" w:tplc="4376646A" w:tentative="1">
       <w:start w:val="1"/>
       <w:numFmt w:val="bullet"/>
       <w:lvlText w:val="●"/>
@@ -22415,97 +22299,97 @@
       </w:pPr>
     </w:lvl>
   </w:abstractNum>
-  <w:num w:numId="1" w16cid:durableId="836312147">
+  <w:num w:numId="1" w16cid:durableId="942761553">
     <w:abstractNumId w:val="1"/>
     <w:lvlOverride w:ilvl="0">
       <w:startOverride w:val="1"/>
     </w:lvlOverride>
   </w:num>
-  <w:num w:numId="2" w16cid:durableId="783114667">
+  <w:num w:numId="2" w16cid:durableId="1898281170">
     <w:abstractNumId w:val="0"/>
     <w:lvlOverride w:ilvl="0">
       <w:startOverride w:val="1"/>
     </w:lvlOverride>
   </w:num>
-  <w:num w:numId="3" w16cid:durableId="1021930371">
+  <w:num w:numId="3" w16cid:durableId="686097270">
     <w:abstractNumId w:val="0"/>
     <w:lvlOverride w:ilvl="0">
       <w:startOverride w:val="1"/>
     </w:lvlOverride>
   </w:num>
-  <w:num w:numId="4" w16cid:durableId="934939582">
+  <w:num w:numId="4" w16cid:durableId="1101299253">
     <w:abstractNumId w:val="0"/>
     <w:lvlOverride w:ilvl="0">
       <w:startOverride w:val="1"/>
     </w:lvlOverride>
   </w:num>
-  <w:num w:numId="5" w16cid:durableId="846555437">
+  <w:num w:numId="5" w16cid:durableId="183712517">
     <w:abstractNumId w:val="0"/>
     <w:lvlOverride w:ilvl="0">
       <w:startOverride w:val="1"/>
     </w:lvlOverride>
   </w:num>
-  <w:num w:numId="6" w16cid:durableId="1291009621">
+  <w:num w:numId="6" w16cid:durableId="277563264">
     <w:abstractNumId w:val="0"/>
     <w:lvlOverride w:ilvl="0">
       <w:startOverride w:val="1"/>
     </w:lvlOverride>
   </w:num>
-  <w:num w:numId="7" w16cid:durableId="1694526906">
+  <w:num w:numId="7" w16cid:durableId="1975939083">
     <w:abstractNumId w:val="0"/>
     <w:lvlOverride w:ilvl="0">
       <w:startOverride w:val="1"/>
     </w:lvlOverride>
   </w:num>
-  <w:num w:numId="8" w16cid:durableId="1299917757">
+  <w:num w:numId="8" w16cid:durableId="181015022">
     <w:abstractNumId w:val="0"/>
     <w:lvlOverride w:ilvl="0">
       <w:startOverride w:val="1"/>
     </w:lvlOverride>
   </w:num>
-  <w:num w:numId="9" w16cid:durableId="1669138331">
+  <w:num w:numId="9" w16cid:durableId="813716252">
     <w:abstractNumId w:val="0"/>
     <w:lvlOverride w:ilvl="0">
       <w:startOverride w:val="1"/>
     </w:lvlOverride>
   </w:num>
-  <w:num w:numId="10" w16cid:durableId="877666265">
+  <w:num w:numId="10" w16cid:durableId="2066636557">
     <w:abstractNumId w:val="0"/>
     <w:lvlOverride w:ilvl="0">
       <w:startOverride w:val="1"/>
     </w:lvlOverride>
   </w:num>
-  <w:num w:numId="11" w16cid:durableId="1350906361">
+  <w:num w:numId="11" w16cid:durableId="1943221286">
     <w:abstractNumId w:val="0"/>
     <w:lvlOverride w:ilvl="0">
       <w:startOverride w:val="1"/>
     </w:lvlOverride>
   </w:num>
-  <w:num w:numId="12" w16cid:durableId="1088379660">
+  <w:num w:numId="12" w16cid:durableId="377583461">
     <w:abstractNumId w:val="0"/>
     <w:lvlOverride w:ilvl="0">
       <w:startOverride w:val="1"/>
     </w:lvlOverride>
   </w:num>
-  <w:num w:numId="13" w16cid:durableId="2067218384">
+  <w:num w:numId="13" w16cid:durableId="1313021446">
     <w:abstractNumId w:val="0"/>
     <w:lvlOverride w:ilvl="0">
       <w:startOverride w:val="1"/>
     </w:lvlOverride>
   </w:num>
-  <w:num w:numId="14" w16cid:durableId="1938370523">
+  <w:num w:numId="14" w16cid:durableId="283780865">
     <w:abstractNumId w:val="0"/>
     <w:lvlOverride w:ilvl="0">
       <w:startOverride w:val="1"/>
     </w:lvlOverride>
   </w:num>
-  <w:num w:numId="15" w16cid:durableId="1737782472">
+  <w:num w:numId="15" w16cid:durableId="1106852865">
     <w:abstractNumId w:val="0"/>
     <w:lvlOverride w:ilvl="0">
       <w:startOverride w:val="1"/>
     </w:lvlOverride>
   </w:num>
-  <w:num w:numId="16" w16cid:durableId="350835443">
+  <w:num w:numId="16" w16cid:durableId="739644164">
     <w:abstractNumId w:val="0"/>
     <w:lvlOverride w:ilvl="0">
       <w:startOverride w:val="1"/>

</xml_diff>

<commit_message>
Relatorio: login com Google funcionando no Android e problemas corrigidos nos testes em aparelho
</commit_message>
<xml_diff>
--- a/relatorio/Relatorio_Final_PIBIC_BioquimicaEDU.docx
+++ b/relatorio/Relatorio_Final_PIBIC_BioquimicaEDU.docx
@@ -329,7 +329,7 @@
     <w:sdt>
       <w:sdtPr>
         <w:alias w:val="LISTA DE FIGURAS"/>
-        <w:id w:val="-1137172668"/>
+        <w:id w:val="-353731221"/>
       </w:sdtPr>
       <w:sdtEndPr/>
       <w:sdtContent>
@@ -355,7 +355,7 @@
           <w:r>
             <w:fldChar w:fldCharType="separate"/>
           </w:r>
-          <w:hyperlink w:anchor="_Toc243299595" w:history="1">
+          <w:hyperlink w:anchor="_Toc243301492" w:history="1">
             <w:r>
               <w:rPr>
                 <w:rStyle w:val="Hyperlink"/>
@@ -379,7 +379,7 @@
               <w:rPr>
                 <w:noProof/>
               </w:rPr>
-              <w:instrText xml:space="preserve"> PAGEREF _Toc243299595 \h </w:instrText>
+              <w:instrText xml:space="preserve"> PAGEREF _Toc243301492 \h </w:instrText>
             </w:r>
             <w:r>
               <w:rPr>
@@ -419,7 +419,7 @@
               <w14:ligatures w14:val="standardContextual"/>
             </w:rPr>
           </w:pPr>
-          <w:hyperlink w:anchor="_Toc243299596" w:history="1">
+          <w:hyperlink w:anchor="_Toc243301493" w:history="1">
             <w:r>
               <w:rPr>
                 <w:rStyle w:val="Hyperlink"/>
@@ -443,7 +443,7 @@
               <w:rPr>
                 <w:noProof/>
               </w:rPr>
-              <w:instrText xml:space="preserve"> PAGEREF _Toc243299596 \h </w:instrText>
+              <w:instrText xml:space="preserve"> PAGEREF _Toc243301493 \h </w:instrText>
             </w:r>
             <w:r>
               <w:rPr>
@@ -483,7 +483,7 @@
               <w14:ligatures w14:val="standardContextual"/>
             </w:rPr>
           </w:pPr>
-          <w:hyperlink w:anchor="_Toc243299597" w:history="1">
+          <w:hyperlink w:anchor="_Toc243301494" w:history="1">
             <w:r>
               <w:rPr>
                 <w:rStyle w:val="Hyperlink"/>
@@ -507,7 +507,7 @@
               <w:rPr>
                 <w:noProof/>
               </w:rPr>
-              <w:instrText xml:space="preserve"> PAGEREF _Toc243299597 \h </w:instrText>
+              <w:instrText xml:space="preserve"> PAGEREF _Toc243301494 \h </w:instrText>
             </w:r>
             <w:r>
               <w:rPr>
@@ -547,7 +547,7 @@
               <w14:ligatures w14:val="standardContextual"/>
             </w:rPr>
           </w:pPr>
-          <w:hyperlink w:anchor="_Toc243299598" w:history="1">
+          <w:hyperlink w:anchor="_Toc243301495" w:history="1">
             <w:r>
               <w:rPr>
                 <w:rStyle w:val="Hyperlink"/>
@@ -587,7 +587,7 @@
               <w:rPr>
                 <w:noProof/>
               </w:rPr>
-              <w:instrText xml:space="preserve"> PAGEREF _Toc243299598 \h </w:instrText>
+              <w:instrText xml:space="preserve"> PAGEREF _Toc243301495 \h </w:instrText>
             </w:r>
             <w:r>
               <w:rPr>
@@ -627,7 +627,7 @@
               <w14:ligatures w14:val="standardContextual"/>
             </w:rPr>
           </w:pPr>
-          <w:hyperlink w:anchor="_Toc243299599" w:history="1">
+          <w:hyperlink w:anchor="_Toc243301496" w:history="1">
             <w:r>
               <w:rPr>
                 <w:rStyle w:val="Hyperlink"/>
@@ -651,7 +651,7 @@
               <w:rPr>
                 <w:noProof/>
               </w:rPr>
-              <w:instrText xml:space="preserve"> PAGEREF _Toc243299599 \h </w:instrText>
+              <w:instrText xml:space="preserve"> PAGEREF _Toc243301496 \h </w:instrText>
             </w:r>
             <w:r>
               <w:rPr>
@@ -691,7 +691,7 @@
               <w14:ligatures w14:val="standardContextual"/>
             </w:rPr>
           </w:pPr>
-          <w:hyperlink w:anchor="_Toc243299600" w:history="1">
+          <w:hyperlink w:anchor="_Toc243301497" w:history="1">
             <w:r>
               <w:rPr>
                 <w:rStyle w:val="Hyperlink"/>
@@ -715,7 +715,7 @@
               <w:rPr>
                 <w:noProof/>
               </w:rPr>
-              <w:instrText xml:space="preserve"> PAGEREF _Toc243299600 \h </w:instrText>
+              <w:instrText xml:space="preserve"> PAGEREF _Toc243301497 \h </w:instrText>
             </w:r>
             <w:r>
               <w:rPr>
@@ -755,7 +755,7 @@
               <w14:ligatures w14:val="standardContextual"/>
             </w:rPr>
           </w:pPr>
-          <w:hyperlink w:anchor="_Toc243299601" w:history="1">
+          <w:hyperlink w:anchor="_Toc243301498" w:history="1">
             <w:r>
               <w:rPr>
                 <w:rStyle w:val="Hyperlink"/>
@@ -779,7 +779,7 @@
               <w:rPr>
                 <w:noProof/>
               </w:rPr>
-              <w:instrText xml:space="preserve"> PAGEREF _Toc243299601 \h </w:instrText>
+              <w:instrText xml:space="preserve"> PAGEREF _Toc243301498 \h </w:instrText>
             </w:r>
             <w:r>
               <w:rPr>
@@ -819,7 +819,7 @@
               <w14:ligatures w14:val="standardContextual"/>
             </w:rPr>
           </w:pPr>
-          <w:hyperlink w:anchor="_Toc243299602" w:history="1">
+          <w:hyperlink w:anchor="_Toc243301499" w:history="1">
             <w:r>
               <w:rPr>
                 <w:rStyle w:val="Hyperlink"/>
@@ -843,7 +843,7 @@
               <w:rPr>
                 <w:noProof/>
               </w:rPr>
-              <w:instrText xml:space="preserve"> PAGEREF _Toc243299602 \h </w:instrText>
+              <w:instrText xml:space="preserve"> PAGEREF _Toc243301499 \h </w:instrText>
             </w:r>
             <w:r>
               <w:rPr>
@@ -883,7 +883,7 @@
               <w14:ligatures w14:val="standardContextual"/>
             </w:rPr>
           </w:pPr>
-          <w:hyperlink w:anchor="_Toc243299603" w:history="1">
+          <w:hyperlink w:anchor="_Toc243301500" w:history="1">
             <w:r>
               <w:rPr>
                 <w:rStyle w:val="Hyperlink"/>
@@ -907,7 +907,7 @@
               <w:rPr>
                 <w:noProof/>
               </w:rPr>
-              <w:instrText xml:space="preserve"> PAGEREF _Toc243299603 \h </w:instrText>
+              <w:instrText xml:space="preserve"> PAGEREF _Toc243301500 \h </w:instrText>
             </w:r>
             <w:r>
               <w:rPr>
@@ -947,7 +947,7 @@
               <w14:ligatures w14:val="standardContextual"/>
             </w:rPr>
           </w:pPr>
-          <w:hyperlink w:anchor="_Toc243299604" w:history="1">
+          <w:hyperlink w:anchor="_Toc243301501" w:history="1">
             <w:r>
               <w:rPr>
                 <w:rStyle w:val="Hyperlink"/>
@@ -971,7 +971,7 @@
               <w:rPr>
                 <w:noProof/>
               </w:rPr>
-              <w:instrText xml:space="preserve"> PAGEREF _Toc243299604 \h </w:instrText>
+              <w:instrText xml:space="preserve"> PAGEREF _Toc243301501 \h </w:instrText>
             </w:r>
             <w:r>
               <w:rPr>
@@ -1011,7 +1011,7 @@
               <w14:ligatures w14:val="standardContextual"/>
             </w:rPr>
           </w:pPr>
-          <w:hyperlink w:anchor="_Toc243299605" w:history="1">
+          <w:hyperlink w:anchor="_Toc243301502" w:history="1">
             <w:r>
               <w:rPr>
                 <w:rStyle w:val="Hyperlink"/>
@@ -1035,7 +1035,7 @@
               <w:rPr>
                 <w:noProof/>
               </w:rPr>
-              <w:instrText xml:space="preserve"> PAGEREF _Toc243299605 \h </w:instrText>
+              <w:instrText xml:space="preserve"> PAGEREF _Toc243301502 \h </w:instrText>
             </w:r>
             <w:r>
               <w:rPr>
@@ -1075,7 +1075,7 @@
               <w14:ligatures w14:val="standardContextual"/>
             </w:rPr>
           </w:pPr>
-          <w:hyperlink w:anchor="_Toc243299606" w:history="1">
+          <w:hyperlink w:anchor="_Toc243301503" w:history="1">
             <w:r>
               <w:rPr>
                 <w:rStyle w:val="Hyperlink"/>
@@ -1099,7 +1099,7 @@
               <w:rPr>
                 <w:noProof/>
               </w:rPr>
-              <w:instrText xml:space="preserve"> PAGEREF _Toc243299606 \h </w:instrText>
+              <w:instrText xml:space="preserve"> PAGEREF _Toc243301503 \h </w:instrText>
             </w:r>
             <w:r>
               <w:rPr>
@@ -1144,7 +1144,7 @@
     <w:sdt>
       <w:sdtPr>
         <w:alias w:val="LISTA DE QUADROS"/>
-        <w:id w:val="-1113359238"/>
+        <w:id w:val="-626161061"/>
       </w:sdtPr>
       <w:sdtEndPr/>
       <w:sdtContent>
@@ -1170,7 +1170,7 @@
           <w:r>
             <w:fldChar w:fldCharType="separate"/>
           </w:r>
-          <w:hyperlink w:anchor="_Toc243299607" w:history="1">
+          <w:hyperlink w:anchor="_Toc243301504" w:history="1">
             <w:r>
               <w:rPr>
                 <w:rStyle w:val="Hyperlink"/>
@@ -1194,7 +1194,7 @@
               <w:rPr>
                 <w:noProof/>
               </w:rPr>
-              <w:instrText xml:space="preserve"> PAGEREF _Toc243299607 \h </w:instrText>
+              <w:instrText xml:space="preserve"> PAGEREF _Toc243301504 \h </w:instrText>
             </w:r>
             <w:r>
               <w:rPr>
@@ -1234,7 +1234,7 @@
               <w14:ligatures w14:val="standardContextual"/>
             </w:rPr>
           </w:pPr>
-          <w:hyperlink w:anchor="_Toc243299608" w:history="1">
+          <w:hyperlink w:anchor="_Toc243301505" w:history="1">
             <w:r>
               <w:rPr>
                 <w:rStyle w:val="Hyperlink"/>
@@ -1258,7 +1258,7 @@
               <w:rPr>
                 <w:noProof/>
               </w:rPr>
-              <w:instrText xml:space="preserve"> PAGEREF _Toc243299608 \h </w:instrText>
+              <w:instrText xml:space="preserve"> PAGEREF _Toc243301505 \h </w:instrText>
             </w:r>
             <w:r>
               <w:rPr>
@@ -1298,7 +1298,7 @@
               <w14:ligatures w14:val="standardContextual"/>
             </w:rPr>
           </w:pPr>
-          <w:hyperlink w:anchor="_Toc243299609" w:history="1">
+          <w:hyperlink w:anchor="_Toc243301506" w:history="1">
             <w:r>
               <w:rPr>
                 <w:rStyle w:val="Hyperlink"/>
@@ -1322,7 +1322,7 @@
               <w:rPr>
                 <w:noProof/>
               </w:rPr>
-              <w:instrText xml:space="preserve"> PAGEREF _Toc243299609 \h </w:instrText>
+              <w:instrText xml:space="preserve"> PAGEREF _Toc243301506 \h </w:instrText>
             </w:r>
             <w:r>
               <w:rPr>
@@ -1362,7 +1362,7 @@
               <w14:ligatures w14:val="standardContextual"/>
             </w:rPr>
           </w:pPr>
-          <w:hyperlink w:anchor="_Toc243299610" w:history="1">
+          <w:hyperlink w:anchor="_Toc243301507" w:history="1">
             <w:r>
               <w:rPr>
                 <w:rStyle w:val="Hyperlink"/>
@@ -1386,7 +1386,7 @@
               <w:rPr>
                 <w:noProof/>
               </w:rPr>
-              <w:instrText xml:space="preserve"> PAGEREF _Toc243299610 \h </w:instrText>
+              <w:instrText xml:space="preserve"> PAGEREF _Toc243301507 \h </w:instrText>
             </w:r>
             <w:r>
               <w:rPr>
@@ -1426,7 +1426,7 @@
               <w14:ligatures w14:val="standardContextual"/>
             </w:rPr>
           </w:pPr>
-          <w:hyperlink w:anchor="_Toc243299611" w:history="1">
+          <w:hyperlink w:anchor="_Toc243301508" w:history="1">
             <w:r>
               <w:rPr>
                 <w:rStyle w:val="Hyperlink"/>
@@ -1450,7 +1450,7 @@
               <w:rPr>
                 <w:noProof/>
               </w:rPr>
-              <w:instrText xml:space="preserve"> PAGEREF _Toc243299611 \h </w:instrText>
+              <w:instrText xml:space="preserve"> PAGEREF _Toc243301508 \h </w:instrText>
             </w:r>
             <w:r>
               <w:rPr>
@@ -1490,7 +1490,7 @@
               <w14:ligatures w14:val="standardContextual"/>
             </w:rPr>
           </w:pPr>
-          <w:hyperlink w:anchor="_Toc243299612" w:history="1">
+          <w:hyperlink w:anchor="_Toc243301509" w:history="1">
             <w:r>
               <w:rPr>
                 <w:rStyle w:val="Hyperlink"/>
@@ -1514,7 +1514,7 @@
               <w:rPr>
                 <w:noProof/>
               </w:rPr>
-              <w:instrText xml:space="preserve"> PAGEREF _Toc243299612 \h </w:instrText>
+              <w:instrText xml:space="preserve"> PAGEREF _Toc243301509 \h </w:instrText>
             </w:r>
             <w:r>
               <w:rPr>
@@ -1554,7 +1554,7 @@
               <w14:ligatures w14:val="standardContextual"/>
             </w:rPr>
           </w:pPr>
-          <w:hyperlink w:anchor="_Toc243299613" w:history="1">
+          <w:hyperlink w:anchor="_Toc243301510" w:history="1">
             <w:r>
               <w:rPr>
                 <w:rStyle w:val="Hyperlink"/>
@@ -1578,7 +1578,7 @@
               <w:rPr>
                 <w:noProof/>
               </w:rPr>
-              <w:instrText xml:space="preserve"> PAGEREF _Toc243299613 \h </w:instrText>
+              <w:instrText xml:space="preserve"> PAGEREF _Toc243301510 \h </w:instrText>
             </w:r>
             <w:r>
               <w:rPr>
@@ -1623,7 +1623,7 @@
     <w:sdt>
       <w:sdtPr>
         <w:alias w:val="LISTA DE TABELAS"/>
-        <w:id w:val="-1534569972"/>
+        <w:id w:val="822162155"/>
       </w:sdtPr>
       <w:sdtEndPr/>
       <w:sdtContent>
@@ -1649,7 +1649,7 @@
           <w:r>
             <w:fldChar w:fldCharType="separate"/>
           </w:r>
-          <w:hyperlink w:anchor="_Toc243299614" w:history="1">
+          <w:hyperlink w:anchor="_Toc243301511" w:history="1">
             <w:r>
               <w:rPr>
                 <w:rStyle w:val="Hyperlink"/>
@@ -1673,7 +1673,7 @@
               <w:rPr>
                 <w:noProof/>
               </w:rPr>
-              <w:instrText xml:space="preserve"> PAGEREF _Toc243299614 \h </w:instrText>
+              <w:instrText xml:space="preserve"> PAGEREF _Toc243301511 \h </w:instrText>
             </w:r>
             <w:r>
               <w:rPr>
@@ -1713,7 +1713,7 @@
               <w14:ligatures w14:val="standardContextual"/>
             </w:rPr>
           </w:pPr>
-          <w:hyperlink w:anchor="_Toc243299615" w:history="1">
+          <w:hyperlink w:anchor="_Toc243301512" w:history="1">
             <w:r>
               <w:rPr>
                 <w:rStyle w:val="Hyperlink"/>
@@ -1737,7 +1737,7 @@
               <w:rPr>
                 <w:noProof/>
               </w:rPr>
-              <w:instrText xml:space="preserve"> PAGEREF _Toc243299615 \h </w:instrText>
+              <w:instrText xml:space="preserve"> PAGEREF _Toc243301512 \h </w:instrText>
             </w:r>
             <w:r>
               <w:rPr>
@@ -1777,7 +1777,7 @@
               <w14:ligatures w14:val="standardContextual"/>
             </w:rPr>
           </w:pPr>
-          <w:hyperlink w:anchor="_Toc243299616" w:history="1">
+          <w:hyperlink w:anchor="_Toc243301513" w:history="1">
             <w:r>
               <w:rPr>
                 <w:rStyle w:val="Hyperlink"/>
@@ -1801,7 +1801,7 @@
               <w:rPr>
                 <w:noProof/>
               </w:rPr>
-              <w:instrText xml:space="preserve"> PAGEREF _Toc243299616 \h </w:instrText>
+              <w:instrText xml:space="preserve"> PAGEREF _Toc243301513 \h </w:instrText>
             </w:r>
             <w:r>
               <w:rPr>
@@ -1841,7 +1841,7 @@
               <w14:ligatures w14:val="standardContextual"/>
             </w:rPr>
           </w:pPr>
-          <w:hyperlink w:anchor="_Toc243299617" w:history="1">
+          <w:hyperlink w:anchor="_Toc243301514" w:history="1">
             <w:r>
               <w:rPr>
                 <w:rStyle w:val="Hyperlink"/>
@@ -1865,7 +1865,7 @@
               <w:rPr>
                 <w:noProof/>
               </w:rPr>
-              <w:instrText xml:space="preserve"> PAGEREF _Toc243299617 \h </w:instrText>
+              <w:instrText xml:space="preserve"> PAGEREF _Toc243301514 \h </w:instrText>
             </w:r>
             <w:r>
               <w:rPr>
@@ -1905,7 +1905,7 @@
               <w14:ligatures w14:val="standardContextual"/>
             </w:rPr>
           </w:pPr>
-          <w:hyperlink w:anchor="_Toc243299618" w:history="1">
+          <w:hyperlink w:anchor="_Toc243301515" w:history="1">
             <w:r>
               <w:rPr>
                 <w:rStyle w:val="Hyperlink"/>
@@ -1929,7 +1929,7 @@
               <w:rPr>
                 <w:noProof/>
               </w:rPr>
-              <w:instrText xml:space="preserve"> PAGEREF _Toc243299618 \h </w:instrText>
+              <w:instrText xml:space="preserve"> PAGEREF _Toc243301515 \h </w:instrText>
             </w:r>
             <w:r>
               <w:rPr>
@@ -2532,7 +2532,7 @@
           <w:bCs w:val="0"/>
         </w:rPr>
         <w:alias w:val="Sumário"/>
-        <w:id w:val="-260373951"/>
+        <w:id w:val="-1315481255"/>
       </w:sdtPr>
       <w:sdtEndPr/>
       <w:sdtContent>
@@ -2560,7 +2560,7 @@
           <w:r>
             <w:fldChar w:fldCharType="separate"/>
           </w:r>
-          <w:hyperlink w:anchor="_Toc243299549" w:history="1">
+          <w:hyperlink w:anchor="_Toc243301446" w:history="1">
             <w:r>
               <w:rPr>
                 <w:rStyle w:val="Hyperlink"/>
@@ -2584,7 +2584,7 @@
               <w:rPr>
                 <w:noProof/>
               </w:rPr>
-              <w:instrText xml:space="preserve"> PAGEREF _Toc243299549 \h </w:instrText>
+              <w:instrText xml:space="preserve"> PAGEREF _Toc243301446 \h </w:instrText>
             </w:r>
             <w:r>
               <w:rPr>
@@ -2624,7 +2624,7 @@
               <w14:ligatures w14:val="standardContextual"/>
             </w:rPr>
           </w:pPr>
-          <w:hyperlink w:anchor="_Toc243299550" w:history="1">
+          <w:hyperlink w:anchor="_Toc243301447" w:history="1">
             <w:r>
               <w:rPr>
                 <w:rStyle w:val="Hyperlink"/>
@@ -2648,7 +2648,7 @@
               <w:rPr>
                 <w:noProof/>
               </w:rPr>
-              <w:instrText xml:space="preserve"> PAGEREF _Toc243299550 \h </w:instrText>
+              <w:instrText xml:space="preserve"> PAGEREF _Toc243301447 \h </w:instrText>
             </w:r>
             <w:r>
               <w:rPr>
@@ -2688,7 +2688,7 @@
               <w14:ligatures w14:val="standardContextual"/>
             </w:rPr>
           </w:pPr>
-          <w:hyperlink w:anchor="_Toc243299551" w:history="1">
+          <w:hyperlink w:anchor="_Toc243301448" w:history="1">
             <w:r>
               <w:rPr>
                 <w:rStyle w:val="Hyperlink"/>
@@ -2712,7 +2712,7 @@
               <w:rPr>
                 <w:noProof/>
               </w:rPr>
-              <w:instrText xml:space="preserve"> PAGEREF _Toc243299551 \h </w:instrText>
+              <w:instrText xml:space="preserve"> PAGEREF _Toc243301448 \h </w:instrText>
             </w:r>
             <w:r>
               <w:rPr>
@@ -2752,7 +2752,7 @@
               <w14:ligatures w14:val="standardContextual"/>
             </w:rPr>
           </w:pPr>
-          <w:hyperlink w:anchor="_Toc243299552" w:history="1">
+          <w:hyperlink w:anchor="_Toc243301449" w:history="1">
             <w:r>
               <w:rPr>
                 <w:rStyle w:val="Hyperlink"/>
@@ -2776,7 +2776,7 @@
               <w:rPr>
                 <w:noProof/>
               </w:rPr>
-              <w:instrText xml:space="preserve"> PAGEREF _Toc243299552 \h </w:instrText>
+              <w:instrText xml:space="preserve"> PAGEREF _Toc243301449 \h </w:instrText>
             </w:r>
             <w:r>
               <w:rPr>
@@ -2816,7 +2816,7 @@
               <w14:ligatures w14:val="standardContextual"/>
             </w:rPr>
           </w:pPr>
-          <w:hyperlink w:anchor="_Toc243299553" w:history="1">
+          <w:hyperlink w:anchor="_Toc243301450" w:history="1">
             <w:r>
               <w:rPr>
                 <w:rStyle w:val="Hyperlink"/>
@@ -2840,7 +2840,7 @@
               <w:rPr>
                 <w:noProof/>
               </w:rPr>
-              <w:instrText xml:space="preserve"> PAGEREF _Toc243299553 \h </w:instrText>
+              <w:instrText xml:space="preserve"> PAGEREF _Toc243301450 \h </w:instrText>
             </w:r>
             <w:r>
               <w:rPr>
@@ -2882,7 +2882,7 @@
               <w14:ligatures w14:val="standardContextual"/>
             </w:rPr>
           </w:pPr>
-          <w:hyperlink w:anchor="_Toc243299554" w:history="1">
+          <w:hyperlink w:anchor="_Toc243301451" w:history="1">
             <w:r>
               <w:rPr>
                 <w:rStyle w:val="Hyperlink"/>
@@ -2906,7 +2906,7 @@
               <w:rPr>
                 <w:noProof/>
               </w:rPr>
-              <w:instrText xml:space="preserve"> PAGEREF _Toc243299554 \h </w:instrText>
+              <w:instrText xml:space="preserve"> PAGEREF _Toc243301451 \h </w:instrText>
             </w:r>
             <w:r>
               <w:rPr>
@@ -2946,7 +2946,7 @@
               <w14:ligatures w14:val="standardContextual"/>
             </w:rPr>
           </w:pPr>
-          <w:hyperlink w:anchor="_Toc243299555" w:history="1">
+          <w:hyperlink w:anchor="_Toc243301452" w:history="1">
             <w:r>
               <w:rPr>
                 <w:rStyle w:val="Hyperlink"/>
@@ -2970,7 +2970,7 @@
               <w:rPr>
                 <w:noProof/>
               </w:rPr>
-              <w:instrText xml:space="preserve"> PAGEREF _Toc243299555 \h </w:instrText>
+              <w:instrText xml:space="preserve"> PAGEREF _Toc243301452 \h </w:instrText>
             </w:r>
             <w:r>
               <w:rPr>
@@ -3010,7 +3010,7 @@
               <w14:ligatures w14:val="standardContextual"/>
             </w:rPr>
           </w:pPr>
-          <w:hyperlink w:anchor="_Toc243299556" w:history="1">
+          <w:hyperlink w:anchor="_Toc243301453" w:history="1">
             <w:r>
               <w:rPr>
                 <w:rStyle w:val="Hyperlink"/>
@@ -3034,7 +3034,7 @@
               <w:rPr>
                 <w:noProof/>
               </w:rPr>
-              <w:instrText xml:space="preserve"> PAGEREF _Toc243299556 \h </w:instrText>
+              <w:instrText xml:space="preserve"> PAGEREF _Toc243301453 \h </w:instrText>
             </w:r>
             <w:r>
               <w:rPr>
@@ -3074,7 +3074,7 @@
               <w14:ligatures w14:val="standardContextual"/>
             </w:rPr>
           </w:pPr>
-          <w:hyperlink w:anchor="_Toc243299557" w:history="1">
+          <w:hyperlink w:anchor="_Toc243301454" w:history="1">
             <w:r>
               <w:rPr>
                 <w:rStyle w:val="Hyperlink"/>
@@ -3098,7 +3098,7 @@
               <w:rPr>
                 <w:noProof/>
               </w:rPr>
-              <w:instrText xml:space="preserve"> PAGEREF _Toc243299557 \h </w:instrText>
+              <w:instrText xml:space="preserve"> PAGEREF _Toc243301454 \h </w:instrText>
             </w:r>
             <w:r>
               <w:rPr>
@@ -3138,7 +3138,7 @@
               <w14:ligatures w14:val="standardContextual"/>
             </w:rPr>
           </w:pPr>
-          <w:hyperlink w:anchor="_Toc243299558" w:history="1">
+          <w:hyperlink w:anchor="_Toc243301455" w:history="1">
             <w:r>
               <w:rPr>
                 <w:rStyle w:val="Hyperlink"/>
@@ -3162,7 +3162,7 @@
               <w:rPr>
                 <w:noProof/>
               </w:rPr>
-              <w:instrText xml:space="preserve"> PAGEREF _Toc243299558 \h </w:instrText>
+              <w:instrText xml:space="preserve"> PAGEREF _Toc243301455 \h </w:instrText>
             </w:r>
             <w:r>
               <w:rPr>
@@ -3202,7 +3202,7 @@
               <w14:ligatures w14:val="standardContextual"/>
             </w:rPr>
           </w:pPr>
-          <w:hyperlink w:anchor="_Toc243299559" w:history="1">
+          <w:hyperlink w:anchor="_Toc243301456" w:history="1">
             <w:r>
               <w:rPr>
                 <w:rStyle w:val="Hyperlink"/>
@@ -3226,7 +3226,7 @@
               <w:rPr>
                 <w:noProof/>
               </w:rPr>
-              <w:instrText xml:space="preserve"> PAGEREF _Toc243299559 \h </w:instrText>
+              <w:instrText xml:space="preserve"> PAGEREF _Toc243301456 \h </w:instrText>
             </w:r>
             <w:r>
               <w:rPr>
@@ -3268,7 +3268,7 @@
               <w14:ligatures w14:val="standardContextual"/>
             </w:rPr>
           </w:pPr>
-          <w:hyperlink w:anchor="_Toc243299560" w:history="1">
+          <w:hyperlink w:anchor="_Toc243301457" w:history="1">
             <w:r>
               <w:rPr>
                 <w:rStyle w:val="Hyperlink"/>
@@ -3292,7 +3292,7 @@
               <w:rPr>
                 <w:noProof/>
               </w:rPr>
-              <w:instrText xml:space="preserve"> PAGEREF _Toc243299560 \h </w:instrText>
+              <w:instrText xml:space="preserve"> PAGEREF _Toc243301457 \h </w:instrText>
             </w:r>
             <w:r>
               <w:rPr>
@@ -3332,7 +3332,7 @@
               <w14:ligatures w14:val="standardContextual"/>
             </w:rPr>
           </w:pPr>
-          <w:hyperlink w:anchor="_Toc243299561" w:history="1">
+          <w:hyperlink w:anchor="_Toc243301458" w:history="1">
             <w:r>
               <w:rPr>
                 <w:rStyle w:val="Hyperlink"/>
@@ -3356,7 +3356,7 @@
               <w:rPr>
                 <w:noProof/>
               </w:rPr>
-              <w:instrText xml:space="preserve"> PAGEREF _Toc243299561 \h </w:instrText>
+              <w:instrText xml:space="preserve"> PAGEREF _Toc243301458 \h </w:instrText>
             </w:r>
             <w:r>
               <w:rPr>
@@ -3396,7 +3396,7 @@
               <w14:ligatures w14:val="standardContextual"/>
             </w:rPr>
           </w:pPr>
-          <w:hyperlink w:anchor="_Toc243299562" w:history="1">
+          <w:hyperlink w:anchor="_Toc243301459" w:history="1">
             <w:r>
               <w:rPr>
                 <w:rStyle w:val="Hyperlink"/>
@@ -3420,7 +3420,7 @@
               <w:rPr>
                 <w:noProof/>
               </w:rPr>
-              <w:instrText xml:space="preserve"> PAGEREF _Toc243299562 \h </w:instrText>
+              <w:instrText xml:space="preserve"> PAGEREF _Toc243301459 \h </w:instrText>
             </w:r>
             <w:r>
               <w:rPr>
@@ -3460,7 +3460,7 @@
               <w14:ligatures w14:val="standardContextual"/>
             </w:rPr>
           </w:pPr>
-          <w:hyperlink w:anchor="_Toc243299563" w:history="1">
+          <w:hyperlink w:anchor="_Toc243301460" w:history="1">
             <w:r>
               <w:rPr>
                 <w:rStyle w:val="Hyperlink"/>
@@ -3484,7 +3484,7 @@
               <w:rPr>
                 <w:noProof/>
               </w:rPr>
-              <w:instrText xml:space="preserve"> PAGEREF _Toc243299563 \h </w:instrText>
+              <w:instrText xml:space="preserve"> PAGEREF _Toc243301460 \h </w:instrText>
             </w:r>
             <w:r>
               <w:rPr>
@@ -3524,7 +3524,7 @@
               <w14:ligatures w14:val="standardContextual"/>
             </w:rPr>
           </w:pPr>
-          <w:hyperlink w:anchor="_Toc243299564" w:history="1">
+          <w:hyperlink w:anchor="_Toc243301461" w:history="1">
             <w:r>
               <w:rPr>
                 <w:rStyle w:val="Hyperlink"/>
@@ -3548,7 +3548,7 @@
               <w:rPr>
                 <w:noProof/>
               </w:rPr>
-              <w:instrText xml:space="preserve"> PAGEREF _Toc243299564 \h </w:instrText>
+              <w:instrText xml:space="preserve"> PAGEREF _Toc243301461 \h </w:instrText>
             </w:r>
             <w:r>
               <w:rPr>
@@ -3588,7 +3588,7 @@
               <w14:ligatures w14:val="standardContextual"/>
             </w:rPr>
           </w:pPr>
-          <w:hyperlink w:anchor="_Toc243299565" w:history="1">
+          <w:hyperlink w:anchor="_Toc243301462" w:history="1">
             <w:r>
               <w:rPr>
                 <w:rStyle w:val="Hyperlink"/>
@@ -3612,7 +3612,7 @@
               <w:rPr>
                 <w:noProof/>
               </w:rPr>
-              <w:instrText xml:space="preserve"> PAGEREF _Toc243299565 \h </w:instrText>
+              <w:instrText xml:space="preserve"> PAGEREF _Toc243301462 \h </w:instrText>
             </w:r>
             <w:r>
               <w:rPr>
@@ -3652,7 +3652,7 @@
               <w14:ligatures w14:val="standardContextual"/>
             </w:rPr>
           </w:pPr>
-          <w:hyperlink w:anchor="_Toc243299566" w:history="1">
+          <w:hyperlink w:anchor="_Toc243301463" w:history="1">
             <w:r>
               <w:rPr>
                 <w:rStyle w:val="Hyperlink"/>
@@ -3676,7 +3676,7 @@
               <w:rPr>
                 <w:noProof/>
               </w:rPr>
-              <w:instrText xml:space="preserve"> PAGEREF _Toc243299566 \h </w:instrText>
+              <w:instrText xml:space="preserve"> PAGEREF _Toc243301463 \h </w:instrText>
             </w:r>
             <w:r>
               <w:rPr>
@@ -3716,7 +3716,7 @@
               <w14:ligatures w14:val="standardContextual"/>
             </w:rPr>
           </w:pPr>
-          <w:hyperlink w:anchor="_Toc243299567" w:history="1">
+          <w:hyperlink w:anchor="_Toc243301464" w:history="1">
             <w:r>
               <w:rPr>
                 <w:rStyle w:val="Hyperlink"/>
@@ -3740,7 +3740,7 @@
               <w:rPr>
                 <w:noProof/>
               </w:rPr>
-              <w:instrText xml:space="preserve"> PAGEREF _Toc243299567 \h </w:instrText>
+              <w:instrText xml:space="preserve"> PAGEREF _Toc243301464 \h </w:instrText>
             </w:r>
             <w:r>
               <w:rPr>
@@ -3780,7 +3780,7 @@
               <w14:ligatures w14:val="standardContextual"/>
             </w:rPr>
           </w:pPr>
-          <w:hyperlink w:anchor="_Toc243299568" w:history="1">
+          <w:hyperlink w:anchor="_Toc243301465" w:history="1">
             <w:r>
               <w:rPr>
                 <w:rStyle w:val="Hyperlink"/>
@@ -3804,7 +3804,7 @@
               <w:rPr>
                 <w:noProof/>
               </w:rPr>
-              <w:instrText xml:space="preserve"> PAGEREF _Toc243299568 \h </w:instrText>
+              <w:instrText xml:space="preserve"> PAGEREF _Toc243301465 \h </w:instrText>
             </w:r>
             <w:r>
               <w:rPr>
@@ -3844,7 +3844,7 @@
               <w14:ligatures w14:val="standardContextual"/>
             </w:rPr>
           </w:pPr>
-          <w:hyperlink w:anchor="_Toc243299569" w:history="1">
+          <w:hyperlink w:anchor="_Toc243301466" w:history="1">
             <w:r>
               <w:rPr>
                 <w:rStyle w:val="Hyperlink"/>
@@ -3868,7 +3868,7 @@
               <w:rPr>
                 <w:noProof/>
               </w:rPr>
-              <w:instrText xml:space="preserve"> PAGEREF _Toc243299569 \h </w:instrText>
+              <w:instrText xml:space="preserve"> PAGEREF _Toc243301466 \h </w:instrText>
             </w:r>
             <w:r>
               <w:rPr>
@@ -3908,7 +3908,7 @@
               <w14:ligatures w14:val="standardContextual"/>
             </w:rPr>
           </w:pPr>
-          <w:hyperlink w:anchor="_Toc243299570" w:history="1">
+          <w:hyperlink w:anchor="_Toc243301467" w:history="1">
             <w:r>
               <w:rPr>
                 <w:rStyle w:val="Hyperlink"/>
@@ -3932,7 +3932,7 @@
               <w:rPr>
                 <w:noProof/>
               </w:rPr>
-              <w:instrText xml:space="preserve"> PAGEREF _Toc243299570 \h </w:instrText>
+              <w:instrText xml:space="preserve"> PAGEREF _Toc243301467 \h </w:instrText>
             </w:r>
             <w:r>
               <w:rPr>
@@ -3972,7 +3972,7 @@
               <w14:ligatures w14:val="standardContextual"/>
             </w:rPr>
           </w:pPr>
-          <w:hyperlink w:anchor="_Toc243299571" w:history="1">
+          <w:hyperlink w:anchor="_Toc243301468" w:history="1">
             <w:r>
               <w:rPr>
                 <w:rStyle w:val="Hyperlink"/>
@@ -3996,7 +3996,7 @@
               <w:rPr>
                 <w:noProof/>
               </w:rPr>
-              <w:instrText xml:space="preserve"> PAGEREF _Toc243299571 \h </w:instrText>
+              <w:instrText xml:space="preserve"> PAGEREF _Toc243301468 \h </w:instrText>
             </w:r>
             <w:r>
               <w:rPr>
@@ -4038,7 +4038,7 @@
               <w14:ligatures w14:val="standardContextual"/>
             </w:rPr>
           </w:pPr>
-          <w:hyperlink w:anchor="_Toc243299572" w:history="1">
+          <w:hyperlink w:anchor="_Toc243301469" w:history="1">
             <w:r>
               <w:rPr>
                 <w:rStyle w:val="Hyperlink"/>
@@ -4062,7 +4062,7 @@
               <w:rPr>
                 <w:noProof/>
               </w:rPr>
-              <w:instrText xml:space="preserve"> PAGEREF _Toc243299572 \h </w:instrText>
+              <w:instrText xml:space="preserve"> PAGEREF _Toc243301469 \h </w:instrText>
             </w:r>
             <w:r>
               <w:rPr>
@@ -4102,7 +4102,7 @@
               <w14:ligatures w14:val="standardContextual"/>
             </w:rPr>
           </w:pPr>
-          <w:hyperlink w:anchor="_Toc243299573" w:history="1">
+          <w:hyperlink w:anchor="_Toc243301470" w:history="1">
             <w:r>
               <w:rPr>
                 <w:rStyle w:val="Hyperlink"/>
@@ -4126,7 +4126,7 @@
               <w:rPr>
                 <w:noProof/>
               </w:rPr>
-              <w:instrText xml:space="preserve"> PAGEREF _Toc243299573 \h </w:instrText>
+              <w:instrText xml:space="preserve"> PAGEREF _Toc243301470 \h </w:instrText>
             </w:r>
             <w:r>
               <w:rPr>
@@ -4166,7 +4166,7 @@
               <w14:ligatures w14:val="standardContextual"/>
             </w:rPr>
           </w:pPr>
-          <w:hyperlink w:anchor="_Toc243299574" w:history="1">
+          <w:hyperlink w:anchor="_Toc243301471" w:history="1">
             <w:r>
               <w:rPr>
                 <w:rStyle w:val="Hyperlink"/>
@@ -4190,7 +4190,7 @@
               <w:rPr>
                 <w:noProof/>
               </w:rPr>
-              <w:instrText xml:space="preserve"> PAGEREF _Toc243299574 \h </w:instrText>
+              <w:instrText xml:space="preserve"> PAGEREF _Toc243301471 \h </w:instrText>
             </w:r>
             <w:r>
               <w:rPr>
@@ -4230,7 +4230,7 @@
               <w14:ligatures w14:val="standardContextual"/>
             </w:rPr>
           </w:pPr>
-          <w:hyperlink w:anchor="_Toc243299575" w:history="1">
+          <w:hyperlink w:anchor="_Toc243301472" w:history="1">
             <w:r>
               <w:rPr>
                 <w:rStyle w:val="Hyperlink"/>
@@ -4254,7 +4254,7 @@
               <w:rPr>
                 <w:noProof/>
               </w:rPr>
-              <w:instrText xml:space="preserve"> PAGEREF _Toc243299575 \h </w:instrText>
+              <w:instrText xml:space="preserve"> PAGEREF _Toc243301472 \h </w:instrText>
             </w:r>
             <w:r>
               <w:rPr>
@@ -4294,7 +4294,7 @@
               <w14:ligatures w14:val="standardContextual"/>
             </w:rPr>
           </w:pPr>
-          <w:hyperlink w:anchor="_Toc243299576" w:history="1">
+          <w:hyperlink w:anchor="_Toc243301473" w:history="1">
             <w:r>
               <w:rPr>
                 <w:rStyle w:val="Hyperlink"/>
@@ -4318,7 +4318,7 @@
               <w:rPr>
                 <w:noProof/>
               </w:rPr>
-              <w:instrText xml:space="preserve"> PAGEREF _Toc243299576 \h </w:instrText>
+              <w:instrText xml:space="preserve"> PAGEREF _Toc243301473 \h </w:instrText>
             </w:r>
             <w:r>
               <w:rPr>
@@ -4358,7 +4358,7 @@
               <w14:ligatures w14:val="standardContextual"/>
             </w:rPr>
           </w:pPr>
-          <w:hyperlink w:anchor="_Toc243299577" w:history="1">
+          <w:hyperlink w:anchor="_Toc243301474" w:history="1">
             <w:r>
               <w:rPr>
                 <w:rStyle w:val="Hyperlink"/>
@@ -4382,7 +4382,7 @@
               <w:rPr>
                 <w:noProof/>
               </w:rPr>
-              <w:instrText xml:space="preserve"> PAGEREF _Toc243299577 \h </w:instrText>
+              <w:instrText xml:space="preserve"> PAGEREF _Toc243301474 \h </w:instrText>
             </w:r>
             <w:r>
               <w:rPr>
@@ -4422,7 +4422,7 @@
               <w14:ligatures w14:val="standardContextual"/>
             </w:rPr>
           </w:pPr>
-          <w:hyperlink w:anchor="_Toc243299578" w:history="1">
+          <w:hyperlink w:anchor="_Toc243301475" w:history="1">
             <w:r>
               <w:rPr>
                 <w:rStyle w:val="Hyperlink"/>
@@ -4446,7 +4446,7 @@
               <w:rPr>
                 <w:noProof/>
               </w:rPr>
-              <w:instrText xml:space="preserve"> PAGEREF _Toc243299578 \h </w:instrText>
+              <w:instrText xml:space="preserve"> PAGEREF _Toc243301475 \h </w:instrText>
             </w:r>
             <w:r>
               <w:rPr>
@@ -4486,7 +4486,7 @@
               <w14:ligatures w14:val="standardContextual"/>
             </w:rPr>
           </w:pPr>
-          <w:hyperlink w:anchor="_Toc243299579" w:history="1">
+          <w:hyperlink w:anchor="_Toc243301476" w:history="1">
             <w:r>
               <w:rPr>
                 <w:rStyle w:val="Hyperlink"/>
@@ -4510,7 +4510,7 @@
               <w:rPr>
                 <w:noProof/>
               </w:rPr>
-              <w:instrText xml:space="preserve"> PAGEREF _Toc243299579 \h </w:instrText>
+              <w:instrText xml:space="preserve"> PAGEREF _Toc243301476 \h </w:instrText>
             </w:r>
             <w:r>
               <w:rPr>
@@ -4550,7 +4550,7 @@
               <w14:ligatures w14:val="standardContextual"/>
             </w:rPr>
           </w:pPr>
-          <w:hyperlink w:anchor="_Toc243299580" w:history="1">
+          <w:hyperlink w:anchor="_Toc243301477" w:history="1">
             <w:r>
               <w:rPr>
                 <w:rStyle w:val="Hyperlink"/>
@@ -4574,7 +4574,7 @@
               <w:rPr>
                 <w:noProof/>
               </w:rPr>
-              <w:instrText xml:space="preserve"> PAGEREF _Toc243299580 \h </w:instrText>
+              <w:instrText xml:space="preserve"> PAGEREF _Toc243301477 \h </w:instrText>
             </w:r>
             <w:r>
               <w:rPr>
@@ -4614,7 +4614,7 @@
               <w14:ligatures w14:val="standardContextual"/>
             </w:rPr>
           </w:pPr>
-          <w:hyperlink w:anchor="_Toc243299581" w:history="1">
+          <w:hyperlink w:anchor="_Toc243301478" w:history="1">
             <w:r>
               <w:rPr>
                 <w:rStyle w:val="Hyperlink"/>
@@ -4638,7 +4638,7 @@
               <w:rPr>
                 <w:noProof/>
               </w:rPr>
-              <w:instrText xml:space="preserve"> PAGEREF _Toc243299581 \h </w:instrText>
+              <w:instrText xml:space="preserve"> PAGEREF _Toc243301478 \h </w:instrText>
             </w:r>
             <w:r>
               <w:rPr>
@@ -4678,7 +4678,7 @@
               <w14:ligatures w14:val="standardContextual"/>
             </w:rPr>
           </w:pPr>
-          <w:hyperlink w:anchor="_Toc243299582" w:history="1">
+          <w:hyperlink w:anchor="_Toc243301479" w:history="1">
             <w:r>
               <w:rPr>
                 <w:rStyle w:val="Hyperlink"/>
@@ -4702,7 +4702,7 @@
               <w:rPr>
                 <w:noProof/>
               </w:rPr>
-              <w:instrText xml:space="preserve"> PAGEREF _Toc243299582 \h </w:instrText>
+              <w:instrText xml:space="preserve"> PAGEREF _Toc243301479 \h </w:instrText>
             </w:r>
             <w:r>
               <w:rPr>
@@ -4742,7 +4742,7 @@
               <w14:ligatures w14:val="standardContextual"/>
             </w:rPr>
           </w:pPr>
-          <w:hyperlink w:anchor="_Toc243299583" w:history="1">
+          <w:hyperlink w:anchor="_Toc243301480" w:history="1">
             <w:r>
               <w:rPr>
                 <w:rStyle w:val="Hyperlink"/>
@@ -4766,7 +4766,7 @@
               <w:rPr>
                 <w:noProof/>
               </w:rPr>
-              <w:instrText xml:space="preserve"> PAGEREF _Toc243299583 \h </w:instrText>
+              <w:instrText xml:space="preserve"> PAGEREF _Toc243301480 \h </w:instrText>
             </w:r>
             <w:r>
               <w:rPr>
@@ -4806,7 +4806,7 @@
               <w14:ligatures w14:val="standardContextual"/>
             </w:rPr>
           </w:pPr>
-          <w:hyperlink w:anchor="_Toc243299584" w:history="1">
+          <w:hyperlink w:anchor="_Toc243301481" w:history="1">
             <w:r>
               <w:rPr>
                 <w:rStyle w:val="Hyperlink"/>
@@ -4830,7 +4830,7 @@
               <w:rPr>
                 <w:noProof/>
               </w:rPr>
-              <w:instrText xml:space="preserve"> PAGEREF _Toc243299584 \h </w:instrText>
+              <w:instrText xml:space="preserve"> PAGEREF _Toc243301481 \h </w:instrText>
             </w:r>
             <w:r>
               <w:rPr>
@@ -4870,7 +4870,7 @@
               <w14:ligatures w14:val="standardContextual"/>
             </w:rPr>
           </w:pPr>
-          <w:hyperlink w:anchor="_Toc243299585" w:history="1">
+          <w:hyperlink w:anchor="_Toc243301482" w:history="1">
             <w:r>
               <w:rPr>
                 <w:rStyle w:val="Hyperlink"/>
@@ -4894,7 +4894,7 @@
               <w:rPr>
                 <w:noProof/>
               </w:rPr>
-              <w:instrText xml:space="preserve"> PAGEREF _Toc243299585 \h </w:instrText>
+              <w:instrText xml:space="preserve"> PAGEREF _Toc243301482 \h </w:instrText>
             </w:r>
             <w:r>
               <w:rPr>
@@ -4934,7 +4934,7 @@
               <w14:ligatures w14:val="standardContextual"/>
             </w:rPr>
           </w:pPr>
-          <w:hyperlink w:anchor="_Toc243299586" w:history="1">
+          <w:hyperlink w:anchor="_Toc243301483" w:history="1">
             <w:r>
               <w:rPr>
                 <w:rStyle w:val="Hyperlink"/>
@@ -4958,7 +4958,7 @@
               <w:rPr>
                 <w:noProof/>
               </w:rPr>
-              <w:instrText xml:space="preserve"> PAGEREF _Toc243299586 \h </w:instrText>
+              <w:instrText xml:space="preserve"> PAGEREF _Toc243301483 \h </w:instrText>
             </w:r>
             <w:r>
               <w:rPr>
@@ -4998,7 +4998,7 @@
               <w14:ligatures w14:val="standardContextual"/>
             </w:rPr>
           </w:pPr>
-          <w:hyperlink w:anchor="_Toc243299587" w:history="1">
+          <w:hyperlink w:anchor="_Toc243301484" w:history="1">
             <w:r>
               <w:rPr>
                 <w:rStyle w:val="Hyperlink"/>
@@ -5022,7 +5022,7 @@
               <w:rPr>
                 <w:noProof/>
               </w:rPr>
-              <w:instrText xml:space="preserve"> PAGEREF _Toc243299587 \h </w:instrText>
+              <w:instrText xml:space="preserve"> PAGEREF _Toc243301484 \h </w:instrText>
             </w:r>
             <w:r>
               <w:rPr>
@@ -5064,7 +5064,7 @@
               <w14:ligatures w14:val="standardContextual"/>
             </w:rPr>
           </w:pPr>
-          <w:hyperlink w:anchor="_Toc243299588" w:history="1">
+          <w:hyperlink w:anchor="_Toc243301485" w:history="1">
             <w:r>
               <w:rPr>
                 <w:rStyle w:val="Hyperlink"/>
@@ -5088,7 +5088,7 @@
               <w:rPr>
                 <w:noProof/>
               </w:rPr>
-              <w:instrText xml:space="preserve"> PAGEREF _Toc243299588 \h </w:instrText>
+              <w:instrText xml:space="preserve"> PAGEREF _Toc243301485 \h </w:instrText>
             </w:r>
             <w:r>
               <w:rPr>
@@ -5130,7 +5130,7 @@
               <w14:ligatures w14:val="standardContextual"/>
             </w:rPr>
           </w:pPr>
-          <w:hyperlink w:anchor="_Toc243299589" w:history="1">
+          <w:hyperlink w:anchor="_Toc243301486" w:history="1">
             <w:r>
               <w:rPr>
                 <w:rStyle w:val="Hyperlink"/>
@@ -5154,7 +5154,7 @@
               <w:rPr>
                 <w:noProof/>
               </w:rPr>
-              <w:instrText xml:space="preserve"> PAGEREF _Toc243299589 \h </w:instrText>
+              <w:instrText xml:space="preserve"> PAGEREF _Toc243301486 \h </w:instrText>
             </w:r>
             <w:r>
               <w:rPr>
@@ -5196,7 +5196,7 @@
               <w14:ligatures w14:val="standardContextual"/>
             </w:rPr>
           </w:pPr>
-          <w:hyperlink w:anchor="_Toc243299590" w:history="1">
+          <w:hyperlink w:anchor="_Toc243301487" w:history="1">
             <w:r>
               <w:rPr>
                 <w:rStyle w:val="Hyperlink"/>
@@ -5220,7 +5220,7 @@
               <w:rPr>
                 <w:noProof/>
               </w:rPr>
-              <w:instrText xml:space="preserve"> PAGEREF _Toc243299590 \h </w:instrText>
+              <w:instrText xml:space="preserve"> PAGEREF _Toc243301487 \h </w:instrText>
             </w:r>
             <w:r>
               <w:rPr>
@@ -5262,7 +5262,7 @@
               <w14:ligatures w14:val="standardContextual"/>
             </w:rPr>
           </w:pPr>
-          <w:hyperlink w:anchor="_Toc243299591" w:history="1">
+          <w:hyperlink w:anchor="_Toc243301488" w:history="1">
             <w:r>
               <w:rPr>
                 <w:rStyle w:val="Hyperlink"/>
@@ -5286,7 +5286,7 @@
               <w:rPr>
                 <w:noProof/>
               </w:rPr>
-              <w:instrText xml:space="preserve"> PAGEREF _Toc243299591 \h </w:instrText>
+              <w:instrText xml:space="preserve"> PAGEREF _Toc243301488 \h </w:instrText>
             </w:r>
             <w:r>
               <w:rPr>
@@ -5328,7 +5328,7 @@
               <w14:ligatures w14:val="standardContextual"/>
             </w:rPr>
           </w:pPr>
-          <w:hyperlink w:anchor="_Toc243299592" w:history="1">
+          <w:hyperlink w:anchor="_Toc243301489" w:history="1">
             <w:r>
               <w:rPr>
                 <w:rStyle w:val="Hyperlink"/>
@@ -5352,7 +5352,7 @@
               <w:rPr>
                 <w:noProof/>
               </w:rPr>
-              <w:instrText xml:space="preserve"> PAGEREF _Toc243299592 \h </w:instrText>
+              <w:instrText xml:space="preserve"> PAGEREF _Toc243301489 \h </w:instrText>
             </w:r>
             <w:r>
               <w:rPr>
@@ -5394,7 +5394,7 @@
               <w14:ligatures w14:val="standardContextual"/>
             </w:rPr>
           </w:pPr>
-          <w:hyperlink w:anchor="_Toc243299593" w:history="1">
+          <w:hyperlink w:anchor="_Toc243301490" w:history="1">
             <w:r>
               <w:rPr>
                 <w:rStyle w:val="Hyperlink"/>
@@ -5418,7 +5418,7 @@
               <w:rPr>
                 <w:noProof/>
               </w:rPr>
-              <w:instrText xml:space="preserve"> PAGEREF _Toc243299593 \h </w:instrText>
+              <w:instrText xml:space="preserve"> PAGEREF _Toc243301490 \h </w:instrText>
             </w:r>
             <w:r>
               <w:rPr>
@@ -5460,7 +5460,7 @@
               <w14:ligatures w14:val="standardContextual"/>
             </w:rPr>
           </w:pPr>
-          <w:hyperlink w:anchor="_Toc243299594" w:history="1">
+          <w:hyperlink w:anchor="_Toc243301491" w:history="1">
             <w:r>
               <w:rPr>
                 <w:rStyle w:val="Hyperlink"/>
@@ -5484,7 +5484,7 @@
               <w:rPr>
                 <w:noProof/>
               </w:rPr>
-              <w:instrText xml:space="preserve"> PAGEREF _Toc243299594 \h </w:instrText>
+              <w:instrText xml:space="preserve"> PAGEREF _Toc243301491 \h </w:instrText>
             </w:r>
             <w:r>
               <w:rPr>
@@ -5533,7 +5533,7 @@
       <w:pPr>
         <w:pStyle w:val="Ttulo1"/>
       </w:pPr>
-      <w:bookmarkStart w:id="0" w:name="_Toc243299549"/>
+      <w:bookmarkStart w:id="0" w:name="_Toc243301446"/>
       <w:r>
         <w:t>1 INTRODUÇÃO</w:t>
       </w:r>
@@ -5605,7 +5605,7 @@
       <w:pPr>
         <w:pStyle w:val="Ttulo2"/>
       </w:pPr>
-      <w:bookmarkStart w:id="1" w:name="_Toc243299550"/>
+      <w:bookmarkStart w:id="1" w:name="_Toc243301447"/>
       <w:r>
         <w:t>1.1 OBJETIVOS</w:t>
       </w:r>
@@ -5615,7 +5615,7 @@
       <w:pPr>
         <w:pStyle w:val="Ttulo3"/>
       </w:pPr>
-      <w:bookmarkStart w:id="2" w:name="_Toc243299551"/>
+      <w:bookmarkStart w:id="2" w:name="_Toc243301448"/>
       <w:r>
         <w:t>1.1.1 Objetivo geral</w:t>
       </w:r>
@@ -5634,7 +5634,7 @@
       <w:pPr>
         <w:pStyle w:val="Ttulo3"/>
       </w:pPr>
-      <w:bookmarkStart w:id="3" w:name="_Toc243299552"/>
+      <w:bookmarkStart w:id="3" w:name="_Toc243301449"/>
       <w:r>
         <w:t>1.1.2 Objetivos específicos</w:t>
       </w:r>
@@ -5742,7 +5742,7 @@
       <w:pPr>
         <w:pStyle w:val="Ttulo2"/>
       </w:pPr>
-      <w:bookmarkStart w:id="4" w:name="_Toc243299553"/>
+      <w:bookmarkStart w:id="4" w:name="_Toc243301450"/>
       <w:r>
         <w:t>1.2 ORGANIZAÇÃO DO RELATÓRIO</w:t>
       </w:r>
@@ -5761,7 +5761,7 @@
       <w:pPr>
         <w:pStyle w:val="Ttulo1"/>
       </w:pPr>
-      <w:bookmarkStart w:id="5" w:name="_Toc243299554"/>
+      <w:bookmarkStart w:id="5" w:name="_Toc243301451"/>
       <w:r>
         <w:t>2 FUNDAMENTAÇÃO TEÓRICA</w:t>
       </w:r>
@@ -5780,7 +5780,7 @@
       <w:pPr>
         <w:pStyle w:val="Ttulo2"/>
       </w:pPr>
-      <w:bookmarkStart w:id="6" w:name="_Toc243299555"/>
+      <w:bookmarkStart w:id="6" w:name="_Toc243301452"/>
       <w:r>
         <w:t>2.1 MARCADORES BIOQUÍMICOS NO DIAGNÓSTICO CLÍNICO</w:t>
       </w:r>
@@ -5812,7 +5812,7 @@
       <w:pPr>
         <w:pStyle w:val="LegendaABNT"/>
       </w:pPr>
-      <w:bookmarkStart w:id="7" w:name="_Toc243299607"/>
+      <w:bookmarkStart w:id="7" w:name="_Toc243301504"/>
       <w:r>
         <w:t xml:space="preserve">Quadro </w:t>
       </w:r>
@@ -6350,7 +6350,7 @@
       <w:pPr>
         <w:pStyle w:val="Ttulo2"/>
       </w:pPr>
-      <w:bookmarkStart w:id="8" w:name="_Toc243299556"/>
+      <w:bookmarkStart w:id="8" w:name="_Toc243301453"/>
       <w:r>
         <w:t>2.2 PRÁTICA DE RECUPERAÇÃO E REPETIÇÃO ESPAÇADA</w:t>
       </w:r>
@@ -6430,7 +6430,7 @@
       <w:pPr>
         <w:pStyle w:val="Ttulo2"/>
       </w:pPr>
-      <w:bookmarkStart w:id="9" w:name="_Toc243299557"/>
+      <w:bookmarkStart w:id="9" w:name="_Toc243301454"/>
       <w:r>
         <w:t>2.3 O ALGORITMO SM-2</w:t>
       </w:r>
@@ -6506,7 +6506,7 @@
       <w:pPr>
         <w:pStyle w:val="Ttulo2"/>
       </w:pPr>
-      <w:bookmarkStart w:id="10" w:name="_Toc243299558"/>
+      <w:bookmarkStart w:id="10" w:name="_Toc243301455"/>
       <w:r>
         <w:t>2.4 GAMIFICAÇÃO E MOTIVAÇÃO</w:t>
       </w:r>
@@ -6584,7 +6584,7 @@
       <w:pPr>
         <w:pStyle w:val="Ttulo2"/>
       </w:pPr>
-      <w:bookmarkStart w:id="11" w:name="_Toc243299559"/>
+      <w:bookmarkStart w:id="11" w:name="_Toc243301456"/>
       <w:r>
         <w:t>2.5 METACOGNIÇÃO E CALIBRAÇÃO</w:t>
       </w:r>
@@ -6632,7 +6632,7 @@
       <w:pPr>
         <w:pStyle w:val="Ttulo1"/>
       </w:pPr>
-      <w:bookmarkStart w:id="12" w:name="_Toc243299560"/>
+      <w:bookmarkStart w:id="12" w:name="_Toc243301457"/>
       <w:r>
         <w:t>3 MATERIAIS E MÉTODOS</w:t>
       </w:r>
@@ -6642,7 +6642,7 @@
       <w:pPr>
         <w:pStyle w:val="Ttulo2"/>
       </w:pPr>
-      <w:bookmarkStart w:id="13" w:name="_Toc243299561"/>
+      <w:bookmarkStart w:id="13" w:name="_Toc243301458"/>
       <w:r>
         <w:t>3.1 NATUREZA DA PESQUISA E ETAPAS</w:t>
       </w:r>
@@ -6779,7 +6779,7 @@
       <w:pPr>
         <w:pStyle w:val="Ttulo2"/>
       </w:pPr>
-      <w:bookmarkStart w:id="14" w:name="_Toc243299562"/>
+      <w:bookmarkStart w:id="14" w:name="_Toc243301459"/>
       <w:r>
         <w:t>3.2 CURADORIA DO CONTEÚDO</w:t>
       </w:r>
@@ -6840,7 +6840,7 @@
       <w:pPr>
         <w:pStyle w:val="Ttulo2"/>
       </w:pPr>
-      <w:bookmarkStart w:id="15" w:name="_Toc243299563"/>
+      <w:bookmarkStart w:id="15" w:name="_Toc243301460"/>
       <w:r>
         <w:t>3.3 TECNOLOGIAS UTILIZADAS</w:t>
       </w:r>
@@ -6860,7 +6860,7 @@
       <w:pPr>
         <w:pStyle w:val="LegendaABNT"/>
       </w:pPr>
-      <w:bookmarkStart w:id="16" w:name="_Toc243299608"/>
+      <w:bookmarkStart w:id="16" w:name="_Toc243301505"/>
       <w:r>
         <w:t xml:space="preserve">Quadro </w:t>
       </w:r>
@@ -8410,7 +8410,7 @@
       <w:pPr>
         <w:pStyle w:val="Ttulo2"/>
       </w:pPr>
-      <w:bookmarkStart w:id="17" w:name="_Toc243299564"/>
+      <w:bookmarkStart w:id="17" w:name="_Toc243301461"/>
       <w:r>
         <w:t>3.4 ARQUITETURA DO SOFTWARE</w:t>
       </w:r>
@@ -8430,7 +8430,7 @@
       <w:pPr>
         <w:pStyle w:val="LegendaABNT"/>
       </w:pPr>
-      <w:bookmarkStart w:id="18" w:name="_Toc243299595"/>
+      <w:bookmarkStart w:id="18" w:name="_Toc243301492"/>
       <w:r>
         <w:t xml:space="preserve">Figura </w:t>
       </w:r>
@@ -8468,7 +8468,7 @@
           <w:noProof/>
         </w:rPr>
         <w:drawing>
-          <wp:inline distT="0" distB="0" distL="0" distR="0" wp14:anchorId="2DC13974" wp14:editId="68C5EC42">
+          <wp:inline distT="0" distB="0" distL="0" distR="0" wp14:anchorId="28F1D7F1" wp14:editId="60F60893">
             <wp:extent cx="5762625" cy="3714750"/>
             <wp:effectExtent l="0" t="0" r="0" b="0"/>
             <wp:docPr id="1" name="arquitetura.png" descr="Arquitetura do BioquímicaEDU" title="Arquitetura do BioquímicaEDU"/>
@@ -8531,7 +8531,7 @@
       <w:pPr>
         <w:pStyle w:val="Ttulo2"/>
       </w:pPr>
-      <w:bookmarkStart w:id="19" w:name="_Toc243299565"/>
+      <w:bookmarkStart w:id="19" w:name="_Toc243301462"/>
       <w:r>
         <w:t>3.5 VERIFICAÇÃO DO SOFTWARE</w:t>
       </w:r>
@@ -8572,7 +8572,7 @@
       <w:pPr>
         <w:pStyle w:val="Ttulo2"/>
       </w:pPr>
-      <w:bookmarkStart w:id="20" w:name="_Toc243299566"/>
+      <w:bookmarkStart w:id="20" w:name="_Toc243301463"/>
       <w:r>
         <w:t>3.6 AVALIAÇÃO COM USUÁRIOS</w:t>
       </w:r>
@@ -8591,7 +8591,7 @@
       <w:pPr>
         <w:pStyle w:val="Ttulo3"/>
       </w:pPr>
-      <w:bookmarkStart w:id="21" w:name="_Toc243299567"/>
+      <w:bookmarkStart w:id="21" w:name="_Toc243301464"/>
       <w:r>
         <w:t>3.6.1 Avaliação formativa</w:t>
       </w:r>
@@ -8613,7 +8613,7 @@
       <w:pPr>
         <w:pStyle w:val="Ttulo3"/>
       </w:pPr>
-      <w:bookmarkStart w:id="22" w:name="_Toc243299568"/>
+      <w:bookmarkStart w:id="22" w:name="_Toc243301465"/>
       <w:r>
         <w:t>3.6.2 Pré-teste e pós-teste</w:t>
       </w:r>
@@ -8659,7 +8659,7 @@
       <w:pPr>
         <w:pStyle w:val="Ttulo3"/>
       </w:pPr>
-      <w:bookmarkStart w:id="23" w:name="_Toc243299569"/>
+      <w:bookmarkStart w:id="23" w:name="_Toc243301466"/>
       <w:r>
         <w:t>3.6.3 Questionário de opinião</w:t>
       </w:r>
@@ -8681,7 +8681,7 @@
       <w:pPr>
         <w:pStyle w:val="Ttulo3"/>
       </w:pPr>
-      <w:bookmarkStart w:id="24" w:name="_Toc243299570"/>
+      <w:bookmarkStart w:id="24" w:name="_Toc243301467"/>
       <w:r>
         <w:t>3.6.4 Aspectos éticos e proteção de dados</w:t>
       </w:r>
@@ -8718,7 +8718,7 @@
       <w:pPr>
         <w:pStyle w:val="Ttulo2"/>
       </w:pPr>
-      <w:bookmarkStart w:id="25" w:name="_Toc243299571"/>
+      <w:bookmarkStart w:id="25" w:name="_Toc243301468"/>
       <w:r>
         <w:t>3.7 USO DE FERRAMENTAS DE INTELIGÊNCIA ARTIFICIAL</w:t>
       </w:r>
@@ -8743,7 +8743,7 @@
       <w:pPr>
         <w:pStyle w:val="Ttulo1"/>
       </w:pPr>
-      <w:bookmarkStart w:id="26" w:name="_Toc243299572"/>
+      <w:bookmarkStart w:id="26" w:name="_Toc243301469"/>
       <w:r>
         <w:t>4 RESULTADOS</w:t>
       </w:r>
@@ -8753,7 +8753,7 @@
       <w:pPr>
         <w:pStyle w:val="Ttulo2"/>
       </w:pPr>
-      <w:bookmarkStart w:id="27" w:name="_Toc243299573"/>
+      <w:bookmarkStart w:id="27" w:name="_Toc243301470"/>
       <w:r>
         <w:t>4.1 VISÃO GERAL DO SOFTWARE</w:t>
       </w:r>
@@ -8773,7 +8773,7 @@
       <w:pPr>
         <w:pStyle w:val="LegendaABNT"/>
       </w:pPr>
-      <w:bookmarkStart w:id="28" w:name="_Toc243299609"/>
+      <w:bookmarkStart w:id="28" w:name="_Toc243301506"/>
       <w:r>
         <w:t xml:space="preserve">Quadro </w:t>
       </w:r>
@@ -9260,7 +9260,7 @@
       <w:pPr>
         <w:pStyle w:val="LegendaABNT"/>
       </w:pPr>
-      <w:bookmarkStart w:id="29" w:name="_Toc243299614"/>
+      <w:bookmarkStart w:id="29" w:name="_Toc243301511"/>
       <w:r>
         <w:t xml:space="preserve">Tabela </w:t>
       </w:r>
@@ -10640,7 +10640,7 @@
       <w:pPr>
         <w:pStyle w:val="LegendaABNT"/>
       </w:pPr>
-      <w:bookmarkStart w:id="30" w:name="_Toc243299615"/>
+      <w:bookmarkStart w:id="30" w:name="_Toc243301512"/>
       <w:r>
         <w:t xml:space="preserve">Tabela </w:t>
       </w:r>
@@ -11327,7 +11327,7 @@
       <w:pPr>
         <w:pStyle w:val="Ttulo2"/>
       </w:pPr>
-      <w:bookmarkStart w:id="31" w:name="_Toc243299574"/>
+      <w:bookmarkStart w:id="31" w:name="_Toc243301471"/>
       <w:r>
         <w:t>4.2 MOTOR DE APRENDIZAGEM</w:t>
       </w:r>
@@ -11359,7 +11359,7 @@
       <w:pPr>
         <w:pStyle w:val="LegendaABNT"/>
       </w:pPr>
-      <w:bookmarkStart w:id="32" w:name="_Toc243299610"/>
+      <w:bookmarkStart w:id="32" w:name="_Toc243301507"/>
       <w:r>
         <w:t xml:space="preserve">Quadro </w:t>
       </w:r>
@@ -11957,7 +11957,7 @@
       <w:pPr>
         <w:pStyle w:val="LegendaABNT"/>
       </w:pPr>
-      <w:bookmarkStart w:id="33" w:name="_Toc243299596"/>
+      <w:bookmarkStart w:id="33" w:name="_Toc243301493"/>
       <w:r>
         <w:t xml:space="preserve">Figura </w:t>
       </w:r>
@@ -11995,7 +11995,7 @@
           <w:noProof/>
         </w:rPr>
         <w:drawing>
-          <wp:inline distT="0" distB="0" distL="0" distR="0" wp14:anchorId="0C058702" wp14:editId="4B1901D6">
+          <wp:inline distT="0" distB="0" distL="0" distR="0" wp14:anchorId="59B3C8F1" wp14:editId="6130A1B6">
             <wp:extent cx="5400675" cy="2971800"/>
             <wp:effectExtent l="0" t="0" r="0" b="0"/>
             <wp:docPr id="2" name="sm2_intervalos.png" descr="Intervalos calculados pelo motor em três sequências de respostas" title="Intervalos calculados pelo motor em três sequências de respostas"/>
@@ -12056,7 +12056,7 @@
       <w:pPr>
         <w:pStyle w:val="LegendaABNT"/>
       </w:pPr>
-      <w:bookmarkStart w:id="34" w:name="_Toc243299616"/>
+      <w:bookmarkStart w:id="34" w:name="_Toc243301513"/>
       <w:r>
         <w:t xml:space="preserve">Tabela </w:t>
       </w:r>
@@ -12883,7 +12883,7 @@
       <w:pPr>
         <w:pStyle w:val="Ttulo2"/>
       </w:pPr>
-      <w:bookmarkStart w:id="35" w:name="_Toc243299575"/>
+      <w:bookmarkStart w:id="35" w:name="_Toc243301472"/>
       <w:r>
         <w:t>4.3 VERSÃO PARA DISPOSITIVOS MÓVEIS</w:t>
       </w:r>
@@ -12903,7 +12903,7 @@
       <w:pPr>
         <w:pStyle w:val="LegendaABNT"/>
       </w:pPr>
-      <w:bookmarkStart w:id="36" w:name="_Toc243299597"/>
+      <w:bookmarkStart w:id="36" w:name="_Toc243301494"/>
       <w:r>
         <w:t xml:space="preserve">Figura </w:t>
       </w:r>
@@ -12941,7 +12941,7 @@
           <w:noProof/>
         </w:rPr>
         <w:drawing>
-          <wp:inline distT="0" distB="0" distL="0" distR="0" wp14:anchorId="19684BBB" wp14:editId="512E085E">
+          <wp:inline distT="0" distB="0" distL="0" distR="0" wp14:anchorId="21B8ACFE" wp14:editId="44D15900">
             <wp:extent cx="5762625" cy="4086225"/>
             <wp:effectExtent l="0" t="0" r="0" b="0"/>
             <wp:docPr id="3" name="telas_inicio_estudo.png" descr="Início e estudo na versão móvel" title="Início e estudo na versão móvel"/>
@@ -13011,7 +13011,7 @@
       <w:pPr>
         <w:pStyle w:val="LegendaABNT"/>
       </w:pPr>
-      <w:bookmarkStart w:id="37" w:name="_Toc243299598"/>
+      <w:bookmarkStart w:id="37" w:name="_Toc243301495"/>
       <w:r>
         <w:t xml:space="preserve">Figura </w:t>
       </w:r>
@@ -13059,7 +13059,7 @@
           <w:noProof/>
         </w:rPr>
         <w:drawing>
-          <wp:inline distT="0" distB="0" distL="0" distR="0" wp14:anchorId="6E03EA44" wp14:editId="273F3707">
+          <wp:inline distT="0" distB="0" distL="0" distR="0" wp14:anchorId="2E502ED7" wp14:editId="5521BFC7">
             <wp:extent cx="5762625" cy="4086225"/>
             <wp:effectExtent l="0" t="0" r="0" b="0"/>
             <wp:docPr id="4" name="telas_revisao.png" descr="Revisão espaçada e flashcards na versão móvel" title="Revisão espaçada e flashcards na versão móvel"/>
@@ -13149,7 +13149,7 @@
       <w:pPr>
         <w:pStyle w:val="LegendaABNT"/>
       </w:pPr>
-      <w:bookmarkStart w:id="38" w:name="_Toc243299599"/>
+      <w:bookmarkStart w:id="38" w:name="_Toc243301496"/>
       <w:r>
         <w:t xml:space="preserve">Figura </w:t>
       </w:r>
@@ -13187,7 +13187,7 @@
           <w:noProof/>
         </w:rPr>
         <w:drawing>
-          <wp:inline distT="0" distB="0" distL="0" distR="0" wp14:anchorId="3F2ED8FE" wp14:editId="03474CC3">
+          <wp:inline distT="0" distB="0" distL="0" distR="0" wp14:anchorId="0AC70EB0" wp14:editId="118B1DCD">
             <wp:extent cx="5762625" cy="4086225"/>
             <wp:effectExtent l="0" t="0" r="0" b="0"/>
             <wp:docPr id="5" name="telas_pratica_tutor.png" descr="Prática e tutor na versão móvel" title="Prática e tutor na versão móvel"/>
@@ -13289,7 +13289,7 @@
       <w:pPr>
         <w:pStyle w:val="Ttulo2"/>
       </w:pPr>
-      <w:bookmarkStart w:id="39" w:name="_Toc243299576"/>
+      <w:bookmarkStart w:id="39" w:name="_Toc243301473"/>
       <w:r>
         <w:t>4.4 VERSÕES PARA COMPUTADOR</w:t>
       </w:r>
@@ -13309,7 +13309,7 @@
       <w:pPr>
         <w:pStyle w:val="LegendaABNT"/>
       </w:pPr>
-      <w:bookmarkStart w:id="40" w:name="_Toc243299600"/>
+      <w:bookmarkStart w:id="40" w:name="_Toc243301497"/>
       <w:r>
         <w:t xml:space="preserve">Figura </w:t>
       </w:r>
@@ -13347,7 +13347,7 @@
           <w:noProof/>
         </w:rPr>
         <w:drawing>
-          <wp:inline distT="0" distB="0" distL="0" distR="0" wp14:anchorId="61588910" wp14:editId="1C8F1BCF">
+          <wp:inline distT="0" distB="0" distL="0" distR="0" wp14:anchorId="21030D3A" wp14:editId="0D1F360D">
             <wp:extent cx="5762625" cy="3981450"/>
             <wp:effectExtent l="0" t="0" r="0" b="0"/>
             <wp:docPr id="6" name="desktop_painel.png" descr="Painel inicial da versão para computador" title="Painel inicial da versão para computador"/>
@@ -13407,7 +13407,7 @@
       <w:pPr>
         <w:pStyle w:val="Ttulo2"/>
       </w:pPr>
-      <w:bookmarkStart w:id="41" w:name="_Toc243299577"/>
+      <w:bookmarkStart w:id="41" w:name="_Toc243301474"/>
       <w:r>
         <w:t>4.5 IDENTIDADE VISUAL</w:t>
       </w:r>
@@ -13427,7 +13427,7 @@
       <w:pPr>
         <w:pStyle w:val="LegendaABNT"/>
       </w:pPr>
-      <w:bookmarkStart w:id="42" w:name="_Toc243299601"/>
+      <w:bookmarkStart w:id="42" w:name="_Toc243301498"/>
       <w:r>
         <w:t xml:space="preserve">Figura </w:t>
       </w:r>
@@ -13465,7 +13465,7 @@
           <w:noProof/>
         </w:rPr>
         <w:drawing>
-          <wp:inline distT="0" distB="0" distL="0" distR="0" wp14:anchorId="392A9B62" wp14:editId="3297C782">
+          <wp:inline distT="0" distB="0" distL="0" distR="0" wp14:anchorId="01694B3F" wp14:editId="3F785E0B">
             <wp:extent cx="3600450" cy="866775"/>
             <wp:effectExtent l="0" t="0" r="0" b="0"/>
             <wp:docPr id="7" name="horizontal.png" descr="Logo do BioquímicaEDU" title="Logo do BioquímicaEDU"/>
@@ -13516,7 +13516,7 @@
       <w:pPr>
         <w:pStyle w:val="Ttulo2"/>
       </w:pPr>
-      <w:bookmarkStart w:id="43" w:name="_Toc243299578"/>
+      <w:bookmarkStart w:id="43" w:name="_Toc243301475"/>
       <w:r>
         <w:t>4.6 AVALIAÇÃO FORMATIVA</w:t>
       </w:r>
@@ -13547,7 +13547,7 @@
       <w:pPr>
         <w:pStyle w:val="Ttulo2"/>
       </w:pPr>
-      <w:bookmarkStart w:id="44" w:name="_Toc243299579"/>
+      <w:bookmarkStart w:id="44" w:name="_Toc243301476"/>
       <w:r>
         <w:t>4.7 EVOLUÇÃO DO SOFTWARE</w:t>
       </w:r>
@@ -13569,7 +13569,7 @@
       <w:pPr>
         <w:pStyle w:val="Ttulo3"/>
       </w:pPr>
-      <w:bookmarkStart w:id="45" w:name="_Toc243299580"/>
+      <w:bookmarkStart w:id="45" w:name="_Toc243301477"/>
       <w:r>
         <w:t>4.7.1 Itens da proposta: novos marcadores, jogos e régua das faixas</w:t>
       </w:r>
@@ -13617,7 +13617,7 @@
       <w:pPr>
         <w:pStyle w:val="LegendaABNT"/>
       </w:pPr>
-      <w:bookmarkStart w:id="46" w:name="_Toc243299602"/>
+      <w:bookmarkStart w:id="46" w:name="_Toc243301499"/>
       <w:r>
         <w:t xml:space="preserve">Figura </w:t>
       </w:r>
@@ -13655,7 +13655,7 @@
           <w:noProof/>
         </w:rPr>
         <w:drawing>
-          <wp:inline distT="0" distB="0" distL="0" distR="0" wp14:anchorId="03CD95F4" wp14:editId="00FE6F50">
+          <wp:inline distT="0" distB="0" distL="0" distR="0" wp14:anchorId="07BCA1A5" wp14:editId="6A91E71E">
             <wp:extent cx="5762625" cy="4086225"/>
             <wp:effectExtent l="0" t="0" r="0" b="0"/>
             <wp:docPr id="8" name="evolucao_jogos.png" descr="Jogos didáticos e calculadora da TFG estimada na versão para celular" title="Jogos didáticos e calculadora da TFG estimada na versão para celular"/>
@@ -13728,7 +13728,7 @@
       <w:pPr>
         <w:pStyle w:val="Ttulo3"/>
       </w:pPr>
-      <w:bookmarkStart w:id="47" w:name="_Toc243299581"/>
+      <w:bookmarkStart w:id="47" w:name="_Toc243301478"/>
       <w:r>
         <w:t>4.7.2 Intervalos da revisão</w:t>
       </w:r>
@@ -13751,7 +13751,7 @@
       <w:pPr>
         <w:pStyle w:val="LegendaABNT"/>
       </w:pPr>
-      <w:bookmarkStart w:id="48" w:name="_Toc243299617"/>
+      <w:bookmarkStart w:id="48" w:name="_Toc243301514"/>
       <w:r>
         <w:t xml:space="preserve">Tabela </w:t>
       </w:r>
@@ -14330,7 +14330,7 @@
       <w:pPr>
         <w:pStyle w:val="Ttulo3"/>
       </w:pPr>
-      <w:bookmarkStart w:id="49" w:name="_Toc243299582"/>
+      <w:bookmarkStart w:id="49" w:name="_Toc243301479"/>
       <w:r>
         <w:t>4.7.3 Um aplicativo para celular, tablet e computador</w:t>
       </w:r>
@@ -14353,7 +14353,7 @@
       <w:pPr>
         <w:pStyle w:val="LegendaABNT"/>
       </w:pPr>
-      <w:bookmarkStart w:id="50" w:name="_Toc243299611"/>
+      <w:bookmarkStart w:id="50" w:name="_Toc243301508"/>
       <w:r>
         <w:t xml:space="preserve">Quadro </w:t>
       </w:r>
@@ -15103,7 +15103,7 @@
       <w:pPr>
         <w:pStyle w:val="LegendaABNT"/>
       </w:pPr>
-      <w:bookmarkStart w:id="51" w:name="_Toc243299603"/>
+      <w:bookmarkStart w:id="51" w:name="_Toc243301500"/>
       <w:r>
         <w:t xml:space="preserve">Figura </w:t>
       </w:r>
@@ -15141,7 +15141,7 @@
           <w:noProof/>
         </w:rPr>
         <w:drawing>
-          <wp:inline distT="0" distB="0" distL="0" distR="0" wp14:anchorId="3C00EFFC" wp14:editId="0B035890">
+          <wp:inline distT="0" distB="0" distL="0" distR="0" wp14:anchorId="7A5C623B" wp14:editId="453166B2">
             <wp:extent cx="5762625" cy="7219950"/>
             <wp:effectExtent l="0" t="0" r="0" b="0"/>
             <wp:docPr id="9" name="evolucao_formatos.png" descr="O mesmo aplicativo no computador, no tablet e no celular" title="O mesmo aplicativo no computador, no tablet e no celular"/>
@@ -15202,7 +15202,7 @@
       <w:pPr>
         <w:pStyle w:val="Ttulo3"/>
       </w:pPr>
-      <w:bookmarkStart w:id="52" w:name="_Toc243299583"/>
+      <w:bookmarkStart w:id="52" w:name="_Toc243301480"/>
       <w:r>
         <w:t>4.7.4 Acessibilidade</w:t>
       </w:r>
@@ -15303,7 +15303,7 @@
       <w:pPr>
         <w:pStyle w:val="LegendaABNT"/>
       </w:pPr>
-      <w:bookmarkStart w:id="53" w:name="_Toc243299604"/>
+      <w:bookmarkStart w:id="53" w:name="_Toc243301501"/>
       <w:r>
         <w:t xml:space="preserve">Figura </w:t>
       </w:r>
@@ -15341,7 +15341,7 @@
           <w:noProof/>
         </w:rPr>
         <w:drawing>
-          <wp:inline distT="0" distB="0" distL="0" distR="0" wp14:anchorId="1A694C3B" wp14:editId="549E2496">
+          <wp:inline distT="0" distB="0" distL="0" distR="0" wp14:anchorId="133D9ED9" wp14:editId="3E0398B0">
             <wp:extent cx="5762625" cy="4086225"/>
             <wp:effectExtent l="0" t="0" r="0" b="0"/>
             <wp:docPr id="10" name="evolucao_acessibilidade.png" descr="Recursos de acessibilidade na versão para celular" title="Recursos de acessibilidade na versão para celular"/>
@@ -15414,7 +15414,7 @@
       <w:pPr>
         <w:pStyle w:val="Ttulo3"/>
       </w:pPr>
-      <w:bookmarkStart w:id="54" w:name="_Toc243299584"/>
+      <w:bookmarkStart w:id="54" w:name="_Toc243301481"/>
       <w:r>
         <w:t>4.7.5 Tutor com inteligência artificial generativa</w:t>
       </w:r>
@@ -15437,7 +15437,7 @@
       <w:pPr>
         <w:pStyle w:val="LegendaABNT"/>
       </w:pPr>
-      <w:bookmarkStart w:id="55" w:name="_Toc243299605"/>
+      <w:bookmarkStart w:id="55" w:name="_Toc243301502"/>
       <w:r>
         <w:t xml:space="preserve">Figura </w:t>
       </w:r>
@@ -15475,7 +15475,7 @@
           <w:noProof/>
         </w:rPr>
         <w:drawing>
-          <wp:inline distT="0" distB="0" distL="0" distR="0" wp14:anchorId="51EE6E53" wp14:editId="430B4C34">
+          <wp:inline distT="0" distB="0" distL="0" distR="0" wp14:anchorId="2B057812" wp14:editId="0BDC261B">
             <wp:extent cx="5762625" cy="2933700"/>
             <wp:effectExtent l="0" t="0" r="0" b="0"/>
             <wp:docPr id="11" name="tutor_arquitetura.png" descr="Provedores de resposta do tutor e local da chave de acesso" title="Provedores de resposta do tutor e local da chave de acesso"/>
@@ -15581,7 +15581,7 @@
       <w:pPr>
         <w:pStyle w:val="LegendaABNT"/>
       </w:pPr>
-      <w:bookmarkStart w:id="56" w:name="_Toc243299606"/>
+      <w:bookmarkStart w:id="56" w:name="_Toc243301503"/>
       <w:r>
         <w:t xml:space="preserve">Figura </w:t>
       </w:r>
@@ -15619,7 +15619,7 @@
           <w:noProof/>
         </w:rPr>
         <w:drawing>
-          <wp:inline distT="0" distB="0" distL="0" distR="0" wp14:anchorId="23774FDE" wp14:editId="333FBD7C">
+          <wp:inline distT="0" distB="0" distL="0" distR="0" wp14:anchorId="17AE8BF0" wp14:editId="1E3B3D86">
             <wp:extent cx="5762625" cy="4086225"/>
             <wp:effectExtent l="0" t="0" r="0" b="0"/>
             <wp:docPr id="12" name="evolucao_tutor.png" descr="Conversa com o tutor usando o Gemini na versão para celular" title="Conversa com o tutor usando o Gemini na versão para celular"/>
@@ -15680,7 +15680,7 @@
       <w:pPr>
         <w:pStyle w:val="Ttulo3"/>
       </w:pPr>
-      <w:bookmarkStart w:id="57" w:name="_Toc243299585"/>
+      <w:bookmarkStart w:id="57" w:name="_Toc243301482"/>
       <w:r>
         <w:t>4.7.6 Abertura, conta Google opcional e apresentação</w:t>
       </w:r>
@@ -15705,7 +15705,7 @@
       <w:pPr>
         <w:pStyle w:val="Ttulo3"/>
       </w:pPr>
-      <w:bookmarkStart w:id="58" w:name="_Toc243299586"/>
+      <w:bookmarkStart w:id="58" w:name="_Toc243301483"/>
       <w:r>
         <w:t>4.7.7 Site e instaladores</w:t>
       </w:r>
@@ -15739,20 +15739,23 @@
         <w:t>O pacote para Android (APK) é gerado no GitHub Actions, num computador Linux do próprio GitHub, porque o Buildozer não roda no Windows. Ele é gerado para processadores de 64 bits (arm64-v8a), os dos celulares e tablets atuais e os exigidos pela Google Play, e é assinado sempre com a mesma chave, guardada fora do repositório: o Android só atualiza um aplicativo assinado pela mesma chave, e o login com Google confere a impressão digital (SHA-1) dela. Nenhum dos dois pacotes contém a chave do Gemini nem o prog</w:t>
       </w:r>
       <w:r>
-        <w:t xml:space="preserve">resso e as preferências de quem os gerou: o empacotamento os exclui, e os arquivos internos de cada pacote foram conferidos. Ambos usam o servidor intermediário da seção 4.7.5. O APK foi testado num celular Samsung Galaxy S20 FE 5G, com Android 13, e num tablet Samsung Galaxy Tab S4, com Android 10, em pé e deitado: a disposição das telas, o quiz, os jogos, o tutor com Gemini, os vídeos e as referências, o atalho para Libras e o alto contraste funcionaram. </w:t>
+        <w:t>resso e as preferências de quem os gerou: o empacotamento os exclui, e os arquivos internos de cada pacote foram conferidos. Ambos usam o servidor intermediário da seção 4.7.5. O APK foi testado num celular Samsung Galaxy S20 FE 5G, com Android 13, e num tablet Samsung Galaxy Tab S4, com Android 10, em pé e deitado: a disposição das telas, o quiz, os jogos, o tutor com Gemini, os vídeos e as referências, o atalho para Libras, o alto contraste e o login com Google funcionaram. Os testes em aparelho também mo</w:t>
+      </w:r>
+      <w:r>
+        <w:t xml:space="preserve">straram dois problemas, corrigidos antes da distribuição: a aba de casos do detalhe de um marcador abria rolada para o fim, num espaço vazio, e o login no Android falhava porque uma biblioteca do Android de que ele depende ficava fora do pacote. Desde então, cada APK gerado é conferido por um programa que verifica a presença das classes do login e a ausência da chave do Gemini e de dados pessoais. </w:t>
       </w:r>
       <w:r>
         <w:rPr>
           <w:highlight w:val="yellow"/>
         </w:rPr>
-        <w:t>[CONFIRMAR: resultado do login com Google no Android e se o APK já está publicado no site.]</w:t>
+        <w:t>[CONFIRMAR: se o APK já está publicado no site.]</w:t>
       </w:r>
     </w:p>
     <w:p>
       <w:pPr>
         <w:pStyle w:val="Ttulo2"/>
       </w:pPr>
-      <w:bookmarkStart w:id="59" w:name="_Toc243299587"/>
+      <w:bookmarkStart w:id="59" w:name="_Toc243301484"/>
       <w:r>
         <w:t>4.8 AVALIAÇÃO DA APRENDIZAGEM</w:t>
       </w:r>
@@ -15775,7 +15778,7 @@
       <w:pPr>
         <w:pStyle w:val="LegendaABNT"/>
       </w:pPr>
-      <w:bookmarkStart w:id="60" w:name="_Toc243299618"/>
+      <w:bookmarkStart w:id="60" w:name="_Toc243301515"/>
       <w:r>
         <w:t xml:space="preserve">Tabela </w:t>
       </w:r>
@@ -16389,7 +16392,7 @@
       <w:pPr>
         <w:pStyle w:val="Ttulo1"/>
       </w:pPr>
-      <w:bookmarkStart w:id="61" w:name="_Toc243299588"/>
+      <w:bookmarkStart w:id="61" w:name="_Toc243301485"/>
       <w:r>
         <w:t>5 DISCUSSÃO</w:t>
       </w:r>
@@ -16409,7 +16412,7 @@
       <w:pPr>
         <w:pStyle w:val="LegendaABNT"/>
       </w:pPr>
-      <w:bookmarkStart w:id="62" w:name="_Toc243299612"/>
+      <w:bookmarkStart w:id="62" w:name="_Toc243301509"/>
       <w:r>
         <w:t xml:space="preserve">Quadro </w:t>
       </w:r>
@@ -17536,7 +17539,7 @@
       <w:pPr>
         <w:pStyle w:val="Ttulo1"/>
       </w:pPr>
-      <w:bookmarkStart w:id="63" w:name="_Toc243299589"/>
+      <w:bookmarkStart w:id="63" w:name="_Toc243301486"/>
       <w:r>
         <w:t>6 CONSIDERAÇÕES FINAIS</w:t>
       </w:r>
@@ -17606,7 +17609,7 @@
         <w:pStyle w:val="Ttulo1"/>
         <w:jc w:val="center"/>
       </w:pPr>
-      <w:bookmarkStart w:id="64" w:name="_Toc243299590"/>
+      <w:bookmarkStart w:id="64" w:name="_Toc243301487"/>
       <w:r>
         <w:t>REFERÊNCIAS</w:t>
       </w:r>
@@ -18483,7 +18486,7 @@
         <w:pStyle w:val="Ttulo1"/>
         <w:jc w:val="center"/>
       </w:pPr>
-      <w:bookmarkStart w:id="65" w:name="_Toc243299591"/>
+      <w:bookmarkStart w:id="65" w:name="_Toc243301488"/>
       <w:r>
         <w:t>APÊNDICE A – FONTES DO CONTEÚDO POR MARCADOR</w:t>
       </w:r>
@@ -18503,7 +18506,7 @@
       <w:pPr>
         <w:pStyle w:val="LegendaABNT"/>
       </w:pPr>
-      <w:bookmarkStart w:id="66" w:name="_Toc243299613"/>
+      <w:bookmarkStart w:id="66" w:name="_Toc243301510"/>
       <w:r>
         <w:t xml:space="preserve">Quadro </w:t>
       </w:r>
@@ -20878,7 +20881,7 @@
         <w:pStyle w:val="Ttulo1"/>
         <w:jc w:val="center"/>
       </w:pPr>
-      <w:bookmarkStart w:id="67" w:name="_Toc243299592"/>
+      <w:bookmarkStart w:id="67" w:name="_Toc243301489"/>
       <w:r>
         <w:t>APÊNDICE B – CÓDIGO-FONTE E EXECUÇÃO</w:t>
       </w:r>
@@ -20973,7 +20976,7 @@
         <w:pStyle w:val="Ttulo1"/>
         <w:jc w:val="center"/>
       </w:pPr>
-      <w:bookmarkStart w:id="68" w:name="_Toc243299593"/>
+      <w:bookmarkStart w:id="68" w:name="_Toc243301490"/>
       <w:r>
         <w:t>APÊNDICE C – QUESTÕES DO PRÉ-TESTE E DO PÓS-TESTE</w:t>
       </w:r>
@@ -21814,7 +21817,7 @@
         <w:pStyle w:val="Ttulo1"/>
         <w:jc w:val="center"/>
       </w:pPr>
-      <w:bookmarkStart w:id="69" w:name="_Toc243299594"/>
+      <w:bookmarkStart w:id="69" w:name="_Toc243301491"/>
       <w:r>
         <w:t>APÊNDICE D – QUESTIONÁRIO DE OPINIÃO</w:t>
       </w:r>
@@ -22160,10 +22163,10 @@
 <file path=word/numbering.xml><?xml version="1.0" encoding="utf-8"?>
 <w:numbering xmlns:wpc="http://schemas.microsoft.com/office/word/2010/wordprocessingCanvas" xmlns:cx="http://schemas.microsoft.com/office/drawing/2014/chartex" xmlns:cx1="http://schemas.microsoft.com/office/drawing/2015/9/8/chartex" xmlns:cx2="http://schemas.microsoft.com/office/drawing/2015/10/21/chartex" xmlns:cx3="http://schemas.microsoft.com/office/drawing/2016/5/9/chartex" xmlns:cx4="http://schemas.microsoft.com/office/drawing/2016/5/10/chartex" xmlns:cx5="http://schemas.microsoft.com/office/drawing/2016/5/11/chartex" xmlns:cx6="http://schemas.microsoft.com/office/drawing/2016/5/12/chartex" xmlns:cx7="http://schemas.microsoft.com/office/drawing/2016/5/13/chartex" xmlns:cx8="http://schemas.microsoft.com/office/drawing/2016/5/14/chartex" xmlns:mc="http://schemas.openxmlformats.org/markup-compatibility/2006" xmlns:aink="http://schemas.microsoft.com/office/drawing/2016/ink" xmlns:am3d="http://schemas.microsoft.com/office/drawing/2017/model3d" xmlns:o="urn:schemas-microsoft-com:office:office" xmlns:oel="http://schemas.microsoft.com/office/2019/extlst" xmlns:r="http://schemas.openxmlformats.org/officeDocument/2006/relationships" xmlns:m="http://schemas.openxmlformats.org/officeDocument/2006/math" xmlns:v="urn:schemas-microsoft-com:vml" xmlns:wp14="http://schemas.microsoft.com/office/word/2010/wordprocessingDrawing" xmlns:wp="http://schemas.openxmlformats.org/drawingml/2006/wordprocessingDrawing" xmlns:w10="urn:schemas-microsoft-com:office:word" xmlns:w="http://schemas.openxmlformats.org/wordprocessingml/2006/main" xmlns:w14="http://schemas.microsoft.com/office/word/2010/wordml" xmlns:w15="http://schemas.microsoft.com/office/word/2012/wordml" xmlns:w16cex="http://schemas.microsoft.com/office/word/2018/wordml/cex" xmlns:w16cid="http://schemas.microsoft.com/office/word/2016/wordml/cid" xmlns:w16="http://schemas.microsoft.com/office/word/2018/wordml" xmlns:w16du="http://schemas.microsoft.com/office/word/2023/wordml/word16du" xmlns:w16sdtdh="http://schemas.microsoft.com/office/word/2020/wordml/sdtdatahash" xmlns:w16sdtfl="http://schemas.microsoft.com/office/word/2024/wordml/sdtformatlock" xmlns:w16se="http://schemas.microsoft.com/office/word/2015/wordml/symex" xmlns:wpg="http://schemas.microsoft.com/office/word/2010/wordprocessingGroup" xmlns:wpi="http://schemas.microsoft.com/office/word/2010/wordprocessingInk" xmlns:wne="http://schemas.microsoft.com/office/word/2006/wordml" xmlns:wps="http://schemas.microsoft.com/office/word/2010/wordprocessingShape" mc:Ignorable="w14 w15 w16se w16cid w16 w16cex w16sdtdh w16sdtfl w16du wp14">
   <w:abstractNum w:abstractNumId="0" w15:restartNumberingAfterBreak="0">
-    <w:nsid w:val="237876CF"/>
+    <w:nsid w:val="18564847"/>
     <w:multiLevelType w:val="hybridMultilevel"/>
-    <w:tmpl w:val="5A48D5E4"/>
-    <w:lvl w:ilvl="0" w:tplc="157A4362">
+    <w:tmpl w:val="FBF45C82"/>
+    <w:lvl w:ilvl="0" w:tplc="5D248590">
       <w:start w:val="1"/>
       <w:numFmt w:val="lowerLetter"/>
       <w:lvlText w:val="%1)"/>
@@ -22172,52 +22175,52 @@
         <w:ind w:left="1106" w:hanging="397"/>
       </w:pPr>
     </w:lvl>
-    <w:lvl w:ilvl="1" w:tplc="6D7491E0">
+    <w:lvl w:ilvl="1" w:tplc="8946CC08">
       <w:numFmt w:val="decimal"/>
       <w:lvlText w:val=""/>
       <w:lvlJc w:val="left"/>
     </w:lvl>
-    <w:lvl w:ilvl="2" w:tplc="DC486E06">
+    <w:lvl w:ilvl="2" w:tplc="D4A8C7A6">
       <w:numFmt w:val="decimal"/>
       <w:lvlText w:val=""/>
       <w:lvlJc w:val="left"/>
     </w:lvl>
-    <w:lvl w:ilvl="3" w:tplc="73A02868">
+    <w:lvl w:ilvl="3" w:tplc="A7F00E60">
       <w:numFmt w:val="decimal"/>
       <w:lvlText w:val=""/>
       <w:lvlJc w:val="left"/>
     </w:lvl>
-    <w:lvl w:ilvl="4" w:tplc="A8A406AA">
+    <w:lvl w:ilvl="4" w:tplc="F0FA4B34">
       <w:numFmt w:val="decimal"/>
       <w:lvlText w:val=""/>
       <w:lvlJc w:val="left"/>
     </w:lvl>
-    <w:lvl w:ilvl="5" w:tplc="F8880A9C">
+    <w:lvl w:ilvl="5" w:tplc="607CECEE">
       <w:numFmt w:val="decimal"/>
       <w:lvlText w:val=""/>
       <w:lvlJc w:val="left"/>
     </w:lvl>
-    <w:lvl w:ilvl="6" w:tplc="86ACE3AC">
+    <w:lvl w:ilvl="6" w:tplc="20663D32">
       <w:numFmt w:val="decimal"/>
       <w:lvlText w:val=""/>
       <w:lvlJc w:val="left"/>
     </w:lvl>
-    <w:lvl w:ilvl="7" w:tplc="F468F586">
+    <w:lvl w:ilvl="7" w:tplc="04E2B010">
       <w:numFmt w:val="decimal"/>
       <w:lvlText w:val=""/>
       <w:lvlJc w:val="left"/>
     </w:lvl>
-    <w:lvl w:ilvl="8" w:tplc="CBE487E6">
+    <w:lvl w:ilvl="8" w:tplc="DDE8C8E2">
       <w:numFmt w:val="decimal"/>
       <w:lvlText w:val=""/>
       <w:lvlJc w:val="left"/>
     </w:lvl>
   </w:abstractNum>
   <w:abstractNum w:abstractNumId="1" w15:restartNumberingAfterBreak="0">
-    <w:nsid w:val="3F91565B"/>
+    <w:nsid w:val="52B240CA"/>
     <w:multiLevelType w:val="hybridMultilevel"/>
-    <w:tmpl w:val="F6B05156"/>
-    <w:lvl w:ilvl="0" w:tplc="D0783D2C" w:tentative="1">
+    <w:tmpl w:val="C234CB5C"/>
+    <w:lvl w:ilvl="0" w:tplc="110674DC" w:tentative="1">
       <w:start w:val="1"/>
       <w:numFmt w:val="bullet"/>
       <w:lvlText w:val="●"/>
@@ -22226,7 +22229,7 @@
         <w:ind w:left="720" w:hanging="360"/>
       </w:pPr>
     </w:lvl>
-    <w:lvl w:ilvl="1" w:tplc="247887BE" w:tentative="1">
+    <w:lvl w:ilvl="1" w:tplc="BB44CA4A" w:tentative="1">
       <w:start w:val="1"/>
       <w:numFmt w:val="bullet"/>
       <w:lvlText w:val="○"/>
@@ -22235,7 +22238,7 @@
         <w:ind w:left="1440" w:hanging="360"/>
       </w:pPr>
     </w:lvl>
-    <w:lvl w:ilvl="2" w:tplc="E5DE1A2C" w:tentative="1">
+    <w:lvl w:ilvl="2" w:tplc="041AC7C4" w:tentative="1">
       <w:start w:val="1"/>
       <w:numFmt w:val="bullet"/>
       <w:lvlText w:val="■"/>
@@ -22244,7 +22247,7 @@
         <w:ind w:left="2160" w:hanging="360"/>
       </w:pPr>
     </w:lvl>
-    <w:lvl w:ilvl="3" w:tplc="7C009C12" w:tentative="1">
+    <w:lvl w:ilvl="3" w:tplc="4A1C64C6" w:tentative="1">
       <w:start w:val="1"/>
       <w:numFmt w:val="bullet"/>
       <w:lvlText w:val="●"/>
@@ -22253,7 +22256,7 @@
         <w:ind w:left="2880" w:hanging="360"/>
       </w:pPr>
     </w:lvl>
-    <w:lvl w:ilvl="4" w:tplc="DC0C4080" w:tentative="1">
+    <w:lvl w:ilvl="4" w:tplc="58B474B8" w:tentative="1">
       <w:start w:val="1"/>
       <w:numFmt w:val="bullet"/>
       <w:lvlText w:val="○"/>
@@ -22262,7 +22265,7 @@
         <w:ind w:left="3600" w:hanging="360"/>
       </w:pPr>
     </w:lvl>
-    <w:lvl w:ilvl="5" w:tplc="EB2EFE02" w:tentative="1">
+    <w:lvl w:ilvl="5" w:tplc="4F66537A" w:tentative="1">
       <w:start w:val="1"/>
       <w:numFmt w:val="bullet"/>
       <w:lvlText w:val="■"/>
@@ -22271,7 +22274,7 @@
         <w:ind w:left="4320" w:hanging="360"/>
       </w:pPr>
     </w:lvl>
-    <w:lvl w:ilvl="6" w:tplc="3BB27ED8" w:tentative="1">
+    <w:lvl w:ilvl="6" w:tplc="F1C4AA80" w:tentative="1">
       <w:start w:val="1"/>
       <w:numFmt w:val="bullet"/>
       <w:lvlText w:val="●"/>
@@ -22280,7 +22283,7 @@
         <w:ind w:left="5040" w:hanging="360"/>
       </w:pPr>
     </w:lvl>
-    <w:lvl w:ilvl="7" w:tplc="BD86385A" w:tentative="1">
+    <w:lvl w:ilvl="7" w:tplc="7326DE10" w:tentative="1">
       <w:start w:val="1"/>
       <w:numFmt w:val="bullet"/>
       <w:lvlText w:val="●"/>
@@ -22289,7 +22292,7 @@
         <w:ind w:left="5760" w:hanging="360"/>
       </w:pPr>
     </w:lvl>
-    <w:lvl w:ilvl="8" w:tplc="4376646A" w:tentative="1">
+    <w:lvl w:ilvl="8" w:tplc="C8260B72" w:tentative="1">
       <w:start w:val="1"/>
       <w:numFmt w:val="bullet"/>
       <w:lvlText w:val="●"/>
@@ -22299,97 +22302,97 @@
       </w:pPr>
     </w:lvl>
   </w:abstractNum>
-  <w:num w:numId="1" w16cid:durableId="942761553">
+  <w:num w:numId="1" w16cid:durableId="341590442">
     <w:abstractNumId w:val="1"/>
     <w:lvlOverride w:ilvl="0">
       <w:startOverride w:val="1"/>
     </w:lvlOverride>
   </w:num>
-  <w:num w:numId="2" w16cid:durableId="1898281170">
+  <w:num w:numId="2" w16cid:durableId="1262957180">
     <w:abstractNumId w:val="0"/>
     <w:lvlOverride w:ilvl="0">
       <w:startOverride w:val="1"/>
     </w:lvlOverride>
   </w:num>
-  <w:num w:numId="3" w16cid:durableId="686097270">
+  <w:num w:numId="3" w16cid:durableId="1626933412">
     <w:abstractNumId w:val="0"/>
     <w:lvlOverride w:ilvl="0">
       <w:startOverride w:val="1"/>
     </w:lvlOverride>
   </w:num>
-  <w:num w:numId="4" w16cid:durableId="1101299253">
+  <w:num w:numId="4" w16cid:durableId="1680279241">
     <w:abstractNumId w:val="0"/>
     <w:lvlOverride w:ilvl="0">
       <w:startOverride w:val="1"/>
     </w:lvlOverride>
   </w:num>
-  <w:num w:numId="5" w16cid:durableId="183712517">
+  <w:num w:numId="5" w16cid:durableId="269360212">
     <w:abstractNumId w:val="0"/>
     <w:lvlOverride w:ilvl="0">
       <w:startOverride w:val="1"/>
     </w:lvlOverride>
   </w:num>
-  <w:num w:numId="6" w16cid:durableId="277563264">
+  <w:num w:numId="6" w16cid:durableId="1880435439">
     <w:abstractNumId w:val="0"/>
     <w:lvlOverride w:ilvl="0">
       <w:startOverride w:val="1"/>
     </w:lvlOverride>
   </w:num>
-  <w:num w:numId="7" w16cid:durableId="1975939083">
+  <w:num w:numId="7" w16cid:durableId="1172136277">
     <w:abstractNumId w:val="0"/>
     <w:lvlOverride w:ilvl="0">
       <w:startOverride w:val="1"/>
     </w:lvlOverride>
   </w:num>
-  <w:num w:numId="8" w16cid:durableId="181015022">
+  <w:num w:numId="8" w16cid:durableId="947586777">
     <w:abstractNumId w:val="0"/>
     <w:lvlOverride w:ilvl="0">
       <w:startOverride w:val="1"/>
     </w:lvlOverride>
   </w:num>
-  <w:num w:numId="9" w16cid:durableId="813716252">
+  <w:num w:numId="9" w16cid:durableId="1691948984">
     <w:abstractNumId w:val="0"/>
     <w:lvlOverride w:ilvl="0">
       <w:startOverride w:val="1"/>
     </w:lvlOverride>
   </w:num>
-  <w:num w:numId="10" w16cid:durableId="2066636557">
+  <w:num w:numId="10" w16cid:durableId="1587836427">
     <w:abstractNumId w:val="0"/>
     <w:lvlOverride w:ilvl="0">
       <w:startOverride w:val="1"/>
     </w:lvlOverride>
   </w:num>
-  <w:num w:numId="11" w16cid:durableId="1943221286">
+  <w:num w:numId="11" w16cid:durableId="1530294137">
     <w:abstractNumId w:val="0"/>
     <w:lvlOverride w:ilvl="0">
       <w:startOverride w:val="1"/>
     </w:lvlOverride>
   </w:num>
-  <w:num w:numId="12" w16cid:durableId="377583461">
+  <w:num w:numId="12" w16cid:durableId="2047559737">
     <w:abstractNumId w:val="0"/>
     <w:lvlOverride w:ilvl="0">
       <w:startOverride w:val="1"/>
     </w:lvlOverride>
   </w:num>
-  <w:num w:numId="13" w16cid:durableId="1313021446">
+  <w:num w:numId="13" w16cid:durableId="875001060">
     <w:abstractNumId w:val="0"/>
     <w:lvlOverride w:ilvl="0">
       <w:startOverride w:val="1"/>
     </w:lvlOverride>
   </w:num>
-  <w:num w:numId="14" w16cid:durableId="283780865">
+  <w:num w:numId="14" w16cid:durableId="893927298">
     <w:abstractNumId w:val="0"/>
     <w:lvlOverride w:ilvl="0">
       <w:startOverride w:val="1"/>
     </w:lvlOverride>
   </w:num>
-  <w:num w:numId="15" w16cid:durableId="1106852865">
+  <w:num w:numId="15" w16cid:durableId="1138105425">
     <w:abstractNumId w:val="0"/>
     <w:lvlOverride w:ilvl="0">
       <w:startOverride w:val="1"/>
     </w:lvlOverride>
   </w:num>
-  <w:num w:numId="16" w16cid:durableId="739644164">
+  <w:num w:numId="16" w16cid:durableId="122892057">
     <w:abstractNumId w:val="0"/>
     <w:lvlOverride w:ilvl="0">
       <w:startOverride w:val="1"/>

</xml_diff>

<commit_message>
Relatorio: revisao final do conteudo na secao 3.2
</commit_message>
<xml_diff>
--- a/relatorio/Relatorio_Final_PIBIC_BioquimicaEDU.docx
+++ b/relatorio/Relatorio_Final_PIBIC_BioquimicaEDU.docx
@@ -329,7 +329,7 @@
     <w:sdt>
       <w:sdtPr>
         <w:alias w:val="LISTA DE FIGURAS"/>
-        <w:id w:val="-353731221"/>
+        <w:id w:val="-1359577241"/>
       </w:sdtPr>
       <w:sdtEndPr/>
       <w:sdtContent>
@@ -355,7 +355,7 @@
           <w:r>
             <w:fldChar w:fldCharType="separate"/>
           </w:r>
-          <w:hyperlink w:anchor="_Toc243301492" w:history="1">
+          <w:hyperlink w:anchor="_Toc243302147" w:history="1">
             <w:r>
               <w:rPr>
                 <w:rStyle w:val="Hyperlink"/>
@@ -379,7 +379,7 @@
               <w:rPr>
                 <w:noProof/>
               </w:rPr>
-              <w:instrText xml:space="preserve"> PAGEREF _Toc243301492 \h </w:instrText>
+              <w:instrText xml:space="preserve"> PAGEREF _Toc243302147 \h </w:instrText>
             </w:r>
             <w:r>
               <w:rPr>
@@ -419,7 +419,7 @@
               <w14:ligatures w14:val="standardContextual"/>
             </w:rPr>
           </w:pPr>
-          <w:hyperlink w:anchor="_Toc243301493" w:history="1">
+          <w:hyperlink w:anchor="_Toc243302148" w:history="1">
             <w:r>
               <w:rPr>
                 <w:rStyle w:val="Hyperlink"/>
@@ -443,7 +443,7 @@
               <w:rPr>
                 <w:noProof/>
               </w:rPr>
-              <w:instrText xml:space="preserve"> PAGEREF _Toc243301493 \h </w:instrText>
+              <w:instrText xml:space="preserve"> PAGEREF _Toc243302148 \h </w:instrText>
             </w:r>
             <w:r>
               <w:rPr>
@@ -483,7 +483,7 @@
               <w14:ligatures w14:val="standardContextual"/>
             </w:rPr>
           </w:pPr>
-          <w:hyperlink w:anchor="_Toc243301494" w:history="1">
+          <w:hyperlink w:anchor="_Toc243302149" w:history="1">
             <w:r>
               <w:rPr>
                 <w:rStyle w:val="Hyperlink"/>
@@ -507,7 +507,7 @@
               <w:rPr>
                 <w:noProof/>
               </w:rPr>
-              <w:instrText xml:space="preserve"> PAGEREF _Toc243301494 \h </w:instrText>
+              <w:instrText xml:space="preserve"> PAGEREF _Toc243302149 \h </w:instrText>
             </w:r>
             <w:r>
               <w:rPr>
@@ -547,7 +547,7 @@
               <w14:ligatures w14:val="standardContextual"/>
             </w:rPr>
           </w:pPr>
-          <w:hyperlink w:anchor="_Toc243301495" w:history="1">
+          <w:hyperlink w:anchor="_Toc243302150" w:history="1">
             <w:r>
               <w:rPr>
                 <w:rStyle w:val="Hyperlink"/>
@@ -587,7 +587,7 @@
               <w:rPr>
                 <w:noProof/>
               </w:rPr>
-              <w:instrText xml:space="preserve"> PAGEREF _Toc243301495 \h </w:instrText>
+              <w:instrText xml:space="preserve"> PAGEREF _Toc243302150 \h </w:instrText>
             </w:r>
             <w:r>
               <w:rPr>
@@ -627,7 +627,7 @@
               <w14:ligatures w14:val="standardContextual"/>
             </w:rPr>
           </w:pPr>
-          <w:hyperlink w:anchor="_Toc243301496" w:history="1">
+          <w:hyperlink w:anchor="_Toc243302151" w:history="1">
             <w:r>
               <w:rPr>
                 <w:rStyle w:val="Hyperlink"/>
@@ -651,7 +651,7 @@
               <w:rPr>
                 <w:noProof/>
               </w:rPr>
-              <w:instrText xml:space="preserve"> PAGEREF _Toc243301496 \h </w:instrText>
+              <w:instrText xml:space="preserve"> PAGEREF _Toc243302151 \h </w:instrText>
             </w:r>
             <w:r>
               <w:rPr>
@@ -691,7 +691,7 @@
               <w14:ligatures w14:val="standardContextual"/>
             </w:rPr>
           </w:pPr>
-          <w:hyperlink w:anchor="_Toc243301497" w:history="1">
+          <w:hyperlink w:anchor="_Toc243302152" w:history="1">
             <w:r>
               <w:rPr>
                 <w:rStyle w:val="Hyperlink"/>
@@ -715,7 +715,7 @@
               <w:rPr>
                 <w:noProof/>
               </w:rPr>
-              <w:instrText xml:space="preserve"> PAGEREF _Toc243301497 \h </w:instrText>
+              <w:instrText xml:space="preserve"> PAGEREF _Toc243302152 \h </w:instrText>
             </w:r>
             <w:r>
               <w:rPr>
@@ -755,7 +755,7 @@
               <w14:ligatures w14:val="standardContextual"/>
             </w:rPr>
           </w:pPr>
-          <w:hyperlink w:anchor="_Toc243301498" w:history="1">
+          <w:hyperlink w:anchor="_Toc243302153" w:history="1">
             <w:r>
               <w:rPr>
                 <w:rStyle w:val="Hyperlink"/>
@@ -779,7 +779,7 @@
               <w:rPr>
                 <w:noProof/>
               </w:rPr>
-              <w:instrText xml:space="preserve"> PAGEREF _Toc243301498 \h </w:instrText>
+              <w:instrText xml:space="preserve"> PAGEREF _Toc243302153 \h </w:instrText>
             </w:r>
             <w:r>
               <w:rPr>
@@ -819,7 +819,7 @@
               <w14:ligatures w14:val="standardContextual"/>
             </w:rPr>
           </w:pPr>
-          <w:hyperlink w:anchor="_Toc243301499" w:history="1">
+          <w:hyperlink w:anchor="_Toc243302154" w:history="1">
             <w:r>
               <w:rPr>
                 <w:rStyle w:val="Hyperlink"/>
@@ -843,7 +843,7 @@
               <w:rPr>
                 <w:noProof/>
               </w:rPr>
-              <w:instrText xml:space="preserve"> PAGEREF _Toc243301499 \h </w:instrText>
+              <w:instrText xml:space="preserve"> PAGEREF _Toc243302154 \h </w:instrText>
             </w:r>
             <w:r>
               <w:rPr>
@@ -883,7 +883,7 @@
               <w14:ligatures w14:val="standardContextual"/>
             </w:rPr>
           </w:pPr>
-          <w:hyperlink w:anchor="_Toc243301500" w:history="1">
+          <w:hyperlink w:anchor="_Toc243302155" w:history="1">
             <w:r>
               <w:rPr>
                 <w:rStyle w:val="Hyperlink"/>
@@ -907,7 +907,7 @@
               <w:rPr>
                 <w:noProof/>
               </w:rPr>
-              <w:instrText xml:space="preserve"> PAGEREF _Toc243301500 \h </w:instrText>
+              <w:instrText xml:space="preserve"> PAGEREF _Toc243302155 \h </w:instrText>
             </w:r>
             <w:r>
               <w:rPr>
@@ -947,7 +947,7 @@
               <w14:ligatures w14:val="standardContextual"/>
             </w:rPr>
           </w:pPr>
-          <w:hyperlink w:anchor="_Toc243301501" w:history="1">
+          <w:hyperlink w:anchor="_Toc243302156" w:history="1">
             <w:r>
               <w:rPr>
                 <w:rStyle w:val="Hyperlink"/>
@@ -971,7 +971,7 @@
               <w:rPr>
                 <w:noProof/>
               </w:rPr>
-              <w:instrText xml:space="preserve"> PAGEREF _Toc243301501 \h </w:instrText>
+              <w:instrText xml:space="preserve"> PAGEREF _Toc243302156 \h </w:instrText>
             </w:r>
             <w:r>
               <w:rPr>
@@ -1011,7 +1011,7 @@
               <w14:ligatures w14:val="standardContextual"/>
             </w:rPr>
           </w:pPr>
-          <w:hyperlink w:anchor="_Toc243301502" w:history="1">
+          <w:hyperlink w:anchor="_Toc243302157" w:history="1">
             <w:r>
               <w:rPr>
                 <w:rStyle w:val="Hyperlink"/>
@@ -1035,7 +1035,7 @@
               <w:rPr>
                 <w:noProof/>
               </w:rPr>
-              <w:instrText xml:space="preserve"> PAGEREF _Toc243301502 \h </w:instrText>
+              <w:instrText xml:space="preserve"> PAGEREF _Toc243302157 \h </w:instrText>
             </w:r>
             <w:r>
               <w:rPr>
@@ -1075,7 +1075,7 @@
               <w14:ligatures w14:val="standardContextual"/>
             </w:rPr>
           </w:pPr>
-          <w:hyperlink w:anchor="_Toc243301503" w:history="1">
+          <w:hyperlink w:anchor="_Toc243302158" w:history="1">
             <w:r>
               <w:rPr>
                 <w:rStyle w:val="Hyperlink"/>
@@ -1099,7 +1099,7 @@
               <w:rPr>
                 <w:noProof/>
               </w:rPr>
-              <w:instrText xml:space="preserve"> PAGEREF _Toc243301503 \h </w:instrText>
+              <w:instrText xml:space="preserve"> PAGEREF _Toc243302158 \h </w:instrText>
             </w:r>
             <w:r>
               <w:rPr>
@@ -1144,7 +1144,7 @@
     <w:sdt>
       <w:sdtPr>
         <w:alias w:val="LISTA DE QUADROS"/>
-        <w:id w:val="-626161061"/>
+        <w:id w:val="-271476238"/>
       </w:sdtPr>
       <w:sdtEndPr/>
       <w:sdtContent>
@@ -1170,7 +1170,7 @@
           <w:r>
             <w:fldChar w:fldCharType="separate"/>
           </w:r>
-          <w:hyperlink w:anchor="_Toc243301504" w:history="1">
+          <w:hyperlink w:anchor="_Toc243302159" w:history="1">
             <w:r>
               <w:rPr>
                 <w:rStyle w:val="Hyperlink"/>
@@ -1194,7 +1194,7 @@
               <w:rPr>
                 <w:noProof/>
               </w:rPr>
-              <w:instrText xml:space="preserve"> PAGEREF _Toc243301504 \h </w:instrText>
+              <w:instrText xml:space="preserve"> PAGEREF _Toc243302159 \h </w:instrText>
             </w:r>
             <w:r>
               <w:rPr>
@@ -1234,7 +1234,7 @@
               <w14:ligatures w14:val="standardContextual"/>
             </w:rPr>
           </w:pPr>
-          <w:hyperlink w:anchor="_Toc243301505" w:history="1">
+          <w:hyperlink w:anchor="_Toc243302160" w:history="1">
             <w:r>
               <w:rPr>
                 <w:rStyle w:val="Hyperlink"/>
@@ -1258,7 +1258,7 @@
               <w:rPr>
                 <w:noProof/>
               </w:rPr>
-              <w:instrText xml:space="preserve"> PAGEREF _Toc243301505 \h </w:instrText>
+              <w:instrText xml:space="preserve"> PAGEREF _Toc243302160 \h </w:instrText>
             </w:r>
             <w:r>
               <w:rPr>
@@ -1298,7 +1298,7 @@
               <w14:ligatures w14:val="standardContextual"/>
             </w:rPr>
           </w:pPr>
-          <w:hyperlink w:anchor="_Toc243301506" w:history="1">
+          <w:hyperlink w:anchor="_Toc243302161" w:history="1">
             <w:r>
               <w:rPr>
                 <w:rStyle w:val="Hyperlink"/>
@@ -1322,7 +1322,7 @@
               <w:rPr>
                 <w:noProof/>
               </w:rPr>
-              <w:instrText xml:space="preserve"> PAGEREF _Toc243301506 \h </w:instrText>
+              <w:instrText xml:space="preserve"> PAGEREF _Toc243302161 \h </w:instrText>
             </w:r>
             <w:r>
               <w:rPr>
@@ -1362,7 +1362,7 @@
               <w14:ligatures w14:val="standardContextual"/>
             </w:rPr>
           </w:pPr>
-          <w:hyperlink w:anchor="_Toc243301507" w:history="1">
+          <w:hyperlink w:anchor="_Toc243302162" w:history="1">
             <w:r>
               <w:rPr>
                 <w:rStyle w:val="Hyperlink"/>
@@ -1386,7 +1386,7 @@
               <w:rPr>
                 <w:noProof/>
               </w:rPr>
-              <w:instrText xml:space="preserve"> PAGEREF _Toc243301507 \h </w:instrText>
+              <w:instrText xml:space="preserve"> PAGEREF _Toc243302162 \h </w:instrText>
             </w:r>
             <w:r>
               <w:rPr>
@@ -1426,7 +1426,7 @@
               <w14:ligatures w14:val="standardContextual"/>
             </w:rPr>
           </w:pPr>
-          <w:hyperlink w:anchor="_Toc243301508" w:history="1">
+          <w:hyperlink w:anchor="_Toc243302163" w:history="1">
             <w:r>
               <w:rPr>
                 <w:rStyle w:val="Hyperlink"/>
@@ -1450,7 +1450,7 @@
               <w:rPr>
                 <w:noProof/>
               </w:rPr>
-              <w:instrText xml:space="preserve"> PAGEREF _Toc243301508 \h </w:instrText>
+              <w:instrText xml:space="preserve"> PAGEREF _Toc243302163 \h </w:instrText>
             </w:r>
             <w:r>
               <w:rPr>
@@ -1490,7 +1490,7 @@
               <w14:ligatures w14:val="standardContextual"/>
             </w:rPr>
           </w:pPr>
-          <w:hyperlink w:anchor="_Toc243301509" w:history="1">
+          <w:hyperlink w:anchor="_Toc243302164" w:history="1">
             <w:r>
               <w:rPr>
                 <w:rStyle w:val="Hyperlink"/>
@@ -1514,7 +1514,7 @@
               <w:rPr>
                 <w:noProof/>
               </w:rPr>
-              <w:instrText xml:space="preserve"> PAGEREF _Toc243301509 \h </w:instrText>
+              <w:instrText xml:space="preserve"> PAGEREF _Toc243302164 \h </w:instrText>
             </w:r>
             <w:r>
               <w:rPr>
@@ -1554,7 +1554,7 @@
               <w14:ligatures w14:val="standardContextual"/>
             </w:rPr>
           </w:pPr>
-          <w:hyperlink w:anchor="_Toc243301510" w:history="1">
+          <w:hyperlink w:anchor="_Toc243302165" w:history="1">
             <w:r>
               <w:rPr>
                 <w:rStyle w:val="Hyperlink"/>
@@ -1578,7 +1578,7 @@
               <w:rPr>
                 <w:noProof/>
               </w:rPr>
-              <w:instrText xml:space="preserve"> PAGEREF _Toc243301510 \h </w:instrText>
+              <w:instrText xml:space="preserve"> PAGEREF _Toc243302165 \h </w:instrText>
             </w:r>
             <w:r>
               <w:rPr>
@@ -1623,7 +1623,7 @@
     <w:sdt>
       <w:sdtPr>
         <w:alias w:val="LISTA DE TABELAS"/>
-        <w:id w:val="822162155"/>
+        <w:id w:val="980434309"/>
       </w:sdtPr>
       <w:sdtEndPr/>
       <w:sdtContent>
@@ -1649,7 +1649,7 @@
           <w:r>
             <w:fldChar w:fldCharType="separate"/>
           </w:r>
-          <w:hyperlink w:anchor="_Toc243301511" w:history="1">
+          <w:hyperlink w:anchor="_Toc243302166" w:history="1">
             <w:r>
               <w:rPr>
                 <w:rStyle w:val="Hyperlink"/>
@@ -1673,7 +1673,7 @@
               <w:rPr>
                 <w:noProof/>
               </w:rPr>
-              <w:instrText xml:space="preserve"> PAGEREF _Toc243301511 \h </w:instrText>
+              <w:instrText xml:space="preserve"> PAGEREF _Toc243302166 \h </w:instrText>
             </w:r>
             <w:r>
               <w:rPr>
@@ -1713,7 +1713,7 @@
               <w14:ligatures w14:val="standardContextual"/>
             </w:rPr>
           </w:pPr>
-          <w:hyperlink w:anchor="_Toc243301512" w:history="1">
+          <w:hyperlink w:anchor="_Toc243302167" w:history="1">
             <w:r>
               <w:rPr>
                 <w:rStyle w:val="Hyperlink"/>
@@ -1737,7 +1737,7 @@
               <w:rPr>
                 <w:noProof/>
               </w:rPr>
-              <w:instrText xml:space="preserve"> PAGEREF _Toc243301512 \h </w:instrText>
+              <w:instrText xml:space="preserve"> PAGEREF _Toc243302167 \h </w:instrText>
             </w:r>
             <w:r>
               <w:rPr>
@@ -1777,7 +1777,7 @@
               <w14:ligatures w14:val="standardContextual"/>
             </w:rPr>
           </w:pPr>
-          <w:hyperlink w:anchor="_Toc243301513" w:history="1">
+          <w:hyperlink w:anchor="_Toc243302168" w:history="1">
             <w:r>
               <w:rPr>
                 <w:rStyle w:val="Hyperlink"/>
@@ -1801,7 +1801,7 @@
               <w:rPr>
                 <w:noProof/>
               </w:rPr>
-              <w:instrText xml:space="preserve"> PAGEREF _Toc243301513 \h </w:instrText>
+              <w:instrText xml:space="preserve"> PAGEREF _Toc243302168 \h </w:instrText>
             </w:r>
             <w:r>
               <w:rPr>
@@ -1841,7 +1841,7 @@
               <w14:ligatures w14:val="standardContextual"/>
             </w:rPr>
           </w:pPr>
-          <w:hyperlink w:anchor="_Toc243301514" w:history="1">
+          <w:hyperlink w:anchor="_Toc243302169" w:history="1">
             <w:r>
               <w:rPr>
                 <w:rStyle w:val="Hyperlink"/>
@@ -1865,7 +1865,7 @@
               <w:rPr>
                 <w:noProof/>
               </w:rPr>
-              <w:instrText xml:space="preserve"> PAGEREF _Toc243301514 \h </w:instrText>
+              <w:instrText xml:space="preserve"> PAGEREF _Toc243302169 \h </w:instrText>
             </w:r>
             <w:r>
               <w:rPr>
@@ -1905,7 +1905,7 @@
               <w14:ligatures w14:val="standardContextual"/>
             </w:rPr>
           </w:pPr>
-          <w:hyperlink w:anchor="_Toc243301515" w:history="1">
+          <w:hyperlink w:anchor="_Toc243302170" w:history="1">
             <w:r>
               <w:rPr>
                 <w:rStyle w:val="Hyperlink"/>
@@ -1929,7 +1929,7 @@
               <w:rPr>
                 <w:noProof/>
               </w:rPr>
-              <w:instrText xml:space="preserve"> PAGEREF _Toc243301515 \h </w:instrText>
+              <w:instrText xml:space="preserve"> PAGEREF _Toc243302170 \h </w:instrText>
             </w:r>
             <w:r>
               <w:rPr>
@@ -2532,7 +2532,7 @@
           <w:bCs w:val="0"/>
         </w:rPr>
         <w:alias w:val="Sumário"/>
-        <w:id w:val="-1315481255"/>
+        <w:id w:val="1652401318"/>
       </w:sdtPr>
       <w:sdtEndPr/>
       <w:sdtContent>
@@ -2560,7 +2560,7 @@
           <w:r>
             <w:fldChar w:fldCharType="separate"/>
           </w:r>
-          <w:hyperlink w:anchor="_Toc243301446" w:history="1">
+          <w:hyperlink w:anchor="_Toc243302101" w:history="1">
             <w:r>
               <w:rPr>
                 <w:rStyle w:val="Hyperlink"/>
@@ -2584,7 +2584,7 @@
               <w:rPr>
                 <w:noProof/>
               </w:rPr>
-              <w:instrText xml:space="preserve"> PAGEREF _Toc243301446 \h </w:instrText>
+              <w:instrText xml:space="preserve"> PAGEREF _Toc243302101 \h </w:instrText>
             </w:r>
             <w:r>
               <w:rPr>
@@ -2624,7 +2624,7 @@
               <w14:ligatures w14:val="standardContextual"/>
             </w:rPr>
           </w:pPr>
-          <w:hyperlink w:anchor="_Toc243301447" w:history="1">
+          <w:hyperlink w:anchor="_Toc243302102" w:history="1">
             <w:r>
               <w:rPr>
                 <w:rStyle w:val="Hyperlink"/>
@@ -2648,7 +2648,7 @@
               <w:rPr>
                 <w:noProof/>
               </w:rPr>
-              <w:instrText xml:space="preserve"> PAGEREF _Toc243301447 \h </w:instrText>
+              <w:instrText xml:space="preserve"> PAGEREF _Toc243302102 \h </w:instrText>
             </w:r>
             <w:r>
               <w:rPr>
@@ -2688,7 +2688,7 @@
               <w14:ligatures w14:val="standardContextual"/>
             </w:rPr>
           </w:pPr>
-          <w:hyperlink w:anchor="_Toc243301448" w:history="1">
+          <w:hyperlink w:anchor="_Toc243302103" w:history="1">
             <w:r>
               <w:rPr>
                 <w:rStyle w:val="Hyperlink"/>
@@ -2712,7 +2712,7 @@
               <w:rPr>
                 <w:noProof/>
               </w:rPr>
-              <w:instrText xml:space="preserve"> PAGEREF _Toc243301448 \h </w:instrText>
+              <w:instrText xml:space="preserve"> PAGEREF _Toc243302103 \h </w:instrText>
             </w:r>
             <w:r>
               <w:rPr>
@@ -2752,7 +2752,7 @@
               <w14:ligatures w14:val="standardContextual"/>
             </w:rPr>
           </w:pPr>
-          <w:hyperlink w:anchor="_Toc243301449" w:history="1">
+          <w:hyperlink w:anchor="_Toc243302104" w:history="1">
             <w:r>
               <w:rPr>
                 <w:rStyle w:val="Hyperlink"/>
@@ -2776,7 +2776,7 @@
               <w:rPr>
                 <w:noProof/>
               </w:rPr>
-              <w:instrText xml:space="preserve"> PAGEREF _Toc243301449 \h </w:instrText>
+              <w:instrText xml:space="preserve"> PAGEREF _Toc243302104 \h </w:instrText>
             </w:r>
             <w:r>
               <w:rPr>
@@ -2816,7 +2816,7 @@
               <w14:ligatures w14:val="standardContextual"/>
             </w:rPr>
           </w:pPr>
-          <w:hyperlink w:anchor="_Toc243301450" w:history="1">
+          <w:hyperlink w:anchor="_Toc243302105" w:history="1">
             <w:r>
               <w:rPr>
                 <w:rStyle w:val="Hyperlink"/>
@@ -2840,7 +2840,7 @@
               <w:rPr>
                 <w:noProof/>
               </w:rPr>
-              <w:instrText xml:space="preserve"> PAGEREF _Toc243301450 \h </w:instrText>
+              <w:instrText xml:space="preserve"> PAGEREF _Toc243302105 \h </w:instrText>
             </w:r>
             <w:r>
               <w:rPr>
@@ -2882,7 +2882,7 @@
               <w14:ligatures w14:val="standardContextual"/>
             </w:rPr>
           </w:pPr>
-          <w:hyperlink w:anchor="_Toc243301451" w:history="1">
+          <w:hyperlink w:anchor="_Toc243302106" w:history="1">
             <w:r>
               <w:rPr>
                 <w:rStyle w:val="Hyperlink"/>
@@ -2906,7 +2906,7 @@
               <w:rPr>
                 <w:noProof/>
               </w:rPr>
-              <w:instrText xml:space="preserve"> PAGEREF _Toc243301451 \h </w:instrText>
+              <w:instrText xml:space="preserve"> PAGEREF _Toc243302106 \h </w:instrText>
             </w:r>
             <w:r>
               <w:rPr>
@@ -2946,7 +2946,7 @@
               <w14:ligatures w14:val="standardContextual"/>
             </w:rPr>
           </w:pPr>
-          <w:hyperlink w:anchor="_Toc243301452" w:history="1">
+          <w:hyperlink w:anchor="_Toc243302107" w:history="1">
             <w:r>
               <w:rPr>
                 <w:rStyle w:val="Hyperlink"/>
@@ -2970,7 +2970,7 @@
               <w:rPr>
                 <w:noProof/>
               </w:rPr>
-              <w:instrText xml:space="preserve"> PAGEREF _Toc243301452 \h </w:instrText>
+              <w:instrText xml:space="preserve"> PAGEREF _Toc243302107 \h </w:instrText>
             </w:r>
             <w:r>
               <w:rPr>
@@ -3010,7 +3010,7 @@
               <w14:ligatures w14:val="standardContextual"/>
             </w:rPr>
           </w:pPr>
-          <w:hyperlink w:anchor="_Toc243301453" w:history="1">
+          <w:hyperlink w:anchor="_Toc243302108" w:history="1">
             <w:r>
               <w:rPr>
                 <w:rStyle w:val="Hyperlink"/>
@@ -3034,7 +3034,7 @@
               <w:rPr>
                 <w:noProof/>
               </w:rPr>
-              <w:instrText xml:space="preserve"> PAGEREF _Toc243301453 \h </w:instrText>
+              <w:instrText xml:space="preserve"> PAGEREF _Toc243302108 \h </w:instrText>
             </w:r>
             <w:r>
               <w:rPr>
@@ -3074,7 +3074,7 @@
               <w14:ligatures w14:val="standardContextual"/>
             </w:rPr>
           </w:pPr>
-          <w:hyperlink w:anchor="_Toc243301454" w:history="1">
+          <w:hyperlink w:anchor="_Toc243302109" w:history="1">
             <w:r>
               <w:rPr>
                 <w:rStyle w:val="Hyperlink"/>
@@ -3098,7 +3098,7 @@
               <w:rPr>
                 <w:noProof/>
               </w:rPr>
-              <w:instrText xml:space="preserve"> PAGEREF _Toc243301454 \h </w:instrText>
+              <w:instrText xml:space="preserve"> PAGEREF _Toc243302109 \h </w:instrText>
             </w:r>
             <w:r>
               <w:rPr>
@@ -3138,7 +3138,7 @@
               <w14:ligatures w14:val="standardContextual"/>
             </w:rPr>
           </w:pPr>
-          <w:hyperlink w:anchor="_Toc243301455" w:history="1">
+          <w:hyperlink w:anchor="_Toc243302110" w:history="1">
             <w:r>
               <w:rPr>
                 <w:rStyle w:val="Hyperlink"/>
@@ -3162,7 +3162,7 @@
               <w:rPr>
                 <w:noProof/>
               </w:rPr>
-              <w:instrText xml:space="preserve"> PAGEREF _Toc243301455 \h </w:instrText>
+              <w:instrText xml:space="preserve"> PAGEREF _Toc243302110 \h </w:instrText>
             </w:r>
             <w:r>
               <w:rPr>
@@ -3202,7 +3202,7 @@
               <w14:ligatures w14:val="standardContextual"/>
             </w:rPr>
           </w:pPr>
-          <w:hyperlink w:anchor="_Toc243301456" w:history="1">
+          <w:hyperlink w:anchor="_Toc243302111" w:history="1">
             <w:r>
               <w:rPr>
                 <w:rStyle w:val="Hyperlink"/>
@@ -3226,7 +3226,7 @@
               <w:rPr>
                 <w:noProof/>
               </w:rPr>
-              <w:instrText xml:space="preserve"> PAGEREF _Toc243301456 \h </w:instrText>
+              <w:instrText xml:space="preserve"> PAGEREF _Toc243302111 \h </w:instrText>
             </w:r>
             <w:r>
               <w:rPr>
@@ -3268,7 +3268,7 @@
               <w14:ligatures w14:val="standardContextual"/>
             </w:rPr>
           </w:pPr>
-          <w:hyperlink w:anchor="_Toc243301457" w:history="1">
+          <w:hyperlink w:anchor="_Toc243302112" w:history="1">
             <w:r>
               <w:rPr>
                 <w:rStyle w:val="Hyperlink"/>
@@ -3292,7 +3292,7 @@
               <w:rPr>
                 <w:noProof/>
               </w:rPr>
-              <w:instrText xml:space="preserve"> PAGEREF _Toc243301457 \h </w:instrText>
+              <w:instrText xml:space="preserve"> PAGEREF _Toc243302112 \h </w:instrText>
             </w:r>
             <w:r>
               <w:rPr>
@@ -3332,7 +3332,7 @@
               <w14:ligatures w14:val="standardContextual"/>
             </w:rPr>
           </w:pPr>
-          <w:hyperlink w:anchor="_Toc243301458" w:history="1">
+          <w:hyperlink w:anchor="_Toc243302113" w:history="1">
             <w:r>
               <w:rPr>
                 <w:rStyle w:val="Hyperlink"/>
@@ -3356,7 +3356,7 @@
               <w:rPr>
                 <w:noProof/>
               </w:rPr>
-              <w:instrText xml:space="preserve"> PAGEREF _Toc243301458 \h </w:instrText>
+              <w:instrText xml:space="preserve"> PAGEREF _Toc243302113 \h </w:instrText>
             </w:r>
             <w:r>
               <w:rPr>
@@ -3396,7 +3396,7 @@
               <w14:ligatures w14:val="standardContextual"/>
             </w:rPr>
           </w:pPr>
-          <w:hyperlink w:anchor="_Toc243301459" w:history="1">
+          <w:hyperlink w:anchor="_Toc243302114" w:history="1">
             <w:r>
               <w:rPr>
                 <w:rStyle w:val="Hyperlink"/>
@@ -3420,7 +3420,7 @@
               <w:rPr>
                 <w:noProof/>
               </w:rPr>
-              <w:instrText xml:space="preserve"> PAGEREF _Toc243301459 \h </w:instrText>
+              <w:instrText xml:space="preserve"> PAGEREF _Toc243302114 \h </w:instrText>
             </w:r>
             <w:r>
               <w:rPr>
@@ -3460,7 +3460,7 @@
               <w14:ligatures w14:val="standardContextual"/>
             </w:rPr>
           </w:pPr>
-          <w:hyperlink w:anchor="_Toc243301460" w:history="1">
+          <w:hyperlink w:anchor="_Toc243302115" w:history="1">
             <w:r>
               <w:rPr>
                 <w:rStyle w:val="Hyperlink"/>
@@ -3484,7 +3484,7 @@
               <w:rPr>
                 <w:noProof/>
               </w:rPr>
-              <w:instrText xml:space="preserve"> PAGEREF _Toc243301460 \h </w:instrText>
+              <w:instrText xml:space="preserve"> PAGEREF _Toc243302115 \h </w:instrText>
             </w:r>
             <w:r>
               <w:rPr>
@@ -3524,7 +3524,7 @@
               <w14:ligatures w14:val="standardContextual"/>
             </w:rPr>
           </w:pPr>
-          <w:hyperlink w:anchor="_Toc243301461" w:history="1">
+          <w:hyperlink w:anchor="_Toc243302116" w:history="1">
             <w:r>
               <w:rPr>
                 <w:rStyle w:val="Hyperlink"/>
@@ -3548,7 +3548,7 @@
               <w:rPr>
                 <w:noProof/>
               </w:rPr>
-              <w:instrText xml:space="preserve"> PAGEREF _Toc243301461 \h </w:instrText>
+              <w:instrText xml:space="preserve"> PAGEREF _Toc243302116 \h </w:instrText>
             </w:r>
             <w:r>
               <w:rPr>
@@ -3588,7 +3588,7 @@
               <w14:ligatures w14:val="standardContextual"/>
             </w:rPr>
           </w:pPr>
-          <w:hyperlink w:anchor="_Toc243301462" w:history="1">
+          <w:hyperlink w:anchor="_Toc243302117" w:history="1">
             <w:r>
               <w:rPr>
                 <w:rStyle w:val="Hyperlink"/>
@@ -3612,7 +3612,7 @@
               <w:rPr>
                 <w:noProof/>
               </w:rPr>
-              <w:instrText xml:space="preserve"> PAGEREF _Toc243301462 \h </w:instrText>
+              <w:instrText xml:space="preserve"> PAGEREF _Toc243302117 \h </w:instrText>
             </w:r>
             <w:r>
               <w:rPr>
@@ -3652,7 +3652,7 @@
               <w14:ligatures w14:val="standardContextual"/>
             </w:rPr>
           </w:pPr>
-          <w:hyperlink w:anchor="_Toc243301463" w:history="1">
+          <w:hyperlink w:anchor="_Toc243302118" w:history="1">
             <w:r>
               <w:rPr>
                 <w:rStyle w:val="Hyperlink"/>
@@ -3676,7 +3676,7 @@
               <w:rPr>
                 <w:noProof/>
               </w:rPr>
-              <w:instrText xml:space="preserve"> PAGEREF _Toc243301463 \h </w:instrText>
+              <w:instrText xml:space="preserve"> PAGEREF _Toc243302118 \h </w:instrText>
             </w:r>
             <w:r>
               <w:rPr>
@@ -3716,7 +3716,7 @@
               <w14:ligatures w14:val="standardContextual"/>
             </w:rPr>
           </w:pPr>
-          <w:hyperlink w:anchor="_Toc243301464" w:history="1">
+          <w:hyperlink w:anchor="_Toc243302119" w:history="1">
             <w:r>
               <w:rPr>
                 <w:rStyle w:val="Hyperlink"/>
@@ -3740,7 +3740,7 @@
               <w:rPr>
                 <w:noProof/>
               </w:rPr>
-              <w:instrText xml:space="preserve"> PAGEREF _Toc243301464 \h </w:instrText>
+              <w:instrText xml:space="preserve"> PAGEREF _Toc243302119 \h </w:instrText>
             </w:r>
             <w:r>
               <w:rPr>
@@ -3780,7 +3780,7 @@
               <w14:ligatures w14:val="standardContextual"/>
             </w:rPr>
           </w:pPr>
-          <w:hyperlink w:anchor="_Toc243301465" w:history="1">
+          <w:hyperlink w:anchor="_Toc243302120" w:history="1">
             <w:r>
               <w:rPr>
                 <w:rStyle w:val="Hyperlink"/>
@@ -3804,7 +3804,7 @@
               <w:rPr>
                 <w:noProof/>
               </w:rPr>
-              <w:instrText xml:space="preserve"> PAGEREF _Toc243301465 \h </w:instrText>
+              <w:instrText xml:space="preserve"> PAGEREF _Toc243302120 \h </w:instrText>
             </w:r>
             <w:r>
               <w:rPr>
@@ -3844,7 +3844,7 @@
               <w14:ligatures w14:val="standardContextual"/>
             </w:rPr>
           </w:pPr>
-          <w:hyperlink w:anchor="_Toc243301466" w:history="1">
+          <w:hyperlink w:anchor="_Toc243302121" w:history="1">
             <w:r>
               <w:rPr>
                 <w:rStyle w:val="Hyperlink"/>
@@ -3868,7 +3868,7 @@
               <w:rPr>
                 <w:noProof/>
               </w:rPr>
-              <w:instrText xml:space="preserve"> PAGEREF _Toc243301466 \h </w:instrText>
+              <w:instrText xml:space="preserve"> PAGEREF _Toc243302121 \h </w:instrText>
             </w:r>
             <w:r>
               <w:rPr>
@@ -3908,7 +3908,7 @@
               <w14:ligatures w14:val="standardContextual"/>
             </w:rPr>
           </w:pPr>
-          <w:hyperlink w:anchor="_Toc243301467" w:history="1">
+          <w:hyperlink w:anchor="_Toc243302122" w:history="1">
             <w:r>
               <w:rPr>
                 <w:rStyle w:val="Hyperlink"/>
@@ -3932,7 +3932,7 @@
               <w:rPr>
                 <w:noProof/>
               </w:rPr>
-              <w:instrText xml:space="preserve"> PAGEREF _Toc243301467 \h </w:instrText>
+              <w:instrText xml:space="preserve"> PAGEREF _Toc243302122 \h </w:instrText>
             </w:r>
             <w:r>
               <w:rPr>
@@ -3972,7 +3972,7 @@
               <w14:ligatures w14:val="standardContextual"/>
             </w:rPr>
           </w:pPr>
-          <w:hyperlink w:anchor="_Toc243301468" w:history="1">
+          <w:hyperlink w:anchor="_Toc243302123" w:history="1">
             <w:r>
               <w:rPr>
                 <w:rStyle w:val="Hyperlink"/>
@@ -3996,7 +3996,7 @@
               <w:rPr>
                 <w:noProof/>
               </w:rPr>
-              <w:instrText xml:space="preserve"> PAGEREF _Toc243301468 \h </w:instrText>
+              <w:instrText xml:space="preserve"> PAGEREF _Toc243302123 \h </w:instrText>
             </w:r>
             <w:r>
               <w:rPr>
@@ -4038,7 +4038,7 @@
               <w14:ligatures w14:val="standardContextual"/>
             </w:rPr>
           </w:pPr>
-          <w:hyperlink w:anchor="_Toc243301469" w:history="1">
+          <w:hyperlink w:anchor="_Toc243302124" w:history="1">
             <w:r>
               <w:rPr>
                 <w:rStyle w:val="Hyperlink"/>
@@ -4062,7 +4062,7 @@
               <w:rPr>
                 <w:noProof/>
               </w:rPr>
-              <w:instrText xml:space="preserve"> PAGEREF _Toc243301469 \h </w:instrText>
+              <w:instrText xml:space="preserve"> PAGEREF _Toc243302124 \h </w:instrText>
             </w:r>
             <w:r>
               <w:rPr>
@@ -4102,7 +4102,7 @@
               <w14:ligatures w14:val="standardContextual"/>
             </w:rPr>
           </w:pPr>
-          <w:hyperlink w:anchor="_Toc243301470" w:history="1">
+          <w:hyperlink w:anchor="_Toc243302125" w:history="1">
             <w:r>
               <w:rPr>
                 <w:rStyle w:val="Hyperlink"/>
@@ -4126,7 +4126,7 @@
               <w:rPr>
                 <w:noProof/>
               </w:rPr>
-              <w:instrText xml:space="preserve"> PAGEREF _Toc243301470 \h </w:instrText>
+              <w:instrText xml:space="preserve"> PAGEREF _Toc243302125 \h </w:instrText>
             </w:r>
             <w:r>
               <w:rPr>
@@ -4166,7 +4166,7 @@
               <w14:ligatures w14:val="standardContextual"/>
             </w:rPr>
           </w:pPr>
-          <w:hyperlink w:anchor="_Toc243301471" w:history="1">
+          <w:hyperlink w:anchor="_Toc243302126" w:history="1">
             <w:r>
               <w:rPr>
                 <w:rStyle w:val="Hyperlink"/>
@@ -4190,7 +4190,7 @@
               <w:rPr>
                 <w:noProof/>
               </w:rPr>
-              <w:instrText xml:space="preserve"> PAGEREF _Toc243301471 \h </w:instrText>
+              <w:instrText xml:space="preserve"> PAGEREF _Toc243302126 \h </w:instrText>
             </w:r>
             <w:r>
               <w:rPr>
@@ -4230,7 +4230,7 @@
               <w14:ligatures w14:val="standardContextual"/>
             </w:rPr>
           </w:pPr>
-          <w:hyperlink w:anchor="_Toc243301472" w:history="1">
+          <w:hyperlink w:anchor="_Toc243302127" w:history="1">
             <w:r>
               <w:rPr>
                 <w:rStyle w:val="Hyperlink"/>
@@ -4254,7 +4254,7 @@
               <w:rPr>
                 <w:noProof/>
               </w:rPr>
-              <w:instrText xml:space="preserve"> PAGEREF _Toc243301472 \h </w:instrText>
+              <w:instrText xml:space="preserve"> PAGEREF _Toc243302127 \h </w:instrText>
             </w:r>
             <w:r>
               <w:rPr>
@@ -4294,7 +4294,7 @@
               <w14:ligatures w14:val="standardContextual"/>
             </w:rPr>
           </w:pPr>
-          <w:hyperlink w:anchor="_Toc243301473" w:history="1">
+          <w:hyperlink w:anchor="_Toc243302128" w:history="1">
             <w:r>
               <w:rPr>
                 <w:rStyle w:val="Hyperlink"/>
@@ -4318,7 +4318,7 @@
               <w:rPr>
                 <w:noProof/>
               </w:rPr>
-              <w:instrText xml:space="preserve"> PAGEREF _Toc243301473 \h </w:instrText>
+              <w:instrText xml:space="preserve"> PAGEREF _Toc243302128 \h </w:instrText>
             </w:r>
             <w:r>
               <w:rPr>
@@ -4358,7 +4358,7 @@
               <w14:ligatures w14:val="standardContextual"/>
             </w:rPr>
           </w:pPr>
-          <w:hyperlink w:anchor="_Toc243301474" w:history="1">
+          <w:hyperlink w:anchor="_Toc243302129" w:history="1">
             <w:r>
               <w:rPr>
                 <w:rStyle w:val="Hyperlink"/>
@@ -4382,7 +4382,7 @@
               <w:rPr>
                 <w:noProof/>
               </w:rPr>
-              <w:instrText xml:space="preserve"> PAGEREF _Toc243301474 \h </w:instrText>
+              <w:instrText xml:space="preserve"> PAGEREF _Toc243302129 \h </w:instrText>
             </w:r>
             <w:r>
               <w:rPr>
@@ -4422,7 +4422,7 @@
               <w14:ligatures w14:val="standardContextual"/>
             </w:rPr>
           </w:pPr>
-          <w:hyperlink w:anchor="_Toc243301475" w:history="1">
+          <w:hyperlink w:anchor="_Toc243302130" w:history="1">
             <w:r>
               <w:rPr>
                 <w:rStyle w:val="Hyperlink"/>
@@ -4446,7 +4446,7 @@
               <w:rPr>
                 <w:noProof/>
               </w:rPr>
-              <w:instrText xml:space="preserve"> PAGEREF _Toc243301475 \h </w:instrText>
+              <w:instrText xml:space="preserve"> PAGEREF _Toc243302130 \h </w:instrText>
             </w:r>
             <w:r>
               <w:rPr>
@@ -4486,7 +4486,7 @@
               <w14:ligatures w14:val="standardContextual"/>
             </w:rPr>
           </w:pPr>
-          <w:hyperlink w:anchor="_Toc243301476" w:history="1">
+          <w:hyperlink w:anchor="_Toc243302131" w:history="1">
             <w:r>
               <w:rPr>
                 <w:rStyle w:val="Hyperlink"/>
@@ -4510,7 +4510,7 @@
               <w:rPr>
                 <w:noProof/>
               </w:rPr>
-              <w:instrText xml:space="preserve"> PAGEREF _Toc243301476 \h </w:instrText>
+              <w:instrText xml:space="preserve"> PAGEREF _Toc243302131 \h </w:instrText>
             </w:r>
             <w:r>
               <w:rPr>
@@ -4550,7 +4550,7 @@
               <w14:ligatures w14:val="standardContextual"/>
             </w:rPr>
           </w:pPr>
-          <w:hyperlink w:anchor="_Toc243301477" w:history="1">
+          <w:hyperlink w:anchor="_Toc243302132" w:history="1">
             <w:r>
               <w:rPr>
                 <w:rStyle w:val="Hyperlink"/>
@@ -4574,7 +4574,7 @@
               <w:rPr>
                 <w:noProof/>
               </w:rPr>
-              <w:instrText xml:space="preserve"> PAGEREF _Toc243301477 \h </w:instrText>
+              <w:instrText xml:space="preserve"> PAGEREF _Toc243302132 \h </w:instrText>
             </w:r>
             <w:r>
               <w:rPr>
@@ -4614,7 +4614,7 @@
               <w14:ligatures w14:val="standardContextual"/>
             </w:rPr>
           </w:pPr>
-          <w:hyperlink w:anchor="_Toc243301478" w:history="1">
+          <w:hyperlink w:anchor="_Toc243302133" w:history="1">
             <w:r>
               <w:rPr>
                 <w:rStyle w:val="Hyperlink"/>
@@ -4638,7 +4638,7 @@
               <w:rPr>
                 <w:noProof/>
               </w:rPr>
-              <w:instrText xml:space="preserve"> PAGEREF _Toc243301478 \h </w:instrText>
+              <w:instrText xml:space="preserve"> PAGEREF _Toc243302133 \h </w:instrText>
             </w:r>
             <w:r>
               <w:rPr>
@@ -4678,7 +4678,7 @@
               <w14:ligatures w14:val="standardContextual"/>
             </w:rPr>
           </w:pPr>
-          <w:hyperlink w:anchor="_Toc243301479" w:history="1">
+          <w:hyperlink w:anchor="_Toc243302134" w:history="1">
             <w:r>
               <w:rPr>
                 <w:rStyle w:val="Hyperlink"/>
@@ -4702,7 +4702,7 @@
               <w:rPr>
                 <w:noProof/>
               </w:rPr>
-              <w:instrText xml:space="preserve"> PAGEREF _Toc243301479 \h </w:instrText>
+              <w:instrText xml:space="preserve"> PAGEREF _Toc243302134 \h </w:instrText>
             </w:r>
             <w:r>
               <w:rPr>
@@ -4742,7 +4742,7 @@
               <w14:ligatures w14:val="standardContextual"/>
             </w:rPr>
           </w:pPr>
-          <w:hyperlink w:anchor="_Toc243301480" w:history="1">
+          <w:hyperlink w:anchor="_Toc243302135" w:history="1">
             <w:r>
               <w:rPr>
                 <w:rStyle w:val="Hyperlink"/>
@@ -4766,7 +4766,7 @@
               <w:rPr>
                 <w:noProof/>
               </w:rPr>
-              <w:instrText xml:space="preserve"> PAGEREF _Toc243301480 \h </w:instrText>
+              <w:instrText xml:space="preserve"> PAGEREF _Toc243302135 \h </w:instrText>
             </w:r>
             <w:r>
               <w:rPr>
@@ -4806,7 +4806,7 @@
               <w14:ligatures w14:val="standardContextual"/>
             </w:rPr>
           </w:pPr>
-          <w:hyperlink w:anchor="_Toc243301481" w:history="1">
+          <w:hyperlink w:anchor="_Toc243302136" w:history="1">
             <w:r>
               <w:rPr>
                 <w:rStyle w:val="Hyperlink"/>
@@ -4830,7 +4830,7 @@
               <w:rPr>
                 <w:noProof/>
               </w:rPr>
-              <w:instrText xml:space="preserve"> PAGEREF _Toc243301481 \h </w:instrText>
+              <w:instrText xml:space="preserve"> PAGEREF _Toc243302136 \h </w:instrText>
             </w:r>
             <w:r>
               <w:rPr>
@@ -4870,7 +4870,7 @@
               <w14:ligatures w14:val="standardContextual"/>
             </w:rPr>
           </w:pPr>
-          <w:hyperlink w:anchor="_Toc243301482" w:history="1">
+          <w:hyperlink w:anchor="_Toc243302137" w:history="1">
             <w:r>
               <w:rPr>
                 <w:rStyle w:val="Hyperlink"/>
@@ -4894,7 +4894,7 @@
               <w:rPr>
                 <w:noProof/>
               </w:rPr>
-              <w:instrText xml:space="preserve"> PAGEREF _Toc243301482 \h </w:instrText>
+              <w:instrText xml:space="preserve"> PAGEREF _Toc243302137 \h </w:instrText>
             </w:r>
             <w:r>
               <w:rPr>
@@ -4934,7 +4934,7 @@
               <w14:ligatures w14:val="standardContextual"/>
             </w:rPr>
           </w:pPr>
-          <w:hyperlink w:anchor="_Toc243301483" w:history="1">
+          <w:hyperlink w:anchor="_Toc243302138" w:history="1">
             <w:r>
               <w:rPr>
                 <w:rStyle w:val="Hyperlink"/>
@@ -4958,7 +4958,7 @@
               <w:rPr>
                 <w:noProof/>
               </w:rPr>
-              <w:instrText xml:space="preserve"> PAGEREF _Toc243301483 \h </w:instrText>
+              <w:instrText xml:space="preserve"> PAGEREF _Toc243302138 \h </w:instrText>
             </w:r>
             <w:r>
               <w:rPr>
@@ -4998,7 +4998,7 @@
               <w14:ligatures w14:val="standardContextual"/>
             </w:rPr>
           </w:pPr>
-          <w:hyperlink w:anchor="_Toc243301484" w:history="1">
+          <w:hyperlink w:anchor="_Toc243302139" w:history="1">
             <w:r>
               <w:rPr>
                 <w:rStyle w:val="Hyperlink"/>
@@ -5022,7 +5022,7 @@
               <w:rPr>
                 <w:noProof/>
               </w:rPr>
-              <w:instrText xml:space="preserve"> PAGEREF _Toc243301484 \h </w:instrText>
+              <w:instrText xml:space="preserve"> PAGEREF _Toc243302139 \h </w:instrText>
             </w:r>
             <w:r>
               <w:rPr>
@@ -5064,7 +5064,7 @@
               <w14:ligatures w14:val="standardContextual"/>
             </w:rPr>
           </w:pPr>
-          <w:hyperlink w:anchor="_Toc243301485" w:history="1">
+          <w:hyperlink w:anchor="_Toc243302140" w:history="1">
             <w:r>
               <w:rPr>
                 <w:rStyle w:val="Hyperlink"/>
@@ -5088,7 +5088,7 @@
               <w:rPr>
                 <w:noProof/>
               </w:rPr>
-              <w:instrText xml:space="preserve"> PAGEREF _Toc243301485 \h </w:instrText>
+              <w:instrText xml:space="preserve"> PAGEREF _Toc243302140 \h </w:instrText>
             </w:r>
             <w:r>
               <w:rPr>
@@ -5130,7 +5130,7 @@
               <w14:ligatures w14:val="standardContextual"/>
             </w:rPr>
           </w:pPr>
-          <w:hyperlink w:anchor="_Toc243301486" w:history="1">
+          <w:hyperlink w:anchor="_Toc243302141" w:history="1">
             <w:r>
               <w:rPr>
                 <w:rStyle w:val="Hyperlink"/>
@@ -5154,7 +5154,7 @@
               <w:rPr>
                 <w:noProof/>
               </w:rPr>
-              <w:instrText xml:space="preserve"> PAGEREF _Toc243301486 \h </w:instrText>
+              <w:instrText xml:space="preserve"> PAGEREF _Toc243302141 \h </w:instrText>
             </w:r>
             <w:r>
               <w:rPr>
@@ -5196,7 +5196,7 @@
               <w14:ligatures w14:val="standardContextual"/>
             </w:rPr>
           </w:pPr>
-          <w:hyperlink w:anchor="_Toc243301487" w:history="1">
+          <w:hyperlink w:anchor="_Toc243302142" w:history="1">
             <w:r>
               <w:rPr>
                 <w:rStyle w:val="Hyperlink"/>
@@ -5220,7 +5220,7 @@
               <w:rPr>
                 <w:noProof/>
               </w:rPr>
-              <w:instrText xml:space="preserve"> PAGEREF _Toc243301487 \h </w:instrText>
+              <w:instrText xml:space="preserve"> PAGEREF _Toc243302142 \h </w:instrText>
             </w:r>
             <w:r>
               <w:rPr>
@@ -5262,7 +5262,7 @@
               <w14:ligatures w14:val="standardContextual"/>
             </w:rPr>
           </w:pPr>
-          <w:hyperlink w:anchor="_Toc243301488" w:history="1">
+          <w:hyperlink w:anchor="_Toc243302143" w:history="1">
             <w:r>
               <w:rPr>
                 <w:rStyle w:val="Hyperlink"/>
@@ -5286,7 +5286,7 @@
               <w:rPr>
                 <w:noProof/>
               </w:rPr>
-              <w:instrText xml:space="preserve"> PAGEREF _Toc243301488 \h </w:instrText>
+              <w:instrText xml:space="preserve"> PAGEREF _Toc243302143 \h </w:instrText>
             </w:r>
             <w:r>
               <w:rPr>
@@ -5328,7 +5328,7 @@
               <w14:ligatures w14:val="standardContextual"/>
             </w:rPr>
           </w:pPr>
-          <w:hyperlink w:anchor="_Toc243301489" w:history="1">
+          <w:hyperlink w:anchor="_Toc243302144" w:history="1">
             <w:r>
               <w:rPr>
                 <w:rStyle w:val="Hyperlink"/>
@@ -5352,7 +5352,7 @@
               <w:rPr>
                 <w:noProof/>
               </w:rPr>
-              <w:instrText xml:space="preserve"> PAGEREF _Toc243301489 \h </w:instrText>
+              <w:instrText xml:space="preserve"> PAGEREF _Toc243302144 \h </w:instrText>
             </w:r>
             <w:r>
               <w:rPr>
@@ -5394,7 +5394,7 @@
               <w14:ligatures w14:val="standardContextual"/>
             </w:rPr>
           </w:pPr>
-          <w:hyperlink w:anchor="_Toc243301490" w:history="1">
+          <w:hyperlink w:anchor="_Toc243302145" w:history="1">
             <w:r>
               <w:rPr>
                 <w:rStyle w:val="Hyperlink"/>
@@ -5418,7 +5418,7 @@
               <w:rPr>
                 <w:noProof/>
               </w:rPr>
-              <w:instrText xml:space="preserve"> PAGEREF _Toc243301490 \h </w:instrText>
+              <w:instrText xml:space="preserve"> PAGEREF _Toc243302145 \h </w:instrText>
             </w:r>
             <w:r>
               <w:rPr>
@@ -5460,7 +5460,7 @@
               <w14:ligatures w14:val="standardContextual"/>
             </w:rPr>
           </w:pPr>
-          <w:hyperlink w:anchor="_Toc243301491" w:history="1">
+          <w:hyperlink w:anchor="_Toc243302146" w:history="1">
             <w:r>
               <w:rPr>
                 <w:rStyle w:val="Hyperlink"/>
@@ -5484,7 +5484,7 @@
               <w:rPr>
                 <w:noProof/>
               </w:rPr>
-              <w:instrText xml:space="preserve"> PAGEREF _Toc243301491 \h </w:instrText>
+              <w:instrText xml:space="preserve"> PAGEREF _Toc243302146 \h </w:instrText>
             </w:r>
             <w:r>
               <w:rPr>
@@ -5533,7 +5533,7 @@
       <w:pPr>
         <w:pStyle w:val="Ttulo1"/>
       </w:pPr>
-      <w:bookmarkStart w:id="0" w:name="_Toc243301446"/>
+      <w:bookmarkStart w:id="0" w:name="_Toc243302101"/>
       <w:r>
         <w:t>1 INTRODUÇÃO</w:t>
       </w:r>
@@ -5605,7 +5605,7 @@
       <w:pPr>
         <w:pStyle w:val="Ttulo2"/>
       </w:pPr>
-      <w:bookmarkStart w:id="1" w:name="_Toc243301447"/>
+      <w:bookmarkStart w:id="1" w:name="_Toc243302102"/>
       <w:r>
         <w:t>1.1 OBJETIVOS</w:t>
       </w:r>
@@ -5615,7 +5615,7 @@
       <w:pPr>
         <w:pStyle w:val="Ttulo3"/>
       </w:pPr>
-      <w:bookmarkStart w:id="2" w:name="_Toc243301448"/>
+      <w:bookmarkStart w:id="2" w:name="_Toc243302103"/>
       <w:r>
         <w:t>1.1.1 Objetivo geral</w:t>
       </w:r>
@@ -5634,7 +5634,7 @@
       <w:pPr>
         <w:pStyle w:val="Ttulo3"/>
       </w:pPr>
-      <w:bookmarkStart w:id="3" w:name="_Toc243301449"/>
+      <w:bookmarkStart w:id="3" w:name="_Toc243302104"/>
       <w:r>
         <w:t>1.1.2 Objetivos específicos</w:t>
       </w:r>
@@ -5742,7 +5742,7 @@
       <w:pPr>
         <w:pStyle w:val="Ttulo2"/>
       </w:pPr>
-      <w:bookmarkStart w:id="4" w:name="_Toc243301450"/>
+      <w:bookmarkStart w:id="4" w:name="_Toc243302105"/>
       <w:r>
         <w:t>1.2 ORGANIZAÇÃO DO RELATÓRIO</w:t>
       </w:r>
@@ -5761,7 +5761,7 @@
       <w:pPr>
         <w:pStyle w:val="Ttulo1"/>
       </w:pPr>
-      <w:bookmarkStart w:id="5" w:name="_Toc243301451"/>
+      <w:bookmarkStart w:id="5" w:name="_Toc243302106"/>
       <w:r>
         <w:t>2 FUNDAMENTAÇÃO TEÓRICA</w:t>
       </w:r>
@@ -5780,7 +5780,7 @@
       <w:pPr>
         <w:pStyle w:val="Ttulo2"/>
       </w:pPr>
-      <w:bookmarkStart w:id="6" w:name="_Toc243301452"/>
+      <w:bookmarkStart w:id="6" w:name="_Toc243302107"/>
       <w:r>
         <w:t>2.1 MARCADORES BIOQUÍMICOS NO DIAGNÓSTICO CLÍNICO</w:t>
       </w:r>
@@ -5812,7 +5812,7 @@
       <w:pPr>
         <w:pStyle w:val="LegendaABNT"/>
       </w:pPr>
-      <w:bookmarkStart w:id="7" w:name="_Toc243301504"/>
+      <w:bookmarkStart w:id="7" w:name="_Toc243302159"/>
       <w:r>
         <w:t xml:space="preserve">Quadro </w:t>
       </w:r>
@@ -6350,7 +6350,7 @@
       <w:pPr>
         <w:pStyle w:val="Ttulo2"/>
       </w:pPr>
-      <w:bookmarkStart w:id="8" w:name="_Toc243301453"/>
+      <w:bookmarkStart w:id="8" w:name="_Toc243302108"/>
       <w:r>
         <w:t>2.2 PRÁTICA DE RECUPERAÇÃO E REPETIÇÃO ESPAÇADA</w:t>
       </w:r>
@@ -6430,7 +6430,7 @@
       <w:pPr>
         <w:pStyle w:val="Ttulo2"/>
       </w:pPr>
-      <w:bookmarkStart w:id="9" w:name="_Toc243301454"/>
+      <w:bookmarkStart w:id="9" w:name="_Toc243302109"/>
       <w:r>
         <w:t>2.3 O ALGORITMO SM-2</w:t>
       </w:r>
@@ -6506,7 +6506,7 @@
       <w:pPr>
         <w:pStyle w:val="Ttulo2"/>
       </w:pPr>
-      <w:bookmarkStart w:id="10" w:name="_Toc243301455"/>
+      <w:bookmarkStart w:id="10" w:name="_Toc243302110"/>
       <w:r>
         <w:t>2.4 GAMIFICAÇÃO E MOTIVAÇÃO</w:t>
       </w:r>
@@ -6584,7 +6584,7 @@
       <w:pPr>
         <w:pStyle w:val="Ttulo2"/>
       </w:pPr>
-      <w:bookmarkStart w:id="11" w:name="_Toc243301456"/>
+      <w:bookmarkStart w:id="11" w:name="_Toc243302111"/>
       <w:r>
         <w:t>2.5 METACOGNIÇÃO E CALIBRAÇÃO</w:t>
       </w:r>
@@ -6632,7 +6632,7 @@
       <w:pPr>
         <w:pStyle w:val="Ttulo1"/>
       </w:pPr>
-      <w:bookmarkStart w:id="12" w:name="_Toc243301457"/>
+      <w:bookmarkStart w:id="12" w:name="_Toc243302112"/>
       <w:r>
         <w:t>3 MATERIAIS E MÉTODOS</w:t>
       </w:r>
@@ -6642,7 +6642,7 @@
       <w:pPr>
         <w:pStyle w:val="Ttulo2"/>
       </w:pPr>
-      <w:bookmarkStart w:id="13" w:name="_Toc243301458"/>
+      <w:bookmarkStart w:id="13" w:name="_Toc243302113"/>
       <w:r>
         <w:t>3.1 NATUREZA DA PESQUISA E ETAPAS</w:t>
       </w:r>
@@ -6779,7 +6779,7 @@
       <w:pPr>
         <w:pStyle w:val="Ttulo2"/>
       </w:pPr>
-      <w:bookmarkStart w:id="14" w:name="_Toc243301459"/>
+      <w:bookmarkStart w:id="14" w:name="_Toc243302114"/>
       <w:r>
         <w:t>3.2 CURADORIA DO CONTEÚDO</w:t>
       </w:r>
@@ -6833,14 +6833,17 @@
         <w:t>flashcards</w:t>
       </w:r>
       <w:r>
-        <w:t xml:space="preserve"> contra as fichas e as fontes corrigiu 17 cartões com valores divergentes ou erros de conteúdo. O conteúdo não passou por revisão formal de um docente da área da saúde: foi conferido pelo autor nas fontes citadas e ajustado a partir das observações de profissionais da área e de estudantes que já haviam cursado a disciplina, na avaliação formativa (seção 3.6.1).</w:t>
+        <w:t xml:space="preserve"> contra as fichas e as fontes corrigiu 17 cartões com valores divergentes ou erros de conteúdo. Uma revisão final de todo o conteúdo, conferida nas fontes, corrigiu ainda casos clínicos com valores incoerentes com o diagnóstico — num deles, nenhuma alternativa era aceita como certa —, além de cards e questões imprecisos; um teste automatizado passou a conferir que a resposta de cada caso está entre as alternativas. O conteúdo não passou por revisão formal de um docente da área da saúde: foi conferido pelo a</w:t>
+      </w:r>
+      <w:r>
+        <w:t>utor nas fontes citadas e ajustado a partir das observações de profissionais da área e de estudantes que já haviam cursado a disciplina, na avaliação formativa (seção 3.6.1).</w:t>
       </w:r>
     </w:p>
     <w:p>
       <w:pPr>
         <w:pStyle w:val="Ttulo2"/>
       </w:pPr>
-      <w:bookmarkStart w:id="15" w:name="_Toc243301460"/>
+      <w:bookmarkStart w:id="15" w:name="_Toc243302115"/>
       <w:r>
         <w:t>3.3 TECNOLOGIAS UTILIZADAS</w:t>
       </w:r>
@@ -6860,7 +6863,7 @@
       <w:pPr>
         <w:pStyle w:val="LegendaABNT"/>
       </w:pPr>
-      <w:bookmarkStart w:id="16" w:name="_Toc243301505"/>
+      <w:bookmarkStart w:id="16" w:name="_Toc243302160"/>
       <w:r>
         <w:t xml:space="preserve">Quadro </w:t>
       </w:r>
@@ -8410,7 +8413,7 @@
       <w:pPr>
         <w:pStyle w:val="Ttulo2"/>
       </w:pPr>
-      <w:bookmarkStart w:id="17" w:name="_Toc243301461"/>
+      <w:bookmarkStart w:id="17" w:name="_Toc243302116"/>
       <w:r>
         <w:t>3.4 ARQUITETURA DO SOFTWARE</w:t>
       </w:r>
@@ -8430,7 +8433,7 @@
       <w:pPr>
         <w:pStyle w:val="LegendaABNT"/>
       </w:pPr>
-      <w:bookmarkStart w:id="18" w:name="_Toc243301492"/>
+      <w:bookmarkStart w:id="18" w:name="_Toc243302147"/>
       <w:r>
         <w:t xml:space="preserve">Figura </w:t>
       </w:r>
@@ -8468,7 +8471,7 @@
           <w:noProof/>
         </w:rPr>
         <w:drawing>
-          <wp:inline distT="0" distB="0" distL="0" distR="0" wp14:anchorId="28F1D7F1" wp14:editId="60F60893">
+          <wp:inline distT="0" distB="0" distL="0" distR="0" wp14:anchorId="1BE59D7B" wp14:editId="52D737E5">
             <wp:extent cx="5762625" cy="3714750"/>
             <wp:effectExtent l="0" t="0" r="0" b="0"/>
             <wp:docPr id="1" name="arquitetura.png" descr="Arquitetura do BioquímicaEDU" title="Arquitetura do BioquímicaEDU"/>
@@ -8531,7 +8534,7 @@
       <w:pPr>
         <w:pStyle w:val="Ttulo2"/>
       </w:pPr>
-      <w:bookmarkStart w:id="19" w:name="_Toc243301462"/>
+      <w:bookmarkStart w:id="19" w:name="_Toc243302117"/>
       <w:r>
         <w:t>3.5 VERIFICAÇÃO DO SOFTWARE</w:t>
       </w:r>
@@ -8572,7 +8575,7 @@
       <w:pPr>
         <w:pStyle w:val="Ttulo2"/>
       </w:pPr>
-      <w:bookmarkStart w:id="20" w:name="_Toc243301463"/>
+      <w:bookmarkStart w:id="20" w:name="_Toc243302118"/>
       <w:r>
         <w:t>3.6 AVALIAÇÃO COM USUÁRIOS</w:t>
       </w:r>
@@ -8591,7 +8594,7 @@
       <w:pPr>
         <w:pStyle w:val="Ttulo3"/>
       </w:pPr>
-      <w:bookmarkStart w:id="21" w:name="_Toc243301464"/>
+      <w:bookmarkStart w:id="21" w:name="_Toc243302119"/>
       <w:r>
         <w:t>3.6.1 Avaliação formativa</w:t>
       </w:r>
@@ -8613,7 +8616,7 @@
       <w:pPr>
         <w:pStyle w:val="Ttulo3"/>
       </w:pPr>
-      <w:bookmarkStart w:id="22" w:name="_Toc243301465"/>
+      <w:bookmarkStart w:id="22" w:name="_Toc243302120"/>
       <w:r>
         <w:t>3.6.2 Pré-teste e pós-teste</w:t>
       </w:r>
@@ -8659,7 +8662,7 @@
       <w:pPr>
         <w:pStyle w:val="Ttulo3"/>
       </w:pPr>
-      <w:bookmarkStart w:id="23" w:name="_Toc243301466"/>
+      <w:bookmarkStart w:id="23" w:name="_Toc243302121"/>
       <w:r>
         <w:t>3.6.3 Questionário de opinião</w:t>
       </w:r>
@@ -8681,7 +8684,7 @@
       <w:pPr>
         <w:pStyle w:val="Ttulo3"/>
       </w:pPr>
-      <w:bookmarkStart w:id="24" w:name="_Toc243301467"/>
+      <w:bookmarkStart w:id="24" w:name="_Toc243302122"/>
       <w:r>
         <w:t>3.6.4 Aspectos éticos e proteção de dados</w:t>
       </w:r>
@@ -8718,7 +8721,7 @@
       <w:pPr>
         <w:pStyle w:val="Ttulo2"/>
       </w:pPr>
-      <w:bookmarkStart w:id="25" w:name="_Toc243301468"/>
+      <w:bookmarkStart w:id="25" w:name="_Toc243302123"/>
       <w:r>
         <w:t>3.7 USO DE FERRAMENTAS DE INTELIGÊNCIA ARTIFICIAL</w:t>
       </w:r>
@@ -8743,7 +8746,7 @@
       <w:pPr>
         <w:pStyle w:val="Ttulo1"/>
       </w:pPr>
-      <w:bookmarkStart w:id="26" w:name="_Toc243301469"/>
+      <w:bookmarkStart w:id="26" w:name="_Toc243302124"/>
       <w:r>
         <w:t>4 RESULTADOS</w:t>
       </w:r>
@@ -8753,7 +8756,7 @@
       <w:pPr>
         <w:pStyle w:val="Ttulo2"/>
       </w:pPr>
-      <w:bookmarkStart w:id="27" w:name="_Toc243301470"/>
+      <w:bookmarkStart w:id="27" w:name="_Toc243302125"/>
       <w:r>
         <w:t>4.1 VISÃO GERAL DO SOFTWARE</w:t>
       </w:r>
@@ -8773,7 +8776,7 @@
       <w:pPr>
         <w:pStyle w:val="LegendaABNT"/>
       </w:pPr>
-      <w:bookmarkStart w:id="28" w:name="_Toc243301506"/>
+      <w:bookmarkStart w:id="28" w:name="_Toc243302161"/>
       <w:r>
         <w:t xml:space="preserve">Quadro </w:t>
       </w:r>
@@ -9260,7 +9263,7 @@
       <w:pPr>
         <w:pStyle w:val="LegendaABNT"/>
       </w:pPr>
-      <w:bookmarkStart w:id="29" w:name="_Toc243301511"/>
+      <w:bookmarkStart w:id="29" w:name="_Toc243302166"/>
       <w:r>
         <w:t xml:space="preserve">Tabela </w:t>
       </w:r>
@@ -10640,7 +10643,7 @@
       <w:pPr>
         <w:pStyle w:val="LegendaABNT"/>
       </w:pPr>
-      <w:bookmarkStart w:id="30" w:name="_Toc243301512"/>
+      <w:bookmarkStart w:id="30" w:name="_Toc243302167"/>
       <w:r>
         <w:t xml:space="preserve">Tabela </w:t>
       </w:r>
@@ -11327,7 +11330,7 @@
       <w:pPr>
         <w:pStyle w:val="Ttulo2"/>
       </w:pPr>
-      <w:bookmarkStart w:id="31" w:name="_Toc243301471"/>
+      <w:bookmarkStart w:id="31" w:name="_Toc243302126"/>
       <w:r>
         <w:t>4.2 MOTOR DE APRENDIZAGEM</w:t>
       </w:r>
@@ -11359,7 +11362,7 @@
       <w:pPr>
         <w:pStyle w:val="LegendaABNT"/>
       </w:pPr>
-      <w:bookmarkStart w:id="32" w:name="_Toc243301507"/>
+      <w:bookmarkStart w:id="32" w:name="_Toc243302162"/>
       <w:r>
         <w:t xml:space="preserve">Quadro </w:t>
       </w:r>
@@ -11957,7 +11960,7 @@
       <w:pPr>
         <w:pStyle w:val="LegendaABNT"/>
       </w:pPr>
-      <w:bookmarkStart w:id="33" w:name="_Toc243301493"/>
+      <w:bookmarkStart w:id="33" w:name="_Toc243302148"/>
       <w:r>
         <w:t xml:space="preserve">Figura </w:t>
       </w:r>
@@ -11995,7 +11998,7 @@
           <w:noProof/>
         </w:rPr>
         <w:drawing>
-          <wp:inline distT="0" distB="0" distL="0" distR="0" wp14:anchorId="59B3C8F1" wp14:editId="6130A1B6">
+          <wp:inline distT="0" distB="0" distL="0" distR="0" wp14:anchorId="25883F95" wp14:editId="76FC067A">
             <wp:extent cx="5400675" cy="2971800"/>
             <wp:effectExtent l="0" t="0" r="0" b="0"/>
             <wp:docPr id="2" name="sm2_intervalos.png" descr="Intervalos calculados pelo motor em três sequências de respostas" title="Intervalos calculados pelo motor em três sequências de respostas"/>
@@ -12056,7 +12059,7 @@
       <w:pPr>
         <w:pStyle w:val="LegendaABNT"/>
       </w:pPr>
-      <w:bookmarkStart w:id="34" w:name="_Toc243301513"/>
+      <w:bookmarkStart w:id="34" w:name="_Toc243302168"/>
       <w:r>
         <w:t xml:space="preserve">Tabela </w:t>
       </w:r>
@@ -12883,7 +12886,7 @@
       <w:pPr>
         <w:pStyle w:val="Ttulo2"/>
       </w:pPr>
-      <w:bookmarkStart w:id="35" w:name="_Toc243301472"/>
+      <w:bookmarkStart w:id="35" w:name="_Toc243302127"/>
       <w:r>
         <w:t>4.3 VERSÃO PARA DISPOSITIVOS MÓVEIS</w:t>
       </w:r>
@@ -12903,7 +12906,7 @@
       <w:pPr>
         <w:pStyle w:val="LegendaABNT"/>
       </w:pPr>
-      <w:bookmarkStart w:id="36" w:name="_Toc243301494"/>
+      <w:bookmarkStart w:id="36" w:name="_Toc243302149"/>
       <w:r>
         <w:t xml:space="preserve">Figura </w:t>
       </w:r>
@@ -12941,7 +12944,7 @@
           <w:noProof/>
         </w:rPr>
         <w:drawing>
-          <wp:inline distT="0" distB="0" distL="0" distR="0" wp14:anchorId="21B8ACFE" wp14:editId="44D15900">
+          <wp:inline distT="0" distB="0" distL="0" distR="0" wp14:anchorId="3D915DDF" wp14:editId="0CCB0F0E">
             <wp:extent cx="5762625" cy="4086225"/>
             <wp:effectExtent l="0" t="0" r="0" b="0"/>
             <wp:docPr id="3" name="telas_inicio_estudo.png" descr="Início e estudo na versão móvel" title="Início e estudo na versão móvel"/>
@@ -13011,7 +13014,7 @@
       <w:pPr>
         <w:pStyle w:val="LegendaABNT"/>
       </w:pPr>
-      <w:bookmarkStart w:id="37" w:name="_Toc243301495"/>
+      <w:bookmarkStart w:id="37" w:name="_Toc243302150"/>
       <w:r>
         <w:t xml:space="preserve">Figura </w:t>
       </w:r>
@@ -13059,7 +13062,7 @@
           <w:noProof/>
         </w:rPr>
         <w:drawing>
-          <wp:inline distT="0" distB="0" distL="0" distR="0" wp14:anchorId="2E502ED7" wp14:editId="5521BFC7">
+          <wp:inline distT="0" distB="0" distL="0" distR="0" wp14:anchorId="650D33CC" wp14:editId="4688FD4A">
             <wp:extent cx="5762625" cy="4086225"/>
             <wp:effectExtent l="0" t="0" r="0" b="0"/>
             <wp:docPr id="4" name="telas_revisao.png" descr="Revisão espaçada e flashcards na versão móvel" title="Revisão espaçada e flashcards na versão móvel"/>
@@ -13149,7 +13152,7 @@
       <w:pPr>
         <w:pStyle w:val="LegendaABNT"/>
       </w:pPr>
-      <w:bookmarkStart w:id="38" w:name="_Toc243301496"/>
+      <w:bookmarkStart w:id="38" w:name="_Toc243302151"/>
       <w:r>
         <w:t xml:space="preserve">Figura </w:t>
       </w:r>
@@ -13187,7 +13190,7 @@
           <w:noProof/>
         </w:rPr>
         <w:drawing>
-          <wp:inline distT="0" distB="0" distL="0" distR="0" wp14:anchorId="0AC70EB0" wp14:editId="118B1DCD">
+          <wp:inline distT="0" distB="0" distL="0" distR="0" wp14:anchorId="1069D41B" wp14:editId="46FAC994">
             <wp:extent cx="5762625" cy="4086225"/>
             <wp:effectExtent l="0" t="0" r="0" b="0"/>
             <wp:docPr id="5" name="telas_pratica_tutor.png" descr="Prática e tutor na versão móvel" title="Prática e tutor na versão móvel"/>
@@ -13289,7 +13292,7 @@
       <w:pPr>
         <w:pStyle w:val="Ttulo2"/>
       </w:pPr>
-      <w:bookmarkStart w:id="39" w:name="_Toc243301473"/>
+      <w:bookmarkStart w:id="39" w:name="_Toc243302128"/>
       <w:r>
         <w:t>4.4 VERSÕES PARA COMPUTADOR</w:t>
       </w:r>
@@ -13309,7 +13312,7 @@
       <w:pPr>
         <w:pStyle w:val="LegendaABNT"/>
       </w:pPr>
-      <w:bookmarkStart w:id="40" w:name="_Toc243301497"/>
+      <w:bookmarkStart w:id="40" w:name="_Toc243302152"/>
       <w:r>
         <w:t xml:space="preserve">Figura </w:t>
       </w:r>
@@ -13347,7 +13350,7 @@
           <w:noProof/>
         </w:rPr>
         <w:drawing>
-          <wp:inline distT="0" distB="0" distL="0" distR="0" wp14:anchorId="21030D3A" wp14:editId="0D1F360D">
+          <wp:inline distT="0" distB="0" distL="0" distR="0" wp14:anchorId="1E140E55" wp14:editId="02768503">
             <wp:extent cx="5762625" cy="3981450"/>
             <wp:effectExtent l="0" t="0" r="0" b="0"/>
             <wp:docPr id="6" name="desktop_painel.png" descr="Painel inicial da versão para computador" title="Painel inicial da versão para computador"/>
@@ -13407,7 +13410,7 @@
       <w:pPr>
         <w:pStyle w:val="Ttulo2"/>
       </w:pPr>
-      <w:bookmarkStart w:id="41" w:name="_Toc243301474"/>
+      <w:bookmarkStart w:id="41" w:name="_Toc243302129"/>
       <w:r>
         <w:t>4.5 IDENTIDADE VISUAL</w:t>
       </w:r>
@@ -13427,7 +13430,7 @@
       <w:pPr>
         <w:pStyle w:val="LegendaABNT"/>
       </w:pPr>
-      <w:bookmarkStart w:id="42" w:name="_Toc243301498"/>
+      <w:bookmarkStart w:id="42" w:name="_Toc243302153"/>
       <w:r>
         <w:t xml:space="preserve">Figura </w:t>
       </w:r>
@@ -13465,7 +13468,7 @@
           <w:noProof/>
         </w:rPr>
         <w:drawing>
-          <wp:inline distT="0" distB="0" distL="0" distR="0" wp14:anchorId="01694B3F" wp14:editId="3F785E0B">
+          <wp:inline distT="0" distB="0" distL="0" distR="0" wp14:anchorId="17D96510" wp14:editId="0A06C74C">
             <wp:extent cx="3600450" cy="866775"/>
             <wp:effectExtent l="0" t="0" r="0" b="0"/>
             <wp:docPr id="7" name="horizontal.png" descr="Logo do BioquímicaEDU" title="Logo do BioquímicaEDU"/>
@@ -13516,7 +13519,7 @@
       <w:pPr>
         <w:pStyle w:val="Ttulo2"/>
       </w:pPr>
-      <w:bookmarkStart w:id="43" w:name="_Toc243301475"/>
+      <w:bookmarkStart w:id="43" w:name="_Toc243302130"/>
       <w:r>
         <w:t>4.6 AVALIAÇÃO FORMATIVA</w:t>
       </w:r>
@@ -13547,7 +13550,7 @@
       <w:pPr>
         <w:pStyle w:val="Ttulo2"/>
       </w:pPr>
-      <w:bookmarkStart w:id="44" w:name="_Toc243301476"/>
+      <w:bookmarkStart w:id="44" w:name="_Toc243302131"/>
       <w:r>
         <w:t>4.7 EVOLUÇÃO DO SOFTWARE</w:t>
       </w:r>
@@ -13569,7 +13572,7 @@
       <w:pPr>
         <w:pStyle w:val="Ttulo3"/>
       </w:pPr>
-      <w:bookmarkStart w:id="45" w:name="_Toc243301477"/>
+      <w:bookmarkStart w:id="45" w:name="_Toc243302132"/>
       <w:r>
         <w:t>4.7.1 Itens da proposta: novos marcadores, jogos e régua das faixas</w:t>
       </w:r>
@@ -13617,7 +13620,7 @@
       <w:pPr>
         <w:pStyle w:val="LegendaABNT"/>
       </w:pPr>
-      <w:bookmarkStart w:id="46" w:name="_Toc243301499"/>
+      <w:bookmarkStart w:id="46" w:name="_Toc243302154"/>
       <w:r>
         <w:t xml:space="preserve">Figura </w:t>
       </w:r>
@@ -13655,7 +13658,7 @@
           <w:noProof/>
         </w:rPr>
         <w:drawing>
-          <wp:inline distT="0" distB="0" distL="0" distR="0" wp14:anchorId="07BCA1A5" wp14:editId="6A91E71E">
+          <wp:inline distT="0" distB="0" distL="0" distR="0" wp14:anchorId="411866BB" wp14:editId="6029EFA5">
             <wp:extent cx="5762625" cy="4086225"/>
             <wp:effectExtent l="0" t="0" r="0" b="0"/>
             <wp:docPr id="8" name="evolucao_jogos.png" descr="Jogos didáticos e calculadora da TFG estimada na versão para celular" title="Jogos didáticos e calculadora da TFG estimada na versão para celular"/>
@@ -13728,7 +13731,7 @@
       <w:pPr>
         <w:pStyle w:val="Ttulo3"/>
       </w:pPr>
-      <w:bookmarkStart w:id="47" w:name="_Toc243301478"/>
+      <w:bookmarkStart w:id="47" w:name="_Toc243302133"/>
       <w:r>
         <w:t>4.7.2 Intervalos da revisão</w:t>
       </w:r>
@@ -13751,7 +13754,7 @@
       <w:pPr>
         <w:pStyle w:val="LegendaABNT"/>
       </w:pPr>
-      <w:bookmarkStart w:id="48" w:name="_Toc243301514"/>
+      <w:bookmarkStart w:id="48" w:name="_Toc243302169"/>
       <w:r>
         <w:t xml:space="preserve">Tabela </w:t>
       </w:r>
@@ -14330,7 +14333,7 @@
       <w:pPr>
         <w:pStyle w:val="Ttulo3"/>
       </w:pPr>
-      <w:bookmarkStart w:id="49" w:name="_Toc243301479"/>
+      <w:bookmarkStart w:id="49" w:name="_Toc243302134"/>
       <w:r>
         <w:t>4.7.3 Um aplicativo para celular, tablet e computador</w:t>
       </w:r>
@@ -14353,7 +14356,7 @@
       <w:pPr>
         <w:pStyle w:val="LegendaABNT"/>
       </w:pPr>
-      <w:bookmarkStart w:id="50" w:name="_Toc243301508"/>
+      <w:bookmarkStart w:id="50" w:name="_Toc243302163"/>
       <w:r>
         <w:t xml:space="preserve">Quadro </w:t>
       </w:r>
@@ -15103,7 +15106,7 @@
       <w:pPr>
         <w:pStyle w:val="LegendaABNT"/>
       </w:pPr>
-      <w:bookmarkStart w:id="51" w:name="_Toc243301500"/>
+      <w:bookmarkStart w:id="51" w:name="_Toc243302155"/>
       <w:r>
         <w:t xml:space="preserve">Figura </w:t>
       </w:r>
@@ -15141,7 +15144,7 @@
           <w:noProof/>
         </w:rPr>
         <w:drawing>
-          <wp:inline distT="0" distB="0" distL="0" distR="0" wp14:anchorId="7A5C623B" wp14:editId="453166B2">
+          <wp:inline distT="0" distB="0" distL="0" distR="0" wp14:anchorId="43DB735E" wp14:editId="54E5C29A">
             <wp:extent cx="5762625" cy="7219950"/>
             <wp:effectExtent l="0" t="0" r="0" b="0"/>
             <wp:docPr id="9" name="evolucao_formatos.png" descr="O mesmo aplicativo no computador, no tablet e no celular" title="O mesmo aplicativo no computador, no tablet e no celular"/>
@@ -15202,7 +15205,7 @@
       <w:pPr>
         <w:pStyle w:val="Ttulo3"/>
       </w:pPr>
-      <w:bookmarkStart w:id="52" w:name="_Toc243301480"/>
+      <w:bookmarkStart w:id="52" w:name="_Toc243302135"/>
       <w:r>
         <w:t>4.7.4 Acessibilidade</w:t>
       </w:r>
@@ -15303,7 +15306,7 @@
       <w:pPr>
         <w:pStyle w:val="LegendaABNT"/>
       </w:pPr>
-      <w:bookmarkStart w:id="53" w:name="_Toc243301501"/>
+      <w:bookmarkStart w:id="53" w:name="_Toc243302156"/>
       <w:r>
         <w:t xml:space="preserve">Figura </w:t>
       </w:r>
@@ -15341,7 +15344,7 @@
           <w:noProof/>
         </w:rPr>
         <w:drawing>
-          <wp:inline distT="0" distB="0" distL="0" distR="0" wp14:anchorId="133D9ED9" wp14:editId="3E0398B0">
+          <wp:inline distT="0" distB="0" distL="0" distR="0" wp14:anchorId="0D67658A" wp14:editId="52AF1F92">
             <wp:extent cx="5762625" cy="4086225"/>
             <wp:effectExtent l="0" t="0" r="0" b="0"/>
             <wp:docPr id="10" name="evolucao_acessibilidade.png" descr="Recursos de acessibilidade na versão para celular" title="Recursos de acessibilidade na versão para celular"/>
@@ -15414,7 +15417,7 @@
       <w:pPr>
         <w:pStyle w:val="Ttulo3"/>
       </w:pPr>
-      <w:bookmarkStart w:id="54" w:name="_Toc243301481"/>
+      <w:bookmarkStart w:id="54" w:name="_Toc243302136"/>
       <w:r>
         <w:t>4.7.5 Tutor com inteligência artificial generativa</w:t>
       </w:r>
@@ -15437,7 +15440,7 @@
       <w:pPr>
         <w:pStyle w:val="LegendaABNT"/>
       </w:pPr>
-      <w:bookmarkStart w:id="55" w:name="_Toc243301502"/>
+      <w:bookmarkStart w:id="55" w:name="_Toc243302157"/>
       <w:r>
         <w:t xml:space="preserve">Figura </w:t>
       </w:r>
@@ -15475,7 +15478,7 @@
           <w:noProof/>
         </w:rPr>
         <w:drawing>
-          <wp:inline distT="0" distB="0" distL="0" distR="0" wp14:anchorId="2B057812" wp14:editId="0BDC261B">
+          <wp:inline distT="0" distB="0" distL="0" distR="0" wp14:anchorId="235B05F9" wp14:editId="7600E471">
             <wp:extent cx="5762625" cy="2933700"/>
             <wp:effectExtent l="0" t="0" r="0" b="0"/>
             <wp:docPr id="11" name="tutor_arquitetura.png" descr="Provedores de resposta do tutor e local da chave de acesso" title="Provedores de resposta do tutor e local da chave de acesso"/>
@@ -15581,7 +15584,7 @@
       <w:pPr>
         <w:pStyle w:val="LegendaABNT"/>
       </w:pPr>
-      <w:bookmarkStart w:id="56" w:name="_Toc243301503"/>
+      <w:bookmarkStart w:id="56" w:name="_Toc243302158"/>
       <w:r>
         <w:t xml:space="preserve">Figura </w:t>
       </w:r>
@@ -15619,7 +15622,7 @@
           <w:noProof/>
         </w:rPr>
         <w:drawing>
-          <wp:inline distT="0" distB="0" distL="0" distR="0" wp14:anchorId="17AE8BF0" wp14:editId="1E3B3D86">
+          <wp:inline distT="0" distB="0" distL="0" distR="0" wp14:anchorId="1B48ABBA" wp14:editId="4DF0CEF8">
             <wp:extent cx="5762625" cy="4086225"/>
             <wp:effectExtent l="0" t="0" r="0" b="0"/>
             <wp:docPr id="12" name="evolucao_tutor.png" descr="Conversa com o tutor usando o Gemini na versão para celular" title="Conversa com o tutor usando o Gemini na versão para celular"/>
@@ -15680,7 +15683,7 @@
       <w:pPr>
         <w:pStyle w:val="Ttulo3"/>
       </w:pPr>
-      <w:bookmarkStart w:id="57" w:name="_Toc243301482"/>
+      <w:bookmarkStart w:id="57" w:name="_Toc243302137"/>
       <w:r>
         <w:t>4.7.6 Abertura, conta Google opcional e apresentação</w:t>
       </w:r>
@@ -15705,7 +15708,7 @@
       <w:pPr>
         <w:pStyle w:val="Ttulo3"/>
       </w:pPr>
-      <w:bookmarkStart w:id="58" w:name="_Toc243301483"/>
+      <w:bookmarkStart w:id="58" w:name="_Toc243302138"/>
       <w:r>
         <w:t>4.7.7 Site e instaladores</w:t>
       </w:r>
@@ -15755,7 +15758,7 @@
       <w:pPr>
         <w:pStyle w:val="Ttulo2"/>
       </w:pPr>
-      <w:bookmarkStart w:id="59" w:name="_Toc243301484"/>
+      <w:bookmarkStart w:id="59" w:name="_Toc243302139"/>
       <w:r>
         <w:t>4.8 AVALIAÇÃO DA APRENDIZAGEM</w:t>
       </w:r>
@@ -15778,7 +15781,7 @@
       <w:pPr>
         <w:pStyle w:val="LegendaABNT"/>
       </w:pPr>
-      <w:bookmarkStart w:id="60" w:name="_Toc243301515"/>
+      <w:bookmarkStart w:id="60" w:name="_Toc243302170"/>
       <w:r>
         <w:t xml:space="preserve">Tabela </w:t>
       </w:r>
@@ -16392,7 +16395,7 @@
       <w:pPr>
         <w:pStyle w:val="Ttulo1"/>
       </w:pPr>
-      <w:bookmarkStart w:id="61" w:name="_Toc243301485"/>
+      <w:bookmarkStart w:id="61" w:name="_Toc243302140"/>
       <w:r>
         <w:t>5 DISCUSSÃO</w:t>
       </w:r>
@@ -16412,7 +16415,7 @@
       <w:pPr>
         <w:pStyle w:val="LegendaABNT"/>
       </w:pPr>
-      <w:bookmarkStart w:id="62" w:name="_Toc243301509"/>
+      <w:bookmarkStart w:id="62" w:name="_Toc243302164"/>
       <w:r>
         <w:t xml:space="preserve">Quadro </w:t>
       </w:r>
@@ -17539,7 +17542,7 @@
       <w:pPr>
         <w:pStyle w:val="Ttulo1"/>
       </w:pPr>
-      <w:bookmarkStart w:id="63" w:name="_Toc243301486"/>
+      <w:bookmarkStart w:id="63" w:name="_Toc243302141"/>
       <w:r>
         <w:t>6 CONSIDERAÇÕES FINAIS</w:t>
       </w:r>
@@ -17609,7 +17612,7 @@
         <w:pStyle w:val="Ttulo1"/>
         <w:jc w:val="center"/>
       </w:pPr>
-      <w:bookmarkStart w:id="64" w:name="_Toc243301487"/>
+      <w:bookmarkStart w:id="64" w:name="_Toc243302142"/>
       <w:r>
         <w:t>REFERÊNCIAS</w:t>
       </w:r>
@@ -18486,7 +18489,7 @@
         <w:pStyle w:val="Ttulo1"/>
         <w:jc w:val="center"/>
       </w:pPr>
-      <w:bookmarkStart w:id="65" w:name="_Toc243301488"/>
+      <w:bookmarkStart w:id="65" w:name="_Toc243302143"/>
       <w:r>
         <w:t>APÊNDICE A – FONTES DO CONTEÚDO POR MARCADOR</w:t>
       </w:r>
@@ -18506,7 +18509,7 @@
       <w:pPr>
         <w:pStyle w:val="LegendaABNT"/>
       </w:pPr>
-      <w:bookmarkStart w:id="66" w:name="_Toc243301510"/>
+      <w:bookmarkStart w:id="66" w:name="_Toc243302165"/>
       <w:r>
         <w:t xml:space="preserve">Quadro </w:t>
       </w:r>
@@ -20881,7 +20884,7 @@
         <w:pStyle w:val="Ttulo1"/>
         <w:jc w:val="center"/>
       </w:pPr>
-      <w:bookmarkStart w:id="67" w:name="_Toc243301489"/>
+      <w:bookmarkStart w:id="67" w:name="_Toc243302144"/>
       <w:r>
         <w:t>APÊNDICE B – CÓDIGO-FONTE E EXECUÇÃO</w:t>
       </w:r>
@@ -20976,7 +20979,7 @@
         <w:pStyle w:val="Ttulo1"/>
         <w:jc w:val="center"/>
       </w:pPr>
-      <w:bookmarkStart w:id="68" w:name="_Toc243301490"/>
+      <w:bookmarkStart w:id="68" w:name="_Toc243302145"/>
       <w:r>
         <w:t>APÊNDICE C – QUESTÕES DO PRÉ-TESTE E DO PÓS-TESTE</w:t>
       </w:r>
@@ -21817,7 +21820,7 @@
         <w:pStyle w:val="Ttulo1"/>
         <w:jc w:val="center"/>
       </w:pPr>
-      <w:bookmarkStart w:id="69" w:name="_Toc243301491"/>
+      <w:bookmarkStart w:id="69" w:name="_Toc243302146"/>
       <w:r>
         <w:t>APÊNDICE D – QUESTIONÁRIO DE OPINIÃO</w:t>
       </w:r>
@@ -22163,10 +22166,10 @@
 <file path=word/numbering.xml><?xml version="1.0" encoding="utf-8"?>
 <w:numbering xmlns:wpc="http://schemas.microsoft.com/office/word/2010/wordprocessingCanvas" xmlns:cx="http://schemas.microsoft.com/office/drawing/2014/chartex" xmlns:cx1="http://schemas.microsoft.com/office/drawing/2015/9/8/chartex" xmlns:cx2="http://schemas.microsoft.com/office/drawing/2015/10/21/chartex" xmlns:cx3="http://schemas.microsoft.com/office/drawing/2016/5/9/chartex" xmlns:cx4="http://schemas.microsoft.com/office/drawing/2016/5/10/chartex" xmlns:cx5="http://schemas.microsoft.com/office/drawing/2016/5/11/chartex" xmlns:cx6="http://schemas.microsoft.com/office/drawing/2016/5/12/chartex" xmlns:cx7="http://schemas.microsoft.com/office/drawing/2016/5/13/chartex" xmlns:cx8="http://schemas.microsoft.com/office/drawing/2016/5/14/chartex" xmlns:mc="http://schemas.openxmlformats.org/markup-compatibility/2006" xmlns:aink="http://schemas.microsoft.com/office/drawing/2016/ink" xmlns:am3d="http://schemas.microsoft.com/office/drawing/2017/model3d" xmlns:o="urn:schemas-microsoft-com:office:office" xmlns:oel="http://schemas.microsoft.com/office/2019/extlst" xmlns:r="http://schemas.openxmlformats.org/officeDocument/2006/relationships" xmlns:m="http://schemas.openxmlformats.org/officeDocument/2006/math" xmlns:v="urn:schemas-microsoft-com:vml" xmlns:wp14="http://schemas.microsoft.com/office/word/2010/wordprocessingDrawing" xmlns:wp="http://schemas.openxmlformats.org/drawingml/2006/wordprocessingDrawing" xmlns:w10="urn:schemas-microsoft-com:office:word" xmlns:w="http://schemas.openxmlformats.org/wordprocessingml/2006/main" xmlns:w14="http://schemas.microsoft.com/office/word/2010/wordml" xmlns:w15="http://schemas.microsoft.com/office/word/2012/wordml" xmlns:w16cex="http://schemas.microsoft.com/office/word/2018/wordml/cex" xmlns:w16cid="http://schemas.microsoft.com/office/word/2016/wordml/cid" xmlns:w16="http://schemas.microsoft.com/office/word/2018/wordml" xmlns:w16du="http://schemas.microsoft.com/office/word/2023/wordml/word16du" xmlns:w16sdtdh="http://schemas.microsoft.com/office/word/2020/wordml/sdtdatahash" xmlns:w16sdtfl="http://schemas.microsoft.com/office/word/2024/wordml/sdtformatlock" xmlns:w16se="http://schemas.microsoft.com/office/word/2015/wordml/symex" xmlns:wpg="http://schemas.microsoft.com/office/word/2010/wordprocessingGroup" xmlns:wpi="http://schemas.microsoft.com/office/word/2010/wordprocessingInk" xmlns:wne="http://schemas.microsoft.com/office/word/2006/wordml" xmlns:wps="http://schemas.microsoft.com/office/word/2010/wordprocessingShape" mc:Ignorable="w14 w15 w16se w16cid w16 w16cex w16sdtdh w16sdtfl w16du wp14">
   <w:abstractNum w:abstractNumId="0" w15:restartNumberingAfterBreak="0">
-    <w:nsid w:val="18564847"/>
+    <w:nsid w:val="3D605F2D"/>
     <w:multiLevelType w:val="hybridMultilevel"/>
-    <w:tmpl w:val="FBF45C82"/>
-    <w:lvl w:ilvl="0" w:tplc="5D248590">
+    <w:tmpl w:val="FA726E54"/>
+    <w:lvl w:ilvl="0" w:tplc="1966DE36">
       <w:start w:val="1"/>
       <w:numFmt w:val="lowerLetter"/>
       <w:lvlText w:val="%1)"/>
@@ -22175,52 +22178,52 @@
         <w:ind w:left="1106" w:hanging="397"/>
       </w:pPr>
     </w:lvl>
-    <w:lvl w:ilvl="1" w:tplc="8946CC08">
+    <w:lvl w:ilvl="1" w:tplc="4768EEC4">
       <w:numFmt w:val="decimal"/>
       <w:lvlText w:val=""/>
       <w:lvlJc w:val="left"/>
     </w:lvl>
-    <w:lvl w:ilvl="2" w:tplc="D4A8C7A6">
+    <w:lvl w:ilvl="2" w:tplc="59E2AC3C">
       <w:numFmt w:val="decimal"/>
       <w:lvlText w:val=""/>
       <w:lvlJc w:val="left"/>
     </w:lvl>
-    <w:lvl w:ilvl="3" w:tplc="A7F00E60">
+    <w:lvl w:ilvl="3" w:tplc="1CC2A474">
       <w:numFmt w:val="decimal"/>
       <w:lvlText w:val=""/>
       <w:lvlJc w:val="left"/>
     </w:lvl>
-    <w:lvl w:ilvl="4" w:tplc="F0FA4B34">
+    <w:lvl w:ilvl="4" w:tplc="AA366664">
       <w:numFmt w:val="decimal"/>
       <w:lvlText w:val=""/>
       <w:lvlJc w:val="left"/>
     </w:lvl>
-    <w:lvl w:ilvl="5" w:tplc="607CECEE">
+    <w:lvl w:ilvl="5" w:tplc="6DA867CA">
       <w:numFmt w:val="decimal"/>
       <w:lvlText w:val=""/>
       <w:lvlJc w:val="left"/>
     </w:lvl>
-    <w:lvl w:ilvl="6" w:tplc="20663D32">
+    <w:lvl w:ilvl="6" w:tplc="35705C46">
       <w:numFmt w:val="decimal"/>
       <w:lvlText w:val=""/>
       <w:lvlJc w:val="left"/>
     </w:lvl>
-    <w:lvl w:ilvl="7" w:tplc="04E2B010">
+    <w:lvl w:ilvl="7" w:tplc="412A3B4E">
       <w:numFmt w:val="decimal"/>
       <w:lvlText w:val=""/>
       <w:lvlJc w:val="left"/>
     </w:lvl>
-    <w:lvl w:ilvl="8" w:tplc="DDE8C8E2">
+    <w:lvl w:ilvl="8" w:tplc="895C0832">
       <w:numFmt w:val="decimal"/>
       <w:lvlText w:val=""/>
       <w:lvlJc w:val="left"/>
     </w:lvl>
   </w:abstractNum>
   <w:abstractNum w:abstractNumId="1" w15:restartNumberingAfterBreak="0">
-    <w:nsid w:val="52B240CA"/>
+    <w:nsid w:val="62E94DB9"/>
     <w:multiLevelType w:val="hybridMultilevel"/>
-    <w:tmpl w:val="C234CB5C"/>
-    <w:lvl w:ilvl="0" w:tplc="110674DC" w:tentative="1">
+    <w:tmpl w:val="A2B2366E"/>
+    <w:lvl w:ilvl="0" w:tplc="8C065568" w:tentative="1">
       <w:start w:val="1"/>
       <w:numFmt w:val="bullet"/>
       <w:lvlText w:val="●"/>
@@ -22229,7 +22232,7 @@
         <w:ind w:left="720" w:hanging="360"/>
       </w:pPr>
     </w:lvl>
-    <w:lvl w:ilvl="1" w:tplc="BB44CA4A" w:tentative="1">
+    <w:lvl w:ilvl="1" w:tplc="D388B1E6" w:tentative="1">
       <w:start w:val="1"/>
       <w:numFmt w:val="bullet"/>
       <w:lvlText w:val="○"/>
@@ -22238,7 +22241,7 @@
         <w:ind w:left="1440" w:hanging="360"/>
       </w:pPr>
     </w:lvl>
-    <w:lvl w:ilvl="2" w:tplc="041AC7C4" w:tentative="1">
+    <w:lvl w:ilvl="2" w:tplc="5BF2CA1A" w:tentative="1">
       <w:start w:val="1"/>
       <w:numFmt w:val="bullet"/>
       <w:lvlText w:val="■"/>
@@ -22247,7 +22250,7 @@
         <w:ind w:left="2160" w:hanging="360"/>
       </w:pPr>
     </w:lvl>
-    <w:lvl w:ilvl="3" w:tplc="4A1C64C6" w:tentative="1">
+    <w:lvl w:ilvl="3" w:tplc="BD2493FA" w:tentative="1">
       <w:start w:val="1"/>
       <w:numFmt w:val="bullet"/>
       <w:lvlText w:val="●"/>
@@ -22256,7 +22259,7 @@
         <w:ind w:left="2880" w:hanging="360"/>
       </w:pPr>
     </w:lvl>
-    <w:lvl w:ilvl="4" w:tplc="58B474B8" w:tentative="1">
+    <w:lvl w:ilvl="4" w:tplc="8460BE38" w:tentative="1">
       <w:start w:val="1"/>
       <w:numFmt w:val="bullet"/>
       <w:lvlText w:val="○"/>
@@ -22265,7 +22268,7 @@
         <w:ind w:left="3600" w:hanging="360"/>
       </w:pPr>
     </w:lvl>
-    <w:lvl w:ilvl="5" w:tplc="4F66537A" w:tentative="1">
+    <w:lvl w:ilvl="5" w:tplc="15B4027A" w:tentative="1">
       <w:start w:val="1"/>
       <w:numFmt w:val="bullet"/>
       <w:lvlText w:val="■"/>
@@ -22274,7 +22277,7 @@
         <w:ind w:left="4320" w:hanging="360"/>
       </w:pPr>
     </w:lvl>
-    <w:lvl w:ilvl="6" w:tplc="F1C4AA80" w:tentative="1">
+    <w:lvl w:ilvl="6" w:tplc="73DAE084" w:tentative="1">
       <w:start w:val="1"/>
       <w:numFmt w:val="bullet"/>
       <w:lvlText w:val="●"/>
@@ -22283,7 +22286,7 @@
         <w:ind w:left="5040" w:hanging="360"/>
       </w:pPr>
     </w:lvl>
-    <w:lvl w:ilvl="7" w:tplc="7326DE10" w:tentative="1">
+    <w:lvl w:ilvl="7" w:tplc="BA3E8196" w:tentative="1">
       <w:start w:val="1"/>
       <w:numFmt w:val="bullet"/>
       <w:lvlText w:val="●"/>
@@ -22292,7 +22295,7 @@
         <w:ind w:left="5760" w:hanging="360"/>
       </w:pPr>
     </w:lvl>
-    <w:lvl w:ilvl="8" w:tplc="C8260B72" w:tentative="1">
+    <w:lvl w:ilvl="8" w:tplc="007AB56C" w:tentative="1">
       <w:start w:val="1"/>
       <w:numFmt w:val="bullet"/>
       <w:lvlText w:val="●"/>
@@ -22302,97 +22305,97 @@
       </w:pPr>
     </w:lvl>
   </w:abstractNum>
-  <w:num w:numId="1" w16cid:durableId="341590442">
+  <w:num w:numId="1" w16cid:durableId="924144810">
     <w:abstractNumId w:val="1"/>
     <w:lvlOverride w:ilvl="0">
       <w:startOverride w:val="1"/>
     </w:lvlOverride>
   </w:num>
-  <w:num w:numId="2" w16cid:durableId="1262957180">
+  <w:num w:numId="2" w16cid:durableId="1990131837">
     <w:abstractNumId w:val="0"/>
     <w:lvlOverride w:ilvl="0">
       <w:startOverride w:val="1"/>
     </w:lvlOverride>
   </w:num>
-  <w:num w:numId="3" w16cid:durableId="1626933412">
+  <w:num w:numId="3" w16cid:durableId="463546805">
     <w:abstractNumId w:val="0"/>
     <w:lvlOverride w:ilvl="0">
       <w:startOverride w:val="1"/>
     </w:lvlOverride>
   </w:num>
-  <w:num w:numId="4" w16cid:durableId="1680279241">
+  <w:num w:numId="4" w16cid:durableId="1279802546">
     <w:abstractNumId w:val="0"/>
     <w:lvlOverride w:ilvl="0">
       <w:startOverride w:val="1"/>
     </w:lvlOverride>
   </w:num>
-  <w:num w:numId="5" w16cid:durableId="269360212">
+  <w:num w:numId="5" w16cid:durableId="664630536">
     <w:abstractNumId w:val="0"/>
     <w:lvlOverride w:ilvl="0">
       <w:startOverride w:val="1"/>
     </w:lvlOverride>
   </w:num>
-  <w:num w:numId="6" w16cid:durableId="1880435439">
+  <w:num w:numId="6" w16cid:durableId="888103132">
     <w:abstractNumId w:val="0"/>
     <w:lvlOverride w:ilvl="0">
       <w:startOverride w:val="1"/>
     </w:lvlOverride>
   </w:num>
-  <w:num w:numId="7" w16cid:durableId="1172136277">
+  <w:num w:numId="7" w16cid:durableId="735054404">
     <w:abstractNumId w:val="0"/>
     <w:lvlOverride w:ilvl="0">
       <w:startOverride w:val="1"/>
     </w:lvlOverride>
   </w:num>
-  <w:num w:numId="8" w16cid:durableId="947586777">
+  <w:num w:numId="8" w16cid:durableId="24258919">
     <w:abstractNumId w:val="0"/>
     <w:lvlOverride w:ilvl="0">
       <w:startOverride w:val="1"/>
     </w:lvlOverride>
   </w:num>
-  <w:num w:numId="9" w16cid:durableId="1691948984">
+  <w:num w:numId="9" w16cid:durableId="2118211523">
     <w:abstractNumId w:val="0"/>
     <w:lvlOverride w:ilvl="0">
       <w:startOverride w:val="1"/>
     </w:lvlOverride>
   </w:num>
-  <w:num w:numId="10" w16cid:durableId="1587836427">
+  <w:num w:numId="10" w16cid:durableId="345518796">
     <w:abstractNumId w:val="0"/>
     <w:lvlOverride w:ilvl="0">
       <w:startOverride w:val="1"/>
     </w:lvlOverride>
   </w:num>
-  <w:num w:numId="11" w16cid:durableId="1530294137">
+  <w:num w:numId="11" w16cid:durableId="2024162832">
     <w:abstractNumId w:val="0"/>
     <w:lvlOverride w:ilvl="0">
       <w:startOverride w:val="1"/>
     </w:lvlOverride>
   </w:num>
-  <w:num w:numId="12" w16cid:durableId="2047559737">
+  <w:num w:numId="12" w16cid:durableId="1490289021">
     <w:abstractNumId w:val="0"/>
     <w:lvlOverride w:ilvl="0">
       <w:startOverride w:val="1"/>
     </w:lvlOverride>
   </w:num>
-  <w:num w:numId="13" w16cid:durableId="875001060">
+  <w:num w:numId="13" w16cid:durableId="1853490193">
     <w:abstractNumId w:val="0"/>
     <w:lvlOverride w:ilvl="0">
       <w:startOverride w:val="1"/>
     </w:lvlOverride>
   </w:num>
-  <w:num w:numId="14" w16cid:durableId="893927298">
+  <w:num w:numId="14" w16cid:durableId="2096437247">
     <w:abstractNumId w:val="0"/>
     <w:lvlOverride w:ilvl="0">
       <w:startOverride w:val="1"/>
     </w:lvlOverride>
   </w:num>
-  <w:num w:numId="15" w16cid:durableId="1138105425">
+  <w:num w:numId="15" w16cid:durableId="869883047">
     <w:abstractNumId w:val="0"/>
     <w:lvlOverride w:ilvl="0">
       <w:startOverride w:val="1"/>
     </w:lvlOverride>
   </w:num>
-  <w:num w:numId="16" w16cid:durableId="122892057">
+  <w:num w:numId="16" w16cid:durableId="1336494319">
     <w:abstractNumId w:val="0"/>
     <w:lvlOverride w:ilvl="0">
       <w:startOverride w:val="1"/>

</xml_diff>

<commit_message>
Relatório: imagens e esquemas pedidos na avaliação formativa já foram atendidos
O que as pessoas viram nas conversas foi uma demonstração inicial; o app
desenvolvido depois já traz as imagens e os esquemas melhores que elas
pediram. Saem a pendência na seção 4.6, nas limitações e nos trabalhos
futuros.
</commit_message>
<xml_diff>
--- a/relatorio/Relatorio_Final_PIBIC_BioquimicaEDU.docx
+++ b/relatorio/Relatorio_Final_PIBIC_BioquimicaEDU.docx
@@ -329,7 +329,7 @@
     <w:sdt>
       <w:sdtPr>
         <w:alias w:val="LISTA DE FIGURAS"/>
-        <w:id w:val="-1359577241"/>
+        <w:id w:val="76865456"/>
       </w:sdtPr>
       <w:sdtEndPr/>
       <w:sdtContent>
@@ -355,7 +355,7 @@
           <w:r>
             <w:fldChar w:fldCharType="separate"/>
           </w:r>
-          <w:hyperlink w:anchor="_Toc243302147" w:history="1">
+          <w:hyperlink w:anchor="_Toc243416738" w:history="1">
             <w:r>
               <w:rPr>
                 <w:rStyle w:val="Hyperlink"/>
@@ -379,7 +379,7 @@
               <w:rPr>
                 <w:noProof/>
               </w:rPr>
-              <w:instrText xml:space="preserve"> PAGEREF _Toc243302147 \h </w:instrText>
+              <w:instrText xml:space="preserve"> PAGEREF _Toc243416738 \h </w:instrText>
             </w:r>
             <w:r>
               <w:rPr>
@@ -419,7 +419,7 @@
               <w14:ligatures w14:val="standardContextual"/>
             </w:rPr>
           </w:pPr>
-          <w:hyperlink w:anchor="_Toc243302148" w:history="1">
+          <w:hyperlink w:anchor="_Toc243416739" w:history="1">
             <w:r>
               <w:rPr>
                 <w:rStyle w:val="Hyperlink"/>
@@ -443,7 +443,7 @@
               <w:rPr>
                 <w:noProof/>
               </w:rPr>
-              <w:instrText xml:space="preserve"> PAGEREF _Toc243302148 \h </w:instrText>
+              <w:instrText xml:space="preserve"> PAGEREF _Toc243416739 \h </w:instrText>
             </w:r>
             <w:r>
               <w:rPr>
@@ -483,7 +483,7 @@
               <w14:ligatures w14:val="standardContextual"/>
             </w:rPr>
           </w:pPr>
-          <w:hyperlink w:anchor="_Toc243302149" w:history="1">
+          <w:hyperlink w:anchor="_Toc243416740" w:history="1">
             <w:r>
               <w:rPr>
                 <w:rStyle w:val="Hyperlink"/>
@@ -507,7 +507,7 @@
               <w:rPr>
                 <w:noProof/>
               </w:rPr>
-              <w:instrText xml:space="preserve"> PAGEREF _Toc243302149 \h </w:instrText>
+              <w:instrText xml:space="preserve"> PAGEREF _Toc243416740 \h </w:instrText>
             </w:r>
             <w:r>
               <w:rPr>
@@ -547,7 +547,7 @@
               <w14:ligatures w14:val="standardContextual"/>
             </w:rPr>
           </w:pPr>
-          <w:hyperlink w:anchor="_Toc243302150" w:history="1">
+          <w:hyperlink w:anchor="_Toc243416741" w:history="1">
             <w:r>
               <w:rPr>
                 <w:rStyle w:val="Hyperlink"/>
@@ -587,7 +587,7 @@
               <w:rPr>
                 <w:noProof/>
               </w:rPr>
-              <w:instrText xml:space="preserve"> PAGEREF _Toc243302150 \h </w:instrText>
+              <w:instrText xml:space="preserve"> PAGEREF _Toc243416741 \h </w:instrText>
             </w:r>
             <w:r>
               <w:rPr>
@@ -627,7 +627,7 @@
               <w14:ligatures w14:val="standardContextual"/>
             </w:rPr>
           </w:pPr>
-          <w:hyperlink w:anchor="_Toc243302151" w:history="1">
+          <w:hyperlink w:anchor="_Toc243416742" w:history="1">
             <w:r>
               <w:rPr>
                 <w:rStyle w:val="Hyperlink"/>
@@ -651,7 +651,7 @@
               <w:rPr>
                 <w:noProof/>
               </w:rPr>
-              <w:instrText xml:space="preserve"> PAGEREF _Toc243302151 \h </w:instrText>
+              <w:instrText xml:space="preserve"> PAGEREF _Toc243416742 \h </w:instrText>
             </w:r>
             <w:r>
               <w:rPr>
@@ -691,7 +691,7 @@
               <w14:ligatures w14:val="standardContextual"/>
             </w:rPr>
           </w:pPr>
-          <w:hyperlink w:anchor="_Toc243302152" w:history="1">
+          <w:hyperlink w:anchor="_Toc243416743" w:history="1">
             <w:r>
               <w:rPr>
                 <w:rStyle w:val="Hyperlink"/>
@@ -715,7 +715,7 @@
               <w:rPr>
                 <w:noProof/>
               </w:rPr>
-              <w:instrText xml:space="preserve"> PAGEREF _Toc243302152 \h </w:instrText>
+              <w:instrText xml:space="preserve"> PAGEREF _Toc243416743 \h </w:instrText>
             </w:r>
             <w:r>
               <w:rPr>
@@ -755,7 +755,7 @@
               <w14:ligatures w14:val="standardContextual"/>
             </w:rPr>
           </w:pPr>
-          <w:hyperlink w:anchor="_Toc243302153" w:history="1">
+          <w:hyperlink w:anchor="_Toc243416744" w:history="1">
             <w:r>
               <w:rPr>
                 <w:rStyle w:val="Hyperlink"/>
@@ -779,7 +779,7 @@
               <w:rPr>
                 <w:noProof/>
               </w:rPr>
-              <w:instrText xml:space="preserve"> PAGEREF _Toc243302153 \h </w:instrText>
+              <w:instrText xml:space="preserve"> PAGEREF _Toc243416744 \h </w:instrText>
             </w:r>
             <w:r>
               <w:rPr>
@@ -819,7 +819,7 @@
               <w14:ligatures w14:val="standardContextual"/>
             </w:rPr>
           </w:pPr>
-          <w:hyperlink w:anchor="_Toc243302154" w:history="1">
+          <w:hyperlink w:anchor="_Toc243416745" w:history="1">
             <w:r>
               <w:rPr>
                 <w:rStyle w:val="Hyperlink"/>
@@ -843,7 +843,7 @@
               <w:rPr>
                 <w:noProof/>
               </w:rPr>
-              <w:instrText xml:space="preserve"> PAGEREF _Toc243302154 \h </w:instrText>
+              <w:instrText xml:space="preserve"> PAGEREF _Toc243416745 \h </w:instrText>
             </w:r>
             <w:r>
               <w:rPr>
@@ -883,7 +883,7 @@
               <w14:ligatures w14:val="standardContextual"/>
             </w:rPr>
           </w:pPr>
-          <w:hyperlink w:anchor="_Toc243302155" w:history="1">
+          <w:hyperlink w:anchor="_Toc243416746" w:history="1">
             <w:r>
               <w:rPr>
                 <w:rStyle w:val="Hyperlink"/>
@@ -907,7 +907,7 @@
               <w:rPr>
                 <w:noProof/>
               </w:rPr>
-              <w:instrText xml:space="preserve"> PAGEREF _Toc243302155 \h </w:instrText>
+              <w:instrText xml:space="preserve"> PAGEREF _Toc243416746 \h </w:instrText>
             </w:r>
             <w:r>
               <w:rPr>
@@ -947,7 +947,7 @@
               <w14:ligatures w14:val="standardContextual"/>
             </w:rPr>
           </w:pPr>
-          <w:hyperlink w:anchor="_Toc243302156" w:history="1">
+          <w:hyperlink w:anchor="_Toc243416747" w:history="1">
             <w:r>
               <w:rPr>
                 <w:rStyle w:val="Hyperlink"/>
@@ -971,7 +971,7 @@
               <w:rPr>
                 <w:noProof/>
               </w:rPr>
-              <w:instrText xml:space="preserve"> PAGEREF _Toc243302156 \h </w:instrText>
+              <w:instrText xml:space="preserve"> PAGEREF _Toc243416747 \h </w:instrText>
             </w:r>
             <w:r>
               <w:rPr>
@@ -1011,7 +1011,7 @@
               <w14:ligatures w14:val="standardContextual"/>
             </w:rPr>
           </w:pPr>
-          <w:hyperlink w:anchor="_Toc243302157" w:history="1">
+          <w:hyperlink w:anchor="_Toc243416748" w:history="1">
             <w:r>
               <w:rPr>
                 <w:rStyle w:val="Hyperlink"/>
@@ -1035,7 +1035,7 @@
               <w:rPr>
                 <w:noProof/>
               </w:rPr>
-              <w:instrText xml:space="preserve"> PAGEREF _Toc243302157 \h </w:instrText>
+              <w:instrText xml:space="preserve"> PAGEREF _Toc243416748 \h </w:instrText>
             </w:r>
             <w:r>
               <w:rPr>
@@ -1075,7 +1075,7 @@
               <w14:ligatures w14:val="standardContextual"/>
             </w:rPr>
           </w:pPr>
-          <w:hyperlink w:anchor="_Toc243302158" w:history="1">
+          <w:hyperlink w:anchor="_Toc243416749" w:history="1">
             <w:r>
               <w:rPr>
                 <w:rStyle w:val="Hyperlink"/>
@@ -1099,7 +1099,7 @@
               <w:rPr>
                 <w:noProof/>
               </w:rPr>
-              <w:instrText xml:space="preserve"> PAGEREF _Toc243302158 \h </w:instrText>
+              <w:instrText xml:space="preserve"> PAGEREF _Toc243416749 \h </w:instrText>
             </w:r>
             <w:r>
               <w:rPr>
@@ -1144,7 +1144,7 @@
     <w:sdt>
       <w:sdtPr>
         <w:alias w:val="LISTA DE QUADROS"/>
-        <w:id w:val="-271476238"/>
+        <w:id w:val="-1036962502"/>
       </w:sdtPr>
       <w:sdtEndPr/>
       <w:sdtContent>
@@ -1170,7 +1170,7 @@
           <w:r>
             <w:fldChar w:fldCharType="separate"/>
           </w:r>
-          <w:hyperlink w:anchor="_Toc243302159" w:history="1">
+          <w:hyperlink w:anchor="_Toc243416750" w:history="1">
             <w:r>
               <w:rPr>
                 <w:rStyle w:val="Hyperlink"/>
@@ -1194,7 +1194,7 @@
               <w:rPr>
                 <w:noProof/>
               </w:rPr>
-              <w:instrText xml:space="preserve"> PAGEREF _Toc243302159 \h </w:instrText>
+              <w:instrText xml:space="preserve"> PAGEREF _Toc243416750 \h </w:instrText>
             </w:r>
             <w:r>
               <w:rPr>
@@ -1234,7 +1234,7 @@
               <w14:ligatures w14:val="standardContextual"/>
             </w:rPr>
           </w:pPr>
-          <w:hyperlink w:anchor="_Toc243302160" w:history="1">
+          <w:hyperlink w:anchor="_Toc243416751" w:history="1">
             <w:r>
               <w:rPr>
                 <w:rStyle w:val="Hyperlink"/>
@@ -1258,7 +1258,7 @@
               <w:rPr>
                 <w:noProof/>
               </w:rPr>
-              <w:instrText xml:space="preserve"> PAGEREF _Toc243302160 \h </w:instrText>
+              <w:instrText xml:space="preserve"> PAGEREF _Toc243416751 \h </w:instrText>
             </w:r>
             <w:r>
               <w:rPr>
@@ -1298,7 +1298,7 @@
               <w14:ligatures w14:val="standardContextual"/>
             </w:rPr>
           </w:pPr>
-          <w:hyperlink w:anchor="_Toc243302161" w:history="1">
+          <w:hyperlink w:anchor="_Toc243416752" w:history="1">
             <w:r>
               <w:rPr>
                 <w:rStyle w:val="Hyperlink"/>
@@ -1322,7 +1322,7 @@
               <w:rPr>
                 <w:noProof/>
               </w:rPr>
-              <w:instrText xml:space="preserve"> PAGEREF _Toc243302161 \h </w:instrText>
+              <w:instrText xml:space="preserve"> PAGEREF _Toc243416752 \h </w:instrText>
             </w:r>
             <w:r>
               <w:rPr>
@@ -1362,7 +1362,7 @@
               <w14:ligatures w14:val="standardContextual"/>
             </w:rPr>
           </w:pPr>
-          <w:hyperlink w:anchor="_Toc243302162" w:history="1">
+          <w:hyperlink w:anchor="_Toc243416753" w:history="1">
             <w:r>
               <w:rPr>
                 <w:rStyle w:val="Hyperlink"/>
@@ -1386,7 +1386,7 @@
               <w:rPr>
                 <w:noProof/>
               </w:rPr>
-              <w:instrText xml:space="preserve"> PAGEREF _Toc243302162 \h </w:instrText>
+              <w:instrText xml:space="preserve"> PAGEREF _Toc243416753 \h </w:instrText>
             </w:r>
             <w:r>
               <w:rPr>
@@ -1426,7 +1426,7 @@
               <w14:ligatures w14:val="standardContextual"/>
             </w:rPr>
           </w:pPr>
-          <w:hyperlink w:anchor="_Toc243302163" w:history="1">
+          <w:hyperlink w:anchor="_Toc243416754" w:history="1">
             <w:r>
               <w:rPr>
                 <w:rStyle w:val="Hyperlink"/>
@@ -1450,7 +1450,7 @@
               <w:rPr>
                 <w:noProof/>
               </w:rPr>
-              <w:instrText xml:space="preserve"> PAGEREF _Toc243302163 \h </w:instrText>
+              <w:instrText xml:space="preserve"> PAGEREF _Toc243416754 \h </w:instrText>
             </w:r>
             <w:r>
               <w:rPr>
@@ -1490,7 +1490,7 @@
               <w14:ligatures w14:val="standardContextual"/>
             </w:rPr>
           </w:pPr>
-          <w:hyperlink w:anchor="_Toc243302164" w:history="1">
+          <w:hyperlink w:anchor="_Toc243416755" w:history="1">
             <w:r>
               <w:rPr>
                 <w:rStyle w:val="Hyperlink"/>
@@ -1514,7 +1514,7 @@
               <w:rPr>
                 <w:noProof/>
               </w:rPr>
-              <w:instrText xml:space="preserve"> PAGEREF _Toc243302164 \h </w:instrText>
+              <w:instrText xml:space="preserve"> PAGEREF _Toc243416755 \h </w:instrText>
             </w:r>
             <w:r>
               <w:rPr>
@@ -1554,7 +1554,7 @@
               <w14:ligatures w14:val="standardContextual"/>
             </w:rPr>
           </w:pPr>
-          <w:hyperlink w:anchor="_Toc243302165" w:history="1">
+          <w:hyperlink w:anchor="_Toc243416756" w:history="1">
             <w:r>
               <w:rPr>
                 <w:rStyle w:val="Hyperlink"/>
@@ -1578,7 +1578,7 @@
               <w:rPr>
                 <w:noProof/>
               </w:rPr>
-              <w:instrText xml:space="preserve"> PAGEREF _Toc243302165 \h </w:instrText>
+              <w:instrText xml:space="preserve"> PAGEREF _Toc243416756 \h </w:instrText>
             </w:r>
             <w:r>
               <w:rPr>
@@ -1623,7 +1623,7 @@
     <w:sdt>
       <w:sdtPr>
         <w:alias w:val="LISTA DE TABELAS"/>
-        <w:id w:val="980434309"/>
+        <w:id w:val="999389164"/>
       </w:sdtPr>
       <w:sdtEndPr/>
       <w:sdtContent>
@@ -1649,7 +1649,7 @@
           <w:r>
             <w:fldChar w:fldCharType="separate"/>
           </w:r>
-          <w:hyperlink w:anchor="_Toc243302166" w:history="1">
+          <w:hyperlink w:anchor="_Toc243416757" w:history="1">
             <w:r>
               <w:rPr>
                 <w:rStyle w:val="Hyperlink"/>
@@ -1673,7 +1673,7 @@
               <w:rPr>
                 <w:noProof/>
               </w:rPr>
-              <w:instrText xml:space="preserve"> PAGEREF _Toc243302166 \h </w:instrText>
+              <w:instrText xml:space="preserve"> PAGEREF _Toc243416757 \h </w:instrText>
             </w:r>
             <w:r>
               <w:rPr>
@@ -1713,7 +1713,7 @@
               <w14:ligatures w14:val="standardContextual"/>
             </w:rPr>
           </w:pPr>
-          <w:hyperlink w:anchor="_Toc243302167" w:history="1">
+          <w:hyperlink w:anchor="_Toc243416758" w:history="1">
             <w:r>
               <w:rPr>
                 <w:rStyle w:val="Hyperlink"/>
@@ -1737,7 +1737,7 @@
               <w:rPr>
                 <w:noProof/>
               </w:rPr>
-              <w:instrText xml:space="preserve"> PAGEREF _Toc243302167 \h </w:instrText>
+              <w:instrText xml:space="preserve"> PAGEREF _Toc243416758 \h </w:instrText>
             </w:r>
             <w:r>
               <w:rPr>
@@ -1777,7 +1777,7 @@
               <w14:ligatures w14:val="standardContextual"/>
             </w:rPr>
           </w:pPr>
-          <w:hyperlink w:anchor="_Toc243302168" w:history="1">
+          <w:hyperlink w:anchor="_Toc243416759" w:history="1">
             <w:r>
               <w:rPr>
                 <w:rStyle w:val="Hyperlink"/>
@@ -1801,7 +1801,7 @@
               <w:rPr>
                 <w:noProof/>
               </w:rPr>
-              <w:instrText xml:space="preserve"> PAGEREF _Toc243302168 \h </w:instrText>
+              <w:instrText xml:space="preserve"> PAGEREF _Toc243416759 \h </w:instrText>
             </w:r>
             <w:r>
               <w:rPr>
@@ -1841,7 +1841,7 @@
               <w14:ligatures w14:val="standardContextual"/>
             </w:rPr>
           </w:pPr>
-          <w:hyperlink w:anchor="_Toc243302169" w:history="1">
+          <w:hyperlink w:anchor="_Toc243416760" w:history="1">
             <w:r>
               <w:rPr>
                 <w:rStyle w:val="Hyperlink"/>
@@ -1865,7 +1865,7 @@
               <w:rPr>
                 <w:noProof/>
               </w:rPr>
-              <w:instrText xml:space="preserve"> PAGEREF _Toc243302169 \h </w:instrText>
+              <w:instrText xml:space="preserve"> PAGEREF _Toc243416760 \h </w:instrText>
             </w:r>
             <w:r>
               <w:rPr>
@@ -1905,7 +1905,7 @@
               <w14:ligatures w14:val="standardContextual"/>
             </w:rPr>
           </w:pPr>
-          <w:hyperlink w:anchor="_Toc243302170" w:history="1">
+          <w:hyperlink w:anchor="_Toc243416761" w:history="1">
             <w:r>
               <w:rPr>
                 <w:rStyle w:val="Hyperlink"/>
@@ -1929,7 +1929,7 @@
               <w:rPr>
                 <w:noProof/>
               </w:rPr>
-              <w:instrText xml:space="preserve"> PAGEREF _Toc243302170 \h </w:instrText>
+              <w:instrText xml:space="preserve"> PAGEREF _Toc243416761 \h </w:instrText>
             </w:r>
             <w:r>
               <w:rPr>
@@ -2532,7 +2532,7 @@
           <w:bCs w:val="0"/>
         </w:rPr>
         <w:alias w:val="Sumário"/>
-        <w:id w:val="1652401318"/>
+        <w:id w:val="-295449585"/>
       </w:sdtPr>
       <w:sdtEndPr/>
       <w:sdtContent>
@@ -2560,7 +2560,7 @@
           <w:r>
             <w:fldChar w:fldCharType="separate"/>
           </w:r>
-          <w:hyperlink w:anchor="_Toc243302101" w:history="1">
+          <w:hyperlink w:anchor="_Toc243416692" w:history="1">
             <w:r>
               <w:rPr>
                 <w:rStyle w:val="Hyperlink"/>
@@ -2584,7 +2584,7 @@
               <w:rPr>
                 <w:noProof/>
               </w:rPr>
-              <w:instrText xml:space="preserve"> PAGEREF _Toc243302101 \h </w:instrText>
+              <w:instrText xml:space="preserve"> PAGEREF _Toc243416692 \h </w:instrText>
             </w:r>
             <w:r>
               <w:rPr>
@@ -2624,7 +2624,7 @@
               <w14:ligatures w14:val="standardContextual"/>
             </w:rPr>
           </w:pPr>
-          <w:hyperlink w:anchor="_Toc243302102" w:history="1">
+          <w:hyperlink w:anchor="_Toc243416693" w:history="1">
             <w:r>
               <w:rPr>
                 <w:rStyle w:val="Hyperlink"/>
@@ -2648,7 +2648,7 @@
               <w:rPr>
                 <w:noProof/>
               </w:rPr>
-              <w:instrText xml:space="preserve"> PAGEREF _Toc243302102 \h </w:instrText>
+              <w:instrText xml:space="preserve"> PAGEREF _Toc243416693 \h </w:instrText>
             </w:r>
             <w:r>
               <w:rPr>
@@ -2688,7 +2688,7 @@
               <w14:ligatures w14:val="standardContextual"/>
             </w:rPr>
           </w:pPr>
-          <w:hyperlink w:anchor="_Toc243302103" w:history="1">
+          <w:hyperlink w:anchor="_Toc243416694" w:history="1">
             <w:r>
               <w:rPr>
                 <w:rStyle w:val="Hyperlink"/>
@@ -2712,7 +2712,7 @@
               <w:rPr>
                 <w:noProof/>
               </w:rPr>
-              <w:instrText xml:space="preserve"> PAGEREF _Toc243302103 \h </w:instrText>
+              <w:instrText xml:space="preserve"> PAGEREF _Toc243416694 \h </w:instrText>
             </w:r>
             <w:r>
               <w:rPr>
@@ -2752,7 +2752,7 @@
               <w14:ligatures w14:val="standardContextual"/>
             </w:rPr>
           </w:pPr>
-          <w:hyperlink w:anchor="_Toc243302104" w:history="1">
+          <w:hyperlink w:anchor="_Toc243416695" w:history="1">
             <w:r>
               <w:rPr>
                 <w:rStyle w:val="Hyperlink"/>
@@ -2776,7 +2776,7 @@
               <w:rPr>
                 <w:noProof/>
               </w:rPr>
-              <w:instrText xml:space="preserve"> PAGEREF _Toc243302104 \h </w:instrText>
+              <w:instrText xml:space="preserve"> PAGEREF _Toc243416695 \h </w:instrText>
             </w:r>
             <w:r>
               <w:rPr>
@@ -2816,7 +2816,7 @@
               <w14:ligatures w14:val="standardContextual"/>
             </w:rPr>
           </w:pPr>
-          <w:hyperlink w:anchor="_Toc243302105" w:history="1">
+          <w:hyperlink w:anchor="_Toc243416696" w:history="1">
             <w:r>
               <w:rPr>
                 <w:rStyle w:val="Hyperlink"/>
@@ -2840,7 +2840,7 @@
               <w:rPr>
                 <w:noProof/>
               </w:rPr>
-              <w:instrText xml:space="preserve"> PAGEREF _Toc243302105 \h </w:instrText>
+              <w:instrText xml:space="preserve"> PAGEREF _Toc243416696 \h </w:instrText>
             </w:r>
             <w:r>
               <w:rPr>
@@ -2882,7 +2882,7 @@
               <w14:ligatures w14:val="standardContextual"/>
             </w:rPr>
           </w:pPr>
-          <w:hyperlink w:anchor="_Toc243302106" w:history="1">
+          <w:hyperlink w:anchor="_Toc243416697" w:history="1">
             <w:r>
               <w:rPr>
                 <w:rStyle w:val="Hyperlink"/>
@@ -2906,7 +2906,7 @@
               <w:rPr>
                 <w:noProof/>
               </w:rPr>
-              <w:instrText xml:space="preserve"> PAGEREF _Toc243302106 \h </w:instrText>
+              <w:instrText xml:space="preserve"> PAGEREF _Toc243416697 \h </w:instrText>
             </w:r>
             <w:r>
               <w:rPr>
@@ -2946,7 +2946,7 @@
               <w14:ligatures w14:val="standardContextual"/>
             </w:rPr>
           </w:pPr>
-          <w:hyperlink w:anchor="_Toc243302107" w:history="1">
+          <w:hyperlink w:anchor="_Toc243416698" w:history="1">
             <w:r>
               <w:rPr>
                 <w:rStyle w:val="Hyperlink"/>
@@ -2970,7 +2970,7 @@
               <w:rPr>
                 <w:noProof/>
               </w:rPr>
-              <w:instrText xml:space="preserve"> PAGEREF _Toc243302107 \h </w:instrText>
+              <w:instrText xml:space="preserve"> PAGEREF _Toc243416698 \h </w:instrText>
             </w:r>
             <w:r>
               <w:rPr>
@@ -3010,7 +3010,7 @@
               <w14:ligatures w14:val="standardContextual"/>
             </w:rPr>
           </w:pPr>
-          <w:hyperlink w:anchor="_Toc243302108" w:history="1">
+          <w:hyperlink w:anchor="_Toc243416699" w:history="1">
             <w:r>
               <w:rPr>
                 <w:rStyle w:val="Hyperlink"/>
@@ -3034,7 +3034,7 @@
               <w:rPr>
                 <w:noProof/>
               </w:rPr>
-              <w:instrText xml:space="preserve"> PAGEREF _Toc243302108 \h </w:instrText>
+              <w:instrText xml:space="preserve"> PAGEREF _Toc243416699 \h </w:instrText>
             </w:r>
             <w:r>
               <w:rPr>
@@ -3074,7 +3074,7 @@
               <w14:ligatures w14:val="standardContextual"/>
             </w:rPr>
           </w:pPr>
-          <w:hyperlink w:anchor="_Toc243302109" w:history="1">
+          <w:hyperlink w:anchor="_Toc243416700" w:history="1">
             <w:r>
               <w:rPr>
                 <w:rStyle w:val="Hyperlink"/>
@@ -3098,7 +3098,7 @@
               <w:rPr>
                 <w:noProof/>
               </w:rPr>
-              <w:instrText xml:space="preserve"> PAGEREF _Toc243302109 \h </w:instrText>
+              <w:instrText xml:space="preserve"> PAGEREF _Toc243416700 \h </w:instrText>
             </w:r>
             <w:r>
               <w:rPr>
@@ -3138,7 +3138,7 @@
               <w14:ligatures w14:val="standardContextual"/>
             </w:rPr>
           </w:pPr>
-          <w:hyperlink w:anchor="_Toc243302110" w:history="1">
+          <w:hyperlink w:anchor="_Toc243416701" w:history="1">
             <w:r>
               <w:rPr>
                 <w:rStyle w:val="Hyperlink"/>
@@ -3162,7 +3162,7 @@
               <w:rPr>
                 <w:noProof/>
               </w:rPr>
-              <w:instrText xml:space="preserve"> PAGEREF _Toc243302110 \h </w:instrText>
+              <w:instrText xml:space="preserve"> PAGEREF _Toc243416701 \h </w:instrText>
             </w:r>
             <w:r>
               <w:rPr>
@@ -3202,7 +3202,7 @@
               <w14:ligatures w14:val="standardContextual"/>
             </w:rPr>
           </w:pPr>
-          <w:hyperlink w:anchor="_Toc243302111" w:history="1">
+          <w:hyperlink w:anchor="_Toc243416702" w:history="1">
             <w:r>
               <w:rPr>
                 <w:rStyle w:val="Hyperlink"/>
@@ -3226,7 +3226,7 @@
               <w:rPr>
                 <w:noProof/>
               </w:rPr>
-              <w:instrText xml:space="preserve"> PAGEREF _Toc243302111 \h </w:instrText>
+              <w:instrText xml:space="preserve"> PAGEREF _Toc243416702 \h </w:instrText>
             </w:r>
             <w:r>
               <w:rPr>
@@ -3268,7 +3268,7 @@
               <w14:ligatures w14:val="standardContextual"/>
             </w:rPr>
           </w:pPr>
-          <w:hyperlink w:anchor="_Toc243302112" w:history="1">
+          <w:hyperlink w:anchor="_Toc243416703" w:history="1">
             <w:r>
               <w:rPr>
                 <w:rStyle w:val="Hyperlink"/>
@@ -3292,7 +3292,7 @@
               <w:rPr>
                 <w:noProof/>
               </w:rPr>
-              <w:instrText xml:space="preserve"> PAGEREF _Toc243302112 \h </w:instrText>
+              <w:instrText xml:space="preserve"> PAGEREF _Toc243416703 \h </w:instrText>
             </w:r>
             <w:r>
               <w:rPr>
@@ -3332,7 +3332,7 @@
               <w14:ligatures w14:val="standardContextual"/>
             </w:rPr>
           </w:pPr>
-          <w:hyperlink w:anchor="_Toc243302113" w:history="1">
+          <w:hyperlink w:anchor="_Toc243416704" w:history="1">
             <w:r>
               <w:rPr>
                 <w:rStyle w:val="Hyperlink"/>
@@ -3356,7 +3356,7 @@
               <w:rPr>
                 <w:noProof/>
               </w:rPr>
-              <w:instrText xml:space="preserve"> PAGEREF _Toc243302113 \h </w:instrText>
+              <w:instrText xml:space="preserve"> PAGEREF _Toc243416704 \h </w:instrText>
             </w:r>
             <w:r>
               <w:rPr>
@@ -3396,7 +3396,7 @@
               <w14:ligatures w14:val="standardContextual"/>
             </w:rPr>
           </w:pPr>
-          <w:hyperlink w:anchor="_Toc243302114" w:history="1">
+          <w:hyperlink w:anchor="_Toc243416705" w:history="1">
             <w:r>
               <w:rPr>
                 <w:rStyle w:val="Hyperlink"/>
@@ -3420,7 +3420,7 @@
               <w:rPr>
                 <w:noProof/>
               </w:rPr>
-              <w:instrText xml:space="preserve"> PAGEREF _Toc243302114 \h </w:instrText>
+              <w:instrText xml:space="preserve"> PAGEREF _Toc243416705 \h </w:instrText>
             </w:r>
             <w:r>
               <w:rPr>
@@ -3460,7 +3460,7 @@
               <w14:ligatures w14:val="standardContextual"/>
             </w:rPr>
           </w:pPr>
-          <w:hyperlink w:anchor="_Toc243302115" w:history="1">
+          <w:hyperlink w:anchor="_Toc243416706" w:history="1">
             <w:r>
               <w:rPr>
                 <w:rStyle w:val="Hyperlink"/>
@@ -3484,7 +3484,7 @@
               <w:rPr>
                 <w:noProof/>
               </w:rPr>
-              <w:instrText xml:space="preserve"> PAGEREF _Toc243302115 \h </w:instrText>
+              <w:instrText xml:space="preserve"> PAGEREF _Toc243416706 \h </w:instrText>
             </w:r>
             <w:r>
               <w:rPr>
@@ -3524,7 +3524,7 @@
               <w14:ligatures w14:val="standardContextual"/>
             </w:rPr>
           </w:pPr>
-          <w:hyperlink w:anchor="_Toc243302116" w:history="1">
+          <w:hyperlink w:anchor="_Toc243416707" w:history="1">
             <w:r>
               <w:rPr>
                 <w:rStyle w:val="Hyperlink"/>
@@ -3548,7 +3548,7 @@
               <w:rPr>
                 <w:noProof/>
               </w:rPr>
-              <w:instrText xml:space="preserve"> PAGEREF _Toc243302116 \h </w:instrText>
+              <w:instrText xml:space="preserve"> PAGEREF _Toc243416707 \h </w:instrText>
             </w:r>
             <w:r>
               <w:rPr>
@@ -3588,7 +3588,7 @@
               <w14:ligatures w14:val="standardContextual"/>
             </w:rPr>
           </w:pPr>
-          <w:hyperlink w:anchor="_Toc243302117" w:history="1">
+          <w:hyperlink w:anchor="_Toc243416708" w:history="1">
             <w:r>
               <w:rPr>
                 <w:rStyle w:val="Hyperlink"/>
@@ -3612,7 +3612,7 @@
               <w:rPr>
                 <w:noProof/>
               </w:rPr>
-              <w:instrText xml:space="preserve"> PAGEREF _Toc243302117 \h </w:instrText>
+              <w:instrText xml:space="preserve"> PAGEREF _Toc243416708 \h </w:instrText>
             </w:r>
             <w:r>
               <w:rPr>
@@ -3652,7 +3652,7 @@
               <w14:ligatures w14:val="standardContextual"/>
             </w:rPr>
           </w:pPr>
-          <w:hyperlink w:anchor="_Toc243302118" w:history="1">
+          <w:hyperlink w:anchor="_Toc243416709" w:history="1">
             <w:r>
               <w:rPr>
                 <w:rStyle w:val="Hyperlink"/>
@@ -3676,7 +3676,7 @@
               <w:rPr>
                 <w:noProof/>
               </w:rPr>
-              <w:instrText xml:space="preserve"> PAGEREF _Toc243302118 \h </w:instrText>
+              <w:instrText xml:space="preserve"> PAGEREF _Toc243416709 \h </w:instrText>
             </w:r>
             <w:r>
               <w:rPr>
@@ -3716,7 +3716,7 @@
               <w14:ligatures w14:val="standardContextual"/>
             </w:rPr>
           </w:pPr>
-          <w:hyperlink w:anchor="_Toc243302119" w:history="1">
+          <w:hyperlink w:anchor="_Toc243416710" w:history="1">
             <w:r>
               <w:rPr>
                 <w:rStyle w:val="Hyperlink"/>
@@ -3740,7 +3740,7 @@
               <w:rPr>
                 <w:noProof/>
               </w:rPr>
-              <w:instrText xml:space="preserve"> PAGEREF _Toc243302119 \h </w:instrText>
+              <w:instrText xml:space="preserve"> PAGEREF _Toc243416710 \h </w:instrText>
             </w:r>
             <w:r>
               <w:rPr>
@@ -3780,7 +3780,7 @@
               <w14:ligatures w14:val="standardContextual"/>
             </w:rPr>
           </w:pPr>
-          <w:hyperlink w:anchor="_Toc243302120" w:history="1">
+          <w:hyperlink w:anchor="_Toc243416711" w:history="1">
             <w:r>
               <w:rPr>
                 <w:rStyle w:val="Hyperlink"/>
@@ -3804,7 +3804,7 @@
               <w:rPr>
                 <w:noProof/>
               </w:rPr>
-              <w:instrText xml:space="preserve"> PAGEREF _Toc243302120 \h </w:instrText>
+              <w:instrText xml:space="preserve"> PAGEREF _Toc243416711 \h </w:instrText>
             </w:r>
             <w:r>
               <w:rPr>
@@ -3844,7 +3844,7 @@
               <w14:ligatures w14:val="standardContextual"/>
             </w:rPr>
           </w:pPr>
-          <w:hyperlink w:anchor="_Toc243302121" w:history="1">
+          <w:hyperlink w:anchor="_Toc243416712" w:history="1">
             <w:r>
               <w:rPr>
                 <w:rStyle w:val="Hyperlink"/>
@@ -3868,7 +3868,7 @@
               <w:rPr>
                 <w:noProof/>
               </w:rPr>
-              <w:instrText xml:space="preserve"> PAGEREF _Toc243302121 \h </w:instrText>
+              <w:instrText xml:space="preserve"> PAGEREF _Toc243416712 \h </w:instrText>
             </w:r>
             <w:r>
               <w:rPr>
@@ -3908,7 +3908,7 @@
               <w14:ligatures w14:val="standardContextual"/>
             </w:rPr>
           </w:pPr>
-          <w:hyperlink w:anchor="_Toc243302122" w:history="1">
+          <w:hyperlink w:anchor="_Toc243416713" w:history="1">
             <w:r>
               <w:rPr>
                 <w:rStyle w:val="Hyperlink"/>
@@ -3932,7 +3932,7 @@
               <w:rPr>
                 <w:noProof/>
               </w:rPr>
-              <w:instrText xml:space="preserve"> PAGEREF _Toc243302122 \h </w:instrText>
+              <w:instrText xml:space="preserve"> PAGEREF _Toc243416713 \h </w:instrText>
             </w:r>
             <w:r>
               <w:rPr>
@@ -3972,7 +3972,7 @@
               <w14:ligatures w14:val="standardContextual"/>
             </w:rPr>
           </w:pPr>
-          <w:hyperlink w:anchor="_Toc243302123" w:history="1">
+          <w:hyperlink w:anchor="_Toc243416714" w:history="1">
             <w:r>
               <w:rPr>
                 <w:rStyle w:val="Hyperlink"/>
@@ -3996,7 +3996,7 @@
               <w:rPr>
                 <w:noProof/>
               </w:rPr>
-              <w:instrText xml:space="preserve"> PAGEREF _Toc243302123 \h </w:instrText>
+              <w:instrText xml:space="preserve"> PAGEREF _Toc243416714 \h </w:instrText>
             </w:r>
             <w:r>
               <w:rPr>
@@ -4038,7 +4038,7 @@
               <w14:ligatures w14:val="standardContextual"/>
             </w:rPr>
           </w:pPr>
-          <w:hyperlink w:anchor="_Toc243302124" w:history="1">
+          <w:hyperlink w:anchor="_Toc243416715" w:history="1">
             <w:r>
               <w:rPr>
                 <w:rStyle w:val="Hyperlink"/>
@@ -4062,7 +4062,7 @@
               <w:rPr>
                 <w:noProof/>
               </w:rPr>
-              <w:instrText xml:space="preserve"> PAGEREF _Toc243302124 \h </w:instrText>
+              <w:instrText xml:space="preserve"> PAGEREF _Toc243416715 \h </w:instrText>
             </w:r>
             <w:r>
               <w:rPr>
@@ -4102,7 +4102,7 @@
               <w14:ligatures w14:val="standardContextual"/>
             </w:rPr>
           </w:pPr>
-          <w:hyperlink w:anchor="_Toc243302125" w:history="1">
+          <w:hyperlink w:anchor="_Toc243416716" w:history="1">
             <w:r>
               <w:rPr>
                 <w:rStyle w:val="Hyperlink"/>
@@ -4126,7 +4126,7 @@
               <w:rPr>
                 <w:noProof/>
               </w:rPr>
-              <w:instrText xml:space="preserve"> PAGEREF _Toc243302125 \h </w:instrText>
+              <w:instrText xml:space="preserve"> PAGEREF _Toc243416716 \h </w:instrText>
             </w:r>
             <w:r>
               <w:rPr>
@@ -4166,7 +4166,7 @@
               <w14:ligatures w14:val="standardContextual"/>
             </w:rPr>
           </w:pPr>
-          <w:hyperlink w:anchor="_Toc243302126" w:history="1">
+          <w:hyperlink w:anchor="_Toc243416717" w:history="1">
             <w:r>
               <w:rPr>
                 <w:rStyle w:val="Hyperlink"/>
@@ -4190,7 +4190,7 @@
               <w:rPr>
                 <w:noProof/>
               </w:rPr>
-              <w:instrText xml:space="preserve"> PAGEREF _Toc243302126 \h </w:instrText>
+              <w:instrText xml:space="preserve"> PAGEREF _Toc243416717 \h </w:instrText>
             </w:r>
             <w:r>
               <w:rPr>
@@ -4230,7 +4230,7 @@
               <w14:ligatures w14:val="standardContextual"/>
             </w:rPr>
           </w:pPr>
-          <w:hyperlink w:anchor="_Toc243302127" w:history="1">
+          <w:hyperlink w:anchor="_Toc243416718" w:history="1">
             <w:r>
               <w:rPr>
                 <w:rStyle w:val="Hyperlink"/>
@@ -4254,7 +4254,7 @@
               <w:rPr>
                 <w:noProof/>
               </w:rPr>
-              <w:instrText xml:space="preserve"> PAGEREF _Toc243302127 \h </w:instrText>
+              <w:instrText xml:space="preserve"> PAGEREF _Toc243416718 \h </w:instrText>
             </w:r>
             <w:r>
               <w:rPr>
@@ -4294,7 +4294,7 @@
               <w14:ligatures w14:val="standardContextual"/>
             </w:rPr>
           </w:pPr>
-          <w:hyperlink w:anchor="_Toc243302128" w:history="1">
+          <w:hyperlink w:anchor="_Toc243416719" w:history="1">
             <w:r>
               <w:rPr>
                 <w:rStyle w:val="Hyperlink"/>
@@ -4318,7 +4318,7 @@
               <w:rPr>
                 <w:noProof/>
               </w:rPr>
-              <w:instrText xml:space="preserve"> PAGEREF _Toc243302128 \h </w:instrText>
+              <w:instrText xml:space="preserve"> PAGEREF _Toc243416719 \h </w:instrText>
             </w:r>
             <w:r>
               <w:rPr>
@@ -4358,7 +4358,7 @@
               <w14:ligatures w14:val="standardContextual"/>
             </w:rPr>
           </w:pPr>
-          <w:hyperlink w:anchor="_Toc243302129" w:history="1">
+          <w:hyperlink w:anchor="_Toc243416720" w:history="1">
             <w:r>
               <w:rPr>
                 <w:rStyle w:val="Hyperlink"/>
@@ -4382,7 +4382,7 @@
               <w:rPr>
                 <w:noProof/>
               </w:rPr>
-              <w:instrText xml:space="preserve"> PAGEREF _Toc243302129 \h </w:instrText>
+              <w:instrText xml:space="preserve"> PAGEREF _Toc243416720 \h </w:instrText>
             </w:r>
             <w:r>
               <w:rPr>
@@ -4422,7 +4422,7 @@
               <w14:ligatures w14:val="standardContextual"/>
             </w:rPr>
           </w:pPr>
-          <w:hyperlink w:anchor="_Toc243302130" w:history="1">
+          <w:hyperlink w:anchor="_Toc243416721" w:history="1">
             <w:r>
               <w:rPr>
                 <w:rStyle w:val="Hyperlink"/>
@@ -4446,7 +4446,7 @@
               <w:rPr>
                 <w:noProof/>
               </w:rPr>
-              <w:instrText xml:space="preserve"> PAGEREF _Toc243302130 \h </w:instrText>
+              <w:instrText xml:space="preserve"> PAGEREF _Toc243416721 \h </w:instrText>
             </w:r>
             <w:r>
               <w:rPr>
@@ -4486,7 +4486,7 @@
               <w14:ligatures w14:val="standardContextual"/>
             </w:rPr>
           </w:pPr>
-          <w:hyperlink w:anchor="_Toc243302131" w:history="1">
+          <w:hyperlink w:anchor="_Toc243416722" w:history="1">
             <w:r>
               <w:rPr>
                 <w:rStyle w:val="Hyperlink"/>
@@ -4510,7 +4510,7 @@
               <w:rPr>
                 <w:noProof/>
               </w:rPr>
-              <w:instrText xml:space="preserve"> PAGEREF _Toc243302131 \h </w:instrText>
+              <w:instrText xml:space="preserve"> PAGEREF _Toc243416722 \h </w:instrText>
             </w:r>
             <w:r>
               <w:rPr>
@@ -4550,7 +4550,7 @@
               <w14:ligatures w14:val="standardContextual"/>
             </w:rPr>
           </w:pPr>
-          <w:hyperlink w:anchor="_Toc243302132" w:history="1">
+          <w:hyperlink w:anchor="_Toc243416723" w:history="1">
             <w:r>
               <w:rPr>
                 <w:rStyle w:val="Hyperlink"/>
@@ -4574,7 +4574,7 @@
               <w:rPr>
                 <w:noProof/>
               </w:rPr>
-              <w:instrText xml:space="preserve"> PAGEREF _Toc243302132 \h </w:instrText>
+              <w:instrText xml:space="preserve"> PAGEREF _Toc243416723 \h </w:instrText>
             </w:r>
             <w:r>
               <w:rPr>
@@ -4614,7 +4614,7 @@
               <w14:ligatures w14:val="standardContextual"/>
             </w:rPr>
           </w:pPr>
-          <w:hyperlink w:anchor="_Toc243302133" w:history="1">
+          <w:hyperlink w:anchor="_Toc243416724" w:history="1">
             <w:r>
               <w:rPr>
                 <w:rStyle w:val="Hyperlink"/>
@@ -4638,7 +4638,7 @@
               <w:rPr>
                 <w:noProof/>
               </w:rPr>
-              <w:instrText xml:space="preserve"> PAGEREF _Toc243302133 \h </w:instrText>
+              <w:instrText xml:space="preserve"> PAGEREF _Toc243416724 \h </w:instrText>
             </w:r>
             <w:r>
               <w:rPr>
@@ -4678,7 +4678,7 @@
               <w14:ligatures w14:val="standardContextual"/>
             </w:rPr>
           </w:pPr>
-          <w:hyperlink w:anchor="_Toc243302134" w:history="1">
+          <w:hyperlink w:anchor="_Toc243416725" w:history="1">
             <w:r>
               <w:rPr>
                 <w:rStyle w:val="Hyperlink"/>
@@ -4702,7 +4702,7 @@
               <w:rPr>
                 <w:noProof/>
               </w:rPr>
-              <w:instrText xml:space="preserve"> PAGEREF _Toc243302134 \h </w:instrText>
+              <w:instrText xml:space="preserve"> PAGEREF _Toc243416725 \h </w:instrText>
             </w:r>
             <w:r>
               <w:rPr>
@@ -4742,7 +4742,7 @@
               <w14:ligatures w14:val="standardContextual"/>
             </w:rPr>
           </w:pPr>
-          <w:hyperlink w:anchor="_Toc243302135" w:history="1">
+          <w:hyperlink w:anchor="_Toc243416726" w:history="1">
             <w:r>
               <w:rPr>
                 <w:rStyle w:val="Hyperlink"/>
@@ -4766,7 +4766,7 @@
               <w:rPr>
                 <w:noProof/>
               </w:rPr>
-              <w:instrText xml:space="preserve"> PAGEREF _Toc243302135 \h </w:instrText>
+              <w:instrText xml:space="preserve"> PAGEREF _Toc243416726 \h </w:instrText>
             </w:r>
             <w:r>
               <w:rPr>
@@ -4806,7 +4806,7 @@
               <w14:ligatures w14:val="standardContextual"/>
             </w:rPr>
           </w:pPr>
-          <w:hyperlink w:anchor="_Toc243302136" w:history="1">
+          <w:hyperlink w:anchor="_Toc243416727" w:history="1">
             <w:r>
               <w:rPr>
                 <w:rStyle w:val="Hyperlink"/>
@@ -4830,7 +4830,7 @@
               <w:rPr>
                 <w:noProof/>
               </w:rPr>
-              <w:instrText xml:space="preserve"> PAGEREF _Toc243302136 \h </w:instrText>
+              <w:instrText xml:space="preserve"> PAGEREF _Toc243416727 \h </w:instrText>
             </w:r>
             <w:r>
               <w:rPr>
@@ -4870,7 +4870,7 @@
               <w14:ligatures w14:val="standardContextual"/>
             </w:rPr>
           </w:pPr>
-          <w:hyperlink w:anchor="_Toc243302137" w:history="1">
+          <w:hyperlink w:anchor="_Toc243416728" w:history="1">
             <w:r>
               <w:rPr>
                 <w:rStyle w:val="Hyperlink"/>
@@ -4894,7 +4894,7 @@
               <w:rPr>
                 <w:noProof/>
               </w:rPr>
-              <w:instrText xml:space="preserve"> PAGEREF _Toc243302137 \h </w:instrText>
+              <w:instrText xml:space="preserve"> PAGEREF _Toc243416728 \h </w:instrText>
             </w:r>
             <w:r>
               <w:rPr>
@@ -4934,7 +4934,7 @@
               <w14:ligatures w14:val="standardContextual"/>
             </w:rPr>
           </w:pPr>
-          <w:hyperlink w:anchor="_Toc243302138" w:history="1">
+          <w:hyperlink w:anchor="_Toc243416729" w:history="1">
             <w:r>
               <w:rPr>
                 <w:rStyle w:val="Hyperlink"/>
@@ -4958,7 +4958,7 @@
               <w:rPr>
                 <w:noProof/>
               </w:rPr>
-              <w:instrText xml:space="preserve"> PAGEREF _Toc243302138 \h </w:instrText>
+              <w:instrText xml:space="preserve"> PAGEREF _Toc243416729 \h </w:instrText>
             </w:r>
             <w:r>
               <w:rPr>
@@ -4998,7 +4998,7 @@
               <w14:ligatures w14:val="standardContextual"/>
             </w:rPr>
           </w:pPr>
-          <w:hyperlink w:anchor="_Toc243302139" w:history="1">
+          <w:hyperlink w:anchor="_Toc243416730" w:history="1">
             <w:r>
               <w:rPr>
                 <w:rStyle w:val="Hyperlink"/>
@@ -5022,7 +5022,7 @@
               <w:rPr>
                 <w:noProof/>
               </w:rPr>
-              <w:instrText xml:space="preserve"> PAGEREF _Toc243302139 \h </w:instrText>
+              <w:instrText xml:space="preserve"> PAGEREF _Toc243416730 \h </w:instrText>
             </w:r>
             <w:r>
               <w:rPr>
@@ -5064,7 +5064,7 @@
               <w14:ligatures w14:val="standardContextual"/>
             </w:rPr>
           </w:pPr>
-          <w:hyperlink w:anchor="_Toc243302140" w:history="1">
+          <w:hyperlink w:anchor="_Toc243416731" w:history="1">
             <w:r>
               <w:rPr>
                 <w:rStyle w:val="Hyperlink"/>
@@ -5088,7 +5088,7 @@
               <w:rPr>
                 <w:noProof/>
               </w:rPr>
-              <w:instrText xml:space="preserve"> PAGEREF _Toc243302140 \h </w:instrText>
+              <w:instrText xml:space="preserve"> PAGEREF _Toc243416731 \h </w:instrText>
             </w:r>
             <w:r>
               <w:rPr>
@@ -5130,7 +5130,7 @@
               <w14:ligatures w14:val="standardContextual"/>
             </w:rPr>
           </w:pPr>
-          <w:hyperlink w:anchor="_Toc243302141" w:history="1">
+          <w:hyperlink w:anchor="_Toc243416732" w:history="1">
             <w:r>
               <w:rPr>
                 <w:rStyle w:val="Hyperlink"/>
@@ -5154,7 +5154,7 @@
               <w:rPr>
                 <w:noProof/>
               </w:rPr>
-              <w:instrText xml:space="preserve"> PAGEREF _Toc243302141 \h </w:instrText>
+              <w:instrText xml:space="preserve"> PAGEREF _Toc243416732 \h </w:instrText>
             </w:r>
             <w:r>
               <w:rPr>
@@ -5196,7 +5196,7 @@
               <w14:ligatures w14:val="standardContextual"/>
             </w:rPr>
           </w:pPr>
-          <w:hyperlink w:anchor="_Toc243302142" w:history="1">
+          <w:hyperlink w:anchor="_Toc243416733" w:history="1">
             <w:r>
               <w:rPr>
                 <w:rStyle w:val="Hyperlink"/>
@@ -5220,7 +5220,7 @@
               <w:rPr>
                 <w:noProof/>
               </w:rPr>
-              <w:instrText xml:space="preserve"> PAGEREF _Toc243302142 \h </w:instrText>
+              <w:instrText xml:space="preserve"> PAGEREF _Toc243416733 \h </w:instrText>
             </w:r>
             <w:r>
               <w:rPr>
@@ -5262,7 +5262,7 @@
               <w14:ligatures w14:val="standardContextual"/>
             </w:rPr>
           </w:pPr>
-          <w:hyperlink w:anchor="_Toc243302143" w:history="1">
+          <w:hyperlink w:anchor="_Toc243416734" w:history="1">
             <w:r>
               <w:rPr>
                 <w:rStyle w:val="Hyperlink"/>
@@ -5286,7 +5286,7 @@
               <w:rPr>
                 <w:noProof/>
               </w:rPr>
-              <w:instrText xml:space="preserve"> PAGEREF _Toc243302143 \h </w:instrText>
+              <w:instrText xml:space="preserve"> PAGEREF _Toc243416734 \h </w:instrText>
             </w:r>
             <w:r>
               <w:rPr>
@@ -5328,7 +5328,7 @@
               <w14:ligatures w14:val="standardContextual"/>
             </w:rPr>
           </w:pPr>
-          <w:hyperlink w:anchor="_Toc243302144" w:history="1">
+          <w:hyperlink w:anchor="_Toc243416735" w:history="1">
             <w:r>
               <w:rPr>
                 <w:rStyle w:val="Hyperlink"/>
@@ -5352,7 +5352,7 @@
               <w:rPr>
                 <w:noProof/>
               </w:rPr>
-              <w:instrText xml:space="preserve"> PAGEREF _Toc243302144 \h </w:instrText>
+              <w:instrText xml:space="preserve"> PAGEREF _Toc243416735 \h </w:instrText>
             </w:r>
             <w:r>
               <w:rPr>
@@ -5394,7 +5394,7 @@
               <w14:ligatures w14:val="standardContextual"/>
             </w:rPr>
           </w:pPr>
-          <w:hyperlink w:anchor="_Toc243302145" w:history="1">
+          <w:hyperlink w:anchor="_Toc243416736" w:history="1">
             <w:r>
               <w:rPr>
                 <w:rStyle w:val="Hyperlink"/>
@@ -5418,7 +5418,7 @@
               <w:rPr>
                 <w:noProof/>
               </w:rPr>
-              <w:instrText xml:space="preserve"> PAGEREF _Toc243302145 \h </w:instrText>
+              <w:instrText xml:space="preserve"> PAGEREF _Toc243416736 \h </w:instrText>
             </w:r>
             <w:r>
               <w:rPr>
@@ -5460,7 +5460,7 @@
               <w14:ligatures w14:val="standardContextual"/>
             </w:rPr>
           </w:pPr>
-          <w:hyperlink w:anchor="_Toc243302146" w:history="1">
+          <w:hyperlink w:anchor="_Toc243416737" w:history="1">
             <w:r>
               <w:rPr>
                 <w:rStyle w:val="Hyperlink"/>
@@ -5484,7 +5484,7 @@
               <w:rPr>
                 <w:noProof/>
               </w:rPr>
-              <w:instrText xml:space="preserve"> PAGEREF _Toc243302146 \h </w:instrText>
+              <w:instrText xml:space="preserve"> PAGEREF _Toc243416737 \h </w:instrText>
             </w:r>
             <w:r>
               <w:rPr>
@@ -5533,7 +5533,7 @@
       <w:pPr>
         <w:pStyle w:val="Ttulo1"/>
       </w:pPr>
-      <w:bookmarkStart w:id="0" w:name="_Toc243302101"/>
+      <w:bookmarkStart w:id="0" w:name="_Toc243416692"/>
       <w:r>
         <w:t>1 INTRODUÇÃO</w:t>
       </w:r>
@@ -5605,7 +5605,7 @@
       <w:pPr>
         <w:pStyle w:val="Ttulo2"/>
       </w:pPr>
-      <w:bookmarkStart w:id="1" w:name="_Toc243302102"/>
+      <w:bookmarkStart w:id="1" w:name="_Toc243416693"/>
       <w:r>
         <w:t>1.1 OBJETIVOS</w:t>
       </w:r>
@@ -5615,7 +5615,7 @@
       <w:pPr>
         <w:pStyle w:val="Ttulo3"/>
       </w:pPr>
-      <w:bookmarkStart w:id="2" w:name="_Toc243302103"/>
+      <w:bookmarkStart w:id="2" w:name="_Toc243416694"/>
       <w:r>
         <w:t>1.1.1 Objetivo geral</w:t>
       </w:r>
@@ -5634,7 +5634,7 @@
       <w:pPr>
         <w:pStyle w:val="Ttulo3"/>
       </w:pPr>
-      <w:bookmarkStart w:id="3" w:name="_Toc243302104"/>
+      <w:bookmarkStart w:id="3" w:name="_Toc243416695"/>
       <w:r>
         <w:t>1.1.2 Objetivos específicos</w:t>
       </w:r>
@@ -5742,7 +5742,7 @@
       <w:pPr>
         <w:pStyle w:val="Ttulo2"/>
       </w:pPr>
-      <w:bookmarkStart w:id="4" w:name="_Toc243302105"/>
+      <w:bookmarkStart w:id="4" w:name="_Toc243416696"/>
       <w:r>
         <w:t>1.2 ORGANIZAÇÃO DO RELATÓRIO</w:t>
       </w:r>
@@ -5761,7 +5761,7 @@
       <w:pPr>
         <w:pStyle w:val="Ttulo1"/>
       </w:pPr>
-      <w:bookmarkStart w:id="5" w:name="_Toc243302106"/>
+      <w:bookmarkStart w:id="5" w:name="_Toc243416697"/>
       <w:r>
         <w:t>2 FUNDAMENTAÇÃO TEÓRICA</w:t>
       </w:r>
@@ -5780,7 +5780,7 @@
       <w:pPr>
         <w:pStyle w:val="Ttulo2"/>
       </w:pPr>
-      <w:bookmarkStart w:id="6" w:name="_Toc243302107"/>
+      <w:bookmarkStart w:id="6" w:name="_Toc243416698"/>
       <w:r>
         <w:t>2.1 MARCADORES BIOQUÍMICOS NO DIAGNÓSTICO CLÍNICO</w:t>
       </w:r>
@@ -5812,7 +5812,7 @@
       <w:pPr>
         <w:pStyle w:val="LegendaABNT"/>
       </w:pPr>
-      <w:bookmarkStart w:id="7" w:name="_Toc243302159"/>
+      <w:bookmarkStart w:id="7" w:name="_Toc243416750"/>
       <w:r>
         <w:t xml:space="preserve">Quadro </w:t>
       </w:r>
@@ -6350,7 +6350,7 @@
       <w:pPr>
         <w:pStyle w:val="Ttulo2"/>
       </w:pPr>
-      <w:bookmarkStart w:id="8" w:name="_Toc243302108"/>
+      <w:bookmarkStart w:id="8" w:name="_Toc243416699"/>
       <w:r>
         <w:t>2.2 PRÁTICA DE RECUPERAÇÃO E REPETIÇÃO ESPAÇADA</w:t>
       </w:r>
@@ -6430,7 +6430,7 @@
       <w:pPr>
         <w:pStyle w:val="Ttulo2"/>
       </w:pPr>
-      <w:bookmarkStart w:id="9" w:name="_Toc243302109"/>
+      <w:bookmarkStart w:id="9" w:name="_Toc243416700"/>
       <w:r>
         <w:t>2.3 O ALGORITMO SM-2</w:t>
       </w:r>
@@ -6506,7 +6506,7 @@
       <w:pPr>
         <w:pStyle w:val="Ttulo2"/>
       </w:pPr>
-      <w:bookmarkStart w:id="10" w:name="_Toc243302110"/>
+      <w:bookmarkStart w:id="10" w:name="_Toc243416701"/>
       <w:r>
         <w:t>2.4 GAMIFICAÇÃO E MOTIVAÇÃO</w:t>
       </w:r>
@@ -6584,7 +6584,7 @@
       <w:pPr>
         <w:pStyle w:val="Ttulo2"/>
       </w:pPr>
-      <w:bookmarkStart w:id="11" w:name="_Toc243302111"/>
+      <w:bookmarkStart w:id="11" w:name="_Toc243416702"/>
       <w:r>
         <w:t>2.5 METACOGNIÇÃO E CALIBRAÇÃO</w:t>
       </w:r>
@@ -6632,7 +6632,7 @@
       <w:pPr>
         <w:pStyle w:val="Ttulo1"/>
       </w:pPr>
-      <w:bookmarkStart w:id="12" w:name="_Toc243302112"/>
+      <w:bookmarkStart w:id="12" w:name="_Toc243416703"/>
       <w:r>
         <w:t>3 MATERIAIS E MÉTODOS</w:t>
       </w:r>
@@ -6642,7 +6642,7 @@
       <w:pPr>
         <w:pStyle w:val="Ttulo2"/>
       </w:pPr>
-      <w:bookmarkStart w:id="13" w:name="_Toc243302113"/>
+      <w:bookmarkStart w:id="13" w:name="_Toc243416704"/>
       <w:r>
         <w:t>3.1 NATUREZA DA PESQUISA E ETAPAS</w:t>
       </w:r>
@@ -6779,7 +6779,7 @@
       <w:pPr>
         <w:pStyle w:val="Ttulo2"/>
       </w:pPr>
-      <w:bookmarkStart w:id="14" w:name="_Toc243302114"/>
+      <w:bookmarkStart w:id="14" w:name="_Toc243416705"/>
       <w:r>
         <w:t>3.2 CURADORIA DO CONTEÚDO</w:t>
       </w:r>
@@ -6843,7 +6843,7 @@
       <w:pPr>
         <w:pStyle w:val="Ttulo2"/>
       </w:pPr>
-      <w:bookmarkStart w:id="15" w:name="_Toc243302115"/>
+      <w:bookmarkStart w:id="15" w:name="_Toc243416706"/>
       <w:r>
         <w:t>3.3 TECNOLOGIAS UTILIZADAS</w:t>
       </w:r>
@@ -6863,7 +6863,7 @@
       <w:pPr>
         <w:pStyle w:val="LegendaABNT"/>
       </w:pPr>
-      <w:bookmarkStart w:id="16" w:name="_Toc243302160"/>
+      <w:bookmarkStart w:id="16" w:name="_Toc243416751"/>
       <w:r>
         <w:t xml:space="preserve">Quadro </w:t>
       </w:r>
@@ -8413,7 +8413,7 @@
       <w:pPr>
         <w:pStyle w:val="Ttulo2"/>
       </w:pPr>
-      <w:bookmarkStart w:id="17" w:name="_Toc243302116"/>
+      <w:bookmarkStart w:id="17" w:name="_Toc243416707"/>
       <w:r>
         <w:t>3.4 ARQUITETURA DO SOFTWARE</w:t>
       </w:r>
@@ -8433,7 +8433,7 @@
       <w:pPr>
         <w:pStyle w:val="LegendaABNT"/>
       </w:pPr>
-      <w:bookmarkStart w:id="18" w:name="_Toc243302147"/>
+      <w:bookmarkStart w:id="18" w:name="_Toc243416738"/>
       <w:r>
         <w:t xml:space="preserve">Figura </w:t>
       </w:r>
@@ -8471,7 +8471,7 @@
           <w:noProof/>
         </w:rPr>
         <w:drawing>
-          <wp:inline distT="0" distB="0" distL="0" distR="0" wp14:anchorId="1BE59D7B" wp14:editId="52D737E5">
+          <wp:inline distT="0" distB="0" distL="0" distR="0" wp14:anchorId="166F50B8" wp14:editId="47786D9F">
             <wp:extent cx="5762625" cy="3714750"/>
             <wp:effectExtent l="0" t="0" r="0" b="0"/>
             <wp:docPr id="1" name="arquitetura.png" descr="Arquitetura do BioquímicaEDU" title="Arquitetura do BioquímicaEDU"/>
@@ -8534,7 +8534,7 @@
       <w:pPr>
         <w:pStyle w:val="Ttulo2"/>
       </w:pPr>
-      <w:bookmarkStart w:id="19" w:name="_Toc243302117"/>
+      <w:bookmarkStart w:id="19" w:name="_Toc243416708"/>
       <w:r>
         <w:t>3.5 VERIFICAÇÃO DO SOFTWARE</w:t>
       </w:r>
@@ -8575,7 +8575,7 @@
       <w:pPr>
         <w:pStyle w:val="Ttulo2"/>
       </w:pPr>
-      <w:bookmarkStart w:id="20" w:name="_Toc243302118"/>
+      <w:bookmarkStart w:id="20" w:name="_Toc243416709"/>
       <w:r>
         <w:t>3.6 AVALIAÇÃO COM USUÁRIOS</w:t>
       </w:r>
@@ -8594,7 +8594,7 @@
       <w:pPr>
         <w:pStyle w:val="Ttulo3"/>
       </w:pPr>
-      <w:bookmarkStart w:id="21" w:name="_Toc243302119"/>
+      <w:bookmarkStart w:id="21" w:name="_Toc243416710"/>
       <w:r>
         <w:t>3.6.1 Avaliação formativa</w:t>
       </w:r>
@@ -8616,7 +8616,7 @@
       <w:pPr>
         <w:pStyle w:val="Ttulo3"/>
       </w:pPr>
-      <w:bookmarkStart w:id="22" w:name="_Toc243302120"/>
+      <w:bookmarkStart w:id="22" w:name="_Toc243416711"/>
       <w:r>
         <w:t>3.6.2 Pré-teste e pós-teste</w:t>
       </w:r>
@@ -8662,7 +8662,7 @@
       <w:pPr>
         <w:pStyle w:val="Ttulo3"/>
       </w:pPr>
-      <w:bookmarkStart w:id="23" w:name="_Toc243302121"/>
+      <w:bookmarkStart w:id="23" w:name="_Toc243416712"/>
       <w:r>
         <w:t>3.6.3 Questionário de opinião</w:t>
       </w:r>
@@ -8684,7 +8684,7 @@
       <w:pPr>
         <w:pStyle w:val="Ttulo3"/>
       </w:pPr>
-      <w:bookmarkStart w:id="24" w:name="_Toc243302122"/>
+      <w:bookmarkStart w:id="24" w:name="_Toc243416713"/>
       <w:r>
         <w:t>3.6.4 Aspectos éticos e proteção de dados</w:t>
       </w:r>
@@ -8721,7 +8721,7 @@
       <w:pPr>
         <w:pStyle w:val="Ttulo2"/>
       </w:pPr>
-      <w:bookmarkStart w:id="25" w:name="_Toc243302123"/>
+      <w:bookmarkStart w:id="25" w:name="_Toc243416714"/>
       <w:r>
         <w:t>3.7 USO DE FERRAMENTAS DE INTELIGÊNCIA ARTIFICIAL</w:t>
       </w:r>
@@ -8746,7 +8746,7 @@
       <w:pPr>
         <w:pStyle w:val="Ttulo1"/>
       </w:pPr>
-      <w:bookmarkStart w:id="26" w:name="_Toc243302124"/>
+      <w:bookmarkStart w:id="26" w:name="_Toc243416715"/>
       <w:r>
         <w:t>4 RESULTADOS</w:t>
       </w:r>
@@ -8756,7 +8756,7 @@
       <w:pPr>
         <w:pStyle w:val="Ttulo2"/>
       </w:pPr>
-      <w:bookmarkStart w:id="27" w:name="_Toc243302125"/>
+      <w:bookmarkStart w:id="27" w:name="_Toc243416716"/>
       <w:r>
         <w:t>4.1 VISÃO GERAL DO SOFTWARE</w:t>
       </w:r>
@@ -8776,7 +8776,7 @@
       <w:pPr>
         <w:pStyle w:val="LegendaABNT"/>
       </w:pPr>
-      <w:bookmarkStart w:id="28" w:name="_Toc243302161"/>
+      <w:bookmarkStart w:id="28" w:name="_Toc243416752"/>
       <w:r>
         <w:t xml:space="preserve">Quadro </w:t>
       </w:r>
@@ -9263,7 +9263,7 @@
       <w:pPr>
         <w:pStyle w:val="LegendaABNT"/>
       </w:pPr>
-      <w:bookmarkStart w:id="29" w:name="_Toc243302166"/>
+      <w:bookmarkStart w:id="29" w:name="_Toc243416757"/>
       <w:r>
         <w:t xml:space="preserve">Tabela </w:t>
       </w:r>
@@ -10643,7 +10643,7 @@
       <w:pPr>
         <w:pStyle w:val="LegendaABNT"/>
       </w:pPr>
-      <w:bookmarkStart w:id="30" w:name="_Toc243302167"/>
+      <w:bookmarkStart w:id="30" w:name="_Toc243416758"/>
       <w:r>
         <w:t xml:space="preserve">Tabela </w:t>
       </w:r>
@@ -11330,7 +11330,7 @@
       <w:pPr>
         <w:pStyle w:val="Ttulo2"/>
       </w:pPr>
-      <w:bookmarkStart w:id="31" w:name="_Toc243302126"/>
+      <w:bookmarkStart w:id="31" w:name="_Toc243416717"/>
       <w:r>
         <w:t>4.2 MOTOR DE APRENDIZAGEM</w:t>
       </w:r>
@@ -11362,7 +11362,7 @@
       <w:pPr>
         <w:pStyle w:val="LegendaABNT"/>
       </w:pPr>
-      <w:bookmarkStart w:id="32" w:name="_Toc243302162"/>
+      <w:bookmarkStart w:id="32" w:name="_Toc243416753"/>
       <w:r>
         <w:t xml:space="preserve">Quadro </w:t>
       </w:r>
@@ -11960,7 +11960,7 @@
       <w:pPr>
         <w:pStyle w:val="LegendaABNT"/>
       </w:pPr>
-      <w:bookmarkStart w:id="33" w:name="_Toc243302148"/>
+      <w:bookmarkStart w:id="33" w:name="_Toc243416739"/>
       <w:r>
         <w:t xml:space="preserve">Figura </w:t>
       </w:r>
@@ -11998,7 +11998,7 @@
           <w:noProof/>
         </w:rPr>
         <w:drawing>
-          <wp:inline distT="0" distB="0" distL="0" distR="0" wp14:anchorId="25883F95" wp14:editId="76FC067A">
+          <wp:inline distT="0" distB="0" distL="0" distR="0" wp14:anchorId="7212513D" wp14:editId="43C38141">
             <wp:extent cx="5400675" cy="2971800"/>
             <wp:effectExtent l="0" t="0" r="0" b="0"/>
             <wp:docPr id="2" name="sm2_intervalos.png" descr="Intervalos calculados pelo motor em três sequências de respostas" title="Intervalos calculados pelo motor em três sequências de respostas"/>
@@ -12059,7 +12059,7 @@
       <w:pPr>
         <w:pStyle w:val="LegendaABNT"/>
       </w:pPr>
-      <w:bookmarkStart w:id="34" w:name="_Toc243302168"/>
+      <w:bookmarkStart w:id="34" w:name="_Toc243416759"/>
       <w:r>
         <w:t xml:space="preserve">Tabela </w:t>
       </w:r>
@@ -12886,7 +12886,7 @@
       <w:pPr>
         <w:pStyle w:val="Ttulo2"/>
       </w:pPr>
-      <w:bookmarkStart w:id="35" w:name="_Toc243302127"/>
+      <w:bookmarkStart w:id="35" w:name="_Toc243416718"/>
       <w:r>
         <w:t>4.3 VERSÃO PARA DISPOSITIVOS MÓVEIS</w:t>
       </w:r>
@@ -12906,7 +12906,7 @@
       <w:pPr>
         <w:pStyle w:val="LegendaABNT"/>
       </w:pPr>
-      <w:bookmarkStart w:id="36" w:name="_Toc243302149"/>
+      <w:bookmarkStart w:id="36" w:name="_Toc243416740"/>
       <w:r>
         <w:t xml:space="preserve">Figura </w:t>
       </w:r>
@@ -12944,7 +12944,7 @@
           <w:noProof/>
         </w:rPr>
         <w:drawing>
-          <wp:inline distT="0" distB="0" distL="0" distR="0" wp14:anchorId="3D915DDF" wp14:editId="0CCB0F0E">
+          <wp:inline distT="0" distB="0" distL="0" distR="0" wp14:anchorId="3E426A43" wp14:editId="14F36967">
             <wp:extent cx="5762625" cy="4086225"/>
             <wp:effectExtent l="0" t="0" r="0" b="0"/>
             <wp:docPr id="3" name="telas_inicio_estudo.png" descr="Início e estudo na versão móvel" title="Início e estudo na versão móvel"/>
@@ -13014,7 +13014,7 @@
       <w:pPr>
         <w:pStyle w:val="LegendaABNT"/>
       </w:pPr>
-      <w:bookmarkStart w:id="37" w:name="_Toc243302150"/>
+      <w:bookmarkStart w:id="37" w:name="_Toc243416741"/>
       <w:r>
         <w:t xml:space="preserve">Figura </w:t>
       </w:r>
@@ -13062,7 +13062,7 @@
           <w:noProof/>
         </w:rPr>
         <w:drawing>
-          <wp:inline distT="0" distB="0" distL="0" distR="0" wp14:anchorId="650D33CC" wp14:editId="4688FD4A">
+          <wp:inline distT="0" distB="0" distL="0" distR="0" wp14:anchorId="591F5ED2" wp14:editId="2385864B">
             <wp:extent cx="5762625" cy="4086225"/>
             <wp:effectExtent l="0" t="0" r="0" b="0"/>
             <wp:docPr id="4" name="telas_revisao.png" descr="Revisão espaçada e flashcards na versão móvel" title="Revisão espaçada e flashcards na versão móvel"/>
@@ -13152,7 +13152,7 @@
       <w:pPr>
         <w:pStyle w:val="LegendaABNT"/>
       </w:pPr>
-      <w:bookmarkStart w:id="38" w:name="_Toc243302151"/>
+      <w:bookmarkStart w:id="38" w:name="_Toc243416742"/>
       <w:r>
         <w:t xml:space="preserve">Figura </w:t>
       </w:r>
@@ -13190,7 +13190,7 @@
           <w:noProof/>
         </w:rPr>
         <w:drawing>
-          <wp:inline distT="0" distB="0" distL="0" distR="0" wp14:anchorId="1069D41B" wp14:editId="46FAC994">
+          <wp:inline distT="0" distB="0" distL="0" distR="0" wp14:anchorId="547DA337" wp14:editId="72EB691E">
             <wp:extent cx="5762625" cy="4086225"/>
             <wp:effectExtent l="0" t="0" r="0" b="0"/>
             <wp:docPr id="5" name="telas_pratica_tutor.png" descr="Prática e tutor na versão móvel" title="Prática e tutor na versão móvel"/>
@@ -13292,7 +13292,7 @@
       <w:pPr>
         <w:pStyle w:val="Ttulo2"/>
       </w:pPr>
-      <w:bookmarkStart w:id="39" w:name="_Toc243302128"/>
+      <w:bookmarkStart w:id="39" w:name="_Toc243416719"/>
       <w:r>
         <w:t>4.4 VERSÕES PARA COMPUTADOR</w:t>
       </w:r>
@@ -13312,7 +13312,7 @@
       <w:pPr>
         <w:pStyle w:val="LegendaABNT"/>
       </w:pPr>
-      <w:bookmarkStart w:id="40" w:name="_Toc243302152"/>
+      <w:bookmarkStart w:id="40" w:name="_Toc243416743"/>
       <w:r>
         <w:t xml:space="preserve">Figura </w:t>
       </w:r>
@@ -13350,7 +13350,7 @@
           <w:noProof/>
         </w:rPr>
         <w:drawing>
-          <wp:inline distT="0" distB="0" distL="0" distR="0" wp14:anchorId="1E140E55" wp14:editId="02768503">
+          <wp:inline distT="0" distB="0" distL="0" distR="0" wp14:anchorId="4C2C9291" wp14:editId="64FFA974">
             <wp:extent cx="5762625" cy="3981450"/>
             <wp:effectExtent l="0" t="0" r="0" b="0"/>
             <wp:docPr id="6" name="desktop_painel.png" descr="Painel inicial da versão para computador" title="Painel inicial da versão para computador"/>
@@ -13410,7 +13410,7 @@
       <w:pPr>
         <w:pStyle w:val="Ttulo2"/>
       </w:pPr>
-      <w:bookmarkStart w:id="41" w:name="_Toc243302129"/>
+      <w:bookmarkStart w:id="41" w:name="_Toc243416720"/>
       <w:r>
         <w:t>4.5 IDENTIDADE VISUAL</w:t>
       </w:r>
@@ -13430,7 +13430,7 @@
       <w:pPr>
         <w:pStyle w:val="LegendaABNT"/>
       </w:pPr>
-      <w:bookmarkStart w:id="42" w:name="_Toc243302153"/>
+      <w:bookmarkStart w:id="42" w:name="_Toc243416744"/>
       <w:r>
         <w:t xml:space="preserve">Figura </w:t>
       </w:r>
@@ -13468,7 +13468,7 @@
           <w:noProof/>
         </w:rPr>
         <w:drawing>
-          <wp:inline distT="0" distB="0" distL="0" distR="0" wp14:anchorId="17D96510" wp14:editId="0A06C74C">
+          <wp:inline distT="0" distB="0" distL="0" distR="0" wp14:anchorId="3F14ACBE" wp14:editId="1733DA8E">
             <wp:extent cx="3600450" cy="866775"/>
             <wp:effectExtent l="0" t="0" r="0" b="0"/>
             <wp:docPr id="7" name="horizontal.png" descr="Logo do BioquímicaEDU" title="Logo do BioquímicaEDU"/>
@@ -13519,7 +13519,7 @@
       <w:pPr>
         <w:pStyle w:val="Ttulo2"/>
       </w:pPr>
-      <w:bookmarkStart w:id="43" w:name="_Toc243302130"/>
+      <w:bookmarkStart w:id="43" w:name="_Toc243416721"/>
       <w:r>
         <w:t>4.6 AVALIAÇÃO FORMATIVA</w:t>
       </w:r>
@@ -13543,14 +13543,14 @@
         <w:jc w:val="both"/>
       </w:pPr>
       <w:r>
-        <w:t>Como a avaliação foi formativa e sem instrumento padronizado, esses resultados não medem usabilidade nem satisfação: indicam o que pessoas do público do aplicativo e da área consideraram importante. As sugestões orientaram as mudanças visuais e de estrutura e as funções acrescentadas depois, junto com os itens da proposta que ainda faltavam (seção 4.7). Os vídeos em português foram incluídos; a melhoria dos diagramas do conteúdo ainda não foi feita e fica como trabalho futuro.</w:t>
+        <w:t>Como a avaliação foi formativa e sem instrumento padronizado, esses resultados não medem usabilidade nem satisfação: indicam o que pessoas do público do aplicativo e da área consideraram importante. As sugestões orientaram as mudanças visuais e de estrutura e as funções acrescentadas depois, junto com os itens da proposta que ainda faltavam (seção 4.7). Os dois pedidos mais diretos foram atendidos nessa evolução: os vídeos em português foram incluídos, e as imagens e os esquemas foram melhorados.</w:t>
       </w:r>
     </w:p>
     <w:p>
       <w:pPr>
         <w:pStyle w:val="Ttulo2"/>
       </w:pPr>
-      <w:bookmarkStart w:id="44" w:name="_Toc243302131"/>
+      <w:bookmarkStart w:id="44" w:name="_Toc243416722"/>
       <w:r>
         <w:t>4.7 EVOLUÇÃO DO SOFTWARE</w:t>
       </w:r>
@@ -13572,7 +13572,7 @@
       <w:pPr>
         <w:pStyle w:val="Ttulo3"/>
       </w:pPr>
-      <w:bookmarkStart w:id="45" w:name="_Toc243302132"/>
+      <w:bookmarkStart w:id="45" w:name="_Toc243416723"/>
       <w:r>
         <w:t>4.7.1 Itens da proposta: novos marcadores, jogos e régua das faixas</w:t>
       </w:r>
@@ -13620,7 +13620,7 @@
       <w:pPr>
         <w:pStyle w:val="LegendaABNT"/>
       </w:pPr>
-      <w:bookmarkStart w:id="46" w:name="_Toc243302154"/>
+      <w:bookmarkStart w:id="46" w:name="_Toc243416745"/>
       <w:r>
         <w:t xml:space="preserve">Figura </w:t>
       </w:r>
@@ -13658,7 +13658,7 @@
           <w:noProof/>
         </w:rPr>
         <w:drawing>
-          <wp:inline distT="0" distB="0" distL="0" distR="0" wp14:anchorId="411866BB" wp14:editId="6029EFA5">
+          <wp:inline distT="0" distB="0" distL="0" distR="0" wp14:anchorId="3B5431C8" wp14:editId="2806A857">
             <wp:extent cx="5762625" cy="4086225"/>
             <wp:effectExtent l="0" t="0" r="0" b="0"/>
             <wp:docPr id="8" name="evolucao_jogos.png" descr="Jogos didáticos e calculadora da TFG estimada na versão para celular" title="Jogos didáticos e calculadora da TFG estimada na versão para celular"/>
@@ -13731,7 +13731,7 @@
       <w:pPr>
         <w:pStyle w:val="Ttulo3"/>
       </w:pPr>
-      <w:bookmarkStart w:id="47" w:name="_Toc243302133"/>
+      <w:bookmarkStart w:id="47" w:name="_Toc243416724"/>
       <w:r>
         <w:t>4.7.2 Intervalos da revisão</w:t>
       </w:r>
@@ -13754,7 +13754,7 @@
       <w:pPr>
         <w:pStyle w:val="LegendaABNT"/>
       </w:pPr>
-      <w:bookmarkStart w:id="48" w:name="_Toc243302169"/>
+      <w:bookmarkStart w:id="48" w:name="_Toc243416760"/>
       <w:r>
         <w:t xml:space="preserve">Tabela </w:t>
       </w:r>
@@ -14333,7 +14333,7 @@
       <w:pPr>
         <w:pStyle w:val="Ttulo3"/>
       </w:pPr>
-      <w:bookmarkStart w:id="49" w:name="_Toc243302134"/>
+      <w:bookmarkStart w:id="49" w:name="_Toc243416725"/>
       <w:r>
         <w:t>4.7.3 Um aplicativo para celular, tablet e computador</w:t>
       </w:r>
@@ -14356,7 +14356,7 @@
       <w:pPr>
         <w:pStyle w:val="LegendaABNT"/>
       </w:pPr>
-      <w:bookmarkStart w:id="50" w:name="_Toc243302163"/>
+      <w:bookmarkStart w:id="50" w:name="_Toc243416754"/>
       <w:r>
         <w:t xml:space="preserve">Quadro </w:t>
       </w:r>
@@ -15106,7 +15106,7 @@
       <w:pPr>
         <w:pStyle w:val="LegendaABNT"/>
       </w:pPr>
-      <w:bookmarkStart w:id="51" w:name="_Toc243302155"/>
+      <w:bookmarkStart w:id="51" w:name="_Toc243416746"/>
       <w:r>
         <w:t xml:space="preserve">Figura </w:t>
       </w:r>
@@ -15144,7 +15144,7 @@
           <w:noProof/>
         </w:rPr>
         <w:drawing>
-          <wp:inline distT="0" distB="0" distL="0" distR="0" wp14:anchorId="43DB735E" wp14:editId="54E5C29A">
+          <wp:inline distT="0" distB="0" distL="0" distR="0" wp14:anchorId="2274CD8D" wp14:editId="75FE59AF">
             <wp:extent cx="5762625" cy="7219950"/>
             <wp:effectExtent l="0" t="0" r="0" b="0"/>
             <wp:docPr id="9" name="evolucao_formatos.png" descr="O mesmo aplicativo no computador, no tablet e no celular" title="O mesmo aplicativo no computador, no tablet e no celular"/>
@@ -15205,7 +15205,7 @@
       <w:pPr>
         <w:pStyle w:val="Ttulo3"/>
       </w:pPr>
-      <w:bookmarkStart w:id="52" w:name="_Toc243302135"/>
+      <w:bookmarkStart w:id="52" w:name="_Toc243416726"/>
       <w:r>
         <w:t>4.7.4 Acessibilidade</w:t>
       </w:r>
@@ -15306,7 +15306,7 @@
       <w:pPr>
         <w:pStyle w:val="LegendaABNT"/>
       </w:pPr>
-      <w:bookmarkStart w:id="53" w:name="_Toc243302156"/>
+      <w:bookmarkStart w:id="53" w:name="_Toc243416747"/>
       <w:r>
         <w:t xml:space="preserve">Figura </w:t>
       </w:r>
@@ -15344,7 +15344,7 @@
           <w:noProof/>
         </w:rPr>
         <w:drawing>
-          <wp:inline distT="0" distB="0" distL="0" distR="0" wp14:anchorId="0D67658A" wp14:editId="52AF1F92">
+          <wp:inline distT="0" distB="0" distL="0" distR="0" wp14:anchorId="39C38902" wp14:editId="1D6BE413">
             <wp:extent cx="5762625" cy="4086225"/>
             <wp:effectExtent l="0" t="0" r="0" b="0"/>
             <wp:docPr id="10" name="evolucao_acessibilidade.png" descr="Recursos de acessibilidade na versão para celular" title="Recursos de acessibilidade na versão para celular"/>
@@ -15417,7 +15417,7 @@
       <w:pPr>
         <w:pStyle w:val="Ttulo3"/>
       </w:pPr>
-      <w:bookmarkStart w:id="54" w:name="_Toc243302136"/>
+      <w:bookmarkStart w:id="54" w:name="_Toc243416727"/>
       <w:r>
         <w:t>4.7.5 Tutor com inteligência artificial generativa</w:t>
       </w:r>
@@ -15440,7 +15440,7 @@
       <w:pPr>
         <w:pStyle w:val="LegendaABNT"/>
       </w:pPr>
-      <w:bookmarkStart w:id="55" w:name="_Toc243302157"/>
+      <w:bookmarkStart w:id="55" w:name="_Toc243416748"/>
       <w:r>
         <w:t xml:space="preserve">Figura </w:t>
       </w:r>
@@ -15478,7 +15478,7 @@
           <w:noProof/>
         </w:rPr>
         <w:drawing>
-          <wp:inline distT="0" distB="0" distL="0" distR="0" wp14:anchorId="235B05F9" wp14:editId="7600E471">
+          <wp:inline distT="0" distB="0" distL="0" distR="0" wp14:anchorId="4F197848" wp14:editId="1F2831A8">
             <wp:extent cx="5762625" cy="2933700"/>
             <wp:effectExtent l="0" t="0" r="0" b="0"/>
             <wp:docPr id="11" name="tutor_arquitetura.png" descr="Provedores de resposta do tutor e local da chave de acesso" title="Provedores de resposta do tutor e local da chave de acesso"/>
@@ -15584,7 +15584,7 @@
       <w:pPr>
         <w:pStyle w:val="LegendaABNT"/>
       </w:pPr>
-      <w:bookmarkStart w:id="56" w:name="_Toc243302158"/>
+      <w:bookmarkStart w:id="56" w:name="_Toc243416749"/>
       <w:r>
         <w:t xml:space="preserve">Figura </w:t>
       </w:r>
@@ -15622,7 +15622,7 @@
           <w:noProof/>
         </w:rPr>
         <w:drawing>
-          <wp:inline distT="0" distB="0" distL="0" distR="0" wp14:anchorId="1B48ABBA" wp14:editId="4DF0CEF8">
+          <wp:inline distT="0" distB="0" distL="0" distR="0" wp14:anchorId="6405C927" wp14:editId="4D02D62D">
             <wp:extent cx="5762625" cy="4086225"/>
             <wp:effectExtent l="0" t="0" r="0" b="0"/>
             <wp:docPr id="12" name="evolucao_tutor.png" descr="Conversa com o tutor usando o Gemini na versão para celular" title="Conversa com o tutor usando o Gemini na versão para celular"/>
@@ -15683,7 +15683,7 @@
       <w:pPr>
         <w:pStyle w:val="Ttulo3"/>
       </w:pPr>
-      <w:bookmarkStart w:id="57" w:name="_Toc243302137"/>
+      <w:bookmarkStart w:id="57" w:name="_Toc243416728"/>
       <w:r>
         <w:t>4.7.6 Abertura, conta Google opcional e apresentação</w:t>
       </w:r>
@@ -15708,7 +15708,7 @@
       <w:pPr>
         <w:pStyle w:val="Ttulo3"/>
       </w:pPr>
-      <w:bookmarkStart w:id="58" w:name="_Toc243302138"/>
+      <w:bookmarkStart w:id="58" w:name="_Toc243416729"/>
       <w:r>
         <w:t>4.7.7 Site e instaladores</w:t>
       </w:r>
@@ -15758,7 +15758,7 @@
       <w:pPr>
         <w:pStyle w:val="Ttulo2"/>
       </w:pPr>
-      <w:bookmarkStart w:id="59" w:name="_Toc243302139"/>
+      <w:bookmarkStart w:id="59" w:name="_Toc243416730"/>
       <w:r>
         <w:t>4.8 AVALIAÇÃO DA APRENDIZAGEM</w:t>
       </w:r>
@@ -15781,7 +15781,7 @@
       <w:pPr>
         <w:pStyle w:val="LegendaABNT"/>
       </w:pPr>
-      <w:bookmarkStart w:id="60" w:name="_Toc243302170"/>
+      <w:bookmarkStart w:id="60" w:name="_Toc243416761"/>
       <w:r>
         <w:t xml:space="preserve">Tabela </w:t>
       </w:r>
@@ -16395,7 +16395,7 @@
       <w:pPr>
         <w:pStyle w:val="Ttulo1"/>
       </w:pPr>
-      <w:bookmarkStart w:id="61" w:name="_Toc243302140"/>
+      <w:bookmarkStart w:id="61" w:name="_Toc243416731"/>
       <w:r>
         <w:t>5 DISCUSSÃO</w:t>
       </w:r>
@@ -16415,7 +16415,7 @@
       <w:pPr>
         <w:pStyle w:val="LegendaABNT"/>
       </w:pPr>
-      <w:bookmarkStart w:id="62" w:name="_Toc243302164"/>
+      <w:bookmarkStart w:id="62" w:name="_Toc243416755"/>
       <w:r>
         <w:t xml:space="preserve">Quadro </w:t>
       </w:r>
@@ -17523,10 +17523,10 @@
         <w:jc w:val="both"/>
       </w:pPr>
       <w:r>
-        <w:t xml:space="preserve">O trabalho tem limitações. O conteúdo cobre 22 marcadores e não passou por revisão formal de docente da área da saúde, e o banco de 14 questões é pequeno, o que favorece a repetição das mesmas perguntas. As questões geradas pelo modelo de linguagem na versão clássica com tutor não passam por curadoria e podem conter erros. Os diagramas do conteúdo ainda são os da primeira versão, e a melhoria pedida na avaliação formativa não foi feita. A versão para iOS, possível com o Kivy, não foi testada, e os recursos </w:t>
-      </w:r>
-      <w:r>
-        <w:t xml:space="preserve">de acessibilidade não foram avaliados com estudantes com deficiência. Na avaliação, a parte formativa não usou instrumento padronizado nem produziu medidas; o pré-teste e o pós-teste não têm grupo de comparação, repetem as mesmas questões — parte da melhora pode vir de já tê-las visto — e reúnem uma amostra pequena e de conveniência </w:t>
+        <w:t>O trabalho tem limitações. O conteúdo cobre 22 marcadores e não passou por revisão formal de docente da área da saúde, e o banco de 14 questões é pequeno, o que favorece a repetição das mesmas perguntas. As questões geradas pelo modelo de linguagem na versão clássica com tutor não passam por curadoria e podem conter erros. A versão para iOS, possível com o Kivy, não foi testada, e os recursos de acessibilidade não foram avaliados com estudantes com deficiência. Na avaliação, a parte formativa não usou instr</w:t>
+      </w:r>
+      <w:r>
+        <w:t xml:space="preserve">umento padronizado nem produziu medidas; o pré-teste e o pós-teste não têm grupo de comparação, repetem as mesmas questões — parte da melhora pode vir de já tê-las visto — e reúnem uma amostra pequena e de conveniência </w:t>
       </w:r>
       <w:r>
         <w:rPr>
@@ -17542,7 +17542,7 @@
       <w:pPr>
         <w:pStyle w:val="Ttulo1"/>
       </w:pPr>
-      <w:bookmarkStart w:id="63" w:name="_Toc243302141"/>
+      <w:bookmarkStart w:id="63" w:name="_Toc243416732"/>
       <w:r>
         <w:t>6 CONSIDERAÇÕES FINAIS</w:t>
       </w:r>
@@ -17601,10 +17601,10 @@
         <w:jc w:val="both"/>
       </w:pPr>
       <w:r>
-        <w:t>Como trabalhos futuros, sugerem-se: ampliar o número de marcadores e de questões, com revisão por docentes da área da saúde; melhorar os diagramas e esquemas do conteúdo, como pediram os participantes; realizar estudo com grupo de comparação e acompanhamento da retenção ao longo de meses; sincronizar o progresso entre aparelhos pela conta Google, mediante consentimento explícito; publicar o aplicativo na Google Play, após testes em diferentes aparelhos; levar a tradução para Libras para dentro do próprio ap</w:t>
-      </w:r>
-      <w:r>
-        <w:t>licativo, sem depender do navegador; avaliar os recursos de acessibilidade com estudantes com deficiência e a qualidade das respostas do tutor com docentes; e testar a versão para iOS.</w:t>
+        <w:t>Como trabalhos futuros, sugerem-se: ampliar o número de marcadores e de questões, com revisão por docentes da área da saúde; realizar estudo com grupo de comparação e acompanhamento da retenção ao longo de meses; sincronizar o progresso entre aparelhos pela conta Google, mediante consentimento explícito; publicar o aplicativo na Google Play, após testes em diferentes aparelhos; levar a tradução para Libras para dentro do próprio aplicativo, sem depender do navegador; avaliar os recursos de acessibilidade co</w:t>
+      </w:r>
+      <w:r>
+        <w:t>m estudantes com deficiência e a qualidade das respostas do tutor com docentes; e testar a versão para iOS.</w:t>
       </w:r>
     </w:p>
     <w:p>
@@ -17612,7 +17612,7 @@
         <w:pStyle w:val="Ttulo1"/>
         <w:jc w:val="center"/>
       </w:pPr>
-      <w:bookmarkStart w:id="64" w:name="_Toc243302142"/>
+      <w:bookmarkStart w:id="64" w:name="_Toc243416733"/>
       <w:r>
         <w:t>REFERÊNCIAS</w:t>
       </w:r>
@@ -18489,7 +18489,7 @@
         <w:pStyle w:val="Ttulo1"/>
         <w:jc w:val="center"/>
       </w:pPr>
-      <w:bookmarkStart w:id="65" w:name="_Toc243302143"/>
+      <w:bookmarkStart w:id="65" w:name="_Toc243416734"/>
       <w:r>
         <w:t>APÊNDICE A – FONTES DO CONTEÚDO POR MARCADOR</w:t>
       </w:r>
@@ -18509,7 +18509,7 @@
       <w:pPr>
         <w:pStyle w:val="LegendaABNT"/>
       </w:pPr>
-      <w:bookmarkStart w:id="66" w:name="_Toc243302165"/>
+      <w:bookmarkStart w:id="66" w:name="_Toc243416756"/>
       <w:r>
         <w:t xml:space="preserve">Quadro </w:t>
       </w:r>
@@ -20884,7 +20884,7 @@
         <w:pStyle w:val="Ttulo1"/>
         <w:jc w:val="center"/>
       </w:pPr>
-      <w:bookmarkStart w:id="67" w:name="_Toc243302144"/>
+      <w:bookmarkStart w:id="67" w:name="_Toc243416735"/>
       <w:r>
         <w:t>APÊNDICE B – CÓDIGO-FONTE E EXECUÇÃO</w:t>
       </w:r>
@@ -20979,7 +20979,7 @@
         <w:pStyle w:val="Ttulo1"/>
         <w:jc w:val="center"/>
       </w:pPr>
-      <w:bookmarkStart w:id="68" w:name="_Toc243302145"/>
+      <w:bookmarkStart w:id="68" w:name="_Toc243416736"/>
       <w:r>
         <w:t>APÊNDICE C – QUESTÕES DO PRÉ-TESTE E DO PÓS-TESTE</w:t>
       </w:r>
@@ -21820,7 +21820,7 @@
         <w:pStyle w:val="Ttulo1"/>
         <w:jc w:val="center"/>
       </w:pPr>
-      <w:bookmarkStart w:id="69" w:name="_Toc243302146"/>
+      <w:bookmarkStart w:id="69" w:name="_Toc243416737"/>
       <w:r>
         <w:t>APÊNDICE D – QUESTIONÁRIO DE OPINIÃO</w:t>
       </w:r>
@@ -22166,10 +22166,10 @@
 <file path=word/numbering.xml><?xml version="1.0" encoding="utf-8"?>
 <w:numbering xmlns:wpc="http://schemas.microsoft.com/office/word/2010/wordprocessingCanvas" xmlns:cx="http://schemas.microsoft.com/office/drawing/2014/chartex" xmlns:cx1="http://schemas.microsoft.com/office/drawing/2015/9/8/chartex" xmlns:cx2="http://schemas.microsoft.com/office/drawing/2015/10/21/chartex" xmlns:cx3="http://schemas.microsoft.com/office/drawing/2016/5/9/chartex" xmlns:cx4="http://schemas.microsoft.com/office/drawing/2016/5/10/chartex" xmlns:cx5="http://schemas.microsoft.com/office/drawing/2016/5/11/chartex" xmlns:cx6="http://schemas.microsoft.com/office/drawing/2016/5/12/chartex" xmlns:cx7="http://schemas.microsoft.com/office/drawing/2016/5/13/chartex" xmlns:cx8="http://schemas.microsoft.com/office/drawing/2016/5/14/chartex" xmlns:mc="http://schemas.openxmlformats.org/markup-compatibility/2006" xmlns:aink="http://schemas.microsoft.com/office/drawing/2016/ink" xmlns:am3d="http://schemas.microsoft.com/office/drawing/2017/model3d" xmlns:o="urn:schemas-microsoft-com:office:office" xmlns:oel="http://schemas.microsoft.com/office/2019/extlst" xmlns:r="http://schemas.openxmlformats.org/officeDocument/2006/relationships" xmlns:m="http://schemas.openxmlformats.org/officeDocument/2006/math" xmlns:v="urn:schemas-microsoft-com:vml" xmlns:wp14="http://schemas.microsoft.com/office/word/2010/wordprocessingDrawing" xmlns:wp="http://schemas.openxmlformats.org/drawingml/2006/wordprocessingDrawing" xmlns:w10="urn:schemas-microsoft-com:office:word" xmlns:w="http://schemas.openxmlformats.org/wordprocessingml/2006/main" xmlns:w14="http://schemas.microsoft.com/office/word/2010/wordml" xmlns:w15="http://schemas.microsoft.com/office/word/2012/wordml" xmlns:w16cex="http://schemas.microsoft.com/office/word/2018/wordml/cex" xmlns:w16cid="http://schemas.microsoft.com/office/word/2016/wordml/cid" xmlns:w16="http://schemas.microsoft.com/office/word/2018/wordml" xmlns:w16du="http://schemas.microsoft.com/office/word/2023/wordml/word16du" xmlns:w16sdtdh="http://schemas.microsoft.com/office/word/2020/wordml/sdtdatahash" xmlns:w16sdtfl="http://schemas.microsoft.com/office/word/2024/wordml/sdtformatlock" xmlns:w16se="http://schemas.microsoft.com/office/word/2015/wordml/symex" xmlns:wpg="http://schemas.microsoft.com/office/word/2010/wordprocessingGroup" xmlns:wpi="http://schemas.microsoft.com/office/word/2010/wordprocessingInk" xmlns:wne="http://schemas.microsoft.com/office/word/2006/wordml" xmlns:wps="http://schemas.microsoft.com/office/word/2010/wordprocessingShape" mc:Ignorable="w14 w15 w16se w16cid w16 w16cex w16sdtdh w16sdtfl w16du wp14">
   <w:abstractNum w:abstractNumId="0" w15:restartNumberingAfterBreak="0">
-    <w:nsid w:val="3D605F2D"/>
+    <w:nsid w:val="65845218"/>
     <w:multiLevelType w:val="hybridMultilevel"/>
-    <w:tmpl w:val="FA726E54"/>
-    <w:lvl w:ilvl="0" w:tplc="1966DE36">
+    <w:tmpl w:val="77F20AD6"/>
+    <w:lvl w:ilvl="0" w:tplc="14A427E2">
       <w:start w:val="1"/>
       <w:numFmt w:val="lowerLetter"/>
       <w:lvlText w:val="%1)"/>
@@ -22178,52 +22178,52 @@
         <w:ind w:left="1106" w:hanging="397"/>
       </w:pPr>
     </w:lvl>
-    <w:lvl w:ilvl="1" w:tplc="4768EEC4">
+    <w:lvl w:ilvl="1" w:tplc="5D969B6C">
       <w:numFmt w:val="decimal"/>
       <w:lvlText w:val=""/>
       <w:lvlJc w:val="left"/>
     </w:lvl>
-    <w:lvl w:ilvl="2" w:tplc="59E2AC3C">
+    <w:lvl w:ilvl="2" w:tplc="2DA0B54E">
       <w:numFmt w:val="decimal"/>
       <w:lvlText w:val=""/>
       <w:lvlJc w:val="left"/>
     </w:lvl>
-    <w:lvl w:ilvl="3" w:tplc="1CC2A474">
+    <w:lvl w:ilvl="3" w:tplc="144CE542">
       <w:numFmt w:val="decimal"/>
       <w:lvlText w:val=""/>
       <w:lvlJc w:val="left"/>
     </w:lvl>
-    <w:lvl w:ilvl="4" w:tplc="AA366664">
+    <w:lvl w:ilvl="4" w:tplc="9B92C550">
       <w:numFmt w:val="decimal"/>
       <w:lvlText w:val=""/>
       <w:lvlJc w:val="left"/>
     </w:lvl>
-    <w:lvl w:ilvl="5" w:tplc="6DA867CA">
+    <w:lvl w:ilvl="5" w:tplc="0A860FB2">
       <w:numFmt w:val="decimal"/>
       <w:lvlText w:val=""/>
       <w:lvlJc w:val="left"/>
     </w:lvl>
-    <w:lvl w:ilvl="6" w:tplc="35705C46">
+    <w:lvl w:ilvl="6" w:tplc="86C00CA6">
       <w:numFmt w:val="decimal"/>
       <w:lvlText w:val=""/>
       <w:lvlJc w:val="left"/>
     </w:lvl>
-    <w:lvl w:ilvl="7" w:tplc="412A3B4E">
+    <w:lvl w:ilvl="7" w:tplc="877AE5A2">
       <w:numFmt w:val="decimal"/>
       <w:lvlText w:val=""/>
       <w:lvlJc w:val="left"/>
     </w:lvl>
-    <w:lvl w:ilvl="8" w:tplc="895C0832">
+    <w:lvl w:ilvl="8" w:tplc="067E6846">
       <w:numFmt w:val="decimal"/>
       <w:lvlText w:val=""/>
       <w:lvlJc w:val="left"/>
     </w:lvl>
   </w:abstractNum>
   <w:abstractNum w:abstractNumId="1" w15:restartNumberingAfterBreak="0">
-    <w:nsid w:val="62E94DB9"/>
+    <w:nsid w:val="672665B0"/>
     <w:multiLevelType w:val="hybridMultilevel"/>
-    <w:tmpl w:val="A2B2366E"/>
-    <w:lvl w:ilvl="0" w:tplc="8C065568" w:tentative="1">
+    <w:tmpl w:val="391C4D56"/>
+    <w:lvl w:ilvl="0" w:tplc="475E450A" w:tentative="1">
       <w:start w:val="1"/>
       <w:numFmt w:val="bullet"/>
       <w:lvlText w:val="●"/>
@@ -22232,7 +22232,7 @@
         <w:ind w:left="720" w:hanging="360"/>
       </w:pPr>
     </w:lvl>
-    <w:lvl w:ilvl="1" w:tplc="D388B1E6" w:tentative="1">
+    <w:lvl w:ilvl="1" w:tplc="E3B2B232" w:tentative="1">
       <w:start w:val="1"/>
       <w:numFmt w:val="bullet"/>
       <w:lvlText w:val="○"/>
@@ -22241,7 +22241,7 @@
         <w:ind w:left="1440" w:hanging="360"/>
       </w:pPr>
     </w:lvl>
-    <w:lvl w:ilvl="2" w:tplc="5BF2CA1A" w:tentative="1">
+    <w:lvl w:ilvl="2" w:tplc="BCEC282A" w:tentative="1">
       <w:start w:val="1"/>
       <w:numFmt w:val="bullet"/>
       <w:lvlText w:val="■"/>
@@ -22250,7 +22250,7 @@
         <w:ind w:left="2160" w:hanging="360"/>
       </w:pPr>
     </w:lvl>
-    <w:lvl w:ilvl="3" w:tplc="BD2493FA" w:tentative="1">
+    <w:lvl w:ilvl="3" w:tplc="22686BAC" w:tentative="1">
       <w:start w:val="1"/>
       <w:numFmt w:val="bullet"/>
       <w:lvlText w:val="●"/>
@@ -22259,7 +22259,7 @@
         <w:ind w:left="2880" w:hanging="360"/>
       </w:pPr>
     </w:lvl>
-    <w:lvl w:ilvl="4" w:tplc="8460BE38" w:tentative="1">
+    <w:lvl w:ilvl="4" w:tplc="15444ADC" w:tentative="1">
       <w:start w:val="1"/>
       <w:numFmt w:val="bullet"/>
       <w:lvlText w:val="○"/>
@@ -22268,7 +22268,7 @@
         <w:ind w:left="3600" w:hanging="360"/>
       </w:pPr>
     </w:lvl>
-    <w:lvl w:ilvl="5" w:tplc="15B4027A" w:tentative="1">
+    <w:lvl w:ilvl="5" w:tplc="62F26C98" w:tentative="1">
       <w:start w:val="1"/>
       <w:numFmt w:val="bullet"/>
       <w:lvlText w:val="■"/>
@@ -22277,7 +22277,7 @@
         <w:ind w:left="4320" w:hanging="360"/>
       </w:pPr>
     </w:lvl>
-    <w:lvl w:ilvl="6" w:tplc="73DAE084" w:tentative="1">
+    <w:lvl w:ilvl="6" w:tplc="6BA4D0A4" w:tentative="1">
       <w:start w:val="1"/>
       <w:numFmt w:val="bullet"/>
       <w:lvlText w:val="●"/>
@@ -22286,7 +22286,7 @@
         <w:ind w:left="5040" w:hanging="360"/>
       </w:pPr>
     </w:lvl>
-    <w:lvl w:ilvl="7" w:tplc="BA3E8196" w:tentative="1">
+    <w:lvl w:ilvl="7" w:tplc="AC608142" w:tentative="1">
       <w:start w:val="1"/>
       <w:numFmt w:val="bullet"/>
       <w:lvlText w:val="●"/>
@@ -22295,7 +22295,7 @@
         <w:ind w:left="5760" w:hanging="360"/>
       </w:pPr>
     </w:lvl>
-    <w:lvl w:ilvl="8" w:tplc="007AB56C" w:tentative="1">
+    <w:lvl w:ilvl="8" w:tplc="31E223F0" w:tentative="1">
       <w:start w:val="1"/>
       <w:numFmt w:val="bullet"/>
       <w:lvlText w:val="●"/>
@@ -22305,97 +22305,97 @@
       </w:pPr>
     </w:lvl>
   </w:abstractNum>
-  <w:num w:numId="1" w16cid:durableId="924144810">
+  <w:num w:numId="1" w16cid:durableId="940799439">
     <w:abstractNumId w:val="1"/>
     <w:lvlOverride w:ilvl="0">
       <w:startOverride w:val="1"/>
     </w:lvlOverride>
   </w:num>
-  <w:num w:numId="2" w16cid:durableId="1990131837">
+  <w:num w:numId="2" w16cid:durableId="783619779">
     <w:abstractNumId w:val="0"/>
     <w:lvlOverride w:ilvl="0">
       <w:startOverride w:val="1"/>
     </w:lvlOverride>
   </w:num>
-  <w:num w:numId="3" w16cid:durableId="463546805">
+  <w:num w:numId="3" w16cid:durableId="2083945240">
     <w:abstractNumId w:val="0"/>
     <w:lvlOverride w:ilvl="0">
       <w:startOverride w:val="1"/>
     </w:lvlOverride>
   </w:num>
-  <w:num w:numId="4" w16cid:durableId="1279802546">
+  <w:num w:numId="4" w16cid:durableId="1298561619">
     <w:abstractNumId w:val="0"/>
     <w:lvlOverride w:ilvl="0">
       <w:startOverride w:val="1"/>
     </w:lvlOverride>
   </w:num>
-  <w:num w:numId="5" w16cid:durableId="664630536">
+  <w:num w:numId="5" w16cid:durableId="1547253547">
     <w:abstractNumId w:val="0"/>
     <w:lvlOverride w:ilvl="0">
       <w:startOverride w:val="1"/>
     </w:lvlOverride>
   </w:num>
-  <w:num w:numId="6" w16cid:durableId="888103132">
+  <w:num w:numId="6" w16cid:durableId="209002088">
     <w:abstractNumId w:val="0"/>
     <w:lvlOverride w:ilvl="0">
       <w:startOverride w:val="1"/>
     </w:lvlOverride>
   </w:num>
-  <w:num w:numId="7" w16cid:durableId="735054404">
+  <w:num w:numId="7" w16cid:durableId="33703561">
     <w:abstractNumId w:val="0"/>
     <w:lvlOverride w:ilvl="0">
       <w:startOverride w:val="1"/>
     </w:lvlOverride>
   </w:num>
-  <w:num w:numId="8" w16cid:durableId="24258919">
+  <w:num w:numId="8" w16cid:durableId="759571361">
     <w:abstractNumId w:val="0"/>
     <w:lvlOverride w:ilvl="0">
       <w:startOverride w:val="1"/>
     </w:lvlOverride>
   </w:num>
-  <w:num w:numId="9" w16cid:durableId="2118211523">
+  <w:num w:numId="9" w16cid:durableId="1689528676">
     <w:abstractNumId w:val="0"/>
     <w:lvlOverride w:ilvl="0">
       <w:startOverride w:val="1"/>
     </w:lvlOverride>
   </w:num>
-  <w:num w:numId="10" w16cid:durableId="345518796">
+  <w:num w:numId="10" w16cid:durableId="627710153">
     <w:abstractNumId w:val="0"/>
     <w:lvlOverride w:ilvl="0">
       <w:startOverride w:val="1"/>
     </w:lvlOverride>
   </w:num>
-  <w:num w:numId="11" w16cid:durableId="2024162832">
+  <w:num w:numId="11" w16cid:durableId="1790586153">
     <w:abstractNumId w:val="0"/>
     <w:lvlOverride w:ilvl="0">
       <w:startOverride w:val="1"/>
     </w:lvlOverride>
   </w:num>
-  <w:num w:numId="12" w16cid:durableId="1490289021">
+  <w:num w:numId="12" w16cid:durableId="876042021">
     <w:abstractNumId w:val="0"/>
     <w:lvlOverride w:ilvl="0">
       <w:startOverride w:val="1"/>
     </w:lvlOverride>
   </w:num>
-  <w:num w:numId="13" w16cid:durableId="1853490193">
+  <w:num w:numId="13" w16cid:durableId="1499733726">
     <w:abstractNumId w:val="0"/>
     <w:lvlOverride w:ilvl="0">
       <w:startOverride w:val="1"/>
     </w:lvlOverride>
   </w:num>
-  <w:num w:numId="14" w16cid:durableId="2096437247">
+  <w:num w:numId="14" w16cid:durableId="141124476">
     <w:abstractNumId w:val="0"/>
     <w:lvlOverride w:ilvl="0">
       <w:startOverride w:val="1"/>
     </w:lvlOverride>
   </w:num>
-  <w:num w:numId="15" w16cid:durableId="869883047">
+  <w:num w:numId="15" w16cid:durableId="1840198031">
     <w:abstractNumId w:val="0"/>
     <w:lvlOverride w:ilvl="0">
       <w:startOverride w:val="1"/>
     </w:lvlOverride>
   </w:num>
-  <w:num w:numId="16" w16cid:durableId="1336494319">
+  <w:num w:numId="16" w16cid:durableId="959729739">
     <w:abstractNumId w:val="0"/>
     <w:lvlOverride w:ilvl="0">
       <w:startOverride w:val="1"/>

</xml_diff>

<commit_message>
Relatório: o APK da versão 0.6 já está publicado no site
</commit_message>
<xml_diff>
--- a/relatorio/Relatorio_Final_PIBIC_BioquimicaEDU.docx
+++ b/relatorio/Relatorio_Final_PIBIC_BioquimicaEDU.docx
@@ -329,7 +329,7 @@
     <w:sdt>
       <w:sdtPr>
         <w:alias w:val="LISTA DE FIGURAS"/>
-        <w:id w:val="76865456"/>
+        <w:id w:val="640149772"/>
       </w:sdtPr>
       <w:sdtEndPr/>
       <w:sdtContent>
@@ -355,7 +355,7 @@
           <w:r>
             <w:fldChar w:fldCharType="separate"/>
           </w:r>
-          <w:hyperlink w:anchor="_Toc243416738" w:history="1">
+          <w:hyperlink w:anchor="_Toc243474413" w:history="1">
             <w:r>
               <w:rPr>
                 <w:rStyle w:val="Hyperlink"/>
@@ -379,7 +379,7 @@
               <w:rPr>
                 <w:noProof/>
               </w:rPr>
-              <w:instrText xml:space="preserve"> PAGEREF _Toc243416738 \h </w:instrText>
+              <w:instrText xml:space="preserve"> PAGEREF _Toc243474413 \h </w:instrText>
             </w:r>
             <w:r>
               <w:rPr>
@@ -419,7 +419,7 @@
               <w14:ligatures w14:val="standardContextual"/>
             </w:rPr>
           </w:pPr>
-          <w:hyperlink w:anchor="_Toc243416739" w:history="1">
+          <w:hyperlink w:anchor="_Toc243474414" w:history="1">
             <w:r>
               <w:rPr>
                 <w:rStyle w:val="Hyperlink"/>
@@ -443,7 +443,7 @@
               <w:rPr>
                 <w:noProof/>
               </w:rPr>
-              <w:instrText xml:space="preserve"> PAGEREF _Toc243416739 \h </w:instrText>
+              <w:instrText xml:space="preserve"> PAGEREF _Toc243474414 \h </w:instrText>
             </w:r>
             <w:r>
               <w:rPr>
@@ -483,7 +483,7 @@
               <w14:ligatures w14:val="standardContextual"/>
             </w:rPr>
           </w:pPr>
-          <w:hyperlink w:anchor="_Toc243416740" w:history="1">
+          <w:hyperlink w:anchor="_Toc243474415" w:history="1">
             <w:r>
               <w:rPr>
                 <w:rStyle w:val="Hyperlink"/>
@@ -507,7 +507,7 @@
               <w:rPr>
                 <w:noProof/>
               </w:rPr>
-              <w:instrText xml:space="preserve"> PAGEREF _Toc243416740 \h </w:instrText>
+              <w:instrText xml:space="preserve"> PAGEREF _Toc243474415 \h </w:instrText>
             </w:r>
             <w:r>
               <w:rPr>
@@ -547,7 +547,7 @@
               <w14:ligatures w14:val="standardContextual"/>
             </w:rPr>
           </w:pPr>
-          <w:hyperlink w:anchor="_Toc243416741" w:history="1">
+          <w:hyperlink w:anchor="_Toc243474416" w:history="1">
             <w:r>
               <w:rPr>
                 <w:rStyle w:val="Hyperlink"/>
@@ -587,7 +587,7 @@
               <w:rPr>
                 <w:noProof/>
               </w:rPr>
-              <w:instrText xml:space="preserve"> PAGEREF _Toc243416741 \h </w:instrText>
+              <w:instrText xml:space="preserve"> PAGEREF _Toc243474416 \h </w:instrText>
             </w:r>
             <w:r>
               <w:rPr>
@@ -627,7 +627,7 @@
               <w14:ligatures w14:val="standardContextual"/>
             </w:rPr>
           </w:pPr>
-          <w:hyperlink w:anchor="_Toc243416742" w:history="1">
+          <w:hyperlink w:anchor="_Toc243474417" w:history="1">
             <w:r>
               <w:rPr>
                 <w:rStyle w:val="Hyperlink"/>
@@ -651,7 +651,7 @@
               <w:rPr>
                 <w:noProof/>
               </w:rPr>
-              <w:instrText xml:space="preserve"> PAGEREF _Toc243416742 \h </w:instrText>
+              <w:instrText xml:space="preserve"> PAGEREF _Toc243474417 \h </w:instrText>
             </w:r>
             <w:r>
               <w:rPr>
@@ -691,7 +691,7 @@
               <w14:ligatures w14:val="standardContextual"/>
             </w:rPr>
           </w:pPr>
-          <w:hyperlink w:anchor="_Toc243416743" w:history="1">
+          <w:hyperlink w:anchor="_Toc243474418" w:history="1">
             <w:r>
               <w:rPr>
                 <w:rStyle w:val="Hyperlink"/>
@@ -715,7 +715,7 @@
               <w:rPr>
                 <w:noProof/>
               </w:rPr>
-              <w:instrText xml:space="preserve"> PAGEREF _Toc243416743 \h </w:instrText>
+              <w:instrText xml:space="preserve"> PAGEREF _Toc243474418 \h </w:instrText>
             </w:r>
             <w:r>
               <w:rPr>
@@ -755,7 +755,7 @@
               <w14:ligatures w14:val="standardContextual"/>
             </w:rPr>
           </w:pPr>
-          <w:hyperlink w:anchor="_Toc243416744" w:history="1">
+          <w:hyperlink w:anchor="_Toc243474419" w:history="1">
             <w:r>
               <w:rPr>
                 <w:rStyle w:val="Hyperlink"/>
@@ -779,7 +779,7 @@
               <w:rPr>
                 <w:noProof/>
               </w:rPr>
-              <w:instrText xml:space="preserve"> PAGEREF _Toc243416744 \h </w:instrText>
+              <w:instrText xml:space="preserve"> PAGEREF _Toc243474419 \h </w:instrText>
             </w:r>
             <w:r>
               <w:rPr>
@@ -819,7 +819,7 @@
               <w14:ligatures w14:val="standardContextual"/>
             </w:rPr>
           </w:pPr>
-          <w:hyperlink w:anchor="_Toc243416745" w:history="1">
+          <w:hyperlink w:anchor="_Toc243474420" w:history="1">
             <w:r>
               <w:rPr>
                 <w:rStyle w:val="Hyperlink"/>
@@ -843,7 +843,7 @@
               <w:rPr>
                 <w:noProof/>
               </w:rPr>
-              <w:instrText xml:space="preserve"> PAGEREF _Toc243416745 \h </w:instrText>
+              <w:instrText xml:space="preserve"> PAGEREF _Toc243474420 \h </w:instrText>
             </w:r>
             <w:r>
               <w:rPr>
@@ -883,7 +883,7 @@
               <w14:ligatures w14:val="standardContextual"/>
             </w:rPr>
           </w:pPr>
-          <w:hyperlink w:anchor="_Toc243416746" w:history="1">
+          <w:hyperlink w:anchor="_Toc243474421" w:history="1">
             <w:r>
               <w:rPr>
                 <w:rStyle w:val="Hyperlink"/>
@@ -907,7 +907,7 @@
               <w:rPr>
                 <w:noProof/>
               </w:rPr>
-              <w:instrText xml:space="preserve"> PAGEREF _Toc243416746 \h </w:instrText>
+              <w:instrText xml:space="preserve"> PAGEREF _Toc243474421 \h </w:instrText>
             </w:r>
             <w:r>
               <w:rPr>
@@ -947,7 +947,7 @@
               <w14:ligatures w14:val="standardContextual"/>
             </w:rPr>
           </w:pPr>
-          <w:hyperlink w:anchor="_Toc243416747" w:history="1">
+          <w:hyperlink w:anchor="_Toc243474422" w:history="1">
             <w:r>
               <w:rPr>
                 <w:rStyle w:val="Hyperlink"/>
@@ -971,7 +971,7 @@
               <w:rPr>
                 <w:noProof/>
               </w:rPr>
-              <w:instrText xml:space="preserve"> PAGEREF _Toc243416747 \h </w:instrText>
+              <w:instrText xml:space="preserve"> PAGEREF _Toc243474422 \h </w:instrText>
             </w:r>
             <w:r>
               <w:rPr>
@@ -1011,7 +1011,7 @@
               <w14:ligatures w14:val="standardContextual"/>
             </w:rPr>
           </w:pPr>
-          <w:hyperlink w:anchor="_Toc243416748" w:history="1">
+          <w:hyperlink w:anchor="_Toc243474423" w:history="1">
             <w:r>
               <w:rPr>
                 <w:rStyle w:val="Hyperlink"/>
@@ -1035,7 +1035,7 @@
               <w:rPr>
                 <w:noProof/>
               </w:rPr>
-              <w:instrText xml:space="preserve"> PAGEREF _Toc243416748 \h </w:instrText>
+              <w:instrText xml:space="preserve"> PAGEREF _Toc243474423 \h </w:instrText>
             </w:r>
             <w:r>
               <w:rPr>
@@ -1075,7 +1075,7 @@
               <w14:ligatures w14:val="standardContextual"/>
             </w:rPr>
           </w:pPr>
-          <w:hyperlink w:anchor="_Toc243416749" w:history="1">
+          <w:hyperlink w:anchor="_Toc243474424" w:history="1">
             <w:r>
               <w:rPr>
                 <w:rStyle w:val="Hyperlink"/>
@@ -1099,7 +1099,7 @@
               <w:rPr>
                 <w:noProof/>
               </w:rPr>
-              <w:instrText xml:space="preserve"> PAGEREF _Toc243416749 \h </w:instrText>
+              <w:instrText xml:space="preserve"> PAGEREF _Toc243474424 \h </w:instrText>
             </w:r>
             <w:r>
               <w:rPr>
@@ -1144,7 +1144,7 @@
     <w:sdt>
       <w:sdtPr>
         <w:alias w:val="LISTA DE QUADROS"/>
-        <w:id w:val="-1036962502"/>
+        <w:id w:val="-418630212"/>
       </w:sdtPr>
       <w:sdtEndPr/>
       <w:sdtContent>
@@ -1170,7 +1170,7 @@
           <w:r>
             <w:fldChar w:fldCharType="separate"/>
           </w:r>
-          <w:hyperlink w:anchor="_Toc243416750" w:history="1">
+          <w:hyperlink w:anchor="_Toc243474425" w:history="1">
             <w:r>
               <w:rPr>
                 <w:rStyle w:val="Hyperlink"/>
@@ -1194,7 +1194,7 @@
               <w:rPr>
                 <w:noProof/>
               </w:rPr>
-              <w:instrText xml:space="preserve"> PAGEREF _Toc243416750 \h </w:instrText>
+              <w:instrText xml:space="preserve"> PAGEREF _Toc243474425 \h </w:instrText>
             </w:r>
             <w:r>
               <w:rPr>
@@ -1234,7 +1234,7 @@
               <w14:ligatures w14:val="standardContextual"/>
             </w:rPr>
           </w:pPr>
-          <w:hyperlink w:anchor="_Toc243416751" w:history="1">
+          <w:hyperlink w:anchor="_Toc243474426" w:history="1">
             <w:r>
               <w:rPr>
                 <w:rStyle w:val="Hyperlink"/>
@@ -1258,7 +1258,7 @@
               <w:rPr>
                 <w:noProof/>
               </w:rPr>
-              <w:instrText xml:space="preserve"> PAGEREF _Toc243416751 \h </w:instrText>
+              <w:instrText xml:space="preserve"> PAGEREF _Toc243474426 \h </w:instrText>
             </w:r>
             <w:r>
               <w:rPr>
@@ -1298,7 +1298,7 @@
               <w14:ligatures w14:val="standardContextual"/>
             </w:rPr>
           </w:pPr>
-          <w:hyperlink w:anchor="_Toc243416752" w:history="1">
+          <w:hyperlink w:anchor="_Toc243474427" w:history="1">
             <w:r>
               <w:rPr>
                 <w:rStyle w:val="Hyperlink"/>
@@ -1322,7 +1322,7 @@
               <w:rPr>
                 <w:noProof/>
               </w:rPr>
-              <w:instrText xml:space="preserve"> PAGEREF _Toc243416752 \h </w:instrText>
+              <w:instrText xml:space="preserve"> PAGEREF _Toc243474427 \h </w:instrText>
             </w:r>
             <w:r>
               <w:rPr>
@@ -1362,7 +1362,7 @@
               <w14:ligatures w14:val="standardContextual"/>
             </w:rPr>
           </w:pPr>
-          <w:hyperlink w:anchor="_Toc243416753" w:history="1">
+          <w:hyperlink w:anchor="_Toc243474428" w:history="1">
             <w:r>
               <w:rPr>
                 <w:rStyle w:val="Hyperlink"/>
@@ -1386,7 +1386,7 @@
               <w:rPr>
                 <w:noProof/>
               </w:rPr>
-              <w:instrText xml:space="preserve"> PAGEREF _Toc243416753 \h </w:instrText>
+              <w:instrText xml:space="preserve"> PAGEREF _Toc243474428 \h </w:instrText>
             </w:r>
             <w:r>
               <w:rPr>
@@ -1426,7 +1426,7 @@
               <w14:ligatures w14:val="standardContextual"/>
             </w:rPr>
           </w:pPr>
-          <w:hyperlink w:anchor="_Toc243416754" w:history="1">
+          <w:hyperlink w:anchor="_Toc243474429" w:history="1">
             <w:r>
               <w:rPr>
                 <w:rStyle w:val="Hyperlink"/>
@@ -1450,7 +1450,7 @@
               <w:rPr>
                 <w:noProof/>
               </w:rPr>
-              <w:instrText xml:space="preserve"> PAGEREF _Toc243416754 \h </w:instrText>
+              <w:instrText xml:space="preserve"> PAGEREF _Toc243474429 \h </w:instrText>
             </w:r>
             <w:r>
               <w:rPr>
@@ -1490,7 +1490,7 @@
               <w14:ligatures w14:val="standardContextual"/>
             </w:rPr>
           </w:pPr>
-          <w:hyperlink w:anchor="_Toc243416755" w:history="1">
+          <w:hyperlink w:anchor="_Toc243474430" w:history="1">
             <w:r>
               <w:rPr>
                 <w:rStyle w:val="Hyperlink"/>
@@ -1514,7 +1514,7 @@
               <w:rPr>
                 <w:noProof/>
               </w:rPr>
-              <w:instrText xml:space="preserve"> PAGEREF _Toc243416755 \h </w:instrText>
+              <w:instrText xml:space="preserve"> PAGEREF _Toc243474430 \h </w:instrText>
             </w:r>
             <w:r>
               <w:rPr>
@@ -1554,7 +1554,7 @@
               <w14:ligatures w14:val="standardContextual"/>
             </w:rPr>
           </w:pPr>
-          <w:hyperlink w:anchor="_Toc243416756" w:history="1">
+          <w:hyperlink w:anchor="_Toc243474431" w:history="1">
             <w:r>
               <w:rPr>
                 <w:rStyle w:val="Hyperlink"/>
@@ -1578,7 +1578,7 @@
               <w:rPr>
                 <w:noProof/>
               </w:rPr>
-              <w:instrText xml:space="preserve"> PAGEREF _Toc243416756 \h </w:instrText>
+              <w:instrText xml:space="preserve"> PAGEREF _Toc243474431 \h </w:instrText>
             </w:r>
             <w:r>
               <w:rPr>
@@ -1623,7 +1623,7 @@
     <w:sdt>
       <w:sdtPr>
         <w:alias w:val="LISTA DE TABELAS"/>
-        <w:id w:val="999389164"/>
+        <w:id w:val="-1088385168"/>
       </w:sdtPr>
       <w:sdtEndPr/>
       <w:sdtContent>
@@ -1649,7 +1649,7 @@
           <w:r>
             <w:fldChar w:fldCharType="separate"/>
           </w:r>
-          <w:hyperlink w:anchor="_Toc243416757" w:history="1">
+          <w:hyperlink w:anchor="_Toc243474432" w:history="1">
             <w:r>
               <w:rPr>
                 <w:rStyle w:val="Hyperlink"/>
@@ -1673,7 +1673,7 @@
               <w:rPr>
                 <w:noProof/>
               </w:rPr>
-              <w:instrText xml:space="preserve"> PAGEREF _Toc243416757 \h </w:instrText>
+              <w:instrText xml:space="preserve"> PAGEREF _Toc243474432 \h </w:instrText>
             </w:r>
             <w:r>
               <w:rPr>
@@ -1713,7 +1713,7 @@
               <w14:ligatures w14:val="standardContextual"/>
             </w:rPr>
           </w:pPr>
-          <w:hyperlink w:anchor="_Toc243416758" w:history="1">
+          <w:hyperlink w:anchor="_Toc243474433" w:history="1">
             <w:r>
               <w:rPr>
                 <w:rStyle w:val="Hyperlink"/>
@@ -1737,7 +1737,7 @@
               <w:rPr>
                 <w:noProof/>
               </w:rPr>
-              <w:instrText xml:space="preserve"> PAGEREF _Toc243416758 \h </w:instrText>
+              <w:instrText xml:space="preserve"> PAGEREF _Toc243474433 \h </w:instrText>
             </w:r>
             <w:r>
               <w:rPr>
@@ -1777,7 +1777,7 @@
               <w14:ligatures w14:val="standardContextual"/>
             </w:rPr>
           </w:pPr>
-          <w:hyperlink w:anchor="_Toc243416759" w:history="1">
+          <w:hyperlink w:anchor="_Toc243474434" w:history="1">
             <w:r>
               <w:rPr>
                 <w:rStyle w:val="Hyperlink"/>
@@ -1801,7 +1801,7 @@
               <w:rPr>
                 <w:noProof/>
               </w:rPr>
-              <w:instrText xml:space="preserve"> PAGEREF _Toc243416759 \h </w:instrText>
+              <w:instrText xml:space="preserve"> PAGEREF _Toc243474434 \h </w:instrText>
             </w:r>
             <w:r>
               <w:rPr>
@@ -1841,7 +1841,7 @@
               <w14:ligatures w14:val="standardContextual"/>
             </w:rPr>
           </w:pPr>
-          <w:hyperlink w:anchor="_Toc243416760" w:history="1">
+          <w:hyperlink w:anchor="_Toc243474435" w:history="1">
             <w:r>
               <w:rPr>
                 <w:rStyle w:val="Hyperlink"/>
@@ -1865,7 +1865,7 @@
               <w:rPr>
                 <w:noProof/>
               </w:rPr>
-              <w:instrText xml:space="preserve"> PAGEREF _Toc243416760 \h </w:instrText>
+              <w:instrText xml:space="preserve"> PAGEREF _Toc243474435 \h </w:instrText>
             </w:r>
             <w:r>
               <w:rPr>
@@ -1905,7 +1905,7 @@
               <w14:ligatures w14:val="standardContextual"/>
             </w:rPr>
           </w:pPr>
-          <w:hyperlink w:anchor="_Toc243416761" w:history="1">
+          <w:hyperlink w:anchor="_Toc243474436" w:history="1">
             <w:r>
               <w:rPr>
                 <w:rStyle w:val="Hyperlink"/>
@@ -1929,7 +1929,7 @@
               <w:rPr>
                 <w:noProof/>
               </w:rPr>
-              <w:instrText xml:space="preserve"> PAGEREF _Toc243416761 \h </w:instrText>
+              <w:instrText xml:space="preserve"> PAGEREF _Toc243474436 \h </w:instrText>
             </w:r>
             <w:r>
               <w:rPr>
@@ -2532,7 +2532,7 @@
           <w:bCs w:val="0"/>
         </w:rPr>
         <w:alias w:val="Sumário"/>
-        <w:id w:val="-295449585"/>
+        <w:id w:val="205227630"/>
       </w:sdtPr>
       <w:sdtEndPr/>
       <w:sdtContent>
@@ -2560,7 +2560,7 @@
           <w:r>
             <w:fldChar w:fldCharType="separate"/>
           </w:r>
-          <w:hyperlink w:anchor="_Toc243416692" w:history="1">
+          <w:hyperlink w:anchor="_Toc243474367" w:history="1">
             <w:r>
               <w:rPr>
                 <w:rStyle w:val="Hyperlink"/>
@@ -2584,7 +2584,7 @@
               <w:rPr>
                 <w:noProof/>
               </w:rPr>
-              <w:instrText xml:space="preserve"> PAGEREF _Toc243416692 \h </w:instrText>
+              <w:instrText xml:space="preserve"> PAGEREF _Toc243474367 \h </w:instrText>
             </w:r>
             <w:r>
               <w:rPr>
@@ -2624,7 +2624,7 @@
               <w14:ligatures w14:val="standardContextual"/>
             </w:rPr>
           </w:pPr>
-          <w:hyperlink w:anchor="_Toc243416693" w:history="1">
+          <w:hyperlink w:anchor="_Toc243474368" w:history="1">
             <w:r>
               <w:rPr>
                 <w:rStyle w:val="Hyperlink"/>
@@ -2648,7 +2648,7 @@
               <w:rPr>
                 <w:noProof/>
               </w:rPr>
-              <w:instrText xml:space="preserve"> PAGEREF _Toc243416693 \h </w:instrText>
+              <w:instrText xml:space="preserve"> PAGEREF _Toc243474368 \h </w:instrText>
             </w:r>
             <w:r>
               <w:rPr>
@@ -2688,7 +2688,7 @@
               <w14:ligatures w14:val="standardContextual"/>
             </w:rPr>
           </w:pPr>
-          <w:hyperlink w:anchor="_Toc243416694" w:history="1">
+          <w:hyperlink w:anchor="_Toc243474369" w:history="1">
             <w:r>
               <w:rPr>
                 <w:rStyle w:val="Hyperlink"/>
@@ -2712,7 +2712,7 @@
               <w:rPr>
                 <w:noProof/>
               </w:rPr>
-              <w:instrText xml:space="preserve"> PAGEREF _Toc243416694 \h </w:instrText>
+              <w:instrText xml:space="preserve"> PAGEREF _Toc243474369 \h </w:instrText>
             </w:r>
             <w:r>
               <w:rPr>
@@ -2752,7 +2752,7 @@
               <w14:ligatures w14:val="standardContextual"/>
             </w:rPr>
           </w:pPr>
-          <w:hyperlink w:anchor="_Toc243416695" w:history="1">
+          <w:hyperlink w:anchor="_Toc243474370" w:history="1">
             <w:r>
               <w:rPr>
                 <w:rStyle w:val="Hyperlink"/>
@@ -2776,7 +2776,7 @@
               <w:rPr>
                 <w:noProof/>
               </w:rPr>
-              <w:instrText xml:space="preserve"> PAGEREF _Toc243416695 \h </w:instrText>
+              <w:instrText xml:space="preserve"> PAGEREF _Toc243474370 \h </w:instrText>
             </w:r>
             <w:r>
               <w:rPr>
@@ -2816,7 +2816,7 @@
               <w14:ligatures w14:val="standardContextual"/>
             </w:rPr>
           </w:pPr>
-          <w:hyperlink w:anchor="_Toc243416696" w:history="1">
+          <w:hyperlink w:anchor="_Toc243474371" w:history="1">
             <w:r>
               <w:rPr>
                 <w:rStyle w:val="Hyperlink"/>
@@ -2840,7 +2840,7 @@
               <w:rPr>
                 <w:noProof/>
               </w:rPr>
-              <w:instrText xml:space="preserve"> PAGEREF _Toc243416696 \h </w:instrText>
+              <w:instrText xml:space="preserve"> PAGEREF _Toc243474371 \h </w:instrText>
             </w:r>
             <w:r>
               <w:rPr>
@@ -2882,7 +2882,7 @@
               <w14:ligatures w14:val="standardContextual"/>
             </w:rPr>
           </w:pPr>
-          <w:hyperlink w:anchor="_Toc243416697" w:history="1">
+          <w:hyperlink w:anchor="_Toc243474372" w:history="1">
             <w:r>
               <w:rPr>
                 <w:rStyle w:val="Hyperlink"/>
@@ -2906,7 +2906,7 @@
               <w:rPr>
                 <w:noProof/>
               </w:rPr>
-              <w:instrText xml:space="preserve"> PAGEREF _Toc243416697 \h </w:instrText>
+              <w:instrText xml:space="preserve"> PAGEREF _Toc243474372 \h </w:instrText>
             </w:r>
             <w:r>
               <w:rPr>
@@ -2946,7 +2946,7 @@
               <w14:ligatures w14:val="standardContextual"/>
             </w:rPr>
           </w:pPr>
-          <w:hyperlink w:anchor="_Toc243416698" w:history="1">
+          <w:hyperlink w:anchor="_Toc243474373" w:history="1">
             <w:r>
               <w:rPr>
                 <w:rStyle w:val="Hyperlink"/>
@@ -2970,7 +2970,7 @@
               <w:rPr>
                 <w:noProof/>
               </w:rPr>
-              <w:instrText xml:space="preserve"> PAGEREF _Toc243416698 \h </w:instrText>
+              <w:instrText xml:space="preserve"> PAGEREF _Toc243474373 \h </w:instrText>
             </w:r>
             <w:r>
               <w:rPr>
@@ -3010,7 +3010,7 @@
               <w14:ligatures w14:val="standardContextual"/>
             </w:rPr>
           </w:pPr>
-          <w:hyperlink w:anchor="_Toc243416699" w:history="1">
+          <w:hyperlink w:anchor="_Toc243474374" w:history="1">
             <w:r>
               <w:rPr>
                 <w:rStyle w:val="Hyperlink"/>
@@ -3034,7 +3034,7 @@
               <w:rPr>
                 <w:noProof/>
               </w:rPr>
-              <w:instrText xml:space="preserve"> PAGEREF _Toc243416699 \h </w:instrText>
+              <w:instrText xml:space="preserve"> PAGEREF _Toc243474374 \h </w:instrText>
             </w:r>
             <w:r>
               <w:rPr>
@@ -3074,7 +3074,7 @@
               <w14:ligatures w14:val="standardContextual"/>
             </w:rPr>
           </w:pPr>
-          <w:hyperlink w:anchor="_Toc243416700" w:history="1">
+          <w:hyperlink w:anchor="_Toc243474375" w:history="1">
             <w:r>
               <w:rPr>
                 <w:rStyle w:val="Hyperlink"/>
@@ -3098,7 +3098,7 @@
               <w:rPr>
                 <w:noProof/>
               </w:rPr>
-              <w:instrText xml:space="preserve"> PAGEREF _Toc243416700 \h </w:instrText>
+              <w:instrText xml:space="preserve"> PAGEREF _Toc243474375 \h </w:instrText>
             </w:r>
             <w:r>
               <w:rPr>
@@ -3138,7 +3138,7 @@
               <w14:ligatures w14:val="standardContextual"/>
             </w:rPr>
           </w:pPr>
-          <w:hyperlink w:anchor="_Toc243416701" w:history="1">
+          <w:hyperlink w:anchor="_Toc243474376" w:history="1">
             <w:r>
               <w:rPr>
                 <w:rStyle w:val="Hyperlink"/>
@@ -3162,7 +3162,7 @@
               <w:rPr>
                 <w:noProof/>
               </w:rPr>
-              <w:instrText xml:space="preserve"> PAGEREF _Toc243416701 \h </w:instrText>
+              <w:instrText xml:space="preserve"> PAGEREF _Toc243474376 \h </w:instrText>
             </w:r>
             <w:r>
               <w:rPr>
@@ -3202,7 +3202,7 @@
               <w14:ligatures w14:val="standardContextual"/>
             </w:rPr>
           </w:pPr>
-          <w:hyperlink w:anchor="_Toc243416702" w:history="1">
+          <w:hyperlink w:anchor="_Toc243474377" w:history="1">
             <w:r>
               <w:rPr>
                 <w:rStyle w:val="Hyperlink"/>
@@ -3226,7 +3226,7 @@
               <w:rPr>
                 <w:noProof/>
               </w:rPr>
-              <w:instrText xml:space="preserve"> PAGEREF _Toc243416702 \h </w:instrText>
+              <w:instrText xml:space="preserve"> PAGEREF _Toc243474377 \h </w:instrText>
             </w:r>
             <w:r>
               <w:rPr>
@@ -3268,7 +3268,7 @@
               <w14:ligatures w14:val="standardContextual"/>
             </w:rPr>
           </w:pPr>
-          <w:hyperlink w:anchor="_Toc243416703" w:history="1">
+          <w:hyperlink w:anchor="_Toc243474378" w:history="1">
             <w:r>
               <w:rPr>
                 <w:rStyle w:val="Hyperlink"/>
@@ -3292,7 +3292,7 @@
               <w:rPr>
                 <w:noProof/>
               </w:rPr>
-              <w:instrText xml:space="preserve"> PAGEREF _Toc243416703 \h </w:instrText>
+              <w:instrText xml:space="preserve"> PAGEREF _Toc243474378 \h </w:instrText>
             </w:r>
             <w:r>
               <w:rPr>
@@ -3332,7 +3332,7 @@
               <w14:ligatures w14:val="standardContextual"/>
             </w:rPr>
           </w:pPr>
-          <w:hyperlink w:anchor="_Toc243416704" w:history="1">
+          <w:hyperlink w:anchor="_Toc243474379" w:history="1">
             <w:r>
               <w:rPr>
                 <w:rStyle w:val="Hyperlink"/>
@@ -3356,7 +3356,7 @@
               <w:rPr>
                 <w:noProof/>
               </w:rPr>
-              <w:instrText xml:space="preserve"> PAGEREF _Toc243416704 \h </w:instrText>
+              <w:instrText xml:space="preserve"> PAGEREF _Toc243474379 \h </w:instrText>
             </w:r>
             <w:r>
               <w:rPr>
@@ -3396,7 +3396,7 @@
               <w14:ligatures w14:val="standardContextual"/>
             </w:rPr>
           </w:pPr>
-          <w:hyperlink w:anchor="_Toc243416705" w:history="1">
+          <w:hyperlink w:anchor="_Toc243474380" w:history="1">
             <w:r>
               <w:rPr>
                 <w:rStyle w:val="Hyperlink"/>
@@ -3420,7 +3420,7 @@
               <w:rPr>
                 <w:noProof/>
               </w:rPr>
-              <w:instrText xml:space="preserve"> PAGEREF _Toc243416705 \h </w:instrText>
+              <w:instrText xml:space="preserve"> PAGEREF _Toc243474380 \h </w:instrText>
             </w:r>
             <w:r>
               <w:rPr>
@@ -3460,7 +3460,7 @@
               <w14:ligatures w14:val="standardContextual"/>
             </w:rPr>
           </w:pPr>
-          <w:hyperlink w:anchor="_Toc243416706" w:history="1">
+          <w:hyperlink w:anchor="_Toc243474381" w:history="1">
             <w:r>
               <w:rPr>
                 <w:rStyle w:val="Hyperlink"/>
@@ -3484,7 +3484,7 @@
               <w:rPr>
                 <w:noProof/>
               </w:rPr>
-              <w:instrText xml:space="preserve"> PAGEREF _Toc243416706 \h </w:instrText>
+              <w:instrText xml:space="preserve"> PAGEREF _Toc243474381 \h </w:instrText>
             </w:r>
             <w:r>
               <w:rPr>
@@ -3524,7 +3524,7 @@
               <w14:ligatures w14:val="standardContextual"/>
             </w:rPr>
           </w:pPr>
-          <w:hyperlink w:anchor="_Toc243416707" w:history="1">
+          <w:hyperlink w:anchor="_Toc243474382" w:history="1">
             <w:r>
               <w:rPr>
                 <w:rStyle w:val="Hyperlink"/>
@@ -3548,7 +3548,7 @@
               <w:rPr>
                 <w:noProof/>
               </w:rPr>
-              <w:instrText xml:space="preserve"> PAGEREF _Toc243416707 \h </w:instrText>
+              <w:instrText xml:space="preserve"> PAGEREF _Toc243474382 \h </w:instrText>
             </w:r>
             <w:r>
               <w:rPr>
@@ -3588,7 +3588,7 @@
               <w14:ligatures w14:val="standardContextual"/>
             </w:rPr>
           </w:pPr>
-          <w:hyperlink w:anchor="_Toc243416708" w:history="1">
+          <w:hyperlink w:anchor="_Toc243474383" w:history="1">
             <w:r>
               <w:rPr>
                 <w:rStyle w:val="Hyperlink"/>
@@ -3612,7 +3612,7 @@
               <w:rPr>
                 <w:noProof/>
               </w:rPr>
-              <w:instrText xml:space="preserve"> PAGEREF _Toc243416708 \h </w:instrText>
+              <w:instrText xml:space="preserve"> PAGEREF _Toc243474383 \h </w:instrText>
             </w:r>
             <w:r>
               <w:rPr>
@@ -3652,7 +3652,7 @@
               <w14:ligatures w14:val="standardContextual"/>
             </w:rPr>
           </w:pPr>
-          <w:hyperlink w:anchor="_Toc243416709" w:history="1">
+          <w:hyperlink w:anchor="_Toc243474384" w:history="1">
             <w:r>
               <w:rPr>
                 <w:rStyle w:val="Hyperlink"/>
@@ -3676,7 +3676,7 @@
               <w:rPr>
                 <w:noProof/>
               </w:rPr>
-              <w:instrText xml:space="preserve"> PAGEREF _Toc243416709 \h </w:instrText>
+              <w:instrText xml:space="preserve"> PAGEREF _Toc243474384 \h </w:instrText>
             </w:r>
             <w:r>
               <w:rPr>
@@ -3716,7 +3716,7 @@
               <w14:ligatures w14:val="standardContextual"/>
             </w:rPr>
           </w:pPr>
-          <w:hyperlink w:anchor="_Toc243416710" w:history="1">
+          <w:hyperlink w:anchor="_Toc243474385" w:history="1">
             <w:r>
               <w:rPr>
                 <w:rStyle w:val="Hyperlink"/>
@@ -3740,7 +3740,7 @@
               <w:rPr>
                 <w:noProof/>
               </w:rPr>
-              <w:instrText xml:space="preserve"> PAGEREF _Toc243416710 \h </w:instrText>
+              <w:instrText xml:space="preserve"> PAGEREF _Toc243474385 \h </w:instrText>
             </w:r>
             <w:r>
               <w:rPr>
@@ -3780,7 +3780,7 @@
               <w14:ligatures w14:val="standardContextual"/>
             </w:rPr>
           </w:pPr>
-          <w:hyperlink w:anchor="_Toc243416711" w:history="1">
+          <w:hyperlink w:anchor="_Toc243474386" w:history="1">
             <w:r>
               <w:rPr>
                 <w:rStyle w:val="Hyperlink"/>
@@ -3804,7 +3804,7 @@
               <w:rPr>
                 <w:noProof/>
               </w:rPr>
-              <w:instrText xml:space="preserve"> PAGEREF _Toc243416711 \h </w:instrText>
+              <w:instrText xml:space="preserve"> PAGEREF _Toc243474386 \h </w:instrText>
             </w:r>
             <w:r>
               <w:rPr>
@@ -3844,7 +3844,7 @@
               <w14:ligatures w14:val="standardContextual"/>
             </w:rPr>
           </w:pPr>
-          <w:hyperlink w:anchor="_Toc243416712" w:history="1">
+          <w:hyperlink w:anchor="_Toc243474387" w:history="1">
             <w:r>
               <w:rPr>
                 <w:rStyle w:val="Hyperlink"/>
@@ -3868,7 +3868,7 @@
               <w:rPr>
                 <w:noProof/>
               </w:rPr>
-              <w:instrText xml:space="preserve"> PAGEREF _Toc243416712 \h </w:instrText>
+              <w:instrText xml:space="preserve"> PAGEREF _Toc243474387 \h </w:instrText>
             </w:r>
             <w:r>
               <w:rPr>
@@ -3908,7 +3908,7 @@
               <w14:ligatures w14:val="standardContextual"/>
             </w:rPr>
           </w:pPr>
-          <w:hyperlink w:anchor="_Toc243416713" w:history="1">
+          <w:hyperlink w:anchor="_Toc243474388" w:history="1">
             <w:r>
               <w:rPr>
                 <w:rStyle w:val="Hyperlink"/>
@@ -3932,7 +3932,7 @@
               <w:rPr>
                 <w:noProof/>
               </w:rPr>
-              <w:instrText xml:space="preserve"> PAGEREF _Toc243416713 \h </w:instrText>
+              <w:instrText xml:space="preserve"> PAGEREF _Toc243474388 \h </w:instrText>
             </w:r>
             <w:r>
               <w:rPr>
@@ -3972,7 +3972,7 @@
               <w14:ligatures w14:val="standardContextual"/>
             </w:rPr>
           </w:pPr>
-          <w:hyperlink w:anchor="_Toc243416714" w:history="1">
+          <w:hyperlink w:anchor="_Toc243474389" w:history="1">
             <w:r>
               <w:rPr>
                 <w:rStyle w:val="Hyperlink"/>
@@ -3996,7 +3996,7 @@
               <w:rPr>
                 <w:noProof/>
               </w:rPr>
-              <w:instrText xml:space="preserve"> PAGEREF _Toc243416714 \h </w:instrText>
+              <w:instrText xml:space="preserve"> PAGEREF _Toc243474389 \h </w:instrText>
             </w:r>
             <w:r>
               <w:rPr>
@@ -4038,7 +4038,7 @@
               <w14:ligatures w14:val="standardContextual"/>
             </w:rPr>
           </w:pPr>
-          <w:hyperlink w:anchor="_Toc243416715" w:history="1">
+          <w:hyperlink w:anchor="_Toc243474390" w:history="1">
             <w:r>
               <w:rPr>
                 <w:rStyle w:val="Hyperlink"/>
@@ -4062,7 +4062,7 @@
               <w:rPr>
                 <w:noProof/>
               </w:rPr>
-              <w:instrText xml:space="preserve"> PAGEREF _Toc243416715 \h </w:instrText>
+              <w:instrText xml:space="preserve"> PAGEREF _Toc243474390 \h </w:instrText>
             </w:r>
             <w:r>
               <w:rPr>
@@ -4102,7 +4102,7 @@
               <w14:ligatures w14:val="standardContextual"/>
             </w:rPr>
           </w:pPr>
-          <w:hyperlink w:anchor="_Toc243416716" w:history="1">
+          <w:hyperlink w:anchor="_Toc243474391" w:history="1">
             <w:r>
               <w:rPr>
                 <w:rStyle w:val="Hyperlink"/>
@@ -4126,7 +4126,7 @@
               <w:rPr>
                 <w:noProof/>
               </w:rPr>
-              <w:instrText xml:space="preserve"> PAGEREF _Toc243416716 \h </w:instrText>
+              <w:instrText xml:space="preserve"> PAGEREF _Toc243474391 \h </w:instrText>
             </w:r>
             <w:r>
               <w:rPr>
@@ -4166,7 +4166,7 @@
               <w14:ligatures w14:val="standardContextual"/>
             </w:rPr>
           </w:pPr>
-          <w:hyperlink w:anchor="_Toc243416717" w:history="1">
+          <w:hyperlink w:anchor="_Toc243474392" w:history="1">
             <w:r>
               <w:rPr>
                 <w:rStyle w:val="Hyperlink"/>
@@ -4190,7 +4190,7 @@
               <w:rPr>
                 <w:noProof/>
               </w:rPr>
-              <w:instrText xml:space="preserve"> PAGEREF _Toc243416717 \h </w:instrText>
+              <w:instrText xml:space="preserve"> PAGEREF _Toc243474392 \h </w:instrText>
             </w:r>
             <w:r>
               <w:rPr>
@@ -4230,7 +4230,7 @@
               <w14:ligatures w14:val="standardContextual"/>
             </w:rPr>
           </w:pPr>
-          <w:hyperlink w:anchor="_Toc243416718" w:history="1">
+          <w:hyperlink w:anchor="_Toc243474393" w:history="1">
             <w:r>
               <w:rPr>
                 <w:rStyle w:val="Hyperlink"/>
@@ -4254,7 +4254,7 @@
               <w:rPr>
                 <w:noProof/>
               </w:rPr>
-              <w:instrText xml:space="preserve"> PAGEREF _Toc243416718 \h </w:instrText>
+              <w:instrText xml:space="preserve"> PAGEREF _Toc243474393 \h </w:instrText>
             </w:r>
             <w:r>
               <w:rPr>
@@ -4294,7 +4294,7 @@
               <w14:ligatures w14:val="standardContextual"/>
             </w:rPr>
           </w:pPr>
-          <w:hyperlink w:anchor="_Toc243416719" w:history="1">
+          <w:hyperlink w:anchor="_Toc243474394" w:history="1">
             <w:r>
               <w:rPr>
                 <w:rStyle w:val="Hyperlink"/>
@@ -4318,7 +4318,7 @@
               <w:rPr>
                 <w:noProof/>
               </w:rPr>
-              <w:instrText xml:space="preserve"> PAGEREF _Toc243416719 \h </w:instrText>
+              <w:instrText xml:space="preserve"> PAGEREF _Toc243474394 \h </w:instrText>
             </w:r>
             <w:r>
               <w:rPr>
@@ -4358,7 +4358,7 @@
               <w14:ligatures w14:val="standardContextual"/>
             </w:rPr>
           </w:pPr>
-          <w:hyperlink w:anchor="_Toc243416720" w:history="1">
+          <w:hyperlink w:anchor="_Toc243474395" w:history="1">
             <w:r>
               <w:rPr>
                 <w:rStyle w:val="Hyperlink"/>
@@ -4382,7 +4382,7 @@
               <w:rPr>
                 <w:noProof/>
               </w:rPr>
-              <w:instrText xml:space="preserve"> PAGEREF _Toc243416720 \h </w:instrText>
+              <w:instrText xml:space="preserve"> PAGEREF _Toc243474395 \h </w:instrText>
             </w:r>
             <w:r>
               <w:rPr>
@@ -4422,7 +4422,7 @@
               <w14:ligatures w14:val="standardContextual"/>
             </w:rPr>
           </w:pPr>
-          <w:hyperlink w:anchor="_Toc243416721" w:history="1">
+          <w:hyperlink w:anchor="_Toc243474396" w:history="1">
             <w:r>
               <w:rPr>
                 <w:rStyle w:val="Hyperlink"/>
@@ -4446,7 +4446,7 @@
               <w:rPr>
                 <w:noProof/>
               </w:rPr>
-              <w:instrText xml:space="preserve"> PAGEREF _Toc243416721 \h </w:instrText>
+              <w:instrText xml:space="preserve"> PAGEREF _Toc243474396 \h </w:instrText>
             </w:r>
             <w:r>
               <w:rPr>
@@ -4486,7 +4486,7 @@
               <w14:ligatures w14:val="standardContextual"/>
             </w:rPr>
           </w:pPr>
-          <w:hyperlink w:anchor="_Toc243416722" w:history="1">
+          <w:hyperlink w:anchor="_Toc243474397" w:history="1">
             <w:r>
               <w:rPr>
                 <w:rStyle w:val="Hyperlink"/>
@@ -4510,7 +4510,7 @@
               <w:rPr>
                 <w:noProof/>
               </w:rPr>
-              <w:instrText xml:space="preserve"> PAGEREF _Toc243416722 \h </w:instrText>
+              <w:instrText xml:space="preserve"> PAGEREF _Toc243474397 \h </w:instrText>
             </w:r>
             <w:r>
               <w:rPr>
@@ -4550,7 +4550,7 @@
               <w14:ligatures w14:val="standardContextual"/>
             </w:rPr>
           </w:pPr>
-          <w:hyperlink w:anchor="_Toc243416723" w:history="1">
+          <w:hyperlink w:anchor="_Toc243474398" w:history="1">
             <w:r>
               <w:rPr>
                 <w:rStyle w:val="Hyperlink"/>
@@ -4574,7 +4574,7 @@
               <w:rPr>
                 <w:noProof/>
               </w:rPr>
-              <w:instrText xml:space="preserve"> PAGEREF _Toc243416723 \h </w:instrText>
+              <w:instrText xml:space="preserve"> PAGEREF _Toc243474398 \h </w:instrText>
             </w:r>
             <w:r>
               <w:rPr>
@@ -4614,7 +4614,7 @@
               <w14:ligatures w14:val="standardContextual"/>
             </w:rPr>
           </w:pPr>
-          <w:hyperlink w:anchor="_Toc243416724" w:history="1">
+          <w:hyperlink w:anchor="_Toc243474399" w:history="1">
             <w:r>
               <w:rPr>
                 <w:rStyle w:val="Hyperlink"/>
@@ -4638,7 +4638,7 @@
               <w:rPr>
                 <w:noProof/>
               </w:rPr>
-              <w:instrText xml:space="preserve"> PAGEREF _Toc243416724 \h </w:instrText>
+              <w:instrText xml:space="preserve"> PAGEREF _Toc243474399 \h </w:instrText>
             </w:r>
             <w:r>
               <w:rPr>
@@ -4678,7 +4678,7 @@
               <w14:ligatures w14:val="standardContextual"/>
             </w:rPr>
           </w:pPr>
-          <w:hyperlink w:anchor="_Toc243416725" w:history="1">
+          <w:hyperlink w:anchor="_Toc243474400" w:history="1">
             <w:r>
               <w:rPr>
                 <w:rStyle w:val="Hyperlink"/>
@@ -4702,7 +4702,7 @@
               <w:rPr>
                 <w:noProof/>
               </w:rPr>
-              <w:instrText xml:space="preserve"> PAGEREF _Toc243416725 \h </w:instrText>
+              <w:instrText xml:space="preserve"> PAGEREF _Toc243474400 \h </w:instrText>
             </w:r>
             <w:r>
               <w:rPr>
@@ -4742,7 +4742,7 @@
               <w14:ligatures w14:val="standardContextual"/>
             </w:rPr>
           </w:pPr>
-          <w:hyperlink w:anchor="_Toc243416726" w:history="1">
+          <w:hyperlink w:anchor="_Toc243474401" w:history="1">
             <w:r>
               <w:rPr>
                 <w:rStyle w:val="Hyperlink"/>
@@ -4766,7 +4766,7 @@
               <w:rPr>
                 <w:noProof/>
               </w:rPr>
-              <w:instrText xml:space="preserve"> PAGEREF _Toc243416726 \h </w:instrText>
+              <w:instrText xml:space="preserve"> PAGEREF _Toc243474401 \h </w:instrText>
             </w:r>
             <w:r>
               <w:rPr>
@@ -4806,7 +4806,7 @@
               <w14:ligatures w14:val="standardContextual"/>
             </w:rPr>
           </w:pPr>
-          <w:hyperlink w:anchor="_Toc243416727" w:history="1">
+          <w:hyperlink w:anchor="_Toc243474402" w:history="1">
             <w:r>
               <w:rPr>
                 <w:rStyle w:val="Hyperlink"/>
@@ -4830,7 +4830,7 @@
               <w:rPr>
                 <w:noProof/>
               </w:rPr>
-              <w:instrText xml:space="preserve"> PAGEREF _Toc243416727 \h </w:instrText>
+              <w:instrText xml:space="preserve"> PAGEREF _Toc243474402 \h </w:instrText>
             </w:r>
             <w:r>
               <w:rPr>
@@ -4870,7 +4870,7 @@
               <w14:ligatures w14:val="standardContextual"/>
             </w:rPr>
           </w:pPr>
-          <w:hyperlink w:anchor="_Toc243416728" w:history="1">
+          <w:hyperlink w:anchor="_Toc243474403" w:history="1">
             <w:r>
               <w:rPr>
                 <w:rStyle w:val="Hyperlink"/>
@@ -4894,7 +4894,7 @@
               <w:rPr>
                 <w:noProof/>
               </w:rPr>
-              <w:instrText xml:space="preserve"> PAGEREF _Toc243416728 \h </w:instrText>
+              <w:instrText xml:space="preserve"> PAGEREF _Toc243474403 \h </w:instrText>
             </w:r>
             <w:r>
               <w:rPr>
@@ -4934,7 +4934,7 @@
               <w14:ligatures w14:val="standardContextual"/>
             </w:rPr>
           </w:pPr>
-          <w:hyperlink w:anchor="_Toc243416729" w:history="1">
+          <w:hyperlink w:anchor="_Toc243474404" w:history="1">
             <w:r>
               <w:rPr>
                 <w:rStyle w:val="Hyperlink"/>
@@ -4958,7 +4958,7 @@
               <w:rPr>
                 <w:noProof/>
               </w:rPr>
-              <w:instrText xml:space="preserve"> PAGEREF _Toc243416729 \h </w:instrText>
+              <w:instrText xml:space="preserve"> PAGEREF _Toc243474404 \h </w:instrText>
             </w:r>
             <w:r>
               <w:rPr>
@@ -4998,7 +4998,7 @@
               <w14:ligatures w14:val="standardContextual"/>
             </w:rPr>
           </w:pPr>
-          <w:hyperlink w:anchor="_Toc243416730" w:history="1">
+          <w:hyperlink w:anchor="_Toc243474405" w:history="1">
             <w:r>
               <w:rPr>
                 <w:rStyle w:val="Hyperlink"/>
@@ -5022,7 +5022,7 @@
               <w:rPr>
                 <w:noProof/>
               </w:rPr>
-              <w:instrText xml:space="preserve"> PAGEREF _Toc243416730 \h </w:instrText>
+              <w:instrText xml:space="preserve"> PAGEREF _Toc243474405 \h </w:instrText>
             </w:r>
             <w:r>
               <w:rPr>
@@ -5064,7 +5064,7 @@
               <w14:ligatures w14:val="standardContextual"/>
             </w:rPr>
           </w:pPr>
-          <w:hyperlink w:anchor="_Toc243416731" w:history="1">
+          <w:hyperlink w:anchor="_Toc243474406" w:history="1">
             <w:r>
               <w:rPr>
                 <w:rStyle w:val="Hyperlink"/>
@@ -5088,7 +5088,7 @@
               <w:rPr>
                 <w:noProof/>
               </w:rPr>
-              <w:instrText xml:space="preserve"> PAGEREF _Toc243416731 \h </w:instrText>
+              <w:instrText xml:space="preserve"> PAGEREF _Toc243474406 \h </w:instrText>
             </w:r>
             <w:r>
               <w:rPr>
@@ -5130,7 +5130,7 @@
               <w14:ligatures w14:val="standardContextual"/>
             </w:rPr>
           </w:pPr>
-          <w:hyperlink w:anchor="_Toc243416732" w:history="1">
+          <w:hyperlink w:anchor="_Toc243474407" w:history="1">
             <w:r>
               <w:rPr>
                 <w:rStyle w:val="Hyperlink"/>
@@ -5154,7 +5154,7 @@
               <w:rPr>
                 <w:noProof/>
               </w:rPr>
-              <w:instrText xml:space="preserve"> PAGEREF _Toc243416732 \h </w:instrText>
+              <w:instrText xml:space="preserve"> PAGEREF _Toc243474407 \h </w:instrText>
             </w:r>
             <w:r>
               <w:rPr>
@@ -5196,7 +5196,7 @@
               <w14:ligatures w14:val="standardContextual"/>
             </w:rPr>
           </w:pPr>
-          <w:hyperlink w:anchor="_Toc243416733" w:history="1">
+          <w:hyperlink w:anchor="_Toc243474408" w:history="1">
             <w:r>
               <w:rPr>
                 <w:rStyle w:val="Hyperlink"/>
@@ -5220,7 +5220,7 @@
               <w:rPr>
                 <w:noProof/>
               </w:rPr>
-              <w:instrText xml:space="preserve"> PAGEREF _Toc243416733 \h </w:instrText>
+              <w:instrText xml:space="preserve"> PAGEREF _Toc243474408 \h </w:instrText>
             </w:r>
             <w:r>
               <w:rPr>
@@ -5262,7 +5262,7 @@
               <w14:ligatures w14:val="standardContextual"/>
             </w:rPr>
           </w:pPr>
-          <w:hyperlink w:anchor="_Toc243416734" w:history="1">
+          <w:hyperlink w:anchor="_Toc243474409" w:history="1">
             <w:r>
               <w:rPr>
                 <w:rStyle w:val="Hyperlink"/>
@@ -5286,7 +5286,7 @@
               <w:rPr>
                 <w:noProof/>
               </w:rPr>
-              <w:instrText xml:space="preserve"> PAGEREF _Toc243416734 \h </w:instrText>
+              <w:instrText xml:space="preserve"> PAGEREF _Toc243474409 \h </w:instrText>
             </w:r>
             <w:r>
               <w:rPr>
@@ -5328,7 +5328,7 @@
               <w14:ligatures w14:val="standardContextual"/>
             </w:rPr>
           </w:pPr>
-          <w:hyperlink w:anchor="_Toc243416735" w:history="1">
+          <w:hyperlink w:anchor="_Toc243474410" w:history="1">
             <w:r>
               <w:rPr>
                 <w:rStyle w:val="Hyperlink"/>
@@ -5352,7 +5352,7 @@
               <w:rPr>
                 <w:noProof/>
               </w:rPr>
-              <w:instrText xml:space="preserve"> PAGEREF _Toc243416735 \h </w:instrText>
+              <w:instrText xml:space="preserve"> PAGEREF _Toc243474410 \h </w:instrText>
             </w:r>
             <w:r>
               <w:rPr>
@@ -5394,7 +5394,7 @@
               <w14:ligatures w14:val="standardContextual"/>
             </w:rPr>
           </w:pPr>
-          <w:hyperlink w:anchor="_Toc243416736" w:history="1">
+          <w:hyperlink w:anchor="_Toc243474411" w:history="1">
             <w:r>
               <w:rPr>
                 <w:rStyle w:val="Hyperlink"/>
@@ -5418,7 +5418,7 @@
               <w:rPr>
                 <w:noProof/>
               </w:rPr>
-              <w:instrText xml:space="preserve"> PAGEREF _Toc243416736 \h </w:instrText>
+              <w:instrText xml:space="preserve"> PAGEREF _Toc243474411 \h </w:instrText>
             </w:r>
             <w:r>
               <w:rPr>
@@ -5460,7 +5460,7 @@
               <w14:ligatures w14:val="standardContextual"/>
             </w:rPr>
           </w:pPr>
-          <w:hyperlink w:anchor="_Toc243416737" w:history="1">
+          <w:hyperlink w:anchor="_Toc243474412" w:history="1">
             <w:r>
               <w:rPr>
                 <w:rStyle w:val="Hyperlink"/>
@@ -5484,7 +5484,7 @@
               <w:rPr>
                 <w:noProof/>
               </w:rPr>
-              <w:instrText xml:space="preserve"> PAGEREF _Toc243416737 \h </w:instrText>
+              <w:instrText xml:space="preserve"> PAGEREF _Toc243474412 \h </w:instrText>
             </w:r>
             <w:r>
               <w:rPr>
@@ -5533,7 +5533,7 @@
       <w:pPr>
         <w:pStyle w:val="Ttulo1"/>
       </w:pPr>
-      <w:bookmarkStart w:id="0" w:name="_Toc243416692"/>
+      <w:bookmarkStart w:id="0" w:name="_Toc243474367"/>
       <w:r>
         <w:t>1 INTRODUÇÃO</w:t>
       </w:r>
@@ -5605,7 +5605,7 @@
       <w:pPr>
         <w:pStyle w:val="Ttulo2"/>
       </w:pPr>
-      <w:bookmarkStart w:id="1" w:name="_Toc243416693"/>
+      <w:bookmarkStart w:id="1" w:name="_Toc243474368"/>
       <w:r>
         <w:t>1.1 OBJETIVOS</w:t>
       </w:r>
@@ -5615,7 +5615,7 @@
       <w:pPr>
         <w:pStyle w:val="Ttulo3"/>
       </w:pPr>
-      <w:bookmarkStart w:id="2" w:name="_Toc243416694"/>
+      <w:bookmarkStart w:id="2" w:name="_Toc243474369"/>
       <w:r>
         <w:t>1.1.1 Objetivo geral</w:t>
       </w:r>
@@ -5634,7 +5634,7 @@
       <w:pPr>
         <w:pStyle w:val="Ttulo3"/>
       </w:pPr>
-      <w:bookmarkStart w:id="3" w:name="_Toc243416695"/>
+      <w:bookmarkStart w:id="3" w:name="_Toc243474370"/>
       <w:r>
         <w:t>1.1.2 Objetivos específicos</w:t>
       </w:r>
@@ -5742,7 +5742,7 @@
       <w:pPr>
         <w:pStyle w:val="Ttulo2"/>
       </w:pPr>
-      <w:bookmarkStart w:id="4" w:name="_Toc243416696"/>
+      <w:bookmarkStart w:id="4" w:name="_Toc243474371"/>
       <w:r>
         <w:t>1.2 ORGANIZAÇÃO DO RELATÓRIO</w:t>
       </w:r>
@@ -5761,7 +5761,7 @@
       <w:pPr>
         <w:pStyle w:val="Ttulo1"/>
       </w:pPr>
-      <w:bookmarkStart w:id="5" w:name="_Toc243416697"/>
+      <w:bookmarkStart w:id="5" w:name="_Toc243474372"/>
       <w:r>
         <w:t>2 FUNDAMENTAÇÃO TEÓRICA</w:t>
       </w:r>
@@ -5780,7 +5780,7 @@
       <w:pPr>
         <w:pStyle w:val="Ttulo2"/>
       </w:pPr>
-      <w:bookmarkStart w:id="6" w:name="_Toc243416698"/>
+      <w:bookmarkStart w:id="6" w:name="_Toc243474373"/>
       <w:r>
         <w:t>2.1 MARCADORES BIOQUÍMICOS NO DIAGNÓSTICO CLÍNICO</w:t>
       </w:r>
@@ -5812,7 +5812,7 @@
       <w:pPr>
         <w:pStyle w:val="LegendaABNT"/>
       </w:pPr>
-      <w:bookmarkStart w:id="7" w:name="_Toc243416750"/>
+      <w:bookmarkStart w:id="7" w:name="_Toc243474425"/>
       <w:r>
         <w:t xml:space="preserve">Quadro </w:t>
       </w:r>
@@ -6350,7 +6350,7 @@
       <w:pPr>
         <w:pStyle w:val="Ttulo2"/>
       </w:pPr>
-      <w:bookmarkStart w:id="8" w:name="_Toc243416699"/>
+      <w:bookmarkStart w:id="8" w:name="_Toc243474374"/>
       <w:r>
         <w:t>2.2 PRÁTICA DE RECUPERAÇÃO E REPETIÇÃO ESPAÇADA</w:t>
       </w:r>
@@ -6430,7 +6430,7 @@
       <w:pPr>
         <w:pStyle w:val="Ttulo2"/>
       </w:pPr>
-      <w:bookmarkStart w:id="9" w:name="_Toc243416700"/>
+      <w:bookmarkStart w:id="9" w:name="_Toc243474375"/>
       <w:r>
         <w:t>2.3 O ALGORITMO SM-2</w:t>
       </w:r>
@@ -6506,7 +6506,7 @@
       <w:pPr>
         <w:pStyle w:val="Ttulo2"/>
       </w:pPr>
-      <w:bookmarkStart w:id="10" w:name="_Toc243416701"/>
+      <w:bookmarkStart w:id="10" w:name="_Toc243474376"/>
       <w:r>
         <w:t>2.4 GAMIFICAÇÃO E MOTIVAÇÃO</w:t>
       </w:r>
@@ -6584,7 +6584,7 @@
       <w:pPr>
         <w:pStyle w:val="Ttulo2"/>
       </w:pPr>
-      <w:bookmarkStart w:id="11" w:name="_Toc243416702"/>
+      <w:bookmarkStart w:id="11" w:name="_Toc243474377"/>
       <w:r>
         <w:t>2.5 METACOGNIÇÃO E CALIBRAÇÃO</w:t>
       </w:r>
@@ -6632,7 +6632,7 @@
       <w:pPr>
         <w:pStyle w:val="Ttulo1"/>
       </w:pPr>
-      <w:bookmarkStart w:id="12" w:name="_Toc243416703"/>
+      <w:bookmarkStart w:id="12" w:name="_Toc243474378"/>
       <w:r>
         <w:t>3 MATERIAIS E MÉTODOS</w:t>
       </w:r>
@@ -6642,7 +6642,7 @@
       <w:pPr>
         <w:pStyle w:val="Ttulo2"/>
       </w:pPr>
-      <w:bookmarkStart w:id="13" w:name="_Toc243416704"/>
+      <w:bookmarkStart w:id="13" w:name="_Toc243474379"/>
       <w:r>
         <w:t>3.1 NATUREZA DA PESQUISA E ETAPAS</w:t>
       </w:r>
@@ -6779,7 +6779,7 @@
       <w:pPr>
         <w:pStyle w:val="Ttulo2"/>
       </w:pPr>
-      <w:bookmarkStart w:id="14" w:name="_Toc243416705"/>
+      <w:bookmarkStart w:id="14" w:name="_Toc243474380"/>
       <w:r>
         <w:t>3.2 CURADORIA DO CONTEÚDO</w:t>
       </w:r>
@@ -6843,7 +6843,7 @@
       <w:pPr>
         <w:pStyle w:val="Ttulo2"/>
       </w:pPr>
-      <w:bookmarkStart w:id="15" w:name="_Toc243416706"/>
+      <w:bookmarkStart w:id="15" w:name="_Toc243474381"/>
       <w:r>
         <w:t>3.3 TECNOLOGIAS UTILIZADAS</w:t>
       </w:r>
@@ -6863,7 +6863,7 @@
       <w:pPr>
         <w:pStyle w:val="LegendaABNT"/>
       </w:pPr>
-      <w:bookmarkStart w:id="16" w:name="_Toc243416751"/>
+      <w:bookmarkStart w:id="16" w:name="_Toc243474426"/>
       <w:r>
         <w:t xml:space="preserve">Quadro </w:t>
       </w:r>
@@ -8413,7 +8413,7 @@
       <w:pPr>
         <w:pStyle w:val="Ttulo2"/>
       </w:pPr>
-      <w:bookmarkStart w:id="17" w:name="_Toc243416707"/>
+      <w:bookmarkStart w:id="17" w:name="_Toc243474382"/>
       <w:r>
         <w:t>3.4 ARQUITETURA DO SOFTWARE</w:t>
       </w:r>
@@ -8433,7 +8433,7 @@
       <w:pPr>
         <w:pStyle w:val="LegendaABNT"/>
       </w:pPr>
-      <w:bookmarkStart w:id="18" w:name="_Toc243416738"/>
+      <w:bookmarkStart w:id="18" w:name="_Toc243474413"/>
       <w:r>
         <w:t xml:space="preserve">Figura </w:t>
       </w:r>
@@ -8471,7 +8471,7 @@
           <w:noProof/>
         </w:rPr>
         <w:drawing>
-          <wp:inline distT="0" distB="0" distL="0" distR="0" wp14:anchorId="166F50B8" wp14:editId="47786D9F">
+          <wp:inline distT="0" distB="0" distL="0" distR="0" wp14:anchorId="08294A09" wp14:editId="3309F32B">
             <wp:extent cx="5762625" cy="3714750"/>
             <wp:effectExtent l="0" t="0" r="0" b="0"/>
             <wp:docPr id="1" name="arquitetura.png" descr="Arquitetura do BioquímicaEDU" title="Arquitetura do BioquímicaEDU"/>
@@ -8534,7 +8534,7 @@
       <w:pPr>
         <w:pStyle w:val="Ttulo2"/>
       </w:pPr>
-      <w:bookmarkStart w:id="19" w:name="_Toc243416708"/>
+      <w:bookmarkStart w:id="19" w:name="_Toc243474383"/>
       <w:r>
         <w:t>3.5 VERIFICAÇÃO DO SOFTWARE</w:t>
       </w:r>
@@ -8575,7 +8575,7 @@
       <w:pPr>
         <w:pStyle w:val="Ttulo2"/>
       </w:pPr>
-      <w:bookmarkStart w:id="20" w:name="_Toc243416709"/>
+      <w:bookmarkStart w:id="20" w:name="_Toc243474384"/>
       <w:r>
         <w:t>3.6 AVALIAÇÃO COM USUÁRIOS</w:t>
       </w:r>
@@ -8594,7 +8594,7 @@
       <w:pPr>
         <w:pStyle w:val="Ttulo3"/>
       </w:pPr>
-      <w:bookmarkStart w:id="21" w:name="_Toc243416710"/>
+      <w:bookmarkStart w:id="21" w:name="_Toc243474385"/>
       <w:r>
         <w:t>3.6.1 Avaliação formativa</w:t>
       </w:r>
@@ -8616,7 +8616,7 @@
       <w:pPr>
         <w:pStyle w:val="Ttulo3"/>
       </w:pPr>
-      <w:bookmarkStart w:id="22" w:name="_Toc243416711"/>
+      <w:bookmarkStart w:id="22" w:name="_Toc243474386"/>
       <w:r>
         <w:t>3.6.2 Pré-teste e pós-teste</w:t>
       </w:r>
@@ -8662,7 +8662,7 @@
       <w:pPr>
         <w:pStyle w:val="Ttulo3"/>
       </w:pPr>
-      <w:bookmarkStart w:id="23" w:name="_Toc243416712"/>
+      <w:bookmarkStart w:id="23" w:name="_Toc243474387"/>
       <w:r>
         <w:t>3.6.3 Questionário de opinião</w:t>
       </w:r>
@@ -8684,7 +8684,7 @@
       <w:pPr>
         <w:pStyle w:val="Ttulo3"/>
       </w:pPr>
-      <w:bookmarkStart w:id="24" w:name="_Toc243416713"/>
+      <w:bookmarkStart w:id="24" w:name="_Toc243474388"/>
       <w:r>
         <w:t>3.6.4 Aspectos éticos e proteção de dados</w:t>
       </w:r>
@@ -8721,7 +8721,7 @@
       <w:pPr>
         <w:pStyle w:val="Ttulo2"/>
       </w:pPr>
-      <w:bookmarkStart w:id="25" w:name="_Toc243416714"/>
+      <w:bookmarkStart w:id="25" w:name="_Toc243474389"/>
       <w:r>
         <w:t>3.7 USO DE FERRAMENTAS DE INTELIGÊNCIA ARTIFICIAL</w:t>
       </w:r>
@@ -8746,7 +8746,7 @@
       <w:pPr>
         <w:pStyle w:val="Ttulo1"/>
       </w:pPr>
-      <w:bookmarkStart w:id="26" w:name="_Toc243416715"/>
+      <w:bookmarkStart w:id="26" w:name="_Toc243474390"/>
       <w:r>
         <w:t>4 RESULTADOS</w:t>
       </w:r>
@@ -8756,7 +8756,7 @@
       <w:pPr>
         <w:pStyle w:val="Ttulo2"/>
       </w:pPr>
-      <w:bookmarkStart w:id="27" w:name="_Toc243416716"/>
+      <w:bookmarkStart w:id="27" w:name="_Toc243474391"/>
       <w:r>
         <w:t>4.1 VISÃO GERAL DO SOFTWARE</w:t>
       </w:r>
@@ -8776,7 +8776,7 @@
       <w:pPr>
         <w:pStyle w:val="LegendaABNT"/>
       </w:pPr>
-      <w:bookmarkStart w:id="28" w:name="_Toc243416752"/>
+      <w:bookmarkStart w:id="28" w:name="_Toc243474427"/>
       <w:r>
         <w:t xml:space="preserve">Quadro </w:t>
       </w:r>
@@ -9263,7 +9263,7 @@
       <w:pPr>
         <w:pStyle w:val="LegendaABNT"/>
       </w:pPr>
-      <w:bookmarkStart w:id="29" w:name="_Toc243416757"/>
+      <w:bookmarkStart w:id="29" w:name="_Toc243474432"/>
       <w:r>
         <w:t xml:space="preserve">Tabela </w:t>
       </w:r>
@@ -10643,7 +10643,7 @@
       <w:pPr>
         <w:pStyle w:val="LegendaABNT"/>
       </w:pPr>
-      <w:bookmarkStart w:id="30" w:name="_Toc243416758"/>
+      <w:bookmarkStart w:id="30" w:name="_Toc243474433"/>
       <w:r>
         <w:t xml:space="preserve">Tabela </w:t>
       </w:r>
@@ -11330,7 +11330,7 @@
       <w:pPr>
         <w:pStyle w:val="Ttulo2"/>
       </w:pPr>
-      <w:bookmarkStart w:id="31" w:name="_Toc243416717"/>
+      <w:bookmarkStart w:id="31" w:name="_Toc243474392"/>
       <w:r>
         <w:t>4.2 MOTOR DE APRENDIZAGEM</w:t>
       </w:r>
@@ -11362,7 +11362,7 @@
       <w:pPr>
         <w:pStyle w:val="LegendaABNT"/>
       </w:pPr>
-      <w:bookmarkStart w:id="32" w:name="_Toc243416753"/>
+      <w:bookmarkStart w:id="32" w:name="_Toc243474428"/>
       <w:r>
         <w:t xml:space="preserve">Quadro </w:t>
       </w:r>
@@ -11960,7 +11960,7 @@
       <w:pPr>
         <w:pStyle w:val="LegendaABNT"/>
       </w:pPr>
-      <w:bookmarkStart w:id="33" w:name="_Toc243416739"/>
+      <w:bookmarkStart w:id="33" w:name="_Toc243474414"/>
       <w:r>
         <w:t xml:space="preserve">Figura </w:t>
       </w:r>
@@ -11998,7 +11998,7 @@
           <w:noProof/>
         </w:rPr>
         <w:drawing>
-          <wp:inline distT="0" distB="0" distL="0" distR="0" wp14:anchorId="7212513D" wp14:editId="43C38141">
+          <wp:inline distT="0" distB="0" distL="0" distR="0" wp14:anchorId="1FC27F6E" wp14:editId="039F6B64">
             <wp:extent cx="5400675" cy="2971800"/>
             <wp:effectExtent l="0" t="0" r="0" b="0"/>
             <wp:docPr id="2" name="sm2_intervalos.png" descr="Intervalos calculados pelo motor em três sequências de respostas" title="Intervalos calculados pelo motor em três sequências de respostas"/>
@@ -12059,7 +12059,7 @@
       <w:pPr>
         <w:pStyle w:val="LegendaABNT"/>
       </w:pPr>
-      <w:bookmarkStart w:id="34" w:name="_Toc243416759"/>
+      <w:bookmarkStart w:id="34" w:name="_Toc243474434"/>
       <w:r>
         <w:t xml:space="preserve">Tabela </w:t>
       </w:r>
@@ -12886,7 +12886,7 @@
       <w:pPr>
         <w:pStyle w:val="Ttulo2"/>
       </w:pPr>
-      <w:bookmarkStart w:id="35" w:name="_Toc243416718"/>
+      <w:bookmarkStart w:id="35" w:name="_Toc243474393"/>
       <w:r>
         <w:t>4.3 VERSÃO PARA DISPOSITIVOS MÓVEIS</w:t>
       </w:r>
@@ -12906,7 +12906,7 @@
       <w:pPr>
         <w:pStyle w:val="LegendaABNT"/>
       </w:pPr>
-      <w:bookmarkStart w:id="36" w:name="_Toc243416740"/>
+      <w:bookmarkStart w:id="36" w:name="_Toc243474415"/>
       <w:r>
         <w:t xml:space="preserve">Figura </w:t>
       </w:r>
@@ -12944,7 +12944,7 @@
           <w:noProof/>
         </w:rPr>
         <w:drawing>
-          <wp:inline distT="0" distB="0" distL="0" distR="0" wp14:anchorId="3E426A43" wp14:editId="14F36967">
+          <wp:inline distT="0" distB="0" distL="0" distR="0" wp14:anchorId="15E7994C" wp14:editId="70F0B466">
             <wp:extent cx="5762625" cy="4086225"/>
             <wp:effectExtent l="0" t="0" r="0" b="0"/>
             <wp:docPr id="3" name="telas_inicio_estudo.png" descr="Início e estudo na versão móvel" title="Início e estudo na versão móvel"/>
@@ -13014,7 +13014,7 @@
       <w:pPr>
         <w:pStyle w:val="LegendaABNT"/>
       </w:pPr>
-      <w:bookmarkStart w:id="37" w:name="_Toc243416741"/>
+      <w:bookmarkStart w:id="37" w:name="_Toc243474416"/>
       <w:r>
         <w:t xml:space="preserve">Figura </w:t>
       </w:r>
@@ -13062,7 +13062,7 @@
           <w:noProof/>
         </w:rPr>
         <w:drawing>
-          <wp:inline distT="0" distB="0" distL="0" distR="0" wp14:anchorId="591F5ED2" wp14:editId="2385864B">
+          <wp:inline distT="0" distB="0" distL="0" distR="0" wp14:anchorId="5D45AB4F" wp14:editId="54C9D216">
             <wp:extent cx="5762625" cy="4086225"/>
             <wp:effectExtent l="0" t="0" r="0" b="0"/>
             <wp:docPr id="4" name="telas_revisao.png" descr="Revisão espaçada e flashcards na versão móvel" title="Revisão espaçada e flashcards na versão móvel"/>
@@ -13152,7 +13152,7 @@
       <w:pPr>
         <w:pStyle w:val="LegendaABNT"/>
       </w:pPr>
-      <w:bookmarkStart w:id="38" w:name="_Toc243416742"/>
+      <w:bookmarkStart w:id="38" w:name="_Toc243474417"/>
       <w:r>
         <w:t xml:space="preserve">Figura </w:t>
       </w:r>
@@ -13190,7 +13190,7 @@
           <w:noProof/>
         </w:rPr>
         <w:drawing>
-          <wp:inline distT="0" distB="0" distL="0" distR="0" wp14:anchorId="547DA337" wp14:editId="72EB691E">
+          <wp:inline distT="0" distB="0" distL="0" distR="0" wp14:anchorId="5D8D6E68" wp14:editId="15D17283">
             <wp:extent cx="5762625" cy="4086225"/>
             <wp:effectExtent l="0" t="0" r="0" b="0"/>
             <wp:docPr id="5" name="telas_pratica_tutor.png" descr="Prática e tutor na versão móvel" title="Prática e tutor na versão móvel"/>
@@ -13292,7 +13292,7 @@
       <w:pPr>
         <w:pStyle w:val="Ttulo2"/>
       </w:pPr>
-      <w:bookmarkStart w:id="39" w:name="_Toc243416719"/>
+      <w:bookmarkStart w:id="39" w:name="_Toc243474394"/>
       <w:r>
         <w:t>4.4 VERSÕES PARA COMPUTADOR</w:t>
       </w:r>
@@ -13312,7 +13312,7 @@
       <w:pPr>
         <w:pStyle w:val="LegendaABNT"/>
       </w:pPr>
-      <w:bookmarkStart w:id="40" w:name="_Toc243416743"/>
+      <w:bookmarkStart w:id="40" w:name="_Toc243474418"/>
       <w:r>
         <w:t xml:space="preserve">Figura </w:t>
       </w:r>
@@ -13350,7 +13350,7 @@
           <w:noProof/>
         </w:rPr>
         <w:drawing>
-          <wp:inline distT="0" distB="0" distL="0" distR="0" wp14:anchorId="4C2C9291" wp14:editId="64FFA974">
+          <wp:inline distT="0" distB="0" distL="0" distR="0" wp14:anchorId="1F22C031" wp14:editId="1333DEE9">
             <wp:extent cx="5762625" cy="3981450"/>
             <wp:effectExtent l="0" t="0" r="0" b="0"/>
             <wp:docPr id="6" name="desktop_painel.png" descr="Painel inicial da versão para computador" title="Painel inicial da versão para computador"/>
@@ -13410,7 +13410,7 @@
       <w:pPr>
         <w:pStyle w:val="Ttulo2"/>
       </w:pPr>
-      <w:bookmarkStart w:id="41" w:name="_Toc243416720"/>
+      <w:bookmarkStart w:id="41" w:name="_Toc243474395"/>
       <w:r>
         <w:t>4.5 IDENTIDADE VISUAL</w:t>
       </w:r>
@@ -13430,7 +13430,7 @@
       <w:pPr>
         <w:pStyle w:val="LegendaABNT"/>
       </w:pPr>
-      <w:bookmarkStart w:id="42" w:name="_Toc243416744"/>
+      <w:bookmarkStart w:id="42" w:name="_Toc243474419"/>
       <w:r>
         <w:t xml:space="preserve">Figura </w:t>
       </w:r>
@@ -13468,7 +13468,7 @@
           <w:noProof/>
         </w:rPr>
         <w:drawing>
-          <wp:inline distT="0" distB="0" distL="0" distR="0" wp14:anchorId="3F14ACBE" wp14:editId="1733DA8E">
+          <wp:inline distT="0" distB="0" distL="0" distR="0" wp14:anchorId="47FB5295" wp14:editId="0F9BF1FA">
             <wp:extent cx="3600450" cy="866775"/>
             <wp:effectExtent l="0" t="0" r="0" b="0"/>
             <wp:docPr id="7" name="horizontal.png" descr="Logo do BioquímicaEDU" title="Logo do BioquímicaEDU"/>
@@ -13519,7 +13519,7 @@
       <w:pPr>
         <w:pStyle w:val="Ttulo2"/>
       </w:pPr>
-      <w:bookmarkStart w:id="43" w:name="_Toc243416721"/>
+      <w:bookmarkStart w:id="43" w:name="_Toc243474396"/>
       <w:r>
         <w:t>4.6 AVALIAÇÃO FORMATIVA</w:t>
       </w:r>
@@ -13550,7 +13550,7 @@
       <w:pPr>
         <w:pStyle w:val="Ttulo2"/>
       </w:pPr>
-      <w:bookmarkStart w:id="44" w:name="_Toc243416722"/>
+      <w:bookmarkStart w:id="44" w:name="_Toc243474397"/>
       <w:r>
         <w:t>4.7 EVOLUÇÃO DO SOFTWARE</w:t>
       </w:r>
@@ -13572,7 +13572,7 @@
       <w:pPr>
         <w:pStyle w:val="Ttulo3"/>
       </w:pPr>
-      <w:bookmarkStart w:id="45" w:name="_Toc243416723"/>
+      <w:bookmarkStart w:id="45" w:name="_Toc243474398"/>
       <w:r>
         <w:t>4.7.1 Itens da proposta: novos marcadores, jogos e régua das faixas</w:t>
       </w:r>
@@ -13620,7 +13620,7 @@
       <w:pPr>
         <w:pStyle w:val="LegendaABNT"/>
       </w:pPr>
-      <w:bookmarkStart w:id="46" w:name="_Toc243416745"/>
+      <w:bookmarkStart w:id="46" w:name="_Toc243474420"/>
       <w:r>
         <w:t xml:space="preserve">Figura </w:t>
       </w:r>
@@ -13658,7 +13658,7 @@
           <w:noProof/>
         </w:rPr>
         <w:drawing>
-          <wp:inline distT="0" distB="0" distL="0" distR="0" wp14:anchorId="3B5431C8" wp14:editId="2806A857">
+          <wp:inline distT="0" distB="0" distL="0" distR="0" wp14:anchorId="6C9EC11C" wp14:editId="21633F57">
             <wp:extent cx="5762625" cy="4086225"/>
             <wp:effectExtent l="0" t="0" r="0" b="0"/>
             <wp:docPr id="8" name="evolucao_jogos.png" descr="Jogos didáticos e calculadora da TFG estimada na versão para celular" title="Jogos didáticos e calculadora da TFG estimada na versão para celular"/>
@@ -13731,7 +13731,7 @@
       <w:pPr>
         <w:pStyle w:val="Ttulo3"/>
       </w:pPr>
-      <w:bookmarkStart w:id="47" w:name="_Toc243416724"/>
+      <w:bookmarkStart w:id="47" w:name="_Toc243474399"/>
       <w:r>
         <w:t>4.7.2 Intervalos da revisão</w:t>
       </w:r>
@@ -13754,7 +13754,7 @@
       <w:pPr>
         <w:pStyle w:val="LegendaABNT"/>
       </w:pPr>
-      <w:bookmarkStart w:id="48" w:name="_Toc243416760"/>
+      <w:bookmarkStart w:id="48" w:name="_Toc243474435"/>
       <w:r>
         <w:t xml:space="preserve">Tabela </w:t>
       </w:r>
@@ -14333,7 +14333,7 @@
       <w:pPr>
         <w:pStyle w:val="Ttulo3"/>
       </w:pPr>
-      <w:bookmarkStart w:id="49" w:name="_Toc243416725"/>
+      <w:bookmarkStart w:id="49" w:name="_Toc243474400"/>
       <w:r>
         <w:t>4.7.3 Um aplicativo para celular, tablet e computador</w:t>
       </w:r>
@@ -14356,7 +14356,7 @@
       <w:pPr>
         <w:pStyle w:val="LegendaABNT"/>
       </w:pPr>
-      <w:bookmarkStart w:id="50" w:name="_Toc243416754"/>
+      <w:bookmarkStart w:id="50" w:name="_Toc243474429"/>
       <w:r>
         <w:t xml:space="preserve">Quadro </w:t>
       </w:r>
@@ -15106,7 +15106,7 @@
       <w:pPr>
         <w:pStyle w:val="LegendaABNT"/>
       </w:pPr>
-      <w:bookmarkStart w:id="51" w:name="_Toc243416746"/>
+      <w:bookmarkStart w:id="51" w:name="_Toc243474421"/>
       <w:r>
         <w:t xml:space="preserve">Figura </w:t>
       </w:r>
@@ -15144,7 +15144,7 @@
           <w:noProof/>
         </w:rPr>
         <w:drawing>
-          <wp:inline distT="0" distB="0" distL="0" distR="0" wp14:anchorId="2274CD8D" wp14:editId="75FE59AF">
+          <wp:inline distT="0" distB="0" distL="0" distR="0" wp14:anchorId="7781C34B" wp14:editId="482E1A84">
             <wp:extent cx="5762625" cy="7219950"/>
             <wp:effectExtent l="0" t="0" r="0" b="0"/>
             <wp:docPr id="9" name="evolucao_formatos.png" descr="O mesmo aplicativo no computador, no tablet e no celular" title="O mesmo aplicativo no computador, no tablet e no celular"/>
@@ -15205,7 +15205,7 @@
       <w:pPr>
         <w:pStyle w:val="Ttulo3"/>
       </w:pPr>
-      <w:bookmarkStart w:id="52" w:name="_Toc243416726"/>
+      <w:bookmarkStart w:id="52" w:name="_Toc243474401"/>
       <w:r>
         <w:t>4.7.4 Acessibilidade</w:t>
       </w:r>
@@ -15306,7 +15306,7 @@
       <w:pPr>
         <w:pStyle w:val="LegendaABNT"/>
       </w:pPr>
-      <w:bookmarkStart w:id="53" w:name="_Toc243416747"/>
+      <w:bookmarkStart w:id="53" w:name="_Toc243474422"/>
       <w:r>
         <w:t xml:space="preserve">Figura </w:t>
       </w:r>
@@ -15344,7 +15344,7 @@
           <w:noProof/>
         </w:rPr>
         <w:drawing>
-          <wp:inline distT="0" distB="0" distL="0" distR="0" wp14:anchorId="39C38902" wp14:editId="1D6BE413">
+          <wp:inline distT="0" distB="0" distL="0" distR="0" wp14:anchorId="2BBC26FA" wp14:editId="6C30034F">
             <wp:extent cx="5762625" cy="4086225"/>
             <wp:effectExtent l="0" t="0" r="0" b="0"/>
             <wp:docPr id="10" name="evolucao_acessibilidade.png" descr="Recursos de acessibilidade na versão para celular" title="Recursos de acessibilidade na versão para celular"/>
@@ -15417,7 +15417,7 @@
       <w:pPr>
         <w:pStyle w:val="Ttulo3"/>
       </w:pPr>
-      <w:bookmarkStart w:id="54" w:name="_Toc243416727"/>
+      <w:bookmarkStart w:id="54" w:name="_Toc243474402"/>
       <w:r>
         <w:t>4.7.5 Tutor com inteligência artificial generativa</w:t>
       </w:r>
@@ -15440,7 +15440,7 @@
       <w:pPr>
         <w:pStyle w:val="LegendaABNT"/>
       </w:pPr>
-      <w:bookmarkStart w:id="55" w:name="_Toc243416748"/>
+      <w:bookmarkStart w:id="55" w:name="_Toc243474423"/>
       <w:r>
         <w:t xml:space="preserve">Figura </w:t>
       </w:r>
@@ -15478,7 +15478,7 @@
           <w:noProof/>
         </w:rPr>
         <w:drawing>
-          <wp:inline distT="0" distB="0" distL="0" distR="0" wp14:anchorId="4F197848" wp14:editId="1F2831A8">
+          <wp:inline distT="0" distB="0" distL="0" distR="0" wp14:anchorId="08FBDA46" wp14:editId="40F16A8C">
             <wp:extent cx="5762625" cy="2933700"/>
             <wp:effectExtent l="0" t="0" r="0" b="0"/>
             <wp:docPr id="11" name="tutor_arquitetura.png" descr="Provedores de resposta do tutor e local da chave de acesso" title="Provedores de resposta do tutor e local da chave de acesso"/>
@@ -15584,7 +15584,7 @@
       <w:pPr>
         <w:pStyle w:val="LegendaABNT"/>
       </w:pPr>
-      <w:bookmarkStart w:id="56" w:name="_Toc243416749"/>
+      <w:bookmarkStart w:id="56" w:name="_Toc243474424"/>
       <w:r>
         <w:t xml:space="preserve">Figura </w:t>
       </w:r>
@@ -15622,7 +15622,7 @@
           <w:noProof/>
         </w:rPr>
         <w:drawing>
-          <wp:inline distT="0" distB="0" distL="0" distR="0" wp14:anchorId="6405C927" wp14:editId="4D02D62D">
+          <wp:inline distT="0" distB="0" distL="0" distR="0" wp14:anchorId="089162C4" wp14:editId="4C86ADE1">
             <wp:extent cx="5762625" cy="4086225"/>
             <wp:effectExtent l="0" t="0" r="0" b="0"/>
             <wp:docPr id="12" name="evolucao_tutor.png" descr="Conversa com o tutor usando o Gemini na versão para celular" title="Conversa com o tutor usando o Gemini na versão para celular"/>
@@ -15683,7 +15683,7 @@
       <w:pPr>
         <w:pStyle w:val="Ttulo3"/>
       </w:pPr>
-      <w:bookmarkStart w:id="57" w:name="_Toc243416728"/>
+      <w:bookmarkStart w:id="57" w:name="_Toc243474403"/>
       <w:r>
         <w:t>4.7.6 Abertura, conta Google opcional e apresentação</w:t>
       </w:r>
@@ -15708,7 +15708,7 @@
       <w:pPr>
         <w:pStyle w:val="Ttulo3"/>
       </w:pPr>
-      <w:bookmarkStart w:id="58" w:name="_Toc243416729"/>
+      <w:bookmarkStart w:id="58" w:name="_Toc243474404"/>
       <w:r>
         <w:t>4.7.7 Site e instaladores</w:t>
       </w:r>
@@ -15745,20 +15745,14 @@
         <w:t>resso e as preferências de quem os gerou: o empacotamento os exclui, e os arquivos internos de cada pacote foram conferidos. Ambos usam o servidor intermediário da seção 4.7.5. O APK foi testado num celular Samsung Galaxy S20 FE 5G, com Android 13, e num tablet Samsung Galaxy Tab S4, com Android 10, em pé e deitado: a disposição das telas, o quiz, os jogos, o tutor com Gemini, os vídeos e as referências, o atalho para Libras, o alto contraste e o login com Google funcionaram. Os testes em aparelho também mo</w:t>
       </w:r>
       <w:r>
-        <w:t xml:space="preserve">straram dois problemas, corrigidos antes da distribuição: a aba de casos do detalhe de um marcador abria rolada para o fim, num espaço vazio, e o login no Android falhava porque uma biblioteca do Android de que ele depende ficava fora do pacote. Desde então, cada APK gerado é conferido por um programa que verifica a presença das classes do login e a ausência da chave do Gemini e de dados pessoais. </w:t>
-      </w:r>
-      <w:r>
-        <w:rPr>
-          <w:highlight w:val="yellow"/>
-        </w:rPr>
-        <w:t>[CONFIRMAR: se o APK já está publicado no site.]</w:t>
+        <w:t>straram dois problemas, corrigidos antes da distribuição: a aba de casos do detalhe de um marcador abria rolada para o fim, num espaço vazio, e o login no Android falhava porque uma biblioteca do Android de que ele depende ficava fora do pacote. Desde então, cada APK gerado é conferido por um programa que verifica a presença das classes do login e a ausência da chave do Gemini e de dados pessoais. O APK da versão 0.6 está publicado no site do projeto, ao lado do executável para Windows.</w:t>
       </w:r>
     </w:p>
     <w:p>
       <w:pPr>
         <w:pStyle w:val="Ttulo2"/>
       </w:pPr>
-      <w:bookmarkStart w:id="59" w:name="_Toc243416730"/>
+      <w:bookmarkStart w:id="59" w:name="_Toc243474405"/>
       <w:r>
         <w:t>4.8 AVALIAÇÃO DA APRENDIZAGEM</w:t>
       </w:r>
@@ -15781,7 +15775,7 @@
       <w:pPr>
         <w:pStyle w:val="LegendaABNT"/>
       </w:pPr>
-      <w:bookmarkStart w:id="60" w:name="_Toc243416761"/>
+      <w:bookmarkStart w:id="60" w:name="_Toc243474436"/>
       <w:r>
         <w:t xml:space="preserve">Tabela </w:t>
       </w:r>
@@ -16395,7 +16389,7 @@
       <w:pPr>
         <w:pStyle w:val="Ttulo1"/>
       </w:pPr>
-      <w:bookmarkStart w:id="61" w:name="_Toc243416731"/>
+      <w:bookmarkStart w:id="61" w:name="_Toc243474406"/>
       <w:r>
         <w:t>5 DISCUSSÃO</w:t>
       </w:r>
@@ -16415,7 +16409,7 @@
       <w:pPr>
         <w:pStyle w:val="LegendaABNT"/>
       </w:pPr>
-      <w:bookmarkStart w:id="62" w:name="_Toc243416755"/>
+      <w:bookmarkStart w:id="62" w:name="_Toc243474430"/>
       <w:r>
         <w:t xml:space="preserve">Quadro </w:t>
       </w:r>
@@ -17542,7 +17536,7 @@
       <w:pPr>
         <w:pStyle w:val="Ttulo1"/>
       </w:pPr>
-      <w:bookmarkStart w:id="63" w:name="_Toc243416732"/>
+      <w:bookmarkStart w:id="63" w:name="_Toc243474407"/>
       <w:r>
         <w:t>6 CONSIDERAÇÕES FINAIS</w:t>
       </w:r>
@@ -17612,7 +17606,7 @@
         <w:pStyle w:val="Ttulo1"/>
         <w:jc w:val="center"/>
       </w:pPr>
-      <w:bookmarkStart w:id="64" w:name="_Toc243416733"/>
+      <w:bookmarkStart w:id="64" w:name="_Toc243474408"/>
       <w:r>
         <w:t>REFERÊNCIAS</w:t>
       </w:r>
@@ -18489,7 +18483,7 @@
         <w:pStyle w:val="Ttulo1"/>
         <w:jc w:val="center"/>
       </w:pPr>
-      <w:bookmarkStart w:id="65" w:name="_Toc243416734"/>
+      <w:bookmarkStart w:id="65" w:name="_Toc243474409"/>
       <w:r>
         <w:t>APÊNDICE A – FONTES DO CONTEÚDO POR MARCADOR</w:t>
       </w:r>
@@ -18509,7 +18503,7 @@
       <w:pPr>
         <w:pStyle w:val="LegendaABNT"/>
       </w:pPr>
-      <w:bookmarkStart w:id="66" w:name="_Toc243416756"/>
+      <w:bookmarkStart w:id="66" w:name="_Toc243474431"/>
       <w:r>
         <w:t xml:space="preserve">Quadro </w:t>
       </w:r>
@@ -20884,7 +20878,7 @@
         <w:pStyle w:val="Ttulo1"/>
         <w:jc w:val="center"/>
       </w:pPr>
-      <w:bookmarkStart w:id="67" w:name="_Toc243416735"/>
+      <w:bookmarkStart w:id="67" w:name="_Toc243474410"/>
       <w:r>
         <w:t>APÊNDICE B – CÓDIGO-FONTE E EXECUÇÃO</w:t>
       </w:r>
@@ -20979,7 +20973,7 @@
         <w:pStyle w:val="Ttulo1"/>
         <w:jc w:val="center"/>
       </w:pPr>
-      <w:bookmarkStart w:id="68" w:name="_Toc243416736"/>
+      <w:bookmarkStart w:id="68" w:name="_Toc243474411"/>
       <w:r>
         <w:t>APÊNDICE C – QUESTÕES DO PRÉ-TESTE E DO PÓS-TESTE</w:t>
       </w:r>
@@ -21820,7 +21814,7 @@
         <w:pStyle w:val="Ttulo1"/>
         <w:jc w:val="center"/>
       </w:pPr>
-      <w:bookmarkStart w:id="69" w:name="_Toc243416737"/>
+      <w:bookmarkStart w:id="69" w:name="_Toc243474412"/>
       <w:r>
         <w:t>APÊNDICE D – QUESTIONÁRIO DE OPINIÃO</w:t>
       </w:r>
@@ -22166,10 +22160,10 @@
 <file path=word/numbering.xml><?xml version="1.0" encoding="utf-8"?>
 <w:numbering xmlns:wpc="http://schemas.microsoft.com/office/word/2010/wordprocessingCanvas" xmlns:cx="http://schemas.microsoft.com/office/drawing/2014/chartex" xmlns:cx1="http://schemas.microsoft.com/office/drawing/2015/9/8/chartex" xmlns:cx2="http://schemas.microsoft.com/office/drawing/2015/10/21/chartex" xmlns:cx3="http://schemas.microsoft.com/office/drawing/2016/5/9/chartex" xmlns:cx4="http://schemas.microsoft.com/office/drawing/2016/5/10/chartex" xmlns:cx5="http://schemas.microsoft.com/office/drawing/2016/5/11/chartex" xmlns:cx6="http://schemas.microsoft.com/office/drawing/2016/5/12/chartex" xmlns:cx7="http://schemas.microsoft.com/office/drawing/2016/5/13/chartex" xmlns:cx8="http://schemas.microsoft.com/office/drawing/2016/5/14/chartex" xmlns:mc="http://schemas.openxmlformats.org/markup-compatibility/2006" xmlns:aink="http://schemas.microsoft.com/office/drawing/2016/ink" xmlns:am3d="http://schemas.microsoft.com/office/drawing/2017/model3d" xmlns:o="urn:schemas-microsoft-com:office:office" xmlns:oel="http://schemas.microsoft.com/office/2019/extlst" xmlns:r="http://schemas.openxmlformats.org/officeDocument/2006/relationships" xmlns:m="http://schemas.openxmlformats.org/officeDocument/2006/math" xmlns:v="urn:schemas-microsoft-com:vml" xmlns:wp14="http://schemas.microsoft.com/office/word/2010/wordprocessingDrawing" xmlns:wp="http://schemas.openxmlformats.org/drawingml/2006/wordprocessingDrawing" xmlns:w10="urn:schemas-microsoft-com:office:word" xmlns:w="http://schemas.openxmlformats.org/wordprocessingml/2006/main" xmlns:w14="http://schemas.microsoft.com/office/word/2010/wordml" xmlns:w15="http://schemas.microsoft.com/office/word/2012/wordml" xmlns:w16cex="http://schemas.microsoft.com/office/word/2018/wordml/cex" xmlns:w16cid="http://schemas.microsoft.com/office/word/2016/wordml/cid" xmlns:w16="http://schemas.microsoft.com/office/word/2018/wordml" xmlns:w16du="http://schemas.microsoft.com/office/word/2023/wordml/word16du" xmlns:w16sdtdh="http://schemas.microsoft.com/office/word/2020/wordml/sdtdatahash" xmlns:w16sdtfl="http://schemas.microsoft.com/office/word/2024/wordml/sdtformatlock" xmlns:w16se="http://schemas.microsoft.com/office/word/2015/wordml/symex" xmlns:wpg="http://schemas.microsoft.com/office/word/2010/wordprocessingGroup" xmlns:wpi="http://schemas.microsoft.com/office/word/2010/wordprocessingInk" xmlns:wne="http://schemas.microsoft.com/office/word/2006/wordml" xmlns:wps="http://schemas.microsoft.com/office/word/2010/wordprocessingShape" mc:Ignorable="w14 w15 w16se w16cid w16 w16cex w16sdtdh w16sdtfl w16du wp14">
   <w:abstractNum w:abstractNumId="0" w15:restartNumberingAfterBreak="0">
-    <w:nsid w:val="65845218"/>
+    <w:nsid w:val="06DE11E5"/>
     <w:multiLevelType w:val="hybridMultilevel"/>
-    <w:tmpl w:val="77F20AD6"/>
-    <w:lvl w:ilvl="0" w:tplc="14A427E2">
+    <w:tmpl w:val="75D86C26"/>
+    <w:lvl w:ilvl="0" w:tplc="4AECAFC2">
       <w:start w:val="1"/>
       <w:numFmt w:val="lowerLetter"/>
       <w:lvlText w:val="%1)"/>
@@ -22178,52 +22172,52 @@
         <w:ind w:left="1106" w:hanging="397"/>
       </w:pPr>
     </w:lvl>
-    <w:lvl w:ilvl="1" w:tplc="5D969B6C">
+    <w:lvl w:ilvl="1" w:tplc="1A0A6EF6">
       <w:numFmt w:val="decimal"/>
       <w:lvlText w:val=""/>
       <w:lvlJc w:val="left"/>
     </w:lvl>
-    <w:lvl w:ilvl="2" w:tplc="2DA0B54E">
+    <w:lvl w:ilvl="2" w:tplc="33E4222C">
       <w:numFmt w:val="decimal"/>
       <w:lvlText w:val=""/>
       <w:lvlJc w:val="left"/>
     </w:lvl>
-    <w:lvl w:ilvl="3" w:tplc="144CE542">
+    <w:lvl w:ilvl="3" w:tplc="636461B6">
       <w:numFmt w:val="decimal"/>
       <w:lvlText w:val=""/>
       <w:lvlJc w:val="left"/>
     </w:lvl>
-    <w:lvl w:ilvl="4" w:tplc="9B92C550">
+    <w:lvl w:ilvl="4" w:tplc="EE3E8486">
       <w:numFmt w:val="decimal"/>
       <w:lvlText w:val=""/>
       <w:lvlJc w:val="left"/>
     </w:lvl>
-    <w:lvl w:ilvl="5" w:tplc="0A860FB2">
+    <w:lvl w:ilvl="5" w:tplc="9C063C52">
       <w:numFmt w:val="decimal"/>
       <w:lvlText w:val=""/>
       <w:lvlJc w:val="left"/>
     </w:lvl>
-    <w:lvl w:ilvl="6" w:tplc="86C00CA6">
+    <w:lvl w:ilvl="6" w:tplc="987A077A">
       <w:numFmt w:val="decimal"/>
       <w:lvlText w:val=""/>
       <w:lvlJc w:val="left"/>
     </w:lvl>
-    <w:lvl w:ilvl="7" w:tplc="877AE5A2">
+    <w:lvl w:ilvl="7" w:tplc="24D6A266">
       <w:numFmt w:val="decimal"/>
       <w:lvlText w:val=""/>
       <w:lvlJc w:val="left"/>
     </w:lvl>
-    <w:lvl w:ilvl="8" w:tplc="067E6846">
+    <w:lvl w:ilvl="8" w:tplc="9350D114">
       <w:numFmt w:val="decimal"/>
       <w:lvlText w:val=""/>
       <w:lvlJc w:val="left"/>
     </w:lvl>
   </w:abstractNum>
   <w:abstractNum w:abstractNumId="1" w15:restartNumberingAfterBreak="0">
-    <w:nsid w:val="672665B0"/>
+    <w:nsid w:val="264E27BD"/>
     <w:multiLevelType w:val="hybridMultilevel"/>
-    <w:tmpl w:val="391C4D56"/>
-    <w:lvl w:ilvl="0" w:tplc="475E450A" w:tentative="1">
+    <w:tmpl w:val="677EBADA"/>
+    <w:lvl w:ilvl="0" w:tplc="B762A990" w:tentative="1">
       <w:start w:val="1"/>
       <w:numFmt w:val="bullet"/>
       <w:lvlText w:val="●"/>
@@ -22232,7 +22226,7 @@
         <w:ind w:left="720" w:hanging="360"/>
       </w:pPr>
     </w:lvl>
-    <w:lvl w:ilvl="1" w:tplc="E3B2B232" w:tentative="1">
+    <w:lvl w:ilvl="1" w:tplc="632AD3C0" w:tentative="1">
       <w:start w:val="1"/>
       <w:numFmt w:val="bullet"/>
       <w:lvlText w:val="○"/>
@@ -22241,7 +22235,7 @@
         <w:ind w:left="1440" w:hanging="360"/>
       </w:pPr>
     </w:lvl>
-    <w:lvl w:ilvl="2" w:tplc="BCEC282A" w:tentative="1">
+    <w:lvl w:ilvl="2" w:tplc="F478326A" w:tentative="1">
       <w:start w:val="1"/>
       <w:numFmt w:val="bullet"/>
       <w:lvlText w:val="■"/>
@@ -22250,7 +22244,7 @@
         <w:ind w:left="2160" w:hanging="360"/>
       </w:pPr>
     </w:lvl>
-    <w:lvl w:ilvl="3" w:tplc="22686BAC" w:tentative="1">
+    <w:lvl w:ilvl="3" w:tplc="59EE76D4" w:tentative="1">
       <w:start w:val="1"/>
       <w:numFmt w:val="bullet"/>
       <w:lvlText w:val="●"/>
@@ -22259,7 +22253,7 @@
         <w:ind w:left="2880" w:hanging="360"/>
       </w:pPr>
     </w:lvl>
-    <w:lvl w:ilvl="4" w:tplc="15444ADC" w:tentative="1">
+    <w:lvl w:ilvl="4" w:tplc="2990D2F4" w:tentative="1">
       <w:start w:val="1"/>
       <w:numFmt w:val="bullet"/>
       <w:lvlText w:val="○"/>
@@ -22268,7 +22262,7 @@
         <w:ind w:left="3600" w:hanging="360"/>
       </w:pPr>
     </w:lvl>
-    <w:lvl w:ilvl="5" w:tplc="62F26C98" w:tentative="1">
+    <w:lvl w:ilvl="5" w:tplc="5CA806F0" w:tentative="1">
       <w:start w:val="1"/>
       <w:numFmt w:val="bullet"/>
       <w:lvlText w:val="■"/>
@@ -22277,7 +22271,7 @@
         <w:ind w:left="4320" w:hanging="360"/>
       </w:pPr>
     </w:lvl>
-    <w:lvl w:ilvl="6" w:tplc="6BA4D0A4" w:tentative="1">
+    <w:lvl w:ilvl="6" w:tplc="76FAF0FA" w:tentative="1">
       <w:start w:val="1"/>
       <w:numFmt w:val="bullet"/>
       <w:lvlText w:val="●"/>
@@ -22286,7 +22280,7 @@
         <w:ind w:left="5040" w:hanging="360"/>
       </w:pPr>
     </w:lvl>
-    <w:lvl w:ilvl="7" w:tplc="AC608142" w:tentative="1">
+    <w:lvl w:ilvl="7" w:tplc="5AB42CCA" w:tentative="1">
       <w:start w:val="1"/>
       <w:numFmt w:val="bullet"/>
       <w:lvlText w:val="●"/>
@@ -22295,7 +22289,7 @@
         <w:ind w:left="5760" w:hanging="360"/>
       </w:pPr>
     </w:lvl>
-    <w:lvl w:ilvl="8" w:tplc="31E223F0" w:tentative="1">
+    <w:lvl w:ilvl="8" w:tplc="95C2CC74" w:tentative="1">
       <w:start w:val="1"/>
       <w:numFmt w:val="bullet"/>
       <w:lvlText w:val="●"/>
@@ -22305,97 +22299,97 @@
       </w:pPr>
     </w:lvl>
   </w:abstractNum>
-  <w:num w:numId="1" w16cid:durableId="940799439">
+  <w:num w:numId="1" w16cid:durableId="34275488">
     <w:abstractNumId w:val="1"/>
     <w:lvlOverride w:ilvl="0">
       <w:startOverride w:val="1"/>
     </w:lvlOverride>
   </w:num>
-  <w:num w:numId="2" w16cid:durableId="783619779">
+  <w:num w:numId="2" w16cid:durableId="1504736386">
     <w:abstractNumId w:val="0"/>
     <w:lvlOverride w:ilvl="0">
       <w:startOverride w:val="1"/>
     </w:lvlOverride>
   </w:num>
-  <w:num w:numId="3" w16cid:durableId="2083945240">
+  <w:num w:numId="3" w16cid:durableId="1746949968">
     <w:abstractNumId w:val="0"/>
     <w:lvlOverride w:ilvl="0">
       <w:startOverride w:val="1"/>
     </w:lvlOverride>
   </w:num>
-  <w:num w:numId="4" w16cid:durableId="1298561619">
+  <w:num w:numId="4" w16cid:durableId="644166279">
     <w:abstractNumId w:val="0"/>
     <w:lvlOverride w:ilvl="0">
       <w:startOverride w:val="1"/>
     </w:lvlOverride>
   </w:num>
-  <w:num w:numId="5" w16cid:durableId="1547253547">
+  <w:num w:numId="5" w16cid:durableId="1472671043">
     <w:abstractNumId w:val="0"/>
     <w:lvlOverride w:ilvl="0">
       <w:startOverride w:val="1"/>
     </w:lvlOverride>
   </w:num>
-  <w:num w:numId="6" w16cid:durableId="209002088">
+  <w:num w:numId="6" w16cid:durableId="674697944">
     <w:abstractNumId w:val="0"/>
     <w:lvlOverride w:ilvl="0">
       <w:startOverride w:val="1"/>
     </w:lvlOverride>
   </w:num>
-  <w:num w:numId="7" w16cid:durableId="33703561">
+  <w:num w:numId="7" w16cid:durableId="1200508299">
     <w:abstractNumId w:val="0"/>
     <w:lvlOverride w:ilvl="0">
       <w:startOverride w:val="1"/>
     </w:lvlOverride>
   </w:num>
-  <w:num w:numId="8" w16cid:durableId="759571361">
+  <w:num w:numId="8" w16cid:durableId="1088843097">
     <w:abstractNumId w:val="0"/>
     <w:lvlOverride w:ilvl="0">
       <w:startOverride w:val="1"/>
     </w:lvlOverride>
   </w:num>
-  <w:num w:numId="9" w16cid:durableId="1689528676">
+  <w:num w:numId="9" w16cid:durableId="1343625770">
     <w:abstractNumId w:val="0"/>
     <w:lvlOverride w:ilvl="0">
       <w:startOverride w:val="1"/>
     </w:lvlOverride>
   </w:num>
-  <w:num w:numId="10" w16cid:durableId="627710153">
+  <w:num w:numId="10" w16cid:durableId="2008635278">
     <w:abstractNumId w:val="0"/>
     <w:lvlOverride w:ilvl="0">
       <w:startOverride w:val="1"/>
     </w:lvlOverride>
   </w:num>
-  <w:num w:numId="11" w16cid:durableId="1790586153">
+  <w:num w:numId="11" w16cid:durableId="155191190">
     <w:abstractNumId w:val="0"/>
     <w:lvlOverride w:ilvl="0">
       <w:startOverride w:val="1"/>
     </w:lvlOverride>
   </w:num>
-  <w:num w:numId="12" w16cid:durableId="876042021">
+  <w:num w:numId="12" w16cid:durableId="582759217">
     <w:abstractNumId w:val="0"/>
     <w:lvlOverride w:ilvl="0">
       <w:startOverride w:val="1"/>
     </w:lvlOverride>
   </w:num>
-  <w:num w:numId="13" w16cid:durableId="1499733726">
+  <w:num w:numId="13" w16cid:durableId="1024552462">
     <w:abstractNumId w:val="0"/>
     <w:lvlOverride w:ilvl="0">
       <w:startOverride w:val="1"/>
     </w:lvlOverride>
   </w:num>
-  <w:num w:numId="14" w16cid:durableId="141124476">
+  <w:num w:numId="14" w16cid:durableId="1186601018">
     <w:abstractNumId w:val="0"/>
     <w:lvlOverride w:ilvl="0">
       <w:startOverride w:val="1"/>
     </w:lvlOverride>
   </w:num>
-  <w:num w:numId="15" w16cid:durableId="1840198031">
+  <w:num w:numId="15" w16cid:durableId="698967948">
     <w:abstractNumId w:val="0"/>
     <w:lvlOverride w:ilvl="0">
       <w:startOverride w:val="1"/>
     </w:lvlOverride>
   </w:num>
-  <w:num w:numId="16" w16cid:durableId="959729739">
+  <w:num w:numId="16" w16cid:durableId="119156296">
     <w:abstractNumId w:val="0"/>
     <w:lvlOverride w:ilvl="0">
       <w:startOverride w:val="1"/>

</xml_diff>